<commit_message>
Name HPC co-author and adopt the Harder to Kill brand promise
Adds Jacques Rousseau (Human Performance Cell) as co-originator and
sets HARDER TO KILL as the brand promise: Army Red statement on the
cover, and woven into the Option 1 definition and why/how callout.

Co-Authored-By: Claude Fable 5 <noreply@anthropic.com>
Claude-Session: https://claude.ai/code/session_01YLo1WfwUDkbwfJEF3ZNVbB
</commit_message>
<xml_diff>
--- a/output/combat-mindset-way-forward.docx
+++ b/output/combat-mindset-way-forward.docx
@@ -71,7 +71,7 @@
     <w:p>
       <w:pPr>
         <w:pStyle w:val="Normal"/>
-        <w:spacing w:before="120" w:after="2400"/>
+        <w:spacing w:before="120" w:after="280"/>
         <w:rPr/>
       </w:pPr>
       <w:r>
@@ -81,6 +81,23 @@
           <w:sz w:val="26"/>
         </w:rPr>
         <w:t>Joint NZALC and Human Performance Cell response to COMDT ACS</w:t>
+      </w:r>
+    </w:p>
+    <w:p>
+      <w:pPr>
+        <w:pStyle w:val="Normal"/>
+        <w:spacing w:before="0" w:after="1920"/>
+        <w:rPr/>
+      </w:pPr>
+      <w:r>
+        <w:rPr>
+          <w:rFonts w:cs="Arial" w:ascii="Arial" w:hAnsi="Arial"/>
+          <w:b/>
+          <w:color w:val="C62026"/>
+          <w:spacing w:val="60"/>
+          <w:sz w:val="30"/>
+        </w:rPr>
+        <w:t>HARDER TO KILL</w:t>
       </w:r>
     </w:p>
     <w:p>
@@ -170,7 +187,7 @@
           <w:color w:val="000000"/>
           <w:sz w:val="20"/>
         </w:rPr>
-        <w:t>Major M Coom, CI NZALC · ____, Human Performance Cell</w:t>
+        <w:t>Major M Coom, CI NZALC · Jacques Rousseau, Human Performance Cell</w:t>
       </w:r>
     </w:p>
     <w:p>
@@ -613,7 +630,23 @@
           <w:b w:val="false"/>
           <w:i w:val="false"/>
         </w:rPr>
-        <w:t>Combat Mindset is the Army-owned banner and orienting purpose, aligned to Warfighter Focus. Performance Under Pressure is the doctrinal mechanism that sits beneath it — the trained individual and collective capacity the brand runs on.</w:t>
+        <w:t xml:space="preserve">Combat Mindset is the Army-owned banner and orienting purpose, aligned to Warfighter Focus and carrying the brand promise: </w:t>
+      </w:r>
+      <w:r>
+        <w:rPr>
+          <w:rFonts w:cs="Book Antiqua"/>
+          <w:b/>
+          <w:i w:val="false"/>
+        </w:rPr>
+        <w:t>Harder to Kill</w:t>
+      </w:r>
+      <w:r>
+        <w:rPr>
+          <w:rFonts w:cs="Book Antiqua"/>
+          <w:b w:val="false"/>
+          <w:i w:val="false"/>
+        </w:rPr>
+        <w:t>. Performance Under Pressure is the doctrinal mechanism that sits beneath it — the trained individual and collective capacity the brand runs on.</w:t>
       </w:r>
     </w:p>
     <w:p>
@@ -633,7 +666,7 @@
           <w:b/>
           <w:i w:val="false"/>
         </w:rPr>
-        <w:t>Combat Mindset is why: acting decisively, persistently and ethically in combat, and being harder to kill. Performance Under Pressure is how: the trained capacity to prepare for, remain effective through, adapt within and recover from pressure.</w:t>
+        <w:t>Combat Mindset is why: acting decisively, persistently and ethically in combat — Harder to Kill. Performance Under Pressure is how: the trained capacity to prepare for, remain effective through, adapt within and recover from pressure.</w:t>
       </w:r>
     </w:p>
     <w:p>
@@ -669,7 +702,7 @@
           <w:b w:val="false"/>
           <w:i w:val="false"/>
         </w:rPr>
-        <w:t>Preserves Combat Mindset as the recognisable, operationally credible Army brand.</w:t>
+        <w:t>Preserves Combat Mindset as the recognisable, operationally credible Army brand, with Harder to Kill as its memorable, warfighter-focused promise.</w:t>
       </w:r>
     </w:p>
     <w:p>

</xml_diff>

<commit_message>
Add Annex A: NZALC-HPC common lexicon and division of functions
Adds the integration annex to the way-forward paper: the Rosetta table
mapping cognitive-fitness dimensions to NZALC techniques and COGCON
conditioning methods, the by-function division of responsibilities,
and the shared delivery frames. Extends the builder with branded table
rendering (Swamp Green headers, Waiouru hairlines, no row splits) and
a page-break marker.

Co-Authored-By: Claude Fable 5 <noreply@anthropic.com>
Claude-Session: https://claude.ai/code/session_01YLo1WfwUDkbwfJEF3ZNVbB
</commit_message>
<xml_diff>
--- a/output/combat-mindset-way-forward.docx
+++ b/output/combat-mindset-way-forward.docx
@@ -1904,6 +1904,1373 @@
           <w:i w:val="false"/>
         </w:rPr>
         <w:t xml:space="preserve"> that NZALC and HPC will deliver this programme jointly, with the capability note at Reference C and the COGCON evidence base as its foundation inputs.</w:t>
+      </w:r>
+    </w:p>
+    <w:p>
+      <w:pPr>
+        <w:pStyle w:val="Normal"/>
+        <w:rPr/>
+      </w:pPr>
+      <w:r>
+        <w:rPr/>
+      </w:r>
+      <w:r>
+        <w:br w:type="page"/>
+      </w:r>
+    </w:p>
+    <w:p>
+      <w:pPr>
+        <w:pStyle w:val="Heading1"/>
+        <w:pBdr>
+          <w:left w:val="single" w:sz="24" w:space="8" w:color="C62026"/>
+        </w:pBdr>
+        <w:spacing w:before="0" w:after="160"/>
+        <w:rPr/>
+      </w:pPr>
+      <w:r>
+        <w:rPr>
+          <w:rFonts w:cs="Arial" w:ascii="Arial" w:hAnsi="Arial"/>
+          <w:b/>
+          <w:i w:val="false"/>
+          <w:color w:val="002516"/>
+          <w:sz w:val="28"/>
+        </w:rPr>
+        <w:t>Annex A — Common lexicon and division of functions</w:t>
+      </w:r>
+    </w:p>
+    <w:p>
+      <w:pPr>
+        <w:pStyle w:val="Normal"/>
+        <w:rPr/>
+      </w:pPr>
+      <w:r>
+        <w:rPr>
+          <w:rFonts w:cs="Book Antiqua"/>
+          <w:b w:val="false"/>
+          <w:i w:val="false"/>
+        </w:rPr>
+        <w:t>These tables give effect to the integration described at paragraphs 2 and 3. They are the joint NZALC–HPC working baseline and will be validated during Phase 1 mapping.</w:t>
+      </w:r>
+    </w:p>
+    <w:p>
+      <w:pPr>
+        <w:pStyle w:val="Heading2"/>
+        <w:rPr/>
+      </w:pPr>
+      <w:r>
+        <w:rPr>
+          <w:rFonts w:cs="Arial" w:ascii="Arial" w:hAnsi="Arial"/>
+          <w:b/>
+          <w:i w:val="false"/>
+          <w:color w:val="000000"/>
+          <w:sz w:val="22"/>
+        </w:rPr>
+        <w:t>A1. Common lexicon — one construct, two layers</w:t>
+      </w:r>
+    </w:p>
+    <w:p>
+      <w:pPr>
+        <w:pStyle w:val="Normal"/>
+        <w:rPr/>
+      </w:pPr>
+      <w:r>
+        <w:rPr>
+          <w:rFonts w:cs="Book Antiqua"/>
+          <w:b w:val="false"/>
+          <w:i w:val="false"/>
+        </w:rPr>
+        <w:t>The framework adopts the cognitive-fitness dimensions as the science layer (HPC) and the NZALC mental-skills toolkit as the soldier-facing technique layer. One name per technique is used in delivery; programme-specific protocol names sit beneath it — for example, rhythm breathing is the COGCON conditioning protocol for tactical breathing.</w:t>
+      </w:r>
+    </w:p>
+    <w:tbl>
+      <w:tblPr>
+        <w:tblW w:w="9072" w:type="dxa"/>
+        <w:jc w:val="left"/>
+        <w:tblInd w:w="0" w:type="dxa"/>
+        <w:tblLayout w:type="fixed"/>
+        <w:tblCellMar>
+          <w:top w:w="0" w:type="dxa"/>
+          <w:left w:w="108" w:type="dxa"/>
+          <w:bottom w:w="0" w:type="dxa"/>
+          <w:right w:w="108" w:type="dxa"/>
+        </w:tblCellMar>
+        <w:tblLook w:val="04a0" w:noHBand="0" w:noVBand="1" w:firstColumn="1" w:lastRow="0" w:lastColumn="0" w:firstRow="1"/>
+      </w:tblPr>
+      <w:tblGrid>
+        <w:gridCol w:w="3024"/>
+        <w:gridCol w:w="3024"/>
+        <w:gridCol w:w="3024"/>
+      </w:tblGrid>
+      <w:tr>
+        <w:trPr>
+          <w:cantSplit w:val="true"/>
+        </w:trPr>
+        <w:tc>
+          <w:tcPr>
+            <w:tcW w:w="3024" w:type="dxa"/>
+            <w:tcBorders>
+              <w:top w:val="single" w:sz="4" w:space="0" w:color="A89662"/>
+              <w:left w:val="single" w:sz="4" w:space="0" w:color="A89662"/>
+              <w:bottom w:val="single" w:sz="4" w:space="0" w:color="A89662"/>
+              <w:right w:val="single" w:sz="4" w:space="0" w:color="A89662"/>
+            </w:tcBorders>
+            <w:shd w:fill="002516" w:val="clear"/>
+          </w:tcPr>
+          <w:p>
+            <w:pPr>
+              <w:pStyle w:val="Normal"/>
+              <w:spacing w:before="40" w:after="40"/>
+              <w:rPr/>
+            </w:pPr>
+            <w:r>
+              <w:rPr>
+                <w:rFonts w:cs="Arial" w:ascii="Arial" w:hAnsi="Arial"/>
+                <w:b/>
+                <w:color w:val="FFFFFF"/>
+                <w:sz w:val="19"/>
+              </w:rPr>
+              <w:t>Cognitive dimension (science layer)</w:t>
+            </w:r>
+          </w:p>
+        </w:tc>
+        <w:tc>
+          <w:tcPr>
+            <w:tcW w:w="3024" w:type="dxa"/>
+            <w:tcBorders>
+              <w:top w:val="single" w:sz="4" w:space="0" w:color="A89662"/>
+              <w:left w:val="single" w:sz="4" w:space="0" w:color="A89662"/>
+              <w:bottom w:val="single" w:sz="4" w:space="0" w:color="A89662"/>
+              <w:right w:val="single" w:sz="4" w:space="0" w:color="A89662"/>
+            </w:tcBorders>
+            <w:shd w:fill="002516" w:val="clear"/>
+          </w:tcPr>
+          <w:p>
+            <w:pPr>
+              <w:pStyle w:val="Normal"/>
+              <w:spacing w:before="40" w:after="40"/>
+              <w:rPr/>
+            </w:pPr>
+            <w:r>
+              <w:rPr>
+                <w:rFonts w:cs="Arial" w:ascii="Arial" w:hAnsi="Arial"/>
+                <w:b/>
+                <w:color w:val="FFFFFF"/>
+                <w:sz w:val="19"/>
+              </w:rPr>
+              <w:t>Soldier-facing techniques (NZALC toolkit)</w:t>
+            </w:r>
+          </w:p>
+        </w:tc>
+        <w:tc>
+          <w:tcPr>
+            <w:tcW w:w="3024" w:type="dxa"/>
+            <w:tcBorders>
+              <w:top w:val="single" w:sz="4" w:space="0" w:color="A89662"/>
+              <w:left w:val="single" w:sz="4" w:space="0" w:color="A89662"/>
+              <w:bottom w:val="single" w:sz="4" w:space="0" w:color="A89662"/>
+              <w:right w:val="single" w:sz="4" w:space="0" w:color="A89662"/>
+            </w:tcBorders>
+            <w:shd w:fill="002516" w:val="clear"/>
+          </w:tcPr>
+          <w:p>
+            <w:pPr>
+              <w:pStyle w:val="Normal"/>
+              <w:spacing w:before="40" w:after="40"/>
+              <w:rPr/>
+            </w:pPr>
+            <w:r>
+              <w:rPr>
+                <w:rFonts w:cs="Arial" w:ascii="Arial" w:hAnsi="Arial"/>
+                <w:b/>
+                <w:color w:val="FFFFFF"/>
+                <w:sz w:val="19"/>
+              </w:rPr>
+              <w:t>COGCON conditioning methods</w:t>
+            </w:r>
+          </w:p>
+        </w:tc>
+      </w:tr>
+      <w:tr>
+        <w:trPr>
+          <w:cantSplit w:val="true"/>
+        </w:trPr>
+        <w:tc>
+          <w:tcPr>
+            <w:tcW w:w="3024" w:type="dxa"/>
+            <w:tcBorders>
+              <w:top w:val="single" w:sz="4" w:space="0" w:color="A89662"/>
+              <w:left w:val="single" w:sz="4" w:space="0" w:color="A89662"/>
+              <w:bottom w:val="single" w:sz="4" w:space="0" w:color="A89662"/>
+              <w:right w:val="single" w:sz="4" w:space="0" w:color="A89662"/>
+            </w:tcBorders>
+          </w:tcPr>
+          <w:p>
+            <w:pPr>
+              <w:pStyle w:val="Normal"/>
+              <w:spacing w:before="40" w:after="40"/>
+              <w:rPr/>
+            </w:pPr>
+            <w:r>
+              <w:rPr>
+                <w:rFonts w:cs="Book Antiqua"/>
+                <w:color w:val="000000"/>
+                <w:sz w:val="19"/>
+              </w:rPr>
+              <w:t>Arousal regulation</w:t>
+            </w:r>
+          </w:p>
+        </w:tc>
+        <w:tc>
+          <w:tcPr>
+            <w:tcW w:w="3024" w:type="dxa"/>
+            <w:tcBorders>
+              <w:top w:val="single" w:sz="4" w:space="0" w:color="A89662"/>
+              <w:left w:val="single" w:sz="4" w:space="0" w:color="A89662"/>
+              <w:bottom w:val="single" w:sz="4" w:space="0" w:color="A89662"/>
+              <w:right w:val="single" w:sz="4" w:space="0" w:color="A89662"/>
+            </w:tcBorders>
+          </w:tcPr>
+          <w:p>
+            <w:pPr>
+              <w:pStyle w:val="Normal"/>
+              <w:spacing w:before="40" w:after="40"/>
+              <w:rPr/>
+            </w:pPr>
+            <w:r>
+              <w:rPr>
+                <w:rFonts w:cs="Book Antiqua"/>
+                <w:color w:val="000000"/>
+                <w:sz w:val="19"/>
+              </w:rPr>
+              <w:t>Tactical breathing; grounding</w:t>
+            </w:r>
+          </w:p>
+        </w:tc>
+        <w:tc>
+          <w:tcPr>
+            <w:tcW w:w="3024" w:type="dxa"/>
+            <w:tcBorders>
+              <w:top w:val="single" w:sz="4" w:space="0" w:color="A89662"/>
+              <w:left w:val="single" w:sz="4" w:space="0" w:color="A89662"/>
+              <w:bottom w:val="single" w:sz="4" w:space="0" w:color="A89662"/>
+              <w:right w:val="single" w:sz="4" w:space="0" w:color="A89662"/>
+            </w:tcBorders>
+          </w:tcPr>
+          <w:p>
+            <w:pPr>
+              <w:pStyle w:val="Normal"/>
+              <w:spacing w:before="40" w:after="40"/>
+              <w:rPr/>
+            </w:pPr>
+            <w:r>
+              <w:rPr>
+                <w:rFonts w:cs="Book Antiqua"/>
+                <w:color w:val="000000"/>
+                <w:sz w:val="19"/>
+              </w:rPr>
+              <w:t>Rhythm-breathing injects during high-intensity physical training; within-session heart-rate down-regulation</w:t>
+            </w:r>
+          </w:p>
+        </w:tc>
+      </w:tr>
+      <w:tr>
+        <w:trPr>
+          <w:cantSplit w:val="true"/>
+        </w:trPr>
+        <w:tc>
+          <w:tcPr>
+            <w:tcW w:w="3024" w:type="dxa"/>
+            <w:tcBorders>
+              <w:top w:val="single" w:sz="4" w:space="0" w:color="A89662"/>
+              <w:left w:val="single" w:sz="4" w:space="0" w:color="A89662"/>
+              <w:bottom w:val="single" w:sz="4" w:space="0" w:color="A89662"/>
+              <w:right w:val="single" w:sz="4" w:space="0" w:color="A89662"/>
+            </w:tcBorders>
+          </w:tcPr>
+          <w:p>
+            <w:pPr>
+              <w:pStyle w:val="Normal"/>
+              <w:spacing w:before="40" w:after="40"/>
+              <w:rPr/>
+            </w:pPr>
+            <w:r>
+              <w:rPr>
+                <w:rFonts w:cs="Book Antiqua"/>
+                <w:color w:val="000000"/>
+                <w:sz w:val="19"/>
+              </w:rPr>
+              <w:t>Attention</w:t>
+            </w:r>
+          </w:p>
+        </w:tc>
+        <w:tc>
+          <w:tcPr>
+            <w:tcW w:w="3024" w:type="dxa"/>
+            <w:tcBorders>
+              <w:top w:val="single" w:sz="4" w:space="0" w:color="A89662"/>
+              <w:left w:val="single" w:sz="4" w:space="0" w:color="A89662"/>
+              <w:bottom w:val="single" w:sz="4" w:space="0" w:color="A89662"/>
+              <w:right w:val="single" w:sz="4" w:space="0" w:color="A89662"/>
+            </w:tcBorders>
+          </w:tcPr>
+          <w:p>
+            <w:pPr>
+              <w:pStyle w:val="Normal"/>
+              <w:spacing w:before="40" w:after="40"/>
+              <w:rPr/>
+            </w:pPr>
+            <w:r>
+              <w:rPr>
+                <w:rFonts w:cs="Book Antiqua"/>
+                <w:color w:val="000000"/>
+                <w:sz w:val="19"/>
+              </w:rPr>
+              <w:t>Noticing; chunking</w:t>
+            </w:r>
+          </w:p>
+        </w:tc>
+        <w:tc>
+          <w:tcPr>
+            <w:tcW w:w="3024" w:type="dxa"/>
+            <w:tcBorders>
+              <w:top w:val="single" w:sz="4" w:space="0" w:color="A89662"/>
+              <w:left w:val="single" w:sz="4" w:space="0" w:color="A89662"/>
+              <w:bottom w:val="single" w:sz="4" w:space="0" w:color="A89662"/>
+              <w:right w:val="single" w:sz="4" w:space="0" w:color="A89662"/>
+            </w:tcBorders>
+          </w:tcPr>
+          <w:p>
+            <w:pPr>
+              <w:pStyle w:val="Normal"/>
+              <w:spacing w:before="40" w:after="40"/>
+              <w:rPr/>
+            </w:pPr>
+            <w:r>
+              <w:rPr>
+                <w:rFonts w:cs="Book Antiqua"/>
+                <w:color w:val="000000"/>
+                <w:sz w:val="19"/>
+              </w:rPr>
+              <w:t>Go/no-go attention drills; threat-identification dual-tasks; agility cones</w:t>
+            </w:r>
+          </w:p>
+        </w:tc>
+      </w:tr>
+      <w:tr>
+        <w:trPr>
+          <w:cantSplit w:val="true"/>
+        </w:trPr>
+        <w:tc>
+          <w:tcPr>
+            <w:tcW w:w="3024" w:type="dxa"/>
+            <w:tcBorders>
+              <w:top w:val="single" w:sz="4" w:space="0" w:color="A89662"/>
+              <w:left w:val="single" w:sz="4" w:space="0" w:color="A89662"/>
+              <w:bottom w:val="single" w:sz="4" w:space="0" w:color="A89662"/>
+              <w:right w:val="single" w:sz="4" w:space="0" w:color="A89662"/>
+            </w:tcBorders>
+          </w:tcPr>
+          <w:p>
+            <w:pPr>
+              <w:pStyle w:val="Normal"/>
+              <w:spacing w:before="40" w:after="40"/>
+              <w:rPr/>
+            </w:pPr>
+            <w:r>
+              <w:rPr>
+                <w:rFonts w:cs="Book Antiqua"/>
+                <w:color w:val="000000"/>
+                <w:sz w:val="19"/>
+              </w:rPr>
+              <w:t>Cognitive control</w:t>
+            </w:r>
+          </w:p>
+        </w:tc>
+        <w:tc>
+          <w:tcPr>
+            <w:tcW w:w="3024" w:type="dxa"/>
+            <w:tcBorders>
+              <w:top w:val="single" w:sz="4" w:space="0" w:color="A89662"/>
+              <w:left w:val="single" w:sz="4" w:space="0" w:color="A89662"/>
+              <w:bottom w:val="single" w:sz="4" w:space="0" w:color="A89662"/>
+              <w:right w:val="single" w:sz="4" w:space="0" w:color="A89662"/>
+            </w:tcBorders>
+          </w:tcPr>
+          <w:p>
+            <w:pPr>
+              <w:pStyle w:val="Normal"/>
+              <w:spacing w:before="40" w:after="40"/>
+              <w:rPr/>
+            </w:pPr>
+            <w:r>
+              <w:rPr>
+                <w:rFonts w:cs="Book Antiqua"/>
+                <w:color w:val="000000"/>
+                <w:sz w:val="19"/>
+              </w:rPr>
+              <w:t>Motivational and instructional self-talk</w:t>
+            </w:r>
+          </w:p>
+        </w:tc>
+        <w:tc>
+          <w:tcPr>
+            <w:tcW w:w="3024" w:type="dxa"/>
+            <w:tcBorders>
+              <w:top w:val="single" w:sz="4" w:space="0" w:color="A89662"/>
+              <w:left w:val="single" w:sz="4" w:space="0" w:color="A89662"/>
+              <w:bottom w:val="single" w:sz="4" w:space="0" w:color="A89662"/>
+              <w:right w:val="single" w:sz="4" w:space="0" w:color="A89662"/>
+            </w:tcBorders>
+          </w:tcPr>
+          <w:p>
+            <w:pPr>
+              <w:pStyle w:val="Normal"/>
+              <w:spacing w:before="40" w:after="40"/>
+              <w:rPr/>
+            </w:pPr>
+            <w:r>
+              <w:rPr>
+                <w:rFonts w:cs="Book Antiqua"/>
+                <w:color w:val="000000"/>
+                <w:sz w:val="19"/>
+              </w:rPr>
+              <w:t>Inhibition performance under load; adaptive difficulty progression</w:t>
+            </w:r>
+          </w:p>
+        </w:tc>
+      </w:tr>
+      <w:tr>
+        <w:trPr>
+          <w:cantSplit w:val="true"/>
+        </w:trPr>
+        <w:tc>
+          <w:tcPr>
+            <w:tcW w:w="3024" w:type="dxa"/>
+            <w:tcBorders>
+              <w:top w:val="single" w:sz="4" w:space="0" w:color="A89662"/>
+              <w:left w:val="single" w:sz="4" w:space="0" w:color="A89662"/>
+              <w:bottom w:val="single" w:sz="4" w:space="0" w:color="A89662"/>
+              <w:right w:val="single" w:sz="4" w:space="0" w:color="A89662"/>
+            </w:tcBorders>
+          </w:tcPr>
+          <w:p>
+            <w:pPr>
+              <w:pStyle w:val="Normal"/>
+              <w:spacing w:before="40" w:after="40"/>
+              <w:rPr/>
+            </w:pPr>
+            <w:r>
+              <w:rPr>
+                <w:rFonts w:cs="Book Antiqua"/>
+                <w:color w:val="000000"/>
+                <w:sz w:val="19"/>
+              </w:rPr>
+              <w:t>Working memory</w:t>
+            </w:r>
+          </w:p>
+        </w:tc>
+        <w:tc>
+          <w:tcPr>
+            <w:tcW w:w="3024" w:type="dxa"/>
+            <w:tcBorders>
+              <w:top w:val="single" w:sz="4" w:space="0" w:color="A89662"/>
+              <w:left w:val="single" w:sz="4" w:space="0" w:color="A89662"/>
+              <w:bottom w:val="single" w:sz="4" w:space="0" w:color="A89662"/>
+              <w:right w:val="single" w:sz="4" w:space="0" w:color="A89662"/>
+            </w:tcBorders>
+          </w:tcPr>
+          <w:p>
+            <w:pPr>
+              <w:pStyle w:val="Normal"/>
+              <w:spacing w:before="40" w:after="40"/>
+              <w:rPr/>
+            </w:pPr>
+            <w:r>
+              <w:rPr>
+                <w:rFonts w:cs="Book Antiqua"/>
+                <w:color w:val="000000"/>
+                <w:sz w:val="19"/>
+              </w:rPr>
+              <w:t>Chunking; individual and team game planning</w:t>
+            </w:r>
+          </w:p>
+        </w:tc>
+        <w:tc>
+          <w:tcPr>
+            <w:tcW w:w="3024" w:type="dxa"/>
+            <w:tcBorders>
+              <w:top w:val="single" w:sz="4" w:space="0" w:color="A89662"/>
+              <w:left w:val="single" w:sz="4" w:space="0" w:color="A89662"/>
+              <w:bottom w:val="single" w:sz="4" w:space="0" w:color="A89662"/>
+              <w:right w:val="single" w:sz="4" w:space="0" w:color="A89662"/>
+            </w:tcBorders>
+          </w:tcPr>
+          <w:p>
+            <w:pPr>
+              <w:pStyle w:val="Normal"/>
+              <w:spacing w:before="40" w:after="40"/>
+              <w:rPr/>
+            </w:pPr>
+            <w:r>
+              <w:rPr>
+                <w:rFonts w:cs="Book Antiqua"/>
+                <w:color w:val="000000"/>
+                <w:sz w:val="19"/>
+              </w:rPr>
+              <w:t>Audio-brief retention and recall during concurrent tasks</w:t>
+            </w:r>
+          </w:p>
+        </w:tc>
+      </w:tr>
+      <w:tr>
+        <w:trPr>
+          <w:cantSplit w:val="true"/>
+        </w:trPr>
+        <w:tc>
+          <w:tcPr>
+            <w:tcW w:w="3024" w:type="dxa"/>
+            <w:tcBorders>
+              <w:top w:val="single" w:sz="4" w:space="0" w:color="A89662"/>
+              <w:left w:val="single" w:sz="4" w:space="0" w:color="A89662"/>
+              <w:bottom w:val="single" w:sz="4" w:space="0" w:color="A89662"/>
+              <w:right w:val="single" w:sz="4" w:space="0" w:color="A89662"/>
+            </w:tcBorders>
+          </w:tcPr>
+          <w:p>
+            <w:pPr>
+              <w:pStyle w:val="Normal"/>
+              <w:spacing w:before="40" w:after="40"/>
+              <w:rPr/>
+            </w:pPr>
+            <w:r>
+              <w:rPr>
+                <w:rFonts w:cs="Book Antiqua"/>
+                <w:color w:val="000000"/>
+                <w:sz w:val="19"/>
+              </w:rPr>
+              <w:t>Self-knowledge</w:t>
+            </w:r>
+          </w:p>
+        </w:tc>
+        <w:tc>
+          <w:tcPr>
+            <w:tcW w:w="3024" w:type="dxa"/>
+            <w:tcBorders>
+              <w:top w:val="single" w:sz="4" w:space="0" w:color="A89662"/>
+              <w:left w:val="single" w:sz="4" w:space="0" w:color="A89662"/>
+              <w:bottom w:val="single" w:sz="4" w:space="0" w:color="A89662"/>
+              <w:right w:val="single" w:sz="4" w:space="0" w:color="A89662"/>
+            </w:tcBorders>
+          </w:tcPr>
+          <w:p>
+            <w:pPr>
+              <w:pStyle w:val="Normal"/>
+              <w:spacing w:before="40" w:after="40"/>
+              <w:rPr/>
+            </w:pPr>
+            <w:r>
+              <w:rPr>
+                <w:rFonts w:cs="Book Antiqua"/>
+                <w:color w:val="000000"/>
+                <w:sz w:val="19"/>
+              </w:rPr>
+              <w:t>Structured reflection; psychometrics; Red Head–Blue Head</w:t>
+            </w:r>
+          </w:p>
+        </w:tc>
+        <w:tc>
+          <w:tcPr>
+            <w:tcW w:w="3024" w:type="dxa"/>
+            <w:tcBorders>
+              <w:top w:val="single" w:sz="4" w:space="0" w:color="A89662"/>
+              <w:left w:val="single" w:sz="4" w:space="0" w:color="A89662"/>
+              <w:bottom w:val="single" w:sz="4" w:space="0" w:color="A89662"/>
+              <w:right w:val="single" w:sz="4" w:space="0" w:color="A89662"/>
+            </w:tcBorders>
+          </w:tcPr>
+          <w:p>
+            <w:pPr>
+              <w:pStyle w:val="Normal"/>
+              <w:spacing w:before="40" w:after="40"/>
+              <w:rPr/>
+            </w:pPr>
+            <w:r>
+              <w:rPr>
+                <w:rFonts w:cs="Book Antiqua"/>
+                <w:color w:val="000000"/>
+                <w:sz w:val="19"/>
+              </w:rPr>
+              <w:t>Performance monitoring; coach scoring and feedback; Team Awareness drills</w:t>
+            </w:r>
+          </w:p>
+        </w:tc>
+      </w:tr>
+    </w:tbl>
+    <w:p>
+      <w:pPr>
+        <w:pStyle w:val="Normal"/>
+        <w:spacing w:before="0" w:after="160"/>
+        <w:rPr/>
+      </w:pPr>
+      <w:r>
+        <w:rPr/>
+      </w:r>
+    </w:p>
+    <w:p>
+      <w:pPr>
+        <w:pStyle w:val="Heading2"/>
+        <w:rPr/>
+      </w:pPr>
+      <w:r>
+        <w:rPr>
+          <w:rFonts w:cs="Arial" w:ascii="Arial" w:hAnsi="Arial"/>
+          <w:b/>
+          <w:i w:val="false"/>
+          <w:color w:val="000000"/>
+          <w:sz w:val="22"/>
+        </w:rPr>
+        <w:t>A2. Division of functions — by function, not organisation</w:t>
+      </w:r>
+    </w:p>
+    <w:tbl>
+      <w:tblPr>
+        <w:tblW w:w="9072" w:type="dxa"/>
+        <w:jc w:val="left"/>
+        <w:tblInd w:w="0" w:type="dxa"/>
+        <w:tblLayout w:type="fixed"/>
+        <w:tblCellMar>
+          <w:top w:w="0" w:type="dxa"/>
+          <w:left w:w="108" w:type="dxa"/>
+          <w:bottom w:w="0" w:type="dxa"/>
+          <w:right w:w="108" w:type="dxa"/>
+        </w:tblCellMar>
+        <w:tblLook w:val="04a0" w:noHBand="0" w:noVBand="1" w:firstColumn="1" w:lastRow="0" w:lastColumn="0" w:firstRow="1"/>
+      </w:tblPr>
+      <w:tblGrid>
+        <w:gridCol w:w="3024"/>
+        <w:gridCol w:w="3024"/>
+        <w:gridCol w:w="3024"/>
+      </w:tblGrid>
+      <w:tr>
+        <w:trPr>
+          <w:cantSplit w:val="true"/>
+        </w:trPr>
+        <w:tc>
+          <w:tcPr>
+            <w:tcW w:w="3024" w:type="dxa"/>
+            <w:tcBorders>
+              <w:top w:val="single" w:sz="4" w:space="0" w:color="A89662"/>
+              <w:left w:val="single" w:sz="4" w:space="0" w:color="A89662"/>
+              <w:bottom w:val="single" w:sz="4" w:space="0" w:color="A89662"/>
+              <w:right w:val="single" w:sz="4" w:space="0" w:color="A89662"/>
+            </w:tcBorders>
+            <w:shd w:fill="002516" w:val="clear"/>
+          </w:tcPr>
+          <w:p>
+            <w:pPr>
+              <w:pStyle w:val="Normal"/>
+              <w:spacing w:before="40" w:after="40"/>
+              <w:rPr/>
+            </w:pPr>
+            <w:r>
+              <w:rPr>
+                <w:rFonts w:cs="Arial" w:ascii="Arial" w:hAnsi="Arial"/>
+                <w:b/>
+                <w:color w:val="FFFFFF"/>
+                <w:sz w:val="19"/>
+              </w:rPr>
+              <w:t>Function</w:t>
+            </w:r>
+          </w:p>
+        </w:tc>
+        <w:tc>
+          <w:tcPr>
+            <w:tcW w:w="3024" w:type="dxa"/>
+            <w:tcBorders>
+              <w:top w:val="single" w:sz="4" w:space="0" w:color="A89662"/>
+              <w:left w:val="single" w:sz="4" w:space="0" w:color="A89662"/>
+              <w:bottom w:val="single" w:sz="4" w:space="0" w:color="A89662"/>
+              <w:right w:val="single" w:sz="4" w:space="0" w:color="A89662"/>
+            </w:tcBorders>
+            <w:shd w:fill="002516" w:val="clear"/>
+          </w:tcPr>
+          <w:p>
+            <w:pPr>
+              <w:pStyle w:val="Normal"/>
+              <w:spacing w:before="40" w:after="40"/>
+              <w:rPr/>
+            </w:pPr>
+            <w:r>
+              <w:rPr>
+                <w:rFonts w:cs="Arial" w:ascii="Arial" w:hAnsi="Arial"/>
+                <w:b/>
+                <w:color w:val="FFFFFF"/>
+                <w:sz w:val="19"/>
+              </w:rPr>
+              <w:t>Lead</w:t>
+            </w:r>
+          </w:p>
+        </w:tc>
+        <w:tc>
+          <w:tcPr>
+            <w:tcW w:w="3024" w:type="dxa"/>
+            <w:tcBorders>
+              <w:top w:val="single" w:sz="4" w:space="0" w:color="A89662"/>
+              <w:left w:val="single" w:sz="4" w:space="0" w:color="A89662"/>
+              <w:bottom w:val="single" w:sz="4" w:space="0" w:color="A89662"/>
+              <w:right w:val="single" w:sz="4" w:space="0" w:color="A89662"/>
+            </w:tcBorders>
+            <w:shd w:fill="002516" w:val="clear"/>
+          </w:tcPr>
+          <w:p>
+            <w:pPr>
+              <w:pStyle w:val="Normal"/>
+              <w:spacing w:before="40" w:after="40"/>
+              <w:rPr/>
+            </w:pPr>
+            <w:r>
+              <w:rPr>
+                <w:rFonts w:cs="Arial" w:ascii="Arial" w:hAnsi="Arial"/>
+                <w:b/>
+                <w:color w:val="FFFFFF"/>
+                <w:sz w:val="19"/>
+              </w:rPr>
+              <w:t>What it looks like</w:t>
+            </w:r>
+          </w:p>
+        </w:tc>
+      </w:tr>
+      <w:tr>
+        <w:trPr>
+          <w:cantSplit w:val="true"/>
+        </w:trPr>
+        <w:tc>
+          <w:tcPr>
+            <w:tcW w:w="3024" w:type="dxa"/>
+            <w:tcBorders>
+              <w:top w:val="single" w:sz="4" w:space="0" w:color="A89662"/>
+              <w:left w:val="single" w:sz="4" w:space="0" w:color="A89662"/>
+              <w:bottom w:val="single" w:sz="4" w:space="0" w:color="A89662"/>
+              <w:right w:val="single" w:sz="4" w:space="0" w:color="A89662"/>
+            </w:tcBorders>
+          </w:tcPr>
+          <w:p>
+            <w:pPr>
+              <w:pStyle w:val="Normal"/>
+              <w:spacing w:before="40" w:after="40"/>
+              <w:rPr/>
+            </w:pPr>
+            <w:r>
+              <w:rPr>
+                <w:rFonts w:cs="Book Antiqua"/>
+                <w:color w:val="000000"/>
+                <w:sz w:val="19"/>
+              </w:rPr>
+              <w:t>Educate</w:t>
+            </w:r>
+          </w:p>
+        </w:tc>
+        <w:tc>
+          <w:tcPr>
+            <w:tcW w:w="3024" w:type="dxa"/>
+            <w:tcBorders>
+              <w:top w:val="single" w:sz="4" w:space="0" w:color="A89662"/>
+              <w:left w:val="single" w:sz="4" w:space="0" w:color="A89662"/>
+              <w:bottom w:val="single" w:sz="4" w:space="0" w:color="A89662"/>
+              <w:right w:val="single" w:sz="4" w:space="0" w:color="A89662"/>
+            </w:tcBorders>
+          </w:tcPr>
+          <w:p>
+            <w:pPr>
+              <w:pStyle w:val="Normal"/>
+              <w:spacing w:before="40" w:after="40"/>
+              <w:rPr/>
+            </w:pPr>
+            <w:r>
+              <w:rPr>
+                <w:rFonts w:cs="Book Antiqua"/>
+                <w:color w:val="000000"/>
+                <w:sz w:val="19"/>
+              </w:rPr>
+              <w:t>NZALC</w:t>
+            </w:r>
+          </w:p>
+        </w:tc>
+        <w:tc>
+          <w:tcPr>
+            <w:tcW w:w="3024" w:type="dxa"/>
+            <w:tcBorders>
+              <w:top w:val="single" w:sz="4" w:space="0" w:color="A89662"/>
+              <w:left w:val="single" w:sz="4" w:space="0" w:color="A89662"/>
+              <w:bottom w:val="single" w:sz="4" w:space="0" w:color="A89662"/>
+              <w:right w:val="single" w:sz="4" w:space="0" w:color="A89662"/>
+            </w:tcBorders>
+          </w:tcPr>
+          <w:p>
+            <w:pPr>
+              <w:pStyle w:val="Normal"/>
+              <w:spacing w:before="40" w:after="40"/>
+              <w:rPr/>
+            </w:pPr>
+            <w:r>
+              <w:rPr>
+                <w:rFonts w:cs="Book Antiqua"/>
+                <w:color w:val="000000"/>
+                <w:sz w:val="19"/>
+              </w:rPr>
+              <w:t>Concepts and toolkit taught and applied through leadership development, Lead Self to Lead Systems</w:t>
+            </w:r>
+          </w:p>
+        </w:tc>
+      </w:tr>
+      <w:tr>
+        <w:trPr>
+          <w:cantSplit w:val="true"/>
+        </w:trPr>
+        <w:tc>
+          <w:tcPr>
+            <w:tcW w:w="3024" w:type="dxa"/>
+            <w:tcBorders>
+              <w:top w:val="single" w:sz="4" w:space="0" w:color="A89662"/>
+              <w:left w:val="single" w:sz="4" w:space="0" w:color="A89662"/>
+              <w:bottom w:val="single" w:sz="4" w:space="0" w:color="A89662"/>
+              <w:right w:val="single" w:sz="4" w:space="0" w:color="A89662"/>
+            </w:tcBorders>
+          </w:tcPr>
+          <w:p>
+            <w:pPr>
+              <w:pStyle w:val="Normal"/>
+              <w:spacing w:before="40" w:after="40"/>
+              <w:rPr/>
+            </w:pPr>
+            <w:r>
+              <w:rPr>
+                <w:rFonts w:cs="Book Antiqua"/>
+                <w:color w:val="000000"/>
+                <w:sz w:val="19"/>
+              </w:rPr>
+              <w:t>Condition</w:t>
+            </w:r>
+          </w:p>
+        </w:tc>
+        <w:tc>
+          <w:tcPr>
+            <w:tcW w:w="3024" w:type="dxa"/>
+            <w:tcBorders>
+              <w:top w:val="single" w:sz="4" w:space="0" w:color="A89662"/>
+              <w:left w:val="single" w:sz="4" w:space="0" w:color="A89662"/>
+              <w:bottom w:val="single" w:sz="4" w:space="0" w:color="A89662"/>
+              <w:right w:val="single" w:sz="4" w:space="0" w:color="A89662"/>
+            </w:tcBorders>
+          </w:tcPr>
+          <w:p>
+            <w:pPr>
+              <w:pStyle w:val="Normal"/>
+              <w:spacing w:before="40" w:after="40"/>
+              <w:rPr/>
+            </w:pPr>
+            <w:r>
+              <w:rPr>
+                <w:rFonts w:cs="Book Antiqua"/>
+                <w:color w:val="000000"/>
+                <w:sz w:val="19"/>
+              </w:rPr>
+              <w:t>HPC</w:t>
+            </w:r>
+          </w:p>
+        </w:tc>
+        <w:tc>
+          <w:tcPr>
+            <w:tcW w:w="3024" w:type="dxa"/>
+            <w:tcBorders>
+              <w:top w:val="single" w:sz="4" w:space="0" w:color="A89662"/>
+              <w:left w:val="single" w:sz="4" w:space="0" w:color="A89662"/>
+              <w:bottom w:val="single" w:sz="4" w:space="0" w:color="A89662"/>
+              <w:right w:val="single" w:sz="4" w:space="0" w:color="A89662"/>
+            </w:tcBorders>
+          </w:tcPr>
+          <w:p>
+            <w:pPr>
+              <w:pStyle w:val="Normal"/>
+              <w:spacing w:before="40" w:after="40"/>
+              <w:rPr/>
+            </w:pPr>
+            <w:r>
+              <w:rPr>
+                <w:rFonts w:cs="Book Antiqua"/>
+                <w:color w:val="000000"/>
+                <w:sz w:val="19"/>
+              </w:rPr>
+              <w:t>COGCON dual-task repetitions embedded in physical training, with adaptive difficulty</w:t>
+            </w:r>
+          </w:p>
+        </w:tc>
+      </w:tr>
+      <w:tr>
+        <w:trPr>
+          <w:cantSplit w:val="true"/>
+        </w:trPr>
+        <w:tc>
+          <w:tcPr>
+            <w:tcW w:w="3024" w:type="dxa"/>
+            <w:tcBorders>
+              <w:top w:val="single" w:sz="4" w:space="0" w:color="A89662"/>
+              <w:left w:val="single" w:sz="4" w:space="0" w:color="A89662"/>
+              <w:bottom w:val="single" w:sz="4" w:space="0" w:color="A89662"/>
+              <w:right w:val="single" w:sz="4" w:space="0" w:color="A89662"/>
+            </w:tcBorders>
+          </w:tcPr>
+          <w:p>
+            <w:pPr>
+              <w:pStyle w:val="Normal"/>
+              <w:spacing w:before="40" w:after="40"/>
+              <w:rPr/>
+            </w:pPr>
+            <w:r>
+              <w:rPr>
+                <w:rFonts w:cs="Book Antiqua"/>
+                <w:color w:val="000000"/>
+                <w:sz w:val="19"/>
+              </w:rPr>
+              <w:t>Expose</w:t>
+            </w:r>
+          </w:p>
+        </w:tc>
+        <w:tc>
+          <w:tcPr>
+            <w:tcW w:w="3024" w:type="dxa"/>
+            <w:tcBorders>
+              <w:top w:val="single" w:sz="4" w:space="0" w:color="A89662"/>
+              <w:left w:val="single" w:sz="4" w:space="0" w:color="A89662"/>
+              <w:bottom w:val="single" w:sz="4" w:space="0" w:color="A89662"/>
+              <w:right w:val="single" w:sz="4" w:space="0" w:color="A89662"/>
+            </w:tcBorders>
+          </w:tcPr>
+          <w:p>
+            <w:pPr>
+              <w:pStyle w:val="Normal"/>
+              <w:spacing w:before="40" w:after="40"/>
+              <w:rPr/>
+            </w:pPr>
+            <w:r>
+              <w:rPr>
+                <w:rFonts w:cs="Book Antiqua"/>
+                <w:color w:val="000000"/>
+                <w:sz w:val="19"/>
+              </w:rPr>
+              <w:t>Joint</w:t>
+            </w:r>
+          </w:p>
+        </w:tc>
+        <w:tc>
+          <w:tcPr>
+            <w:tcW w:w="3024" w:type="dxa"/>
+            <w:tcBorders>
+              <w:top w:val="single" w:sz="4" w:space="0" w:color="A89662"/>
+              <w:left w:val="single" w:sz="4" w:space="0" w:color="A89662"/>
+              <w:bottom w:val="single" w:sz="4" w:space="0" w:color="A89662"/>
+              <w:right w:val="single" w:sz="4" w:space="0" w:color="A89662"/>
+            </w:tcBorders>
+          </w:tcPr>
+          <w:p>
+            <w:pPr>
+              <w:pStyle w:val="Normal"/>
+              <w:spacing w:before="40" w:after="40"/>
+              <w:rPr/>
+            </w:pPr>
+            <w:r>
+              <w:rPr>
+                <w:rFonts w:cs="Book Antiqua"/>
+                <w:color w:val="000000"/>
+                <w:sz w:val="19"/>
+              </w:rPr>
+              <w:t>Scenario and experiential pressure training, co-designed</w:t>
+            </w:r>
+          </w:p>
+        </w:tc>
+      </w:tr>
+      <w:tr>
+        <w:trPr>
+          <w:cantSplit w:val="true"/>
+        </w:trPr>
+        <w:tc>
+          <w:tcPr>
+            <w:tcW w:w="3024" w:type="dxa"/>
+            <w:tcBorders>
+              <w:top w:val="single" w:sz="4" w:space="0" w:color="A89662"/>
+              <w:left w:val="single" w:sz="4" w:space="0" w:color="A89662"/>
+              <w:bottom w:val="single" w:sz="4" w:space="0" w:color="A89662"/>
+              <w:right w:val="single" w:sz="4" w:space="0" w:color="A89662"/>
+            </w:tcBorders>
+          </w:tcPr>
+          <w:p>
+            <w:pPr>
+              <w:pStyle w:val="Normal"/>
+              <w:spacing w:before="40" w:after="40"/>
+              <w:rPr/>
+            </w:pPr>
+            <w:r>
+              <w:rPr>
+                <w:rFonts w:cs="Book Antiqua"/>
+                <w:color w:val="000000"/>
+                <w:sz w:val="19"/>
+              </w:rPr>
+              <w:t>Measure</w:t>
+            </w:r>
+          </w:p>
+        </w:tc>
+        <w:tc>
+          <w:tcPr>
+            <w:tcW w:w="3024" w:type="dxa"/>
+            <w:tcBorders>
+              <w:top w:val="single" w:sz="4" w:space="0" w:color="A89662"/>
+              <w:left w:val="single" w:sz="4" w:space="0" w:color="A89662"/>
+              <w:bottom w:val="single" w:sz="4" w:space="0" w:color="A89662"/>
+              <w:right w:val="single" w:sz="4" w:space="0" w:color="A89662"/>
+            </w:tcBorders>
+          </w:tcPr>
+          <w:p>
+            <w:pPr>
+              <w:pStyle w:val="Normal"/>
+              <w:spacing w:before="40" w:after="40"/>
+              <w:rPr/>
+            </w:pPr>
+            <w:r>
+              <w:rPr>
+                <w:rFonts w:cs="Book Antiqua"/>
+                <w:color w:val="000000"/>
+                <w:sz w:val="19"/>
+              </w:rPr>
+              <w:t>HPC</w:t>
+            </w:r>
+          </w:p>
+        </w:tc>
+        <w:tc>
+          <w:tcPr>
+            <w:tcW w:w="3024" w:type="dxa"/>
+            <w:tcBorders>
+              <w:top w:val="single" w:sz="4" w:space="0" w:color="A89662"/>
+              <w:left w:val="single" w:sz="4" w:space="0" w:color="A89662"/>
+              <w:bottom w:val="single" w:sz="4" w:space="0" w:color="A89662"/>
+              <w:right w:val="single" w:sz="4" w:space="0" w:color="A89662"/>
+            </w:tcBorders>
+          </w:tcPr>
+          <w:p>
+            <w:pPr>
+              <w:pStyle w:val="Normal"/>
+              <w:spacing w:before="40" w:after="40"/>
+              <w:rPr/>
+            </w:pPr>
+            <w:r>
+              <w:rPr>
+                <w:rFonts w:cs="Book Antiqua"/>
+                <w:color w:val="000000"/>
+                <w:sz w:val="19"/>
+              </w:rPr>
+              <w:t>Heart-rate regulation, attention and inhibition thresholds, progression level reached</w:t>
+            </w:r>
+          </w:p>
+        </w:tc>
+      </w:tr>
+      <w:tr>
+        <w:trPr>
+          <w:cantSplit w:val="true"/>
+        </w:trPr>
+        <w:tc>
+          <w:tcPr>
+            <w:tcW w:w="3024" w:type="dxa"/>
+            <w:tcBorders>
+              <w:top w:val="single" w:sz="4" w:space="0" w:color="A89662"/>
+              <w:left w:val="single" w:sz="4" w:space="0" w:color="A89662"/>
+              <w:bottom w:val="single" w:sz="4" w:space="0" w:color="A89662"/>
+              <w:right w:val="single" w:sz="4" w:space="0" w:color="A89662"/>
+            </w:tcBorders>
+          </w:tcPr>
+          <w:p>
+            <w:pPr>
+              <w:pStyle w:val="Normal"/>
+              <w:spacing w:before="40" w:after="40"/>
+              <w:rPr/>
+            </w:pPr>
+            <w:r>
+              <w:rPr>
+                <w:rFonts w:cs="Book Antiqua"/>
+                <w:color w:val="000000"/>
+                <w:sz w:val="19"/>
+              </w:rPr>
+              <w:t>Review and recover</w:t>
+            </w:r>
+          </w:p>
+        </w:tc>
+        <w:tc>
+          <w:tcPr>
+            <w:tcW w:w="3024" w:type="dxa"/>
+            <w:tcBorders>
+              <w:top w:val="single" w:sz="4" w:space="0" w:color="A89662"/>
+              <w:left w:val="single" w:sz="4" w:space="0" w:color="A89662"/>
+              <w:bottom w:val="single" w:sz="4" w:space="0" w:color="A89662"/>
+              <w:right w:val="single" w:sz="4" w:space="0" w:color="A89662"/>
+            </w:tcBorders>
+          </w:tcPr>
+          <w:p>
+            <w:pPr>
+              <w:pStyle w:val="Normal"/>
+              <w:spacing w:before="40" w:after="40"/>
+              <w:rPr/>
+            </w:pPr>
+            <w:r>
+              <w:rPr>
+                <w:rFonts w:cs="Book Antiqua"/>
+                <w:color w:val="000000"/>
+                <w:sz w:val="19"/>
+              </w:rPr>
+              <w:t>NZALC</w:t>
+            </w:r>
+          </w:p>
+        </w:tc>
+        <w:tc>
+          <w:tcPr>
+            <w:tcW w:w="3024" w:type="dxa"/>
+            <w:tcBorders>
+              <w:top w:val="single" w:sz="4" w:space="0" w:color="A89662"/>
+              <w:left w:val="single" w:sz="4" w:space="0" w:color="A89662"/>
+              <w:bottom w:val="single" w:sz="4" w:space="0" w:color="A89662"/>
+              <w:right w:val="single" w:sz="4" w:space="0" w:color="A89662"/>
+            </w:tcBorders>
+          </w:tcPr>
+          <w:p>
+            <w:pPr>
+              <w:pStyle w:val="Normal"/>
+              <w:spacing w:before="40" w:after="40"/>
+              <w:rPr/>
+            </w:pPr>
+            <w:r>
+              <w:rPr>
+                <w:rFonts w:cs="Book Antiqua"/>
+                <w:color w:val="000000"/>
+                <w:sz w:val="19"/>
+              </w:rPr>
+              <w:t>Structured reflection, self and peer feedback, Leadership Development Plans</w:t>
+            </w:r>
+          </w:p>
+        </w:tc>
+      </w:tr>
+      <w:tr>
+        <w:trPr>
+          <w:cantSplit w:val="true"/>
+        </w:trPr>
+        <w:tc>
+          <w:tcPr>
+            <w:tcW w:w="3024" w:type="dxa"/>
+            <w:tcBorders>
+              <w:top w:val="single" w:sz="4" w:space="0" w:color="A89662"/>
+              <w:left w:val="single" w:sz="4" w:space="0" w:color="A89662"/>
+              <w:bottom w:val="single" w:sz="4" w:space="0" w:color="A89662"/>
+              <w:right w:val="single" w:sz="4" w:space="0" w:color="A89662"/>
+            </w:tcBorders>
+          </w:tcPr>
+          <w:p>
+            <w:pPr>
+              <w:pStyle w:val="Normal"/>
+              <w:spacing w:before="40" w:after="40"/>
+              <w:rPr/>
+            </w:pPr>
+            <w:r>
+              <w:rPr>
+                <w:rFonts w:cs="Book Antiqua"/>
+                <w:color w:val="000000"/>
+                <w:sz w:val="19"/>
+              </w:rPr>
+              <w:t>Assure</w:t>
+            </w:r>
+          </w:p>
+        </w:tc>
+        <w:tc>
+          <w:tcPr>
+            <w:tcW w:w="3024" w:type="dxa"/>
+            <w:tcBorders>
+              <w:top w:val="single" w:sz="4" w:space="0" w:color="A89662"/>
+              <w:left w:val="single" w:sz="4" w:space="0" w:color="A89662"/>
+              <w:bottom w:val="single" w:sz="4" w:space="0" w:color="A89662"/>
+              <w:right w:val="single" w:sz="4" w:space="0" w:color="A89662"/>
+            </w:tcBorders>
+          </w:tcPr>
+          <w:p>
+            <w:pPr>
+              <w:pStyle w:val="Normal"/>
+              <w:spacing w:before="40" w:after="40"/>
+              <w:rPr/>
+            </w:pPr>
+            <w:r>
+              <w:rPr>
+                <w:rFonts w:cs="Book Antiqua"/>
+                <w:color w:val="000000"/>
+                <w:sz w:val="19"/>
+              </w:rPr>
+              <w:t>Joint</w:t>
+            </w:r>
+          </w:p>
+        </w:tc>
+        <w:tc>
+          <w:tcPr>
+            <w:tcW w:w="3024" w:type="dxa"/>
+            <w:tcBorders>
+              <w:top w:val="single" w:sz="4" w:space="0" w:color="A89662"/>
+              <w:left w:val="single" w:sz="4" w:space="0" w:color="A89662"/>
+              <w:bottom w:val="single" w:sz="4" w:space="0" w:color="A89662"/>
+              <w:right w:val="single" w:sz="4" w:space="0" w:color="A89662"/>
+            </w:tcBorders>
+          </w:tcPr>
+          <w:p>
+            <w:pPr>
+              <w:pStyle w:val="Normal"/>
+              <w:spacing w:before="40" w:after="40"/>
+              <w:rPr/>
+            </w:pPr>
+            <w:r>
+              <w:rPr>
+                <w:rFonts w:cs="Book Antiqua"/>
+                <w:color w:val="000000"/>
+                <w:sz w:val="19"/>
+              </w:rPr>
+              <w:t>Cognitive-readiness metrics (HPC) alongside observed leadership behaviour (NZALC)</w:t>
+            </w:r>
+          </w:p>
+        </w:tc>
+      </w:tr>
+    </w:tbl>
+    <w:p>
+      <w:pPr>
+        <w:pStyle w:val="Normal"/>
+        <w:spacing w:before="0" w:after="160"/>
+        <w:rPr/>
+      </w:pPr>
+      <w:r>
+        <w:rPr/>
+      </w:r>
+    </w:p>
+    <w:p>
+      <w:pPr>
+        <w:pStyle w:val="Heading2"/>
+        <w:rPr/>
+      </w:pPr>
+      <w:r>
+        <w:rPr>
+          <w:rFonts w:cs="Arial" w:ascii="Arial" w:hAnsi="Arial"/>
+          <w:b/>
+          <w:i w:val="false"/>
+          <w:color w:val="000000"/>
+          <w:sz w:val="22"/>
+        </w:rPr>
+        <w:t>A3. Shared frames</w:t>
+      </w:r>
+    </w:p>
+    <w:p>
+      <w:pPr>
+        <w:pStyle w:val="Normal"/>
+        <w:tabs>
+          <w:tab w:val="clear" w:pos="720"/>
+          <w:tab w:val="left" w:pos="425" w:leader="none"/>
+        </w:tabs>
+        <w:spacing w:before="0" w:after="60"/>
+        <w:ind w:hanging="255" w:left="425"/>
+        <w:rPr/>
+      </w:pPr>
+      <w:r>
+        <w:rPr>
+          <w:rFonts w:cs="Arial" w:ascii="Arial" w:hAnsi="Arial"/>
+          <w:b/>
+          <w:color w:val="C62026"/>
+        </w:rPr>
+        <w:t>•</w:t>
+      </w:r>
+      <w:r>
+        <w:rPr>
+          <w:rFonts w:cs="Arial" w:ascii="Arial" w:hAnsi="Arial"/>
+          <w:b/>
+          <w:color w:val="C62026"/>
+        </w:rPr>
+        <w:tab/>
+      </w:r>
+      <w:r>
+        <w:rPr>
+          <w:rFonts w:cs="Book Antiqua"/>
+          <w:b w:val="false"/>
+          <w:i w:val="false"/>
+        </w:rPr>
+        <w:t>Prepare–Perform–Recover is the common delivery rhythm: COGCON operates principally in Prepare and Perform; NZALC closes the loop in Recover.</w:t>
+      </w:r>
+    </w:p>
+    <w:p>
+      <w:pPr>
+        <w:pStyle w:val="Normal"/>
+        <w:tabs>
+          <w:tab w:val="clear" w:pos="720"/>
+          <w:tab w:val="left" w:pos="425" w:leader="none"/>
+        </w:tabs>
+        <w:spacing w:before="0" w:after="60"/>
+        <w:ind w:hanging="255" w:left="425"/>
+        <w:rPr/>
+      </w:pPr>
+      <w:r>
+        <w:rPr>
+          <w:rFonts w:cs="Arial" w:ascii="Arial" w:hAnsi="Arial"/>
+          <w:b/>
+          <w:color w:val="C62026"/>
+        </w:rPr>
+        <w:t>•</w:t>
+      </w:r>
+      <w:r>
+        <w:rPr>
+          <w:rFonts w:cs="Arial" w:ascii="Arial" w:hAnsi="Arial"/>
+          <w:b/>
+          <w:color w:val="C62026"/>
+        </w:rPr>
+        <w:tab/>
+      </w:r>
+      <w:r>
+        <w:rPr>
+          <w:rFonts w:cs="Book Antiqua"/>
+          <w:b w:val="false"/>
+          <w:i w:val="false"/>
+        </w:rPr>
+        <w:t>Lead Self to Lead Systems is the common progression: conditioning is densest in initial and individual training; leadership application deepens up the continuum.</w:t>
+      </w:r>
+    </w:p>
+    <w:p>
+      <w:pPr>
+        <w:pStyle w:val="Normal"/>
+        <w:tabs>
+          <w:tab w:val="clear" w:pos="720"/>
+          <w:tab w:val="left" w:pos="425" w:leader="none"/>
+        </w:tabs>
+        <w:spacing w:before="0" w:after="60"/>
+        <w:ind w:hanging="255" w:left="425"/>
+        <w:rPr/>
+      </w:pPr>
+      <w:r>
+        <w:rPr>
+          <w:rFonts w:cs="Arial" w:ascii="Arial" w:hAnsi="Arial"/>
+          <w:b/>
+          <w:color w:val="C62026"/>
+        </w:rPr>
+        <w:t>•</w:t>
+      </w:r>
+      <w:r>
+        <w:rPr>
+          <w:rFonts w:cs="Arial" w:ascii="Arial" w:hAnsi="Arial"/>
+          <w:b/>
+          <w:color w:val="C62026"/>
+        </w:rPr>
+        <w:tab/>
+      </w:r>
+      <w:r>
+        <w:rPr>
+          <w:rFonts w:cs="Book Antiqua"/>
+          <w:b w:val="false"/>
+          <w:i w:val="false"/>
+        </w:rPr>
+        <w:t>The Phase 4 pilot embeds the COGCON adaptive dual-task protocol within an existing NZALC serial — NZALC teaching and reviewing, HPC conditioning and measuring — to prove the integration in delivery.</w:t>
       </w:r>
     </w:p>
     <w:sectPr>
@@ -2009,7 +3376,7 @@
         <w:sz w:val="17"/>
         <w:rFonts w:cs="Arial" w:ascii="Arial" w:hAnsi="Arial"/>
       </w:rPr>
-      <w:t>5</w:t>
+      <w:t>7</w:t>
     </w:r>
     <w:r>
       <w:rPr>
@@ -2053,7 +3420,7 @@
         <w:sz w:val="17"/>
         <w:rFonts w:cs="Arial" w:ascii="Arial" w:hAnsi="Arial"/>
       </w:rPr>
-      <w:t>5</w:t>
+      <w:t>7</w:t>
     </w:r>
     <w:r>
       <w:rPr>

</xml_diff>

<commit_message>
Remove References section; fix subtitle leaking into page 2
Drops the formal reference list and rewords in-text callouts to plain
language (COMDT ACS guidance / NZALC capability note). Also fixes the
parser skip condition that let the cover subtitle render as body text
at the top of page 2.

Co-Authored-By: Claude Fable 5 <noreply@anthropic.com>
Claude-Session: https://claude.ai/code/session_01YLo1WfwUDkbwfJEF3ZNVbB
</commit_message>
<xml_diff>
--- a/output/combat-mindset-way-forward.docx
+++ b/output/combat-mindset-way-forward.docx
@@ -265,25 +265,11 @@
     </w:p>
     <w:p>
       <w:pPr>
-        <w:pStyle w:val="Normal"/>
-        <w:spacing w:before="0" w:after="120"/>
-        <w:rPr/>
-      </w:pPr>
-      <w:r>
-        <w:rPr>
-          <w:rFonts w:cs="Book Antiqua"/>
-          <w:b w:val="false"/>
-          <w:i w:val="false"/>
-        </w:rPr>
-        <w:t>*Joint NZALC and Human Performance Cell response to COMDT ACS*</w:t>
-      </w:r>
-    </w:p>
-    <w:p>
-      <w:pPr>
         <w:pStyle w:val="Heading1"/>
         <w:pBdr>
           <w:left w:val="single" w:sz="24" w:space="8" w:color="C62026"/>
         </w:pBdr>
+        <w:spacing w:before="0" w:after="160"/>
         <w:rPr/>
       </w:pPr>
       <w:r>
@@ -340,7 +326,193 @@
           <w:color w:val="002516"/>
           <w:sz w:val="28"/>
         </w:rPr>
-        <w:t>References</w:t>
+        <w:t>1. The problem</w:t>
+      </w:r>
+    </w:p>
+    <w:p>
+      <w:pPr>
+        <w:pStyle w:val="Normal"/>
+        <w:rPr/>
+      </w:pPr>
+      <w:r>
+        <w:rPr>
+          <w:rFonts w:cs="Book Antiqua"/>
+          <w:b w:val="false"/>
+          <w:i w:val="false"/>
+        </w:rPr>
+        <w:t>Army has no defined doctrine or policy supporting Combat Mindset, despite the term being in active use and despite Army's drive toward an increased Warfighter Focus. The COMDT ACS guidance and the NZALC capability note independently reach the same diagnosis:</w:t>
+      </w:r>
+    </w:p>
+    <w:p>
+      <w:pPr>
+        <w:pStyle w:val="Normal"/>
+        <w:spacing w:before="120" w:after="160"/>
+        <w:ind w:left="567" w:right="567"/>
+        <w:rPr/>
+      </w:pPr>
+      <w:r>
+        <w:rPr>
+          <w:rFonts w:cs="Book Antiqua"/>
+          <w:b w:val="false"/>
+          <w:i/>
+        </w:rPr>
+        <w:t>The challenge is not a lack of content. It is a lack of visibility, integration, doctrine and strategic ownership across the substantial capability that already exists within ACS, NZALC, the Human Performance Cell, NZDF Psychology and ILD.</w:t>
+      </w:r>
+    </w:p>
+    <w:p>
+      <w:pPr>
+        <w:pStyle w:val="Normal"/>
+        <w:rPr/>
+      </w:pPr>
+      <w:r>
+        <w:rPr>
+          <w:rFonts w:cs="Book Antiqua"/>
+          <w:b w:val="false"/>
+          <w:i w:val="false"/>
+        </w:rPr>
+        <w:t>The underlying operational problem remains as stated in the NZALC capability note:</w:t>
+      </w:r>
+    </w:p>
+    <w:p>
+      <w:pPr>
+        <w:pStyle w:val="Normal"/>
+        <w:spacing w:before="120" w:after="160"/>
+        <w:ind w:left="567" w:right="567"/>
+        <w:rPr/>
+      </w:pPr>
+      <w:r>
+        <w:rPr>
+          <w:rFonts w:cs="Book Antiqua"/>
+          <w:b w:val="false"/>
+          <w:i/>
+        </w:rPr>
+        <w:t>Under operational pressure, trained individuals and teams do not always retain access to their full capability.</w:t>
+      </w:r>
+    </w:p>
+    <w:p>
+      <w:pPr>
+        <w:pStyle w:val="Normal"/>
+        <w:rPr/>
+      </w:pPr>
+      <w:r>
+        <w:rPr>
+          <w:rFonts w:cs="Book Antiqua"/>
+          <w:b w:val="false"/>
+          <w:i w:val="false"/>
+        </w:rPr>
+        <w:t>NZALC and HPC agree this diagnosis requires no further analysis before work begins. The gap is institutional, not intellectual.</w:t>
+      </w:r>
+    </w:p>
+    <w:p>
+      <w:pPr>
+        <w:pStyle w:val="Normal"/>
+        <w:pBdr>
+          <w:bottom w:val="single" w:sz="6" w:space="1" w:color="A89662"/>
+        </w:pBdr>
+        <w:spacing w:before="200" w:after="200"/>
+        <w:rPr/>
+      </w:pPr>
+      <w:r>
+        <w:rPr/>
+      </w:r>
+    </w:p>
+    <w:p>
+      <w:pPr>
+        <w:pStyle w:val="Heading1"/>
+        <w:pBdr>
+          <w:left w:val="single" w:sz="24" w:space="8" w:color="C62026"/>
+        </w:pBdr>
+        <w:rPr/>
+      </w:pPr>
+      <w:r>
+        <w:rPr>
+          <w:rFonts w:cs="Arial" w:ascii="Arial" w:hAnsi="Arial"/>
+          <w:b/>
+          <w:i w:val="false"/>
+          <w:color w:val="002516"/>
+          <w:sz w:val="28"/>
+        </w:rPr>
+        <w:t>2. Terminology — decision sought</w:t>
+      </w:r>
+    </w:p>
+    <w:p>
+      <w:pPr>
+        <w:pStyle w:val="Normal"/>
+        <w:rPr/>
+      </w:pPr>
+      <w:r>
+        <w:rPr>
+          <w:rFonts w:cs="Book Antiqua"/>
+          <w:b w:val="false"/>
+          <w:i w:val="false"/>
+        </w:rPr>
+        <w:t>The COMDT ACS guidance and the NZALC capability note differ on one structural point: which term sits at the top of the hierarchy. This is the single decision required before the framework can be drafted. Two options are offered.</w:t>
+      </w:r>
+    </w:p>
+    <w:p>
+      <w:pPr>
+        <w:pStyle w:val="Heading2"/>
+        <w:rPr/>
+      </w:pPr>
+      <w:r>
+        <w:rPr>
+          <w:rFonts w:cs="Arial" w:ascii="Arial" w:hAnsi="Arial"/>
+          <w:b/>
+          <w:i w:val="false"/>
+          <w:color w:val="000000"/>
+          <w:sz w:val="22"/>
+        </w:rPr>
+        <w:t>Option 1 — Combat Mindset as the brand; Performance Under Pressure as the mechanism (recommended)</w:t>
+      </w:r>
+    </w:p>
+    <w:p>
+      <w:pPr>
+        <w:pStyle w:val="Normal"/>
+        <w:rPr/>
+      </w:pPr>
+      <w:r>
+        <w:rPr>
+          <w:rFonts w:cs="Book Antiqua"/>
+          <w:b w:val="false"/>
+          <w:i w:val="false"/>
+        </w:rPr>
+        <w:t xml:space="preserve">Combat Mindset is the Army-owned banner and orienting purpose, aligned to Warfighter Focus and carrying the brand promise: </w:t>
+      </w:r>
+      <w:r>
+        <w:rPr>
+          <w:rFonts w:cs="Book Antiqua"/>
+          <w:b/>
+          <w:i w:val="false"/>
+        </w:rPr>
+        <w:t>Harder to Kill</w:t>
+      </w:r>
+      <w:r>
+        <w:rPr>
+          <w:rFonts w:cs="Book Antiqua"/>
+          <w:b w:val="false"/>
+          <w:i w:val="false"/>
+        </w:rPr>
+        <w:t>. Performance Under Pressure is the doctrinal mechanism that sits beneath it — the trained individual and collective capacity the brand runs on.</w:t>
+      </w:r>
+    </w:p>
+    <w:p>
+      <w:pPr>
+        <w:pStyle w:val="Normal"/>
+        <w:pBdr>
+          <w:left w:val="single" w:sz="28" w:space="8" w:color="C62026"/>
+        </w:pBdr>
+        <w:shd w:val="clear" w:color="auto" w:fill="CDD2B7"/>
+        <w:spacing w:before="200" w:after="200"/>
+        <w:ind w:left="340" w:right="340"/>
+        <w:rPr/>
+      </w:pPr>
+      <w:r>
+        <w:rPr>
+          <w:rFonts w:cs="Book Antiqua"/>
+          <w:b/>
+          <w:i w:val="false"/>
+        </w:rPr>
+        <w:t>Combat Mindset is why: acting decisively, persistently and ethically in combat — Harder to Kill. Performance Under Pressure is how: the trained capacity to prepare for, remain effective through, adapt within and recover from pressure.</w:t>
       </w:r>
     </w:p>
     <w:p>
@@ -376,7 +548,7 @@
           <w:b w:val="false"/>
           <w:i w:val="false"/>
         </w:rPr>
-        <w:t>A. COMDT ACS email — Combat Mindset, dated 16 July 2026.</w:t>
+        <w:t>Preserves Combat Mindset as the recognisable, operationally credible Army brand, with Harder to Kill as its memorable, warfighter-focused promise.</w:t>
       </w:r>
     </w:p>
     <w:p>
@@ -412,7 +584,7 @@
           <w:b w:val="false"/>
           <w:i w:val="false"/>
         </w:rPr>
-        <w:t>B. COMDT ACS — Combat Mindset Guidance [Draft], July 2026.</w:t>
+        <w:t>Keeps the underlying doctrine applicable Army-wide — command, crisis response, garrison leadership and high-risk technical activity, where pressure exists without an enemy.</w:t>
       </w:r>
     </w:p>
     <w:p>
@@ -448,225 +620,7 @@
           <w:b w:val="false"/>
           <w:i w:val="false"/>
         </w:rPr>
-        <w:t>C. NZALC Draft Capability Note — Performance Under Pressure and Combat Mindset in the New Zealand Army, July 2026.</w:t>
-      </w:r>
-    </w:p>
-    <w:p>
-      <w:pPr>
-        <w:pStyle w:val="Normal"/>
-        <w:pBdr>
-          <w:bottom w:val="single" w:sz="6" w:space="1" w:color="A89662"/>
-        </w:pBdr>
-        <w:spacing w:before="200" w:after="200"/>
-        <w:rPr/>
-      </w:pPr>
-      <w:r>
-        <w:rPr/>
-      </w:r>
-    </w:p>
-    <w:p>
-      <w:pPr>
-        <w:pStyle w:val="Heading1"/>
-        <w:pBdr>
-          <w:left w:val="single" w:sz="24" w:space="8" w:color="C62026"/>
-        </w:pBdr>
-        <w:rPr/>
-      </w:pPr>
-      <w:r>
-        <w:rPr>
-          <w:rFonts w:cs="Arial" w:ascii="Arial" w:hAnsi="Arial"/>
-          <w:b/>
-          <w:i w:val="false"/>
-          <w:color w:val="002516"/>
-          <w:sz w:val="28"/>
-        </w:rPr>
-        <w:t>1. The problem</w:t>
-      </w:r>
-    </w:p>
-    <w:p>
-      <w:pPr>
-        <w:pStyle w:val="Normal"/>
-        <w:rPr/>
-      </w:pPr>
-      <w:r>
-        <w:rPr>
-          <w:rFonts w:cs="Book Antiqua"/>
-          <w:b w:val="false"/>
-          <w:i w:val="false"/>
-        </w:rPr>
-        <w:t>Reference A identifies that Army has no defined doctrine or policy supporting Combat Mindset, despite the term being in active use and despite Army's drive toward an increased Warfighter Focus. References B and C independently reach the same diagnosis:</w:t>
-      </w:r>
-    </w:p>
-    <w:p>
-      <w:pPr>
-        <w:pStyle w:val="Normal"/>
-        <w:spacing w:before="120" w:after="160"/>
-        <w:ind w:left="567" w:right="567"/>
-        <w:rPr/>
-      </w:pPr>
-      <w:r>
-        <w:rPr>
-          <w:rFonts w:cs="Book Antiqua"/>
-          <w:b w:val="false"/>
-          <w:i/>
-        </w:rPr>
-        <w:t>The challenge is not a lack of content. It is a lack of visibility, integration, doctrine and strategic ownership across the substantial capability that already exists within ACS, NZALC, the Human Performance Cell, NZDF Psychology and ILD.</w:t>
-      </w:r>
-    </w:p>
-    <w:p>
-      <w:pPr>
-        <w:pStyle w:val="Normal"/>
-        <w:rPr/>
-      </w:pPr>
-      <w:r>
-        <w:rPr>
-          <w:rFonts w:cs="Book Antiqua"/>
-          <w:b w:val="false"/>
-          <w:i w:val="false"/>
-        </w:rPr>
-        <w:t>The underlying operational problem remains as stated at Reference C:</w:t>
-      </w:r>
-    </w:p>
-    <w:p>
-      <w:pPr>
-        <w:pStyle w:val="Normal"/>
-        <w:spacing w:before="120" w:after="160"/>
-        <w:ind w:left="567" w:right="567"/>
-        <w:rPr/>
-      </w:pPr>
-      <w:r>
-        <w:rPr>
-          <w:rFonts w:cs="Book Antiqua"/>
-          <w:b w:val="false"/>
-          <w:i/>
-        </w:rPr>
-        <w:t>Under operational pressure, trained individuals and teams do not always retain access to their full capability.</w:t>
-      </w:r>
-    </w:p>
-    <w:p>
-      <w:pPr>
-        <w:pStyle w:val="Normal"/>
-        <w:rPr/>
-      </w:pPr>
-      <w:r>
-        <w:rPr>
-          <w:rFonts w:cs="Book Antiqua"/>
-          <w:b w:val="false"/>
-          <w:i w:val="false"/>
-        </w:rPr>
-        <w:t>NZALC and HPC agree this diagnosis requires no further analysis before work begins. The gap is institutional, not intellectual.</w:t>
-      </w:r>
-    </w:p>
-    <w:p>
-      <w:pPr>
-        <w:pStyle w:val="Normal"/>
-        <w:pBdr>
-          <w:bottom w:val="single" w:sz="6" w:space="1" w:color="A89662"/>
-        </w:pBdr>
-        <w:spacing w:before="200" w:after="200"/>
-        <w:rPr/>
-      </w:pPr>
-      <w:r>
-        <w:rPr/>
-      </w:r>
-    </w:p>
-    <w:p>
-      <w:pPr>
-        <w:pStyle w:val="Heading1"/>
-        <w:pBdr>
-          <w:left w:val="single" w:sz="24" w:space="8" w:color="C62026"/>
-        </w:pBdr>
-        <w:rPr/>
-      </w:pPr>
-      <w:r>
-        <w:rPr>
-          <w:rFonts w:cs="Arial" w:ascii="Arial" w:hAnsi="Arial"/>
-          <w:b/>
-          <w:i w:val="false"/>
-          <w:color w:val="002516"/>
-          <w:sz w:val="28"/>
-        </w:rPr>
-        <w:t>2. Terminology — decision sought</w:t>
-      </w:r>
-    </w:p>
-    <w:p>
-      <w:pPr>
-        <w:pStyle w:val="Normal"/>
-        <w:rPr/>
-      </w:pPr>
-      <w:r>
-        <w:rPr>
-          <w:rFonts w:cs="Book Antiqua"/>
-          <w:b w:val="false"/>
-          <w:i w:val="false"/>
-        </w:rPr>
-        <w:t>References B and C differ on one structural point: which term sits at the top of the hierarchy. This is the single decision required before the framework can be drafted. Two options are offered.</w:t>
-      </w:r>
-    </w:p>
-    <w:p>
-      <w:pPr>
-        <w:pStyle w:val="Heading2"/>
-        <w:rPr/>
-      </w:pPr>
-      <w:r>
-        <w:rPr>
-          <w:rFonts w:cs="Arial" w:ascii="Arial" w:hAnsi="Arial"/>
-          <w:b/>
-          <w:i w:val="false"/>
-          <w:color w:val="000000"/>
-          <w:sz w:val="22"/>
-        </w:rPr>
-        <w:t>Option 1 — Combat Mindset as the brand; Performance Under Pressure as the mechanism (recommended)</w:t>
-      </w:r>
-    </w:p>
-    <w:p>
-      <w:pPr>
-        <w:pStyle w:val="Normal"/>
-        <w:rPr/>
-      </w:pPr>
-      <w:r>
-        <w:rPr>
-          <w:rFonts w:cs="Book Antiqua"/>
-          <w:b w:val="false"/>
-          <w:i w:val="false"/>
-        </w:rPr>
-        <w:t xml:space="preserve">Combat Mindset is the Army-owned banner and orienting purpose, aligned to Warfighter Focus and carrying the brand promise: </w:t>
-      </w:r>
-      <w:r>
-        <w:rPr>
-          <w:rFonts w:cs="Book Antiqua"/>
-          <w:b/>
-          <w:i w:val="false"/>
-        </w:rPr>
-        <w:t>Harder to Kill</w:t>
-      </w:r>
-      <w:r>
-        <w:rPr>
-          <w:rFonts w:cs="Book Antiqua"/>
-          <w:b w:val="false"/>
-          <w:i w:val="false"/>
-        </w:rPr>
-        <w:t>. Performance Under Pressure is the doctrinal mechanism that sits beneath it — the trained individual and collective capacity the brand runs on.</w:t>
-      </w:r>
-    </w:p>
-    <w:p>
-      <w:pPr>
-        <w:pStyle w:val="Normal"/>
-        <w:pBdr>
-          <w:left w:val="single" w:sz="28" w:space="8" w:color="C62026"/>
-        </w:pBdr>
-        <w:shd w:val="clear" w:color="auto" w:fill="CDD2B7"/>
-        <w:spacing w:before="200" w:after="200"/>
-        <w:ind w:left="340" w:right="340"/>
-        <w:rPr/>
-      </w:pPr>
-      <w:r>
-        <w:rPr>
-          <w:rFonts w:cs="Book Antiqua"/>
-          <w:b/>
-          <w:i w:val="false"/>
-        </w:rPr>
-        <w:t>Combat Mindset is why: acting decisively, persistently and ethically in combat — Harder to Kill. Performance Under Pressure is how: the trained capacity to prepare for, remain effective through, adapt within and recover from pressure.</w:t>
+        <w:t>Guards against Combat Mindset being misread as aggression or motivation alone.</w:t>
       </w:r>
     </w:p>
     <w:p>
@@ -702,7 +656,37 @@
           <w:b w:val="false"/>
           <w:i w:val="false"/>
         </w:rPr>
-        <w:t>Preserves Combat Mindset as the recognisable, operationally credible Army brand, with Harder to Kill as its memorable, warfighter-focused promise.</w:t>
+        <w:t>Allows the doctrinal construct to nest cleanly beneath the brand in doctrine, learning design and assessment.</w:t>
+      </w:r>
+    </w:p>
+    <w:p>
+      <w:pPr>
+        <w:pStyle w:val="Heading2"/>
+        <w:rPr/>
+      </w:pPr>
+      <w:r>
+        <w:rPr>
+          <w:rFonts w:cs="Arial" w:ascii="Arial" w:hAnsi="Arial"/>
+          <w:b/>
+          <w:i w:val="false"/>
+          <w:color w:val="000000"/>
+          <w:sz w:val="22"/>
+        </w:rPr>
+        <w:t>Option 2 — Combat Mindset as the umbrella capability</w:t>
+      </w:r>
+    </w:p>
+    <w:p>
+      <w:pPr>
+        <w:pStyle w:val="Normal"/>
+        <w:rPr/>
+      </w:pPr>
+      <w:r>
+        <w:rPr>
+          <w:rFonts w:cs="Book Antiqua"/>
+          <w:b w:val="false"/>
+          <w:i w:val="false"/>
+        </w:rPr>
+        <w:t>Combat Mindset is the overarching capability, integrating leadership, human performance, resilience, mental skills and performance cognition, with performance under pressure expressed as its intended effect.</w:t>
       </w:r>
     </w:p>
     <w:p>
@@ -738,7 +722,7 @@
           <w:b w:val="false"/>
           <w:i w:val="false"/>
         </w:rPr>
-        <w:t>Keeps the underlying doctrine applicable Army-wide — command, crisis response, garrison leadership and high-risk technical activity, where pressure exists without an enemy.</w:t>
+        <w:t>Maximises simplicity: one term, one capability, one framework.</w:t>
       </w:r>
     </w:p>
     <w:p>
@@ -774,159 +758,21 @@
           <w:b w:val="false"/>
           <w:i w:val="false"/>
         </w:rPr>
-        <w:t>Guards against Combat Mindset being misread as aggression or motivation alone.</w:t>
-      </w:r>
-    </w:p>
-    <w:p>
-      <w:pPr>
-        <w:pStyle w:val="Normal"/>
-        <w:tabs>
-          <w:tab w:val="clear" w:pos="720"/>
-          <w:tab w:val="left" w:pos="425" w:leader="none"/>
-        </w:tabs>
-        <w:spacing w:before="0" w:after="60"/>
-        <w:ind w:hanging="255" w:left="425"/>
-        <w:rPr/>
-      </w:pPr>
-      <w:r>
-        <w:rPr>
-          <w:rFonts w:cs="Arial" w:ascii="Arial" w:hAnsi="Arial"/>
-          <w:b/>
-          <w:color w:val="C62026"/>
-        </w:rPr>
-        <w:t>•</w:t>
-      </w:r>
-      <w:r>
-        <w:rPr>
-          <w:rFonts w:cs="Arial" w:ascii="Arial" w:hAnsi="Arial"/>
-          <w:b/>
-          <w:color w:val="C62026"/>
-        </w:rPr>
-        <w:tab/>
-      </w:r>
-      <w:r>
-        <w:rPr>
-          <w:rFonts w:cs="Book Antiqua"/>
-          <w:b w:val="false"/>
-          <w:i w:val="false"/>
-        </w:rPr>
-        <w:t>Allows the doctrinal construct to nest cleanly beneath the brand in doctrine, learning design and assessment.</w:t>
-      </w:r>
-    </w:p>
-    <w:p>
-      <w:pPr>
-        <w:pStyle w:val="Heading2"/>
-        <w:rPr/>
-      </w:pPr>
-      <w:r>
-        <w:rPr>
-          <w:rFonts w:cs="Arial" w:ascii="Arial" w:hAnsi="Arial"/>
-          <w:b/>
-          <w:i w:val="false"/>
-          <w:color w:val="000000"/>
-          <w:sz w:val="22"/>
-        </w:rPr>
-        <w:t>Option 2 — Combat Mindset as the umbrella capability</w:t>
-      </w:r>
-    </w:p>
-    <w:p>
-      <w:pPr>
-        <w:pStyle w:val="Normal"/>
-        <w:rPr/>
-      </w:pPr>
-      <w:r>
-        <w:rPr>
-          <w:rFonts w:cs="Book Antiqua"/>
-          <w:b w:val="false"/>
-          <w:i w:val="false"/>
-        </w:rPr>
-        <w:t>Combat Mindset is the overarching capability, integrating leadership, human performance, resilience, mental skills and performance cognition, with performance under pressure expressed as its intended effect.</w:t>
-      </w:r>
-    </w:p>
-    <w:p>
-      <w:pPr>
-        <w:pStyle w:val="Normal"/>
-        <w:tabs>
-          <w:tab w:val="clear" w:pos="720"/>
-          <w:tab w:val="left" w:pos="425" w:leader="none"/>
-        </w:tabs>
-        <w:spacing w:before="0" w:after="60"/>
-        <w:ind w:hanging="255" w:left="425"/>
-        <w:rPr/>
-      </w:pPr>
-      <w:r>
-        <w:rPr>
-          <w:rFonts w:cs="Arial" w:ascii="Arial" w:hAnsi="Arial"/>
-          <w:b/>
-          <w:color w:val="C62026"/>
-        </w:rPr>
-        <w:t>•</w:t>
-      </w:r>
-      <w:r>
-        <w:rPr>
-          <w:rFonts w:cs="Arial" w:ascii="Arial" w:hAnsi="Arial"/>
-          <w:b/>
-          <w:color w:val="C62026"/>
-        </w:rPr>
-        <w:tab/>
-      </w:r>
-      <w:r>
-        <w:rPr>
-          <w:rFonts w:cs="Book Antiqua"/>
-          <w:b w:val="false"/>
-          <w:i w:val="false"/>
-        </w:rPr>
-        <w:t>Maximises simplicity: one term, one capability, one framework.</w:t>
-      </w:r>
-    </w:p>
-    <w:p>
-      <w:pPr>
-        <w:pStyle w:val="Normal"/>
-        <w:tabs>
-          <w:tab w:val="clear" w:pos="720"/>
-          <w:tab w:val="left" w:pos="425" w:leader="none"/>
-        </w:tabs>
-        <w:spacing w:before="0" w:after="60"/>
-        <w:ind w:hanging="255" w:left="425"/>
-        <w:rPr/>
-      </w:pPr>
-      <w:r>
-        <w:rPr>
-          <w:rFonts w:cs="Arial" w:ascii="Arial" w:hAnsi="Arial"/>
-          <w:b/>
-          <w:color w:val="C62026"/>
-        </w:rPr>
-        <w:t>•</w:t>
-      </w:r>
-      <w:r>
-        <w:rPr>
-          <w:rFonts w:cs="Arial" w:ascii="Arial" w:hAnsi="Arial"/>
-          <w:b/>
-          <w:color w:val="C62026"/>
-        </w:rPr>
-        <w:tab/>
-      </w:r>
-      <w:r>
-        <w:rPr>
-          <w:rFonts w:cs="Book Antiqua"/>
-          <w:b w:val="false"/>
-          <w:i w:val="false"/>
-        </w:rPr>
-        <w:t>Risks excluding the majority of Army activity that is demanding but not combat, and re-importing the definitional confusion identified at Reference C.</w:t>
-      </w:r>
-    </w:p>
-    <w:p>
-      <w:pPr>
-        <w:pStyle w:val="Normal"/>
-        <w:rPr/>
-      </w:pPr>
-      <w:r>
-        <w:rPr>
-          <w:rFonts w:cs="Book Antiqua"/>
-          <w:b w:val="false"/>
-          <w:i w:val="false"/>
-        </w:rPr>
-        <w:t>Both options deliver Reference B's end state. NZALC and HPC jointly recommend Option 1, and will implement whichever option COMDT ACS selects.</w:t>
+        <w:t>Risks excluding the majority of Army activity that is demanding but not combat, and re-importing the definitional confusion identified in the capability note.</w:t>
+      </w:r>
+    </w:p>
+    <w:p>
+      <w:pPr>
+        <w:pStyle w:val="Normal"/>
+        <w:rPr/>
+      </w:pPr>
+      <w:r>
+        <w:rPr>
+          <w:rFonts w:cs="Book Antiqua"/>
+          <w:b w:val="false"/>
+          <w:i w:val="false"/>
+        </w:rPr>
+        <w:t>Both options deliver the end state described in the COMDT ACS guidance. NZALC and HPC jointly recommend Option 1, and will implement whichever option COMDT ACS selects.</w:t>
       </w:r>
     </w:p>
     <w:p>
@@ -1410,7 +1256,7 @@
           <w:b w:val="false"/>
           <w:i w:val="false"/>
         </w:rPr>
-        <w:t>This sequence creates coherence across existing initiatives while avoiding duplication of effort and investment, consistent with Reference B.</w:t>
+        <w:t>This sequence creates coherence across existing initiatives while avoiding duplication of effort and investment, consistent with the COMDT ACS guidance.</w:t>
       </w:r>
     </w:p>
     <w:p>
@@ -1903,7 +1749,7 @@
           <w:b w:val="false"/>
           <w:i w:val="false"/>
         </w:rPr>
-        <w:t xml:space="preserve"> that NZALC and HPC will deliver this programme jointly, with the capability note at Reference C and the COGCON evidence base as its foundation inputs.</w:t>
+        <w:t xml:space="preserve"> that NZALC and HPC will deliver this programme jointly, with the NZALC capability note and the COGCON evidence base as its foundation inputs.</w:t>
       </w:r>
     </w:p>
     <w:p>

</xml_diff>

<commit_message>
Revise way-forward paper: COGCON as MVP, distributed governance (v0.2)
Repositions COGCON as a developmental minimum viable product within
the performance-cognition strand rather than an organising construct;
changes HPC from framework technical authority to COGCON product
steward and performance-cognition adviser; establishes the frame >
capability > framework > strands > products hierarchy; qualifies
Harder to Kill as a proposed Warfighter Focus line pending sponsor
endorsement; converts Phase 4 to a limited MVP integration trial;
rebuilds Annex A as a capability and product architecture. Builder
gains two-column tables and repeating table headers.

Co-Authored-By: Claude Fable 5 <noreply@anthropic.com>
Claude-Session: https://claude.ai/code/session_01YLo1WfwUDkbwfJEF3ZNVbB
</commit_message>
<xml_diff>
--- a/output/combat-mindset-way-forward.docx
+++ b/output/combat-mindset-way-forward.docx
@@ -86,7 +86,7 @@
     <w:p>
       <w:pPr>
         <w:pStyle w:val="Normal"/>
-        <w:spacing w:before="0" w:after="1920"/>
+        <w:spacing w:before="0" w:after="80"/>
         <w:rPr/>
       </w:pPr>
       <w:r>
@@ -98,6 +98,21 @@
           <w:sz w:val="30"/>
         </w:rPr>
         <w:t>HARDER TO KILL</w:t>
+      </w:r>
+    </w:p>
+    <w:p>
+      <w:pPr>
+        <w:pStyle w:val="Normal"/>
+        <w:spacing w:before="0" w:after="1760"/>
+        <w:rPr/>
+      </w:pPr>
+      <w:r>
+        <w:rPr>
+          <w:rFonts w:cs="Arial" w:ascii="Arial" w:hAnsi="Arial"/>
+          <w:color w:val="002516"/>
+          <w:sz w:val="18"/>
+        </w:rPr>
+        <w:t>Proposed Warfighter Focus line — subject to sponsor endorsement</w:t>
       </w:r>
     </w:p>
     <w:p>
@@ -216,7 +231,7 @@
           <w:color w:val="000000"/>
           <w:sz w:val="20"/>
         </w:rPr>
-        <w:t>Draft v0.1</w:t>
+        <w:t>Draft v0.2</w:t>
       </w:r>
     </w:p>
     <w:p>
@@ -294,7 +309,7 @@
           <w:b w:val="false"/>
           <w:i w:val="false"/>
         </w:rPr>
-        <w:t>This paper responds to COMDT ACS direction of 16 July 2026 for NZALC and the Human Performance Cell to jointly develop a strategy to close the Combat Mindset doctrine and policy gap. It proposes an agreed problem statement, a terminology construct for decision, a joint programme of work, and governance arrangements.</w:t>
+        <w:t>This paper responds to COMDT ACS direction of 16 July 2026 for NZALC and the Human Performance Cell to jointly develop a strategy to close the Combat Mindset doctrine and policy gap. It proposes an agreed problem statement, a terminology construct for decision, a programme of work, interim governance arrangements, and an approach for mapping and appropriately nesting existing training products beneath an Army Combat Mindset Framework.</w:t>
       </w:r>
     </w:p>
     <w:p>
@@ -340,7 +355,7 @@
           <w:b w:val="false"/>
           <w:i w:val="false"/>
         </w:rPr>
-        <w:t>Army has no defined doctrine or policy supporting Combat Mindset, despite the term being in active use and despite Army's drive toward an increased Warfighter Focus. The COMDT ACS guidance and the NZALC capability note independently reach the same diagnosis:</w:t>
+        <w:t>Army does not currently have an endorsed, Army-wide definition, doctrine, governance or assurance model for Combat Mindset, despite the term being in active use and despite Army's drive toward an increased Warfighter Focus. The COMDT ACS guidance and the NZALC capability note reach the same diagnosis:</w:t>
       </w:r>
     </w:p>
     <w:p>
@@ -356,7 +371,7 @@
           <w:b w:val="false"/>
           <w:i/>
         </w:rPr>
-        <w:t>The challenge is not a lack of content. It is a lack of visibility, integration, doctrine and strategic ownership across the substantial capability that already exists within ACS, NZALC, the Human Performance Cell, NZDF Psychology and ILD.</w:t>
+        <w:t>Substantial relevant capability already exists across ACS, NZALC, the Human Performance Cell, NZDF Psychology, ILD, training establishments and force employers. The challenge is not primarily a lack of content. It is a lack of visibility, integration, common terminology, strategic ownership and assurance across that existing capability.</w:t>
       </w:r>
     </w:p>
     <w:p>
@@ -400,7 +415,7 @@
           <w:b w:val="false"/>
           <w:i w:val="false"/>
         </w:rPr>
-        <w:t>NZALC and HPC agree this diagnosis requires no further analysis before work begins. The gap is institutional, not intellectual.</w:t>
+        <w:t>Sufficient evidence and existing capability are available to commence governance, mapping and framework development immediately. The present gap is principally institutional and integrative.</w:t>
       </w:r>
     </w:p>
     <w:p>
@@ -462,37 +477,21 @@
           <w:color w:val="000000"/>
           <w:sz w:val="22"/>
         </w:rPr>
-        <w:t>Option 1 — Combat Mindset as the brand; Performance Under Pressure as the mechanism (recommended)</w:t>
-      </w:r>
-    </w:p>
-    <w:p>
-      <w:pPr>
-        <w:pStyle w:val="Normal"/>
-        <w:rPr/>
-      </w:pPr>
-      <w:r>
-        <w:rPr>
-          <w:rFonts w:cs="Book Antiqua"/>
-          <w:b w:val="false"/>
-          <w:i w:val="false"/>
-        </w:rPr>
-        <w:t xml:space="preserve">Combat Mindset is the Army-owned banner and orienting purpose, aligned to Warfighter Focus and carrying the brand promise: </w:t>
-      </w:r>
-      <w:r>
-        <w:rPr>
-          <w:rFonts w:cs="Book Antiqua"/>
-          <w:b/>
-          <w:i w:val="false"/>
-        </w:rPr>
-        <w:t>Harder to Kill</w:t>
-      </w:r>
-      <w:r>
-        <w:rPr>
-          <w:rFonts w:cs="Book Antiqua"/>
-          <w:b w:val="false"/>
-          <w:i w:val="false"/>
-        </w:rPr>
-        <w:t>. Performance Under Pressure is the doctrinal mechanism that sits beneath it — the trained individual and collective capacity the brand runs on.</w:t>
+        <w:t>Option 1 — Combat Mindset as the operational frame; Performance Under Pressure as the underlying capability (recommended)</w:t>
+      </w:r>
+    </w:p>
+    <w:p>
+      <w:pPr>
+        <w:pStyle w:val="Normal"/>
+        <w:rPr/>
+      </w:pPr>
+      <w:r>
+        <w:rPr>
+          <w:rFonts w:cs="Book Antiqua"/>
+          <w:b w:val="false"/>
+          <w:i w:val="false"/>
+        </w:rPr>
+        <w:t>Combat Mindset is the Army-owned operational frame and orienting purpose, aligned to Warfighter Focus. Performance Under Pressure is the trained individual and collective capability beneath it: the capacity to prepare for, remain effective through, adapt within and recover from pressure. Harder to Kill is proposed as a supporting Warfighter Focus communication line, subject to sponsor endorsement, rather than as part of the formal definition.</w:t>
       </w:r>
     </w:p>
     <w:p>
@@ -512,7 +511,7 @@
           <w:b/>
           <w:i w:val="false"/>
         </w:rPr>
-        <w:t>Combat Mindset is why: acting decisively, persistently and ethically in combat — Harder to Kill. Performance Under Pressure is how: the trained capacity to prepare for, remain effective through, adapt within and recover from pressure.</w:t>
+        <w:t>Combat Mindset explains why the capability matters to Army. Performance Under Pressure explains what must be developed and sustained in individuals, teams, leaders and systems.</w:t>
       </w:r>
     </w:p>
     <w:p>
@@ -548,7 +547,7 @@
           <w:b w:val="false"/>
           <w:i w:val="false"/>
         </w:rPr>
-        <w:t>Preserves Combat Mindset as the recognisable, operationally credible Army brand, with Harder to Kill as its memorable, warfighter-focused promise.</w:t>
+        <w:t>Preserves Combat Mindset as the recognisable, operationally credible Army frame.</w:t>
       </w:r>
     </w:p>
     <w:p>
@@ -584,7 +583,7 @@
           <w:b w:val="false"/>
           <w:i w:val="false"/>
         </w:rPr>
-        <w:t>Keeps the underlying doctrine applicable Army-wide — command, crisis response, garrison leadership and high-risk technical activity, where pressure exists without an enemy.</w:t>
+        <w:t>Keeps the underlying capability applicable Army-wide — command, crisis response, garrison leadership and high-risk technical activity, where pressure exists without an enemy.</w:t>
       </w:r>
     </w:p>
     <w:p>
@@ -656,7 +655,7 @@
           <w:b w:val="false"/>
           <w:i w:val="false"/>
         </w:rPr>
-        <w:t>Allows the doctrinal construct to nest cleanly beneath the brand in doctrine, learning design and assessment.</w:t>
+        <w:t>Allows doctrine, the framework, training products and delivery organisations to nest cleanly beneath the frame.</w:t>
       </w:r>
     </w:p>
     <w:p>
@@ -818,7 +817,185 @@
           <w:b w:val="false"/>
           <w:i w:val="false"/>
         </w:rPr>
-        <w:t>A full joint map is the first task of the programme of work. In outline, the known holdings are:</w:t>
+        <w:t>A full capability and product map will be completed during Phase 1. Initial holdings include the following.</w:t>
+      </w:r>
+    </w:p>
+    <w:p>
+      <w:pPr>
+        <w:pStyle w:val="Heading2"/>
+        <w:rPr/>
+      </w:pPr>
+      <w:r>
+        <w:rPr>
+          <w:rFonts w:cs="Arial" w:ascii="Arial" w:hAnsi="Arial"/>
+          <w:b/>
+          <w:i w:val="false"/>
+          <w:color w:val="000000"/>
+          <w:sz w:val="22"/>
+        </w:rPr>
+        <w:t>NZALC Performance Under Pressure package</w:t>
+      </w:r>
+    </w:p>
+    <w:p>
+      <w:pPr>
+        <w:pStyle w:val="Normal"/>
+        <w:rPr/>
+      </w:pPr>
+      <w:r>
+        <w:rPr>
+          <w:rFonts w:cs="Book Antiqua"/>
+          <w:b w:val="false"/>
+          <w:i w:val="false"/>
+        </w:rPr>
+        <w:t>NZALC delivers a leadership-development approach incorporating Performance = Potential – Interference, Red Head–Blue Head, Prepare–Perform–Recover, mental-skills techniques, psychometrics, experiential activity, feedback and Leadership Development Plans. This material is embedded across Lead Self, Lead Teams, Lead Leaders and Lead Systems.</w:t>
+      </w:r>
+    </w:p>
+    <w:p>
+      <w:pPr>
+        <w:pStyle w:val="Heading2"/>
+        <w:rPr/>
+      </w:pPr>
+      <w:r>
+        <w:rPr>
+          <w:rFonts w:cs="Arial" w:ascii="Arial" w:hAnsi="Arial"/>
+          <w:b/>
+          <w:i w:val="false"/>
+          <w:color w:val="000000"/>
+          <w:sz w:val="22"/>
+        </w:rPr>
+        <w:t>Human Performance Cell Cognitive Conditioning programme (COGCON)</w:t>
+      </w:r>
+    </w:p>
+    <w:p>
+      <w:pPr>
+        <w:pStyle w:val="Normal"/>
+        <w:rPr/>
+      </w:pPr>
+      <w:r>
+        <w:rPr>
+          <w:rFonts w:cs="Book Antiqua"/>
+          <w:b w:val="false"/>
+          <w:i w:val="false"/>
+        </w:rPr>
+        <w:t>COGCON is a developmental cognitive-conditioning product designed to train selected dimensions of performance cognition under physical and cognitive load: arousal regulation, attention, cognitive control, working memory, performance monitoring and self-knowledge. Its most mature and potentially scalable component is an adaptive dual-task training module combining a tablet-based cognitive task with a concurrent job-relevant information task, progressive difficulty and performance feedback.</w:t>
+      </w:r>
+    </w:p>
+    <w:p>
+      <w:pPr>
+        <w:pStyle w:val="Normal"/>
+        <w:rPr/>
+      </w:pPr>
+      <w:r>
+        <w:rPr>
+          <w:rFonts w:cs="Book Antiqua"/>
+          <w:b w:val="false"/>
+          <w:i w:val="false"/>
+        </w:rPr>
+        <w:t>COGCON has demonstrated feasibility, participant acceptability and promising training trends in limited military cohorts. It has not yet been validated as a measure of operational readiness or proven through controlled research to improve real-world military performance. Its current status is therefore that of an emerging, evidence-informed training product rather than an endorsed Army-wide capability system.</w:t>
+      </w:r>
+    </w:p>
+    <w:p>
+      <w:pPr>
+        <w:pStyle w:val="Heading2"/>
+        <w:rPr/>
+      </w:pPr>
+      <w:r>
+        <w:rPr>
+          <w:rFonts w:cs="Arial" w:ascii="Arial" w:hAnsi="Arial"/>
+          <w:b/>
+          <w:i w:val="false"/>
+          <w:color w:val="000000"/>
+          <w:sz w:val="22"/>
+        </w:rPr>
+        <w:t>NZDF Psychology, ILD and other stakeholders</w:t>
+      </w:r>
+    </w:p>
+    <w:p>
+      <w:pPr>
+        <w:pStyle w:val="Normal"/>
+        <w:rPr/>
+      </w:pPr>
+      <w:r>
+        <w:rPr>
+          <w:rFonts w:cs="Book Antiqua"/>
+          <w:b w:val="false"/>
+          <w:i w:val="false"/>
+        </w:rPr>
+        <w:t>These organisations hold additional professional expertise, learning products, delivery capability and assurance functions that will be confirmed during Phase 1 mapping.</w:t>
+      </w:r>
+    </w:p>
+    <w:p>
+      <w:pPr>
+        <w:pStyle w:val="Normal"/>
+        <w:rPr/>
+      </w:pPr>
+      <w:r>
+        <w:rPr>
+          <w:rFonts w:cs="Book Antiqua"/>
+          <w:b w:val="false"/>
+          <w:i w:val="false"/>
+        </w:rPr>
+        <w:t>Initial review indicates considerable conceptual alignment across existing products. The Army Combat Mindset Framework will establish a common doctrinal language beneath which individual products and methods can be appropriately nested. It will not require all products to use identical internal methodologies, provided they align to the endorsed framework, outcomes and assurance requirements.</w:t>
+      </w:r>
+    </w:p>
+    <w:p>
+      <w:pPr>
+        <w:pStyle w:val="Normal"/>
+        <w:pBdr>
+          <w:bottom w:val="single" w:sz="6" w:space="1" w:color="A89662"/>
+        </w:pBdr>
+        <w:spacing w:before="200" w:after="200"/>
+        <w:rPr/>
+      </w:pPr>
+      <w:r>
+        <w:rPr/>
+      </w:r>
+    </w:p>
+    <w:p>
+      <w:pPr>
+        <w:pStyle w:val="Heading1"/>
+        <w:pBdr>
+          <w:left w:val="single" w:sz="24" w:space="8" w:color="C62026"/>
+        </w:pBdr>
+        <w:rPr/>
+      </w:pPr>
+      <w:r>
+        <w:rPr>
+          <w:rFonts w:cs="Arial" w:ascii="Arial" w:hAnsi="Arial"/>
+          <w:b/>
+          <w:i w:val="false"/>
+          <w:color w:val="002516"/>
+          <w:sz w:val="28"/>
+        </w:rPr>
+        <w:t>4. COGCON minimum viable product</w:t>
+      </w:r>
+    </w:p>
+    <w:p>
+      <w:pPr>
+        <w:pStyle w:val="Normal"/>
+        <w:rPr/>
+      </w:pPr>
+      <w:r>
+        <w:rPr>
+          <w:rFonts w:cs="Book Antiqua"/>
+          <w:b w:val="false"/>
+          <w:i w:val="false"/>
+        </w:rPr>
+        <w:t>For the purposes of the Combat Mindset programme of work, COGCON will initially be treated as a minimum viable product within the performance-cognition strand of the broader framework.</w:t>
+      </w:r>
+    </w:p>
+    <w:p>
+      <w:pPr>
+        <w:pStyle w:val="Normal"/>
+        <w:rPr/>
+      </w:pPr>
+      <w:r>
+        <w:rPr>
+          <w:rFonts w:cs="Book Antiqua"/>
+          <w:b w:val="false"/>
+          <w:i w:val="false"/>
+        </w:rPr>
+        <w:t>The COGCON MVP comprises:</w:t>
       </w:r>
     </w:p>
     <w:p>
@@ -854,7 +1031,7 @@
           <w:b w:val="false"/>
           <w:i w:val="false"/>
         </w:rPr>
-        <w:t>NZALC — the Performance Under Pressure package (Performance = Potential – Interference, Red Head–Blue Head, Prepare–Perform–Recover, the mental-skills toolkit), embedded across Lead Self, Lead Teams, Lead Leaders and Lead Systems, with experiential delivery, psychometrics, feedback and Leadership Development Plans.</w:t>
+        <w:t>a short adaptive dual-task activity embedded within existing physical or military training;</w:t>
       </w:r>
     </w:p>
     <w:p>
@@ -890,7 +1067,7 @@
           <w:b w:val="false"/>
           <w:i w:val="false"/>
         </w:rPr>
-        <w:t>Human Performance Cell — the Performance Cognition programme (COGCON), including arousal regulation, attention control, cognitive flexibility, decision-making under cognitive load and dual-task performance development, with an associated evidence and measurement base.</w:t>
+        <w:t>a tablet-delivered attention and inhibition task;</w:t>
       </w:r>
     </w:p>
     <w:p>
@@ -926,21 +1103,395 @@
           <w:b w:val="false"/>
           <w:i w:val="false"/>
         </w:rPr>
-        <w:t>NZDF Psychology and ILD — supporting content, professional expertise and delivery capacity to be confirmed during mapping.</w:t>
-      </w:r>
-    </w:p>
-    <w:p>
-      <w:pPr>
-        <w:pStyle w:val="Normal"/>
-        <w:rPr/>
-      </w:pPr>
-      <w:r>
-        <w:rPr>
-          <w:rFonts w:cs="Book Antiqua"/>
-          <w:b w:val="false"/>
-          <w:i w:val="false"/>
-        </w:rPr>
-        <w:t>Initial review indicates the NZALC mental-skills toolkit and the COGCON constructs map closely — for example arousal regulation to tactical breathing and grounding, attention control to noticing and chunking, cognitive flexibility to reframing, and decision-making under load to game planning. The framework will integrate these into a single evidence-based strand rather than two parallel vocabularies. This mapping will be validated jointly during Phase 1.</w:t>
+        <w:t>a concurrent prerecorded operational information task, such as an audio brief;</w:t>
+      </w:r>
+    </w:p>
+    <w:p>
+      <w:pPr>
+        <w:pStyle w:val="Normal"/>
+        <w:tabs>
+          <w:tab w:val="clear" w:pos="720"/>
+          <w:tab w:val="left" w:pos="425" w:leader="none"/>
+        </w:tabs>
+        <w:spacing w:before="0" w:after="60"/>
+        <w:ind w:hanging="255" w:left="425"/>
+        <w:rPr/>
+      </w:pPr>
+      <w:r>
+        <w:rPr>
+          <w:rFonts w:cs="Arial" w:ascii="Arial" w:hAnsi="Arial"/>
+          <w:b/>
+          <w:color w:val="C62026"/>
+        </w:rPr>
+        <w:t>•</w:t>
+      </w:r>
+      <w:r>
+        <w:rPr>
+          <w:rFonts w:cs="Arial" w:ascii="Arial" w:hAnsi="Arial"/>
+          <w:b/>
+          <w:color w:val="C62026"/>
+        </w:rPr>
+        <w:tab/>
+      </w:r>
+      <w:r>
+        <w:rPr>
+          <w:rFonts w:cs="Book Antiqua"/>
+          <w:b w:val="false"/>
+          <w:i w:val="false"/>
+        </w:rPr>
+        <w:t>immediate recall questions or objective job-task scoring;</w:t>
+      </w:r>
+    </w:p>
+    <w:p>
+      <w:pPr>
+        <w:pStyle w:val="Normal"/>
+        <w:tabs>
+          <w:tab w:val="clear" w:pos="720"/>
+          <w:tab w:val="left" w:pos="425" w:leader="none"/>
+        </w:tabs>
+        <w:spacing w:before="0" w:after="60"/>
+        <w:ind w:hanging="255" w:left="425"/>
+        <w:rPr/>
+      </w:pPr>
+      <w:r>
+        <w:rPr>
+          <w:rFonts w:cs="Arial" w:ascii="Arial" w:hAnsi="Arial"/>
+          <w:b/>
+          <w:color w:val="C62026"/>
+        </w:rPr>
+        <w:t>•</w:t>
+      </w:r>
+      <w:r>
+        <w:rPr>
+          <w:rFonts w:cs="Arial" w:ascii="Arial" w:hAnsi="Arial"/>
+          <w:b/>
+          <w:color w:val="C62026"/>
+        </w:rPr>
+        <w:tab/>
+      </w:r>
+      <w:r>
+        <w:rPr>
+          <w:rFonts w:cs="Book Antiqua"/>
+          <w:b w:val="false"/>
+          <w:i w:val="false"/>
+        </w:rPr>
+        <w:t>controlled difficulty levels and defined progression criteria;</w:t>
+      </w:r>
+    </w:p>
+    <w:p>
+      <w:pPr>
+        <w:pStyle w:val="Normal"/>
+        <w:tabs>
+          <w:tab w:val="clear" w:pos="720"/>
+          <w:tab w:val="left" w:pos="425" w:leader="none"/>
+        </w:tabs>
+        <w:spacing w:before="0" w:after="60"/>
+        <w:ind w:hanging="255" w:left="425"/>
+        <w:rPr/>
+      </w:pPr>
+      <w:r>
+        <w:rPr>
+          <w:rFonts w:cs="Arial" w:ascii="Arial" w:hAnsi="Arial"/>
+          <w:b/>
+          <w:color w:val="C62026"/>
+        </w:rPr>
+        <w:t>•</w:t>
+      </w:r>
+      <w:r>
+        <w:rPr>
+          <w:rFonts w:cs="Arial" w:ascii="Arial" w:hAnsi="Arial"/>
+          <w:b/>
+          <w:color w:val="C62026"/>
+        </w:rPr>
+        <w:tab/>
+      </w:r>
+      <w:r>
+        <w:rPr>
+          <w:rFonts w:cs="Book Antiqua"/>
+          <w:b w:val="false"/>
+          <w:i w:val="false"/>
+        </w:rPr>
+        <w:t>selected arousal-regulation techniques;</w:t>
+      </w:r>
+    </w:p>
+    <w:p>
+      <w:pPr>
+        <w:pStyle w:val="Normal"/>
+        <w:tabs>
+          <w:tab w:val="clear" w:pos="720"/>
+          <w:tab w:val="left" w:pos="425" w:leader="none"/>
+        </w:tabs>
+        <w:spacing w:before="0" w:after="60"/>
+        <w:ind w:hanging="255" w:left="425"/>
+        <w:rPr/>
+      </w:pPr>
+      <w:r>
+        <w:rPr>
+          <w:rFonts w:cs="Arial" w:ascii="Arial" w:hAnsi="Arial"/>
+          <w:b/>
+          <w:color w:val="C62026"/>
+        </w:rPr>
+        <w:t>•</w:t>
+      </w:r>
+      <w:r>
+        <w:rPr>
+          <w:rFonts w:cs="Arial" w:ascii="Arial" w:hAnsi="Arial"/>
+          <w:b/>
+          <w:color w:val="C62026"/>
+        </w:rPr>
+        <w:tab/>
+      </w:r>
+      <w:r>
+        <w:rPr>
+          <w:rFonts w:cs="Book Antiqua"/>
+          <w:b w:val="false"/>
+          <w:i w:val="false"/>
+        </w:rPr>
+        <w:t>basic performance feedback and longitudinal training records; and</w:t>
+      </w:r>
+    </w:p>
+    <w:p>
+      <w:pPr>
+        <w:pStyle w:val="Normal"/>
+        <w:tabs>
+          <w:tab w:val="clear" w:pos="720"/>
+          <w:tab w:val="left" w:pos="425" w:leader="none"/>
+        </w:tabs>
+        <w:spacing w:before="0" w:after="60"/>
+        <w:ind w:hanging="255" w:left="425"/>
+        <w:rPr/>
+      </w:pPr>
+      <w:r>
+        <w:rPr>
+          <w:rFonts w:cs="Arial" w:ascii="Arial" w:hAnsi="Arial"/>
+          <w:b/>
+          <w:color w:val="C62026"/>
+        </w:rPr>
+        <w:t>•</w:t>
+      </w:r>
+      <w:r>
+        <w:rPr>
+          <w:rFonts w:cs="Arial" w:ascii="Arial" w:hAnsi="Arial"/>
+          <w:b/>
+          <w:color w:val="C62026"/>
+        </w:rPr>
+        <w:tab/>
+      </w:r>
+      <w:r>
+        <w:rPr>
+          <w:rFonts w:cs="Book Antiqua"/>
+          <w:b w:val="false"/>
+          <w:i w:val="false"/>
+        </w:rPr>
+        <w:t>a train-the-trainer and assurance package allowing delivery by existing training staff.</w:t>
+      </w:r>
+    </w:p>
+    <w:p>
+      <w:pPr>
+        <w:pStyle w:val="Normal"/>
+        <w:rPr/>
+      </w:pPr>
+      <w:r>
+        <w:rPr>
+          <w:rFonts w:cs="Book Antiqua"/>
+          <w:b w:val="false"/>
+          <w:i w:val="false"/>
+        </w:rPr>
+        <w:t>The MVP does not constitute:</w:t>
+      </w:r>
+    </w:p>
+    <w:p>
+      <w:pPr>
+        <w:pStyle w:val="Normal"/>
+        <w:tabs>
+          <w:tab w:val="clear" w:pos="720"/>
+          <w:tab w:val="left" w:pos="425" w:leader="none"/>
+        </w:tabs>
+        <w:spacing w:before="0" w:after="60"/>
+        <w:ind w:hanging="255" w:left="425"/>
+        <w:rPr/>
+      </w:pPr>
+      <w:r>
+        <w:rPr>
+          <w:rFonts w:cs="Arial" w:ascii="Arial" w:hAnsi="Arial"/>
+          <w:b/>
+          <w:color w:val="C62026"/>
+        </w:rPr>
+        <w:t>•</w:t>
+      </w:r>
+      <w:r>
+        <w:rPr>
+          <w:rFonts w:cs="Arial" w:ascii="Arial" w:hAnsi="Arial"/>
+          <w:b/>
+          <w:color w:val="C62026"/>
+        </w:rPr>
+        <w:tab/>
+      </w:r>
+      <w:r>
+        <w:rPr>
+          <w:rFonts w:cs="Book Antiqua"/>
+          <w:b w:val="false"/>
+          <w:i w:val="false"/>
+        </w:rPr>
+        <w:t>a standalone Army course;</w:t>
+      </w:r>
+    </w:p>
+    <w:p>
+      <w:pPr>
+        <w:pStyle w:val="Normal"/>
+        <w:tabs>
+          <w:tab w:val="clear" w:pos="720"/>
+          <w:tab w:val="left" w:pos="425" w:leader="none"/>
+        </w:tabs>
+        <w:spacing w:before="0" w:after="60"/>
+        <w:ind w:hanging="255" w:left="425"/>
+        <w:rPr/>
+      </w:pPr>
+      <w:r>
+        <w:rPr>
+          <w:rFonts w:cs="Arial" w:ascii="Arial" w:hAnsi="Arial"/>
+          <w:b/>
+          <w:color w:val="C62026"/>
+        </w:rPr>
+        <w:t>•</w:t>
+      </w:r>
+      <w:r>
+        <w:rPr>
+          <w:rFonts w:cs="Arial" w:ascii="Arial" w:hAnsi="Arial"/>
+          <w:b/>
+          <w:color w:val="C62026"/>
+        </w:rPr>
+        <w:tab/>
+      </w:r>
+      <w:r>
+        <w:rPr>
+          <w:rFonts w:cs="Book Antiqua"/>
+          <w:b w:val="false"/>
+          <w:i w:val="false"/>
+        </w:rPr>
+        <w:t>a complete Combat Mindset or Performance Under Pressure programme;</w:t>
+      </w:r>
+    </w:p>
+    <w:p>
+      <w:pPr>
+        <w:pStyle w:val="Normal"/>
+        <w:tabs>
+          <w:tab w:val="clear" w:pos="720"/>
+          <w:tab w:val="left" w:pos="425" w:leader="none"/>
+        </w:tabs>
+        <w:spacing w:before="0" w:after="60"/>
+        <w:ind w:hanging="255" w:left="425"/>
+        <w:rPr/>
+      </w:pPr>
+      <w:r>
+        <w:rPr>
+          <w:rFonts w:cs="Arial" w:ascii="Arial" w:hAnsi="Arial"/>
+          <w:b/>
+          <w:color w:val="C62026"/>
+        </w:rPr>
+        <w:t>•</w:t>
+      </w:r>
+      <w:r>
+        <w:rPr>
+          <w:rFonts w:cs="Arial" w:ascii="Arial" w:hAnsi="Arial"/>
+          <w:b/>
+          <w:color w:val="C62026"/>
+        </w:rPr>
+        <w:tab/>
+      </w:r>
+      <w:r>
+        <w:rPr>
+          <w:rFonts w:cs="Book Antiqua"/>
+          <w:b w:val="false"/>
+          <w:i w:val="false"/>
+        </w:rPr>
+        <w:t>a selection, promotion or diagnostic tool;</w:t>
+      </w:r>
+    </w:p>
+    <w:p>
+      <w:pPr>
+        <w:pStyle w:val="Normal"/>
+        <w:tabs>
+          <w:tab w:val="clear" w:pos="720"/>
+          <w:tab w:val="left" w:pos="425" w:leader="none"/>
+        </w:tabs>
+        <w:spacing w:before="0" w:after="60"/>
+        <w:ind w:hanging="255" w:left="425"/>
+        <w:rPr/>
+      </w:pPr>
+      <w:r>
+        <w:rPr>
+          <w:rFonts w:cs="Arial" w:ascii="Arial" w:hAnsi="Arial"/>
+          <w:b/>
+          <w:color w:val="C62026"/>
+        </w:rPr>
+        <w:t>•</w:t>
+      </w:r>
+      <w:r>
+        <w:rPr>
+          <w:rFonts w:cs="Arial" w:ascii="Arial" w:hAnsi="Arial"/>
+          <w:b/>
+          <w:color w:val="C62026"/>
+        </w:rPr>
+        <w:tab/>
+      </w:r>
+      <w:r>
+        <w:rPr>
+          <w:rFonts w:cs="Book Antiqua"/>
+          <w:b w:val="false"/>
+          <w:i w:val="false"/>
+        </w:rPr>
+        <w:t>a validated measure of operational readiness; or</w:t>
+      </w:r>
+    </w:p>
+    <w:p>
+      <w:pPr>
+        <w:pStyle w:val="Normal"/>
+        <w:tabs>
+          <w:tab w:val="clear" w:pos="720"/>
+          <w:tab w:val="left" w:pos="425" w:leader="none"/>
+        </w:tabs>
+        <w:spacing w:before="0" w:after="60"/>
+        <w:ind w:hanging="255" w:left="425"/>
+        <w:rPr/>
+      </w:pPr>
+      <w:r>
+        <w:rPr>
+          <w:rFonts w:cs="Arial" w:ascii="Arial" w:hAnsi="Arial"/>
+          <w:b/>
+          <w:color w:val="C62026"/>
+        </w:rPr>
+        <w:t>•</w:t>
+      </w:r>
+      <w:r>
+        <w:rPr>
+          <w:rFonts w:cs="Arial" w:ascii="Arial" w:hAnsi="Arial"/>
+          <w:b/>
+          <w:color w:val="C62026"/>
+        </w:rPr>
+        <w:tab/>
+      </w:r>
+      <w:r>
+        <w:rPr>
+          <w:rFonts w:cs="Book Antiqua"/>
+          <w:b w:val="false"/>
+          <w:i w:val="false"/>
+        </w:rPr>
+        <w:t>a commitment for HPC personnel to deliver the product across Army.</w:t>
+      </w:r>
+    </w:p>
+    <w:p>
+      <w:pPr>
+        <w:pStyle w:val="Normal"/>
+        <w:rPr/>
+      </w:pPr>
+      <w:r>
+        <w:rPr>
+          <w:rFonts w:cs="Book Antiqua"/>
+          <w:b w:val="false"/>
+          <w:i w:val="false"/>
+        </w:rPr>
+        <w:t>HPC will retain technical stewardship of the COGCON method and provide specialist advice, product development, train-the-trainer support and proportionate assurance within available capacity. Routine delivery, if subsequently approved, will be undertaken through existing training establishments, instructors and physical-training staff.</w:t>
       </w:r>
     </w:p>
     <w:p>
@@ -972,7 +1523,1113 @@
           <w:color w:val="002516"/>
           <w:sz w:val="28"/>
         </w:rPr>
-        <w:t>4. Proposed programme of work</w:t>
+        <w:t>5. Proposed programme of work</w:t>
+      </w:r>
+    </w:p>
+    <w:p>
+      <w:pPr>
+        <w:pStyle w:val="Heading2"/>
+        <w:rPr/>
+      </w:pPr>
+      <w:r>
+        <w:rPr>
+          <w:rFonts w:cs="Arial" w:ascii="Arial" w:hAnsi="Arial"/>
+          <w:b/>
+          <w:i w:val="false"/>
+          <w:color w:val="000000"/>
+          <w:sz w:val="22"/>
+        </w:rPr>
+        <w:t>Phase 0 — Governance and definition (by end July 2026)</w:t>
+      </w:r>
+    </w:p>
+    <w:p>
+      <w:pPr>
+        <w:pStyle w:val="Normal"/>
+        <w:rPr/>
+      </w:pPr>
+      <w:r>
+        <w:rPr>
+          <w:rFonts w:cs="Book Antiqua"/>
+          <w:b w:val="false"/>
+          <w:i w:val="false"/>
+        </w:rPr>
+        <w:t>Confirm interim sponsorship and capability-integration arrangements, endorse the problem statement, select the terminology option at paragraph 2, and draft the Army-endorsed definitions of Combat Mindset and Performance Under Pressure for staffing.</w:t>
+      </w:r>
+    </w:p>
+    <w:p>
+      <w:pPr>
+        <w:pStyle w:val="Heading2"/>
+        <w:rPr/>
+      </w:pPr>
+      <w:r>
+        <w:rPr>
+          <w:rFonts w:cs="Arial" w:ascii="Arial" w:hAnsi="Arial"/>
+          <w:b/>
+          <w:i w:val="false"/>
+          <w:color w:val="000000"/>
+          <w:sz w:val="22"/>
+        </w:rPr>
+        <w:t>Phase 1 — Capability and product mapping (August 2026)</w:t>
+      </w:r>
+    </w:p>
+    <w:p>
+      <w:pPr>
+        <w:pStyle w:val="Normal"/>
+        <w:rPr/>
+      </w:pPr>
+      <w:r>
+        <w:rPr>
+          <w:rFonts w:cs="Book Antiqua"/>
+          <w:b w:val="false"/>
+          <w:i w:val="false"/>
+        </w:rPr>
+        <w:t>Map existing doctrine, content, products, courses, instructor capability, delivery activity, evidence, ownership and assurance arrangements across ACS, NZALC, HPC, NZDF Psychology, ILD, training establishments and selected force employers. The mapping will distinguish:</w:t>
+      </w:r>
+    </w:p>
+    <w:p>
+      <w:pPr>
+        <w:pStyle w:val="Normal"/>
+        <w:tabs>
+          <w:tab w:val="clear" w:pos="720"/>
+          <w:tab w:val="left" w:pos="425" w:leader="none"/>
+        </w:tabs>
+        <w:spacing w:before="0" w:after="60"/>
+        <w:ind w:hanging="255" w:left="425"/>
+        <w:rPr/>
+      </w:pPr>
+      <w:r>
+        <w:rPr>
+          <w:rFonts w:cs="Arial" w:ascii="Arial" w:hAnsi="Arial"/>
+          <w:b/>
+          <w:color w:val="C62026"/>
+        </w:rPr>
+        <w:t>•</w:t>
+      </w:r>
+      <w:r>
+        <w:rPr>
+          <w:rFonts w:cs="Arial" w:ascii="Arial" w:hAnsi="Arial"/>
+          <w:b/>
+          <w:color w:val="C62026"/>
+        </w:rPr>
+        <w:tab/>
+      </w:r>
+      <w:r>
+        <w:rPr>
+          <w:rFonts w:cs="Book Antiqua"/>
+          <w:b w:val="false"/>
+          <w:i w:val="false"/>
+        </w:rPr>
+        <w:t>doctrinal and policy holdings;</w:t>
+      </w:r>
+    </w:p>
+    <w:p>
+      <w:pPr>
+        <w:pStyle w:val="Normal"/>
+        <w:tabs>
+          <w:tab w:val="clear" w:pos="720"/>
+          <w:tab w:val="left" w:pos="425" w:leader="none"/>
+        </w:tabs>
+        <w:spacing w:before="0" w:after="60"/>
+        <w:ind w:hanging="255" w:left="425"/>
+        <w:rPr/>
+      </w:pPr>
+      <w:r>
+        <w:rPr>
+          <w:rFonts w:cs="Arial" w:ascii="Arial" w:hAnsi="Arial"/>
+          <w:b/>
+          <w:color w:val="C62026"/>
+        </w:rPr>
+        <w:t>•</w:t>
+      </w:r>
+      <w:r>
+        <w:rPr>
+          <w:rFonts w:cs="Arial" w:ascii="Arial" w:hAnsi="Arial"/>
+          <w:b/>
+          <w:color w:val="C62026"/>
+        </w:rPr>
+        <w:tab/>
+      </w:r>
+      <w:r>
+        <w:rPr>
+          <w:rFonts w:cs="Book Antiqua"/>
+          <w:b w:val="false"/>
+          <w:i w:val="false"/>
+        </w:rPr>
+        <w:t>capability outcomes;</w:t>
+      </w:r>
+    </w:p>
+    <w:p>
+      <w:pPr>
+        <w:pStyle w:val="Normal"/>
+        <w:tabs>
+          <w:tab w:val="clear" w:pos="720"/>
+          <w:tab w:val="left" w:pos="425" w:leader="none"/>
+        </w:tabs>
+        <w:spacing w:before="0" w:after="60"/>
+        <w:ind w:hanging="255" w:left="425"/>
+        <w:rPr/>
+      </w:pPr>
+      <w:r>
+        <w:rPr>
+          <w:rFonts w:cs="Arial" w:ascii="Arial" w:hAnsi="Arial"/>
+          <w:b/>
+          <w:color w:val="C62026"/>
+        </w:rPr>
+        <w:t>•</w:t>
+      </w:r>
+      <w:r>
+        <w:rPr>
+          <w:rFonts w:cs="Arial" w:ascii="Arial" w:hAnsi="Arial"/>
+          <w:b/>
+          <w:color w:val="C62026"/>
+        </w:rPr>
+        <w:tab/>
+      </w:r>
+      <w:r>
+        <w:rPr>
+          <w:rFonts w:cs="Book Antiqua"/>
+          <w:b w:val="false"/>
+          <w:i w:val="false"/>
+        </w:rPr>
+        <w:t>training products and methods;</w:t>
+      </w:r>
+    </w:p>
+    <w:p>
+      <w:pPr>
+        <w:pStyle w:val="Normal"/>
+        <w:tabs>
+          <w:tab w:val="clear" w:pos="720"/>
+          <w:tab w:val="left" w:pos="425" w:leader="none"/>
+        </w:tabs>
+        <w:spacing w:before="0" w:after="60"/>
+        <w:ind w:hanging="255" w:left="425"/>
+        <w:rPr/>
+      </w:pPr>
+      <w:r>
+        <w:rPr>
+          <w:rFonts w:cs="Arial" w:ascii="Arial" w:hAnsi="Arial"/>
+          <w:b/>
+          <w:color w:val="C62026"/>
+        </w:rPr>
+        <w:t>•</w:t>
+      </w:r>
+      <w:r>
+        <w:rPr>
+          <w:rFonts w:cs="Arial" w:ascii="Arial" w:hAnsi="Arial"/>
+          <w:b/>
+          <w:color w:val="C62026"/>
+        </w:rPr>
+        <w:tab/>
+      </w:r>
+      <w:r>
+        <w:rPr>
+          <w:rFonts w:cs="Book Antiqua"/>
+          <w:b w:val="false"/>
+          <w:i w:val="false"/>
+        </w:rPr>
+        <w:t>delivery organisations;</w:t>
+      </w:r>
+    </w:p>
+    <w:p>
+      <w:pPr>
+        <w:pStyle w:val="Normal"/>
+        <w:tabs>
+          <w:tab w:val="clear" w:pos="720"/>
+          <w:tab w:val="left" w:pos="425" w:leader="none"/>
+        </w:tabs>
+        <w:spacing w:before="0" w:after="60"/>
+        <w:ind w:hanging="255" w:left="425"/>
+        <w:rPr/>
+      </w:pPr>
+      <w:r>
+        <w:rPr>
+          <w:rFonts w:cs="Arial" w:ascii="Arial" w:hAnsi="Arial"/>
+          <w:b/>
+          <w:color w:val="C62026"/>
+        </w:rPr>
+        <w:t>•</w:t>
+      </w:r>
+      <w:r>
+        <w:rPr>
+          <w:rFonts w:cs="Arial" w:ascii="Arial" w:hAnsi="Arial"/>
+          <w:b/>
+          <w:color w:val="C62026"/>
+        </w:rPr>
+        <w:tab/>
+      </w:r>
+      <w:r>
+        <w:rPr>
+          <w:rFonts w:cs="Book Antiqua"/>
+          <w:b w:val="false"/>
+          <w:i w:val="false"/>
+        </w:rPr>
+        <w:t>technical and professional authorities;</w:t>
+      </w:r>
+    </w:p>
+    <w:p>
+      <w:pPr>
+        <w:pStyle w:val="Normal"/>
+        <w:tabs>
+          <w:tab w:val="clear" w:pos="720"/>
+          <w:tab w:val="left" w:pos="425" w:leader="none"/>
+        </w:tabs>
+        <w:spacing w:before="0" w:after="60"/>
+        <w:ind w:hanging="255" w:left="425"/>
+        <w:rPr/>
+      </w:pPr>
+      <w:r>
+        <w:rPr>
+          <w:rFonts w:cs="Arial" w:ascii="Arial" w:hAnsi="Arial"/>
+          <w:b/>
+          <w:color w:val="C62026"/>
+        </w:rPr>
+        <w:t>•</w:t>
+      </w:r>
+      <w:r>
+        <w:rPr>
+          <w:rFonts w:cs="Arial" w:ascii="Arial" w:hAnsi="Arial"/>
+          <w:b/>
+          <w:color w:val="C62026"/>
+        </w:rPr>
+        <w:tab/>
+      </w:r>
+      <w:r>
+        <w:rPr>
+          <w:rFonts w:cs="Book Antiqua"/>
+          <w:b w:val="false"/>
+          <w:i w:val="false"/>
+        </w:rPr>
+        <w:t>evidence maturity;</w:t>
+      </w:r>
+    </w:p>
+    <w:p>
+      <w:pPr>
+        <w:pStyle w:val="Normal"/>
+        <w:tabs>
+          <w:tab w:val="clear" w:pos="720"/>
+          <w:tab w:val="left" w:pos="425" w:leader="none"/>
+        </w:tabs>
+        <w:spacing w:before="0" w:after="60"/>
+        <w:ind w:hanging="255" w:left="425"/>
+        <w:rPr/>
+      </w:pPr>
+      <w:r>
+        <w:rPr>
+          <w:rFonts w:cs="Arial" w:ascii="Arial" w:hAnsi="Arial"/>
+          <w:b/>
+          <w:color w:val="C62026"/>
+        </w:rPr>
+        <w:t>•</w:t>
+      </w:r>
+      <w:r>
+        <w:rPr>
+          <w:rFonts w:cs="Arial" w:ascii="Arial" w:hAnsi="Arial"/>
+          <w:b/>
+          <w:color w:val="C62026"/>
+        </w:rPr>
+        <w:tab/>
+      </w:r>
+      <w:r>
+        <w:rPr>
+          <w:rFonts w:cs="Book Antiqua"/>
+          <w:b w:val="false"/>
+          <w:i w:val="false"/>
+        </w:rPr>
+        <w:t>scalability and resource requirements; and</w:t>
+      </w:r>
+    </w:p>
+    <w:p>
+      <w:pPr>
+        <w:pStyle w:val="Normal"/>
+        <w:tabs>
+          <w:tab w:val="clear" w:pos="720"/>
+          <w:tab w:val="left" w:pos="425" w:leader="none"/>
+        </w:tabs>
+        <w:spacing w:before="0" w:after="60"/>
+        <w:ind w:hanging="255" w:left="425"/>
+        <w:rPr/>
+      </w:pPr>
+      <w:r>
+        <w:rPr>
+          <w:rFonts w:cs="Arial" w:ascii="Arial" w:hAnsi="Arial"/>
+          <w:b/>
+          <w:color w:val="C62026"/>
+        </w:rPr>
+        <w:t>•</w:t>
+      </w:r>
+      <w:r>
+        <w:rPr>
+          <w:rFonts w:cs="Arial" w:ascii="Arial" w:hAnsi="Arial"/>
+          <w:b/>
+          <w:color w:val="C62026"/>
+        </w:rPr>
+        <w:tab/>
+      </w:r>
+      <w:r>
+        <w:rPr>
+          <w:rFonts w:cs="Book Antiqua"/>
+          <w:b w:val="false"/>
+          <w:i w:val="false"/>
+        </w:rPr>
+        <w:t>gaps, duplication and integration opportunities.</w:t>
+      </w:r>
+    </w:p>
+    <w:p>
+      <w:pPr>
+        <w:pStyle w:val="Normal"/>
+        <w:rPr/>
+      </w:pPr>
+      <w:r>
+        <w:rPr>
+          <w:rFonts w:cs="Book Antiqua"/>
+          <w:b w:val="false"/>
+          <w:i w:val="false"/>
+        </w:rPr>
+        <w:t>COGCON will be assessed as one developmental product within this map, with particular attention to its MVP boundary, evidence base, ownership, workforce requirements and scalability.</w:t>
+      </w:r>
+    </w:p>
+    <w:p>
+      <w:pPr>
+        <w:pStyle w:val="Heading2"/>
+        <w:rPr/>
+      </w:pPr>
+      <w:r>
+        <w:rPr>
+          <w:rFonts w:cs="Arial" w:ascii="Arial" w:hAnsi="Arial"/>
+          <w:b/>
+          <w:i w:val="false"/>
+          <w:color w:val="000000"/>
+          <w:sz w:val="22"/>
+        </w:rPr>
+        <w:t>Phase 2 — Framework and product architecture (September 2026)</w:t>
+      </w:r>
+    </w:p>
+    <w:p>
+      <w:pPr>
+        <w:pStyle w:val="Normal"/>
+        <w:rPr/>
+      </w:pPr>
+      <w:r>
+        <w:rPr>
+          <w:rFonts w:cs="Book Antiqua"/>
+          <w:b w:val="false"/>
+          <w:i w:val="false"/>
+        </w:rPr>
+        <w:t>Draft the Army Combat Mindset Framework, including the endorsed definition and desired operational effect; the integrated capability strands; developmental outcomes from Lead Self through Lead Systems; the relationship between doctrine, framework, products and delivery; common assurance principles; and the criteria by which existing and future products may be recognised as contributing to the framework.</w:t>
+      </w:r>
+    </w:p>
+    <w:p>
+      <w:pPr>
+        <w:pStyle w:val="Normal"/>
+        <w:rPr/>
+      </w:pPr>
+      <w:r>
+        <w:rPr>
+          <w:rFonts w:cs="Book Antiqua"/>
+          <w:b w:val="false"/>
+          <w:i w:val="false"/>
+        </w:rPr>
+        <w:t>Existing products, including the NZALC Performance Under Pressure package and the COGCON MVP, will be mapped beneath the relevant capability strands rather than treated as the framework itself.</w:t>
+      </w:r>
+    </w:p>
+    <w:p>
+      <w:pPr>
+        <w:pStyle w:val="Heading2"/>
+        <w:rPr/>
+      </w:pPr>
+      <w:r>
+        <w:rPr>
+          <w:rFonts w:cs="Arial" w:ascii="Arial" w:hAnsi="Arial"/>
+          <w:b/>
+          <w:i w:val="false"/>
+          <w:color w:val="000000"/>
+          <w:sz w:val="22"/>
+        </w:rPr>
+        <w:t>Phase 3 — Stakeholder forum (September 2026)</w:t>
+      </w:r>
+    </w:p>
+    <w:p>
+      <w:pPr>
+        <w:pStyle w:val="Normal"/>
+        <w:rPr/>
+      </w:pPr>
+      <w:r>
+        <w:rPr>
+          <w:rFonts w:cs="Book Antiqua"/>
+          <w:b w:val="false"/>
+          <w:i w:val="false"/>
+        </w:rPr>
+        <w:t>Convene ACS, NZALC, HPC, NZDF Psychology, ILD, selected training providers and force employers to refine the framework, product architecture, governance model and implementation priorities.</w:t>
+      </w:r>
+    </w:p>
+    <w:p>
+      <w:pPr>
+        <w:pStyle w:val="Heading2"/>
+        <w:rPr/>
+      </w:pPr>
+      <w:r>
+        <w:rPr>
+          <w:rFonts w:cs="Arial" w:ascii="Arial" w:hAnsi="Arial"/>
+          <w:b/>
+          <w:i w:val="false"/>
+          <w:color w:val="000000"/>
+          <w:sz w:val="22"/>
+        </w:rPr>
+        <w:t>Phase 4 — Limited MVP integration trial (October 2026, subject to capacity)</w:t>
+      </w:r>
+    </w:p>
+    <w:p>
+      <w:pPr>
+        <w:pStyle w:val="Normal"/>
+        <w:rPr/>
+      </w:pPr>
+      <w:r>
+        <w:rPr>
+          <w:rFonts w:cs="Book Antiqua"/>
+          <w:b w:val="false"/>
+          <w:i w:val="false"/>
+        </w:rPr>
+        <w:t>Conduct a controlled trial of the draft framework and the COGCON MVP within one existing ACS or NZALC training activity. The trial will:</w:t>
+      </w:r>
+    </w:p>
+    <w:p>
+      <w:pPr>
+        <w:pStyle w:val="Normal"/>
+        <w:tabs>
+          <w:tab w:val="clear" w:pos="720"/>
+          <w:tab w:val="left" w:pos="425" w:leader="none"/>
+        </w:tabs>
+        <w:spacing w:before="0" w:after="60"/>
+        <w:ind w:hanging="255" w:left="425"/>
+        <w:rPr/>
+      </w:pPr>
+      <w:r>
+        <w:rPr>
+          <w:rFonts w:cs="Arial" w:ascii="Arial" w:hAnsi="Arial"/>
+          <w:b/>
+          <w:color w:val="C62026"/>
+        </w:rPr>
+        <w:t>•</w:t>
+      </w:r>
+      <w:r>
+        <w:rPr>
+          <w:rFonts w:cs="Arial" w:ascii="Arial" w:hAnsi="Arial"/>
+          <w:b/>
+          <w:color w:val="C62026"/>
+        </w:rPr>
+        <w:tab/>
+      </w:r>
+      <w:r>
+        <w:rPr>
+          <w:rFonts w:cs="Book Antiqua"/>
+          <w:b w:val="false"/>
+          <w:i w:val="false"/>
+        </w:rPr>
+        <w:t>use existing delivery staff and training infrastructure;</w:t>
+      </w:r>
+    </w:p>
+    <w:p>
+      <w:pPr>
+        <w:pStyle w:val="Normal"/>
+        <w:tabs>
+          <w:tab w:val="clear" w:pos="720"/>
+          <w:tab w:val="left" w:pos="425" w:leader="none"/>
+        </w:tabs>
+        <w:spacing w:before="0" w:after="60"/>
+        <w:ind w:hanging="255" w:left="425"/>
+        <w:rPr/>
+      </w:pPr>
+      <w:r>
+        <w:rPr>
+          <w:rFonts w:cs="Arial" w:ascii="Arial" w:hAnsi="Arial"/>
+          <w:b/>
+          <w:color w:val="C62026"/>
+        </w:rPr>
+        <w:t>•</w:t>
+      </w:r>
+      <w:r>
+        <w:rPr>
+          <w:rFonts w:cs="Arial" w:ascii="Arial" w:hAnsi="Arial"/>
+          <w:b/>
+          <w:color w:val="C62026"/>
+        </w:rPr>
+        <w:tab/>
+      </w:r>
+      <w:r>
+        <w:rPr>
+          <w:rFonts w:cs="Book Antiqua"/>
+          <w:b w:val="false"/>
+          <w:i w:val="false"/>
+        </w:rPr>
+        <w:t>incorporate one bounded COGCON adaptive dual-task activity;</w:t>
+      </w:r>
+    </w:p>
+    <w:p>
+      <w:pPr>
+        <w:pStyle w:val="Normal"/>
+        <w:tabs>
+          <w:tab w:val="clear" w:pos="720"/>
+          <w:tab w:val="left" w:pos="425" w:leader="none"/>
+        </w:tabs>
+        <w:spacing w:before="0" w:after="60"/>
+        <w:ind w:hanging="255" w:left="425"/>
+        <w:rPr/>
+      </w:pPr>
+      <w:r>
+        <w:rPr>
+          <w:rFonts w:cs="Arial" w:ascii="Arial" w:hAnsi="Arial"/>
+          <w:b/>
+          <w:color w:val="C62026"/>
+        </w:rPr>
+        <w:t>•</w:t>
+      </w:r>
+      <w:r>
+        <w:rPr>
+          <w:rFonts w:cs="Arial" w:ascii="Arial" w:hAnsi="Arial"/>
+          <w:b/>
+          <w:color w:val="C62026"/>
+        </w:rPr>
+        <w:tab/>
+      </w:r>
+      <w:r>
+        <w:rPr>
+          <w:rFonts w:cs="Book Antiqua"/>
+          <w:b w:val="false"/>
+          <w:i w:val="false"/>
+        </w:rPr>
+        <w:t>test whether the product nests coherently beneath the draft framework;</w:t>
+      </w:r>
+    </w:p>
+    <w:p>
+      <w:pPr>
+        <w:pStyle w:val="Normal"/>
+        <w:tabs>
+          <w:tab w:val="clear" w:pos="720"/>
+          <w:tab w:val="left" w:pos="425" w:leader="none"/>
+        </w:tabs>
+        <w:spacing w:before="0" w:after="60"/>
+        <w:ind w:hanging="255" w:left="425"/>
+        <w:rPr/>
+      </w:pPr>
+      <w:r>
+        <w:rPr>
+          <w:rFonts w:cs="Arial" w:ascii="Arial" w:hAnsi="Arial"/>
+          <w:b/>
+          <w:color w:val="C62026"/>
+        </w:rPr>
+        <w:t>•</w:t>
+      </w:r>
+      <w:r>
+        <w:rPr>
+          <w:rFonts w:cs="Arial" w:ascii="Arial" w:hAnsi="Arial"/>
+          <w:b/>
+          <w:color w:val="C62026"/>
+        </w:rPr>
+        <w:tab/>
+      </w:r>
+      <w:r>
+        <w:rPr>
+          <w:rFonts w:cs="Book Antiqua"/>
+          <w:b w:val="false"/>
+          <w:i w:val="false"/>
+        </w:rPr>
+        <w:t>assess instructor burden, delivery consistency and participant usability;</w:t>
+      </w:r>
+    </w:p>
+    <w:p>
+      <w:pPr>
+        <w:pStyle w:val="Normal"/>
+        <w:tabs>
+          <w:tab w:val="clear" w:pos="720"/>
+          <w:tab w:val="left" w:pos="425" w:leader="none"/>
+        </w:tabs>
+        <w:spacing w:before="0" w:after="60"/>
+        <w:ind w:hanging="255" w:left="425"/>
+        <w:rPr/>
+      </w:pPr>
+      <w:r>
+        <w:rPr>
+          <w:rFonts w:cs="Arial" w:ascii="Arial" w:hAnsi="Arial"/>
+          <w:b/>
+          <w:color w:val="C62026"/>
+        </w:rPr>
+        <w:t>•</w:t>
+      </w:r>
+      <w:r>
+        <w:rPr>
+          <w:rFonts w:cs="Arial" w:ascii="Arial" w:hAnsi="Arial"/>
+          <w:b/>
+          <w:color w:val="C62026"/>
+        </w:rPr>
+        <w:tab/>
+      </w:r>
+      <w:r>
+        <w:rPr>
+          <w:rFonts w:cs="Book Antiqua"/>
+          <w:b w:val="false"/>
+          <w:i w:val="false"/>
+        </w:rPr>
+        <w:t>collect proportionate training and implementation evidence;</w:t>
+      </w:r>
+    </w:p>
+    <w:p>
+      <w:pPr>
+        <w:pStyle w:val="Normal"/>
+        <w:tabs>
+          <w:tab w:val="clear" w:pos="720"/>
+          <w:tab w:val="left" w:pos="425" w:leader="none"/>
+        </w:tabs>
+        <w:spacing w:before="0" w:after="60"/>
+        <w:ind w:hanging="255" w:left="425"/>
+        <w:rPr/>
+      </w:pPr>
+      <w:r>
+        <w:rPr>
+          <w:rFonts w:cs="Arial" w:ascii="Arial" w:hAnsi="Arial"/>
+          <w:b/>
+          <w:color w:val="C62026"/>
+        </w:rPr>
+        <w:t>•</w:t>
+      </w:r>
+      <w:r>
+        <w:rPr>
+          <w:rFonts w:cs="Arial" w:ascii="Arial" w:hAnsi="Arial"/>
+          <w:b/>
+          <w:color w:val="C62026"/>
+        </w:rPr>
+        <w:tab/>
+      </w:r>
+      <w:r>
+        <w:rPr>
+          <w:rFonts w:cs="Book Antiqua"/>
+          <w:b w:val="false"/>
+          <w:i w:val="false"/>
+        </w:rPr>
+        <w:t>avoid readiness certification or high-stakes personnel assessment; and</w:t>
+      </w:r>
+    </w:p>
+    <w:p>
+      <w:pPr>
+        <w:pStyle w:val="Normal"/>
+        <w:tabs>
+          <w:tab w:val="clear" w:pos="720"/>
+          <w:tab w:val="left" w:pos="425" w:leader="none"/>
+        </w:tabs>
+        <w:spacing w:before="0" w:after="60"/>
+        <w:ind w:hanging="255" w:left="425"/>
+        <w:rPr/>
+      </w:pPr>
+      <w:r>
+        <w:rPr>
+          <w:rFonts w:cs="Arial" w:ascii="Arial" w:hAnsi="Arial"/>
+          <w:b/>
+          <w:color w:val="C62026"/>
+        </w:rPr>
+        <w:t>•</w:t>
+      </w:r>
+      <w:r>
+        <w:rPr>
+          <w:rFonts w:cs="Arial" w:ascii="Arial" w:hAnsi="Arial"/>
+          <w:b/>
+          <w:color w:val="C62026"/>
+        </w:rPr>
+        <w:tab/>
+      </w:r>
+      <w:r>
+        <w:rPr>
+          <w:rFonts w:cs="Book Antiqua"/>
+          <w:b w:val="false"/>
+          <w:i w:val="false"/>
+        </w:rPr>
+        <w:t>identify the workforce, technology, assurance and funding requirements for any wider implementation.</w:t>
+      </w:r>
+    </w:p>
+    <w:p>
+      <w:pPr>
+        <w:pStyle w:val="Normal"/>
+        <w:rPr/>
+      </w:pPr>
+      <w:r>
+        <w:rPr>
+          <w:rFonts w:cs="Book Antiqua"/>
+          <w:b w:val="false"/>
+          <w:i w:val="false"/>
+        </w:rPr>
+        <w:t>HPC will provide the protocol, specialist advice and limited evaluation support. NZALC or the relevant training provider will lead delivery and structured review. The trial will not create an enduring obligation for HPC to provide routine delivery.</w:t>
+      </w:r>
+    </w:p>
+    <w:p>
+      <w:pPr>
+        <w:pStyle w:val="Heading2"/>
+        <w:rPr/>
+      </w:pPr>
+      <w:r>
+        <w:rPr>
+          <w:rFonts w:cs="Arial" w:ascii="Arial" w:hAnsi="Arial"/>
+          <w:b/>
+          <w:i w:val="false"/>
+          <w:color w:val="000000"/>
+          <w:sz w:val="22"/>
+        </w:rPr>
+        <w:t>Phase 5 — Report back (November 2026)</w:t>
+      </w:r>
+    </w:p>
+    <w:p>
+      <w:pPr>
+        <w:pStyle w:val="Normal"/>
+        <w:rPr/>
+      </w:pPr>
+      <w:r>
+        <w:rPr>
+          <w:rFonts w:cs="Book Antiqua"/>
+          <w:b w:val="false"/>
+          <w:i w:val="false"/>
+        </w:rPr>
+        <w:t>Present Framework v1.0, the validated capability and product map, the results of any limited MVP integration trial, the proposed governance and assurance model, and a prioritised implementation plan. The report will identify whether COGCON should remain a developmental product; undergo further controlled evaluation; be integrated selectively into existing training; be prepared for broader scaling; or cease or change direction.</w:t>
+      </w:r>
+    </w:p>
+    <w:p>
+      <w:pPr>
+        <w:pStyle w:val="Normal"/>
+        <w:pBdr>
+          <w:bottom w:val="single" w:sz="6" w:space="1" w:color="A89662"/>
+        </w:pBdr>
+        <w:spacing w:before="200" w:after="200"/>
+        <w:rPr/>
+      </w:pPr>
+      <w:r>
+        <w:rPr/>
+      </w:r>
+    </w:p>
+    <w:p>
+      <w:pPr>
+        <w:pStyle w:val="Heading1"/>
+        <w:pBdr>
+          <w:left w:val="single" w:sz="24" w:space="8" w:color="C62026"/>
+        </w:pBdr>
+        <w:rPr/>
+      </w:pPr>
+      <w:r>
+        <w:rPr>
+          <w:rFonts w:cs="Arial" w:ascii="Arial" w:hAnsi="Arial"/>
+          <w:b/>
+          <w:i w:val="false"/>
+          <w:color w:val="002516"/>
+          <w:sz w:val="28"/>
+        </w:rPr>
+        <w:t>6. Governance</w:t>
+      </w:r>
+    </w:p>
+    <w:p>
+      <w:pPr>
+        <w:pStyle w:val="Normal"/>
+        <w:rPr/>
+      </w:pPr>
+      <w:r>
+        <w:rPr>
+          <w:rFonts w:cs="Book Antiqua"/>
+          <w:b w:val="false"/>
+          <w:i w:val="false"/>
+        </w:rPr>
+        <w:t>The following arrangements are proposed for confirmation at Phase 0. Technical and professional authority is distributed by domain; no single organisation owns the evidence base for the entire capability.</w:t>
+      </w:r>
+    </w:p>
+    <w:p>
+      <w:pPr>
+        <w:pStyle w:val="Normal"/>
+        <w:tabs>
+          <w:tab w:val="clear" w:pos="720"/>
+          <w:tab w:val="left" w:pos="425" w:leader="none"/>
+        </w:tabs>
+        <w:spacing w:before="0" w:after="60"/>
+        <w:ind w:hanging="255" w:left="425"/>
+        <w:rPr/>
+      </w:pPr>
+      <w:r>
+        <w:rPr>
+          <w:rFonts w:cs="Arial" w:ascii="Arial" w:hAnsi="Arial"/>
+          <w:b/>
+          <w:color w:val="C62026"/>
+        </w:rPr>
+        <w:t>•</w:t>
+      </w:r>
+      <w:r>
+        <w:rPr>
+          <w:rFonts w:cs="Arial" w:ascii="Arial" w:hAnsi="Arial"/>
+          <w:b/>
+          <w:color w:val="C62026"/>
+        </w:rPr>
+        <w:tab/>
+      </w:r>
+      <w:r>
+        <w:rPr>
+          <w:rFonts w:cs="Book Antiqua"/>
+          <w:b w:val="false"/>
+          <w:i w:val="false"/>
+        </w:rPr>
+        <w:t>Army Sponsor — strategic owner of the Combat Mindset capability at Army level.</w:t>
+      </w:r>
+    </w:p>
+    <w:p>
+      <w:pPr>
+        <w:pStyle w:val="Normal"/>
+        <w:tabs>
+          <w:tab w:val="clear" w:pos="720"/>
+          <w:tab w:val="left" w:pos="425" w:leader="none"/>
+        </w:tabs>
+        <w:spacing w:before="0" w:after="60"/>
+        <w:ind w:hanging="255" w:left="425"/>
+        <w:rPr/>
+      </w:pPr>
+      <w:r>
+        <w:rPr>
+          <w:rFonts w:cs="Arial" w:ascii="Arial" w:hAnsi="Arial"/>
+          <w:b/>
+          <w:color w:val="C62026"/>
+        </w:rPr>
+        <w:t>•</w:t>
+      </w:r>
+      <w:r>
+        <w:rPr>
+          <w:rFonts w:cs="Arial" w:ascii="Arial" w:hAnsi="Arial"/>
+          <w:b/>
+          <w:color w:val="C62026"/>
+        </w:rPr>
+        <w:tab/>
+      </w:r>
+      <w:r>
+        <w:rPr>
+          <w:rFonts w:cs="Book Antiqua"/>
+          <w:b w:val="false"/>
+          <w:i w:val="false"/>
+        </w:rPr>
+        <w:t>Interim capability integrator — COMDT ACS, coordinating framework development, stakeholder engagement and recommendations to the Army Sponsor.</w:t>
+      </w:r>
+    </w:p>
+    <w:p>
+      <w:pPr>
+        <w:pStyle w:val="Normal"/>
+        <w:tabs>
+          <w:tab w:val="clear" w:pos="720"/>
+          <w:tab w:val="left" w:pos="425" w:leader="none"/>
+        </w:tabs>
+        <w:spacing w:before="0" w:after="60"/>
+        <w:ind w:hanging="255" w:left="425"/>
+        <w:rPr/>
+      </w:pPr>
+      <w:r>
+        <w:rPr>
+          <w:rFonts w:cs="Arial" w:ascii="Arial" w:hAnsi="Arial"/>
+          <w:b/>
+          <w:color w:val="C62026"/>
+        </w:rPr>
+        <w:t>•</w:t>
+      </w:r>
+      <w:r>
+        <w:rPr>
+          <w:rFonts w:cs="Arial" w:ascii="Arial" w:hAnsi="Arial"/>
+          <w:b/>
+          <w:color w:val="C62026"/>
+        </w:rPr>
+        <w:tab/>
+      </w:r>
+      <w:r>
+        <w:rPr>
+          <w:rFonts w:cs="Book Antiqua"/>
+          <w:b w:val="false"/>
+          <w:i w:val="false"/>
+        </w:rPr>
+        <w:t>Capability development and delivery coordinator — ACS, leveraging NZALC and wider ACS expertise, intellectual property and programmes.</w:t>
+      </w:r>
+    </w:p>
+    <w:p>
+      <w:pPr>
+        <w:pStyle w:val="Normal"/>
+        <w:tabs>
+          <w:tab w:val="clear" w:pos="720"/>
+          <w:tab w:val="left" w:pos="425" w:leader="none"/>
+        </w:tabs>
+        <w:spacing w:before="0" w:after="60"/>
+        <w:ind w:hanging="255" w:left="425"/>
+        <w:rPr/>
+      </w:pPr>
+      <w:r>
+        <w:rPr>
+          <w:rFonts w:cs="Arial" w:ascii="Arial" w:hAnsi="Arial"/>
+          <w:b/>
+          <w:color w:val="C62026"/>
+        </w:rPr>
+        <w:t>•</w:t>
+      </w:r>
+      <w:r>
+        <w:rPr>
+          <w:rFonts w:cs="Arial" w:ascii="Arial" w:hAnsi="Arial"/>
+          <w:b/>
+          <w:color w:val="C62026"/>
+        </w:rPr>
+        <w:tab/>
+      </w:r>
+      <w:r>
+        <w:rPr>
+          <w:rFonts w:cs="Book Antiqua"/>
+          <w:b w:val="false"/>
+          <w:i w:val="false"/>
+        </w:rPr>
+        <w:t>COGCON product steward and performance-cognition adviser — Human Performance Cell, responsible for the integrity and further development of the COGCON method and for specialist advice on cognitive conditioning and proportionate measurement, within available capacity.</w:t>
+      </w:r>
+    </w:p>
+    <w:p>
+      <w:pPr>
+        <w:pStyle w:val="Normal"/>
+        <w:tabs>
+          <w:tab w:val="clear" w:pos="720"/>
+          <w:tab w:val="left" w:pos="425" w:leader="none"/>
+        </w:tabs>
+        <w:spacing w:before="0" w:after="60"/>
+        <w:ind w:hanging="255" w:left="425"/>
+        <w:rPr/>
+      </w:pPr>
+      <w:r>
+        <w:rPr>
+          <w:rFonts w:cs="Arial" w:ascii="Arial" w:hAnsi="Arial"/>
+          <w:b/>
+          <w:color w:val="C62026"/>
+        </w:rPr>
+        <w:t>•</w:t>
+      </w:r>
+      <w:r>
+        <w:rPr>
+          <w:rFonts w:cs="Arial" w:ascii="Arial" w:hAnsi="Arial"/>
+          <w:b/>
+          <w:color w:val="C62026"/>
+        </w:rPr>
+        <w:tab/>
+      </w:r>
+      <w:r>
+        <w:rPr>
+          <w:rFonts w:cs="Book Antiqua"/>
+          <w:b w:val="false"/>
+          <w:i w:val="false"/>
+        </w:rPr>
+        <w:t>Domain advisers and authorities — NZDF Psychology, ILD, physical-performance specialists, doctrine staff and other relevant organisations, providing technical or professional advice within their respective domains.</w:t>
+      </w:r>
+    </w:p>
+    <w:p>
+      <w:pPr>
+        <w:pStyle w:val="Normal"/>
+        <w:tabs>
+          <w:tab w:val="clear" w:pos="720"/>
+          <w:tab w:val="left" w:pos="425" w:leader="none"/>
+        </w:tabs>
+        <w:spacing w:before="0" w:after="60"/>
+        <w:ind w:hanging="255" w:left="425"/>
+        <w:rPr/>
+      </w:pPr>
+      <w:r>
+        <w:rPr>
+          <w:rFonts w:cs="Arial" w:ascii="Arial" w:hAnsi="Arial"/>
+          <w:b/>
+          <w:color w:val="C62026"/>
+        </w:rPr>
+        <w:t>•</w:t>
+      </w:r>
+      <w:r>
+        <w:rPr>
+          <w:rFonts w:cs="Arial" w:ascii="Arial" w:hAnsi="Arial"/>
+          <w:b/>
+          <w:color w:val="C62026"/>
+        </w:rPr>
+        <w:tab/>
+      </w:r>
+      <w:r>
+        <w:rPr>
+          <w:rFonts w:cs="Book Antiqua"/>
+          <w:b w:val="false"/>
+          <w:i w:val="false"/>
+        </w:rPr>
+        <w:t>Delivery agencies — training establishments, units and existing instructor workforces approved to deliver recognised products.</w:t>
+      </w:r>
+    </w:p>
+    <w:p>
+      <w:pPr>
+        <w:pStyle w:val="Normal"/>
+        <w:tabs>
+          <w:tab w:val="clear" w:pos="720"/>
+          <w:tab w:val="left" w:pos="425" w:leader="none"/>
+        </w:tabs>
+        <w:spacing w:before="0" w:after="60"/>
+        <w:ind w:hanging="255" w:left="425"/>
+        <w:rPr/>
+      </w:pPr>
+      <w:r>
+        <w:rPr>
+          <w:rFonts w:cs="Arial" w:ascii="Arial" w:hAnsi="Arial"/>
+          <w:b/>
+          <w:color w:val="C62026"/>
+        </w:rPr>
+        <w:t>•</w:t>
+      </w:r>
+      <w:r>
+        <w:rPr>
+          <w:rFonts w:cs="Arial" w:ascii="Arial" w:hAnsi="Arial"/>
+          <w:b/>
+          <w:color w:val="C62026"/>
+        </w:rPr>
+        <w:tab/>
+      </w:r>
+      <w:r>
+        <w:rPr>
+          <w:rFonts w:cs="Book Antiqua"/>
+          <w:b w:val="false"/>
+          <w:i w:val="false"/>
+        </w:rPr>
+        <w:t>Assurance — a layered assurance model covering doctrine, evidence, professional content, learning design, delivery quality and operational relevance, with sufficient independence from individual product owners and delivery organisations.</w:t>
+      </w:r>
+    </w:p>
+    <w:p>
+      <w:pPr>
+        <w:pStyle w:val="Normal"/>
+        <w:pBdr>
+          <w:bottom w:val="single" w:sz="6" w:space="1" w:color="A89662"/>
+        </w:pBdr>
+        <w:spacing w:before="200" w:after="200"/>
+        <w:rPr/>
+      </w:pPr>
+      <w:r>
+        <w:rPr/>
+      </w:r>
+    </w:p>
+    <w:p>
+      <w:pPr>
+        <w:pStyle w:val="Heading1"/>
+        <w:pBdr>
+          <w:left w:val="single" w:sz="24" w:space="8" w:color="C62026"/>
+        </w:pBdr>
+        <w:rPr/>
+      </w:pPr>
+      <w:r>
+        <w:rPr>
+          <w:rFonts w:cs="Arial" w:ascii="Arial" w:hAnsi="Arial"/>
+          <w:b/>
+          <w:i w:val="false"/>
+          <w:color w:val="002516"/>
+          <w:sz w:val="28"/>
+        </w:rPr>
+        <w:t>7. Recommendations</w:t>
+      </w:r>
+    </w:p>
+    <w:p>
+      <w:pPr>
+        <w:pStyle w:val="Normal"/>
+        <w:rPr/>
+      </w:pPr>
+      <w:r>
+        <w:rPr>
+          <w:rFonts w:cs="Book Antiqua"/>
+          <w:b w:val="false"/>
+          <w:i w:val="false"/>
+        </w:rPr>
+        <w:t>It is recommended that COMDT ACS:</w:t>
       </w:r>
     </w:p>
     <w:p>
@@ -1001,23 +2658,15 @@
           <w:b/>
           <w:i w:val="false"/>
         </w:rPr>
-        <w:t>Phase 0 — Governance and definition (by end July 2026).</w:t>
-      </w:r>
-    </w:p>
-    <w:p>
-      <w:pPr>
-        <w:pStyle w:val="Normal"/>
-        <w:spacing w:before="0" w:after="120"/>
-        <w:ind w:left="425"/>
-        <w:rPr/>
-      </w:pPr>
-      <w:r>
-        <w:rPr>
-          <w:rFonts w:cs="Book Antiqua"/>
-          <w:b w:val="false"/>
-          <w:i w:val="false"/>
-        </w:rPr>
-        <w:t>Confirm sponsorship and sub-sponsorship arrangements, endorse the problem statement, and select the terminology option at paragraph 2. Draft the Army-endorsed definition of Combat Mindset for staffing.</w:t>
+        <w:t>Endorse the problem statement</w:t>
+      </w:r>
+      <w:r>
+        <w:rPr>
+          <w:rFonts w:cs="Book Antiqua"/>
+          <w:b w:val="false"/>
+          <w:i w:val="false"/>
+        </w:rPr>
+        <w:t xml:space="preserve"> at paragraph 1.</w:t>
       </w:r>
     </w:p>
     <w:p>
@@ -1046,23 +2695,15 @@
           <w:b/>
           <w:i w:val="false"/>
         </w:rPr>
-        <w:t>Phase 1 — Joint mapping and gap analysis (August 2026).</w:t>
-      </w:r>
-    </w:p>
-    <w:p>
-      <w:pPr>
-        <w:pStyle w:val="Normal"/>
-        <w:spacing w:before="0" w:after="120"/>
-        <w:ind w:left="425"/>
-        <w:rPr/>
-      </w:pPr>
-      <w:r>
-        <w:rPr>
-          <w:rFonts w:cs="Book Antiqua"/>
-          <w:b w:val="false"/>
-          <w:i w:val="false"/>
-        </w:rPr>
-        <w:t>Map existing content, courses, instructor capability, delivery activity and assurance mechanisms across ACS, NZALC, HPC, NZDF Psychology and ILD. Scope is Army, with NZDF-level interfaces identified rather than absorbed. Identify gaps, duplication and integration opportunities.</w:t>
+        <w:t>Endorse Combat Mindset as the Army operational frame</w:t>
+      </w:r>
+      <w:r>
+        <w:rPr>
+          <w:rFonts w:cs="Book Antiqua"/>
+          <w:b w:val="false"/>
+          <w:i w:val="false"/>
+        </w:rPr>
+        <w:t xml:space="preserve"> and Performance Under Pressure as the underlying individual and collective capability.</w:t>
       </w:r>
     </w:p>
     <w:p>
@@ -1091,23 +2732,15 @@
           <w:b/>
           <w:i w:val="false"/>
         </w:rPr>
-        <w:t>Phase 2 — Framework development (September 2026).</w:t>
-      </w:r>
-    </w:p>
-    <w:p>
-      <w:pPr>
-        <w:pStyle w:val="Normal"/>
-        <w:spacing w:before="0" w:after="120"/>
-        <w:ind w:left="425"/>
-        <w:rPr/>
-      </w:pPr>
-      <w:r>
-        <w:rPr>
-          <w:rFonts w:cs="Book Antiqua"/>
-          <w:b w:val="false"/>
-          <w:i w:val="false"/>
-        </w:rPr>
-        <w:t>Draft the Army Combat Mindset Framework: definition, desired operational effect, integrated strands (leadership, mental skills, performance cognition, resilience and recovery, values and professional identity, physical performance), and the developmental pathway aligned Lead Self through Lead Systems.</w:t>
+        <w:t>Note that existing programmes and products will be mapped beneath the framework</w:t>
+      </w:r>
+      <w:r>
+        <w:rPr>
+          <w:rFonts w:cs="Book Antiqua"/>
+          <w:b w:val="false"/>
+          <w:i w:val="false"/>
+        </w:rPr>
+        <w:t xml:space="preserve"> and will not constitute the framework in isolation.</w:t>
       </w:r>
     </w:p>
     <w:p>
@@ -1136,23 +2769,15 @@
           <w:b/>
           <w:i w:val="false"/>
         </w:rPr>
-        <w:t>Phase 3 — Stakeholder forum (September 2026).</w:t>
-      </w:r>
-    </w:p>
-    <w:p>
-      <w:pPr>
-        <w:pStyle w:val="Normal"/>
-        <w:spacing w:before="0" w:after="120"/>
-        <w:ind w:left="425"/>
-        <w:rPr/>
-      </w:pPr>
-      <w:r>
-        <w:rPr>
-          <w:rFonts w:cs="Book Antiqua"/>
-          <w:b w:val="false"/>
-          <w:i w:val="false"/>
-        </w:rPr>
-        <w:t>Convene ACS, HPC, NZDF Psychology, ILD and selected force employers to refine the framework and implementation approach.</w:t>
+        <w:t>Endorse COGCON's interim status as a developmental MVP</w:t>
+      </w:r>
+      <w:r>
+        <w:rPr>
+          <w:rFonts w:cs="Book Antiqua"/>
+          <w:b w:val="false"/>
+          <w:i w:val="false"/>
+        </w:rPr>
+        <w:t xml:space="preserve"> within the performance-cognition strand.</w:t>
       </w:r>
     </w:p>
     <w:p>
@@ -1181,23 +2806,15 @@
           <w:b/>
           <w:i w:val="false"/>
         </w:rPr>
-        <w:t>Phase 4 — Pilot (October 2026).</w:t>
-      </w:r>
-    </w:p>
-    <w:p>
-      <w:pPr>
-        <w:pStyle w:val="Normal"/>
-        <w:spacing w:before="0" w:after="120"/>
-        <w:ind w:left="425"/>
-        <w:rPr/>
-      </w:pPr>
-      <w:r>
-        <w:rPr>
-          <w:rFonts w:cs="Book Antiqua"/>
-          <w:b w:val="false"/>
-          <w:i w:val="false"/>
-        </w:rPr>
-        <w:t>Apply the framework to selected existing NZALC or ACS activity before any new content is designed, to prove the framework in delivery and generate evidence for refinement.</w:t>
+        <w:t>Confirm COMDT ACS as the interim capability integrator</w:t>
+      </w:r>
+      <w:r>
+        <w:rPr>
+          <w:rFonts w:cs="Book Antiqua"/>
+          <w:b w:val="false"/>
+          <w:i w:val="false"/>
+        </w:rPr>
+        <w:t xml:space="preserve"> pending confirmation of the Army Sponsor.</w:t>
       </w:r>
     </w:p>
     <w:p>
@@ -1226,345 +2843,15 @@
           <w:b/>
           <w:i w:val="false"/>
         </w:rPr>
-        <w:t>Phase 5 — Report back (November 2026).</w:t>
-      </w:r>
-    </w:p>
-    <w:p>
-      <w:pPr>
-        <w:pStyle w:val="Normal"/>
-        <w:spacing w:before="0" w:after="120"/>
-        <w:ind w:left="425"/>
-        <w:rPr/>
-      </w:pPr>
-      <w:r>
-        <w:rPr>
-          <w:rFonts w:cs="Book Antiqua"/>
-          <w:b w:val="false"/>
-          <w:i w:val="false"/>
-        </w:rPr>
-        <w:t>Present Framework v1.0, the validated capability map, and an implementation and assurance plan for endorsement.</w:t>
-      </w:r>
-    </w:p>
-    <w:p>
-      <w:pPr>
-        <w:pStyle w:val="Normal"/>
-        <w:rPr/>
-      </w:pPr>
-      <w:r>
-        <w:rPr>
-          <w:rFonts w:cs="Book Antiqua"/>
-          <w:b w:val="false"/>
-          <w:i w:val="false"/>
-        </w:rPr>
-        <w:t>This sequence creates coherence across existing initiatives while avoiding duplication of effort and investment, consistent with the COMDT ACS guidance.</w:t>
-      </w:r>
-    </w:p>
-    <w:p>
-      <w:pPr>
-        <w:pStyle w:val="Normal"/>
-        <w:pBdr>
-          <w:bottom w:val="single" w:sz="6" w:space="1" w:color="A89662"/>
-        </w:pBdr>
-        <w:spacing w:before="200" w:after="200"/>
-        <w:rPr/>
-      </w:pPr>
-      <w:r>
-        <w:rPr/>
-      </w:r>
-    </w:p>
-    <w:p>
-      <w:pPr>
-        <w:pStyle w:val="Heading1"/>
-        <w:pBdr>
-          <w:left w:val="single" w:sz="24" w:space="8" w:color="C62026"/>
-        </w:pBdr>
-        <w:rPr/>
-      </w:pPr>
-      <w:r>
-        <w:rPr>
-          <w:rFonts w:cs="Arial" w:ascii="Arial" w:hAnsi="Arial"/>
-          <w:b/>
-          <w:i w:val="false"/>
-          <w:color w:val="002516"/>
-          <w:sz w:val="28"/>
-        </w:rPr>
-        <w:t>5. Governance</w:t>
-      </w:r>
-    </w:p>
-    <w:p>
-      <w:pPr>
-        <w:pStyle w:val="Normal"/>
-        <w:rPr/>
-      </w:pPr>
-      <w:r>
-        <w:rPr>
-          <w:rFonts w:cs="Book Antiqua"/>
-          <w:b w:val="false"/>
-          <w:i w:val="false"/>
-        </w:rPr>
-        <w:t>The following arrangements are proposed for confirmation at Phase 0:</w:t>
-      </w:r>
-    </w:p>
-    <w:p>
-      <w:pPr>
-        <w:pStyle w:val="Normal"/>
-        <w:tabs>
-          <w:tab w:val="clear" w:pos="720"/>
-          <w:tab w:val="left" w:pos="425" w:leader="none"/>
-        </w:tabs>
-        <w:spacing w:before="0" w:after="60"/>
-        <w:ind w:hanging="255" w:left="425"/>
-        <w:rPr/>
-      </w:pPr>
-      <w:r>
-        <w:rPr>
-          <w:rFonts w:cs="Arial" w:ascii="Arial" w:hAnsi="Arial"/>
-          <w:b/>
-          <w:color w:val="C62026"/>
-        </w:rPr>
-        <w:t>•</w:t>
-      </w:r>
-      <w:r>
-        <w:rPr>
-          <w:rFonts w:cs="Arial" w:ascii="Arial" w:hAnsi="Arial"/>
-          <w:b/>
-          <w:color w:val="C62026"/>
-        </w:rPr>
-        <w:tab/>
-      </w:r>
-      <w:r>
-        <w:rPr>
-          <w:rFonts w:cs="Book Antiqua"/>
-          <w:b w:val="false"/>
-          <w:i w:val="false"/>
-        </w:rPr>
-        <w:t>Army Sponsor — strategic owner of the Combat Mindset capability at Army level (to be confirmed through COMDT ACS).</w:t>
-      </w:r>
-    </w:p>
-    <w:p>
-      <w:pPr>
-        <w:pStyle w:val="Normal"/>
-        <w:tabs>
-          <w:tab w:val="clear" w:pos="720"/>
-          <w:tab w:val="left" w:pos="425" w:leader="none"/>
-        </w:tabs>
-        <w:spacing w:before="0" w:after="60"/>
-        <w:ind w:hanging="255" w:left="425"/>
-        <w:rPr/>
-      </w:pPr>
-      <w:r>
-        <w:rPr>
-          <w:rFonts w:cs="Arial" w:ascii="Arial" w:hAnsi="Arial"/>
-          <w:b/>
-          <w:color w:val="C62026"/>
-        </w:rPr>
-        <w:t>•</w:t>
-      </w:r>
-      <w:r>
-        <w:rPr>
-          <w:rFonts w:cs="Arial" w:ascii="Arial" w:hAnsi="Arial"/>
-          <w:b/>
-          <w:color w:val="C62026"/>
-        </w:rPr>
-        <w:tab/>
-      </w:r>
-      <w:r>
-        <w:rPr>
-          <w:rFonts w:cs="Book Antiqua"/>
-          <w:b w:val="false"/>
-          <w:i w:val="false"/>
-        </w:rPr>
-        <w:t>Sub-sponsor — COMDT ACS, driving and championing the capability on the sponsor's behalf.</w:t>
-      </w:r>
-    </w:p>
-    <w:p>
-      <w:pPr>
-        <w:pStyle w:val="Normal"/>
-        <w:tabs>
-          <w:tab w:val="clear" w:pos="720"/>
-          <w:tab w:val="left" w:pos="425" w:leader="none"/>
-        </w:tabs>
-        <w:spacing w:before="0" w:after="60"/>
-        <w:ind w:hanging="255" w:left="425"/>
-        <w:rPr/>
-      </w:pPr>
-      <w:r>
-        <w:rPr>
-          <w:rFonts w:cs="Arial" w:ascii="Arial" w:hAnsi="Arial"/>
-          <w:b/>
-          <w:color w:val="C62026"/>
-        </w:rPr>
-        <w:t>•</w:t>
-      </w:r>
-      <w:r>
-        <w:rPr>
-          <w:rFonts w:cs="Arial" w:ascii="Arial" w:hAnsi="Arial"/>
-          <w:b/>
-          <w:color w:val="C62026"/>
-        </w:rPr>
-        <w:tab/>
-      </w:r>
-      <w:r>
-        <w:rPr>
-          <w:rFonts w:cs="Book Antiqua"/>
-          <w:b w:val="false"/>
-          <w:i w:val="false"/>
-        </w:rPr>
-        <w:t>Capability development and delivery agency — ACS, leveraging NZALC leadership-development expertise, intellectual property and programmes.</w:t>
-      </w:r>
-    </w:p>
-    <w:p>
-      <w:pPr>
-        <w:pStyle w:val="Normal"/>
-        <w:tabs>
-          <w:tab w:val="clear" w:pos="720"/>
-          <w:tab w:val="left" w:pos="425" w:leader="none"/>
-        </w:tabs>
-        <w:spacing w:before="0" w:after="60"/>
-        <w:ind w:hanging="255" w:left="425"/>
-        <w:rPr/>
-      </w:pPr>
-      <w:r>
-        <w:rPr>
-          <w:rFonts w:cs="Arial" w:ascii="Arial" w:hAnsi="Arial"/>
-          <w:b/>
-          <w:color w:val="C62026"/>
-        </w:rPr>
-        <w:t>•</w:t>
-      </w:r>
-      <w:r>
-        <w:rPr>
-          <w:rFonts w:cs="Arial" w:ascii="Arial" w:hAnsi="Arial"/>
-          <w:b/>
-          <w:color w:val="C62026"/>
-        </w:rPr>
-        <w:tab/>
-      </w:r>
-      <w:r>
-        <w:rPr>
-          <w:rFonts w:cs="Book Antiqua"/>
-          <w:b w:val="false"/>
-          <w:i w:val="false"/>
-        </w:rPr>
-        <w:t>Technical authority — Human Performance Cell, ensuring the framework remains evidence-based and measurable, drawing on COGCON.</w:t>
-      </w:r>
-    </w:p>
-    <w:p>
-      <w:pPr>
-        <w:pStyle w:val="Normal"/>
-        <w:tabs>
-          <w:tab w:val="clear" w:pos="720"/>
-          <w:tab w:val="left" w:pos="425" w:leader="none"/>
-        </w:tabs>
-        <w:spacing w:before="0" w:after="60"/>
-        <w:ind w:hanging="255" w:left="425"/>
-        <w:rPr/>
-      </w:pPr>
-      <w:r>
-        <w:rPr>
-          <w:rFonts w:cs="Arial" w:ascii="Arial" w:hAnsi="Arial"/>
-          <w:b/>
-          <w:color w:val="C62026"/>
-        </w:rPr>
-        <w:t>•</w:t>
-      </w:r>
-      <w:r>
-        <w:rPr>
-          <w:rFonts w:cs="Arial" w:ascii="Arial" w:hAnsi="Arial"/>
-          <w:b/>
-          <w:color w:val="C62026"/>
-        </w:rPr>
-        <w:tab/>
-      </w:r>
-      <w:r>
-        <w:rPr>
-          <w:rFonts w:cs="Book Antiqua"/>
-          <w:b w:val="false"/>
-          <w:i w:val="false"/>
-        </w:rPr>
-        <w:t>Supporting stakeholders — NZDF Psychology, ILD, training establishments and force employers.</w:t>
-      </w:r>
-    </w:p>
-    <w:p>
-      <w:pPr>
-        <w:pStyle w:val="Normal"/>
-        <w:tabs>
-          <w:tab w:val="clear" w:pos="720"/>
-          <w:tab w:val="left" w:pos="425" w:leader="none"/>
-        </w:tabs>
-        <w:spacing w:before="0" w:after="60"/>
-        <w:ind w:hanging="255" w:left="425"/>
-        <w:rPr/>
-      </w:pPr>
-      <w:r>
-        <w:rPr>
-          <w:rFonts w:cs="Arial" w:ascii="Arial" w:hAnsi="Arial"/>
-          <w:b/>
-          <w:color w:val="C62026"/>
-        </w:rPr>
-        <w:t>•</w:t>
-      </w:r>
-      <w:r>
-        <w:rPr>
-          <w:rFonts w:cs="Arial" w:ascii="Arial" w:hAnsi="Arial"/>
-          <w:b/>
-          <w:color w:val="C62026"/>
-        </w:rPr>
-        <w:tab/>
-      </w:r>
-      <w:r>
-        <w:rPr>
-          <w:rFonts w:cs="Book Antiqua"/>
-          <w:b w:val="false"/>
-          <w:i w:val="false"/>
-        </w:rPr>
-        <w:t>Assurance — designed into the framework from the outset, with a degree of independence from the principal delivery organisation.</w:t>
-      </w:r>
-    </w:p>
-    <w:p>
-      <w:pPr>
-        <w:pStyle w:val="Normal"/>
-        <w:pBdr>
-          <w:bottom w:val="single" w:sz="6" w:space="1" w:color="A89662"/>
-        </w:pBdr>
-        <w:spacing w:before="200" w:after="200"/>
-        <w:rPr/>
-      </w:pPr>
-      <w:r>
-        <w:rPr/>
-      </w:r>
-    </w:p>
-    <w:p>
-      <w:pPr>
-        <w:pStyle w:val="Heading1"/>
-        <w:pBdr>
-          <w:left w:val="single" w:sz="24" w:space="8" w:color="C62026"/>
-        </w:pBdr>
-        <w:rPr/>
-      </w:pPr>
-      <w:r>
-        <w:rPr>
-          <w:rFonts w:cs="Arial" w:ascii="Arial" w:hAnsi="Arial"/>
-          <w:b/>
-          <w:i w:val="false"/>
-          <w:color w:val="002516"/>
-          <w:sz w:val="28"/>
-        </w:rPr>
-        <w:t>6. Recommendations</w:t>
-      </w:r>
-    </w:p>
-    <w:p>
-      <w:pPr>
-        <w:pStyle w:val="Normal"/>
-        <w:rPr/>
-      </w:pPr>
-      <w:r>
-        <w:rPr>
-          <w:rFonts w:cs="Book Antiqua"/>
-          <w:b w:val="false"/>
-          <w:i w:val="false"/>
-        </w:rPr>
-        <w:t>It is recommended that COMDT ACS:</w:t>
+        <w:t>Confirm HPC as the COGCON product steward and performance-cognition adviser</w:t>
+      </w:r>
+      <w:r>
+        <w:rPr>
+          <w:rFonts w:cs="Book Antiqua"/>
+          <w:b w:val="false"/>
+          <w:i w:val="false"/>
+        </w:rPr>
+        <w:t>, rather than the technical authority for the full Combat Mindset capability.</w:t>
       </w:r>
     </w:p>
     <w:p>
@@ -1584,7 +2871,7 @@
           <w:rFonts w:cs="Arial" w:ascii="Arial" w:hAnsi="Arial"/>
           <w:b/>
         </w:rPr>
-        <w:t>1.</w:t>
+        <w:t>7.</w:t>
         <w:tab/>
       </w:r>
       <w:r>
@@ -1593,15 +2880,15 @@
           <w:b/>
           <w:i w:val="false"/>
         </w:rPr>
-        <w:t>Endorse the agreed problem statement</w:t>
-      </w:r>
-      <w:r>
-        <w:rPr>
-          <w:rFonts w:cs="Book Antiqua"/>
-          <w:b w:val="false"/>
-          <w:i w:val="false"/>
-        </w:rPr>
-        <w:t xml:space="preserve"> at paragraph 1.</w:t>
+        <w:t>Approve the revised programme of work</w:t>
+      </w:r>
+      <w:r>
+        <w:rPr>
+          <w:rFonts w:cs="Book Antiqua"/>
+          <w:b w:val="false"/>
+          <w:i w:val="false"/>
+        </w:rPr>
+        <w:t>, including capability and product mapping, framework development, stakeholder engagement and a limited MVP integration trial subject to resource availability.</w:t>
       </w:r>
     </w:p>
     <w:p>
@@ -1621,7 +2908,7 @@
           <w:rFonts w:cs="Arial" w:ascii="Arial" w:hAnsi="Arial"/>
           <w:b/>
         </w:rPr>
-        <w:t>2.</w:t>
+        <w:t>8.</w:t>
         <w:tab/>
       </w:r>
       <w:r>
@@ -1630,126 +2917,15 @@
           <w:b/>
           <w:i w:val="false"/>
         </w:rPr>
-        <w:t>Select the terminology construct</w:t>
-      </w:r>
-      <w:r>
-        <w:rPr>
-          <w:rFonts w:cs="Book Antiqua"/>
-          <w:b w:val="false"/>
-          <w:i w:val="false"/>
-        </w:rPr>
-        <w:t xml:space="preserve"> at paragraph 2 (Option 1 recommended).</w:t>
-      </w:r>
-    </w:p>
-    <w:p>
-      <w:pPr>
-        <w:pStyle w:val="Normal"/>
-        <w:keepNext w:val="true"/>
-        <w:tabs>
-          <w:tab w:val="clear" w:pos="720"/>
-          <w:tab w:val="left" w:pos="425" w:leader="none"/>
-        </w:tabs>
-        <w:spacing w:before="80" w:after="40"/>
-        <w:ind w:hanging="425" w:left="425"/>
-        <w:rPr/>
-      </w:pPr>
-      <w:r>
-        <w:rPr>
-          <w:rFonts w:cs="Arial" w:ascii="Arial" w:hAnsi="Arial"/>
-          <w:b/>
-        </w:rPr>
-        <w:t>3.</w:t>
-        <w:tab/>
-      </w:r>
-      <w:r>
-        <w:rPr>
-          <w:rFonts w:cs="Book Antiqua"/>
-          <w:b/>
-          <w:i w:val="false"/>
-        </w:rPr>
-        <w:t>Confirm governance arrangements</w:t>
-      </w:r>
-      <w:r>
-        <w:rPr>
-          <w:rFonts w:cs="Book Antiqua"/>
-          <w:b w:val="false"/>
-          <w:i w:val="false"/>
-        </w:rPr>
-        <w:t xml:space="preserve"> at paragraph 5, including confirmation of the Army Sponsor.</w:t>
-      </w:r>
-    </w:p>
-    <w:p>
-      <w:pPr>
-        <w:pStyle w:val="Normal"/>
-        <w:keepNext w:val="true"/>
-        <w:tabs>
-          <w:tab w:val="clear" w:pos="720"/>
-          <w:tab w:val="left" w:pos="425" w:leader="none"/>
-        </w:tabs>
-        <w:spacing w:before="80" w:after="40"/>
-        <w:ind w:hanging="425" w:left="425"/>
-        <w:rPr/>
-      </w:pPr>
-      <w:r>
-        <w:rPr>
-          <w:rFonts w:cs="Arial" w:ascii="Arial" w:hAnsi="Arial"/>
-          <w:b/>
-        </w:rPr>
-        <w:t>4.</w:t>
-        <w:tab/>
-      </w:r>
-      <w:r>
-        <w:rPr>
-          <w:rFonts w:cs="Book Antiqua"/>
-          <w:b/>
-          <w:i w:val="false"/>
-        </w:rPr>
-        <w:t>Approve the programme of work</w:t>
-      </w:r>
-      <w:r>
-        <w:rPr>
-          <w:rFonts w:cs="Book Antiqua"/>
-          <w:b w:val="false"/>
-          <w:i w:val="false"/>
-        </w:rPr>
-        <w:t xml:space="preserve"> at paragraph 4, including the joint mapping, stakeholder forum and pilot.</w:t>
-      </w:r>
-    </w:p>
-    <w:p>
-      <w:pPr>
-        <w:pStyle w:val="Normal"/>
-        <w:keepNext w:val="true"/>
-        <w:tabs>
-          <w:tab w:val="clear" w:pos="720"/>
-          <w:tab w:val="left" w:pos="425" w:leader="none"/>
-        </w:tabs>
-        <w:spacing w:before="80" w:after="40"/>
-        <w:ind w:hanging="425" w:left="425"/>
-        <w:rPr/>
-      </w:pPr>
-      <w:r>
-        <w:rPr>
-          <w:rFonts w:cs="Arial" w:ascii="Arial" w:hAnsi="Arial"/>
-          <w:b/>
-        </w:rPr>
-        <w:t>5.</w:t>
-        <w:tab/>
-      </w:r>
-      <w:r>
-        <w:rPr>
-          <w:rFonts w:cs="Book Antiqua"/>
-          <w:b/>
-          <w:i w:val="false"/>
-        </w:rPr>
-        <w:t>Note</w:t>
-      </w:r>
-      <w:r>
-        <w:rPr>
-          <w:rFonts w:cs="Book Antiqua"/>
-          <w:b w:val="false"/>
-          <w:i w:val="false"/>
-        </w:rPr>
-        <w:t xml:space="preserve"> that NZALC and HPC will deliver this programme jointly, with the NZALC capability note and the COGCON evidence base as its foundation inputs.</w:t>
+        <w:t>Direct that the November 2026 report provide</w:t>
+      </w:r>
+      <w:r>
+        <w:rPr>
+          <w:rFonts w:cs="Book Antiqua"/>
+          <w:b w:val="false"/>
+          <w:i w:val="false"/>
+        </w:rPr>
+        <w:t xml:space="preserve"> Framework v1.0; the validated capability and product map; a governance and assurance model; an assessment of COGCON's evidence, scalability, resource requirements and appropriate future role; and a prioritised implementation plan.</w:t>
       </w:r>
     </w:p>
     <w:p>
@@ -1781,21 +2957,7 @@
           <w:color w:val="002516"/>
           <w:sz w:val="28"/>
         </w:rPr>
-        <w:t>Annex A — Common lexicon and division of functions</w:t>
-      </w:r>
-    </w:p>
-    <w:p>
-      <w:pPr>
-        <w:pStyle w:val="Normal"/>
-        <w:rPr/>
-      </w:pPr>
-      <w:r>
-        <w:rPr>
-          <w:rFonts w:cs="Book Antiqua"/>
-          <w:b w:val="false"/>
-          <w:i w:val="false"/>
-        </w:rPr>
-        <w:t>These tables give effect to the integration described at paragraphs 2 and 3. They are the joint NZALC–HPC working baseline and will be validated during Phase 1 mapping.</w:t>
+        <w:t>Annex A — Initial capability and product architecture</w:t>
       </w:r>
     </w:p>
     <w:p>
@@ -1811,21 +2973,1019 @@
           <w:color w:val="000000"/>
           <w:sz w:val="22"/>
         </w:rPr>
-        <w:t>A1. Common lexicon — one construct, two layers</w:t>
-      </w:r>
-    </w:p>
-    <w:p>
-      <w:pPr>
-        <w:pStyle w:val="Normal"/>
-        <w:rPr/>
-      </w:pPr>
-      <w:r>
-        <w:rPr>
-          <w:rFonts w:cs="Book Antiqua"/>
-          <w:b w:val="false"/>
-          <w:i w:val="false"/>
-        </w:rPr>
-        <w:t>The framework adopts the cognitive-fitness dimensions as the science layer (HPC) and the NZALC mental-skills toolkit as the soldier-facing technique layer. One name per technique is used in delivery; programme-specific protocol names sit beneath it — for example, rhythm breathing is the COGCON conditioning protocol for tactical breathing.</w:t>
+        <w:t>A1. Framework levels</w:t>
+      </w:r>
+    </w:p>
+    <w:tbl>
+      <w:tblPr>
+        <w:tblW w:w="9072" w:type="dxa"/>
+        <w:jc w:val="left"/>
+        <w:tblInd w:w="0" w:type="dxa"/>
+        <w:tblLayout w:type="fixed"/>
+        <w:tblCellMar>
+          <w:top w:w="0" w:type="dxa"/>
+          <w:left w:w="108" w:type="dxa"/>
+          <w:bottom w:w="0" w:type="dxa"/>
+          <w:right w:w="108" w:type="dxa"/>
+        </w:tblCellMar>
+        <w:tblLook w:val="04a0" w:noHBand="0" w:noVBand="1" w:firstColumn="1" w:lastRow="0" w:lastColumn="0" w:firstRow="1"/>
+      </w:tblPr>
+      <w:tblGrid>
+        <w:gridCol w:w="4536"/>
+        <w:gridCol w:w="4535"/>
+      </w:tblGrid>
+      <w:tr>
+        <w:trPr>
+          <w:tblHeader w:val="true"/>
+          <w:cantSplit w:val="true"/>
+        </w:trPr>
+        <w:tc>
+          <w:tcPr>
+            <w:tcW w:w="4536" w:type="dxa"/>
+            <w:tcBorders>
+              <w:top w:val="single" w:sz="4" w:space="0" w:color="A89662"/>
+              <w:left w:val="single" w:sz="4" w:space="0" w:color="A89662"/>
+              <w:bottom w:val="single" w:sz="4" w:space="0" w:color="A89662"/>
+              <w:right w:val="single" w:sz="4" w:space="0" w:color="A89662"/>
+            </w:tcBorders>
+            <w:shd w:fill="002516" w:val="clear"/>
+          </w:tcPr>
+          <w:p>
+            <w:pPr>
+              <w:pStyle w:val="Normal"/>
+              <w:spacing w:before="40" w:after="40"/>
+              <w:rPr/>
+            </w:pPr>
+            <w:r>
+              <w:rPr>
+                <w:rFonts w:cs="Arial" w:ascii="Arial" w:hAnsi="Arial"/>
+                <w:b/>
+                <w:color w:val="FFFFFF"/>
+                <w:sz w:val="19"/>
+              </w:rPr>
+              <w:t>Framework level</w:t>
+            </w:r>
+          </w:p>
+        </w:tc>
+        <w:tc>
+          <w:tcPr>
+            <w:tcW w:w="4535" w:type="dxa"/>
+            <w:tcBorders>
+              <w:top w:val="single" w:sz="4" w:space="0" w:color="A89662"/>
+              <w:left w:val="single" w:sz="4" w:space="0" w:color="A89662"/>
+              <w:bottom w:val="single" w:sz="4" w:space="0" w:color="A89662"/>
+              <w:right w:val="single" w:sz="4" w:space="0" w:color="A89662"/>
+            </w:tcBorders>
+            <w:shd w:fill="002516" w:val="clear"/>
+          </w:tcPr>
+          <w:p>
+            <w:pPr>
+              <w:pStyle w:val="Normal"/>
+              <w:spacing w:before="40" w:after="40"/>
+              <w:rPr/>
+            </w:pPr>
+            <w:r>
+              <w:rPr>
+                <w:rFonts w:cs="Arial" w:ascii="Arial" w:hAnsi="Arial"/>
+                <w:b/>
+                <w:color w:val="FFFFFF"/>
+                <w:sz w:val="19"/>
+              </w:rPr>
+              <w:t>Composition</w:t>
+            </w:r>
+          </w:p>
+        </w:tc>
+      </w:tr>
+      <w:tr>
+        <w:trPr>
+          <w:cantSplit w:val="true"/>
+        </w:trPr>
+        <w:tc>
+          <w:tcPr>
+            <w:tcW w:w="4536" w:type="dxa"/>
+            <w:tcBorders>
+              <w:top w:val="single" w:sz="4" w:space="0" w:color="A89662"/>
+              <w:left w:val="single" w:sz="4" w:space="0" w:color="A89662"/>
+              <w:bottom w:val="single" w:sz="4" w:space="0" w:color="A89662"/>
+              <w:right w:val="single" w:sz="4" w:space="0" w:color="A89662"/>
+            </w:tcBorders>
+          </w:tcPr>
+          <w:p>
+            <w:pPr>
+              <w:pStyle w:val="Normal"/>
+              <w:spacing w:before="40" w:after="40"/>
+              <w:rPr/>
+            </w:pPr>
+            <w:r>
+              <w:rPr>
+                <w:rFonts w:cs="Book Antiqua"/>
+                <w:color w:val="000000"/>
+                <w:sz w:val="19"/>
+              </w:rPr>
+              <w:t>Army operational frame</w:t>
+            </w:r>
+          </w:p>
+        </w:tc>
+        <w:tc>
+          <w:tcPr>
+            <w:tcW w:w="4535" w:type="dxa"/>
+            <w:tcBorders>
+              <w:top w:val="single" w:sz="4" w:space="0" w:color="A89662"/>
+              <w:left w:val="single" w:sz="4" w:space="0" w:color="A89662"/>
+              <w:bottom w:val="single" w:sz="4" w:space="0" w:color="A89662"/>
+              <w:right w:val="single" w:sz="4" w:space="0" w:color="A89662"/>
+            </w:tcBorders>
+          </w:tcPr>
+          <w:p>
+            <w:pPr>
+              <w:pStyle w:val="Normal"/>
+              <w:spacing w:before="40" w:after="40"/>
+              <w:rPr/>
+            </w:pPr>
+            <w:r>
+              <w:rPr>
+                <w:rFonts w:cs="Book Antiqua"/>
+                <w:color w:val="000000"/>
+                <w:sz w:val="19"/>
+              </w:rPr>
+              <w:t>Combat Mindset</w:t>
+            </w:r>
+          </w:p>
+        </w:tc>
+      </w:tr>
+      <w:tr>
+        <w:trPr>
+          <w:cantSplit w:val="true"/>
+        </w:trPr>
+        <w:tc>
+          <w:tcPr>
+            <w:tcW w:w="4536" w:type="dxa"/>
+            <w:tcBorders>
+              <w:top w:val="single" w:sz="4" w:space="0" w:color="A89662"/>
+              <w:left w:val="single" w:sz="4" w:space="0" w:color="A89662"/>
+              <w:bottom w:val="single" w:sz="4" w:space="0" w:color="A89662"/>
+              <w:right w:val="single" w:sz="4" w:space="0" w:color="A89662"/>
+            </w:tcBorders>
+          </w:tcPr>
+          <w:p>
+            <w:pPr>
+              <w:pStyle w:val="Normal"/>
+              <w:spacing w:before="40" w:after="40"/>
+              <w:rPr/>
+            </w:pPr>
+            <w:r>
+              <w:rPr>
+                <w:rFonts w:cs="Book Antiqua"/>
+                <w:color w:val="000000"/>
+                <w:sz w:val="19"/>
+              </w:rPr>
+              <w:t>Underlying capability</w:t>
+            </w:r>
+          </w:p>
+        </w:tc>
+        <w:tc>
+          <w:tcPr>
+            <w:tcW w:w="4535" w:type="dxa"/>
+            <w:tcBorders>
+              <w:top w:val="single" w:sz="4" w:space="0" w:color="A89662"/>
+              <w:left w:val="single" w:sz="4" w:space="0" w:color="A89662"/>
+              <w:bottom w:val="single" w:sz="4" w:space="0" w:color="A89662"/>
+              <w:right w:val="single" w:sz="4" w:space="0" w:color="A89662"/>
+            </w:tcBorders>
+          </w:tcPr>
+          <w:p>
+            <w:pPr>
+              <w:pStyle w:val="Normal"/>
+              <w:spacing w:before="40" w:after="40"/>
+              <w:rPr/>
+            </w:pPr>
+            <w:r>
+              <w:rPr>
+                <w:rFonts w:cs="Book Antiqua"/>
+                <w:color w:val="000000"/>
+                <w:sz w:val="19"/>
+              </w:rPr>
+              <w:t>Performance Under Pressure</w:t>
+            </w:r>
+          </w:p>
+        </w:tc>
+      </w:tr>
+      <w:tr>
+        <w:trPr>
+          <w:cantSplit w:val="true"/>
+        </w:trPr>
+        <w:tc>
+          <w:tcPr>
+            <w:tcW w:w="4536" w:type="dxa"/>
+            <w:tcBorders>
+              <w:top w:val="single" w:sz="4" w:space="0" w:color="A89662"/>
+              <w:left w:val="single" w:sz="4" w:space="0" w:color="A89662"/>
+              <w:bottom w:val="single" w:sz="4" w:space="0" w:color="A89662"/>
+              <w:right w:val="single" w:sz="4" w:space="0" w:color="A89662"/>
+            </w:tcBorders>
+          </w:tcPr>
+          <w:p>
+            <w:pPr>
+              <w:pStyle w:val="Normal"/>
+              <w:spacing w:before="40" w:after="40"/>
+              <w:rPr/>
+            </w:pPr>
+            <w:r>
+              <w:rPr>
+                <w:rFonts w:cs="Book Antiqua"/>
+                <w:color w:val="000000"/>
+                <w:sz w:val="19"/>
+              </w:rPr>
+              <w:t>Capability strands</w:t>
+            </w:r>
+          </w:p>
+        </w:tc>
+        <w:tc>
+          <w:tcPr>
+            <w:tcW w:w="4535" w:type="dxa"/>
+            <w:tcBorders>
+              <w:top w:val="single" w:sz="4" w:space="0" w:color="A89662"/>
+              <w:left w:val="single" w:sz="4" w:space="0" w:color="A89662"/>
+              <w:bottom w:val="single" w:sz="4" w:space="0" w:color="A89662"/>
+              <w:right w:val="single" w:sz="4" w:space="0" w:color="A89662"/>
+            </w:tcBorders>
+          </w:tcPr>
+          <w:p>
+            <w:pPr>
+              <w:pStyle w:val="Normal"/>
+              <w:spacing w:before="40" w:after="40"/>
+              <w:rPr/>
+            </w:pPr>
+            <w:r>
+              <w:rPr>
+                <w:rFonts w:cs="Book Antiqua"/>
+                <w:color w:val="000000"/>
+                <w:sz w:val="19"/>
+              </w:rPr>
+              <w:t>Leadership; mental skills; performance cognition; resilience and recovery; physical performance; professional identity and values; individual and collective exposure to pressure</w:t>
+            </w:r>
+          </w:p>
+        </w:tc>
+      </w:tr>
+      <w:tr>
+        <w:trPr>
+          <w:cantSplit w:val="true"/>
+        </w:trPr>
+        <w:tc>
+          <w:tcPr>
+            <w:tcW w:w="4536" w:type="dxa"/>
+            <w:tcBorders>
+              <w:top w:val="single" w:sz="4" w:space="0" w:color="A89662"/>
+              <w:left w:val="single" w:sz="4" w:space="0" w:color="A89662"/>
+              <w:bottom w:val="single" w:sz="4" w:space="0" w:color="A89662"/>
+              <w:right w:val="single" w:sz="4" w:space="0" w:color="A89662"/>
+            </w:tcBorders>
+          </w:tcPr>
+          <w:p>
+            <w:pPr>
+              <w:pStyle w:val="Normal"/>
+              <w:spacing w:before="40" w:after="40"/>
+              <w:rPr/>
+            </w:pPr>
+            <w:r>
+              <w:rPr>
+                <w:rFonts w:cs="Book Antiqua"/>
+                <w:color w:val="000000"/>
+                <w:sz w:val="19"/>
+              </w:rPr>
+              <w:t>Training products and methods</w:t>
+            </w:r>
+          </w:p>
+        </w:tc>
+        <w:tc>
+          <w:tcPr>
+            <w:tcW w:w="4535" w:type="dxa"/>
+            <w:tcBorders>
+              <w:top w:val="single" w:sz="4" w:space="0" w:color="A89662"/>
+              <w:left w:val="single" w:sz="4" w:space="0" w:color="A89662"/>
+              <w:bottom w:val="single" w:sz="4" w:space="0" w:color="A89662"/>
+              <w:right w:val="single" w:sz="4" w:space="0" w:color="A89662"/>
+            </w:tcBorders>
+          </w:tcPr>
+          <w:p>
+            <w:pPr>
+              <w:pStyle w:val="Normal"/>
+              <w:spacing w:before="40" w:after="40"/>
+              <w:rPr/>
+            </w:pPr>
+            <w:r>
+              <w:rPr>
+                <w:rFonts w:cs="Book Antiqua"/>
+                <w:color w:val="000000"/>
+                <w:sz w:val="19"/>
+              </w:rPr>
+              <w:t>NZALC Performance Under Pressure package; COGCON MVP; NZDF Psychology products; scenario and experiential training; physical conditioning; structured reflection and recovery; other products identified during Phase 1 mapping</w:t>
+            </w:r>
+          </w:p>
+        </w:tc>
+      </w:tr>
+    </w:tbl>
+    <w:p>
+      <w:pPr>
+        <w:pStyle w:val="Normal"/>
+        <w:spacing w:before="0" w:after="160"/>
+        <w:rPr/>
+      </w:pPr>
+      <w:r>
+        <w:rPr/>
+      </w:r>
+    </w:p>
+    <w:p>
+      <w:pPr>
+        <w:pStyle w:val="Heading2"/>
+        <w:rPr/>
+      </w:pPr>
+      <w:r>
+        <w:rPr>
+          <w:rFonts w:cs="Arial" w:ascii="Arial" w:hAnsi="Arial"/>
+          <w:b/>
+          <w:i w:val="false"/>
+          <w:color w:val="000000"/>
+          <w:sz w:val="22"/>
+        </w:rPr>
+        <w:t>A2. COGCON current nesting</w:t>
+      </w:r>
+    </w:p>
+    <w:tbl>
+      <w:tblPr>
+        <w:tblW w:w="9072" w:type="dxa"/>
+        <w:jc w:val="left"/>
+        <w:tblInd w:w="0" w:type="dxa"/>
+        <w:tblLayout w:type="fixed"/>
+        <w:tblCellMar>
+          <w:top w:w="0" w:type="dxa"/>
+          <w:left w:w="108" w:type="dxa"/>
+          <w:bottom w:w="0" w:type="dxa"/>
+          <w:right w:w="108" w:type="dxa"/>
+        </w:tblCellMar>
+        <w:tblLook w:val="04a0" w:noHBand="0" w:noVBand="1" w:firstColumn="1" w:lastRow="0" w:lastColumn="0" w:firstRow="1"/>
+      </w:tblPr>
+      <w:tblGrid>
+        <w:gridCol w:w="4536"/>
+        <w:gridCol w:w="4535"/>
+      </w:tblGrid>
+      <w:tr>
+        <w:trPr>
+          <w:tblHeader w:val="true"/>
+          <w:cantSplit w:val="true"/>
+        </w:trPr>
+        <w:tc>
+          <w:tcPr>
+            <w:tcW w:w="4536" w:type="dxa"/>
+            <w:tcBorders>
+              <w:top w:val="single" w:sz="4" w:space="0" w:color="A89662"/>
+              <w:left w:val="single" w:sz="4" w:space="0" w:color="A89662"/>
+              <w:bottom w:val="single" w:sz="4" w:space="0" w:color="A89662"/>
+              <w:right w:val="single" w:sz="4" w:space="0" w:color="A89662"/>
+            </w:tcBorders>
+            <w:shd w:fill="002516" w:val="clear"/>
+          </w:tcPr>
+          <w:p>
+            <w:pPr>
+              <w:pStyle w:val="Normal"/>
+              <w:spacing w:before="40" w:after="40"/>
+              <w:rPr/>
+            </w:pPr>
+            <w:r>
+              <w:rPr>
+                <w:rFonts w:cs="Arial" w:ascii="Arial" w:hAnsi="Arial"/>
+                <w:b/>
+                <w:color w:val="FFFFFF"/>
+                <w:sz w:val="19"/>
+              </w:rPr>
+              <w:t>Attribute</w:t>
+            </w:r>
+          </w:p>
+        </w:tc>
+        <w:tc>
+          <w:tcPr>
+            <w:tcW w:w="4535" w:type="dxa"/>
+            <w:tcBorders>
+              <w:top w:val="single" w:sz="4" w:space="0" w:color="A89662"/>
+              <w:left w:val="single" w:sz="4" w:space="0" w:color="A89662"/>
+              <w:bottom w:val="single" w:sz="4" w:space="0" w:color="A89662"/>
+              <w:right w:val="single" w:sz="4" w:space="0" w:color="A89662"/>
+            </w:tcBorders>
+            <w:shd w:fill="002516" w:val="clear"/>
+          </w:tcPr>
+          <w:p>
+            <w:pPr>
+              <w:pStyle w:val="Normal"/>
+              <w:spacing w:before="40" w:after="40"/>
+              <w:rPr/>
+            </w:pPr>
+            <w:r>
+              <w:rPr>
+                <w:rFonts w:cs="Arial" w:ascii="Arial" w:hAnsi="Arial"/>
+                <w:b/>
+                <w:color w:val="FFFFFF"/>
+                <w:sz w:val="19"/>
+              </w:rPr>
+              <w:t>COGCON current position</w:t>
+            </w:r>
+          </w:p>
+        </w:tc>
+      </w:tr>
+      <w:tr>
+        <w:trPr>
+          <w:cantSplit w:val="true"/>
+        </w:trPr>
+        <w:tc>
+          <w:tcPr>
+            <w:tcW w:w="4536" w:type="dxa"/>
+            <w:tcBorders>
+              <w:top w:val="single" w:sz="4" w:space="0" w:color="A89662"/>
+              <w:left w:val="single" w:sz="4" w:space="0" w:color="A89662"/>
+              <w:bottom w:val="single" w:sz="4" w:space="0" w:color="A89662"/>
+              <w:right w:val="single" w:sz="4" w:space="0" w:color="A89662"/>
+            </w:tcBorders>
+          </w:tcPr>
+          <w:p>
+            <w:pPr>
+              <w:pStyle w:val="Normal"/>
+              <w:spacing w:before="40" w:after="40"/>
+              <w:rPr/>
+            </w:pPr>
+            <w:r>
+              <w:rPr>
+                <w:rFonts w:cs="Book Antiqua"/>
+                <w:color w:val="000000"/>
+                <w:sz w:val="19"/>
+              </w:rPr>
+              <w:t>Capability strand</w:t>
+            </w:r>
+          </w:p>
+        </w:tc>
+        <w:tc>
+          <w:tcPr>
+            <w:tcW w:w="4535" w:type="dxa"/>
+            <w:tcBorders>
+              <w:top w:val="single" w:sz="4" w:space="0" w:color="A89662"/>
+              <w:left w:val="single" w:sz="4" w:space="0" w:color="A89662"/>
+              <w:bottom w:val="single" w:sz="4" w:space="0" w:color="A89662"/>
+              <w:right w:val="single" w:sz="4" w:space="0" w:color="A89662"/>
+            </w:tcBorders>
+          </w:tcPr>
+          <w:p>
+            <w:pPr>
+              <w:pStyle w:val="Normal"/>
+              <w:spacing w:before="40" w:after="40"/>
+              <w:rPr/>
+            </w:pPr>
+            <w:r>
+              <w:rPr>
+                <w:rFonts w:cs="Book Antiqua"/>
+                <w:color w:val="000000"/>
+                <w:sz w:val="19"/>
+              </w:rPr>
+              <w:t>Performance cognition</w:t>
+            </w:r>
+          </w:p>
+        </w:tc>
+      </w:tr>
+      <w:tr>
+        <w:trPr>
+          <w:cantSplit w:val="true"/>
+        </w:trPr>
+        <w:tc>
+          <w:tcPr>
+            <w:tcW w:w="4536" w:type="dxa"/>
+            <w:tcBorders>
+              <w:top w:val="single" w:sz="4" w:space="0" w:color="A89662"/>
+              <w:left w:val="single" w:sz="4" w:space="0" w:color="A89662"/>
+              <w:bottom w:val="single" w:sz="4" w:space="0" w:color="A89662"/>
+              <w:right w:val="single" w:sz="4" w:space="0" w:color="A89662"/>
+            </w:tcBorders>
+          </w:tcPr>
+          <w:p>
+            <w:pPr>
+              <w:pStyle w:val="Normal"/>
+              <w:spacing w:before="40" w:after="40"/>
+              <w:rPr/>
+            </w:pPr>
+            <w:r>
+              <w:rPr>
+                <w:rFonts w:cs="Book Antiqua"/>
+                <w:color w:val="000000"/>
+                <w:sz w:val="19"/>
+              </w:rPr>
+              <w:t>Primary level</w:t>
+            </w:r>
+          </w:p>
+        </w:tc>
+        <w:tc>
+          <w:tcPr>
+            <w:tcW w:w="4535" w:type="dxa"/>
+            <w:tcBorders>
+              <w:top w:val="single" w:sz="4" w:space="0" w:color="A89662"/>
+              <w:left w:val="single" w:sz="4" w:space="0" w:color="A89662"/>
+              <w:bottom w:val="single" w:sz="4" w:space="0" w:color="A89662"/>
+              <w:right w:val="single" w:sz="4" w:space="0" w:color="A89662"/>
+            </w:tcBorders>
+          </w:tcPr>
+          <w:p>
+            <w:pPr>
+              <w:pStyle w:val="Normal"/>
+              <w:spacing w:before="40" w:after="40"/>
+              <w:rPr/>
+            </w:pPr>
+            <w:r>
+              <w:rPr>
+                <w:rFonts w:cs="Book Antiqua"/>
+                <w:color w:val="000000"/>
+                <w:sz w:val="19"/>
+              </w:rPr>
+              <w:t>Individual / Lead Self</w:t>
+            </w:r>
+          </w:p>
+        </w:tc>
+      </w:tr>
+      <w:tr>
+        <w:trPr>
+          <w:cantSplit w:val="true"/>
+        </w:trPr>
+        <w:tc>
+          <w:tcPr>
+            <w:tcW w:w="4536" w:type="dxa"/>
+            <w:tcBorders>
+              <w:top w:val="single" w:sz="4" w:space="0" w:color="A89662"/>
+              <w:left w:val="single" w:sz="4" w:space="0" w:color="A89662"/>
+              <w:bottom w:val="single" w:sz="4" w:space="0" w:color="A89662"/>
+              <w:right w:val="single" w:sz="4" w:space="0" w:color="A89662"/>
+            </w:tcBorders>
+          </w:tcPr>
+          <w:p>
+            <w:pPr>
+              <w:pStyle w:val="Normal"/>
+              <w:spacing w:before="40" w:after="40"/>
+              <w:rPr/>
+            </w:pPr>
+            <w:r>
+              <w:rPr>
+                <w:rFonts w:cs="Book Antiqua"/>
+                <w:color w:val="000000"/>
+                <w:sz w:val="19"/>
+              </w:rPr>
+              <w:t>Secondary applicability</w:t>
+            </w:r>
+          </w:p>
+        </w:tc>
+        <w:tc>
+          <w:tcPr>
+            <w:tcW w:w="4535" w:type="dxa"/>
+            <w:tcBorders>
+              <w:top w:val="single" w:sz="4" w:space="0" w:color="A89662"/>
+              <w:left w:val="single" w:sz="4" w:space="0" w:color="A89662"/>
+              <w:bottom w:val="single" w:sz="4" w:space="0" w:color="A89662"/>
+              <w:right w:val="single" w:sz="4" w:space="0" w:color="A89662"/>
+            </w:tcBorders>
+          </w:tcPr>
+          <w:p>
+            <w:pPr>
+              <w:pStyle w:val="Normal"/>
+              <w:spacing w:before="40" w:after="40"/>
+              <w:rPr/>
+            </w:pPr>
+            <w:r>
+              <w:rPr>
+                <w:rFonts w:cs="Book Antiqua"/>
+                <w:color w:val="000000"/>
+                <w:sz w:val="19"/>
+              </w:rPr>
+              <w:t>Selected Lead Teams activity</w:t>
+            </w:r>
+          </w:p>
+        </w:tc>
+      </w:tr>
+      <w:tr>
+        <w:trPr>
+          <w:cantSplit w:val="true"/>
+        </w:trPr>
+        <w:tc>
+          <w:tcPr>
+            <w:tcW w:w="4536" w:type="dxa"/>
+            <w:tcBorders>
+              <w:top w:val="single" w:sz="4" w:space="0" w:color="A89662"/>
+              <w:left w:val="single" w:sz="4" w:space="0" w:color="A89662"/>
+              <w:bottom w:val="single" w:sz="4" w:space="0" w:color="A89662"/>
+              <w:right w:val="single" w:sz="4" w:space="0" w:color="A89662"/>
+            </w:tcBorders>
+          </w:tcPr>
+          <w:p>
+            <w:pPr>
+              <w:pStyle w:val="Normal"/>
+              <w:spacing w:before="40" w:after="40"/>
+              <w:rPr/>
+            </w:pPr>
+            <w:r>
+              <w:rPr>
+                <w:rFonts w:cs="Book Antiqua"/>
+                <w:color w:val="000000"/>
+                <w:sz w:val="19"/>
+              </w:rPr>
+              <w:t>Product status</w:t>
+            </w:r>
+          </w:p>
+        </w:tc>
+        <w:tc>
+          <w:tcPr>
+            <w:tcW w:w="4535" w:type="dxa"/>
+            <w:tcBorders>
+              <w:top w:val="single" w:sz="4" w:space="0" w:color="A89662"/>
+              <w:left w:val="single" w:sz="4" w:space="0" w:color="A89662"/>
+              <w:bottom w:val="single" w:sz="4" w:space="0" w:color="A89662"/>
+              <w:right w:val="single" w:sz="4" w:space="0" w:color="A89662"/>
+            </w:tcBorders>
+          </w:tcPr>
+          <w:p>
+            <w:pPr>
+              <w:pStyle w:val="Normal"/>
+              <w:spacing w:before="40" w:after="40"/>
+              <w:rPr/>
+            </w:pPr>
+            <w:r>
+              <w:rPr>
+                <w:rFonts w:cs="Book Antiqua"/>
+                <w:color w:val="000000"/>
+                <w:sz w:val="19"/>
+              </w:rPr>
+              <w:t>Developmental MVP</w:t>
+            </w:r>
+          </w:p>
+        </w:tc>
+      </w:tr>
+      <w:tr>
+        <w:trPr>
+          <w:cantSplit w:val="true"/>
+        </w:trPr>
+        <w:tc>
+          <w:tcPr>
+            <w:tcW w:w="4536" w:type="dxa"/>
+            <w:tcBorders>
+              <w:top w:val="single" w:sz="4" w:space="0" w:color="A89662"/>
+              <w:left w:val="single" w:sz="4" w:space="0" w:color="A89662"/>
+              <w:bottom w:val="single" w:sz="4" w:space="0" w:color="A89662"/>
+              <w:right w:val="single" w:sz="4" w:space="0" w:color="A89662"/>
+            </w:tcBorders>
+          </w:tcPr>
+          <w:p>
+            <w:pPr>
+              <w:pStyle w:val="Normal"/>
+              <w:spacing w:before="40" w:after="40"/>
+              <w:rPr/>
+            </w:pPr>
+            <w:r>
+              <w:rPr>
+                <w:rFonts w:cs="Book Antiqua"/>
+                <w:color w:val="000000"/>
+                <w:sz w:val="19"/>
+              </w:rPr>
+              <w:t>Current contribution</w:t>
+            </w:r>
+          </w:p>
+        </w:tc>
+        <w:tc>
+          <w:tcPr>
+            <w:tcW w:w="4535" w:type="dxa"/>
+            <w:tcBorders>
+              <w:top w:val="single" w:sz="4" w:space="0" w:color="A89662"/>
+              <w:left w:val="single" w:sz="4" w:space="0" w:color="A89662"/>
+              <w:bottom w:val="single" w:sz="4" w:space="0" w:color="A89662"/>
+              <w:right w:val="single" w:sz="4" w:space="0" w:color="A89662"/>
+            </w:tcBorders>
+          </w:tcPr>
+          <w:p>
+            <w:pPr>
+              <w:pStyle w:val="Normal"/>
+              <w:spacing w:before="40" w:after="40"/>
+              <w:rPr/>
+            </w:pPr>
+            <w:r>
+              <w:rPr>
+                <w:rFonts w:cs="Book Antiqua"/>
+                <w:color w:val="000000"/>
+                <w:sz w:val="19"/>
+              </w:rPr>
+              <w:t>Arousal regulation, attention, cognitive control, working memory, performance monitoring and adaptive dual-task conditioning</w:t>
+            </w:r>
+          </w:p>
+        </w:tc>
+      </w:tr>
+      <w:tr>
+        <w:trPr>
+          <w:cantSplit w:val="true"/>
+        </w:trPr>
+        <w:tc>
+          <w:tcPr>
+            <w:tcW w:w="4536" w:type="dxa"/>
+            <w:tcBorders>
+              <w:top w:val="single" w:sz="4" w:space="0" w:color="A89662"/>
+              <w:left w:val="single" w:sz="4" w:space="0" w:color="A89662"/>
+              <w:bottom w:val="single" w:sz="4" w:space="0" w:color="A89662"/>
+              <w:right w:val="single" w:sz="4" w:space="0" w:color="A89662"/>
+            </w:tcBorders>
+          </w:tcPr>
+          <w:p>
+            <w:pPr>
+              <w:pStyle w:val="Normal"/>
+              <w:spacing w:before="40" w:after="40"/>
+              <w:rPr/>
+            </w:pPr>
+            <w:r>
+              <w:rPr>
+                <w:rFonts w:cs="Book Antiqua"/>
+                <w:color w:val="000000"/>
+                <w:sz w:val="19"/>
+              </w:rPr>
+              <w:t>Current evidence</w:t>
+            </w:r>
+          </w:p>
+        </w:tc>
+        <w:tc>
+          <w:tcPr>
+            <w:tcW w:w="4535" w:type="dxa"/>
+            <w:tcBorders>
+              <w:top w:val="single" w:sz="4" w:space="0" w:color="A89662"/>
+              <w:left w:val="single" w:sz="4" w:space="0" w:color="A89662"/>
+              <w:bottom w:val="single" w:sz="4" w:space="0" w:color="A89662"/>
+              <w:right w:val="single" w:sz="4" w:space="0" w:color="A89662"/>
+            </w:tcBorders>
+          </w:tcPr>
+          <w:p>
+            <w:pPr>
+              <w:pStyle w:val="Normal"/>
+              <w:spacing w:before="40" w:after="40"/>
+              <w:rPr/>
+            </w:pPr>
+            <w:r>
+              <w:rPr>
+                <w:rFonts w:cs="Book Antiqua"/>
+                <w:color w:val="000000"/>
+                <w:sz w:val="19"/>
+              </w:rPr>
+              <w:t>Feasibility, acceptability and promising training trends</w:t>
+            </w:r>
+          </w:p>
+        </w:tc>
+      </w:tr>
+      <w:tr>
+        <w:trPr>
+          <w:cantSplit w:val="true"/>
+        </w:trPr>
+        <w:tc>
+          <w:tcPr>
+            <w:tcW w:w="4536" w:type="dxa"/>
+            <w:tcBorders>
+              <w:top w:val="single" w:sz="4" w:space="0" w:color="A89662"/>
+              <w:left w:val="single" w:sz="4" w:space="0" w:color="A89662"/>
+              <w:bottom w:val="single" w:sz="4" w:space="0" w:color="A89662"/>
+              <w:right w:val="single" w:sz="4" w:space="0" w:color="A89662"/>
+            </w:tcBorders>
+          </w:tcPr>
+          <w:p>
+            <w:pPr>
+              <w:pStyle w:val="Normal"/>
+              <w:spacing w:before="40" w:after="40"/>
+              <w:rPr/>
+            </w:pPr>
+            <w:r>
+              <w:rPr>
+                <w:rFonts w:cs="Book Antiqua"/>
+                <w:color w:val="000000"/>
+                <w:sz w:val="19"/>
+              </w:rPr>
+              <w:t>Not yet established</w:t>
+            </w:r>
+          </w:p>
+        </w:tc>
+        <w:tc>
+          <w:tcPr>
+            <w:tcW w:w="4535" w:type="dxa"/>
+            <w:tcBorders>
+              <w:top w:val="single" w:sz="4" w:space="0" w:color="A89662"/>
+              <w:left w:val="single" w:sz="4" w:space="0" w:color="A89662"/>
+              <w:bottom w:val="single" w:sz="4" w:space="0" w:color="A89662"/>
+              <w:right w:val="single" w:sz="4" w:space="0" w:color="A89662"/>
+            </w:tcBorders>
+          </w:tcPr>
+          <w:p>
+            <w:pPr>
+              <w:pStyle w:val="Normal"/>
+              <w:spacing w:before="40" w:after="40"/>
+              <w:rPr/>
+            </w:pPr>
+            <w:r>
+              <w:rPr>
+                <w:rFonts w:cs="Book Antiqua"/>
+                <w:color w:val="000000"/>
+                <w:sz w:val="19"/>
+              </w:rPr>
+              <w:t>Causal effectiveness, far transfer, operational-readiness validity and Army-wide scalability</w:t>
+            </w:r>
+          </w:p>
+        </w:tc>
+      </w:tr>
+      <w:tr>
+        <w:trPr>
+          <w:cantSplit w:val="true"/>
+        </w:trPr>
+        <w:tc>
+          <w:tcPr>
+            <w:tcW w:w="4536" w:type="dxa"/>
+            <w:tcBorders>
+              <w:top w:val="single" w:sz="4" w:space="0" w:color="A89662"/>
+              <w:left w:val="single" w:sz="4" w:space="0" w:color="A89662"/>
+              <w:bottom w:val="single" w:sz="4" w:space="0" w:color="A89662"/>
+              <w:right w:val="single" w:sz="4" w:space="0" w:color="A89662"/>
+            </w:tcBorders>
+          </w:tcPr>
+          <w:p>
+            <w:pPr>
+              <w:pStyle w:val="Normal"/>
+              <w:spacing w:before="40" w:after="40"/>
+              <w:rPr/>
+            </w:pPr>
+            <w:r>
+              <w:rPr>
+                <w:rFonts w:cs="Book Antiqua"/>
+                <w:color w:val="000000"/>
+                <w:sz w:val="19"/>
+              </w:rPr>
+              <w:t>Product steward</w:t>
+            </w:r>
+          </w:p>
+        </w:tc>
+        <w:tc>
+          <w:tcPr>
+            <w:tcW w:w="4535" w:type="dxa"/>
+            <w:tcBorders>
+              <w:top w:val="single" w:sz="4" w:space="0" w:color="A89662"/>
+              <w:left w:val="single" w:sz="4" w:space="0" w:color="A89662"/>
+              <w:bottom w:val="single" w:sz="4" w:space="0" w:color="A89662"/>
+              <w:right w:val="single" w:sz="4" w:space="0" w:color="A89662"/>
+            </w:tcBorders>
+          </w:tcPr>
+          <w:p>
+            <w:pPr>
+              <w:pStyle w:val="Normal"/>
+              <w:spacing w:before="40" w:after="40"/>
+              <w:rPr/>
+            </w:pPr>
+            <w:r>
+              <w:rPr>
+                <w:rFonts w:cs="Book Antiqua"/>
+                <w:color w:val="000000"/>
+                <w:sz w:val="19"/>
+              </w:rPr>
+              <w:t>Human Performance Cell</w:t>
+            </w:r>
+          </w:p>
+        </w:tc>
+      </w:tr>
+      <w:tr>
+        <w:trPr>
+          <w:cantSplit w:val="true"/>
+        </w:trPr>
+        <w:tc>
+          <w:tcPr>
+            <w:tcW w:w="4536" w:type="dxa"/>
+            <w:tcBorders>
+              <w:top w:val="single" w:sz="4" w:space="0" w:color="A89662"/>
+              <w:left w:val="single" w:sz="4" w:space="0" w:color="A89662"/>
+              <w:bottom w:val="single" w:sz="4" w:space="0" w:color="A89662"/>
+              <w:right w:val="single" w:sz="4" w:space="0" w:color="A89662"/>
+            </w:tcBorders>
+          </w:tcPr>
+          <w:p>
+            <w:pPr>
+              <w:pStyle w:val="Normal"/>
+              <w:spacing w:before="40" w:after="40"/>
+              <w:rPr/>
+            </w:pPr>
+            <w:r>
+              <w:rPr>
+                <w:rFonts w:cs="Book Antiqua"/>
+                <w:color w:val="000000"/>
+                <w:sz w:val="19"/>
+              </w:rPr>
+              <w:t>Likely delivery model</w:t>
+            </w:r>
+          </w:p>
+        </w:tc>
+        <w:tc>
+          <w:tcPr>
+            <w:tcW w:w="4535" w:type="dxa"/>
+            <w:tcBorders>
+              <w:top w:val="single" w:sz="4" w:space="0" w:color="A89662"/>
+              <w:left w:val="single" w:sz="4" w:space="0" w:color="A89662"/>
+              <w:bottom w:val="single" w:sz="4" w:space="0" w:color="A89662"/>
+              <w:right w:val="single" w:sz="4" w:space="0" w:color="A89662"/>
+            </w:tcBorders>
+          </w:tcPr>
+          <w:p>
+            <w:pPr>
+              <w:pStyle w:val="Normal"/>
+              <w:spacing w:before="40" w:after="40"/>
+              <w:rPr/>
+            </w:pPr>
+            <w:r>
+              <w:rPr>
+                <w:rFonts w:cs="Book Antiqua"/>
+                <w:color w:val="000000"/>
+                <w:sz w:val="19"/>
+              </w:rPr>
+              <w:t>Existing instructors or physical-training staff following standardisation and train-the-trainer preparation</w:t>
+            </w:r>
+          </w:p>
+        </w:tc>
+      </w:tr>
+      <w:tr>
+        <w:trPr>
+          <w:cantSplit w:val="true"/>
+        </w:trPr>
+        <w:tc>
+          <w:tcPr>
+            <w:tcW w:w="4536" w:type="dxa"/>
+            <w:tcBorders>
+              <w:top w:val="single" w:sz="4" w:space="0" w:color="A89662"/>
+              <w:left w:val="single" w:sz="4" w:space="0" w:color="A89662"/>
+              <w:bottom w:val="single" w:sz="4" w:space="0" w:color="A89662"/>
+              <w:right w:val="single" w:sz="4" w:space="0" w:color="A89662"/>
+            </w:tcBorders>
+          </w:tcPr>
+          <w:p>
+            <w:pPr>
+              <w:pStyle w:val="Normal"/>
+              <w:spacing w:before="40" w:after="40"/>
+              <w:rPr/>
+            </w:pPr>
+            <w:r>
+              <w:rPr>
+                <w:rFonts w:cs="Book Antiqua"/>
+                <w:color w:val="000000"/>
+                <w:sz w:val="19"/>
+              </w:rPr>
+              <w:t>Assurance</w:t>
+            </w:r>
+          </w:p>
+        </w:tc>
+        <w:tc>
+          <w:tcPr>
+            <w:tcW w:w="4535" w:type="dxa"/>
+            <w:tcBorders>
+              <w:top w:val="single" w:sz="4" w:space="0" w:color="A89662"/>
+              <w:left w:val="single" w:sz="4" w:space="0" w:color="A89662"/>
+              <w:bottom w:val="single" w:sz="4" w:space="0" w:color="A89662"/>
+              <w:right w:val="single" w:sz="4" w:space="0" w:color="A89662"/>
+            </w:tcBorders>
+          </w:tcPr>
+          <w:p>
+            <w:pPr>
+              <w:pStyle w:val="Normal"/>
+              <w:spacing w:before="40" w:after="40"/>
+              <w:rPr/>
+            </w:pPr>
+            <w:r>
+              <w:rPr>
+                <w:rFonts w:cs="Book Antiqua"/>
+                <w:color w:val="000000"/>
+                <w:sz w:val="19"/>
+              </w:rPr>
+              <w:t>HPC for COGCON product integrity; broader framework assurance through the agreed governance system</w:t>
+            </w:r>
+          </w:p>
+        </w:tc>
+      </w:tr>
+    </w:tbl>
+    <w:p>
+      <w:pPr>
+        <w:pStyle w:val="Normal"/>
+        <w:spacing w:before="0" w:after="160"/>
+        <w:rPr/>
+      </w:pPr>
+      <w:r>
+        <w:rPr/>
+      </w:r>
+    </w:p>
+    <w:p>
+      <w:pPr>
+        <w:pStyle w:val="Heading2"/>
+        <w:rPr/>
+      </w:pPr>
+      <w:r>
+        <w:rPr>
+          <w:rFonts w:cs="Arial" w:ascii="Arial" w:hAnsi="Arial"/>
+          <w:b/>
+          <w:i w:val="false"/>
+          <w:color w:val="000000"/>
+          <w:sz w:val="22"/>
+        </w:rPr>
+        <w:t>A3. Division of functions</w:t>
       </w:r>
     </w:p>
     <w:tbl>
@@ -1849,6 +4009,7 @@
       </w:tblGrid>
       <w:tr>
         <w:trPr>
+          <w:tblHeader w:val="true"/>
           <w:cantSplit w:val="true"/>
         </w:trPr>
         <w:tc>
@@ -1875,7 +4036,7 @@
                 <w:color w:val="FFFFFF"/>
                 <w:sz w:val="19"/>
               </w:rPr>
-              <w:t>Cognitive dimension (science layer)</w:t>
+              <w:t>Function</w:t>
             </w:r>
           </w:p>
         </w:tc>
@@ -1903,7 +4064,7 @@
                 <w:color w:val="FFFFFF"/>
                 <w:sz w:val="19"/>
               </w:rPr>
-              <w:t>Soldier-facing techniques (NZALC toolkit)</w:t>
+              <w:t>Lead</w:t>
             </w:r>
           </w:p>
         </w:tc>
@@ -1931,7 +4092,7 @@
                 <w:color w:val="FFFFFF"/>
                 <w:sz w:val="19"/>
               </w:rPr>
-              <w:t>COGCON conditioning methods</w:t>
+              <w:t>Output</w:t>
             </w:r>
           </w:p>
         </w:tc>
@@ -1962,7 +4123,7 @@
                 <w:color w:val="000000"/>
                 <w:sz w:val="19"/>
               </w:rPr>
-              <w:t>Arousal regulation</w:t>
+              <w:t>Define and govern</w:t>
             </w:r>
           </w:p>
         </w:tc>
@@ -1988,7 +4149,7 @@
                 <w:color w:val="000000"/>
                 <w:sz w:val="19"/>
               </w:rPr>
-              <w:t>Tactical breathing; grounding</w:t>
+              <w:t>Army Sponsor / ACS</w:t>
             </w:r>
           </w:p>
         </w:tc>
@@ -2014,7 +4175,7 @@
                 <w:color w:val="000000"/>
                 <w:sz w:val="19"/>
               </w:rPr>
-              <w:t>Rhythm-breathing injects during high-intensity physical training; within-session heart-rate down-regulation</w:t>
+              <w:t>Endorsed doctrine, definitions, policy direction and capability outcomes</w:t>
             </w:r>
           </w:p>
         </w:tc>
@@ -2045,7 +4206,7 @@
                 <w:color w:val="000000"/>
                 <w:sz w:val="19"/>
               </w:rPr>
-              <w:t>Attention</w:t>
+              <w:t>Integrate capability</w:t>
             </w:r>
           </w:p>
         </w:tc>
@@ -2071,7 +4232,7 @@
                 <w:color w:val="000000"/>
                 <w:sz w:val="19"/>
               </w:rPr>
-              <w:t>Noticing; chunking</w:t>
+              <w:t>ACS</w:t>
             </w:r>
           </w:p>
         </w:tc>
@@ -2097,7 +4258,7 @@
                 <w:color w:val="000000"/>
                 <w:sz w:val="19"/>
               </w:rPr>
-              <w:t>Go/no-go attention drills; threat-identification dual-tasks; agility cones</w:t>
+              <w:t>Framework, product architecture, stakeholder coordination and implementation priorities</w:t>
             </w:r>
           </w:p>
         </w:tc>
@@ -2128,7 +4289,7 @@
                 <w:color w:val="000000"/>
                 <w:sz w:val="19"/>
               </w:rPr>
-              <w:t>Cognitive control</w:t>
+              <w:t>Develop products</w:t>
             </w:r>
           </w:p>
         </w:tc>
@@ -2154,7 +4315,7 @@
                 <w:color w:val="000000"/>
                 <w:sz w:val="19"/>
               </w:rPr>
-              <w:t>Motivational and instructional self-talk</w:t>
+              <w:t>Relevant product owner</w:t>
             </w:r>
           </w:p>
         </w:tc>
@@ -2180,7 +4341,7 @@
                 <w:color w:val="000000"/>
                 <w:sz w:val="19"/>
               </w:rPr>
-              <w:t>Inhibition performance under load; adaptive difficulty progression</w:t>
+              <w:t>Product design, protocols, instructor materials and updates</w:t>
             </w:r>
           </w:p>
         </w:tc>
@@ -2211,7 +4372,7 @@
                 <w:color w:val="000000"/>
                 <w:sz w:val="19"/>
               </w:rPr>
-              <w:t>Working memory</w:t>
+              <w:t>Provide domain advice</w:t>
             </w:r>
           </w:p>
         </w:tc>
@@ -2237,7 +4398,7 @@
                 <w:color w:val="000000"/>
                 <w:sz w:val="19"/>
               </w:rPr>
-              <w:t>Chunking; individual and team game planning</w:t>
+              <w:t>Relevant technical or professional adviser</w:t>
             </w:r>
           </w:p>
         </w:tc>
@@ -2263,7 +4424,7 @@
                 <w:color w:val="000000"/>
                 <w:sz w:val="19"/>
               </w:rPr>
-              <w:t>Audio-brief retention and recall during concurrent tasks</w:t>
+              <w:t>Specialist advice within leadership, psychology, cognition, learning design, physical performance and other domains</w:t>
             </w:r>
           </w:p>
         </w:tc>
@@ -2294,7 +4455,7 @@
                 <w:color w:val="000000"/>
                 <w:sz w:val="19"/>
               </w:rPr>
-              <w:t>Self-knowledge</w:t>
+              <w:t>Deliver</w:t>
             </w:r>
           </w:p>
         </w:tc>
@@ -2320,7 +4481,7 @@
                 <w:color w:val="000000"/>
                 <w:sz w:val="19"/>
               </w:rPr>
-              <w:t>Structured reflection; psychometrics; Red Head–Blue Head</w:t>
+              <w:t>Approved training establishments, units and existing instructor workforces</w:t>
             </w:r>
           </w:p>
         </w:tc>
@@ -2346,142 +4507,7 @@
                 <w:color w:val="000000"/>
                 <w:sz w:val="19"/>
               </w:rPr>
-              <w:t>Performance monitoring; coach scoring and feedback; Team Awareness drills</w:t>
-            </w:r>
-          </w:p>
-        </w:tc>
-      </w:tr>
-    </w:tbl>
-    <w:p>
-      <w:pPr>
-        <w:pStyle w:val="Normal"/>
-        <w:spacing w:before="0" w:after="160"/>
-        <w:rPr/>
-      </w:pPr>
-      <w:r>
-        <w:rPr/>
-      </w:r>
-    </w:p>
-    <w:p>
-      <w:pPr>
-        <w:pStyle w:val="Heading2"/>
-        <w:rPr/>
-      </w:pPr>
-      <w:r>
-        <w:rPr>
-          <w:rFonts w:cs="Arial" w:ascii="Arial" w:hAnsi="Arial"/>
-          <w:b/>
-          <w:i w:val="false"/>
-          <w:color w:val="000000"/>
-          <w:sz w:val="22"/>
-        </w:rPr>
-        <w:t>A2. Division of functions — by function, not organisation</w:t>
-      </w:r>
-    </w:p>
-    <w:tbl>
-      <w:tblPr>
-        <w:tblW w:w="9072" w:type="dxa"/>
-        <w:jc w:val="left"/>
-        <w:tblInd w:w="0" w:type="dxa"/>
-        <w:tblLayout w:type="fixed"/>
-        <w:tblCellMar>
-          <w:top w:w="0" w:type="dxa"/>
-          <w:left w:w="108" w:type="dxa"/>
-          <w:bottom w:w="0" w:type="dxa"/>
-          <w:right w:w="108" w:type="dxa"/>
-        </w:tblCellMar>
-        <w:tblLook w:val="04a0" w:noHBand="0" w:noVBand="1" w:firstColumn="1" w:lastRow="0" w:lastColumn="0" w:firstRow="1"/>
-      </w:tblPr>
-      <w:tblGrid>
-        <w:gridCol w:w="3024"/>
-        <w:gridCol w:w="3024"/>
-        <w:gridCol w:w="3024"/>
-      </w:tblGrid>
-      <w:tr>
-        <w:trPr>
-          <w:cantSplit w:val="true"/>
-        </w:trPr>
-        <w:tc>
-          <w:tcPr>
-            <w:tcW w:w="3024" w:type="dxa"/>
-            <w:tcBorders>
-              <w:top w:val="single" w:sz="4" w:space="0" w:color="A89662"/>
-              <w:left w:val="single" w:sz="4" w:space="0" w:color="A89662"/>
-              <w:bottom w:val="single" w:sz="4" w:space="0" w:color="A89662"/>
-              <w:right w:val="single" w:sz="4" w:space="0" w:color="A89662"/>
-            </w:tcBorders>
-            <w:shd w:fill="002516" w:val="clear"/>
-          </w:tcPr>
-          <w:p>
-            <w:pPr>
-              <w:pStyle w:val="Normal"/>
-              <w:spacing w:before="40" w:after="40"/>
-              <w:rPr/>
-            </w:pPr>
-            <w:r>
-              <w:rPr>
-                <w:rFonts w:cs="Arial" w:ascii="Arial" w:hAnsi="Arial"/>
-                <w:b/>
-                <w:color w:val="FFFFFF"/>
-                <w:sz w:val="19"/>
-              </w:rPr>
-              <w:t>Function</w:t>
-            </w:r>
-          </w:p>
-        </w:tc>
-        <w:tc>
-          <w:tcPr>
-            <w:tcW w:w="3024" w:type="dxa"/>
-            <w:tcBorders>
-              <w:top w:val="single" w:sz="4" w:space="0" w:color="A89662"/>
-              <w:left w:val="single" w:sz="4" w:space="0" w:color="A89662"/>
-              <w:bottom w:val="single" w:sz="4" w:space="0" w:color="A89662"/>
-              <w:right w:val="single" w:sz="4" w:space="0" w:color="A89662"/>
-            </w:tcBorders>
-            <w:shd w:fill="002516" w:val="clear"/>
-          </w:tcPr>
-          <w:p>
-            <w:pPr>
-              <w:pStyle w:val="Normal"/>
-              <w:spacing w:before="40" w:after="40"/>
-              <w:rPr/>
-            </w:pPr>
-            <w:r>
-              <w:rPr>
-                <w:rFonts w:cs="Arial" w:ascii="Arial" w:hAnsi="Arial"/>
-                <w:b/>
-                <w:color w:val="FFFFFF"/>
-                <w:sz w:val="19"/>
-              </w:rPr>
-              <w:t>Lead</w:t>
-            </w:r>
-          </w:p>
-        </w:tc>
-        <w:tc>
-          <w:tcPr>
-            <w:tcW w:w="3024" w:type="dxa"/>
-            <w:tcBorders>
-              <w:top w:val="single" w:sz="4" w:space="0" w:color="A89662"/>
-              <w:left w:val="single" w:sz="4" w:space="0" w:color="A89662"/>
-              <w:bottom w:val="single" w:sz="4" w:space="0" w:color="A89662"/>
-              <w:right w:val="single" w:sz="4" w:space="0" w:color="A89662"/>
-            </w:tcBorders>
-            <w:shd w:fill="002516" w:val="clear"/>
-          </w:tcPr>
-          <w:p>
-            <w:pPr>
-              <w:pStyle w:val="Normal"/>
-              <w:spacing w:before="40" w:after="40"/>
-              <w:rPr/>
-            </w:pPr>
-            <w:r>
-              <w:rPr>
-                <w:rFonts w:cs="Arial" w:ascii="Arial" w:hAnsi="Arial"/>
-                <w:b/>
-                <w:color w:val="FFFFFF"/>
-                <w:sz w:val="19"/>
-              </w:rPr>
-              <w:t>What it looks like</w:t>
+              <w:t>Routine delivery of recognised products</w:t>
             </w:r>
           </w:p>
         </w:tc>
@@ -2512,7 +4538,7 @@
                 <w:color w:val="000000"/>
                 <w:sz w:val="19"/>
               </w:rPr>
-              <w:t>Educate</w:t>
+              <w:t>Measure training performance</w:t>
             </w:r>
           </w:p>
         </w:tc>
@@ -2538,7 +4564,7 @@
                 <w:color w:val="000000"/>
                 <w:sz w:val="19"/>
               </w:rPr>
-              <w:t>NZALC</w:t>
+              <w:t>Delivery organisation, using approved methods</w:t>
             </w:r>
           </w:p>
         </w:tc>
@@ -2564,7 +4590,7 @@
                 <w:color w:val="000000"/>
                 <w:sz w:val="19"/>
               </w:rPr>
-              <w:t>Concepts and toolkit taught and applied through leadership development, Lead Self to Lead Systems</w:t>
+              <w:t>Proportionate training feedback and product-level performance data</w:t>
             </w:r>
           </w:p>
         </w:tc>
@@ -2595,7 +4621,7 @@
                 <w:color w:val="000000"/>
                 <w:sz w:val="19"/>
               </w:rPr>
-              <w:t>Condition</w:t>
+              <w:t>Evaluate product effectiveness</w:t>
             </w:r>
           </w:p>
         </w:tc>
@@ -2621,7 +4647,7 @@
                 <w:color w:val="000000"/>
                 <w:sz w:val="19"/>
               </w:rPr>
-              <w:t>HPC</w:t>
+              <w:t>Product owner, with independent evaluation or research support</w:t>
             </w:r>
           </w:p>
         </w:tc>
@@ -2647,7 +4673,7 @@
                 <w:color w:val="000000"/>
                 <w:sz w:val="19"/>
               </w:rPr>
-              <w:t>COGCON dual-task repetitions embedded in physical training, with adaptive difficulty</w:t>
+              <w:t>Evidence of feasibility, effectiveness, transfer and scalability</w:t>
             </w:r>
           </w:p>
         </w:tc>
@@ -2678,7 +4704,7 @@
                 <w:color w:val="000000"/>
                 <w:sz w:val="19"/>
               </w:rPr>
-              <w:t>Expose</w:t>
+              <w:t>Assure</w:t>
             </w:r>
           </w:p>
         </w:tc>
@@ -2704,7 +4730,7 @@
                 <w:color w:val="000000"/>
                 <w:sz w:val="19"/>
               </w:rPr>
-              <w:t>Joint</w:t>
+              <w:t>Layered governance and domain authorities</w:t>
             </w:r>
           </w:p>
         </w:tc>
@@ -2730,7 +4756,7 @@
                 <w:color w:val="000000"/>
                 <w:sz w:val="19"/>
               </w:rPr>
-              <w:t>Scenario and experiential pressure training, co-designed</w:t>
+              <w:t>Doctrine, evidence, professional, learning, delivery and operational assurance</w:t>
             </w:r>
           </w:p>
         </w:tc>
@@ -2761,7 +4787,7 @@
                 <w:color w:val="000000"/>
                 <w:sz w:val="19"/>
               </w:rPr>
-              <w:t>Measure</w:t>
+              <w:t>Review and recover</w:t>
             </w:r>
           </w:p>
         </w:tc>
@@ -2787,7 +4813,7 @@
                 <w:color w:val="000000"/>
                 <w:sz w:val="19"/>
               </w:rPr>
-              <w:t>HPC</w:t>
+              <w:t>Relevant leadership and training systems</w:t>
             </w:r>
           </w:p>
         </w:tc>
@@ -2813,173 +4839,7 @@
                 <w:color w:val="000000"/>
                 <w:sz w:val="19"/>
               </w:rPr>
-              <w:t>Heart-rate regulation, attention and inhibition thresholds, progression level reached</w:t>
-            </w:r>
-          </w:p>
-        </w:tc>
-      </w:tr>
-      <w:tr>
-        <w:trPr>
-          <w:cantSplit w:val="true"/>
-        </w:trPr>
-        <w:tc>
-          <w:tcPr>
-            <w:tcW w:w="3024" w:type="dxa"/>
-            <w:tcBorders>
-              <w:top w:val="single" w:sz="4" w:space="0" w:color="A89662"/>
-              <w:left w:val="single" w:sz="4" w:space="0" w:color="A89662"/>
-              <w:bottom w:val="single" w:sz="4" w:space="0" w:color="A89662"/>
-              <w:right w:val="single" w:sz="4" w:space="0" w:color="A89662"/>
-            </w:tcBorders>
-          </w:tcPr>
-          <w:p>
-            <w:pPr>
-              <w:pStyle w:val="Normal"/>
-              <w:spacing w:before="40" w:after="40"/>
-              <w:rPr/>
-            </w:pPr>
-            <w:r>
-              <w:rPr>
-                <w:rFonts w:cs="Book Antiqua"/>
-                <w:color w:val="000000"/>
-                <w:sz w:val="19"/>
-              </w:rPr>
-              <w:t>Review and recover</w:t>
-            </w:r>
-          </w:p>
-        </w:tc>
-        <w:tc>
-          <w:tcPr>
-            <w:tcW w:w="3024" w:type="dxa"/>
-            <w:tcBorders>
-              <w:top w:val="single" w:sz="4" w:space="0" w:color="A89662"/>
-              <w:left w:val="single" w:sz="4" w:space="0" w:color="A89662"/>
-              <w:bottom w:val="single" w:sz="4" w:space="0" w:color="A89662"/>
-              <w:right w:val="single" w:sz="4" w:space="0" w:color="A89662"/>
-            </w:tcBorders>
-          </w:tcPr>
-          <w:p>
-            <w:pPr>
-              <w:pStyle w:val="Normal"/>
-              <w:spacing w:before="40" w:after="40"/>
-              <w:rPr/>
-            </w:pPr>
-            <w:r>
-              <w:rPr>
-                <w:rFonts w:cs="Book Antiqua"/>
-                <w:color w:val="000000"/>
-                <w:sz w:val="19"/>
-              </w:rPr>
-              <w:t>NZALC</w:t>
-            </w:r>
-          </w:p>
-        </w:tc>
-        <w:tc>
-          <w:tcPr>
-            <w:tcW w:w="3024" w:type="dxa"/>
-            <w:tcBorders>
-              <w:top w:val="single" w:sz="4" w:space="0" w:color="A89662"/>
-              <w:left w:val="single" w:sz="4" w:space="0" w:color="A89662"/>
-              <w:bottom w:val="single" w:sz="4" w:space="0" w:color="A89662"/>
-              <w:right w:val="single" w:sz="4" w:space="0" w:color="A89662"/>
-            </w:tcBorders>
-          </w:tcPr>
-          <w:p>
-            <w:pPr>
-              <w:pStyle w:val="Normal"/>
-              <w:spacing w:before="40" w:after="40"/>
-              <w:rPr/>
-            </w:pPr>
-            <w:r>
-              <w:rPr>
-                <w:rFonts w:cs="Book Antiqua"/>
-                <w:color w:val="000000"/>
-                <w:sz w:val="19"/>
-              </w:rPr>
-              <w:t>Structured reflection, self and peer feedback, Leadership Development Plans</w:t>
-            </w:r>
-          </w:p>
-        </w:tc>
-      </w:tr>
-      <w:tr>
-        <w:trPr>
-          <w:cantSplit w:val="true"/>
-        </w:trPr>
-        <w:tc>
-          <w:tcPr>
-            <w:tcW w:w="3024" w:type="dxa"/>
-            <w:tcBorders>
-              <w:top w:val="single" w:sz="4" w:space="0" w:color="A89662"/>
-              <w:left w:val="single" w:sz="4" w:space="0" w:color="A89662"/>
-              <w:bottom w:val="single" w:sz="4" w:space="0" w:color="A89662"/>
-              <w:right w:val="single" w:sz="4" w:space="0" w:color="A89662"/>
-            </w:tcBorders>
-          </w:tcPr>
-          <w:p>
-            <w:pPr>
-              <w:pStyle w:val="Normal"/>
-              <w:spacing w:before="40" w:after="40"/>
-              <w:rPr/>
-            </w:pPr>
-            <w:r>
-              <w:rPr>
-                <w:rFonts w:cs="Book Antiqua"/>
-                <w:color w:val="000000"/>
-                <w:sz w:val="19"/>
-              </w:rPr>
-              <w:t>Assure</w:t>
-            </w:r>
-          </w:p>
-        </w:tc>
-        <w:tc>
-          <w:tcPr>
-            <w:tcW w:w="3024" w:type="dxa"/>
-            <w:tcBorders>
-              <w:top w:val="single" w:sz="4" w:space="0" w:color="A89662"/>
-              <w:left w:val="single" w:sz="4" w:space="0" w:color="A89662"/>
-              <w:bottom w:val="single" w:sz="4" w:space="0" w:color="A89662"/>
-              <w:right w:val="single" w:sz="4" w:space="0" w:color="A89662"/>
-            </w:tcBorders>
-          </w:tcPr>
-          <w:p>
-            <w:pPr>
-              <w:pStyle w:val="Normal"/>
-              <w:spacing w:before="40" w:after="40"/>
-              <w:rPr/>
-            </w:pPr>
-            <w:r>
-              <w:rPr>
-                <w:rFonts w:cs="Book Antiqua"/>
-                <w:color w:val="000000"/>
-                <w:sz w:val="19"/>
-              </w:rPr>
-              <w:t>Joint</w:t>
-            </w:r>
-          </w:p>
-        </w:tc>
-        <w:tc>
-          <w:tcPr>
-            <w:tcW w:w="3024" w:type="dxa"/>
-            <w:tcBorders>
-              <w:top w:val="single" w:sz="4" w:space="0" w:color="A89662"/>
-              <w:left w:val="single" w:sz="4" w:space="0" w:color="A89662"/>
-              <w:bottom w:val="single" w:sz="4" w:space="0" w:color="A89662"/>
-              <w:right w:val="single" w:sz="4" w:space="0" w:color="A89662"/>
-            </w:tcBorders>
-          </w:tcPr>
-          <w:p>
-            <w:pPr>
-              <w:pStyle w:val="Normal"/>
-              <w:spacing w:before="40" w:after="40"/>
-              <w:rPr/>
-            </w:pPr>
-            <w:r>
-              <w:rPr>
-                <w:rFonts w:cs="Book Antiqua"/>
-                <w:color w:val="000000"/>
-                <w:sz w:val="19"/>
-              </w:rPr>
-              <w:t>Cognitive-readiness metrics (HPC) alongside observed leadership behaviour (NZALC)</w:t>
+              <w:t>Reflection, feedback, recovery and developmental planning</w:t>
             </w:r>
           </w:p>
         </w:tc>
@@ -3008,7 +4868,7 @@
           <w:color w:val="000000"/>
           <w:sz w:val="22"/>
         </w:rPr>
-        <w:t>A3. Shared frames</w:t>
+        <w:t>A4. Shared frames</w:t>
       </w:r>
     </w:p>
     <w:p>
@@ -3044,7 +4904,7 @@
           <w:b w:val="false"/>
           <w:i w:val="false"/>
         </w:rPr>
-        <w:t>Prepare–Perform–Recover is the common delivery rhythm: COGCON operates principally in Prepare and Perform; NZALC closes the loop in Recover.</w:t>
+        <w:t>Prepare–Perform–Recover provides a common delivery rhythm across recognised products and methods.</w:t>
       </w:r>
     </w:p>
     <w:p>
@@ -3080,7 +4940,7 @@
           <w:b w:val="false"/>
           <w:i w:val="false"/>
         </w:rPr>
-        <w:t>Lead Self to Lead Systems is the common progression: conditioning is densest in initial and individual training; leadership application deepens up the continuum.</w:t>
+        <w:t>Lead Self to Lead Systems provides the developmental progression: individual conditioning is likely to be densest in initial and individual training, while leadership, team and systems application deepens across the leadership continuum.</w:t>
       </w:r>
     </w:p>
     <w:p>
@@ -3116,7 +4976,7 @@
           <w:b w:val="false"/>
           <w:i w:val="false"/>
         </w:rPr>
-        <w:t>The Phase 4 pilot embeds the COGCON adaptive dual-task protocol within an existing NZALC serial — NZALC teaching and reviewing, HPC conditioning and measuring — to prove the integration in delivery.</w:t>
+        <w:t>COGCON currently contributes principally to selected Prepare and Perform activities within the performance-cognition strand. NZALC and other leadership-development products provide broader preparation, application, structured review and recovery.</w:t>
       </w:r>
     </w:p>
     <w:sectPr>
@@ -3222,7 +5082,7 @@
         <w:sz w:val="17"/>
         <w:rFonts w:cs="Arial" w:ascii="Arial" w:hAnsi="Arial"/>
       </w:rPr>
-      <w:t>7</w:t>
+      <w:t>9</w:t>
     </w:r>
     <w:r>
       <w:rPr>
@@ -3266,7 +5126,7 @@
         <w:sz w:val="17"/>
         <w:rFonts w:cs="Arial" w:ascii="Arial" w:hAnsi="Arial"/>
       </w:rPr>
-      <w:t>7</w:t>
+      <w:t>9</w:t>
     </w:r>
     <w:r>
       <w:rPr>

</xml_diff>

<commit_message>
Revise definitions: Combat Mindset as combat-specific expression (v0.3)
Removes 'operational frame' as a formal term throughout. Combat
Mindset is redefined as the combat-specific expression of Performance
Under Pressure; PUP as the enabling, trainable human-performance
capability; the Army Combat Mindset Framework as the organising model.
Adds three formal definition blocks, amends recommendations to seek
endorsement of each definition and the framework role separately,
aligns governance wording, rebuilds Annex A1 as the doctrinal
hierarchy with an explicit relationship chain, and adds COGCON's
relationship-to-Combat-Mindset row. Version to Draft v0.3.

Co-Authored-By: Claude Fable 5 <noreply@anthropic.com>
Claude-Session: https://claude.ai/code/session_01YLo1WfwUDkbwfJEF3ZNVbB
</commit_message>
<xml_diff>
--- a/output/combat-mindset-way-forward.docx
+++ b/output/combat-mindset-way-forward.docx
@@ -231,7 +231,7 @@
           <w:color w:val="000000"/>
           <w:sz w:val="20"/>
         </w:rPr>
-        <w:t>Draft v0.2</w:t>
+        <w:t>Draft v0.3</w:t>
       </w:r>
     </w:p>
     <w:p>
@@ -309,7 +309,7 @@
           <w:b w:val="false"/>
           <w:i w:val="false"/>
         </w:rPr>
-        <w:t>This paper responds to COMDT ACS direction of 16 July 2026 for NZALC and the Human Performance Cell to jointly develop a strategy to close the Combat Mindset doctrine and policy gap. It proposes an agreed problem statement, a terminology construct for decision, a programme of work, interim governance arrangements, and an approach for mapping and appropriately nesting existing training products beneath an Army Combat Mindset Framework.</w:t>
+        <w:t>This paper responds to COMDT ACS direction of 16 July 2026 for NZALC and the Human Performance Cell to jointly develop a strategy to close the Combat Mindset doctrine and policy gap. It proposes an agreed problem statement, formal definitions and their relationship for decision, the Army Combat Mindset Framework as the organising model, a programme of work, interim governance and assurance arrangements, and the appropriate nesting of existing training products beneath the framework.</w:t>
       </w:r>
     </w:p>
     <w:p>
@@ -415,6 +415,20 @@
           <w:b w:val="false"/>
           <w:i w:val="false"/>
         </w:rPr>
+        <w:t>The doctrinal requirement is therefore to define the human-performance capability Army must deliberately develop, and to describe its combat-specific expression.</w:t>
+      </w:r>
+    </w:p>
+    <w:p>
+      <w:pPr>
+        <w:pStyle w:val="Normal"/>
+        <w:rPr/>
+      </w:pPr>
+      <w:r>
+        <w:rPr>
+          <w:rFonts w:cs="Book Antiqua"/>
+          <w:b w:val="false"/>
+          <w:i w:val="false"/>
+        </w:rPr>
         <w:t>Sufficient evidence and existing capability are available to commence governance, mapping and framework development immediately. The present gap is principally institutional and integrative.</w:t>
       </w:r>
     </w:p>
@@ -447,21 +461,21 @@
           <w:color w:val="002516"/>
           <w:sz w:val="28"/>
         </w:rPr>
-        <w:t>2. Terminology — decision sought</w:t>
-      </w:r>
-    </w:p>
-    <w:p>
-      <w:pPr>
-        <w:pStyle w:val="Normal"/>
-        <w:rPr/>
-      </w:pPr>
-      <w:r>
-        <w:rPr>
-          <w:rFonts w:cs="Book Antiqua"/>
-          <w:b w:val="false"/>
-          <w:i w:val="false"/>
-        </w:rPr>
-        <w:t>The COMDT ACS guidance and the NZALC capability note differ on one structural point: which term sits at the top of the hierarchy. This is the single decision required before the framework can be drafted. Two options are offered.</w:t>
+        <w:t>2. Terminology and definitions — decision sought</w:t>
+      </w:r>
+    </w:p>
+    <w:p>
+      <w:pPr>
+        <w:pStyle w:val="Normal"/>
+        <w:rPr/>
+      </w:pPr>
+      <w:r>
+        <w:rPr>
+          <w:rFonts w:cs="Book Antiqua"/>
+          <w:b w:val="false"/>
+          <w:i w:val="false"/>
+        </w:rPr>
+        <w:t>The COMDT ACS guidance and the NZALC capability note differ on one structural point: the relationship between Combat Mindset and Performance Under Pressure. This is the single decision required before the framework can be drafted. Two options are offered.</w:t>
       </w:r>
     </w:p>
     <w:p>
@@ -477,21 +491,135 @@
           <w:color w:val="000000"/>
           <w:sz w:val="22"/>
         </w:rPr>
-        <w:t>Option 1 — Combat Mindset as the operational frame; Performance Under Pressure as the underlying capability (recommended)</w:t>
-      </w:r>
-    </w:p>
-    <w:p>
-      <w:pPr>
-        <w:pStyle w:val="Normal"/>
-        <w:rPr/>
-      </w:pPr>
-      <w:r>
-        <w:rPr>
-          <w:rFonts w:cs="Book Antiqua"/>
-          <w:b w:val="false"/>
-          <w:i w:val="false"/>
-        </w:rPr>
-        <w:t>Combat Mindset is the Army-owned operational frame and orienting purpose, aligned to Warfighter Focus. Performance Under Pressure is the trained individual and collective capability beneath it: the capacity to prepare for, remain effective through, adapt within and recover from pressure. Harder to Kill is proposed as a supporting Warfighter Focus communication line, subject to sponsor endorsement, rather than as part of the formal definition.</w:t>
+        <w:t>Option 1 — Combat Mindset as the combat-specific expression of Performance Under Pressure (recommended)</w:t>
+      </w:r>
+    </w:p>
+    <w:p>
+      <w:pPr>
+        <w:pStyle w:val="Normal"/>
+        <w:rPr/>
+      </w:pPr>
+      <w:r>
+        <w:rPr>
+          <w:rFonts w:cs="Book Antiqua"/>
+          <w:b w:val="false"/>
+          <w:i w:val="false"/>
+        </w:rPr>
+        <w:t>Combat Mindset is the combat-specific expression of Performance Under Pressure. It describes the individual and collective readiness and disposition Army seeks under the threat, adversity and uncertainty of combat.</w:t>
+      </w:r>
+    </w:p>
+    <w:p>
+      <w:pPr>
+        <w:pStyle w:val="Normal"/>
+        <w:rPr/>
+      </w:pPr>
+      <w:r>
+        <w:rPr>
+          <w:rFonts w:cs="Book Antiqua"/>
+          <w:b w:val="false"/>
+          <w:i w:val="false"/>
+        </w:rPr>
+        <w:t>Performance Under Pressure is the enabling human-performance capability: the trainable individual and collective capacity to prepare for, maintain effective performance through, adapt within and recover from pressure. It is applicable across combat, command, crisis response, training, garrison leadership and high-risk technical activity. Combat Mindset places that broader capability within its specifically warfighting context and connects it to Army's mission, identity, values and operational purpose.</w:t>
+      </w:r>
+    </w:p>
+    <w:p>
+      <w:pPr>
+        <w:pStyle w:val="Normal"/>
+        <w:rPr/>
+      </w:pPr>
+      <w:r>
+        <w:rPr>
+          <w:rFonts w:cs="Book Antiqua"/>
+          <w:b w:val="false"/>
+          <w:i w:val="false"/>
+        </w:rPr>
+        <w:t>The Army Combat Mindset Framework is the organising model through which Army will define, develop, integrate and assure the capability strands, developmental outcomes, training products and governance arrangements that enable this effect.</w:t>
+      </w:r>
+    </w:p>
+    <w:p>
+      <w:pPr>
+        <w:pStyle w:val="Normal"/>
+        <w:rPr/>
+      </w:pPr>
+      <w:r>
+        <w:rPr>
+          <w:rFonts w:cs="Book Antiqua"/>
+          <w:b w:val="false"/>
+          <w:i w:val="false"/>
+        </w:rPr>
+        <w:t>The following formal definitions are proposed as the drafting baseline.</w:t>
+      </w:r>
+    </w:p>
+    <w:p>
+      <w:pPr>
+        <w:pStyle w:val="Normal"/>
+        <w:spacing w:before="120" w:after="160"/>
+        <w:ind w:left="567" w:right="567"/>
+        <w:rPr/>
+      </w:pPr>
+      <w:r>
+        <w:rPr>
+          <w:rFonts w:cs="Book Antiqua"/>
+          <w:b/>
+          <w:i/>
+        </w:rPr>
+        <w:t>Combat Mindset.</w:t>
+      </w:r>
+      <w:r>
+        <w:rPr>
+          <w:rFonts w:cs="Book Antiqua"/>
+          <w:b w:val="false"/>
+          <w:i/>
+        </w:rPr>
+        <w:t xml:space="preserve"> The combat-specific expression of Performance Under Pressure: the individual and collective readiness and disposition to remain effective and act decisively, persistently, adaptively and ethically under the threat, adversity and uncertainty of combat in order to achieve the mission.</w:t>
+      </w:r>
+    </w:p>
+    <w:p>
+      <w:pPr>
+        <w:pStyle w:val="Normal"/>
+        <w:spacing w:before="120" w:after="160"/>
+        <w:ind w:left="567" w:right="567"/>
+        <w:rPr/>
+      </w:pPr>
+      <w:r>
+        <w:rPr>
+          <w:rFonts w:cs="Book Antiqua"/>
+          <w:b/>
+          <w:i/>
+        </w:rPr>
+        <w:t>Performance Under Pressure.</w:t>
+      </w:r>
+      <w:r>
+        <w:rPr>
+          <w:rFonts w:cs="Book Antiqua"/>
+          <w:b w:val="false"/>
+          <w:i/>
+        </w:rPr>
+        <w:t xml:space="preserve"> The trainable individual and collective human-performance capability to prepare for, maintain effective performance through, adapt within and recover from conditions that create significant physiological, cognitive, emotional or social interference.</w:t>
+      </w:r>
+    </w:p>
+    <w:p>
+      <w:pPr>
+        <w:pStyle w:val="Normal"/>
+        <w:spacing w:before="120" w:after="160"/>
+        <w:ind w:left="567" w:right="567"/>
+        <w:rPr/>
+      </w:pPr>
+      <w:r>
+        <w:rPr>
+          <w:rFonts w:cs="Book Antiqua"/>
+          <w:b/>
+          <w:i/>
+        </w:rPr>
+        <w:t>Army Combat Mindset Framework.</w:t>
+      </w:r>
+      <w:r>
+        <w:rPr>
+          <w:rFonts w:cs="Book Antiqua"/>
+          <w:b w:val="false"/>
+          <w:i/>
+        </w:rPr>
+        <w:t xml:space="preserve"> The organising model through which Army defines, develops, integrates and assures the individual and collective capabilities that enable Combat Mindset.</w:t>
       </w:r>
     </w:p>
     <w:p>
@@ -511,7 +639,7 @@
           <w:b/>
           <w:i w:val="false"/>
         </w:rPr>
-        <w:t>Combat Mindset explains why the capability matters to Army. Performance Under Pressure explains what must be developed and sustained in individuals, teams, leaders and systems.</w:t>
+        <w:t>Performance Under Pressure describes the trainable human-performance capability. Combat Mindset describes the specifically combat-oriented expression of that capability.</w:t>
       </w:r>
     </w:p>
     <w:p>
@@ -547,7 +675,7 @@
           <w:b w:val="false"/>
           <w:i w:val="false"/>
         </w:rPr>
-        <w:t>Preserves Combat Mindset as the recognisable, operationally credible Army frame.</w:t>
+        <w:t>Gives each term one clear purpose: Combat Mindset is the combat-specific expression; Performance Under Pressure is the enabling capability; the Army Combat Mindset Framework is the organising model.</w:t>
       </w:r>
     </w:p>
     <w:p>
@@ -583,7 +711,7 @@
           <w:b w:val="false"/>
           <w:i w:val="false"/>
         </w:rPr>
-        <w:t>Keeps the underlying capability applicable Army-wide — command, crisis response, garrison leadership and high-risk technical activity, where pressure exists without an enemy.</w:t>
+        <w:t>Keeps Performance Under Pressure applicable wherever significant pressure exists without an enemy — command, crisis response, training, garrison leadership and high-risk technical activity.</w:t>
       </w:r>
     </w:p>
     <w:p>
@@ -619,7 +747,7 @@
           <w:b w:val="false"/>
           <w:i w:val="false"/>
         </w:rPr>
-        <w:t>Guards against Combat Mindset being misread as aggression or motivation alone.</w:t>
+        <w:t>Guards against Combat Mindset being misread as aggression, motivation or resilience alone.</w:t>
       </w:r>
     </w:p>
     <w:p>
@@ -655,7 +783,7 @@
           <w:b w:val="false"/>
           <w:i w:val="false"/>
         </w:rPr>
-        <w:t>Allows doctrine, the framework, training products and delivery organisations to nest cleanly beneath the frame.</w:t>
+        <w:t>Harder to Kill remains a proposed Warfighter Focus communication line, subject to sponsor endorsement, and does not form part of the formal definitions.</w:t>
       </w:r>
     </w:p>
     <w:p>
@@ -671,21 +799,21 @@
           <w:color w:val="000000"/>
           <w:sz w:val="22"/>
         </w:rPr>
-        <w:t>Option 2 — Combat Mindset as the umbrella capability</w:t>
-      </w:r>
-    </w:p>
-    <w:p>
-      <w:pPr>
-        <w:pStyle w:val="Normal"/>
-        <w:rPr/>
-      </w:pPr>
-      <w:r>
-        <w:rPr>
-          <w:rFonts w:cs="Book Antiqua"/>
-          <w:b w:val="false"/>
-          <w:i w:val="false"/>
-        </w:rPr>
-        <w:t>Combat Mindset is the overarching capability, integrating leadership, human performance, resilience, mental skills and performance cognition, with performance under pressure expressed as its intended effect.</w:t>
+        <w:t>Option 2 — Combat Mindset as the complete umbrella capability</w:t>
+      </w:r>
+    </w:p>
+    <w:p>
+      <w:pPr>
+        <w:pStyle w:val="Normal"/>
+        <w:rPr/>
+      </w:pPr>
+      <w:r>
+        <w:rPr>
+          <w:rFonts w:cs="Book Antiqua"/>
+          <w:b w:val="false"/>
+          <w:i w:val="false"/>
+        </w:rPr>
+        <w:t>Combat Mindset is treated as the complete capability itself, integrating leadership, human performance, resilience, mental skills and performance cognition, with performance under pressure expressed within it.</w:t>
       </w:r>
     </w:p>
     <w:p>
@@ -721,7 +849,7 @@
           <w:b w:val="false"/>
           <w:i w:val="false"/>
         </w:rPr>
-        <w:t>Maximises simplicity: one term, one capability, one framework.</w:t>
+        <w:t>Maximises simplicity: one term serves as outcome, capability and framework alike.</w:t>
       </w:r>
     </w:p>
     <w:p>
@@ -757,245 +885,7 @@
           <w:b w:val="false"/>
           <w:i w:val="false"/>
         </w:rPr>
-        <w:t>Risks excluding the majority of Army activity that is demanding but not combat, and re-importing the definitional confusion identified in the capability note.</w:t>
-      </w:r>
-    </w:p>
-    <w:p>
-      <w:pPr>
-        <w:pStyle w:val="Normal"/>
-        <w:rPr/>
-      </w:pPr>
-      <w:r>
-        <w:rPr>
-          <w:rFonts w:cs="Book Antiqua"/>
-          <w:b w:val="false"/>
-          <w:i w:val="false"/>
-        </w:rPr>
-        <w:t>Both options deliver the end state described in the COMDT ACS guidance. NZALC and HPC jointly recommend Option 1, and will implement whichever option COMDT ACS selects.</w:t>
-      </w:r>
-    </w:p>
-    <w:p>
-      <w:pPr>
-        <w:pStyle w:val="Normal"/>
-        <w:pBdr>
-          <w:bottom w:val="single" w:sz="6" w:space="1" w:color="A89662"/>
-        </w:pBdr>
-        <w:spacing w:before="200" w:after="200"/>
-        <w:rPr/>
-      </w:pPr>
-      <w:r>
-        <w:rPr/>
-      </w:r>
-    </w:p>
-    <w:p>
-      <w:pPr>
-        <w:pStyle w:val="Heading1"/>
-        <w:pBdr>
-          <w:left w:val="single" w:sz="24" w:space="8" w:color="C62026"/>
-        </w:pBdr>
-        <w:rPr/>
-      </w:pPr>
-      <w:r>
-        <w:rPr>
-          <w:rFonts w:cs="Arial" w:ascii="Arial" w:hAnsi="Arial"/>
-          <w:b/>
-          <w:i w:val="false"/>
-          <w:color w:val="002516"/>
-          <w:sz w:val="28"/>
-        </w:rPr>
-        <w:t>3. What already exists</w:t>
-      </w:r>
-    </w:p>
-    <w:p>
-      <w:pPr>
-        <w:pStyle w:val="Normal"/>
-        <w:rPr/>
-      </w:pPr>
-      <w:r>
-        <w:rPr>
-          <w:rFonts w:cs="Book Antiqua"/>
-          <w:b w:val="false"/>
-          <w:i w:val="false"/>
-        </w:rPr>
-        <w:t>A full capability and product map will be completed during Phase 1. Initial holdings include the following.</w:t>
-      </w:r>
-    </w:p>
-    <w:p>
-      <w:pPr>
-        <w:pStyle w:val="Heading2"/>
-        <w:rPr/>
-      </w:pPr>
-      <w:r>
-        <w:rPr>
-          <w:rFonts w:cs="Arial" w:ascii="Arial" w:hAnsi="Arial"/>
-          <w:b/>
-          <w:i w:val="false"/>
-          <w:color w:val="000000"/>
-          <w:sz w:val="22"/>
-        </w:rPr>
-        <w:t>NZALC Performance Under Pressure package</w:t>
-      </w:r>
-    </w:p>
-    <w:p>
-      <w:pPr>
-        <w:pStyle w:val="Normal"/>
-        <w:rPr/>
-      </w:pPr>
-      <w:r>
-        <w:rPr>
-          <w:rFonts w:cs="Book Antiqua"/>
-          <w:b w:val="false"/>
-          <w:i w:val="false"/>
-        </w:rPr>
-        <w:t>NZALC delivers a leadership-development approach incorporating Performance = Potential – Interference, Red Head–Blue Head, Prepare–Perform–Recover, mental-skills techniques, psychometrics, experiential activity, feedback and Leadership Development Plans. This material is embedded across Lead Self, Lead Teams, Lead Leaders and Lead Systems.</w:t>
-      </w:r>
-    </w:p>
-    <w:p>
-      <w:pPr>
-        <w:pStyle w:val="Heading2"/>
-        <w:rPr/>
-      </w:pPr>
-      <w:r>
-        <w:rPr>
-          <w:rFonts w:cs="Arial" w:ascii="Arial" w:hAnsi="Arial"/>
-          <w:b/>
-          <w:i w:val="false"/>
-          <w:color w:val="000000"/>
-          <w:sz w:val="22"/>
-        </w:rPr>
-        <w:t>Human Performance Cell Cognitive Conditioning programme (COGCON)</w:t>
-      </w:r>
-    </w:p>
-    <w:p>
-      <w:pPr>
-        <w:pStyle w:val="Normal"/>
-        <w:rPr/>
-      </w:pPr>
-      <w:r>
-        <w:rPr>
-          <w:rFonts w:cs="Book Antiqua"/>
-          <w:b w:val="false"/>
-          <w:i w:val="false"/>
-        </w:rPr>
-        <w:t>COGCON is a developmental cognitive-conditioning product designed to train selected dimensions of performance cognition under physical and cognitive load: arousal regulation, attention, cognitive control, working memory, performance monitoring and self-knowledge. Its most mature and potentially scalable component is an adaptive dual-task training module combining a tablet-based cognitive task with a concurrent job-relevant information task, progressive difficulty and performance feedback.</w:t>
-      </w:r>
-    </w:p>
-    <w:p>
-      <w:pPr>
-        <w:pStyle w:val="Normal"/>
-        <w:rPr/>
-      </w:pPr>
-      <w:r>
-        <w:rPr>
-          <w:rFonts w:cs="Book Antiqua"/>
-          <w:b w:val="false"/>
-          <w:i w:val="false"/>
-        </w:rPr>
-        <w:t>COGCON has demonstrated feasibility, participant acceptability and promising training trends in limited military cohorts. It has not yet been validated as a measure of operational readiness or proven through controlled research to improve real-world military performance. Its current status is therefore that of an emerging, evidence-informed training product rather than an endorsed Army-wide capability system.</w:t>
-      </w:r>
-    </w:p>
-    <w:p>
-      <w:pPr>
-        <w:pStyle w:val="Heading2"/>
-        <w:rPr/>
-      </w:pPr>
-      <w:r>
-        <w:rPr>
-          <w:rFonts w:cs="Arial" w:ascii="Arial" w:hAnsi="Arial"/>
-          <w:b/>
-          <w:i w:val="false"/>
-          <w:color w:val="000000"/>
-          <w:sz w:val="22"/>
-        </w:rPr>
-        <w:t>NZDF Psychology, ILD and other stakeholders</w:t>
-      </w:r>
-    </w:p>
-    <w:p>
-      <w:pPr>
-        <w:pStyle w:val="Normal"/>
-        <w:rPr/>
-      </w:pPr>
-      <w:r>
-        <w:rPr>
-          <w:rFonts w:cs="Book Antiqua"/>
-          <w:b w:val="false"/>
-          <w:i w:val="false"/>
-        </w:rPr>
-        <w:t>These organisations hold additional professional expertise, learning products, delivery capability and assurance functions that will be confirmed during Phase 1 mapping.</w:t>
-      </w:r>
-    </w:p>
-    <w:p>
-      <w:pPr>
-        <w:pStyle w:val="Normal"/>
-        <w:rPr/>
-      </w:pPr>
-      <w:r>
-        <w:rPr>
-          <w:rFonts w:cs="Book Antiqua"/>
-          <w:b w:val="false"/>
-          <w:i w:val="false"/>
-        </w:rPr>
-        <w:t>Initial review indicates considerable conceptual alignment across existing products. The Army Combat Mindset Framework will establish a common doctrinal language beneath which individual products and methods can be appropriately nested. It will not require all products to use identical internal methodologies, provided they align to the endorsed framework, outcomes and assurance requirements.</w:t>
-      </w:r>
-    </w:p>
-    <w:p>
-      <w:pPr>
-        <w:pStyle w:val="Normal"/>
-        <w:pBdr>
-          <w:bottom w:val="single" w:sz="6" w:space="1" w:color="A89662"/>
-        </w:pBdr>
-        <w:spacing w:before="200" w:after="200"/>
-        <w:rPr/>
-      </w:pPr>
-      <w:r>
-        <w:rPr/>
-      </w:r>
-    </w:p>
-    <w:p>
-      <w:pPr>
-        <w:pStyle w:val="Heading1"/>
-        <w:pBdr>
-          <w:left w:val="single" w:sz="24" w:space="8" w:color="C62026"/>
-        </w:pBdr>
-        <w:rPr/>
-      </w:pPr>
-      <w:r>
-        <w:rPr>
-          <w:rFonts w:cs="Arial" w:ascii="Arial" w:hAnsi="Arial"/>
-          <w:b/>
-          <w:i w:val="false"/>
-          <w:color w:val="002516"/>
-          <w:sz w:val="28"/>
-        </w:rPr>
-        <w:t>4. COGCON minimum viable product</w:t>
-      </w:r>
-    </w:p>
-    <w:p>
-      <w:pPr>
-        <w:pStyle w:val="Normal"/>
-        <w:rPr/>
-      </w:pPr>
-      <w:r>
-        <w:rPr>
-          <w:rFonts w:cs="Book Antiqua"/>
-          <w:b w:val="false"/>
-          <w:i w:val="false"/>
-        </w:rPr>
-        <w:t>For the purposes of the Combat Mindset programme of work, COGCON will initially be treated as a minimum viable product within the performance-cognition strand of the broader framework.</w:t>
-      </w:r>
-    </w:p>
-    <w:p>
-      <w:pPr>
-        <w:pStyle w:val="Normal"/>
-        <w:rPr/>
-      </w:pPr>
-      <w:r>
-        <w:rPr>
-          <w:rFonts w:cs="Book Antiqua"/>
-          <w:b w:val="false"/>
-          <w:i w:val="false"/>
-        </w:rPr>
-        <w:t>The COGCON MVP comprises:</w:t>
+        <w:t>Conflates the combat-specific outcome with the broader human-performance capability, reducing applicability outside combat.</w:t>
       </w:r>
     </w:p>
     <w:p>
@@ -1031,7 +921,7 @@
           <w:b w:val="false"/>
           <w:i w:val="false"/>
         </w:rPr>
-        <w:t>a short adaptive dual-task activity embedded within existing physical or military training;</w:t>
+        <w:t>Makes it difficult to distinguish doctrine, capability, framework and product.</w:t>
       </w:r>
     </w:p>
     <w:p>
@@ -1067,7 +957,245 @@
           <w:b w:val="false"/>
           <w:i w:val="false"/>
         </w:rPr>
-        <w:t>a tablet-delivered attention and inhibition task;</w:t>
+        <w:t>Increases the risk that Combat Mindset is interpreted as motivation or aggression alone.</w:t>
+      </w:r>
+    </w:p>
+    <w:p>
+      <w:pPr>
+        <w:pStyle w:val="Normal"/>
+        <w:rPr/>
+      </w:pPr>
+      <w:r>
+        <w:rPr>
+          <w:rFonts w:cs="Book Antiqua"/>
+          <w:b w:val="false"/>
+          <w:i w:val="false"/>
+        </w:rPr>
+        <w:t>Both options deliver the end state described in the COMDT ACS guidance. NZALC and HPC jointly recommend Option 1, and will implement whichever option COMDT ACS selects.</w:t>
+      </w:r>
+    </w:p>
+    <w:p>
+      <w:pPr>
+        <w:pStyle w:val="Normal"/>
+        <w:pBdr>
+          <w:bottom w:val="single" w:sz="6" w:space="1" w:color="A89662"/>
+        </w:pBdr>
+        <w:spacing w:before="200" w:after="200"/>
+        <w:rPr/>
+      </w:pPr>
+      <w:r>
+        <w:rPr/>
+      </w:r>
+    </w:p>
+    <w:p>
+      <w:pPr>
+        <w:pStyle w:val="Heading1"/>
+        <w:pBdr>
+          <w:left w:val="single" w:sz="24" w:space="8" w:color="C62026"/>
+        </w:pBdr>
+        <w:rPr/>
+      </w:pPr>
+      <w:r>
+        <w:rPr>
+          <w:rFonts w:cs="Arial" w:ascii="Arial" w:hAnsi="Arial"/>
+          <w:b/>
+          <w:i w:val="false"/>
+          <w:color w:val="002516"/>
+          <w:sz w:val="28"/>
+        </w:rPr>
+        <w:t>3. What already exists</w:t>
+      </w:r>
+    </w:p>
+    <w:p>
+      <w:pPr>
+        <w:pStyle w:val="Normal"/>
+        <w:rPr/>
+      </w:pPr>
+      <w:r>
+        <w:rPr>
+          <w:rFonts w:cs="Book Antiqua"/>
+          <w:b w:val="false"/>
+          <w:i w:val="false"/>
+        </w:rPr>
+        <w:t>A full capability and product map will be completed during Phase 1. The products described below contribute to the development of Performance Under Pressure and, where applied in a warfighting context, to Combat Mindset. They do not constitute the doctrinal definitions or the complete framework in isolation. Initial holdings include the following.</w:t>
+      </w:r>
+    </w:p>
+    <w:p>
+      <w:pPr>
+        <w:pStyle w:val="Heading2"/>
+        <w:rPr/>
+      </w:pPr>
+      <w:r>
+        <w:rPr>
+          <w:rFonts w:cs="Arial" w:ascii="Arial" w:hAnsi="Arial"/>
+          <w:b/>
+          <w:i w:val="false"/>
+          <w:color w:val="000000"/>
+          <w:sz w:val="22"/>
+        </w:rPr>
+        <w:t>NZALC Performance Under Pressure package</w:t>
+      </w:r>
+    </w:p>
+    <w:p>
+      <w:pPr>
+        <w:pStyle w:val="Normal"/>
+        <w:rPr/>
+      </w:pPr>
+      <w:r>
+        <w:rPr>
+          <w:rFonts w:cs="Book Antiqua"/>
+          <w:b w:val="false"/>
+          <w:i w:val="false"/>
+        </w:rPr>
+        <w:t>NZALC delivers a leadership-development approach incorporating Performance = Potential – Interference, Red Head–Blue Head, Prepare–Perform–Recover, mental-skills techniques, psychometrics, experiential activity, feedback and Leadership Development Plans. This material is embedded across Lead Self, Lead Teams, Lead Leaders and Lead Systems.</w:t>
+      </w:r>
+    </w:p>
+    <w:p>
+      <w:pPr>
+        <w:pStyle w:val="Heading2"/>
+        <w:rPr/>
+      </w:pPr>
+      <w:r>
+        <w:rPr>
+          <w:rFonts w:cs="Arial" w:ascii="Arial" w:hAnsi="Arial"/>
+          <w:b/>
+          <w:i w:val="false"/>
+          <w:color w:val="000000"/>
+          <w:sz w:val="22"/>
+        </w:rPr>
+        <w:t>Human Performance Cell Cognitive Conditioning programme (COGCON)</w:t>
+      </w:r>
+    </w:p>
+    <w:p>
+      <w:pPr>
+        <w:pStyle w:val="Normal"/>
+        <w:rPr/>
+      </w:pPr>
+      <w:r>
+        <w:rPr>
+          <w:rFonts w:cs="Book Antiqua"/>
+          <w:b w:val="false"/>
+          <w:i w:val="false"/>
+        </w:rPr>
+        <w:t>COGCON is a developmental cognitive-conditioning product designed to train selected dimensions of performance cognition under physical and cognitive load: arousal regulation, attention, cognitive control, working memory, performance monitoring and self-knowledge. Its most mature and potentially scalable component is an adaptive dual-task training module combining a tablet-based cognitive task with a concurrent job-relevant information task, progressive difficulty and performance feedback.</w:t>
+      </w:r>
+    </w:p>
+    <w:p>
+      <w:pPr>
+        <w:pStyle w:val="Normal"/>
+        <w:rPr/>
+      </w:pPr>
+      <w:r>
+        <w:rPr>
+          <w:rFonts w:cs="Book Antiqua"/>
+          <w:b w:val="false"/>
+          <w:i w:val="false"/>
+        </w:rPr>
+        <w:t>COGCON has demonstrated feasibility, participant acceptability and promising training trends in limited military cohorts. It has not yet been validated as a measure of operational readiness or proven through controlled research to improve real-world military performance. Its current status is therefore that of an emerging, evidence-informed training product rather than an endorsed Army-wide capability system.</w:t>
+      </w:r>
+    </w:p>
+    <w:p>
+      <w:pPr>
+        <w:pStyle w:val="Heading2"/>
+        <w:rPr/>
+      </w:pPr>
+      <w:r>
+        <w:rPr>
+          <w:rFonts w:cs="Arial" w:ascii="Arial" w:hAnsi="Arial"/>
+          <w:b/>
+          <w:i w:val="false"/>
+          <w:color w:val="000000"/>
+          <w:sz w:val="22"/>
+        </w:rPr>
+        <w:t>NZDF Psychology, ILD and other stakeholders</w:t>
+      </w:r>
+    </w:p>
+    <w:p>
+      <w:pPr>
+        <w:pStyle w:val="Normal"/>
+        <w:rPr/>
+      </w:pPr>
+      <w:r>
+        <w:rPr>
+          <w:rFonts w:cs="Book Antiqua"/>
+          <w:b w:val="false"/>
+          <w:i w:val="false"/>
+        </w:rPr>
+        <w:t>These organisations hold additional professional expertise, learning products, delivery capability and assurance functions that will be confirmed during Phase 1 mapping.</w:t>
+      </w:r>
+    </w:p>
+    <w:p>
+      <w:pPr>
+        <w:pStyle w:val="Normal"/>
+        <w:rPr/>
+      </w:pPr>
+      <w:r>
+        <w:rPr>
+          <w:rFonts w:cs="Book Antiqua"/>
+          <w:b w:val="false"/>
+          <w:i w:val="false"/>
+        </w:rPr>
+        <w:t>Initial review indicates considerable conceptual alignment across existing products. The Army Combat Mindset Framework will establish a common doctrinal language beneath which individual products and methods can be appropriately nested. It will not require all products to use identical internal methodologies, provided they align to the endorsed framework, outcomes and assurance requirements.</w:t>
+      </w:r>
+    </w:p>
+    <w:p>
+      <w:pPr>
+        <w:pStyle w:val="Normal"/>
+        <w:pBdr>
+          <w:bottom w:val="single" w:sz="6" w:space="1" w:color="A89662"/>
+        </w:pBdr>
+        <w:spacing w:before="200" w:after="200"/>
+        <w:rPr/>
+      </w:pPr>
+      <w:r>
+        <w:rPr/>
+      </w:r>
+    </w:p>
+    <w:p>
+      <w:pPr>
+        <w:pStyle w:val="Heading1"/>
+        <w:pBdr>
+          <w:left w:val="single" w:sz="24" w:space="8" w:color="C62026"/>
+        </w:pBdr>
+        <w:rPr/>
+      </w:pPr>
+      <w:r>
+        <w:rPr>
+          <w:rFonts w:cs="Arial" w:ascii="Arial" w:hAnsi="Arial"/>
+          <w:b/>
+          <w:i w:val="false"/>
+          <w:color w:val="002516"/>
+          <w:sz w:val="28"/>
+        </w:rPr>
+        <w:t>4. COGCON minimum viable product</w:t>
+      </w:r>
+    </w:p>
+    <w:p>
+      <w:pPr>
+        <w:pStyle w:val="Normal"/>
+        <w:rPr/>
+      </w:pPr>
+      <w:r>
+        <w:rPr>
+          <w:rFonts w:cs="Book Antiqua"/>
+          <w:b w:val="false"/>
+          <w:i w:val="false"/>
+        </w:rPr>
+        <w:t>For the purposes of the Combat Mindset programme of work, COGCON will initially be treated as a developmental minimum viable product within the performance-cognition strand of the Army Combat Mindset Framework, contributing to selected elements of Performance Under Pressure.</w:t>
+      </w:r>
+    </w:p>
+    <w:p>
+      <w:pPr>
+        <w:pStyle w:val="Normal"/>
+        <w:rPr/>
+      </w:pPr>
+      <w:r>
+        <w:rPr>
+          <w:rFonts w:cs="Book Antiqua"/>
+          <w:b w:val="false"/>
+          <w:i w:val="false"/>
+        </w:rPr>
+        <w:t>The COGCON MVP comprises:</w:t>
       </w:r>
     </w:p>
     <w:p>
@@ -1103,7 +1231,7 @@
           <w:b w:val="false"/>
           <w:i w:val="false"/>
         </w:rPr>
-        <w:t>a concurrent prerecorded operational information task, such as an audio brief;</w:t>
+        <w:t>a short adaptive dual-task activity embedded within existing physical or military training;</w:t>
       </w:r>
     </w:p>
     <w:p>
@@ -1139,7 +1267,7 @@
           <w:b w:val="false"/>
           <w:i w:val="false"/>
         </w:rPr>
-        <w:t>immediate recall questions or objective job-task scoring;</w:t>
+        <w:t>a tablet-delivered attention and inhibition task;</w:t>
       </w:r>
     </w:p>
     <w:p>
@@ -1175,7 +1303,7 @@
           <w:b w:val="false"/>
           <w:i w:val="false"/>
         </w:rPr>
-        <w:t>controlled difficulty levels and defined progression criteria;</w:t>
+        <w:t>a concurrent prerecorded operational information task, such as an audio brief;</w:t>
       </w:r>
     </w:p>
     <w:p>
@@ -1211,7 +1339,7 @@
           <w:b w:val="false"/>
           <w:i w:val="false"/>
         </w:rPr>
-        <w:t>selected arousal-regulation techniques;</w:t>
+        <w:t>immediate recall questions or objective job-task scoring;</w:t>
       </w:r>
     </w:p>
     <w:p>
@@ -1247,7 +1375,7 @@
           <w:b w:val="false"/>
           <w:i w:val="false"/>
         </w:rPr>
-        <w:t>basic performance feedback and longitudinal training records; and</w:t>
+        <w:t>controlled difficulty levels and defined progression criteria;</w:t>
       </w:r>
     </w:p>
     <w:p>
@@ -1283,21 +1411,7 @@
           <w:b w:val="false"/>
           <w:i w:val="false"/>
         </w:rPr>
-        <w:t>a train-the-trainer and assurance package allowing delivery by existing training staff.</w:t>
-      </w:r>
-    </w:p>
-    <w:p>
-      <w:pPr>
-        <w:pStyle w:val="Normal"/>
-        <w:rPr/>
-      </w:pPr>
-      <w:r>
-        <w:rPr>
-          <w:rFonts w:cs="Book Antiqua"/>
-          <w:b w:val="false"/>
-          <w:i w:val="false"/>
-        </w:rPr>
-        <w:t>The MVP does not constitute:</w:t>
+        <w:t>selected arousal-regulation techniques;</w:t>
       </w:r>
     </w:p>
     <w:p>
@@ -1333,7 +1447,7 @@
           <w:b w:val="false"/>
           <w:i w:val="false"/>
         </w:rPr>
-        <w:t>a standalone Army course;</w:t>
+        <w:t>basic performance feedback and longitudinal training records; and</w:t>
       </w:r>
     </w:p>
     <w:p>
@@ -1369,7 +1483,21 @@
           <w:b w:val="false"/>
           <w:i w:val="false"/>
         </w:rPr>
-        <w:t>a complete Combat Mindset or Performance Under Pressure programme;</w:t>
+        <w:t>a train-the-trainer and assurance package allowing delivery by existing training staff.</w:t>
+      </w:r>
+    </w:p>
+    <w:p>
+      <w:pPr>
+        <w:pStyle w:val="Normal"/>
+        <w:rPr/>
+      </w:pPr>
+      <w:r>
+        <w:rPr>
+          <w:rFonts w:cs="Book Antiqua"/>
+          <w:b w:val="false"/>
+          <w:i w:val="false"/>
+        </w:rPr>
+        <w:t>The MVP does not constitute:</w:t>
       </w:r>
     </w:p>
     <w:p>
@@ -1405,7 +1533,7 @@
           <w:b w:val="false"/>
           <w:i w:val="false"/>
         </w:rPr>
-        <w:t>a selection, promotion or diagnostic tool;</w:t>
+        <w:t>a standalone Army course;</w:t>
       </w:r>
     </w:p>
     <w:p>
@@ -1441,7 +1569,7 @@
           <w:b w:val="false"/>
           <w:i w:val="false"/>
         </w:rPr>
-        <w:t>a validated measure of operational readiness; or</w:t>
+        <w:t>a complete Combat Mindset or Performance Under Pressure programme;</w:t>
       </w:r>
     </w:p>
     <w:p>
@@ -1477,113 +1605,7 @@
           <w:b w:val="false"/>
           <w:i w:val="false"/>
         </w:rPr>
-        <w:t>a commitment for HPC personnel to deliver the product across Army.</w:t>
-      </w:r>
-    </w:p>
-    <w:p>
-      <w:pPr>
-        <w:pStyle w:val="Normal"/>
-        <w:rPr/>
-      </w:pPr>
-      <w:r>
-        <w:rPr>
-          <w:rFonts w:cs="Book Antiqua"/>
-          <w:b w:val="false"/>
-          <w:i w:val="false"/>
-        </w:rPr>
-        <w:t>HPC will retain technical stewardship of the COGCON method and provide specialist advice, product development, train-the-trainer support and proportionate assurance within available capacity. Routine delivery, if subsequently approved, will be undertaken through existing training establishments, instructors and physical-training staff.</w:t>
-      </w:r>
-    </w:p>
-    <w:p>
-      <w:pPr>
-        <w:pStyle w:val="Normal"/>
-        <w:pBdr>
-          <w:bottom w:val="single" w:sz="6" w:space="1" w:color="A89662"/>
-        </w:pBdr>
-        <w:spacing w:before="200" w:after="200"/>
-        <w:rPr/>
-      </w:pPr>
-      <w:r>
-        <w:rPr/>
-      </w:r>
-    </w:p>
-    <w:p>
-      <w:pPr>
-        <w:pStyle w:val="Heading1"/>
-        <w:pBdr>
-          <w:left w:val="single" w:sz="24" w:space="8" w:color="C62026"/>
-        </w:pBdr>
-        <w:rPr/>
-      </w:pPr>
-      <w:r>
-        <w:rPr>
-          <w:rFonts w:cs="Arial" w:ascii="Arial" w:hAnsi="Arial"/>
-          <w:b/>
-          <w:i w:val="false"/>
-          <w:color w:val="002516"/>
-          <w:sz w:val="28"/>
-        </w:rPr>
-        <w:t>5. Proposed programme of work</w:t>
-      </w:r>
-    </w:p>
-    <w:p>
-      <w:pPr>
-        <w:pStyle w:val="Heading2"/>
-        <w:rPr/>
-      </w:pPr>
-      <w:r>
-        <w:rPr>
-          <w:rFonts w:cs="Arial" w:ascii="Arial" w:hAnsi="Arial"/>
-          <w:b/>
-          <w:i w:val="false"/>
-          <w:color w:val="000000"/>
-          <w:sz w:val="22"/>
-        </w:rPr>
-        <w:t>Phase 0 — Governance and definition (by end July 2026)</w:t>
-      </w:r>
-    </w:p>
-    <w:p>
-      <w:pPr>
-        <w:pStyle w:val="Normal"/>
-        <w:rPr/>
-      </w:pPr>
-      <w:r>
-        <w:rPr>
-          <w:rFonts w:cs="Book Antiqua"/>
-          <w:b w:val="false"/>
-          <w:i w:val="false"/>
-        </w:rPr>
-        <w:t>Confirm interim sponsorship and capability-integration arrangements, endorse the problem statement, select the terminology option at paragraph 2, and draft the Army-endorsed definitions of Combat Mindset and Performance Under Pressure for staffing.</w:t>
-      </w:r>
-    </w:p>
-    <w:p>
-      <w:pPr>
-        <w:pStyle w:val="Heading2"/>
-        <w:rPr/>
-      </w:pPr>
-      <w:r>
-        <w:rPr>
-          <w:rFonts w:cs="Arial" w:ascii="Arial" w:hAnsi="Arial"/>
-          <w:b/>
-          <w:i w:val="false"/>
-          <w:color w:val="000000"/>
-          <w:sz w:val="22"/>
-        </w:rPr>
-        <w:t>Phase 1 — Capability and product mapping (August 2026)</w:t>
-      </w:r>
-    </w:p>
-    <w:p>
-      <w:pPr>
-        <w:pStyle w:val="Normal"/>
-        <w:rPr/>
-      </w:pPr>
-      <w:r>
-        <w:rPr>
-          <w:rFonts w:cs="Book Antiqua"/>
-          <w:b w:val="false"/>
-          <w:i w:val="false"/>
-        </w:rPr>
-        <w:t>Map existing doctrine, content, products, courses, instructor capability, delivery activity, evidence, ownership and assurance arrangements across ACS, NZALC, HPC, NZDF Psychology, ILD, training establishments and selected force employers. The mapping will distinguish:</w:t>
+        <w:t>a selection, promotion or diagnostic tool;</w:t>
       </w:r>
     </w:p>
     <w:p>
@@ -1619,7 +1641,7 @@
           <w:b w:val="false"/>
           <w:i w:val="false"/>
         </w:rPr>
-        <w:t>doctrinal and policy holdings;</w:t>
+        <w:t>a validated measure of operational readiness; or</w:t>
       </w:r>
     </w:p>
     <w:p>
@@ -1655,7 +1677,113 @@
           <w:b w:val="false"/>
           <w:i w:val="false"/>
         </w:rPr>
-        <w:t>capability outcomes;</w:t>
+        <w:t>a commitment for HPC personnel to deliver the product across Army.</w:t>
+      </w:r>
+    </w:p>
+    <w:p>
+      <w:pPr>
+        <w:pStyle w:val="Normal"/>
+        <w:rPr/>
+      </w:pPr>
+      <w:r>
+        <w:rPr>
+          <w:rFonts w:cs="Book Antiqua"/>
+          <w:b w:val="false"/>
+          <w:i w:val="false"/>
+        </w:rPr>
+        <w:t>HPC will retain technical stewardship of the COGCON method and provide specialist advice, product development, train-the-trainer support and proportionate assurance within available capacity. Routine delivery, if subsequently approved, will be undertaken through existing training establishments, instructors and physical-training staff.</w:t>
+      </w:r>
+    </w:p>
+    <w:p>
+      <w:pPr>
+        <w:pStyle w:val="Normal"/>
+        <w:pBdr>
+          <w:bottom w:val="single" w:sz="6" w:space="1" w:color="A89662"/>
+        </w:pBdr>
+        <w:spacing w:before="200" w:after="200"/>
+        <w:rPr/>
+      </w:pPr>
+      <w:r>
+        <w:rPr/>
+      </w:r>
+    </w:p>
+    <w:p>
+      <w:pPr>
+        <w:pStyle w:val="Heading1"/>
+        <w:pBdr>
+          <w:left w:val="single" w:sz="24" w:space="8" w:color="C62026"/>
+        </w:pBdr>
+        <w:rPr/>
+      </w:pPr>
+      <w:r>
+        <w:rPr>
+          <w:rFonts w:cs="Arial" w:ascii="Arial" w:hAnsi="Arial"/>
+          <w:b/>
+          <w:i w:val="false"/>
+          <w:color w:val="002516"/>
+          <w:sz w:val="28"/>
+        </w:rPr>
+        <w:t>5. Proposed programme of work</w:t>
+      </w:r>
+    </w:p>
+    <w:p>
+      <w:pPr>
+        <w:pStyle w:val="Heading2"/>
+        <w:rPr/>
+      </w:pPr>
+      <w:r>
+        <w:rPr>
+          <w:rFonts w:cs="Arial" w:ascii="Arial" w:hAnsi="Arial"/>
+          <w:b/>
+          <w:i w:val="false"/>
+          <w:color w:val="000000"/>
+          <w:sz w:val="22"/>
+        </w:rPr>
+        <w:t>Phase 0 — Governance and definition (by end July 2026)</w:t>
+      </w:r>
+    </w:p>
+    <w:p>
+      <w:pPr>
+        <w:pStyle w:val="Normal"/>
+        <w:rPr/>
+      </w:pPr>
+      <w:r>
+        <w:rPr>
+          <w:rFonts w:cs="Book Antiqua"/>
+          <w:b w:val="false"/>
+          <w:i w:val="false"/>
+        </w:rPr>
+        <w:t>Confirm interim sponsorship and capability-integration arrangements, endorse the problem statement, select the terminology option at paragraph 2, and draft for staffing the Army-endorsed definitions of Combat Mindset, Performance Under Pressure and the Army Combat Mindset Framework, together with the agreed relationship between the three.</w:t>
+      </w:r>
+    </w:p>
+    <w:p>
+      <w:pPr>
+        <w:pStyle w:val="Heading2"/>
+        <w:rPr/>
+      </w:pPr>
+      <w:r>
+        <w:rPr>
+          <w:rFonts w:cs="Arial" w:ascii="Arial" w:hAnsi="Arial"/>
+          <w:b/>
+          <w:i w:val="false"/>
+          <w:color w:val="000000"/>
+          <w:sz w:val="22"/>
+        </w:rPr>
+        <w:t>Phase 1 — Capability and product mapping (August 2026)</w:t>
+      </w:r>
+    </w:p>
+    <w:p>
+      <w:pPr>
+        <w:pStyle w:val="Normal"/>
+        <w:rPr/>
+      </w:pPr>
+      <w:r>
+        <w:rPr>
+          <w:rFonts w:cs="Book Antiqua"/>
+          <w:b w:val="false"/>
+          <w:i w:val="false"/>
+        </w:rPr>
+        <w:t>Map existing doctrine, content, products, courses, instructor capability, delivery activity, evidence, ownership and assurance arrangements across ACS, NZALC, HPC, NZDF Psychology, ILD, training establishments and selected force employers. The mapping will distinguish:</w:t>
       </w:r>
     </w:p>
     <w:p>
@@ -1691,7 +1819,7 @@
           <w:b w:val="false"/>
           <w:i w:val="false"/>
         </w:rPr>
-        <w:t>training products and methods;</w:t>
+        <w:t>doctrinal and policy holdings;</w:t>
       </w:r>
     </w:p>
     <w:p>
@@ -1727,7 +1855,7 @@
           <w:b w:val="false"/>
           <w:i w:val="false"/>
         </w:rPr>
-        <w:t>delivery organisations;</w:t>
+        <w:t>capability outcomes;</w:t>
       </w:r>
     </w:p>
     <w:p>
@@ -1763,7 +1891,7 @@
           <w:b w:val="false"/>
           <w:i w:val="false"/>
         </w:rPr>
-        <w:t>technical and professional authorities;</w:t>
+        <w:t>training products and methods;</w:t>
       </w:r>
     </w:p>
     <w:p>
@@ -1799,7 +1927,7 @@
           <w:b w:val="false"/>
           <w:i w:val="false"/>
         </w:rPr>
-        <w:t>evidence maturity;</w:t>
+        <w:t>delivery organisations;</w:t>
       </w:r>
     </w:p>
     <w:p>
@@ -1835,7 +1963,7 @@
           <w:b w:val="false"/>
           <w:i w:val="false"/>
         </w:rPr>
-        <w:t>scalability and resource requirements; and</w:t>
+        <w:t>technical and professional authorities;</w:t>
       </w:r>
     </w:p>
     <w:p>
@@ -1871,125 +1999,7 @@
           <w:b w:val="false"/>
           <w:i w:val="false"/>
         </w:rPr>
-        <w:t>gaps, duplication and integration opportunities.</w:t>
-      </w:r>
-    </w:p>
-    <w:p>
-      <w:pPr>
-        <w:pStyle w:val="Normal"/>
-        <w:rPr/>
-      </w:pPr>
-      <w:r>
-        <w:rPr>
-          <w:rFonts w:cs="Book Antiqua"/>
-          <w:b w:val="false"/>
-          <w:i w:val="false"/>
-        </w:rPr>
-        <w:t>COGCON will be assessed as one developmental product within this map, with particular attention to its MVP boundary, evidence base, ownership, workforce requirements and scalability.</w:t>
-      </w:r>
-    </w:p>
-    <w:p>
-      <w:pPr>
-        <w:pStyle w:val="Heading2"/>
-        <w:rPr/>
-      </w:pPr>
-      <w:r>
-        <w:rPr>
-          <w:rFonts w:cs="Arial" w:ascii="Arial" w:hAnsi="Arial"/>
-          <w:b/>
-          <w:i w:val="false"/>
-          <w:color w:val="000000"/>
-          <w:sz w:val="22"/>
-        </w:rPr>
-        <w:t>Phase 2 — Framework and product architecture (September 2026)</w:t>
-      </w:r>
-    </w:p>
-    <w:p>
-      <w:pPr>
-        <w:pStyle w:val="Normal"/>
-        <w:rPr/>
-      </w:pPr>
-      <w:r>
-        <w:rPr>
-          <w:rFonts w:cs="Book Antiqua"/>
-          <w:b w:val="false"/>
-          <w:i w:val="false"/>
-        </w:rPr>
-        <w:t>Draft the Army Combat Mindset Framework, including the endorsed definition and desired operational effect; the integrated capability strands; developmental outcomes from Lead Self through Lead Systems; the relationship between doctrine, framework, products and delivery; common assurance principles; and the criteria by which existing and future products may be recognised as contributing to the framework.</w:t>
-      </w:r>
-    </w:p>
-    <w:p>
-      <w:pPr>
-        <w:pStyle w:val="Normal"/>
-        <w:rPr/>
-      </w:pPr>
-      <w:r>
-        <w:rPr>
-          <w:rFonts w:cs="Book Antiqua"/>
-          <w:b w:val="false"/>
-          <w:i w:val="false"/>
-        </w:rPr>
-        <w:t>Existing products, including the NZALC Performance Under Pressure package and the COGCON MVP, will be mapped beneath the relevant capability strands rather than treated as the framework itself.</w:t>
-      </w:r>
-    </w:p>
-    <w:p>
-      <w:pPr>
-        <w:pStyle w:val="Heading2"/>
-        <w:rPr/>
-      </w:pPr>
-      <w:r>
-        <w:rPr>
-          <w:rFonts w:cs="Arial" w:ascii="Arial" w:hAnsi="Arial"/>
-          <w:b/>
-          <w:i w:val="false"/>
-          <w:color w:val="000000"/>
-          <w:sz w:val="22"/>
-        </w:rPr>
-        <w:t>Phase 3 — Stakeholder forum (September 2026)</w:t>
-      </w:r>
-    </w:p>
-    <w:p>
-      <w:pPr>
-        <w:pStyle w:val="Normal"/>
-        <w:rPr/>
-      </w:pPr>
-      <w:r>
-        <w:rPr>
-          <w:rFonts w:cs="Book Antiqua"/>
-          <w:b w:val="false"/>
-          <w:i w:val="false"/>
-        </w:rPr>
-        <w:t>Convene ACS, NZALC, HPC, NZDF Psychology, ILD, selected training providers and force employers to refine the framework, product architecture, governance model and implementation priorities.</w:t>
-      </w:r>
-    </w:p>
-    <w:p>
-      <w:pPr>
-        <w:pStyle w:val="Heading2"/>
-        <w:rPr/>
-      </w:pPr>
-      <w:r>
-        <w:rPr>
-          <w:rFonts w:cs="Arial" w:ascii="Arial" w:hAnsi="Arial"/>
-          <w:b/>
-          <w:i w:val="false"/>
-          <w:color w:val="000000"/>
-          <w:sz w:val="22"/>
-        </w:rPr>
-        <w:t>Phase 4 — Limited MVP integration trial (October 2026, subject to capacity)</w:t>
-      </w:r>
-    </w:p>
-    <w:p>
-      <w:pPr>
-        <w:pStyle w:val="Normal"/>
-        <w:rPr/>
-      </w:pPr>
-      <w:r>
-        <w:rPr>
-          <w:rFonts w:cs="Book Antiqua"/>
-          <w:b w:val="false"/>
-          <w:i w:val="false"/>
-        </w:rPr>
-        <w:t>Conduct a controlled trial of the draft framework and the COGCON MVP within one existing ACS or NZALC training activity. The trial will:</w:t>
+        <w:t>evidence maturity;</w:t>
       </w:r>
     </w:p>
     <w:p>
@@ -2025,7 +2035,7 @@
           <w:b w:val="false"/>
           <w:i w:val="false"/>
         </w:rPr>
-        <w:t>use existing delivery staff and training infrastructure;</w:t>
+        <w:t>scalability and resource requirements; and</w:t>
       </w:r>
     </w:p>
     <w:p>
@@ -2061,7 +2071,125 @@
           <w:b w:val="false"/>
           <w:i w:val="false"/>
         </w:rPr>
-        <w:t>incorporate one bounded COGCON adaptive dual-task activity;</w:t>
+        <w:t>gaps, duplication and integration opportunities.</w:t>
+      </w:r>
+    </w:p>
+    <w:p>
+      <w:pPr>
+        <w:pStyle w:val="Normal"/>
+        <w:rPr/>
+      </w:pPr>
+      <w:r>
+        <w:rPr>
+          <w:rFonts w:cs="Book Antiqua"/>
+          <w:b w:val="false"/>
+          <w:i w:val="false"/>
+        </w:rPr>
+        <w:t>The mapping will identify which products contribute to the broader Performance Under Pressure capability and which support its combat-specific expression. COGCON will be assessed as one developmental product within this map, with particular attention to its MVP boundary, evidence base, ownership, workforce requirements and scalability.</w:t>
+      </w:r>
+    </w:p>
+    <w:p>
+      <w:pPr>
+        <w:pStyle w:val="Heading2"/>
+        <w:rPr/>
+      </w:pPr>
+      <w:r>
+        <w:rPr>
+          <w:rFonts w:cs="Arial" w:ascii="Arial" w:hAnsi="Arial"/>
+          <w:b/>
+          <w:i w:val="false"/>
+          <w:color w:val="000000"/>
+          <w:sz w:val="22"/>
+        </w:rPr>
+        <w:t>Phase 2 — Framework and product architecture (September 2026)</w:t>
+      </w:r>
+    </w:p>
+    <w:p>
+      <w:pPr>
+        <w:pStyle w:val="Normal"/>
+        <w:rPr/>
+      </w:pPr>
+      <w:r>
+        <w:rPr>
+          <w:rFonts w:cs="Book Antiqua"/>
+          <w:b w:val="false"/>
+          <w:i w:val="false"/>
+        </w:rPr>
+        <w:t>Draft the Army Combat Mindset Framework as the organising model through which Army will define, develop, integrate and assure Performance Under Pressure and its combat-specific expression. The framework will include the endorsed definitions and desired operational effect; the integrated capability strands; developmental outcomes from Lead Self through Lead Systems; the relationship between doctrine, framework, products and delivery; common assurance principles; and the criteria by which existing and future products may be recognised as contributing to the framework.</w:t>
+      </w:r>
+    </w:p>
+    <w:p>
+      <w:pPr>
+        <w:pStyle w:val="Normal"/>
+        <w:rPr/>
+      </w:pPr>
+      <w:r>
+        <w:rPr>
+          <w:rFonts w:cs="Book Antiqua"/>
+          <w:b w:val="false"/>
+          <w:i w:val="false"/>
+        </w:rPr>
+        <w:t>Existing products, including the NZALC Performance Under Pressure package and the COGCON MVP, will be mapped beneath the relevant capability strands rather than treated as the framework itself.</w:t>
+      </w:r>
+    </w:p>
+    <w:p>
+      <w:pPr>
+        <w:pStyle w:val="Heading2"/>
+        <w:rPr/>
+      </w:pPr>
+      <w:r>
+        <w:rPr>
+          <w:rFonts w:cs="Arial" w:ascii="Arial" w:hAnsi="Arial"/>
+          <w:b/>
+          <w:i w:val="false"/>
+          <w:color w:val="000000"/>
+          <w:sz w:val="22"/>
+        </w:rPr>
+        <w:t>Phase 3 — Stakeholder forum (September 2026)</w:t>
+      </w:r>
+    </w:p>
+    <w:p>
+      <w:pPr>
+        <w:pStyle w:val="Normal"/>
+        <w:rPr/>
+      </w:pPr>
+      <w:r>
+        <w:rPr>
+          <w:rFonts w:cs="Book Antiqua"/>
+          <w:b w:val="false"/>
+          <w:i w:val="false"/>
+        </w:rPr>
+        <w:t>Convene ACS, NZALC, HPC, NZDF Psychology, ILD, selected training providers and force employers to refine the framework, product architecture, governance model, implementation priorities, definition clarity and doctrinal coherence.</w:t>
+      </w:r>
+    </w:p>
+    <w:p>
+      <w:pPr>
+        <w:pStyle w:val="Heading2"/>
+        <w:rPr/>
+      </w:pPr>
+      <w:r>
+        <w:rPr>
+          <w:rFonts w:cs="Arial" w:ascii="Arial" w:hAnsi="Arial"/>
+          <w:b/>
+          <w:i w:val="false"/>
+          <w:color w:val="000000"/>
+          <w:sz w:val="22"/>
+        </w:rPr>
+        <w:t>Phase 4 — Limited MVP integration trial (October 2026, subject to capacity)</w:t>
+      </w:r>
+    </w:p>
+    <w:p>
+      <w:pPr>
+        <w:pStyle w:val="Normal"/>
+        <w:rPr/>
+      </w:pPr>
+      <w:r>
+        <w:rPr>
+          <w:rFonts w:cs="Book Antiqua"/>
+          <w:b w:val="false"/>
+          <w:i w:val="false"/>
+        </w:rPr>
+        <w:t>Conduct a controlled trial of the draft framework and the COGCON MVP within one existing ACS or NZALC training activity. The trial will:</w:t>
       </w:r>
     </w:p>
     <w:p>
@@ -2097,7 +2225,7 @@
           <w:b w:val="false"/>
           <w:i w:val="false"/>
         </w:rPr>
-        <w:t>test whether the product nests coherently beneath the draft framework;</w:t>
+        <w:t>use existing delivery staff and training infrastructure;</w:t>
       </w:r>
     </w:p>
     <w:p>
@@ -2133,7 +2261,7 @@
           <w:b w:val="false"/>
           <w:i w:val="false"/>
         </w:rPr>
-        <w:t>assess instructor burden, delivery consistency and participant usability;</w:t>
+        <w:t>incorporate one bounded COGCON adaptive dual-task activity;</w:t>
       </w:r>
     </w:p>
     <w:p>
@@ -2169,7 +2297,7 @@
           <w:b w:val="false"/>
           <w:i w:val="false"/>
         </w:rPr>
-        <w:t>collect proportionate training and implementation evidence;</w:t>
+        <w:t>test whether the product contributes to an identified element of Performance Under Pressure and nests coherently beneath the draft framework;</w:t>
       </w:r>
     </w:p>
     <w:p>
@@ -2205,7 +2333,7 @@
           <w:b w:val="false"/>
           <w:i w:val="false"/>
         </w:rPr>
-        <w:t>avoid readiness certification or high-stakes personnel assessment; and</w:t>
+        <w:t>assess instructor burden, delivery consistency, participant usability and value added to existing training;</w:t>
       </w:r>
     </w:p>
     <w:p>
@@ -2241,97 +2369,7 @@
           <w:b w:val="false"/>
           <w:i w:val="false"/>
         </w:rPr>
-        <w:t>identify the workforce, technology, assurance and funding requirements for any wider implementation.</w:t>
-      </w:r>
-    </w:p>
-    <w:p>
-      <w:pPr>
-        <w:pStyle w:val="Normal"/>
-        <w:rPr/>
-      </w:pPr>
-      <w:r>
-        <w:rPr>
-          <w:rFonts w:cs="Book Antiqua"/>
-          <w:b w:val="false"/>
-          <w:i w:val="false"/>
-        </w:rPr>
-        <w:t>HPC will provide the protocol, specialist advice and limited evaluation support. NZALC or the relevant training provider will lead delivery and structured review. The trial will not create an enduring obligation for HPC to provide routine delivery.</w:t>
-      </w:r>
-    </w:p>
-    <w:p>
-      <w:pPr>
-        <w:pStyle w:val="Heading2"/>
-        <w:rPr/>
-      </w:pPr>
-      <w:r>
-        <w:rPr>
-          <w:rFonts w:cs="Arial" w:ascii="Arial" w:hAnsi="Arial"/>
-          <w:b/>
-          <w:i w:val="false"/>
-          <w:color w:val="000000"/>
-          <w:sz w:val="22"/>
-        </w:rPr>
-        <w:t>Phase 5 — Report back (November 2026)</w:t>
-      </w:r>
-    </w:p>
-    <w:p>
-      <w:pPr>
-        <w:pStyle w:val="Normal"/>
-        <w:rPr/>
-      </w:pPr>
-      <w:r>
-        <w:rPr>
-          <w:rFonts w:cs="Book Antiqua"/>
-          <w:b w:val="false"/>
-          <w:i w:val="false"/>
-        </w:rPr>
-        <w:t>Present Framework v1.0, the validated capability and product map, the results of any limited MVP integration trial, the proposed governance and assurance model, and a prioritised implementation plan. The report will identify whether COGCON should remain a developmental product; undergo further controlled evaluation; be integrated selectively into existing training; be prepared for broader scaling; or cease or change direction.</w:t>
-      </w:r>
-    </w:p>
-    <w:p>
-      <w:pPr>
-        <w:pStyle w:val="Normal"/>
-        <w:pBdr>
-          <w:bottom w:val="single" w:sz="6" w:space="1" w:color="A89662"/>
-        </w:pBdr>
-        <w:spacing w:before="200" w:after="200"/>
-        <w:rPr/>
-      </w:pPr>
-      <w:r>
-        <w:rPr/>
-      </w:r>
-    </w:p>
-    <w:p>
-      <w:pPr>
-        <w:pStyle w:val="Heading1"/>
-        <w:pBdr>
-          <w:left w:val="single" w:sz="24" w:space="8" w:color="C62026"/>
-        </w:pBdr>
-        <w:rPr/>
-      </w:pPr>
-      <w:r>
-        <w:rPr>
-          <w:rFonts w:cs="Arial" w:ascii="Arial" w:hAnsi="Arial"/>
-          <w:b/>
-          <w:i w:val="false"/>
-          <w:color w:val="002516"/>
-          <w:sz w:val="28"/>
-        </w:rPr>
-        <w:t>6. Governance</w:t>
-      </w:r>
-    </w:p>
-    <w:p>
-      <w:pPr>
-        <w:pStyle w:val="Normal"/>
-        <w:rPr/>
-      </w:pPr>
-      <w:r>
-        <w:rPr>
-          <w:rFonts w:cs="Book Antiqua"/>
-          <w:b w:val="false"/>
-          <w:i w:val="false"/>
-        </w:rPr>
-        <w:t>The following arrangements are proposed for confirmation at Phase 0. Technical and professional authority is distributed by domain; no single organisation owns the evidence base for the entire capability.</w:t>
+        <w:t>collect proportionate training and implementation evidence;</w:t>
       </w:r>
     </w:p>
     <w:p>
@@ -2367,7 +2405,7 @@
           <w:b w:val="false"/>
           <w:i w:val="false"/>
         </w:rPr>
-        <w:t>Army Sponsor — strategic owner of the Combat Mindset capability at Army level.</w:t>
+        <w:t>avoid readiness certification or high-stakes personnel assessment; and</w:t>
       </w:r>
     </w:p>
     <w:p>
@@ -2403,7 +2441,97 @@
           <w:b w:val="false"/>
           <w:i w:val="false"/>
         </w:rPr>
-        <w:t>Interim capability integrator — COMDT ACS, coordinating framework development, stakeholder engagement and recommendations to the Army Sponsor.</w:t>
+        <w:t>identify the workforce, technology, assurance and funding requirements for any wider implementation.</w:t>
+      </w:r>
+    </w:p>
+    <w:p>
+      <w:pPr>
+        <w:pStyle w:val="Normal"/>
+        <w:rPr/>
+      </w:pPr>
+      <w:r>
+        <w:rPr>
+          <w:rFonts w:cs="Book Antiqua"/>
+          <w:b w:val="false"/>
+          <w:i w:val="false"/>
+        </w:rPr>
+        <w:t>HPC will provide the protocol, specialist advice and limited evaluation support. NZALC or the relevant training provider will lead delivery and structured review. The trial is not testing whether COGCON represents the totality of Combat Mindset, and it will not create an enduring obligation for HPC to provide routine delivery.</w:t>
+      </w:r>
+    </w:p>
+    <w:p>
+      <w:pPr>
+        <w:pStyle w:val="Heading2"/>
+        <w:rPr/>
+      </w:pPr>
+      <w:r>
+        <w:rPr>
+          <w:rFonts w:cs="Arial" w:ascii="Arial" w:hAnsi="Arial"/>
+          <w:b/>
+          <w:i w:val="false"/>
+          <w:color w:val="000000"/>
+          <w:sz w:val="22"/>
+        </w:rPr>
+        <w:t>Phase 5 — Report back (November 2026)</w:t>
+      </w:r>
+    </w:p>
+    <w:p>
+      <w:pPr>
+        <w:pStyle w:val="Normal"/>
+        <w:rPr/>
+      </w:pPr>
+      <w:r>
+        <w:rPr>
+          <w:rFonts w:cs="Book Antiqua"/>
+          <w:b w:val="false"/>
+          <w:i w:val="false"/>
+        </w:rPr>
+        <w:t>Present the endorsed definitions and the confirmed relationship between Combat Mindset and Performance Under Pressure; Framework v1.0 and its agreed architecture; the validated capability and product map; the results of any limited MVP integration trial; the proposed governance and assurance model; and a prioritised implementation plan. The report will identify whether COGCON should remain a developmental product; undergo further controlled evaluation; be integrated selectively into existing training; be prepared for broader scaling; or cease or change direction.</w:t>
+      </w:r>
+    </w:p>
+    <w:p>
+      <w:pPr>
+        <w:pStyle w:val="Normal"/>
+        <w:pBdr>
+          <w:bottom w:val="single" w:sz="6" w:space="1" w:color="A89662"/>
+        </w:pBdr>
+        <w:spacing w:before="200" w:after="200"/>
+        <w:rPr/>
+      </w:pPr>
+      <w:r>
+        <w:rPr/>
+      </w:r>
+    </w:p>
+    <w:p>
+      <w:pPr>
+        <w:pStyle w:val="Heading1"/>
+        <w:pBdr>
+          <w:left w:val="single" w:sz="24" w:space="8" w:color="C62026"/>
+        </w:pBdr>
+        <w:rPr/>
+      </w:pPr>
+      <w:r>
+        <w:rPr>
+          <w:rFonts w:cs="Arial" w:ascii="Arial" w:hAnsi="Arial"/>
+          <w:b/>
+          <w:i w:val="false"/>
+          <w:color w:val="002516"/>
+          <w:sz w:val="28"/>
+        </w:rPr>
+        <w:t>6. Governance</w:t>
+      </w:r>
+    </w:p>
+    <w:p>
+      <w:pPr>
+        <w:pStyle w:val="Normal"/>
+        <w:rPr/>
+      </w:pPr>
+      <w:r>
+        <w:rPr>
+          <w:rFonts w:cs="Book Antiqua"/>
+          <w:b w:val="false"/>
+          <w:i w:val="false"/>
+        </w:rPr>
+        <w:t>The following arrangements are proposed for confirmation at Phase 0. Technical and professional authority is distributed by domain; no single organisation owns the evidence base for the entire capability.</w:t>
       </w:r>
     </w:p>
     <w:p>
@@ -2439,7 +2567,79 @@
           <w:b w:val="false"/>
           <w:i w:val="false"/>
         </w:rPr>
-        <w:t>Capability development and delivery coordinator — ACS, leveraging NZALC and wider ACS expertise, intellectual property and programmes.</w:t>
+        <w:t>Army Sponsor — strategic sponsor for Combat Mindset, the enabling Performance Under Pressure capability and the Army Combat Mindset Framework.</w:t>
+      </w:r>
+    </w:p>
+    <w:p>
+      <w:pPr>
+        <w:pStyle w:val="Normal"/>
+        <w:tabs>
+          <w:tab w:val="clear" w:pos="720"/>
+          <w:tab w:val="left" w:pos="425" w:leader="none"/>
+        </w:tabs>
+        <w:spacing w:before="0" w:after="60"/>
+        <w:ind w:hanging="255" w:left="425"/>
+        <w:rPr/>
+      </w:pPr>
+      <w:r>
+        <w:rPr>
+          <w:rFonts w:cs="Arial" w:ascii="Arial" w:hAnsi="Arial"/>
+          <w:b/>
+          <w:color w:val="C62026"/>
+        </w:rPr>
+        <w:t>•</w:t>
+      </w:r>
+      <w:r>
+        <w:rPr>
+          <w:rFonts w:cs="Arial" w:ascii="Arial" w:hAnsi="Arial"/>
+          <w:b/>
+          <w:color w:val="C62026"/>
+        </w:rPr>
+        <w:tab/>
+      </w:r>
+      <w:r>
+        <w:rPr>
+          <w:rFonts w:cs="Book Antiqua"/>
+          <w:b w:val="false"/>
+          <w:i w:val="false"/>
+        </w:rPr>
+        <w:t>Interim capability integrator — COMDT ACS, coordinating definition, framework development, stakeholder engagement and recommendations to the Army Sponsor.</w:t>
+      </w:r>
+    </w:p>
+    <w:p>
+      <w:pPr>
+        <w:pStyle w:val="Normal"/>
+        <w:tabs>
+          <w:tab w:val="clear" w:pos="720"/>
+          <w:tab w:val="left" w:pos="425" w:leader="none"/>
+        </w:tabs>
+        <w:spacing w:before="0" w:after="60"/>
+        <w:ind w:hanging="255" w:left="425"/>
+        <w:rPr/>
+      </w:pPr>
+      <w:r>
+        <w:rPr>
+          <w:rFonts w:cs="Arial" w:ascii="Arial" w:hAnsi="Arial"/>
+          <w:b/>
+          <w:color w:val="C62026"/>
+        </w:rPr>
+        <w:t>•</w:t>
+      </w:r>
+      <w:r>
+        <w:rPr>
+          <w:rFonts w:cs="Arial" w:ascii="Arial" w:hAnsi="Arial"/>
+          <w:b/>
+          <w:color w:val="C62026"/>
+        </w:rPr>
+        <w:tab/>
+      </w:r>
+      <w:r>
+        <w:rPr>
+          <w:rFonts w:cs="Book Antiqua"/>
+          <w:b w:val="false"/>
+          <w:i w:val="false"/>
+        </w:rPr>
+        <w:t>Capability development and delivery coordinator — ACS, coordinating the framework, developmental architecture and recognised training products, leveraging NZALC and wider ACS expertise, intellectual property and programmes.</w:t>
       </w:r>
     </w:p>
     <w:p>
@@ -2695,15 +2895,15 @@
           <w:b/>
           <w:i w:val="false"/>
         </w:rPr>
-        <w:t>Endorse Combat Mindset as the Army operational frame</w:t>
-      </w:r>
-      <w:r>
-        <w:rPr>
-          <w:rFonts w:cs="Book Antiqua"/>
-          <w:b w:val="false"/>
-          <w:i w:val="false"/>
-        </w:rPr>
-        <w:t xml:space="preserve"> and Performance Under Pressure as the underlying individual and collective capability.</w:t>
+        <w:t>Endorse Combat Mindset as the combat-specific expression of Performance Under Pressure</w:t>
+      </w:r>
+      <w:r>
+        <w:rPr>
+          <w:rFonts w:cs="Book Antiqua"/>
+          <w:b w:val="false"/>
+          <w:i w:val="false"/>
+        </w:rPr>
+        <w:t>, and Performance Under Pressure as the enabling, trainable individual and collective human-performance capability.</w:t>
       </w:r>
     </w:p>
     <w:p>
@@ -2732,15 +2932,15 @@
           <w:b/>
           <w:i w:val="false"/>
         </w:rPr>
-        <w:t>Note that existing programmes and products will be mapped beneath the framework</w:t>
-      </w:r>
-      <w:r>
-        <w:rPr>
-          <w:rFonts w:cs="Book Antiqua"/>
-          <w:b w:val="false"/>
-          <w:i w:val="false"/>
-        </w:rPr>
-        <w:t xml:space="preserve"> and will not constitute the framework in isolation.</w:t>
+        <w:t>Endorse the formal definitions</w:t>
+      </w:r>
+      <w:r>
+        <w:rPr>
+          <w:rFonts w:cs="Book Antiqua"/>
+          <w:b w:val="false"/>
+          <w:i w:val="false"/>
+        </w:rPr>
+        <w:t xml:space="preserve"> at paragraph 2 as the baseline for staffing.</w:t>
       </w:r>
     </w:p>
     <w:p>
@@ -2769,15 +2969,15 @@
           <w:b/>
           <w:i w:val="false"/>
         </w:rPr>
-        <w:t>Endorse COGCON's interim status as a developmental MVP</w:t>
-      </w:r>
-      <w:r>
-        <w:rPr>
-          <w:rFonts w:cs="Book Antiqua"/>
-          <w:b w:val="false"/>
-          <w:i w:val="false"/>
-        </w:rPr>
-        <w:t xml:space="preserve"> within the performance-cognition strand.</w:t>
+        <w:t>Endorse the Army Combat Mindset Framework</w:t>
+      </w:r>
+      <w:r>
+        <w:rPr>
+          <w:rFonts w:cs="Book Antiqua"/>
+          <w:b w:val="false"/>
+          <w:i w:val="false"/>
+        </w:rPr>
+        <w:t xml:space="preserve"> as the organising model through which Army will define, develop, integrate and assure the capabilities, products and governance arrangements that enable Combat Mindset.</w:t>
       </w:r>
     </w:p>
     <w:p>
@@ -2806,15 +3006,15 @@
           <w:b/>
           <w:i w:val="false"/>
         </w:rPr>
-        <w:t>Confirm COMDT ACS as the interim capability integrator</w:t>
-      </w:r>
-      <w:r>
-        <w:rPr>
-          <w:rFonts w:cs="Book Antiqua"/>
-          <w:b w:val="false"/>
-          <w:i w:val="false"/>
-        </w:rPr>
-        <w:t xml:space="preserve"> pending confirmation of the Army Sponsor.</w:t>
+        <w:t>Note that existing programmes and products will be mapped beneath the framework's capability strands</w:t>
+      </w:r>
+      <w:r>
+        <w:rPr>
+          <w:rFonts w:cs="Book Antiqua"/>
+          <w:b w:val="false"/>
+          <w:i w:val="false"/>
+        </w:rPr>
+        <w:t xml:space="preserve"> and will not constitute the framework in isolation.</w:t>
       </w:r>
     </w:p>
     <w:p>
@@ -2843,15 +3043,15 @@
           <w:b/>
           <w:i w:val="false"/>
         </w:rPr>
-        <w:t>Confirm HPC as the COGCON product steward and performance-cognition adviser</w:t>
-      </w:r>
-      <w:r>
-        <w:rPr>
-          <w:rFonts w:cs="Book Antiqua"/>
-          <w:b w:val="false"/>
-          <w:i w:val="false"/>
-        </w:rPr>
-        <w:t>, rather than the technical authority for the full Combat Mindset capability.</w:t>
+        <w:t>Endorse COGCON's interim status as a developmental MVP</w:t>
+      </w:r>
+      <w:r>
+        <w:rPr>
+          <w:rFonts w:cs="Book Antiqua"/>
+          <w:b w:val="false"/>
+          <w:i w:val="false"/>
+        </w:rPr>
+        <w:t xml:space="preserve"> within the performance-cognition strand.</w:t>
       </w:r>
     </w:p>
     <w:p>
@@ -2880,15 +3080,15 @@
           <w:b/>
           <w:i w:val="false"/>
         </w:rPr>
-        <w:t>Approve the revised programme of work</w:t>
-      </w:r>
-      <w:r>
-        <w:rPr>
-          <w:rFonts w:cs="Book Antiqua"/>
-          <w:b w:val="false"/>
-          <w:i w:val="false"/>
-        </w:rPr>
-        <w:t>, including capability and product mapping, framework development, stakeholder engagement and a limited MVP integration trial subject to resource availability.</w:t>
+        <w:t>Confirm the governance model</w:t>
+      </w:r>
+      <w:r>
+        <w:rPr>
+          <w:rFonts w:cs="Book Antiqua"/>
+          <w:b w:val="false"/>
+          <w:i w:val="false"/>
+        </w:rPr>
+        <w:t xml:space="preserve"> at paragraph 6, including COMDT ACS as interim capability integrator pending confirmation of the Army Sponsor, and HPC as COGCON product steward and performance-cognition adviser.</w:t>
       </w:r>
     </w:p>
     <w:p>
@@ -2917,6 +3117,43 @@
           <w:b/>
           <w:i w:val="false"/>
         </w:rPr>
+        <w:t>Approve the programme of work</w:t>
+      </w:r>
+      <w:r>
+        <w:rPr>
+          <w:rFonts w:cs="Book Antiqua"/>
+          <w:b w:val="false"/>
+          <w:i w:val="false"/>
+        </w:rPr>
+        <w:t xml:space="preserve"> at paragraph 5, including capability and product mapping, framework development, stakeholder engagement and a limited MVP integration trial subject to resource availability.</w:t>
+      </w:r>
+    </w:p>
+    <w:p>
+      <w:pPr>
+        <w:pStyle w:val="Normal"/>
+        <w:keepNext w:val="true"/>
+        <w:tabs>
+          <w:tab w:val="clear" w:pos="720"/>
+          <w:tab w:val="left" w:pos="425" w:leader="none"/>
+        </w:tabs>
+        <w:spacing w:before="80" w:after="40"/>
+        <w:ind w:hanging="425" w:left="425"/>
+        <w:rPr/>
+      </w:pPr>
+      <w:r>
+        <w:rPr>
+          <w:rFonts w:cs="Arial" w:ascii="Arial" w:hAnsi="Arial"/>
+          <w:b/>
+        </w:rPr>
+        <w:t>9.</w:t>
+        <w:tab/>
+      </w:r>
+      <w:r>
+        <w:rPr>
+          <w:rFonts w:cs="Book Antiqua"/>
+          <w:b/>
+          <w:i w:val="false"/>
+        </w:rPr>
         <w:t>Direct that the November 2026 report provide</w:t>
       </w:r>
       <w:r>
@@ -2925,7 +3162,7 @@
           <w:b w:val="false"/>
           <w:i w:val="false"/>
         </w:rPr>
-        <w:t xml:space="preserve"> Framework v1.0; the validated capability and product map; a governance and assurance model; an assessment of COGCON's evidence, scalability, resource requirements and appropriate future role; and a prioritised implementation plan.</w:t>
+        <w:t xml:space="preserve"> the endorsed definitions and confirmed relationship between Combat Mindset and Performance Under Pressure; Framework v1.0 and its agreed architecture; the validated capability and product map; a governance and assurance model; an assessment of COGCON's evidence, scalability, resource requirements and appropriate future role; and a prioritised implementation plan.</w:t>
       </w:r>
     </w:p>
     <w:p>
@@ -2973,7 +3210,7 @@
           <w:color w:val="000000"/>
           <w:sz w:val="22"/>
         </w:rPr>
-        <w:t>A1. Framework levels</w:t>
+        <w:t>A1. Doctrinal hierarchy</w:t>
       </w:r>
     </w:p>
     <w:tbl>
@@ -3023,7 +3260,7 @@
                 <w:color w:val="FFFFFF"/>
                 <w:sz w:val="19"/>
               </w:rPr>
-              <w:t>Framework level</w:t>
+              <w:t>Hierarchy</w:t>
             </w:r>
           </w:p>
         </w:tc>
@@ -3082,7 +3319,7 @@
                 <w:color w:val="000000"/>
                 <w:sz w:val="19"/>
               </w:rPr>
-              <w:t>Army operational frame</w:t>
+              <w:t>Warfighting imperative</w:t>
             </w:r>
           </w:p>
         </w:tc>
@@ -3108,7 +3345,7 @@
                 <w:color w:val="000000"/>
                 <w:sz w:val="19"/>
               </w:rPr>
-              <w:t>Combat Mindset</w:t>
+              <w:t>Individuals, teams and leaders remain effective and act decisively, persistently, adaptively and ethically under combat conditions</w:t>
             </w:r>
           </w:p>
         </w:tc>
@@ -3139,7 +3376,7 @@
                 <w:color w:val="000000"/>
                 <w:sz w:val="19"/>
               </w:rPr>
-              <w:t>Underlying capability</w:t>
+              <w:t>Combat-specific expression</w:t>
             </w:r>
           </w:p>
         </w:tc>
@@ -3165,7 +3402,7 @@
                 <w:color w:val="000000"/>
                 <w:sz w:val="19"/>
               </w:rPr>
-              <w:t>Performance Under Pressure</w:t>
+              <w:t>Combat Mindset</w:t>
             </w:r>
           </w:p>
         </w:tc>
@@ -3196,7 +3433,7 @@
                 <w:color w:val="000000"/>
                 <w:sz w:val="19"/>
               </w:rPr>
-              <w:t>Capability strands</w:t>
+              <w:t>Enabling human-performance capability</w:t>
             </w:r>
           </w:p>
         </w:tc>
@@ -3222,7 +3459,7 @@
                 <w:color w:val="000000"/>
                 <w:sz w:val="19"/>
               </w:rPr>
-              <w:t>Leadership; mental skills; performance cognition; resilience and recovery; physical performance; professional identity and values; individual and collective exposure to pressure</w:t>
+              <w:t>Performance Under Pressure</w:t>
             </w:r>
           </w:p>
         </w:tc>
@@ -3253,7 +3490,7 @@
                 <w:color w:val="000000"/>
                 <w:sz w:val="19"/>
               </w:rPr>
-              <w:t>Training products and methods</w:t>
+              <w:t>Organising model</w:t>
             </w:r>
           </w:p>
         </w:tc>
@@ -3279,6 +3516,120 @@
                 <w:color w:val="000000"/>
                 <w:sz w:val="19"/>
               </w:rPr>
+              <w:t>Army Combat Mindset Framework</w:t>
+            </w:r>
+          </w:p>
+        </w:tc>
+      </w:tr>
+      <w:tr>
+        <w:trPr>
+          <w:cantSplit w:val="true"/>
+        </w:trPr>
+        <w:tc>
+          <w:tcPr>
+            <w:tcW w:w="4536" w:type="dxa"/>
+            <w:tcBorders>
+              <w:top w:val="single" w:sz="4" w:space="0" w:color="A89662"/>
+              <w:left w:val="single" w:sz="4" w:space="0" w:color="A89662"/>
+              <w:bottom w:val="single" w:sz="4" w:space="0" w:color="A89662"/>
+              <w:right w:val="single" w:sz="4" w:space="0" w:color="A89662"/>
+            </w:tcBorders>
+          </w:tcPr>
+          <w:p>
+            <w:pPr>
+              <w:pStyle w:val="Normal"/>
+              <w:spacing w:before="40" w:after="40"/>
+              <w:rPr/>
+            </w:pPr>
+            <w:r>
+              <w:rPr>
+                <w:rFonts w:cs="Book Antiqua"/>
+                <w:color w:val="000000"/>
+                <w:sz w:val="19"/>
+              </w:rPr>
+              <w:t>Capability strands</w:t>
+            </w:r>
+          </w:p>
+        </w:tc>
+        <w:tc>
+          <w:tcPr>
+            <w:tcW w:w="4535" w:type="dxa"/>
+            <w:tcBorders>
+              <w:top w:val="single" w:sz="4" w:space="0" w:color="A89662"/>
+              <w:left w:val="single" w:sz="4" w:space="0" w:color="A89662"/>
+              <w:bottom w:val="single" w:sz="4" w:space="0" w:color="A89662"/>
+              <w:right w:val="single" w:sz="4" w:space="0" w:color="A89662"/>
+            </w:tcBorders>
+          </w:tcPr>
+          <w:p>
+            <w:pPr>
+              <w:pStyle w:val="Normal"/>
+              <w:spacing w:before="40" w:after="40"/>
+              <w:rPr/>
+            </w:pPr>
+            <w:r>
+              <w:rPr>
+                <w:rFonts w:cs="Book Antiqua"/>
+                <w:color w:val="000000"/>
+                <w:sz w:val="19"/>
+              </w:rPr>
+              <w:t>Leadership; mental skills; performance cognition; resilience and recovery; physical performance; professional identity and values; individual and collective exposure to pressure</w:t>
+            </w:r>
+          </w:p>
+        </w:tc>
+      </w:tr>
+      <w:tr>
+        <w:trPr>
+          <w:cantSplit w:val="true"/>
+        </w:trPr>
+        <w:tc>
+          <w:tcPr>
+            <w:tcW w:w="4536" w:type="dxa"/>
+            <w:tcBorders>
+              <w:top w:val="single" w:sz="4" w:space="0" w:color="A89662"/>
+              <w:left w:val="single" w:sz="4" w:space="0" w:color="A89662"/>
+              <w:bottom w:val="single" w:sz="4" w:space="0" w:color="A89662"/>
+              <w:right w:val="single" w:sz="4" w:space="0" w:color="A89662"/>
+            </w:tcBorders>
+          </w:tcPr>
+          <w:p>
+            <w:pPr>
+              <w:pStyle w:val="Normal"/>
+              <w:spacing w:before="40" w:after="40"/>
+              <w:rPr/>
+            </w:pPr>
+            <w:r>
+              <w:rPr>
+                <w:rFonts w:cs="Book Antiqua"/>
+                <w:color w:val="000000"/>
+                <w:sz w:val="19"/>
+              </w:rPr>
+              <w:t>Training products and methods</w:t>
+            </w:r>
+          </w:p>
+        </w:tc>
+        <w:tc>
+          <w:tcPr>
+            <w:tcW w:w="4535" w:type="dxa"/>
+            <w:tcBorders>
+              <w:top w:val="single" w:sz="4" w:space="0" w:color="A89662"/>
+              <w:left w:val="single" w:sz="4" w:space="0" w:color="A89662"/>
+              <w:bottom w:val="single" w:sz="4" w:space="0" w:color="A89662"/>
+              <w:right w:val="single" w:sz="4" w:space="0" w:color="A89662"/>
+            </w:tcBorders>
+          </w:tcPr>
+          <w:p>
+            <w:pPr>
+              <w:pStyle w:val="Normal"/>
+              <w:spacing w:before="40" w:after="40"/>
+              <w:rPr/>
+            </w:pPr>
+            <w:r>
+              <w:rPr>
+                <w:rFonts w:cs="Book Antiqua"/>
+                <w:color w:val="000000"/>
+                <w:sz w:val="19"/>
+              </w:rPr>
               <w:t>NZALC Performance Under Pressure package; COGCON MVP; NZDF Psychology products; scenario and experiential training; physical conditioning; structured reflection and recovery; other products identified during Phase 1 mapping</w:t>
             </w:r>
           </w:p>
@@ -3293,6 +3644,26 @@
       </w:pPr>
       <w:r>
         <w:rPr/>
+      </w:r>
+    </w:p>
+    <w:p>
+      <w:pPr>
+        <w:pStyle w:val="Normal"/>
+        <w:pBdr>
+          <w:left w:val="single" w:sz="28" w:space="8" w:color="C62026"/>
+        </w:pBdr>
+        <w:shd w:val="clear" w:color="auto" w:fill="CDD2B7"/>
+        <w:spacing w:before="200" w:after="200"/>
+        <w:ind w:left="340" w:right="340"/>
+        <w:rPr/>
+      </w:pPr>
+      <w:r>
+        <w:rPr>
+          <w:rFonts w:cs="Arial" w:ascii="Arial" w:hAnsi="Arial"/>
+          <w:b/>
+          <w:i w:val="false"/>
+        </w:rPr>
+        <w:t>Warfighting imperative → Combat Mindset → enabled by Performance Under Pressure → developed and organised through the Army Combat Mindset Framework → delivered through capability strands, products and methods</w:t>
       </w:r>
     </w:p>
     <w:p>
@@ -3615,6 +3986,63 @@
                 <w:sz w:val="19"/>
               </w:rPr>
               <w:t>Developmental MVP</w:t>
+            </w:r>
+          </w:p>
+        </w:tc>
+      </w:tr>
+      <w:tr>
+        <w:trPr>
+          <w:cantSplit w:val="true"/>
+        </w:trPr>
+        <w:tc>
+          <w:tcPr>
+            <w:tcW w:w="4536" w:type="dxa"/>
+            <w:tcBorders>
+              <w:top w:val="single" w:sz="4" w:space="0" w:color="A89662"/>
+              <w:left w:val="single" w:sz="4" w:space="0" w:color="A89662"/>
+              <w:bottom w:val="single" w:sz="4" w:space="0" w:color="A89662"/>
+              <w:right w:val="single" w:sz="4" w:space="0" w:color="A89662"/>
+            </w:tcBorders>
+          </w:tcPr>
+          <w:p>
+            <w:pPr>
+              <w:pStyle w:val="Normal"/>
+              <w:spacing w:before="40" w:after="40"/>
+              <w:rPr/>
+            </w:pPr>
+            <w:r>
+              <w:rPr>
+                <w:rFonts w:cs="Book Antiqua"/>
+                <w:color w:val="000000"/>
+                <w:sz w:val="19"/>
+              </w:rPr>
+              <w:t>Relationship to Combat Mindset</w:t>
+            </w:r>
+          </w:p>
+        </w:tc>
+        <w:tc>
+          <w:tcPr>
+            <w:tcW w:w="4535" w:type="dxa"/>
+            <w:tcBorders>
+              <w:top w:val="single" w:sz="4" w:space="0" w:color="A89662"/>
+              <w:left w:val="single" w:sz="4" w:space="0" w:color="A89662"/>
+              <w:bottom w:val="single" w:sz="4" w:space="0" w:color="A89662"/>
+              <w:right w:val="single" w:sz="4" w:space="0" w:color="A89662"/>
+            </w:tcBorders>
+          </w:tcPr>
+          <w:p>
+            <w:pPr>
+              <w:pStyle w:val="Normal"/>
+              <w:spacing w:before="40" w:after="40"/>
+              <w:rPr/>
+            </w:pPr>
+            <w:r>
+              <w:rPr>
+                <w:rFonts w:cs="Book Antiqua"/>
+                <w:color w:val="000000"/>
+                <w:sz w:val="19"/>
+              </w:rPr>
+              <w:t>Develops selected elements of Performance Under Pressure that may contribute to Combat Mindset when integrated within broader warfighting, leadership, values, physical and collective development</w:t>
             </w:r>
           </w:p>
         </w:tc>
@@ -4868,7 +5296,7 @@
           <w:color w:val="000000"/>
           <w:sz w:val="22"/>
         </w:rPr>
-        <w:t>A4. Shared frames</w:t>
+        <w:t>A4. Shared developmental models</w:t>
       </w:r>
     </w:p>
     <w:p>
@@ -4904,7 +5332,7 @@
           <w:b w:val="false"/>
           <w:i w:val="false"/>
         </w:rPr>
-        <w:t>Prepare–Perform–Recover provides a common delivery rhythm across recognised products and methods.</w:t>
+        <w:t>Prepare–Perform–Recover provides a common developmental and delivery rhythm across recognised products and methods.</w:t>
       </w:r>
     </w:p>
     <w:p>
@@ -4940,7 +5368,7 @@
           <w:b w:val="false"/>
           <w:i w:val="false"/>
         </w:rPr>
-        <w:t>Lead Self to Lead Systems provides the developmental progression: individual conditioning is likely to be densest in initial and individual training, while leadership, team and systems application deepens across the leadership continuum.</w:t>
+        <w:t>Lead Self to Lead Systems provides the developmental progression from individual capability to collective, leadership and systems application: individual conditioning is likely to be densest in initial and individual training, while leadership, team and systems application deepens across the leadership continuum.</w:t>
       </w:r>
     </w:p>
     <w:p>
@@ -5082,7 +5510,7 @@
         <w:sz w:val="17"/>
         <w:rFonts w:cs="Arial" w:ascii="Arial" w:hAnsi="Arial"/>
       </w:rPr>
-      <w:t>9</w:t>
+      <w:t>11</w:t>
     </w:r>
     <w:r>
       <w:rPr>
@@ -5126,7 +5554,7 @@
         <w:sz w:val="17"/>
         <w:rFonts w:cs="Arial" w:ascii="Arial" w:hAnsi="Arial"/>
       </w:rPr>
-      <w:t>9</w:t>
+      <w:t>11</w:t>
     </w:r>
     <w:r>
       <w:rPr>

</xml_diff>

<commit_message>
Align paper with slide decisions: pillars, phases 0-4 (v0.4)
Sweeps the way-forward paper to capability pillars terminology,
removes the standalone MVP integration trial phase (COGCON's completed
feasibility trials in live training now enter Phase 1 as mapped
evidence), renumbers report back as Phase 4, and adjusts the programme
recommendation accordingly. Version to Draft v0.4. Updates both
one-pager slides to match: five-step programme, pillars wording and
centred arrow glyphs on the landscape version, v0.4 document control
throughout.

Co-Authored-By: Claude Fable 5 <noreply@anthropic.com>
Claude-Session: https://claude.ai/code/session_01YLo1WfwUDkbwfJEF3ZNVbB
</commit_message>
<xml_diff>
--- a/output/combat-mindset-way-forward.docx
+++ b/output/combat-mindset-way-forward.docx
@@ -231,7 +231,7 @@
           <w:color w:val="000000"/>
           <w:sz w:val="20"/>
         </w:rPr>
-        <w:t>Draft v0.3</w:t>
+        <w:t>Draft v0.4</w:t>
       </w:r>
     </w:p>
     <w:p>
@@ -533,7 +533,7 @@
           <w:b w:val="false"/>
           <w:i w:val="false"/>
         </w:rPr>
-        <w:t>The Army Combat Mindset Framework is the organising model through which Army will define, develop, integrate and assure the capability strands, developmental outcomes, training products and governance arrangements that enable this effect.</w:t>
+        <w:t>The Army Combat Mindset Framework is the organising model through which Army will define, develop, integrate and assure the capability pillars, developmental outcomes, training products and governance arrangements that enable this effect.</w:t>
       </w:r>
     </w:p>
     <w:p>
@@ -1181,7 +1181,7 @@
           <w:b w:val="false"/>
           <w:i w:val="false"/>
         </w:rPr>
-        <w:t>For the purposes of the Combat Mindset programme of work, COGCON will initially be treated as a developmental minimum viable product within the performance-cognition strand of the Army Combat Mindset Framework, contributing to selected elements of Performance Under Pressure.</w:t>
+        <w:t>For the purposes of the Combat Mindset programme of work, COGCON will initially be treated as a developmental minimum viable product within the performance-cognition pillar of the Army Combat Mindset Framework, contributing to selected elements of Performance Under Pressure.</w:t>
       </w:r>
     </w:p>
     <w:p>
@@ -2085,7 +2085,7 @@
           <w:b w:val="false"/>
           <w:i w:val="false"/>
         </w:rPr>
-        <w:t>The mapping will identify which products contribute to the broader Performance Under Pressure capability and which support its combat-specific expression. COGCON will be assessed as one developmental product within this map, with particular attention to its MVP boundary, evidence base, ownership, workforce requirements and scalability.</w:t>
+        <w:t>The mapping will identify which products contribute to the broader Performance Under Pressure capability and which support its combat-specific expression. COGCON will be assessed as one developmental product within this map, with particular attention to its MVP boundary, evidence base — including its completed feasibility trials in live military training — ownership, workforce requirements and scalability.</w:t>
       </w:r>
     </w:p>
     <w:p>
@@ -2115,21 +2115,21 @@
           <w:b w:val="false"/>
           <w:i w:val="false"/>
         </w:rPr>
-        <w:t>Draft the Army Combat Mindset Framework as the organising model through which Army will define, develop, integrate and assure Performance Under Pressure and its combat-specific expression. The framework will include the endorsed definitions and desired operational effect; the integrated capability strands; developmental outcomes from Lead Self through Lead Systems; the relationship between doctrine, framework, products and delivery; common assurance principles; and the criteria by which existing and future products may be recognised as contributing to the framework.</w:t>
-      </w:r>
-    </w:p>
-    <w:p>
-      <w:pPr>
-        <w:pStyle w:val="Normal"/>
-        <w:rPr/>
-      </w:pPr>
-      <w:r>
-        <w:rPr>
-          <w:rFonts w:cs="Book Antiqua"/>
-          <w:b w:val="false"/>
-          <w:i w:val="false"/>
-        </w:rPr>
-        <w:t>Existing products, including the NZALC Performance Under Pressure package and the COGCON MVP, will be mapped beneath the relevant capability strands rather than treated as the framework itself.</w:t>
+        <w:t>Draft the Army Combat Mindset Framework as the organising model through which Army will define, develop, integrate and assure Performance Under Pressure and its combat-specific expression. The framework will include the endorsed definitions and desired operational effect; the integrated capability pillars; developmental outcomes from Lead Self through Lead Systems; the relationship between doctrine, framework, products and delivery; common assurance principles; and the criteria by which existing and future products may be recognised as contributing to the framework.</w:t>
+      </w:r>
+    </w:p>
+    <w:p>
+      <w:pPr>
+        <w:pStyle w:val="Normal"/>
+        <w:rPr/>
+      </w:pPr>
+      <w:r>
+        <w:rPr>
+          <w:rFonts w:cs="Book Antiqua"/>
+          <w:b w:val="false"/>
+          <w:i w:val="false"/>
+        </w:rPr>
+        <w:t>Existing products, including the NZALC Performance Under Pressure package and the COGCON MVP, will be mapped beneath the relevant capability pillars rather than treated as the framework itself.</w:t>
       </w:r>
     </w:p>
     <w:p>
@@ -2175,317 +2175,21 @@
           <w:color w:val="000000"/>
           <w:sz w:val="22"/>
         </w:rPr>
-        <w:t>Phase 4 — Limited MVP integration trial (October 2026, subject to capacity)</w:t>
-      </w:r>
-    </w:p>
-    <w:p>
-      <w:pPr>
-        <w:pStyle w:val="Normal"/>
-        <w:rPr/>
-      </w:pPr>
-      <w:r>
-        <w:rPr>
-          <w:rFonts w:cs="Book Antiqua"/>
-          <w:b w:val="false"/>
-          <w:i w:val="false"/>
-        </w:rPr>
-        <w:t>Conduct a controlled trial of the draft framework and the COGCON MVP within one existing ACS or NZALC training activity. The trial will:</w:t>
-      </w:r>
-    </w:p>
-    <w:p>
-      <w:pPr>
-        <w:pStyle w:val="Normal"/>
-        <w:tabs>
-          <w:tab w:val="clear" w:pos="720"/>
-          <w:tab w:val="left" w:pos="425" w:leader="none"/>
-        </w:tabs>
-        <w:spacing w:before="0" w:after="60"/>
-        <w:ind w:hanging="255" w:left="425"/>
-        <w:rPr/>
-      </w:pPr>
-      <w:r>
-        <w:rPr>
-          <w:rFonts w:cs="Arial" w:ascii="Arial" w:hAnsi="Arial"/>
-          <w:b/>
-          <w:color w:val="C62026"/>
-        </w:rPr>
-        <w:t>•</w:t>
-      </w:r>
-      <w:r>
-        <w:rPr>
-          <w:rFonts w:cs="Arial" w:ascii="Arial" w:hAnsi="Arial"/>
-          <w:b/>
-          <w:color w:val="C62026"/>
-        </w:rPr>
-        <w:tab/>
-      </w:r>
-      <w:r>
-        <w:rPr>
-          <w:rFonts w:cs="Book Antiqua"/>
-          <w:b w:val="false"/>
-          <w:i w:val="false"/>
-        </w:rPr>
-        <w:t>use existing delivery staff and training infrastructure;</w:t>
-      </w:r>
-    </w:p>
-    <w:p>
-      <w:pPr>
-        <w:pStyle w:val="Normal"/>
-        <w:tabs>
-          <w:tab w:val="clear" w:pos="720"/>
-          <w:tab w:val="left" w:pos="425" w:leader="none"/>
-        </w:tabs>
-        <w:spacing w:before="0" w:after="60"/>
-        <w:ind w:hanging="255" w:left="425"/>
-        <w:rPr/>
-      </w:pPr>
-      <w:r>
-        <w:rPr>
-          <w:rFonts w:cs="Arial" w:ascii="Arial" w:hAnsi="Arial"/>
-          <w:b/>
-          <w:color w:val="C62026"/>
-        </w:rPr>
-        <w:t>•</w:t>
-      </w:r>
-      <w:r>
-        <w:rPr>
-          <w:rFonts w:cs="Arial" w:ascii="Arial" w:hAnsi="Arial"/>
-          <w:b/>
-          <w:color w:val="C62026"/>
-        </w:rPr>
-        <w:tab/>
-      </w:r>
-      <w:r>
-        <w:rPr>
-          <w:rFonts w:cs="Book Antiqua"/>
-          <w:b w:val="false"/>
-          <w:i w:val="false"/>
-        </w:rPr>
-        <w:t>incorporate one bounded COGCON adaptive dual-task activity;</w:t>
-      </w:r>
-    </w:p>
-    <w:p>
-      <w:pPr>
-        <w:pStyle w:val="Normal"/>
-        <w:tabs>
-          <w:tab w:val="clear" w:pos="720"/>
-          <w:tab w:val="left" w:pos="425" w:leader="none"/>
-        </w:tabs>
-        <w:spacing w:before="0" w:after="60"/>
-        <w:ind w:hanging="255" w:left="425"/>
-        <w:rPr/>
-      </w:pPr>
-      <w:r>
-        <w:rPr>
-          <w:rFonts w:cs="Arial" w:ascii="Arial" w:hAnsi="Arial"/>
-          <w:b/>
-          <w:color w:val="C62026"/>
-        </w:rPr>
-        <w:t>•</w:t>
-      </w:r>
-      <w:r>
-        <w:rPr>
-          <w:rFonts w:cs="Arial" w:ascii="Arial" w:hAnsi="Arial"/>
-          <w:b/>
-          <w:color w:val="C62026"/>
-        </w:rPr>
-        <w:tab/>
-      </w:r>
-      <w:r>
-        <w:rPr>
-          <w:rFonts w:cs="Book Antiqua"/>
-          <w:b w:val="false"/>
-          <w:i w:val="false"/>
-        </w:rPr>
-        <w:t>test whether the product contributes to an identified element of Performance Under Pressure and nests coherently beneath the draft framework;</w:t>
-      </w:r>
-    </w:p>
-    <w:p>
-      <w:pPr>
-        <w:pStyle w:val="Normal"/>
-        <w:tabs>
-          <w:tab w:val="clear" w:pos="720"/>
-          <w:tab w:val="left" w:pos="425" w:leader="none"/>
-        </w:tabs>
-        <w:spacing w:before="0" w:after="60"/>
-        <w:ind w:hanging="255" w:left="425"/>
-        <w:rPr/>
-      </w:pPr>
-      <w:r>
-        <w:rPr>
-          <w:rFonts w:cs="Arial" w:ascii="Arial" w:hAnsi="Arial"/>
-          <w:b/>
-          <w:color w:val="C62026"/>
-        </w:rPr>
-        <w:t>•</w:t>
-      </w:r>
-      <w:r>
-        <w:rPr>
-          <w:rFonts w:cs="Arial" w:ascii="Arial" w:hAnsi="Arial"/>
-          <w:b/>
-          <w:color w:val="C62026"/>
-        </w:rPr>
-        <w:tab/>
-      </w:r>
-      <w:r>
-        <w:rPr>
-          <w:rFonts w:cs="Book Antiqua"/>
-          <w:b w:val="false"/>
-          <w:i w:val="false"/>
-        </w:rPr>
-        <w:t>assess instructor burden, delivery consistency, participant usability and value added to existing training;</w:t>
-      </w:r>
-    </w:p>
-    <w:p>
-      <w:pPr>
-        <w:pStyle w:val="Normal"/>
-        <w:tabs>
-          <w:tab w:val="clear" w:pos="720"/>
-          <w:tab w:val="left" w:pos="425" w:leader="none"/>
-        </w:tabs>
-        <w:spacing w:before="0" w:after="60"/>
-        <w:ind w:hanging="255" w:left="425"/>
-        <w:rPr/>
-      </w:pPr>
-      <w:r>
-        <w:rPr>
-          <w:rFonts w:cs="Arial" w:ascii="Arial" w:hAnsi="Arial"/>
-          <w:b/>
-          <w:color w:val="C62026"/>
-        </w:rPr>
-        <w:t>•</w:t>
-      </w:r>
-      <w:r>
-        <w:rPr>
-          <w:rFonts w:cs="Arial" w:ascii="Arial" w:hAnsi="Arial"/>
-          <w:b/>
-          <w:color w:val="C62026"/>
-        </w:rPr>
-        <w:tab/>
-      </w:r>
-      <w:r>
-        <w:rPr>
-          <w:rFonts w:cs="Book Antiqua"/>
-          <w:b w:val="false"/>
-          <w:i w:val="false"/>
-        </w:rPr>
-        <w:t>collect proportionate training and implementation evidence;</w:t>
-      </w:r>
-    </w:p>
-    <w:p>
-      <w:pPr>
-        <w:pStyle w:val="Normal"/>
-        <w:tabs>
-          <w:tab w:val="clear" w:pos="720"/>
-          <w:tab w:val="left" w:pos="425" w:leader="none"/>
-        </w:tabs>
-        <w:spacing w:before="0" w:after="60"/>
-        <w:ind w:hanging="255" w:left="425"/>
-        <w:rPr/>
-      </w:pPr>
-      <w:r>
-        <w:rPr>
-          <w:rFonts w:cs="Arial" w:ascii="Arial" w:hAnsi="Arial"/>
-          <w:b/>
-          <w:color w:val="C62026"/>
-        </w:rPr>
-        <w:t>•</w:t>
-      </w:r>
-      <w:r>
-        <w:rPr>
-          <w:rFonts w:cs="Arial" w:ascii="Arial" w:hAnsi="Arial"/>
-          <w:b/>
-          <w:color w:val="C62026"/>
-        </w:rPr>
-        <w:tab/>
-      </w:r>
-      <w:r>
-        <w:rPr>
-          <w:rFonts w:cs="Book Antiqua"/>
-          <w:b w:val="false"/>
-          <w:i w:val="false"/>
-        </w:rPr>
-        <w:t>avoid readiness certification or high-stakes personnel assessment; and</w:t>
-      </w:r>
-    </w:p>
-    <w:p>
-      <w:pPr>
-        <w:pStyle w:val="Normal"/>
-        <w:tabs>
-          <w:tab w:val="clear" w:pos="720"/>
-          <w:tab w:val="left" w:pos="425" w:leader="none"/>
-        </w:tabs>
-        <w:spacing w:before="0" w:after="60"/>
-        <w:ind w:hanging="255" w:left="425"/>
-        <w:rPr/>
-      </w:pPr>
-      <w:r>
-        <w:rPr>
-          <w:rFonts w:cs="Arial" w:ascii="Arial" w:hAnsi="Arial"/>
-          <w:b/>
-          <w:color w:val="C62026"/>
-        </w:rPr>
-        <w:t>•</w:t>
-      </w:r>
-      <w:r>
-        <w:rPr>
-          <w:rFonts w:cs="Arial" w:ascii="Arial" w:hAnsi="Arial"/>
-          <w:b/>
-          <w:color w:val="C62026"/>
-        </w:rPr>
-        <w:tab/>
-      </w:r>
-      <w:r>
-        <w:rPr>
-          <w:rFonts w:cs="Book Antiqua"/>
-          <w:b w:val="false"/>
-          <w:i w:val="false"/>
-        </w:rPr>
-        <w:t>identify the workforce, technology, assurance and funding requirements for any wider implementation.</w:t>
-      </w:r>
-    </w:p>
-    <w:p>
-      <w:pPr>
-        <w:pStyle w:val="Normal"/>
-        <w:rPr/>
-      </w:pPr>
-      <w:r>
-        <w:rPr>
-          <w:rFonts w:cs="Book Antiqua"/>
-          <w:b w:val="false"/>
-          <w:i w:val="false"/>
-        </w:rPr>
-        <w:t>HPC will provide the protocol, specialist advice and limited evaluation support. NZALC or the relevant training provider will lead delivery and structured review. The trial is not testing whether COGCON represents the totality of Combat Mindset, and it will not create an enduring obligation for HPC to provide routine delivery.</w:t>
-      </w:r>
-    </w:p>
-    <w:p>
-      <w:pPr>
-        <w:pStyle w:val="Heading2"/>
-        <w:rPr/>
-      </w:pPr>
-      <w:r>
-        <w:rPr>
-          <w:rFonts w:cs="Arial" w:ascii="Arial" w:hAnsi="Arial"/>
-          <w:b/>
-          <w:i w:val="false"/>
-          <w:color w:val="000000"/>
-          <w:sz w:val="22"/>
-        </w:rPr>
-        <w:t>Phase 5 — Report back (November 2026)</w:t>
-      </w:r>
-    </w:p>
-    <w:p>
-      <w:pPr>
-        <w:pStyle w:val="Normal"/>
-        <w:rPr/>
-      </w:pPr>
-      <w:r>
-        <w:rPr>
-          <w:rFonts w:cs="Book Antiqua"/>
-          <w:b w:val="false"/>
-          <w:i w:val="false"/>
-        </w:rPr>
-        <w:t>Present the endorsed definitions and the confirmed relationship between Combat Mindset and Performance Under Pressure; Framework v1.0 and its agreed architecture; the validated capability and product map; the results of any limited MVP integration trial; the proposed governance and assurance model; and a prioritised implementation plan. The report will identify whether COGCON should remain a developmental product; undergo further controlled evaluation; be integrated selectively into existing training; be prepared for broader scaling; or cease or change direction.</w:t>
+        <w:t>Phase 4 — Report back (November 2026)</w:t>
+      </w:r>
+    </w:p>
+    <w:p>
+      <w:pPr>
+        <w:pStyle w:val="Normal"/>
+        <w:rPr/>
+      </w:pPr>
+      <w:r>
+        <w:rPr>
+          <w:rFonts w:cs="Book Antiqua"/>
+          <w:b w:val="false"/>
+          <w:i w:val="false"/>
+        </w:rPr>
+        <w:t>Present the endorsed definitions and the confirmed relationship between Combat Mindset and Performance Under Pressure; Framework v1.0 and its agreed architecture; the validated capability and product map; the proposed governance and assurance model; and a prioritised implementation plan. The report will identify whether COGCON should remain a developmental product; undergo further controlled evaluation; be integrated selectively into existing training; be prepared for broader scaling; or cease or change direction.</w:t>
       </w:r>
     </w:p>
     <w:p>
@@ -3006,7 +2710,7 @@
           <w:b/>
           <w:i w:val="false"/>
         </w:rPr>
-        <w:t>Note that existing programmes and products will be mapped beneath the framework's capability strands</w:t>
+        <w:t>Note that existing programmes and products will be mapped beneath the framework's capability pillars</w:t>
       </w:r>
       <w:r>
         <w:rPr>
@@ -3051,7 +2755,7 @@
           <w:b w:val="false"/>
           <w:i w:val="false"/>
         </w:rPr>
-        <w:t xml:space="preserve"> within the performance-cognition strand.</w:t>
+        <w:t xml:space="preserve"> within the performance-cognition pillar.</w:t>
       </w:r>
     </w:p>
     <w:p>
@@ -3125,7 +2829,7 @@
           <w:b w:val="false"/>
           <w:i w:val="false"/>
         </w:rPr>
-        <w:t xml:space="preserve"> at paragraph 5, including capability and product mapping, framework development, stakeholder engagement and a limited MVP integration trial subject to resource availability.</w:t>
+        <w:t xml:space="preserve"> at paragraph 5, including capability and product mapping, framework development and stakeholder engagement.</w:t>
       </w:r>
     </w:p>
     <w:p>
@@ -3547,7 +3251,7 @@
                 <w:color w:val="000000"/>
                 <w:sz w:val="19"/>
               </w:rPr>
-              <w:t>Capability strands</w:t>
+              <w:t>Capability pillars</w:t>
             </w:r>
           </w:p>
         </w:tc>
@@ -3663,7 +3367,7 @@
           <w:b/>
           <w:i w:val="false"/>
         </w:rPr>
-        <w:t>Warfighting imperative → Combat Mindset → enabled by Performance Under Pressure → developed and organised through the Army Combat Mindset Framework → delivered through capability strands, products and methods</w:t>
+        <w:t>Warfighting imperative → Combat Mindset → enabled by Performance Under Pressure → developed and organised through the Army Combat Mindset Framework → delivered through capability pillars, products and methods</w:t>
       </w:r>
     </w:p>
     <w:p>
@@ -3788,7 +3492,7 @@
                 <w:color w:val="000000"/>
                 <w:sz w:val="19"/>
               </w:rPr>
-              <w:t>Capability strand</w:t>
+              <w:t>Capability pillar</w:t>
             </w:r>
           </w:p>
         </w:tc>
@@ -5404,7 +5108,7 @@
           <w:b w:val="false"/>
           <w:i w:val="false"/>
         </w:rPr>
-        <w:t>COGCON currently contributes principally to selected Prepare and Perform activities within the performance-cognition strand. NZALC and other leadership-development products provide broader preparation, application, structured review and recovery.</w:t>
+        <w:t>COGCON currently contributes principally to selected Prepare and Perform activities within the performance-cognition pillar. NZALC and other leadership-development products provide broader preparation, application, structured review and recovery.</w:t>
       </w:r>
     </w:p>
     <w:sectPr>

</xml_diff>

<commit_message>
Combine one-pager into the paper; re-attribute as ACS product (v0.5)
The paper now opens cover > hyperlinked contents > The Model on a Page
(the portrait one-pager embedded at 300dpi as the first section, in
the TOC) > body. Cover re-attributed: Army Command School originator,
ACS 2026 reference, joint NZALC/HPC subtitle replaced with the mission
line, named originators and distribution row removed. Both one-pagers
carry the same ACS document control. Version to Draft v0.5.

Co-Authored-By: Claude Fable 5 <noreply@anthropic.com>
Claude-Session: https://claude.ai/code/session_01YLo1WfwUDkbwfJEF3ZNVbB
</commit_message>
<xml_diff>
--- a/output/combat-mindset-way-forward.docx
+++ b/output/combat-mindset-way-forward.docx
@@ -80,7 +80,7 @@
           <w:color w:val="002516"/>
           <w:sz w:val="26"/>
         </w:rPr>
-        <w:t>Joint NZALC and Human Performance Cell response to COMDT ACS</w:t>
+        <w:t>Defining, developing and assuring the human-performance capability Army requires to remain effective in combat.</w:t>
       </w:r>
     </w:p>
     <w:p>
@@ -144,7 +144,7 @@
           <w:color w:val="000000"/>
           <w:sz w:val="20"/>
         </w:rPr>
-        <w:t>NZALC/HPC 2026</w:t>
+        <w:t>ACS 2026</w:t>
       </w:r>
     </w:p>
     <w:p>
@@ -202,36 +202,7 @@
           <w:color w:val="000000"/>
           <w:sz w:val="20"/>
         </w:rPr>
-        <w:t>Major M Coom, CI NZALC · Jacques Rousseau, Human Performance Cell</w:t>
-      </w:r>
-    </w:p>
-    <w:p>
-      <w:pPr>
-        <w:pStyle w:val="Normal"/>
-        <w:tabs>
-          <w:tab w:val="clear" w:pos="720"/>
-          <w:tab w:val="left" w:pos="1814" w:leader="none"/>
-        </w:tabs>
-        <w:spacing w:before="0" w:after="60"/>
-        <w:rPr/>
-      </w:pPr>
-      <w:r>
-        <w:rPr>
-          <w:rFonts w:cs="Arial" w:ascii="Arial" w:hAnsi="Arial"/>
-          <w:b/>
-          <w:color w:val="002516"/>
-          <w:sz w:val="20"/>
-        </w:rPr>
-        <w:t>Version</w:t>
-        <w:tab/>
-      </w:r>
-      <w:r>
-        <w:rPr>
-          <w:rFonts w:cs="Arial" w:ascii="Arial" w:hAnsi="Arial"/>
-          <w:color w:val="000000"/>
-          <w:sz w:val="20"/>
-        </w:rPr>
-        <w:t>Draft v0.4</w:t>
+        <w:t>Army Command School</w:t>
       </w:r>
     </w:p>
     <w:p>
@@ -254,7 +225,7 @@
           <w:color w:val="002516"/>
           <w:sz w:val="20"/>
         </w:rPr>
-        <w:t>Distribution</w:t>
+        <w:t>Version</w:t>
         <w:tab/>
       </w:r>
       <w:r>
@@ -263,16 +234,364 @@
           <w:color w:val="000000"/>
           <w:sz w:val="20"/>
         </w:rPr>
-        <w:t>COMDT ACS</w:t>
-      </w:r>
-    </w:p>
-    <w:p>
-      <w:pPr>
-        <w:pStyle w:val="Normal"/>
-        <w:rPr/>
-      </w:pPr>
-      <w:r>
-        <w:rPr/>
+        <w:t>Draft v0.5</w:t>
+      </w:r>
+    </w:p>
+    <w:p>
+      <w:pPr>
+        <w:pStyle w:val="Normal"/>
+        <w:rPr/>
+      </w:pPr>
+      <w:r>
+        <w:rPr/>
+      </w:r>
+      <w:r>
+        <w:br w:type="page"/>
+      </w:r>
+    </w:p>
+    <w:p>
+      <w:pPr>
+        <w:pStyle w:val="Normal"/>
+        <w:pBdr>
+          <w:left w:val="single" w:sz="24" w:space="8" w:color="C62026"/>
+        </w:pBdr>
+        <w:spacing w:before="0" w:after="240"/>
+        <w:rPr/>
+      </w:pPr>
+      <w:r>
+        <w:rPr>
+          <w:rFonts w:cs="Arial" w:ascii="Arial" w:hAnsi="Arial"/>
+          <w:b/>
+          <w:color w:val="002516"/>
+          <w:sz w:val="28"/>
+        </w:rPr>
+        <w:t>Contents</w:t>
+      </w:r>
+    </w:p>
+    <w:sdt>
+      <w:sdtPr>
+        <w:docPartObj>
+          <w:docPartGallery w:val="Table of Contents"/>
+          <w:docPartUnique w:val="true"/>
+        </w:docPartObj>
+      </w:sdtPr>
+      <w:sdtContent>
+        <w:p>
+          <w:pPr>
+            <w:pStyle w:val="TOC1"/>
+            <w:tabs>
+              <w:tab w:val="clear" w:pos="9072"/>
+              <w:tab w:val="right" w:pos="9071" w:leader="dot"/>
+            </w:tabs>
+            <w:rPr/>
+          </w:pPr>
+          <w:r>
+            <w:fldChar w:fldCharType="begin"/>
+          </w:r>
+          <w:r>
+            <w:rPr>
+              <w:webHidden/>
+              <w:rStyle w:val="IndexLink"/>
+              <w:i w:val="false"/>
+            </w:rPr>
+            <w:instrText xml:space="preserve"> TOC \z \o "1-1" \u \h</w:instrText>
+          </w:r>
+          <w:r>
+            <w:rPr>
+              <w:webHidden/>
+              <w:rStyle w:val="IndexLink"/>
+              <w:i w:val="false"/>
+            </w:rPr>
+            <w:fldChar w:fldCharType="separate"/>
+          </w:r>
+          <w:hyperlink w:anchor="__RefHeading___Toc478_1628147405">
+            <w:r>
+              <w:rPr>
+                <w:webHidden/>
+                <w:rStyle w:val="IndexLink"/>
+                <w:i w:val="false"/>
+              </w:rPr>
+              <w:t>The Model on a Page</w:t>
+            </w:r>
+            <w:r>
+              <w:rPr>
+                <w:rStyle w:val="IndexLink"/>
+              </w:rPr>
+              <w:tab/>
+              <w:t>3</w:t>
+            </w:r>
+          </w:hyperlink>
+        </w:p>
+        <w:p>
+          <w:pPr>
+            <w:pStyle w:val="TOC1"/>
+            <w:tabs>
+              <w:tab w:val="clear" w:pos="9072"/>
+              <w:tab w:val="right" w:pos="9071" w:leader="dot"/>
+            </w:tabs>
+            <w:rPr/>
+          </w:pPr>
+          <w:hyperlink w:anchor="__RefHeading___Toc480_1628147405">
+            <w:r>
+              <w:rPr>
+                <w:webHidden/>
+                <w:rStyle w:val="IndexLink"/>
+                <w:i w:val="false"/>
+              </w:rPr>
+              <w:t>Purpose</w:t>
+            </w:r>
+            <w:r>
+              <w:rPr>
+                <w:rStyle w:val="IndexLink"/>
+              </w:rPr>
+              <w:tab/>
+              <w:t>4</w:t>
+            </w:r>
+          </w:hyperlink>
+        </w:p>
+        <w:p>
+          <w:pPr>
+            <w:pStyle w:val="TOC1"/>
+            <w:tabs>
+              <w:tab w:val="clear" w:pos="9072"/>
+              <w:tab w:val="right" w:pos="9071" w:leader="dot"/>
+            </w:tabs>
+            <w:rPr/>
+          </w:pPr>
+          <w:hyperlink w:anchor="__RefHeading___Toc482_1628147405">
+            <w:r>
+              <w:rPr>
+                <w:webHidden/>
+                <w:rStyle w:val="IndexLink"/>
+                <w:i w:val="false"/>
+              </w:rPr>
+              <w:t>1. The problem</w:t>
+            </w:r>
+            <w:r>
+              <w:rPr>
+                <w:rStyle w:val="IndexLink"/>
+              </w:rPr>
+              <w:tab/>
+              <w:t>4</w:t>
+            </w:r>
+          </w:hyperlink>
+        </w:p>
+        <w:p>
+          <w:pPr>
+            <w:pStyle w:val="TOC1"/>
+            <w:tabs>
+              <w:tab w:val="clear" w:pos="9072"/>
+              <w:tab w:val="right" w:pos="9071" w:leader="dot"/>
+            </w:tabs>
+            <w:rPr/>
+          </w:pPr>
+          <w:hyperlink w:anchor="__RefHeading___Toc484_1628147405">
+            <w:r>
+              <w:rPr>
+                <w:webHidden/>
+                <w:rStyle w:val="IndexLink"/>
+                <w:i w:val="false"/>
+              </w:rPr>
+              <w:t>2. Terminology and definitions — decision sought</w:t>
+            </w:r>
+            <w:r>
+              <w:rPr>
+                <w:rStyle w:val="IndexLink"/>
+              </w:rPr>
+              <w:tab/>
+              <w:t>4</w:t>
+            </w:r>
+          </w:hyperlink>
+        </w:p>
+        <w:p>
+          <w:pPr>
+            <w:pStyle w:val="TOC1"/>
+            <w:tabs>
+              <w:tab w:val="clear" w:pos="9072"/>
+              <w:tab w:val="right" w:pos="9071" w:leader="dot"/>
+            </w:tabs>
+            <w:rPr/>
+          </w:pPr>
+          <w:hyperlink w:anchor="__RefHeading___Toc486_1628147405">
+            <w:r>
+              <w:rPr>
+                <w:webHidden/>
+                <w:rStyle w:val="IndexLink"/>
+                <w:i w:val="false"/>
+              </w:rPr>
+              <w:t>3. What already exists</w:t>
+            </w:r>
+            <w:r>
+              <w:rPr>
+                <w:rStyle w:val="IndexLink"/>
+              </w:rPr>
+              <w:tab/>
+              <w:t>6</w:t>
+            </w:r>
+          </w:hyperlink>
+        </w:p>
+        <w:p>
+          <w:pPr>
+            <w:pStyle w:val="TOC1"/>
+            <w:tabs>
+              <w:tab w:val="clear" w:pos="9072"/>
+              <w:tab w:val="right" w:pos="9071" w:leader="dot"/>
+            </w:tabs>
+            <w:rPr/>
+          </w:pPr>
+          <w:hyperlink w:anchor="__RefHeading___Toc488_1628147405">
+            <w:r>
+              <w:rPr>
+                <w:webHidden/>
+                <w:rStyle w:val="IndexLink"/>
+                <w:i w:val="false"/>
+              </w:rPr>
+              <w:t>4. COGCON minimum viable product</w:t>
+            </w:r>
+            <w:r>
+              <w:rPr>
+                <w:rStyle w:val="IndexLink"/>
+              </w:rPr>
+              <w:tab/>
+              <w:t>7</w:t>
+            </w:r>
+          </w:hyperlink>
+        </w:p>
+        <w:p>
+          <w:pPr>
+            <w:pStyle w:val="TOC1"/>
+            <w:tabs>
+              <w:tab w:val="clear" w:pos="9072"/>
+              <w:tab w:val="right" w:pos="9071" w:leader="dot"/>
+            </w:tabs>
+            <w:rPr/>
+          </w:pPr>
+          <w:hyperlink w:anchor="__RefHeading___Toc490_1628147405">
+            <w:r>
+              <w:rPr>
+                <w:webHidden/>
+                <w:rStyle w:val="IndexLink"/>
+                <w:i w:val="false"/>
+              </w:rPr>
+              <w:t>5. Proposed programme of work</w:t>
+            </w:r>
+            <w:r>
+              <w:rPr>
+                <w:rStyle w:val="IndexLink"/>
+              </w:rPr>
+              <w:tab/>
+              <w:t>7</w:t>
+            </w:r>
+          </w:hyperlink>
+        </w:p>
+        <w:p>
+          <w:pPr>
+            <w:pStyle w:val="TOC1"/>
+            <w:tabs>
+              <w:tab w:val="clear" w:pos="9072"/>
+              <w:tab w:val="right" w:pos="9071" w:leader="dot"/>
+            </w:tabs>
+            <w:rPr/>
+          </w:pPr>
+          <w:hyperlink w:anchor="__RefHeading___Toc492_1628147405">
+            <w:r>
+              <w:rPr>
+                <w:webHidden/>
+                <w:rStyle w:val="IndexLink"/>
+                <w:i w:val="false"/>
+              </w:rPr>
+              <w:t>6. Governance</w:t>
+            </w:r>
+            <w:r>
+              <w:rPr>
+                <w:rStyle w:val="IndexLink"/>
+              </w:rPr>
+              <w:tab/>
+              <w:t>9</w:t>
+            </w:r>
+          </w:hyperlink>
+        </w:p>
+        <w:p>
+          <w:pPr>
+            <w:pStyle w:val="TOC1"/>
+            <w:tabs>
+              <w:tab w:val="clear" w:pos="9072"/>
+              <w:tab w:val="right" w:pos="9071" w:leader="dot"/>
+            </w:tabs>
+            <w:rPr/>
+          </w:pPr>
+          <w:hyperlink w:anchor="__RefHeading___Toc494_1628147405">
+            <w:r>
+              <w:rPr>
+                <w:webHidden/>
+                <w:rStyle w:val="IndexLink"/>
+                <w:i w:val="false"/>
+              </w:rPr>
+              <w:t>7. Recommendations</w:t>
+            </w:r>
+            <w:r>
+              <w:rPr>
+                <w:rStyle w:val="IndexLink"/>
+              </w:rPr>
+              <w:tab/>
+              <w:t>9</w:t>
+            </w:r>
+          </w:hyperlink>
+        </w:p>
+        <w:p>
+          <w:pPr>
+            <w:pStyle w:val="TOC1"/>
+            <w:tabs>
+              <w:tab w:val="clear" w:pos="9072"/>
+              <w:tab w:val="right" w:pos="9071" w:leader="dot"/>
+            </w:tabs>
+            <w:rPr/>
+          </w:pPr>
+          <w:hyperlink w:anchor="__RefHeading___Toc496_1628147405">
+            <w:r>
+              <w:rPr>
+                <w:webHidden/>
+                <w:rStyle w:val="IndexLink"/>
+                <w:i w:val="false"/>
+              </w:rPr>
+              <w:t>Annex A — Initial capability and product architecture</w:t>
+            </w:r>
+            <w:r>
+              <w:rPr>
+                <w:rStyle w:val="IndexLink"/>
+              </w:rPr>
+              <w:tab/>
+              <w:t>11</w:t>
+            </w:r>
+          </w:hyperlink>
+          <w:r>
+            <w:rPr>
+              <w:rStyle w:val="IndexLink"/>
+            </w:rPr>
+            <w:fldChar w:fldCharType="end"/>
+          </w:r>
+        </w:p>
+      </w:sdtContent>
+    </w:sdt>
+    <w:p>
+      <w:pPr>
+        <w:pStyle w:val="Normal"/>
+        <w:widowControl/>
+        <w:bidi w:val="0"/>
+        <w:spacing w:lineRule="auto" w:line="276" w:before="0" w:after="120"/>
+        <w:jc w:val="left"/>
+        <w:rPr>
+          <w:rFonts w:ascii="Book Antiqua" w:hAnsi="Book Antiqua" w:cs="Book Antiqua"/>
+          <w:color w:val="000000"/>
+          <w:sz w:val="22"/>
+        </w:rPr>
+      </w:pPr>
+      <w:r>
+        <w:rPr>
+          <w:rFonts w:cs="Book Antiqua"/>
+          <w:color w:val="000000"/>
+          <w:sz w:val="22"/>
+        </w:rPr>
       </w:r>
       <w:r>
         <w:br w:type="page"/>
@@ -287,6 +606,103 @@
         <w:spacing w:before="0" w:after="160"/>
         <w:rPr/>
       </w:pPr>
+      <w:bookmarkStart w:id="0" w:name="__RefHeading___Toc478_1628147405"/>
+      <w:bookmarkEnd w:id="0"/>
+      <w:r>
+        <w:rPr>
+          <w:rFonts w:cs="Arial" w:ascii="Arial" w:hAnsi="Arial"/>
+          <w:b/>
+          <w:i w:val="false"/>
+          <w:color w:val="002516"/>
+          <w:sz w:val="28"/>
+        </w:rPr>
+        <w:t>The Model on a Page</w:t>
+      </w:r>
+    </w:p>
+    <w:p>
+      <w:pPr>
+        <w:pStyle w:val="Normal"/>
+        <w:jc w:val="center"/>
+        <w:rPr/>
+      </w:pPr>
+      <w:r>
+        <w:rPr/>
+        <w:drawing>
+          <wp:inline distT="0" distB="0" distL="0" distR="0">
+            <wp:extent cx="5544185" cy="7565390"/>
+            <wp:effectExtent l="0" t="0" r="0" b="0"/>
+            <wp:docPr id="2" name="Picture 2" descr=""/>
+            <wp:cNvGraphicFramePr>
+              <a:graphicFrameLocks xmlns:a="http://schemas.openxmlformats.org/drawingml/2006/main" noChangeAspect="1"/>
+            </wp:cNvGraphicFramePr>
+            <a:graphic xmlns:a="http://schemas.openxmlformats.org/drawingml/2006/main">
+              <a:graphicData uri="http://schemas.openxmlformats.org/drawingml/2006/picture">
+                <pic:pic xmlns:pic="http://schemas.openxmlformats.org/drawingml/2006/picture">
+                  <pic:nvPicPr>
+                    <pic:cNvPr id="2" name="Picture 2" descr=""/>
+                    <pic:cNvPicPr>
+                      <a:picLocks noChangeAspect="1" noChangeArrowheads="1"/>
+                    </pic:cNvPicPr>
+                  </pic:nvPicPr>
+                  <pic:blipFill>
+                    <a:blip r:embed="rId3"/>
+                    <a:stretch>
+                      <a:fillRect/>
+                    </a:stretch>
+                  </pic:blipFill>
+                  <pic:spPr bwMode="auto">
+                    <a:xfrm>
+                      <a:off x="0" y="0"/>
+                      <a:ext cx="5544185" cy="7565390"/>
+                    </a:xfrm>
+                    <a:prstGeom prst="rect">
+                      <a:avLst/>
+                    </a:prstGeom>
+                  </pic:spPr>
+                </pic:pic>
+              </a:graphicData>
+            </a:graphic>
+          </wp:inline>
+        </w:drawing>
+      </w:r>
+    </w:p>
+    <w:p>
+      <w:pPr>
+        <w:pStyle w:val="Normal"/>
+        <w:rPr/>
+      </w:pPr>
+      <w:r>
+        <w:rPr/>
+      </w:r>
+      <w:r>
+        <w:br w:type="page"/>
+      </w:r>
+    </w:p>
+    <w:p>
+      <w:pPr>
+        <w:pStyle w:val="Normal"/>
+        <w:spacing w:before="0" w:after="120"/>
+        <w:rPr/>
+      </w:pPr>
+      <w:r>
+        <w:rPr>
+          <w:rFonts w:cs="Book Antiqua"/>
+          <w:b w:val="false"/>
+          <w:i w:val="false"/>
+        </w:rPr>
+        <w:t>*Joint NZALC and Human Performance Cell response to COMDT ACS*</w:t>
+      </w:r>
+    </w:p>
+    <w:p>
+      <w:pPr>
+        <w:pStyle w:val="Heading1"/>
+        <w:pBdr>
+          <w:left w:val="single" w:sz="24" w:space="8" w:color="C62026"/>
+        </w:pBdr>
+        <w:rPr/>
+      </w:pPr>
+      <w:bookmarkStart w:id="1" w:name="__RefHeading___Toc480_1628147405"/>
+      <w:bookmarkEnd w:id="1"/>
       <w:r>
         <w:rPr>
           <w:rFonts w:cs="Arial" w:ascii="Arial" w:hAnsi="Arial"/>
@@ -333,6 +749,8 @@
         </w:pBdr>
         <w:rPr/>
       </w:pPr>
+      <w:bookmarkStart w:id="2" w:name="__RefHeading___Toc482_1628147405"/>
+      <w:bookmarkEnd w:id="2"/>
       <w:r>
         <w:rPr>
           <w:rFonts w:cs="Arial" w:ascii="Arial" w:hAnsi="Arial"/>
@@ -453,6 +871,8 @@
         </w:pBdr>
         <w:rPr/>
       </w:pPr>
+      <w:bookmarkStart w:id="3" w:name="__RefHeading___Toc484_1628147405"/>
+      <w:bookmarkEnd w:id="3"/>
       <w:r>
         <w:rPr>
           <w:rFonts w:cs="Arial" w:ascii="Arial" w:hAnsi="Arial"/>
@@ -995,6 +1415,8 @@
         </w:pBdr>
         <w:rPr/>
       </w:pPr>
+      <w:bookmarkStart w:id="4" w:name="__RefHeading___Toc486_1628147405"/>
+      <w:bookmarkEnd w:id="4"/>
       <w:r>
         <w:rPr>
           <w:rFonts w:cs="Arial" w:ascii="Arial" w:hAnsi="Arial"/>
@@ -1159,6 +1581,8 @@
         </w:pBdr>
         <w:rPr/>
       </w:pPr>
+      <w:bookmarkStart w:id="5" w:name="__RefHeading___Toc488_1628147405"/>
+      <w:bookmarkEnd w:id="5"/>
       <w:r>
         <w:rPr>
           <w:rFonts w:cs="Arial" w:ascii="Arial" w:hAnsi="Arial"/>
@@ -1715,6 +2139,8 @@
         </w:pBdr>
         <w:rPr/>
       </w:pPr>
+      <w:bookmarkStart w:id="6" w:name="__RefHeading___Toc490_1628147405"/>
+      <w:bookmarkEnd w:id="6"/>
       <w:r>
         <w:rPr>
           <w:rFonts w:cs="Arial" w:ascii="Arial" w:hAnsi="Arial"/>
@@ -2213,6 +2639,8 @@
         </w:pBdr>
         <w:rPr/>
       </w:pPr>
+      <w:bookmarkStart w:id="7" w:name="__RefHeading___Toc492_1628147405"/>
+      <w:bookmarkEnd w:id="7"/>
       <w:r>
         <w:rPr>
           <w:rFonts w:cs="Arial" w:ascii="Arial" w:hAnsi="Arial"/>
@@ -2511,6 +2939,8 @@
         </w:pBdr>
         <w:rPr/>
       </w:pPr>
+      <w:bookmarkStart w:id="8" w:name="__RefHeading___Toc494_1628147405"/>
+      <w:bookmarkEnd w:id="8"/>
       <w:r>
         <w:rPr>
           <w:rFonts w:cs="Arial" w:ascii="Arial" w:hAnsi="Arial"/>
@@ -2890,6 +3320,8 @@
         <w:spacing w:before="0" w:after="160"/>
         <w:rPr/>
       </w:pPr>
+      <w:bookmarkStart w:id="9" w:name="__RefHeading___Toc496_1628147405"/>
+      <w:bookmarkEnd w:id="9"/>
       <w:r>
         <w:rPr>
           <w:rFonts w:cs="Arial" w:ascii="Arial" w:hAnsi="Arial"/>
@@ -5112,12 +5544,12 @@
       </w:r>
     </w:p>
     <w:sectPr>
-      <w:headerReference w:type="even" r:id="rId3"/>
-      <w:headerReference w:type="default" r:id="rId4"/>
-      <w:headerReference w:type="first" r:id="rId5"/>
-      <w:footerReference w:type="even" r:id="rId6"/>
-      <w:footerReference w:type="default" r:id="rId7"/>
-      <w:footerReference w:type="first" r:id="rId8"/>
+      <w:headerReference w:type="even" r:id="rId4"/>
+      <w:headerReference w:type="default" r:id="rId5"/>
+      <w:headerReference w:type="first" r:id="rId6"/>
+      <w:footerReference w:type="even" r:id="rId7"/>
+      <w:footerReference w:type="default" r:id="rId8"/>
+      <w:footerReference w:type="first" r:id="rId9"/>
       <w:type w:val="nextPage"/>
       <w:pgSz w:w="11906" w:h="16838"/>
       <w:pgMar w:left="1417" w:right="1417" w:gutter="0" w:header="624" w:top="1361" w:footer="624" w:bottom="1361"/>
@@ -5184,7 +5616,7 @@
       </w:rPr>
       <w:t>Combat Mindset — Proposed Way Forward</w:t>
       <w:tab/>
-      <w:t>NZALC/HPC 2026</w:t>
+      <w:t>ACS 2026</w:t>
       <w:tab/>
       <w:t xml:space="preserve">Page </w:t>
     </w:r>
@@ -5214,7 +5646,7 @@
         <w:sz w:val="17"/>
         <w:rFonts w:cs="Arial" w:ascii="Arial" w:hAnsi="Arial"/>
       </w:rPr>
-      <w:t>11</w:t>
+      <w:t>13</w:t>
     </w:r>
     <w:r>
       <w:rPr>
@@ -5258,7 +5690,7 @@
         <w:sz w:val="17"/>
         <w:rFonts w:cs="Arial" w:ascii="Arial" w:hAnsi="Arial"/>
       </w:rPr>
-      <w:t>11</w:t>
+      <w:t>13</w:t>
     </w:r>
     <w:r>
       <w:rPr>
@@ -5575,6 +6007,18 @@
     <w:qFormat/>
     <w:rPr/>
   </w:style>
+  <w:style w:type="character" w:styleId="Hyperlink">
+    <w:name w:val="Hyperlink"/>
+    <w:rPr>
+      <w:color w:val="000080"/>
+      <w:u w:val="single"/>
+    </w:rPr>
+  </w:style>
+  <w:style w:type="character" w:styleId="IndexLink">
+    <w:name w:val="Index Link"/>
+    <w:qFormat/>
+    <w:rPr/>
+  </w:style>
   <w:style w:type="paragraph" w:styleId="Heading">
     <w:name w:val="Heading"/>
     <w:basedOn w:val="Normal"/>
@@ -5669,6 +6113,18 @@
         <w:tab w:val="right" w:pos="9360" w:leader="none"/>
       </w:tabs>
       <w:spacing w:lineRule="auto" w:line="240" w:before="0" w:after="0"/>
+    </w:pPr>
+    <w:rPr/>
+  </w:style>
+  <w:style w:type="paragraph" w:styleId="TOC1">
+    <w:name w:val="TOC 1"/>
+    <w:basedOn w:val="Index"/>
+    <w:pPr>
+      <w:tabs>
+        <w:tab w:val="clear" w:pos="720"/>
+        <w:tab w:val="right" w:pos="9072" w:leader="dot"/>
+      </w:tabs>
+      <w:ind w:hanging="0" w:left="0"/>
     </w:pPr>
     <w:rPr/>
   </w:style>

</xml_diff>

<commit_message>
Cover tagline wording and colon-style phase headings
- Cover page: "Proposed Warfighter Focus tagline" (was "Focus line"),
  matching Section 2; same fix on the landscape one-pager
- Phase headings use military phasing colons (Phase 0: ...) instead of
  em dashes, Phases 0-4

Co-Authored-By: Claude Fable 5 <noreply@anthropic.com>
Claude-Session: https://claude.ai/code/session_01YLo1WfwUDkbwfJEF3ZNVbB
</commit_message>
<xml_diff>
--- a/output/combat-mindset-way-forward.docx
+++ b/output/combat-mindset-way-forward.docx
@@ -112,7 +112,7 @@
           <w:color w:val="002516"/>
           <w:sz w:val="18"/>
         </w:rPr>
-        <w:t>Proposed Warfighter Focus line — subject to sponsor endorsement</w:t>
+        <w:t>Proposed Warfighter Focus tagline — subject to sponsor endorsement</w:t>
       </w:r>
     </w:p>
     <w:p>
@@ -304,7 +304,7 @@
             </w:rPr>
             <w:fldChar w:fldCharType="separate"/>
           </w:r>
-          <w:hyperlink w:anchor="__RefHeading___Toc348_1061449343">
+          <w:hyperlink w:anchor="__RefHeading___Toc348_3589879323">
             <w:r>
               <w:rPr>
                 <w:webHidden/>
@@ -331,7 +331,7 @@
             </w:tabs>
             <w:rPr/>
           </w:pPr>
-          <w:hyperlink w:anchor="__RefHeading___Toc350_1061449343">
+          <w:hyperlink w:anchor="__RefHeading___Toc350_3589879323">
             <w:r>
               <w:rPr>
                 <w:webHidden/>
@@ -358,7 +358,7 @@
             </w:tabs>
             <w:rPr/>
           </w:pPr>
-          <w:hyperlink w:anchor="__RefHeading___Toc352_1061449343">
+          <w:hyperlink w:anchor="__RefHeading___Toc352_3589879323">
             <w:r>
               <w:rPr>
                 <w:webHidden/>
@@ -385,7 +385,7 @@
             </w:tabs>
             <w:rPr/>
           </w:pPr>
-          <w:hyperlink w:anchor="__RefHeading___Toc354_1061449343">
+          <w:hyperlink w:anchor="__RefHeading___Toc354_3589879323">
             <w:r>
               <w:rPr>
                 <w:webHidden/>
@@ -412,7 +412,7 @@
             </w:tabs>
             <w:rPr/>
           </w:pPr>
-          <w:hyperlink w:anchor="__RefHeading___Toc356_1061449343">
+          <w:hyperlink w:anchor="__RefHeading___Toc356_3589879323">
             <w:r>
               <w:rPr>
                 <w:webHidden/>
@@ -439,7 +439,7 @@
             </w:tabs>
             <w:rPr/>
           </w:pPr>
-          <w:hyperlink w:anchor="__RefHeading___Toc358_1061449343">
+          <w:hyperlink w:anchor="__RefHeading___Toc358_3589879323">
             <w:r>
               <w:rPr>
                 <w:webHidden/>
@@ -466,7 +466,7 @@
             </w:tabs>
             <w:rPr/>
           </w:pPr>
-          <w:hyperlink w:anchor="__RefHeading___Toc360_1061449343">
+          <w:hyperlink w:anchor="__RefHeading___Toc360_3589879323">
             <w:r>
               <w:rPr>
                 <w:webHidden/>
@@ -493,7 +493,7 @@
             </w:tabs>
             <w:rPr/>
           </w:pPr>
-          <w:hyperlink w:anchor="__RefHeading___Toc362_1061449343">
+          <w:hyperlink w:anchor="__RefHeading___Toc362_3589879323">
             <w:r>
               <w:rPr>
                 <w:webHidden/>
@@ -520,7 +520,7 @@
             </w:tabs>
             <w:rPr/>
           </w:pPr>
-          <w:hyperlink w:anchor="__RefHeading___Toc364_1061449343">
+          <w:hyperlink w:anchor="__RefHeading___Toc364_3589879323">
             <w:r>
               <w:rPr>
                 <w:webHidden/>
@@ -579,7 +579,7 @@
         <w:spacing w:before="0" w:after="160"/>
         <w:rPr/>
       </w:pPr>
-      <w:bookmarkStart w:id="0" w:name="__RefHeading___Toc348_1061449343"/>
+      <w:bookmarkStart w:id="0" w:name="__RefHeading___Toc348_3589879323"/>
       <w:bookmarkEnd w:id="0"/>
       <w:r>
         <w:rPr>
@@ -660,7 +660,7 @@
         <w:spacing w:before="0" w:after="160"/>
         <w:rPr/>
       </w:pPr>
-      <w:bookmarkStart w:id="1" w:name="__RefHeading___Toc350_1061449343"/>
+      <w:bookmarkStart w:id="1" w:name="__RefHeading___Toc350_3589879323"/>
       <w:bookmarkEnd w:id="1"/>
       <w:r>
         <w:rPr>
@@ -708,7 +708,7 @@
         </w:pBdr>
         <w:rPr/>
       </w:pPr>
-      <w:bookmarkStart w:id="2" w:name="__RefHeading___Toc352_1061449343"/>
+      <w:bookmarkStart w:id="2" w:name="__RefHeading___Toc352_3589879323"/>
       <w:bookmarkEnd w:id="2"/>
       <w:r>
         <w:rPr>
@@ -830,7 +830,7 @@
         </w:pBdr>
         <w:rPr/>
       </w:pPr>
-      <w:bookmarkStart w:id="3" w:name="__RefHeading___Toc354_1061449343"/>
+      <w:bookmarkStart w:id="3" w:name="__RefHeading___Toc354_3589879323"/>
       <w:bookmarkEnd w:id="3"/>
       <w:r>
         <w:rPr>
@@ -1374,7 +1374,7 @@
         </w:pBdr>
         <w:rPr/>
       </w:pPr>
-      <w:bookmarkStart w:id="4" w:name="__RefHeading___Toc356_1061449343"/>
+      <w:bookmarkStart w:id="4" w:name="__RefHeading___Toc356_3589879323"/>
       <w:bookmarkEnd w:id="4"/>
       <w:r>
         <w:rPr>
@@ -1540,7 +1540,7 @@
         </w:pBdr>
         <w:rPr/>
       </w:pPr>
-      <w:bookmarkStart w:id="5" w:name="__RefHeading___Toc358_1061449343"/>
+      <w:bookmarkStart w:id="5" w:name="__RefHeading___Toc358_3589879323"/>
       <w:bookmarkEnd w:id="5"/>
       <w:r>
         <w:rPr>
@@ -1566,7 +1566,7 @@
           <w:color w:val="000000"/>
           <w:sz w:val="22"/>
         </w:rPr>
-        <w:t>Phase 0 — Governance and definition (by end July 2026)</w:t>
+        <w:t>Phase 0: Governance and definition (by end July 2026)</w:t>
       </w:r>
     </w:p>
     <w:p>
@@ -1596,7 +1596,7 @@
           <w:color w:val="000000"/>
           <w:sz w:val="22"/>
         </w:rPr>
-        <w:t>Phase 1 — Capability and product stocktake (August 2026)</w:t>
+        <w:t>Phase 1: Capability and product stocktake (August 2026)</w:t>
       </w:r>
     </w:p>
     <w:p>
@@ -1928,7 +1928,7 @@
           <w:color w:val="000000"/>
           <w:sz w:val="22"/>
         </w:rPr>
-        <w:t>Phase 2 — Framework and product architecture (September 2026)</w:t>
+        <w:t>Phase 2: Framework and product architecture (September 2026)</w:t>
       </w:r>
     </w:p>
     <w:p>
@@ -1972,7 +1972,7 @@
           <w:color w:val="000000"/>
           <w:sz w:val="22"/>
         </w:rPr>
-        <w:t>Phase 3 — Stakeholder forum (September 2026)</w:t>
+        <w:t>Phase 3: Stakeholder forum (September 2026)</w:t>
       </w:r>
     </w:p>
     <w:p>
@@ -2002,7 +2002,7 @@
           <w:color w:val="000000"/>
           <w:sz w:val="22"/>
         </w:rPr>
-        <w:t>Phase 4 — Report back (November 2026)</w:t>
+        <w:t>Phase 4: Report back (November 2026)</w:t>
       </w:r>
     </w:p>
     <w:p>
@@ -2040,7 +2040,7 @@
         </w:pBdr>
         <w:rPr/>
       </w:pPr>
-      <w:bookmarkStart w:id="6" w:name="__RefHeading___Toc360_1061449343"/>
+      <w:bookmarkStart w:id="6" w:name="__RefHeading___Toc360_3589879323"/>
       <w:bookmarkEnd w:id="6"/>
       <w:r>
         <w:rPr>
@@ -2340,7 +2340,7 @@
         </w:pBdr>
         <w:rPr/>
       </w:pPr>
-      <w:bookmarkStart w:id="7" w:name="__RefHeading___Toc362_1061449343"/>
+      <w:bookmarkStart w:id="7" w:name="__RefHeading___Toc362_3589879323"/>
       <w:bookmarkEnd w:id="7"/>
       <w:r>
         <w:rPr>
@@ -2721,7 +2721,7 @@
         <w:spacing w:before="0" w:after="160"/>
         <w:rPr/>
       </w:pPr>
-      <w:bookmarkStart w:id="8" w:name="__RefHeading___Toc364_1061449343"/>
+      <w:bookmarkStart w:id="8" w:name="__RefHeading___Toc364_3589879323"/>
       <w:bookmarkEnd w:id="8"/>
       <w:r>
         <w:rPr>

</xml_diff>

<commit_message>
Cover hero title: Combat Mindset over subordinate Proposed Way Forward
Combat Mindset now sits alone at 36pt as the cover hero, with Proposed
Way Forward in smaller bold swamp green beneath it, above the Army Red
rule. Running headers keep the full title.

Co-Authored-By: Claude Fable 5 <noreply@anthropic.com>
Claude-Session: https://claude.ai/code/session_01YLo1WfwUDkbwfJEF3ZNVbB
</commit_message>
<xml_diff>
--- a/output/combat-mindset-way-forward.docx
+++ b/output/combat-mindset-way-forward.docx
@@ -52,6 +52,22 @@
     <w:p>
       <w:pPr>
         <w:pStyle w:val="Normal"/>
+        <w:spacing w:before="0" w:after="40"/>
+        <w:rPr/>
+      </w:pPr>
+      <w:r>
+        <w:rPr>
+          <w:rFonts w:cs="Arial" w:ascii="Arial" w:hAnsi="Arial"/>
+          <w:b/>
+          <w:color w:val="000000"/>
+          <w:sz w:val="72"/>
+        </w:rPr>
+        <w:t>Combat Mindset</w:t>
+      </w:r>
+    </w:p>
+    <w:p>
+      <w:pPr>
+        <w:pStyle w:val="Normal"/>
         <w:pBdr>
           <w:bottom w:val="single" w:sz="20" w:space="10" w:color="C62026"/>
         </w:pBdr>
@@ -62,10 +78,10 @@
         <w:rPr>
           <w:rFonts w:cs="Arial" w:ascii="Arial" w:hAnsi="Arial"/>
           <w:b/>
-          <w:color w:val="000000"/>
-          <w:sz w:val="52"/>
-        </w:rPr>
-        <w:t>Combat Mindset — Proposed Way Forward</w:t>
+          <w:color w:val="002516"/>
+          <w:sz w:val="34"/>
+        </w:rPr>
+        <w:t>Proposed Way Forward</w:t>
       </w:r>
     </w:p>
     <w:p>
@@ -304,7 +320,7 @@
             </w:rPr>
             <w:fldChar w:fldCharType="separate"/>
           </w:r>
-          <w:hyperlink w:anchor="__RefHeading___Toc348_3589879323">
+          <w:hyperlink w:anchor="__RefHeading___Toc349_2248940240">
             <w:r>
               <w:rPr>
                 <w:webHidden/>
@@ -331,7 +347,7 @@
             </w:tabs>
             <w:rPr/>
           </w:pPr>
-          <w:hyperlink w:anchor="__RefHeading___Toc350_3589879323">
+          <w:hyperlink w:anchor="__RefHeading___Toc351_2248940240">
             <w:r>
               <w:rPr>
                 <w:webHidden/>
@@ -358,7 +374,7 @@
             </w:tabs>
             <w:rPr/>
           </w:pPr>
-          <w:hyperlink w:anchor="__RefHeading___Toc352_3589879323">
+          <w:hyperlink w:anchor="__RefHeading___Toc353_2248940240">
             <w:r>
               <w:rPr>
                 <w:webHidden/>
@@ -385,7 +401,7 @@
             </w:tabs>
             <w:rPr/>
           </w:pPr>
-          <w:hyperlink w:anchor="__RefHeading___Toc354_3589879323">
+          <w:hyperlink w:anchor="__RefHeading___Toc355_2248940240">
             <w:r>
               <w:rPr>
                 <w:webHidden/>
@@ -412,7 +428,7 @@
             </w:tabs>
             <w:rPr/>
           </w:pPr>
-          <w:hyperlink w:anchor="__RefHeading___Toc356_3589879323">
+          <w:hyperlink w:anchor="__RefHeading___Toc357_2248940240">
             <w:r>
               <w:rPr>
                 <w:webHidden/>
@@ -439,7 +455,7 @@
             </w:tabs>
             <w:rPr/>
           </w:pPr>
-          <w:hyperlink w:anchor="__RefHeading___Toc358_3589879323">
+          <w:hyperlink w:anchor="__RefHeading___Toc359_2248940240">
             <w:r>
               <w:rPr>
                 <w:webHidden/>
@@ -466,7 +482,7 @@
             </w:tabs>
             <w:rPr/>
           </w:pPr>
-          <w:hyperlink w:anchor="__RefHeading___Toc360_3589879323">
+          <w:hyperlink w:anchor="__RefHeading___Toc361_2248940240">
             <w:r>
               <w:rPr>
                 <w:webHidden/>
@@ -493,7 +509,7 @@
             </w:tabs>
             <w:rPr/>
           </w:pPr>
-          <w:hyperlink w:anchor="__RefHeading___Toc362_3589879323">
+          <w:hyperlink w:anchor="__RefHeading___Toc363_2248940240">
             <w:r>
               <w:rPr>
                 <w:webHidden/>
@@ -520,7 +536,7 @@
             </w:tabs>
             <w:rPr/>
           </w:pPr>
-          <w:hyperlink w:anchor="__RefHeading___Toc364_3589879323">
+          <w:hyperlink w:anchor="__RefHeading___Toc365_2248940240">
             <w:r>
               <w:rPr>
                 <w:webHidden/>
@@ -579,7 +595,7 @@
         <w:spacing w:before="0" w:after="160"/>
         <w:rPr/>
       </w:pPr>
-      <w:bookmarkStart w:id="0" w:name="__RefHeading___Toc348_3589879323"/>
+      <w:bookmarkStart w:id="0" w:name="__RefHeading___Toc349_2248940240"/>
       <w:bookmarkEnd w:id="0"/>
       <w:r>
         <w:rPr>
@@ -660,7 +676,7 @@
         <w:spacing w:before="0" w:after="160"/>
         <w:rPr/>
       </w:pPr>
-      <w:bookmarkStart w:id="1" w:name="__RefHeading___Toc350_3589879323"/>
+      <w:bookmarkStart w:id="1" w:name="__RefHeading___Toc351_2248940240"/>
       <w:bookmarkEnd w:id="1"/>
       <w:r>
         <w:rPr>
@@ -708,7 +724,7 @@
         </w:pBdr>
         <w:rPr/>
       </w:pPr>
-      <w:bookmarkStart w:id="2" w:name="__RefHeading___Toc352_3589879323"/>
+      <w:bookmarkStart w:id="2" w:name="__RefHeading___Toc353_2248940240"/>
       <w:bookmarkEnd w:id="2"/>
       <w:r>
         <w:rPr>
@@ -830,7 +846,7 @@
         </w:pBdr>
         <w:rPr/>
       </w:pPr>
-      <w:bookmarkStart w:id="3" w:name="__RefHeading___Toc354_3589879323"/>
+      <w:bookmarkStart w:id="3" w:name="__RefHeading___Toc355_2248940240"/>
       <w:bookmarkEnd w:id="3"/>
       <w:r>
         <w:rPr>
@@ -1374,7 +1390,7 @@
         </w:pBdr>
         <w:rPr/>
       </w:pPr>
-      <w:bookmarkStart w:id="4" w:name="__RefHeading___Toc356_3589879323"/>
+      <w:bookmarkStart w:id="4" w:name="__RefHeading___Toc357_2248940240"/>
       <w:bookmarkEnd w:id="4"/>
       <w:r>
         <w:rPr>
@@ -1540,7 +1556,7 @@
         </w:pBdr>
         <w:rPr/>
       </w:pPr>
-      <w:bookmarkStart w:id="5" w:name="__RefHeading___Toc358_3589879323"/>
+      <w:bookmarkStart w:id="5" w:name="__RefHeading___Toc359_2248940240"/>
       <w:bookmarkEnd w:id="5"/>
       <w:r>
         <w:rPr>
@@ -2040,7 +2056,7 @@
         </w:pBdr>
         <w:rPr/>
       </w:pPr>
-      <w:bookmarkStart w:id="6" w:name="__RefHeading___Toc360_3589879323"/>
+      <w:bookmarkStart w:id="6" w:name="__RefHeading___Toc361_2248940240"/>
       <w:bookmarkEnd w:id="6"/>
       <w:r>
         <w:rPr>
@@ -2340,7 +2356,7 @@
         </w:pBdr>
         <w:rPr/>
       </w:pPr>
-      <w:bookmarkStart w:id="7" w:name="__RefHeading___Toc362_3589879323"/>
+      <w:bookmarkStart w:id="7" w:name="__RefHeading___Toc363_2248940240"/>
       <w:bookmarkEnd w:id="7"/>
       <w:r>
         <w:rPr>
@@ -2721,7 +2737,7 @@
         <w:spacing w:before="0" w:after="160"/>
         <w:rPr/>
       </w:pPr>
-      <w:bookmarkStart w:id="8" w:name="__RefHeading___Toc364_3589879323"/>
+      <w:bookmarkStart w:id="8" w:name="__RefHeading___Toc365_2248940240"/>
       <w:bookmarkEnd w:id="8"/>
       <w:r>
         <w:rPr>

</xml_diff>

<commit_message>
Model on a Page declutter: banners, rules and qualifier removed
Removed UNCLASSIFIED banners and black bars, header subtitle and rule,
connector side-rules, tagline qualifier and all rendered em dashes
(phase titles use colons; PUP products use parentheses). Three feature
cards now centre their headings and supporting text with icons kept
left; crosshair moved to the left of the Combat Mindset card; PUP
supporting line simplified to Prepare - Perform - Recover. Paper embed
regenerated.

Co-Authored-By: Claude Fable 5 <noreply@anthropic.com>
Claude-Session: https://claude.ai/code/session_01YLo1WfwUDkbwfJEF3ZNVbB
</commit_message>
<xml_diff>
--- a/output/combat-mindset-way-forward.docx
+++ b/output/combat-mindset-way-forward.docx
@@ -320,7 +320,7 @@
             </w:rPr>
             <w:fldChar w:fldCharType="separate"/>
           </w:r>
-          <w:hyperlink w:anchor="__RefHeading___Toc386_95378546">
+          <w:hyperlink w:anchor="__RefHeading___Toc386_3964410391">
             <w:r>
               <w:rPr>
                 <w:webHidden/>
@@ -347,7 +347,7 @@
             </w:tabs>
             <w:rPr/>
           </w:pPr>
-          <w:hyperlink w:anchor="__RefHeading___Toc388_95378546">
+          <w:hyperlink w:anchor="__RefHeading___Toc388_3964410391">
             <w:r>
               <w:rPr>
                 <w:webHidden/>
@@ -374,7 +374,7 @@
             </w:tabs>
             <w:rPr/>
           </w:pPr>
-          <w:hyperlink w:anchor="__RefHeading___Toc390_95378546">
+          <w:hyperlink w:anchor="__RefHeading___Toc390_3964410391">
             <w:r>
               <w:rPr>
                 <w:webHidden/>
@@ -401,7 +401,7 @@
             </w:tabs>
             <w:rPr/>
           </w:pPr>
-          <w:hyperlink w:anchor="__RefHeading___Toc392_95378546">
+          <w:hyperlink w:anchor="__RefHeading___Toc392_3964410391">
             <w:r>
               <w:rPr>
                 <w:webHidden/>
@@ -428,7 +428,7 @@
             </w:tabs>
             <w:rPr/>
           </w:pPr>
-          <w:hyperlink w:anchor="__RefHeading___Toc394_95378546">
+          <w:hyperlink w:anchor="__RefHeading___Toc394_3964410391">
             <w:r>
               <w:rPr>
                 <w:webHidden/>
@@ -455,7 +455,7 @@
             </w:tabs>
             <w:rPr/>
           </w:pPr>
-          <w:hyperlink w:anchor="__RefHeading___Toc396_95378546">
+          <w:hyperlink w:anchor="__RefHeading___Toc396_3964410391">
             <w:r>
               <w:rPr>
                 <w:webHidden/>
@@ -482,7 +482,7 @@
             </w:tabs>
             <w:rPr/>
           </w:pPr>
-          <w:hyperlink w:anchor="__RefHeading___Toc398_95378546">
+          <w:hyperlink w:anchor="__RefHeading___Toc398_3964410391">
             <w:r>
               <w:rPr>
                 <w:webHidden/>
@@ -509,7 +509,7 @@
             </w:tabs>
             <w:rPr/>
           </w:pPr>
-          <w:hyperlink w:anchor="__RefHeading___Toc400_95378546">
+          <w:hyperlink w:anchor="__RefHeading___Toc400_3964410391">
             <w:r>
               <w:rPr>
                 <w:webHidden/>
@@ -536,7 +536,7 @@
             </w:tabs>
             <w:rPr/>
           </w:pPr>
-          <w:hyperlink w:anchor="__RefHeading___Toc402_95378546">
+          <w:hyperlink w:anchor="__RefHeading___Toc402_3964410391">
             <w:r>
               <w:rPr>
                 <w:webHidden/>
@@ -563,7 +563,7 @@
             </w:tabs>
             <w:rPr/>
           </w:pPr>
-          <w:hyperlink w:anchor="__RefHeading___Toc404_95378546">
+          <w:hyperlink w:anchor="__RefHeading___Toc404_3964410391">
             <w:r>
               <w:rPr>
                 <w:webHidden/>
@@ -618,7 +618,7 @@
         <w:spacing w:before="0" w:after="160"/>
         <w:rPr/>
       </w:pPr>
-      <w:bookmarkStart w:id="0" w:name="__RefHeading___Toc386_95378546"/>
+      <w:bookmarkStart w:id="0" w:name="__RefHeading___Toc386_3964410391"/>
       <w:bookmarkEnd w:id="0"/>
       <w:r>
         <w:rPr>
@@ -700,7 +700,7 @@
         </w:pBdr>
         <w:rPr/>
       </w:pPr>
-      <w:bookmarkStart w:id="1" w:name="__RefHeading___Toc388_95378546"/>
+      <w:bookmarkStart w:id="1" w:name="__RefHeading___Toc388_3964410391"/>
       <w:bookmarkEnd w:id="1"/>
       <w:r>
         <w:rPr>
@@ -762,7 +762,7 @@
         </w:pBdr>
         <w:rPr/>
       </w:pPr>
-      <w:bookmarkStart w:id="2" w:name="__RefHeading___Toc390_95378546"/>
+      <w:bookmarkStart w:id="2" w:name="__RefHeading___Toc390_3964410391"/>
       <w:bookmarkEnd w:id="2"/>
       <w:r>
         <w:rPr>
@@ -870,7 +870,7 @@
         </w:pBdr>
         <w:rPr/>
       </w:pPr>
-      <w:bookmarkStart w:id="3" w:name="__RefHeading___Toc392_95378546"/>
+      <w:bookmarkStart w:id="3" w:name="__RefHeading___Toc392_3964410391"/>
       <w:bookmarkEnd w:id="3"/>
       <w:r>
         <w:rPr>
@@ -1428,7 +1428,7 @@
         </w:pBdr>
         <w:rPr/>
       </w:pPr>
-      <w:bookmarkStart w:id="4" w:name="__RefHeading___Toc394_95378546"/>
+      <w:bookmarkStart w:id="4" w:name="__RefHeading___Toc394_3964410391"/>
       <w:bookmarkEnd w:id="4"/>
       <w:r>
         <w:rPr>
@@ -1594,7 +1594,7 @@
         </w:pBdr>
         <w:rPr/>
       </w:pPr>
-      <w:bookmarkStart w:id="5" w:name="__RefHeading___Toc396_95378546"/>
+      <w:bookmarkStart w:id="5" w:name="__RefHeading___Toc396_3964410391"/>
       <w:bookmarkEnd w:id="5"/>
       <w:r>
         <w:rPr>
@@ -2476,7 +2476,7 @@
         </w:pBdr>
         <w:rPr/>
       </w:pPr>
-      <w:bookmarkStart w:id="6" w:name="__RefHeading___Toc398_95378546"/>
+      <w:bookmarkStart w:id="6" w:name="__RefHeading___Toc398_3964410391"/>
       <w:bookmarkEnd w:id="6"/>
       <w:r>
         <w:rPr>
@@ -2776,7 +2776,7 @@
         </w:pBdr>
         <w:rPr/>
       </w:pPr>
-      <w:bookmarkStart w:id="7" w:name="__RefHeading___Toc400_95378546"/>
+      <w:bookmarkStart w:id="7" w:name="__RefHeading___Toc400_3964410391"/>
       <w:bookmarkEnd w:id="7"/>
       <w:r>
         <w:rPr>
@@ -3078,7 +3078,7 @@
         <w:spacing w:before="0" w:after="160"/>
         <w:rPr/>
       </w:pPr>
-      <w:bookmarkStart w:id="8" w:name="__RefHeading___Toc402_95378546"/>
+      <w:bookmarkStart w:id="8" w:name="__RefHeading___Toc402_3964410391"/>
       <w:bookmarkEnd w:id="8"/>
       <w:r>
         <w:rPr>
@@ -3235,7 +3235,7 @@
         </w:pBdr>
         <w:rPr/>
       </w:pPr>
-      <w:bookmarkStart w:id="9" w:name="__RefHeading___Toc404_95378546"/>
+      <w:bookmarkStart w:id="9" w:name="__RefHeading___Toc404_3964410391"/>
       <w:bookmarkEnd w:id="9"/>
       <w:r>
         <w:rPr>

</xml_diff>

<commit_message>
Way-forward page restructure: four-level hierarchy plus companion page
Page 1 now carries only the core idea: Combat Mindset banner,
Performance Under Pressure (Prepare, Perform, Recover), the Army
Combat Mindset Framework, and a full-width five-phase Framework
Development Programme pathway (0 Define and govern through 4 Endorse
and implement). Governance & Assurance and Current Delivery System
move to a new second page, Current System, Governance and Delivery,
at full size. Paper embed updated to the new page 1.

Co-Authored-By: Claude Fable 5 <noreply@anthropic.com>
Claude-Session: https://claude.ai/code/session_01YLo1WfwUDkbwfJEF3ZNVbB
</commit_message>
<xml_diff>
--- a/output/combat-mindset-way-forward.docx
+++ b/output/combat-mindset-way-forward.docx
@@ -320,7 +320,7 @@
             </w:rPr>
             <w:fldChar w:fldCharType="separate"/>
           </w:r>
-          <w:hyperlink w:anchor="__RefHeading___Toc386_3964410391">
+          <w:hyperlink w:anchor="__RefHeading___Toc386_2946661499">
             <w:r>
               <w:rPr>
                 <w:webHidden/>
@@ -347,7 +347,7 @@
             </w:tabs>
             <w:rPr/>
           </w:pPr>
-          <w:hyperlink w:anchor="__RefHeading___Toc388_3964410391">
+          <w:hyperlink w:anchor="__RefHeading___Toc388_2946661499">
             <w:r>
               <w:rPr>
                 <w:webHidden/>
@@ -374,7 +374,7 @@
             </w:tabs>
             <w:rPr/>
           </w:pPr>
-          <w:hyperlink w:anchor="__RefHeading___Toc390_3964410391">
+          <w:hyperlink w:anchor="__RefHeading___Toc390_2946661499">
             <w:r>
               <w:rPr>
                 <w:webHidden/>
@@ -401,7 +401,7 @@
             </w:tabs>
             <w:rPr/>
           </w:pPr>
-          <w:hyperlink w:anchor="__RefHeading___Toc392_3964410391">
+          <w:hyperlink w:anchor="__RefHeading___Toc392_2946661499">
             <w:r>
               <w:rPr>
                 <w:webHidden/>
@@ -428,7 +428,7 @@
             </w:tabs>
             <w:rPr/>
           </w:pPr>
-          <w:hyperlink w:anchor="__RefHeading___Toc394_3964410391">
+          <w:hyperlink w:anchor="__RefHeading___Toc394_2946661499">
             <w:r>
               <w:rPr>
                 <w:webHidden/>
@@ -455,7 +455,7 @@
             </w:tabs>
             <w:rPr/>
           </w:pPr>
-          <w:hyperlink w:anchor="__RefHeading___Toc396_3964410391">
+          <w:hyperlink w:anchor="__RefHeading___Toc396_2946661499">
             <w:r>
               <w:rPr>
                 <w:webHidden/>
@@ -482,7 +482,7 @@
             </w:tabs>
             <w:rPr/>
           </w:pPr>
-          <w:hyperlink w:anchor="__RefHeading___Toc398_3964410391">
+          <w:hyperlink w:anchor="__RefHeading___Toc398_2946661499">
             <w:r>
               <w:rPr>
                 <w:webHidden/>
@@ -509,7 +509,7 @@
             </w:tabs>
             <w:rPr/>
           </w:pPr>
-          <w:hyperlink w:anchor="__RefHeading___Toc400_3964410391">
+          <w:hyperlink w:anchor="__RefHeading___Toc400_2946661499">
             <w:r>
               <w:rPr>
                 <w:webHidden/>
@@ -536,7 +536,7 @@
             </w:tabs>
             <w:rPr/>
           </w:pPr>
-          <w:hyperlink w:anchor="__RefHeading___Toc402_3964410391">
+          <w:hyperlink w:anchor="__RefHeading___Toc402_2946661499">
             <w:r>
               <w:rPr>
                 <w:webHidden/>
@@ -563,7 +563,7 @@
             </w:tabs>
             <w:rPr/>
           </w:pPr>
-          <w:hyperlink w:anchor="__RefHeading___Toc404_3964410391">
+          <w:hyperlink w:anchor="__RefHeading___Toc404_2946661499">
             <w:r>
               <w:rPr>
                 <w:webHidden/>
@@ -618,7 +618,7 @@
         <w:spacing w:before="0" w:after="160"/>
         <w:rPr/>
       </w:pPr>
-      <w:bookmarkStart w:id="0" w:name="__RefHeading___Toc386_3964410391"/>
+      <w:bookmarkStart w:id="0" w:name="__RefHeading___Toc386_2946661499"/>
       <w:bookmarkEnd w:id="0"/>
       <w:r>
         <w:rPr>
@@ -700,7 +700,7 @@
         </w:pBdr>
         <w:rPr/>
       </w:pPr>
-      <w:bookmarkStart w:id="1" w:name="__RefHeading___Toc388_3964410391"/>
+      <w:bookmarkStart w:id="1" w:name="__RefHeading___Toc388_2946661499"/>
       <w:bookmarkEnd w:id="1"/>
       <w:r>
         <w:rPr>
@@ -762,7 +762,7 @@
         </w:pBdr>
         <w:rPr/>
       </w:pPr>
-      <w:bookmarkStart w:id="2" w:name="__RefHeading___Toc390_3964410391"/>
+      <w:bookmarkStart w:id="2" w:name="__RefHeading___Toc390_2946661499"/>
       <w:bookmarkEnd w:id="2"/>
       <w:r>
         <w:rPr>
@@ -870,7 +870,7 @@
         </w:pBdr>
         <w:rPr/>
       </w:pPr>
-      <w:bookmarkStart w:id="3" w:name="__RefHeading___Toc392_3964410391"/>
+      <w:bookmarkStart w:id="3" w:name="__RefHeading___Toc392_2946661499"/>
       <w:bookmarkEnd w:id="3"/>
       <w:r>
         <w:rPr>
@@ -1428,7 +1428,7 @@
         </w:pBdr>
         <w:rPr/>
       </w:pPr>
-      <w:bookmarkStart w:id="4" w:name="__RefHeading___Toc394_3964410391"/>
+      <w:bookmarkStart w:id="4" w:name="__RefHeading___Toc394_2946661499"/>
       <w:bookmarkEnd w:id="4"/>
       <w:r>
         <w:rPr>
@@ -1594,7 +1594,7 @@
         </w:pBdr>
         <w:rPr/>
       </w:pPr>
-      <w:bookmarkStart w:id="5" w:name="__RefHeading___Toc396_3964410391"/>
+      <w:bookmarkStart w:id="5" w:name="__RefHeading___Toc396_2946661499"/>
       <w:bookmarkEnd w:id="5"/>
       <w:r>
         <w:rPr>
@@ -2476,7 +2476,7 @@
         </w:pBdr>
         <w:rPr/>
       </w:pPr>
-      <w:bookmarkStart w:id="6" w:name="__RefHeading___Toc398_3964410391"/>
+      <w:bookmarkStart w:id="6" w:name="__RefHeading___Toc398_2946661499"/>
       <w:bookmarkEnd w:id="6"/>
       <w:r>
         <w:rPr>
@@ -2776,7 +2776,7 @@
         </w:pBdr>
         <w:rPr/>
       </w:pPr>
-      <w:bookmarkStart w:id="7" w:name="__RefHeading___Toc400_3964410391"/>
+      <w:bookmarkStart w:id="7" w:name="__RefHeading___Toc400_2946661499"/>
       <w:bookmarkEnd w:id="7"/>
       <w:r>
         <w:rPr>
@@ -3078,7 +3078,7 @@
         <w:spacing w:before="0" w:after="160"/>
         <w:rPr/>
       </w:pPr>
-      <w:bookmarkStart w:id="8" w:name="__RefHeading___Toc402_3964410391"/>
+      <w:bookmarkStart w:id="8" w:name="__RefHeading___Toc402_2946661499"/>
       <w:bookmarkEnd w:id="8"/>
       <w:r>
         <w:rPr>
@@ -3235,7 +3235,7 @@
         </w:pBdr>
         <w:rPr/>
       </w:pPr>
-      <w:bookmarkStart w:id="9" w:name="__RefHeading___Toc404_3964410391"/>
+      <w:bookmarkStart w:id="9" w:name="__RefHeading___Toc404_2946661499"/>
       <w:bookmarkEnd w:id="9"/>
       <w:r>
         <w:rPr>

</xml_diff>

<commit_message>
Way-forward page: single page, vertical five-phase pathway, phases 1-5
Companion page deleted; the Framework Development Programme is now a
vertical pathway (numbered circles 1-5 on a left-hand line, titles and
descriptions right, generous spacing, no per-phase cards) full-width
beneath the three banners. Phases renumbered from 0-4 to 1-5. Paper
embed regenerated.

Co-Authored-By: Claude Fable 5 <noreply@anthropic.com>
Claude-Session: https://claude.ai/code/session_01YLo1WfwUDkbwfJEF3ZNVbB
</commit_message>
<xml_diff>
--- a/output/combat-mindset-way-forward.docx
+++ b/output/combat-mindset-way-forward.docx
@@ -320,7 +320,7 @@
             </w:rPr>
             <w:fldChar w:fldCharType="separate"/>
           </w:r>
-          <w:hyperlink w:anchor="__RefHeading___Toc386_2946661499">
+          <w:hyperlink w:anchor="__RefHeading___Toc386_4046471345">
             <w:r>
               <w:rPr>
                 <w:webHidden/>
@@ -347,7 +347,7 @@
             </w:tabs>
             <w:rPr/>
           </w:pPr>
-          <w:hyperlink w:anchor="__RefHeading___Toc388_2946661499">
+          <w:hyperlink w:anchor="__RefHeading___Toc388_4046471345">
             <w:r>
               <w:rPr>
                 <w:webHidden/>
@@ -374,7 +374,7 @@
             </w:tabs>
             <w:rPr/>
           </w:pPr>
-          <w:hyperlink w:anchor="__RefHeading___Toc390_2946661499">
+          <w:hyperlink w:anchor="__RefHeading___Toc390_4046471345">
             <w:r>
               <w:rPr>
                 <w:webHidden/>
@@ -401,7 +401,7 @@
             </w:tabs>
             <w:rPr/>
           </w:pPr>
-          <w:hyperlink w:anchor="__RefHeading___Toc392_2946661499">
+          <w:hyperlink w:anchor="__RefHeading___Toc392_4046471345">
             <w:r>
               <w:rPr>
                 <w:webHidden/>
@@ -428,7 +428,7 @@
             </w:tabs>
             <w:rPr/>
           </w:pPr>
-          <w:hyperlink w:anchor="__RefHeading___Toc394_2946661499">
+          <w:hyperlink w:anchor="__RefHeading___Toc394_4046471345">
             <w:r>
               <w:rPr>
                 <w:webHidden/>
@@ -455,7 +455,7 @@
             </w:tabs>
             <w:rPr/>
           </w:pPr>
-          <w:hyperlink w:anchor="__RefHeading___Toc396_2946661499">
+          <w:hyperlink w:anchor="__RefHeading___Toc396_4046471345">
             <w:r>
               <w:rPr>
                 <w:webHidden/>
@@ -482,7 +482,7 @@
             </w:tabs>
             <w:rPr/>
           </w:pPr>
-          <w:hyperlink w:anchor="__RefHeading___Toc398_2946661499">
+          <w:hyperlink w:anchor="__RefHeading___Toc398_4046471345">
             <w:r>
               <w:rPr>
                 <w:webHidden/>
@@ -509,7 +509,7 @@
             </w:tabs>
             <w:rPr/>
           </w:pPr>
-          <w:hyperlink w:anchor="__RefHeading___Toc400_2946661499">
+          <w:hyperlink w:anchor="__RefHeading___Toc400_4046471345">
             <w:r>
               <w:rPr>
                 <w:webHidden/>
@@ -536,7 +536,7 @@
             </w:tabs>
             <w:rPr/>
           </w:pPr>
-          <w:hyperlink w:anchor="__RefHeading___Toc402_2946661499">
+          <w:hyperlink w:anchor="__RefHeading___Toc402_4046471345">
             <w:r>
               <w:rPr>
                 <w:webHidden/>
@@ -563,7 +563,7 @@
             </w:tabs>
             <w:rPr/>
           </w:pPr>
-          <w:hyperlink w:anchor="__RefHeading___Toc404_2946661499">
+          <w:hyperlink w:anchor="__RefHeading___Toc404_4046471345">
             <w:r>
               <w:rPr>
                 <w:webHidden/>
@@ -618,7 +618,7 @@
         <w:spacing w:before="0" w:after="160"/>
         <w:rPr/>
       </w:pPr>
-      <w:bookmarkStart w:id="0" w:name="__RefHeading___Toc386_2946661499"/>
+      <w:bookmarkStart w:id="0" w:name="__RefHeading___Toc386_4046471345"/>
       <w:bookmarkEnd w:id="0"/>
       <w:r>
         <w:rPr>
@@ -700,7 +700,7 @@
         </w:pBdr>
         <w:rPr/>
       </w:pPr>
-      <w:bookmarkStart w:id="1" w:name="__RefHeading___Toc388_2946661499"/>
+      <w:bookmarkStart w:id="1" w:name="__RefHeading___Toc388_4046471345"/>
       <w:bookmarkEnd w:id="1"/>
       <w:r>
         <w:rPr>
@@ -762,7 +762,7 @@
         </w:pBdr>
         <w:rPr/>
       </w:pPr>
-      <w:bookmarkStart w:id="2" w:name="__RefHeading___Toc390_2946661499"/>
+      <w:bookmarkStart w:id="2" w:name="__RefHeading___Toc390_4046471345"/>
       <w:bookmarkEnd w:id="2"/>
       <w:r>
         <w:rPr>
@@ -870,7 +870,7 @@
         </w:pBdr>
         <w:rPr/>
       </w:pPr>
-      <w:bookmarkStart w:id="3" w:name="__RefHeading___Toc392_2946661499"/>
+      <w:bookmarkStart w:id="3" w:name="__RefHeading___Toc392_4046471345"/>
       <w:bookmarkEnd w:id="3"/>
       <w:r>
         <w:rPr>
@@ -1428,7 +1428,7 @@
         </w:pBdr>
         <w:rPr/>
       </w:pPr>
-      <w:bookmarkStart w:id="4" w:name="__RefHeading___Toc394_2946661499"/>
+      <w:bookmarkStart w:id="4" w:name="__RefHeading___Toc394_4046471345"/>
       <w:bookmarkEnd w:id="4"/>
       <w:r>
         <w:rPr>
@@ -1594,7 +1594,7 @@
         </w:pBdr>
         <w:rPr/>
       </w:pPr>
-      <w:bookmarkStart w:id="5" w:name="__RefHeading___Toc396_2946661499"/>
+      <w:bookmarkStart w:id="5" w:name="__RefHeading___Toc396_4046471345"/>
       <w:bookmarkEnd w:id="5"/>
       <w:r>
         <w:rPr>
@@ -2476,7 +2476,7 @@
         </w:pBdr>
         <w:rPr/>
       </w:pPr>
-      <w:bookmarkStart w:id="6" w:name="__RefHeading___Toc398_2946661499"/>
+      <w:bookmarkStart w:id="6" w:name="__RefHeading___Toc398_4046471345"/>
       <w:bookmarkEnd w:id="6"/>
       <w:r>
         <w:rPr>
@@ -2776,7 +2776,7 @@
         </w:pBdr>
         <w:rPr/>
       </w:pPr>
-      <w:bookmarkStart w:id="7" w:name="__RefHeading___Toc400_2946661499"/>
+      <w:bookmarkStart w:id="7" w:name="__RefHeading___Toc400_4046471345"/>
       <w:bookmarkEnd w:id="7"/>
       <w:r>
         <w:rPr>
@@ -3078,7 +3078,7 @@
         <w:spacing w:before="0" w:after="160"/>
         <w:rPr/>
       </w:pPr>
-      <w:bookmarkStart w:id="8" w:name="__RefHeading___Toc402_2946661499"/>
+      <w:bookmarkStart w:id="8" w:name="__RefHeading___Toc402_4046471345"/>
       <w:bookmarkEnd w:id="8"/>
       <w:r>
         <w:rPr>
@@ -3235,7 +3235,7 @@
         </w:pBdr>
         <w:rPr/>
       </w:pPr>
-      <w:bookmarkStart w:id="9" w:name="__RefHeading___Toc404_2946661499"/>
+      <w:bookmarkStart w:id="9" w:name="__RefHeading___Toc404_4046471345"/>
       <w:bookmarkEnd w:id="9"/>
       <w:r>
         <w:rPr>

</xml_diff>

<commit_message>
Programme phases tightened to single clear outcomes
Define and govern: confirm terminology, governance, roles and
responsibilities. Understand: assess existing doctrine, products,
delivery and governance. Design: develop the Combat Mindset Framework,
delivery architecture and outcomes. Validate: refine with key
stakeholders and conduct bounded pilots. Endorse and implement:
deliver the framework for approval and implementation. Paper embed
regenerated.

Co-Authored-By: Claude Fable 5 <noreply@anthropic.com>
Claude-Session: https://claude.ai/code/session_01YLo1WfwUDkbwfJEF3ZNVbB
</commit_message>
<xml_diff>
--- a/output/combat-mindset-way-forward.docx
+++ b/output/combat-mindset-way-forward.docx
@@ -320,7 +320,7 @@
             </w:rPr>
             <w:fldChar w:fldCharType="separate"/>
           </w:r>
-          <w:hyperlink w:anchor="__RefHeading___Toc386_4046471345">
+          <w:hyperlink w:anchor="__RefHeading___Toc386_696307034">
             <w:r>
               <w:rPr>
                 <w:webHidden/>
@@ -347,7 +347,7 @@
             </w:tabs>
             <w:rPr/>
           </w:pPr>
-          <w:hyperlink w:anchor="__RefHeading___Toc388_4046471345">
+          <w:hyperlink w:anchor="__RefHeading___Toc388_696307034">
             <w:r>
               <w:rPr>
                 <w:webHidden/>
@@ -374,7 +374,7 @@
             </w:tabs>
             <w:rPr/>
           </w:pPr>
-          <w:hyperlink w:anchor="__RefHeading___Toc390_4046471345">
+          <w:hyperlink w:anchor="__RefHeading___Toc390_696307034">
             <w:r>
               <w:rPr>
                 <w:webHidden/>
@@ -401,7 +401,7 @@
             </w:tabs>
             <w:rPr/>
           </w:pPr>
-          <w:hyperlink w:anchor="__RefHeading___Toc392_4046471345">
+          <w:hyperlink w:anchor="__RefHeading___Toc392_696307034">
             <w:r>
               <w:rPr>
                 <w:webHidden/>
@@ -428,7 +428,7 @@
             </w:tabs>
             <w:rPr/>
           </w:pPr>
-          <w:hyperlink w:anchor="__RefHeading___Toc394_4046471345">
+          <w:hyperlink w:anchor="__RefHeading___Toc394_696307034">
             <w:r>
               <w:rPr>
                 <w:webHidden/>
@@ -455,7 +455,7 @@
             </w:tabs>
             <w:rPr/>
           </w:pPr>
-          <w:hyperlink w:anchor="__RefHeading___Toc396_4046471345">
+          <w:hyperlink w:anchor="__RefHeading___Toc396_696307034">
             <w:r>
               <w:rPr>
                 <w:webHidden/>
@@ -482,7 +482,7 @@
             </w:tabs>
             <w:rPr/>
           </w:pPr>
-          <w:hyperlink w:anchor="__RefHeading___Toc398_4046471345">
+          <w:hyperlink w:anchor="__RefHeading___Toc398_696307034">
             <w:r>
               <w:rPr>
                 <w:webHidden/>
@@ -509,7 +509,7 @@
             </w:tabs>
             <w:rPr/>
           </w:pPr>
-          <w:hyperlink w:anchor="__RefHeading___Toc400_4046471345">
+          <w:hyperlink w:anchor="__RefHeading___Toc400_696307034">
             <w:r>
               <w:rPr>
                 <w:webHidden/>
@@ -536,7 +536,7 @@
             </w:tabs>
             <w:rPr/>
           </w:pPr>
-          <w:hyperlink w:anchor="__RefHeading___Toc402_4046471345">
+          <w:hyperlink w:anchor="__RefHeading___Toc402_696307034">
             <w:r>
               <w:rPr>
                 <w:webHidden/>
@@ -563,7 +563,7 @@
             </w:tabs>
             <w:rPr/>
           </w:pPr>
-          <w:hyperlink w:anchor="__RefHeading___Toc404_4046471345">
+          <w:hyperlink w:anchor="__RefHeading___Toc404_696307034">
             <w:r>
               <w:rPr>
                 <w:webHidden/>
@@ -618,7 +618,7 @@
         <w:spacing w:before="0" w:after="160"/>
         <w:rPr/>
       </w:pPr>
-      <w:bookmarkStart w:id="0" w:name="__RefHeading___Toc386_4046471345"/>
+      <w:bookmarkStart w:id="0" w:name="__RefHeading___Toc386_696307034"/>
       <w:bookmarkEnd w:id="0"/>
       <w:r>
         <w:rPr>
@@ -700,7 +700,7 @@
         </w:pBdr>
         <w:rPr/>
       </w:pPr>
-      <w:bookmarkStart w:id="1" w:name="__RefHeading___Toc388_4046471345"/>
+      <w:bookmarkStart w:id="1" w:name="__RefHeading___Toc388_696307034"/>
       <w:bookmarkEnd w:id="1"/>
       <w:r>
         <w:rPr>
@@ -762,7 +762,7 @@
         </w:pBdr>
         <w:rPr/>
       </w:pPr>
-      <w:bookmarkStart w:id="2" w:name="__RefHeading___Toc390_4046471345"/>
+      <w:bookmarkStart w:id="2" w:name="__RefHeading___Toc390_696307034"/>
       <w:bookmarkEnd w:id="2"/>
       <w:r>
         <w:rPr>
@@ -870,7 +870,7 @@
         </w:pBdr>
         <w:rPr/>
       </w:pPr>
-      <w:bookmarkStart w:id="3" w:name="__RefHeading___Toc392_4046471345"/>
+      <w:bookmarkStart w:id="3" w:name="__RefHeading___Toc392_696307034"/>
       <w:bookmarkEnd w:id="3"/>
       <w:r>
         <w:rPr>
@@ -1428,7 +1428,7 @@
         </w:pBdr>
         <w:rPr/>
       </w:pPr>
-      <w:bookmarkStart w:id="4" w:name="__RefHeading___Toc394_4046471345"/>
+      <w:bookmarkStart w:id="4" w:name="__RefHeading___Toc394_696307034"/>
       <w:bookmarkEnd w:id="4"/>
       <w:r>
         <w:rPr>
@@ -1594,7 +1594,7 @@
         </w:pBdr>
         <w:rPr/>
       </w:pPr>
-      <w:bookmarkStart w:id="5" w:name="__RefHeading___Toc396_4046471345"/>
+      <w:bookmarkStart w:id="5" w:name="__RefHeading___Toc396_696307034"/>
       <w:bookmarkEnd w:id="5"/>
       <w:r>
         <w:rPr>
@@ -2476,7 +2476,7 @@
         </w:pBdr>
         <w:rPr/>
       </w:pPr>
-      <w:bookmarkStart w:id="6" w:name="__RefHeading___Toc398_4046471345"/>
+      <w:bookmarkStart w:id="6" w:name="__RefHeading___Toc398_696307034"/>
       <w:bookmarkEnd w:id="6"/>
       <w:r>
         <w:rPr>
@@ -2776,7 +2776,7 @@
         </w:pBdr>
         <w:rPr/>
       </w:pPr>
-      <w:bookmarkStart w:id="7" w:name="__RefHeading___Toc400_4046471345"/>
+      <w:bookmarkStart w:id="7" w:name="__RefHeading___Toc400_696307034"/>
       <w:bookmarkEnd w:id="7"/>
       <w:r>
         <w:rPr>
@@ -3078,7 +3078,7 @@
         <w:spacing w:before="0" w:after="160"/>
         <w:rPr/>
       </w:pPr>
-      <w:bookmarkStart w:id="8" w:name="__RefHeading___Toc402_4046471345"/>
+      <w:bookmarkStart w:id="8" w:name="__RefHeading___Toc402_696307034"/>
       <w:bookmarkEnd w:id="8"/>
       <w:r>
         <w:rPr>
@@ -3235,7 +3235,7 @@
         </w:pBdr>
         <w:rPr/>
       </w:pPr>
-      <w:bookmarkStart w:id="9" w:name="__RefHeading___Toc404_4046471345"/>
+      <w:bookmarkStart w:id="9" w:name="__RefHeading___Toc404_696307034"/>
       <w:bookmarkEnd w:id="9"/>
       <w:r>
         <w:rPr>

</xml_diff>

<commit_message>
Pathway phases: single-word uppercase titles in tabular layout
DEFINE / UNDERSTAND / DESIGN / VALIDATE / IMPLEMENT as a letterspaced
title column beside the numbered line, descriptions in an aligned
right-hand column. Paper embed regenerated.

Co-Authored-By: Claude Fable 5 <noreply@anthropic.com>
Claude-Session: https://claude.ai/code/session_01YLo1WfwUDkbwfJEF3ZNVbB
</commit_message>
<xml_diff>
--- a/output/combat-mindset-way-forward.docx
+++ b/output/combat-mindset-way-forward.docx
@@ -320,7 +320,7 @@
             </w:rPr>
             <w:fldChar w:fldCharType="separate"/>
           </w:r>
-          <w:hyperlink w:anchor="__RefHeading___Toc386_696307034">
+          <w:hyperlink w:anchor="__RefHeading___Toc386_985890399">
             <w:r>
               <w:rPr>
                 <w:webHidden/>
@@ -347,7 +347,7 @@
             </w:tabs>
             <w:rPr/>
           </w:pPr>
-          <w:hyperlink w:anchor="__RefHeading___Toc388_696307034">
+          <w:hyperlink w:anchor="__RefHeading___Toc388_985890399">
             <w:r>
               <w:rPr>
                 <w:webHidden/>
@@ -374,7 +374,7 @@
             </w:tabs>
             <w:rPr/>
           </w:pPr>
-          <w:hyperlink w:anchor="__RefHeading___Toc390_696307034">
+          <w:hyperlink w:anchor="__RefHeading___Toc390_985890399">
             <w:r>
               <w:rPr>
                 <w:webHidden/>
@@ -401,7 +401,7 @@
             </w:tabs>
             <w:rPr/>
           </w:pPr>
-          <w:hyperlink w:anchor="__RefHeading___Toc392_696307034">
+          <w:hyperlink w:anchor="__RefHeading___Toc392_985890399">
             <w:r>
               <w:rPr>
                 <w:webHidden/>
@@ -428,7 +428,7 @@
             </w:tabs>
             <w:rPr/>
           </w:pPr>
-          <w:hyperlink w:anchor="__RefHeading___Toc394_696307034">
+          <w:hyperlink w:anchor="__RefHeading___Toc394_985890399">
             <w:r>
               <w:rPr>
                 <w:webHidden/>
@@ -455,7 +455,7 @@
             </w:tabs>
             <w:rPr/>
           </w:pPr>
-          <w:hyperlink w:anchor="__RefHeading___Toc396_696307034">
+          <w:hyperlink w:anchor="__RefHeading___Toc396_985890399">
             <w:r>
               <w:rPr>
                 <w:webHidden/>
@@ -482,7 +482,7 @@
             </w:tabs>
             <w:rPr/>
           </w:pPr>
-          <w:hyperlink w:anchor="__RefHeading___Toc398_696307034">
+          <w:hyperlink w:anchor="__RefHeading___Toc398_985890399">
             <w:r>
               <w:rPr>
                 <w:webHidden/>
@@ -509,7 +509,7 @@
             </w:tabs>
             <w:rPr/>
           </w:pPr>
-          <w:hyperlink w:anchor="__RefHeading___Toc400_696307034">
+          <w:hyperlink w:anchor="__RefHeading___Toc400_985890399">
             <w:r>
               <w:rPr>
                 <w:webHidden/>
@@ -536,7 +536,7 @@
             </w:tabs>
             <w:rPr/>
           </w:pPr>
-          <w:hyperlink w:anchor="__RefHeading___Toc402_696307034">
+          <w:hyperlink w:anchor="__RefHeading___Toc402_985890399">
             <w:r>
               <w:rPr>
                 <w:webHidden/>
@@ -563,7 +563,7 @@
             </w:tabs>
             <w:rPr/>
           </w:pPr>
-          <w:hyperlink w:anchor="__RefHeading___Toc404_696307034">
+          <w:hyperlink w:anchor="__RefHeading___Toc404_985890399">
             <w:r>
               <w:rPr>
                 <w:webHidden/>
@@ -618,7 +618,7 @@
         <w:spacing w:before="0" w:after="160"/>
         <w:rPr/>
       </w:pPr>
-      <w:bookmarkStart w:id="0" w:name="__RefHeading___Toc386_696307034"/>
+      <w:bookmarkStart w:id="0" w:name="__RefHeading___Toc386_985890399"/>
       <w:bookmarkEnd w:id="0"/>
       <w:r>
         <w:rPr>
@@ -700,7 +700,7 @@
         </w:pBdr>
         <w:rPr/>
       </w:pPr>
-      <w:bookmarkStart w:id="1" w:name="__RefHeading___Toc388_696307034"/>
+      <w:bookmarkStart w:id="1" w:name="__RefHeading___Toc388_985890399"/>
       <w:bookmarkEnd w:id="1"/>
       <w:r>
         <w:rPr>
@@ -762,7 +762,7 @@
         </w:pBdr>
         <w:rPr/>
       </w:pPr>
-      <w:bookmarkStart w:id="2" w:name="__RefHeading___Toc390_696307034"/>
+      <w:bookmarkStart w:id="2" w:name="__RefHeading___Toc390_985890399"/>
       <w:bookmarkEnd w:id="2"/>
       <w:r>
         <w:rPr>
@@ -870,7 +870,7 @@
         </w:pBdr>
         <w:rPr/>
       </w:pPr>
-      <w:bookmarkStart w:id="3" w:name="__RefHeading___Toc392_696307034"/>
+      <w:bookmarkStart w:id="3" w:name="__RefHeading___Toc392_985890399"/>
       <w:bookmarkEnd w:id="3"/>
       <w:r>
         <w:rPr>
@@ -1428,7 +1428,7 @@
         </w:pBdr>
         <w:rPr/>
       </w:pPr>
-      <w:bookmarkStart w:id="4" w:name="__RefHeading___Toc394_696307034"/>
+      <w:bookmarkStart w:id="4" w:name="__RefHeading___Toc394_985890399"/>
       <w:bookmarkEnd w:id="4"/>
       <w:r>
         <w:rPr>
@@ -1594,7 +1594,7 @@
         </w:pBdr>
         <w:rPr/>
       </w:pPr>
-      <w:bookmarkStart w:id="5" w:name="__RefHeading___Toc396_696307034"/>
+      <w:bookmarkStart w:id="5" w:name="__RefHeading___Toc396_985890399"/>
       <w:bookmarkEnd w:id="5"/>
       <w:r>
         <w:rPr>
@@ -2476,7 +2476,7 @@
         </w:pBdr>
         <w:rPr/>
       </w:pPr>
-      <w:bookmarkStart w:id="6" w:name="__RefHeading___Toc398_696307034"/>
+      <w:bookmarkStart w:id="6" w:name="__RefHeading___Toc398_985890399"/>
       <w:bookmarkEnd w:id="6"/>
       <w:r>
         <w:rPr>
@@ -2776,7 +2776,7 @@
         </w:pBdr>
         <w:rPr/>
       </w:pPr>
-      <w:bookmarkStart w:id="7" w:name="__RefHeading___Toc400_696307034"/>
+      <w:bookmarkStart w:id="7" w:name="__RefHeading___Toc400_985890399"/>
       <w:bookmarkEnd w:id="7"/>
       <w:r>
         <w:rPr>
@@ -3078,7 +3078,7 @@
         <w:spacing w:before="0" w:after="160"/>
         <w:rPr/>
       </w:pPr>
-      <w:bookmarkStart w:id="8" w:name="__RefHeading___Toc402_696307034"/>
+      <w:bookmarkStart w:id="8" w:name="__RefHeading___Toc402_985890399"/>
       <w:bookmarkEnd w:id="8"/>
       <w:r>
         <w:rPr>
@@ -3235,7 +3235,7 @@
         </w:pBdr>
         <w:rPr/>
       </w:pPr>
-      <w:bookmarkStart w:id="9" w:name="__RefHeading___Toc404_696307034"/>
+      <w:bookmarkStart w:id="9" w:name="__RefHeading___Toc404_985890399"/>
       <w:bookmarkEnd w:id="9"/>
       <w:r>
         <w:rPr>

</xml_diff>

<commit_message>
Executive presentation pass: title, brand mark, metadata, footer
Retitled COMBAT MINDSET FRAMEWORK PROPOSAL with stacked header (larger
brand mark, title, Army Command School). Version and draft markings
removed from the page; version control moved to document properties.
Footer simplified to Army Command School / August 2026. Pathway given
more room (wider title column, taller pitch). Paper embed regenerated.

Co-Authored-By: Claude Fable 5 <noreply@anthropic.com>
Claude-Session: https://claude.ai/code/session_01YLo1WfwUDkbwfJEF3ZNVbB
</commit_message>
<xml_diff>
--- a/output/combat-mindset-way-forward.docx
+++ b/output/combat-mindset-way-forward.docx
@@ -320,7 +320,7 @@
             </w:rPr>
             <w:fldChar w:fldCharType="separate"/>
           </w:r>
-          <w:hyperlink w:anchor="__RefHeading___Toc386_985890399">
+          <w:hyperlink w:anchor="__RefHeading___Toc386_2608848684">
             <w:r>
               <w:rPr>
                 <w:webHidden/>
@@ -347,7 +347,7 @@
             </w:tabs>
             <w:rPr/>
           </w:pPr>
-          <w:hyperlink w:anchor="__RefHeading___Toc388_985890399">
+          <w:hyperlink w:anchor="__RefHeading___Toc388_2608848684">
             <w:r>
               <w:rPr>
                 <w:webHidden/>
@@ -374,7 +374,7 @@
             </w:tabs>
             <w:rPr/>
           </w:pPr>
-          <w:hyperlink w:anchor="__RefHeading___Toc390_985890399">
+          <w:hyperlink w:anchor="__RefHeading___Toc390_2608848684">
             <w:r>
               <w:rPr>
                 <w:webHidden/>
@@ -401,7 +401,7 @@
             </w:tabs>
             <w:rPr/>
           </w:pPr>
-          <w:hyperlink w:anchor="__RefHeading___Toc392_985890399">
+          <w:hyperlink w:anchor="__RefHeading___Toc392_2608848684">
             <w:r>
               <w:rPr>
                 <w:webHidden/>
@@ -428,7 +428,7 @@
             </w:tabs>
             <w:rPr/>
           </w:pPr>
-          <w:hyperlink w:anchor="__RefHeading___Toc394_985890399">
+          <w:hyperlink w:anchor="__RefHeading___Toc394_2608848684">
             <w:r>
               <w:rPr>
                 <w:webHidden/>
@@ -455,7 +455,7 @@
             </w:tabs>
             <w:rPr/>
           </w:pPr>
-          <w:hyperlink w:anchor="__RefHeading___Toc396_985890399">
+          <w:hyperlink w:anchor="__RefHeading___Toc396_2608848684">
             <w:r>
               <w:rPr>
                 <w:webHidden/>
@@ -482,7 +482,7 @@
             </w:tabs>
             <w:rPr/>
           </w:pPr>
-          <w:hyperlink w:anchor="__RefHeading___Toc398_985890399">
+          <w:hyperlink w:anchor="__RefHeading___Toc398_2608848684">
             <w:r>
               <w:rPr>
                 <w:webHidden/>
@@ -509,7 +509,7 @@
             </w:tabs>
             <w:rPr/>
           </w:pPr>
-          <w:hyperlink w:anchor="__RefHeading___Toc400_985890399">
+          <w:hyperlink w:anchor="__RefHeading___Toc400_2608848684">
             <w:r>
               <w:rPr>
                 <w:webHidden/>
@@ -536,7 +536,7 @@
             </w:tabs>
             <w:rPr/>
           </w:pPr>
-          <w:hyperlink w:anchor="__RefHeading___Toc402_985890399">
+          <w:hyperlink w:anchor="__RefHeading___Toc402_2608848684">
             <w:r>
               <w:rPr>
                 <w:webHidden/>
@@ -563,7 +563,7 @@
             </w:tabs>
             <w:rPr/>
           </w:pPr>
-          <w:hyperlink w:anchor="__RefHeading___Toc404_985890399">
+          <w:hyperlink w:anchor="__RefHeading___Toc404_2608848684">
             <w:r>
               <w:rPr>
                 <w:webHidden/>
@@ -618,7 +618,7 @@
         <w:spacing w:before="0" w:after="160"/>
         <w:rPr/>
       </w:pPr>
-      <w:bookmarkStart w:id="0" w:name="__RefHeading___Toc386_985890399"/>
+      <w:bookmarkStart w:id="0" w:name="__RefHeading___Toc386_2608848684"/>
       <w:bookmarkEnd w:id="0"/>
       <w:r>
         <w:rPr>
@@ -700,7 +700,7 @@
         </w:pBdr>
         <w:rPr/>
       </w:pPr>
-      <w:bookmarkStart w:id="1" w:name="__RefHeading___Toc388_985890399"/>
+      <w:bookmarkStart w:id="1" w:name="__RefHeading___Toc388_2608848684"/>
       <w:bookmarkEnd w:id="1"/>
       <w:r>
         <w:rPr>
@@ -762,7 +762,7 @@
         </w:pBdr>
         <w:rPr/>
       </w:pPr>
-      <w:bookmarkStart w:id="2" w:name="__RefHeading___Toc390_985890399"/>
+      <w:bookmarkStart w:id="2" w:name="__RefHeading___Toc390_2608848684"/>
       <w:bookmarkEnd w:id="2"/>
       <w:r>
         <w:rPr>
@@ -870,7 +870,7 @@
         </w:pBdr>
         <w:rPr/>
       </w:pPr>
-      <w:bookmarkStart w:id="3" w:name="__RefHeading___Toc392_985890399"/>
+      <w:bookmarkStart w:id="3" w:name="__RefHeading___Toc392_2608848684"/>
       <w:bookmarkEnd w:id="3"/>
       <w:r>
         <w:rPr>
@@ -1428,7 +1428,7 @@
         </w:pBdr>
         <w:rPr/>
       </w:pPr>
-      <w:bookmarkStart w:id="4" w:name="__RefHeading___Toc394_985890399"/>
+      <w:bookmarkStart w:id="4" w:name="__RefHeading___Toc394_2608848684"/>
       <w:bookmarkEnd w:id="4"/>
       <w:r>
         <w:rPr>
@@ -1594,7 +1594,7 @@
         </w:pBdr>
         <w:rPr/>
       </w:pPr>
-      <w:bookmarkStart w:id="5" w:name="__RefHeading___Toc396_985890399"/>
+      <w:bookmarkStart w:id="5" w:name="__RefHeading___Toc396_2608848684"/>
       <w:bookmarkEnd w:id="5"/>
       <w:r>
         <w:rPr>
@@ -2476,7 +2476,7 @@
         </w:pBdr>
         <w:rPr/>
       </w:pPr>
-      <w:bookmarkStart w:id="6" w:name="__RefHeading___Toc398_985890399"/>
+      <w:bookmarkStart w:id="6" w:name="__RefHeading___Toc398_2608848684"/>
       <w:bookmarkEnd w:id="6"/>
       <w:r>
         <w:rPr>
@@ -2776,7 +2776,7 @@
         </w:pBdr>
         <w:rPr/>
       </w:pPr>
-      <w:bookmarkStart w:id="7" w:name="__RefHeading___Toc400_985890399"/>
+      <w:bookmarkStart w:id="7" w:name="__RefHeading___Toc400_2608848684"/>
       <w:bookmarkEnd w:id="7"/>
       <w:r>
         <w:rPr>
@@ -3078,7 +3078,7 @@
         <w:spacing w:before="0" w:after="160"/>
         <w:rPr/>
       </w:pPr>
-      <w:bookmarkStart w:id="8" w:name="__RefHeading___Toc402_985890399"/>
+      <w:bookmarkStart w:id="8" w:name="__RefHeading___Toc402_2608848684"/>
       <w:bookmarkEnd w:id="8"/>
       <w:r>
         <w:rPr>
@@ -3235,7 +3235,7 @@
         </w:pBdr>
         <w:rPr/>
       </w:pPr>
-      <w:bookmarkStart w:id="9" w:name="__RefHeading___Toc404_985890399"/>
+      <w:bookmarkStart w:id="9" w:name="__RefHeading___Toc404_2608848684"/>
       <w:bookmarkEnd w:id="9"/>
       <w:r>
         <w:rPr>

</xml_diff>

<commit_message>
Final executive refinements to the framework proposal page
Brand mark enlarged again to balance the title; footer reduced to
August 2026 bottom-right only; organising system retitled NZ ARMY
COMBAT MINDSET FRAMEWORK; phase 3 now reads delivery system rather
than delivery architecture; section connectors lightened (grey labels,
softened arrows) so the four primary headings carry the page. Paper
embed regenerated.

Co-Authored-By: Claude Fable 5 <noreply@anthropic.com>
Claude-Session: https://claude.ai/code/session_01YLo1WfwUDkbwfJEF3ZNVbB
</commit_message>
<xml_diff>
--- a/output/combat-mindset-way-forward.docx
+++ b/output/combat-mindset-way-forward.docx
@@ -320,7 +320,7 @@
             </w:rPr>
             <w:fldChar w:fldCharType="separate"/>
           </w:r>
-          <w:hyperlink w:anchor="__RefHeading___Toc386_2608848684">
+          <w:hyperlink w:anchor="__RefHeading___Toc386_801911793">
             <w:r>
               <w:rPr>
                 <w:webHidden/>
@@ -347,7 +347,7 @@
             </w:tabs>
             <w:rPr/>
           </w:pPr>
-          <w:hyperlink w:anchor="__RefHeading___Toc388_2608848684">
+          <w:hyperlink w:anchor="__RefHeading___Toc388_801911793">
             <w:r>
               <w:rPr>
                 <w:webHidden/>
@@ -374,7 +374,7 @@
             </w:tabs>
             <w:rPr/>
           </w:pPr>
-          <w:hyperlink w:anchor="__RefHeading___Toc390_2608848684">
+          <w:hyperlink w:anchor="__RefHeading___Toc390_801911793">
             <w:r>
               <w:rPr>
                 <w:webHidden/>
@@ -401,7 +401,7 @@
             </w:tabs>
             <w:rPr/>
           </w:pPr>
-          <w:hyperlink w:anchor="__RefHeading___Toc392_2608848684">
+          <w:hyperlink w:anchor="__RefHeading___Toc392_801911793">
             <w:r>
               <w:rPr>
                 <w:webHidden/>
@@ -428,7 +428,7 @@
             </w:tabs>
             <w:rPr/>
           </w:pPr>
-          <w:hyperlink w:anchor="__RefHeading___Toc394_2608848684">
+          <w:hyperlink w:anchor="__RefHeading___Toc394_801911793">
             <w:r>
               <w:rPr>
                 <w:webHidden/>
@@ -455,7 +455,7 @@
             </w:tabs>
             <w:rPr/>
           </w:pPr>
-          <w:hyperlink w:anchor="__RefHeading___Toc396_2608848684">
+          <w:hyperlink w:anchor="__RefHeading___Toc396_801911793">
             <w:r>
               <w:rPr>
                 <w:webHidden/>
@@ -482,7 +482,7 @@
             </w:tabs>
             <w:rPr/>
           </w:pPr>
-          <w:hyperlink w:anchor="__RefHeading___Toc398_2608848684">
+          <w:hyperlink w:anchor="__RefHeading___Toc398_801911793">
             <w:r>
               <w:rPr>
                 <w:webHidden/>
@@ -509,7 +509,7 @@
             </w:tabs>
             <w:rPr/>
           </w:pPr>
-          <w:hyperlink w:anchor="__RefHeading___Toc400_2608848684">
+          <w:hyperlink w:anchor="__RefHeading___Toc400_801911793">
             <w:r>
               <w:rPr>
                 <w:webHidden/>
@@ -536,7 +536,7 @@
             </w:tabs>
             <w:rPr/>
           </w:pPr>
-          <w:hyperlink w:anchor="__RefHeading___Toc402_2608848684">
+          <w:hyperlink w:anchor="__RefHeading___Toc402_801911793">
             <w:r>
               <w:rPr>
                 <w:webHidden/>
@@ -563,7 +563,7 @@
             </w:tabs>
             <w:rPr/>
           </w:pPr>
-          <w:hyperlink w:anchor="__RefHeading___Toc404_2608848684">
+          <w:hyperlink w:anchor="__RefHeading___Toc404_801911793">
             <w:r>
               <w:rPr>
                 <w:webHidden/>
@@ -618,7 +618,7 @@
         <w:spacing w:before="0" w:after="160"/>
         <w:rPr/>
       </w:pPr>
-      <w:bookmarkStart w:id="0" w:name="__RefHeading___Toc386_2608848684"/>
+      <w:bookmarkStart w:id="0" w:name="__RefHeading___Toc386_801911793"/>
       <w:bookmarkEnd w:id="0"/>
       <w:r>
         <w:rPr>
@@ -700,7 +700,7 @@
         </w:pBdr>
         <w:rPr/>
       </w:pPr>
-      <w:bookmarkStart w:id="1" w:name="__RefHeading___Toc388_2608848684"/>
+      <w:bookmarkStart w:id="1" w:name="__RefHeading___Toc388_801911793"/>
       <w:bookmarkEnd w:id="1"/>
       <w:r>
         <w:rPr>
@@ -762,7 +762,7 @@
         </w:pBdr>
         <w:rPr/>
       </w:pPr>
-      <w:bookmarkStart w:id="2" w:name="__RefHeading___Toc390_2608848684"/>
+      <w:bookmarkStart w:id="2" w:name="__RefHeading___Toc390_801911793"/>
       <w:bookmarkEnd w:id="2"/>
       <w:r>
         <w:rPr>
@@ -870,7 +870,7 @@
         </w:pBdr>
         <w:rPr/>
       </w:pPr>
-      <w:bookmarkStart w:id="3" w:name="__RefHeading___Toc392_2608848684"/>
+      <w:bookmarkStart w:id="3" w:name="__RefHeading___Toc392_801911793"/>
       <w:bookmarkEnd w:id="3"/>
       <w:r>
         <w:rPr>
@@ -1428,7 +1428,7 @@
         </w:pBdr>
         <w:rPr/>
       </w:pPr>
-      <w:bookmarkStart w:id="4" w:name="__RefHeading___Toc394_2608848684"/>
+      <w:bookmarkStart w:id="4" w:name="__RefHeading___Toc394_801911793"/>
       <w:bookmarkEnd w:id="4"/>
       <w:r>
         <w:rPr>
@@ -1594,7 +1594,7 @@
         </w:pBdr>
         <w:rPr/>
       </w:pPr>
-      <w:bookmarkStart w:id="5" w:name="__RefHeading___Toc396_2608848684"/>
+      <w:bookmarkStart w:id="5" w:name="__RefHeading___Toc396_801911793"/>
       <w:bookmarkEnd w:id="5"/>
       <w:r>
         <w:rPr>
@@ -2476,7 +2476,7 @@
         </w:pBdr>
         <w:rPr/>
       </w:pPr>
-      <w:bookmarkStart w:id="6" w:name="__RefHeading___Toc398_2608848684"/>
+      <w:bookmarkStart w:id="6" w:name="__RefHeading___Toc398_801911793"/>
       <w:bookmarkEnd w:id="6"/>
       <w:r>
         <w:rPr>
@@ -2776,7 +2776,7 @@
         </w:pBdr>
         <w:rPr/>
       </w:pPr>
-      <w:bookmarkStart w:id="7" w:name="__RefHeading___Toc400_2608848684"/>
+      <w:bookmarkStart w:id="7" w:name="__RefHeading___Toc400_801911793"/>
       <w:bookmarkEnd w:id="7"/>
       <w:r>
         <w:rPr>
@@ -3078,7 +3078,7 @@
         <w:spacing w:before="0" w:after="160"/>
         <w:rPr/>
       </w:pPr>
-      <w:bookmarkStart w:id="8" w:name="__RefHeading___Toc402_2608848684"/>
+      <w:bookmarkStart w:id="8" w:name="__RefHeading___Toc402_801911793"/>
       <w:bookmarkEnd w:id="8"/>
       <w:r>
         <w:rPr>
@@ -3235,7 +3235,7 @@
         </w:pBdr>
         <w:rPr/>
       </w:pPr>
-      <w:bookmarkStart w:id="9" w:name="__RefHeading___Toc404_2608848684"/>
+      <w:bookmarkStart w:id="9" w:name="__RefHeading___Toc404_801911793"/>
       <w:bookmarkEnd w:id="9"/>
       <w:r>
         <w:rPr>

</xml_diff>

<commit_message>
Two-word connectors and layered tagline emphasis
Connector 2 shortened to "organised through" (all connectors now two
words). Combat Mindset card tagline split across two lines: "Remain
effective. Act decisively." in regular white, "Harder to kill." in
bold Army Red - capability, action, outcome. Paper embed regenerated.

Co-Authored-By: Claude Fable 5 <noreply@anthropic.com>
Claude-Session: https://claude.ai/code/session_01YLo1WfwUDkbwfJEF3ZNVbB
</commit_message>
<xml_diff>
--- a/output/combat-mindset-way-forward.docx
+++ b/output/combat-mindset-way-forward.docx
@@ -320,7 +320,7 @@
             </w:rPr>
             <w:fldChar w:fldCharType="separate"/>
           </w:r>
-          <w:hyperlink w:anchor="__RefHeading___Toc386_801911793">
+          <w:hyperlink w:anchor="__RefHeading___Toc386_3380619225">
             <w:r>
               <w:rPr>
                 <w:webHidden/>
@@ -347,7 +347,7 @@
             </w:tabs>
             <w:rPr/>
           </w:pPr>
-          <w:hyperlink w:anchor="__RefHeading___Toc388_801911793">
+          <w:hyperlink w:anchor="__RefHeading___Toc388_3380619225">
             <w:r>
               <w:rPr>
                 <w:webHidden/>
@@ -374,7 +374,7 @@
             </w:tabs>
             <w:rPr/>
           </w:pPr>
-          <w:hyperlink w:anchor="__RefHeading___Toc390_801911793">
+          <w:hyperlink w:anchor="__RefHeading___Toc390_3380619225">
             <w:r>
               <w:rPr>
                 <w:webHidden/>
@@ -401,7 +401,7 @@
             </w:tabs>
             <w:rPr/>
           </w:pPr>
-          <w:hyperlink w:anchor="__RefHeading___Toc392_801911793">
+          <w:hyperlink w:anchor="__RefHeading___Toc392_3380619225">
             <w:r>
               <w:rPr>
                 <w:webHidden/>
@@ -428,7 +428,7 @@
             </w:tabs>
             <w:rPr/>
           </w:pPr>
-          <w:hyperlink w:anchor="__RefHeading___Toc394_801911793">
+          <w:hyperlink w:anchor="__RefHeading___Toc394_3380619225">
             <w:r>
               <w:rPr>
                 <w:webHidden/>
@@ -455,7 +455,7 @@
             </w:tabs>
             <w:rPr/>
           </w:pPr>
-          <w:hyperlink w:anchor="__RefHeading___Toc396_801911793">
+          <w:hyperlink w:anchor="__RefHeading___Toc396_3380619225">
             <w:r>
               <w:rPr>
                 <w:webHidden/>
@@ -482,7 +482,7 @@
             </w:tabs>
             <w:rPr/>
           </w:pPr>
-          <w:hyperlink w:anchor="__RefHeading___Toc398_801911793">
+          <w:hyperlink w:anchor="__RefHeading___Toc398_3380619225">
             <w:r>
               <w:rPr>
                 <w:webHidden/>
@@ -509,7 +509,7 @@
             </w:tabs>
             <w:rPr/>
           </w:pPr>
-          <w:hyperlink w:anchor="__RefHeading___Toc400_801911793">
+          <w:hyperlink w:anchor="__RefHeading___Toc400_3380619225">
             <w:r>
               <w:rPr>
                 <w:webHidden/>
@@ -536,7 +536,7 @@
             </w:tabs>
             <w:rPr/>
           </w:pPr>
-          <w:hyperlink w:anchor="__RefHeading___Toc402_801911793">
+          <w:hyperlink w:anchor="__RefHeading___Toc402_3380619225">
             <w:r>
               <w:rPr>
                 <w:webHidden/>
@@ -563,7 +563,7 @@
             </w:tabs>
             <w:rPr/>
           </w:pPr>
-          <w:hyperlink w:anchor="__RefHeading___Toc404_801911793">
+          <w:hyperlink w:anchor="__RefHeading___Toc404_3380619225">
             <w:r>
               <w:rPr>
                 <w:webHidden/>
@@ -618,7 +618,7 @@
         <w:spacing w:before="0" w:after="160"/>
         <w:rPr/>
       </w:pPr>
-      <w:bookmarkStart w:id="0" w:name="__RefHeading___Toc386_801911793"/>
+      <w:bookmarkStart w:id="0" w:name="__RefHeading___Toc386_3380619225"/>
       <w:bookmarkEnd w:id="0"/>
       <w:r>
         <w:rPr>
@@ -700,7 +700,7 @@
         </w:pBdr>
         <w:rPr/>
       </w:pPr>
-      <w:bookmarkStart w:id="1" w:name="__RefHeading___Toc388_801911793"/>
+      <w:bookmarkStart w:id="1" w:name="__RefHeading___Toc388_3380619225"/>
       <w:bookmarkEnd w:id="1"/>
       <w:r>
         <w:rPr>
@@ -762,7 +762,7 @@
         </w:pBdr>
         <w:rPr/>
       </w:pPr>
-      <w:bookmarkStart w:id="2" w:name="__RefHeading___Toc390_801911793"/>
+      <w:bookmarkStart w:id="2" w:name="__RefHeading___Toc390_3380619225"/>
       <w:bookmarkEnd w:id="2"/>
       <w:r>
         <w:rPr>
@@ -870,7 +870,7 @@
         </w:pBdr>
         <w:rPr/>
       </w:pPr>
-      <w:bookmarkStart w:id="3" w:name="__RefHeading___Toc392_801911793"/>
+      <w:bookmarkStart w:id="3" w:name="__RefHeading___Toc392_3380619225"/>
       <w:bookmarkEnd w:id="3"/>
       <w:r>
         <w:rPr>
@@ -1428,7 +1428,7 @@
         </w:pBdr>
         <w:rPr/>
       </w:pPr>
-      <w:bookmarkStart w:id="4" w:name="__RefHeading___Toc394_801911793"/>
+      <w:bookmarkStart w:id="4" w:name="__RefHeading___Toc394_3380619225"/>
       <w:bookmarkEnd w:id="4"/>
       <w:r>
         <w:rPr>
@@ -1594,7 +1594,7 @@
         </w:pBdr>
         <w:rPr/>
       </w:pPr>
-      <w:bookmarkStart w:id="5" w:name="__RefHeading___Toc396_801911793"/>
+      <w:bookmarkStart w:id="5" w:name="__RefHeading___Toc396_3380619225"/>
       <w:bookmarkEnd w:id="5"/>
       <w:r>
         <w:rPr>
@@ -2476,7 +2476,7 @@
         </w:pBdr>
         <w:rPr/>
       </w:pPr>
-      <w:bookmarkStart w:id="6" w:name="__RefHeading___Toc398_801911793"/>
+      <w:bookmarkStart w:id="6" w:name="__RefHeading___Toc398_3380619225"/>
       <w:bookmarkEnd w:id="6"/>
       <w:r>
         <w:rPr>
@@ -2776,7 +2776,7 @@
         </w:pBdr>
         <w:rPr/>
       </w:pPr>
-      <w:bookmarkStart w:id="7" w:name="__RefHeading___Toc400_801911793"/>
+      <w:bookmarkStart w:id="7" w:name="__RefHeading___Toc400_3380619225"/>
       <w:bookmarkEnd w:id="7"/>
       <w:r>
         <w:rPr>
@@ -3078,7 +3078,7 @@
         <w:spacing w:before="0" w:after="160"/>
         <w:rPr/>
       </w:pPr>
-      <w:bookmarkStart w:id="8" w:name="__RefHeading___Toc402_801911793"/>
+      <w:bookmarkStart w:id="8" w:name="__RefHeading___Toc402_3380619225"/>
       <w:bookmarkEnd w:id="8"/>
       <w:r>
         <w:rPr>
@@ -3235,7 +3235,7 @@
         </w:pBdr>
         <w:rPr/>
       </w:pPr>
-      <w:bookmarkStart w:id="9" w:name="__RefHeading___Toc404_801911793"/>
+      <w:bookmarkStart w:id="9" w:name="__RefHeading___Toc404_3380619225"/>
       <w:bookmarkEnd w:id="9"/>
       <w:r>
         <w:rPr>

</xml_diff>

<commit_message>
Apply shield emblem family to the framework proposal page
Shield family (family C) replaces the placeholder icons on all three
banners: ringed shield-and-chevron for Combat Mindset, shield within
the Prepare-Perform-Recover arcs for Performance Under Pressure, and
shield on the organising grid for the Framework. Emblems drawn as
parametric SVG in the builder. Paper embed regenerated.

Co-Authored-By: Claude Fable 5 <noreply@anthropic.com>
Claude-Session: https://claude.ai/code/session_01YLo1WfwUDkbwfJEF3ZNVbB
</commit_message>
<xml_diff>
--- a/output/combat-mindset-way-forward.docx
+++ b/output/combat-mindset-way-forward.docx
@@ -320,7 +320,7 @@
             </w:rPr>
             <w:fldChar w:fldCharType="separate"/>
           </w:r>
-          <w:hyperlink w:anchor="__RefHeading___Toc386_3380619225">
+          <w:hyperlink w:anchor="__RefHeading___Toc386_2310514572">
             <w:r>
               <w:rPr>
                 <w:webHidden/>
@@ -347,7 +347,7 @@
             </w:tabs>
             <w:rPr/>
           </w:pPr>
-          <w:hyperlink w:anchor="__RefHeading___Toc388_3380619225">
+          <w:hyperlink w:anchor="__RefHeading___Toc388_2310514572">
             <w:r>
               <w:rPr>
                 <w:webHidden/>
@@ -374,7 +374,7 @@
             </w:tabs>
             <w:rPr/>
           </w:pPr>
-          <w:hyperlink w:anchor="__RefHeading___Toc390_3380619225">
+          <w:hyperlink w:anchor="__RefHeading___Toc390_2310514572">
             <w:r>
               <w:rPr>
                 <w:webHidden/>
@@ -401,7 +401,7 @@
             </w:tabs>
             <w:rPr/>
           </w:pPr>
-          <w:hyperlink w:anchor="__RefHeading___Toc392_3380619225">
+          <w:hyperlink w:anchor="__RefHeading___Toc392_2310514572">
             <w:r>
               <w:rPr>
                 <w:webHidden/>
@@ -428,7 +428,7 @@
             </w:tabs>
             <w:rPr/>
           </w:pPr>
-          <w:hyperlink w:anchor="__RefHeading___Toc394_3380619225">
+          <w:hyperlink w:anchor="__RefHeading___Toc394_2310514572">
             <w:r>
               <w:rPr>
                 <w:webHidden/>
@@ -455,7 +455,7 @@
             </w:tabs>
             <w:rPr/>
           </w:pPr>
-          <w:hyperlink w:anchor="__RefHeading___Toc396_3380619225">
+          <w:hyperlink w:anchor="__RefHeading___Toc396_2310514572">
             <w:r>
               <w:rPr>
                 <w:webHidden/>
@@ -482,7 +482,7 @@
             </w:tabs>
             <w:rPr/>
           </w:pPr>
-          <w:hyperlink w:anchor="__RefHeading___Toc398_3380619225">
+          <w:hyperlink w:anchor="__RefHeading___Toc398_2310514572">
             <w:r>
               <w:rPr>
                 <w:webHidden/>
@@ -509,7 +509,7 @@
             </w:tabs>
             <w:rPr/>
           </w:pPr>
-          <w:hyperlink w:anchor="__RefHeading___Toc400_3380619225">
+          <w:hyperlink w:anchor="__RefHeading___Toc400_2310514572">
             <w:r>
               <w:rPr>
                 <w:webHidden/>
@@ -536,7 +536,7 @@
             </w:tabs>
             <w:rPr/>
           </w:pPr>
-          <w:hyperlink w:anchor="__RefHeading___Toc402_3380619225">
+          <w:hyperlink w:anchor="__RefHeading___Toc402_2310514572">
             <w:r>
               <w:rPr>
                 <w:webHidden/>
@@ -563,7 +563,7 @@
             </w:tabs>
             <w:rPr/>
           </w:pPr>
-          <w:hyperlink w:anchor="__RefHeading___Toc404_3380619225">
+          <w:hyperlink w:anchor="__RefHeading___Toc404_2310514572">
             <w:r>
               <w:rPr>
                 <w:webHidden/>
@@ -618,7 +618,7 @@
         <w:spacing w:before="0" w:after="160"/>
         <w:rPr/>
       </w:pPr>
-      <w:bookmarkStart w:id="0" w:name="__RefHeading___Toc386_3380619225"/>
+      <w:bookmarkStart w:id="0" w:name="__RefHeading___Toc386_2310514572"/>
       <w:bookmarkEnd w:id="0"/>
       <w:r>
         <w:rPr>
@@ -700,7 +700,7 @@
         </w:pBdr>
         <w:rPr/>
       </w:pPr>
-      <w:bookmarkStart w:id="1" w:name="__RefHeading___Toc388_3380619225"/>
+      <w:bookmarkStart w:id="1" w:name="__RefHeading___Toc388_2310514572"/>
       <w:bookmarkEnd w:id="1"/>
       <w:r>
         <w:rPr>
@@ -762,7 +762,7 @@
         </w:pBdr>
         <w:rPr/>
       </w:pPr>
-      <w:bookmarkStart w:id="2" w:name="__RefHeading___Toc390_3380619225"/>
+      <w:bookmarkStart w:id="2" w:name="__RefHeading___Toc390_2310514572"/>
       <w:bookmarkEnd w:id="2"/>
       <w:r>
         <w:rPr>
@@ -870,7 +870,7 @@
         </w:pBdr>
         <w:rPr/>
       </w:pPr>
-      <w:bookmarkStart w:id="3" w:name="__RefHeading___Toc392_3380619225"/>
+      <w:bookmarkStart w:id="3" w:name="__RefHeading___Toc392_2310514572"/>
       <w:bookmarkEnd w:id="3"/>
       <w:r>
         <w:rPr>
@@ -1428,7 +1428,7 @@
         </w:pBdr>
         <w:rPr/>
       </w:pPr>
-      <w:bookmarkStart w:id="4" w:name="__RefHeading___Toc394_3380619225"/>
+      <w:bookmarkStart w:id="4" w:name="__RefHeading___Toc394_2310514572"/>
       <w:bookmarkEnd w:id="4"/>
       <w:r>
         <w:rPr>
@@ -1594,7 +1594,7 @@
         </w:pBdr>
         <w:rPr/>
       </w:pPr>
-      <w:bookmarkStart w:id="5" w:name="__RefHeading___Toc396_3380619225"/>
+      <w:bookmarkStart w:id="5" w:name="__RefHeading___Toc396_2310514572"/>
       <w:bookmarkEnd w:id="5"/>
       <w:r>
         <w:rPr>
@@ -2476,7 +2476,7 @@
         </w:pBdr>
         <w:rPr/>
       </w:pPr>
-      <w:bookmarkStart w:id="6" w:name="__RefHeading___Toc398_3380619225"/>
+      <w:bookmarkStart w:id="6" w:name="__RefHeading___Toc398_2310514572"/>
       <w:bookmarkEnd w:id="6"/>
       <w:r>
         <w:rPr>
@@ -2776,7 +2776,7 @@
         </w:pBdr>
         <w:rPr/>
       </w:pPr>
-      <w:bookmarkStart w:id="7" w:name="__RefHeading___Toc400_3380619225"/>
+      <w:bookmarkStart w:id="7" w:name="__RefHeading___Toc400_2310514572"/>
       <w:bookmarkEnd w:id="7"/>
       <w:r>
         <w:rPr>
@@ -3078,7 +3078,7 @@
         <w:spacing w:before="0" w:after="160"/>
         <w:rPr/>
       </w:pPr>
-      <w:bookmarkStart w:id="8" w:name="__RefHeading___Toc402_3380619225"/>
+      <w:bookmarkStart w:id="8" w:name="__RefHeading___Toc402_2310514572"/>
       <w:bookmarkEnd w:id="8"/>
       <w:r>
         <w:rPr>
@@ -3235,7 +3235,7 @@
         </w:pBdr>
         <w:rPr/>
       </w:pPr>
-      <w:bookmarkStart w:id="9" w:name="__RefHeading___Toc404_3380619225"/>
+      <w:bookmarkStart w:id="9" w:name="__RefHeading___Toc404_2310514572"/>
       <w:bookmarkEnd w:id="9"/>
       <w:r>
         <w:rPr>

</xml_diff>

<commit_message>
Align banner emblem ink edges
The three emblems render at different sizes, so identical x offsets
left the Combat Mindset emblem visually indented; its x is adjusted so
all three ink edges sit on the same vertical line (measured within
0.25 mm at 300 dpi). Paper embed regenerated.

Co-Authored-By: Claude Fable 5 <noreply@anthropic.com>
Claude-Session: https://claude.ai/code/session_01YLo1WfwUDkbwfJEF3ZNVbB
</commit_message>
<xml_diff>
--- a/output/combat-mindset-way-forward.docx
+++ b/output/combat-mindset-way-forward.docx
@@ -320,7 +320,7 @@
             </w:rPr>
             <w:fldChar w:fldCharType="separate"/>
           </w:r>
-          <w:hyperlink w:anchor="__RefHeading___Toc386_2310514572">
+          <w:hyperlink w:anchor="__RefHeading___Toc386_2316868037">
             <w:r>
               <w:rPr>
                 <w:webHidden/>
@@ -347,7 +347,7 @@
             </w:tabs>
             <w:rPr/>
           </w:pPr>
-          <w:hyperlink w:anchor="__RefHeading___Toc388_2310514572">
+          <w:hyperlink w:anchor="__RefHeading___Toc388_2316868037">
             <w:r>
               <w:rPr>
                 <w:webHidden/>
@@ -374,7 +374,7 @@
             </w:tabs>
             <w:rPr/>
           </w:pPr>
-          <w:hyperlink w:anchor="__RefHeading___Toc390_2310514572">
+          <w:hyperlink w:anchor="__RefHeading___Toc390_2316868037">
             <w:r>
               <w:rPr>
                 <w:webHidden/>
@@ -401,7 +401,7 @@
             </w:tabs>
             <w:rPr/>
           </w:pPr>
-          <w:hyperlink w:anchor="__RefHeading___Toc392_2310514572">
+          <w:hyperlink w:anchor="__RefHeading___Toc392_2316868037">
             <w:r>
               <w:rPr>
                 <w:webHidden/>
@@ -428,7 +428,7 @@
             </w:tabs>
             <w:rPr/>
           </w:pPr>
-          <w:hyperlink w:anchor="__RefHeading___Toc394_2310514572">
+          <w:hyperlink w:anchor="__RefHeading___Toc394_2316868037">
             <w:r>
               <w:rPr>
                 <w:webHidden/>
@@ -455,7 +455,7 @@
             </w:tabs>
             <w:rPr/>
           </w:pPr>
-          <w:hyperlink w:anchor="__RefHeading___Toc396_2310514572">
+          <w:hyperlink w:anchor="__RefHeading___Toc396_2316868037">
             <w:r>
               <w:rPr>
                 <w:webHidden/>
@@ -482,7 +482,7 @@
             </w:tabs>
             <w:rPr/>
           </w:pPr>
-          <w:hyperlink w:anchor="__RefHeading___Toc398_2310514572">
+          <w:hyperlink w:anchor="__RefHeading___Toc398_2316868037">
             <w:r>
               <w:rPr>
                 <w:webHidden/>
@@ -509,7 +509,7 @@
             </w:tabs>
             <w:rPr/>
           </w:pPr>
-          <w:hyperlink w:anchor="__RefHeading___Toc400_2310514572">
+          <w:hyperlink w:anchor="__RefHeading___Toc400_2316868037">
             <w:r>
               <w:rPr>
                 <w:webHidden/>
@@ -536,7 +536,7 @@
             </w:tabs>
             <w:rPr/>
           </w:pPr>
-          <w:hyperlink w:anchor="__RefHeading___Toc402_2310514572">
+          <w:hyperlink w:anchor="__RefHeading___Toc402_2316868037">
             <w:r>
               <w:rPr>
                 <w:webHidden/>
@@ -563,7 +563,7 @@
             </w:tabs>
             <w:rPr/>
           </w:pPr>
-          <w:hyperlink w:anchor="__RefHeading___Toc404_2310514572">
+          <w:hyperlink w:anchor="__RefHeading___Toc404_2316868037">
             <w:r>
               <w:rPr>
                 <w:webHidden/>
@@ -618,7 +618,7 @@
         <w:spacing w:before="0" w:after="160"/>
         <w:rPr/>
       </w:pPr>
-      <w:bookmarkStart w:id="0" w:name="__RefHeading___Toc386_2310514572"/>
+      <w:bookmarkStart w:id="0" w:name="__RefHeading___Toc386_2316868037"/>
       <w:bookmarkEnd w:id="0"/>
       <w:r>
         <w:rPr>
@@ -700,7 +700,7 @@
         </w:pBdr>
         <w:rPr/>
       </w:pPr>
-      <w:bookmarkStart w:id="1" w:name="__RefHeading___Toc388_2310514572"/>
+      <w:bookmarkStart w:id="1" w:name="__RefHeading___Toc388_2316868037"/>
       <w:bookmarkEnd w:id="1"/>
       <w:r>
         <w:rPr>
@@ -762,7 +762,7 @@
         </w:pBdr>
         <w:rPr/>
       </w:pPr>
-      <w:bookmarkStart w:id="2" w:name="__RefHeading___Toc390_2310514572"/>
+      <w:bookmarkStart w:id="2" w:name="__RefHeading___Toc390_2316868037"/>
       <w:bookmarkEnd w:id="2"/>
       <w:r>
         <w:rPr>
@@ -870,7 +870,7 @@
         </w:pBdr>
         <w:rPr/>
       </w:pPr>
-      <w:bookmarkStart w:id="3" w:name="__RefHeading___Toc392_2310514572"/>
+      <w:bookmarkStart w:id="3" w:name="__RefHeading___Toc392_2316868037"/>
       <w:bookmarkEnd w:id="3"/>
       <w:r>
         <w:rPr>
@@ -1428,7 +1428,7 @@
         </w:pBdr>
         <w:rPr/>
       </w:pPr>
-      <w:bookmarkStart w:id="4" w:name="__RefHeading___Toc394_2310514572"/>
+      <w:bookmarkStart w:id="4" w:name="__RefHeading___Toc394_2316868037"/>
       <w:bookmarkEnd w:id="4"/>
       <w:r>
         <w:rPr>
@@ -1594,7 +1594,7 @@
         </w:pBdr>
         <w:rPr/>
       </w:pPr>
-      <w:bookmarkStart w:id="5" w:name="__RefHeading___Toc396_2310514572"/>
+      <w:bookmarkStart w:id="5" w:name="__RefHeading___Toc396_2316868037"/>
       <w:bookmarkEnd w:id="5"/>
       <w:r>
         <w:rPr>
@@ -2476,7 +2476,7 @@
         </w:pBdr>
         <w:rPr/>
       </w:pPr>
-      <w:bookmarkStart w:id="6" w:name="__RefHeading___Toc398_2310514572"/>
+      <w:bookmarkStart w:id="6" w:name="__RefHeading___Toc398_2316868037"/>
       <w:bookmarkEnd w:id="6"/>
       <w:r>
         <w:rPr>
@@ -2776,7 +2776,7 @@
         </w:pBdr>
         <w:rPr/>
       </w:pPr>
-      <w:bookmarkStart w:id="7" w:name="__RefHeading___Toc400_2310514572"/>
+      <w:bookmarkStart w:id="7" w:name="__RefHeading___Toc400_2316868037"/>
       <w:bookmarkEnd w:id="7"/>
       <w:r>
         <w:rPr>
@@ -3078,7 +3078,7 @@
         <w:spacing w:before="0" w:after="160"/>
         <w:rPr/>
       </w:pPr>
-      <w:bookmarkStart w:id="8" w:name="__RefHeading___Toc402_2310514572"/>
+      <w:bookmarkStart w:id="8" w:name="__RefHeading___Toc402_2316868037"/>
       <w:bookmarkEnd w:id="8"/>
       <w:r>
         <w:rPr>
@@ -3235,7 +3235,7 @@
         </w:pBdr>
         <w:rPr/>
       </w:pPr>
-      <w:bookmarkStart w:id="9" w:name="__RefHeading___Toc404_2310514572"/>
+      <w:bookmarkStart w:id="9" w:name="__RefHeading___Toc404_2316868037"/>
       <w:bookmarkEnd w:id="9"/>
       <w:r>
         <w:rPr>

</xml_diff>

<commit_message>
Soften main card corners (0.08in radius)
The four section cards now use gently rounded corners, matching the
capsule labels' language. Paper embed regenerated.

Co-Authored-By: Claude Fable 5 <noreply@anthropic.com>
Claude-Session: https://claude.ai/code/session_01YLo1WfwUDkbwfJEF3ZNVbB
</commit_message>
<xml_diff>
--- a/output/combat-mindset-way-forward.docx
+++ b/output/combat-mindset-way-forward.docx
@@ -320,7 +320,7 @@
             </w:rPr>
             <w:fldChar w:fldCharType="separate"/>
           </w:r>
-          <w:hyperlink w:anchor="__RefHeading___Toc386_2316868037">
+          <w:hyperlink w:anchor="__RefHeading___Toc386_2892160277">
             <w:r>
               <w:rPr>
                 <w:webHidden/>
@@ -347,7 +347,7 @@
             </w:tabs>
             <w:rPr/>
           </w:pPr>
-          <w:hyperlink w:anchor="__RefHeading___Toc388_2316868037">
+          <w:hyperlink w:anchor="__RefHeading___Toc388_2892160277">
             <w:r>
               <w:rPr>
                 <w:webHidden/>
@@ -374,7 +374,7 @@
             </w:tabs>
             <w:rPr/>
           </w:pPr>
-          <w:hyperlink w:anchor="__RefHeading___Toc390_2316868037">
+          <w:hyperlink w:anchor="__RefHeading___Toc390_2892160277">
             <w:r>
               <w:rPr>
                 <w:webHidden/>
@@ -401,7 +401,7 @@
             </w:tabs>
             <w:rPr/>
           </w:pPr>
-          <w:hyperlink w:anchor="__RefHeading___Toc392_2316868037">
+          <w:hyperlink w:anchor="__RefHeading___Toc392_2892160277">
             <w:r>
               <w:rPr>
                 <w:webHidden/>
@@ -428,7 +428,7 @@
             </w:tabs>
             <w:rPr/>
           </w:pPr>
-          <w:hyperlink w:anchor="__RefHeading___Toc394_2316868037">
+          <w:hyperlink w:anchor="__RefHeading___Toc394_2892160277">
             <w:r>
               <w:rPr>
                 <w:webHidden/>
@@ -455,7 +455,7 @@
             </w:tabs>
             <w:rPr/>
           </w:pPr>
-          <w:hyperlink w:anchor="__RefHeading___Toc396_2316868037">
+          <w:hyperlink w:anchor="__RefHeading___Toc396_2892160277">
             <w:r>
               <w:rPr>
                 <w:webHidden/>
@@ -482,7 +482,7 @@
             </w:tabs>
             <w:rPr/>
           </w:pPr>
-          <w:hyperlink w:anchor="__RefHeading___Toc398_2316868037">
+          <w:hyperlink w:anchor="__RefHeading___Toc398_2892160277">
             <w:r>
               <w:rPr>
                 <w:webHidden/>
@@ -509,7 +509,7 @@
             </w:tabs>
             <w:rPr/>
           </w:pPr>
-          <w:hyperlink w:anchor="__RefHeading___Toc400_2316868037">
+          <w:hyperlink w:anchor="__RefHeading___Toc400_2892160277">
             <w:r>
               <w:rPr>
                 <w:webHidden/>
@@ -536,7 +536,7 @@
             </w:tabs>
             <w:rPr/>
           </w:pPr>
-          <w:hyperlink w:anchor="__RefHeading___Toc402_2316868037">
+          <w:hyperlink w:anchor="__RefHeading___Toc402_2892160277">
             <w:r>
               <w:rPr>
                 <w:webHidden/>
@@ -563,7 +563,7 @@
             </w:tabs>
             <w:rPr/>
           </w:pPr>
-          <w:hyperlink w:anchor="__RefHeading___Toc404_2316868037">
+          <w:hyperlink w:anchor="__RefHeading___Toc404_2892160277">
             <w:r>
               <w:rPr>
                 <w:webHidden/>
@@ -618,7 +618,7 @@
         <w:spacing w:before="0" w:after="160"/>
         <w:rPr/>
       </w:pPr>
-      <w:bookmarkStart w:id="0" w:name="__RefHeading___Toc386_2316868037"/>
+      <w:bookmarkStart w:id="0" w:name="__RefHeading___Toc386_2892160277"/>
       <w:bookmarkEnd w:id="0"/>
       <w:r>
         <w:rPr>
@@ -700,7 +700,7 @@
         </w:pBdr>
         <w:rPr/>
       </w:pPr>
-      <w:bookmarkStart w:id="1" w:name="__RefHeading___Toc388_2316868037"/>
+      <w:bookmarkStart w:id="1" w:name="__RefHeading___Toc388_2892160277"/>
       <w:bookmarkEnd w:id="1"/>
       <w:r>
         <w:rPr>
@@ -762,7 +762,7 @@
         </w:pBdr>
         <w:rPr/>
       </w:pPr>
-      <w:bookmarkStart w:id="2" w:name="__RefHeading___Toc390_2316868037"/>
+      <w:bookmarkStart w:id="2" w:name="__RefHeading___Toc390_2892160277"/>
       <w:bookmarkEnd w:id="2"/>
       <w:r>
         <w:rPr>
@@ -870,7 +870,7 @@
         </w:pBdr>
         <w:rPr/>
       </w:pPr>
-      <w:bookmarkStart w:id="3" w:name="__RefHeading___Toc392_2316868037"/>
+      <w:bookmarkStart w:id="3" w:name="__RefHeading___Toc392_2892160277"/>
       <w:bookmarkEnd w:id="3"/>
       <w:r>
         <w:rPr>
@@ -1428,7 +1428,7 @@
         </w:pBdr>
         <w:rPr/>
       </w:pPr>
-      <w:bookmarkStart w:id="4" w:name="__RefHeading___Toc394_2316868037"/>
+      <w:bookmarkStart w:id="4" w:name="__RefHeading___Toc394_2892160277"/>
       <w:bookmarkEnd w:id="4"/>
       <w:r>
         <w:rPr>
@@ -1594,7 +1594,7 @@
         </w:pBdr>
         <w:rPr/>
       </w:pPr>
-      <w:bookmarkStart w:id="5" w:name="__RefHeading___Toc396_2316868037"/>
+      <w:bookmarkStart w:id="5" w:name="__RefHeading___Toc396_2892160277"/>
       <w:bookmarkEnd w:id="5"/>
       <w:r>
         <w:rPr>
@@ -2476,7 +2476,7 @@
         </w:pBdr>
         <w:rPr/>
       </w:pPr>
-      <w:bookmarkStart w:id="6" w:name="__RefHeading___Toc398_2316868037"/>
+      <w:bookmarkStart w:id="6" w:name="__RefHeading___Toc398_2892160277"/>
       <w:bookmarkEnd w:id="6"/>
       <w:r>
         <w:rPr>
@@ -2776,7 +2776,7 @@
         </w:pBdr>
         <w:rPr/>
       </w:pPr>
-      <w:bookmarkStart w:id="7" w:name="__RefHeading___Toc400_2316868037"/>
+      <w:bookmarkStart w:id="7" w:name="__RefHeading___Toc400_2892160277"/>
       <w:bookmarkEnd w:id="7"/>
       <w:r>
         <w:rPr>
@@ -3078,7 +3078,7 @@
         <w:spacing w:before="0" w:after="160"/>
         <w:rPr/>
       </w:pPr>
-      <w:bookmarkStart w:id="8" w:name="__RefHeading___Toc402_2316868037"/>
+      <w:bookmarkStart w:id="8" w:name="__RefHeading___Toc402_2892160277"/>
       <w:bookmarkEnd w:id="8"/>
       <w:r>
         <w:rPr>
@@ -3235,7 +3235,7 @@
         </w:pBdr>
         <w:rPr/>
       </w:pPr>
-      <w:bookmarkStart w:id="9" w:name="__RefHeading___Toc404_2316868037"/>
+      <w:bookmarkStart w:id="9" w:name="__RefHeading___Toc404_2892160277"/>
       <w:bookmarkEnd w:id="9"/>
       <w:r>
         <w:rPr>

</xml_diff>

<commit_message>
Third card retitled COMBAT MINDSET FRAMEWORK
NZ Army dropped from the framework card title; the supporting sentence
still attributes the system to Army. Paper embed regenerated.

Co-Authored-By: Claude Fable 5 <noreply@anthropic.com>
Claude-Session: https://claude.ai/code/session_01YLo1WfwUDkbwfJEF3ZNVbB
</commit_message>
<xml_diff>
--- a/output/combat-mindset-way-forward.docx
+++ b/output/combat-mindset-way-forward.docx
@@ -320,7 +320,7 @@
             </w:rPr>
             <w:fldChar w:fldCharType="separate"/>
           </w:r>
-          <w:hyperlink w:anchor="__RefHeading___Toc386_2892160277">
+          <w:hyperlink w:anchor="__RefHeading___Toc386_3896279339">
             <w:r>
               <w:rPr>
                 <w:webHidden/>
@@ -347,7 +347,7 @@
             </w:tabs>
             <w:rPr/>
           </w:pPr>
-          <w:hyperlink w:anchor="__RefHeading___Toc388_2892160277">
+          <w:hyperlink w:anchor="__RefHeading___Toc388_3896279339">
             <w:r>
               <w:rPr>
                 <w:webHidden/>
@@ -374,7 +374,7 @@
             </w:tabs>
             <w:rPr/>
           </w:pPr>
-          <w:hyperlink w:anchor="__RefHeading___Toc390_2892160277">
+          <w:hyperlink w:anchor="__RefHeading___Toc390_3896279339">
             <w:r>
               <w:rPr>
                 <w:webHidden/>
@@ -401,7 +401,7 @@
             </w:tabs>
             <w:rPr/>
           </w:pPr>
-          <w:hyperlink w:anchor="__RefHeading___Toc392_2892160277">
+          <w:hyperlink w:anchor="__RefHeading___Toc392_3896279339">
             <w:r>
               <w:rPr>
                 <w:webHidden/>
@@ -428,7 +428,7 @@
             </w:tabs>
             <w:rPr/>
           </w:pPr>
-          <w:hyperlink w:anchor="__RefHeading___Toc394_2892160277">
+          <w:hyperlink w:anchor="__RefHeading___Toc394_3896279339">
             <w:r>
               <w:rPr>
                 <w:webHidden/>
@@ -455,7 +455,7 @@
             </w:tabs>
             <w:rPr/>
           </w:pPr>
-          <w:hyperlink w:anchor="__RefHeading___Toc396_2892160277">
+          <w:hyperlink w:anchor="__RefHeading___Toc396_3896279339">
             <w:r>
               <w:rPr>
                 <w:webHidden/>
@@ -482,7 +482,7 @@
             </w:tabs>
             <w:rPr/>
           </w:pPr>
-          <w:hyperlink w:anchor="__RefHeading___Toc398_2892160277">
+          <w:hyperlink w:anchor="__RefHeading___Toc398_3896279339">
             <w:r>
               <w:rPr>
                 <w:webHidden/>
@@ -509,7 +509,7 @@
             </w:tabs>
             <w:rPr/>
           </w:pPr>
-          <w:hyperlink w:anchor="__RefHeading___Toc400_2892160277">
+          <w:hyperlink w:anchor="__RefHeading___Toc400_3896279339">
             <w:r>
               <w:rPr>
                 <w:webHidden/>
@@ -536,7 +536,7 @@
             </w:tabs>
             <w:rPr/>
           </w:pPr>
-          <w:hyperlink w:anchor="__RefHeading___Toc402_2892160277">
+          <w:hyperlink w:anchor="__RefHeading___Toc402_3896279339">
             <w:r>
               <w:rPr>
                 <w:webHidden/>
@@ -563,7 +563,7 @@
             </w:tabs>
             <w:rPr/>
           </w:pPr>
-          <w:hyperlink w:anchor="__RefHeading___Toc404_2892160277">
+          <w:hyperlink w:anchor="__RefHeading___Toc404_3896279339">
             <w:r>
               <w:rPr>
                 <w:webHidden/>
@@ -618,7 +618,7 @@
         <w:spacing w:before="0" w:after="160"/>
         <w:rPr/>
       </w:pPr>
-      <w:bookmarkStart w:id="0" w:name="__RefHeading___Toc386_2892160277"/>
+      <w:bookmarkStart w:id="0" w:name="__RefHeading___Toc386_3896279339"/>
       <w:bookmarkEnd w:id="0"/>
       <w:r>
         <w:rPr>
@@ -700,7 +700,7 @@
         </w:pBdr>
         <w:rPr/>
       </w:pPr>
-      <w:bookmarkStart w:id="1" w:name="__RefHeading___Toc388_2892160277"/>
+      <w:bookmarkStart w:id="1" w:name="__RefHeading___Toc388_3896279339"/>
       <w:bookmarkEnd w:id="1"/>
       <w:r>
         <w:rPr>
@@ -762,7 +762,7 @@
         </w:pBdr>
         <w:rPr/>
       </w:pPr>
-      <w:bookmarkStart w:id="2" w:name="__RefHeading___Toc390_2892160277"/>
+      <w:bookmarkStart w:id="2" w:name="__RefHeading___Toc390_3896279339"/>
       <w:bookmarkEnd w:id="2"/>
       <w:r>
         <w:rPr>
@@ -870,7 +870,7 @@
         </w:pBdr>
         <w:rPr/>
       </w:pPr>
-      <w:bookmarkStart w:id="3" w:name="__RefHeading___Toc392_2892160277"/>
+      <w:bookmarkStart w:id="3" w:name="__RefHeading___Toc392_3896279339"/>
       <w:bookmarkEnd w:id="3"/>
       <w:r>
         <w:rPr>
@@ -1428,7 +1428,7 @@
         </w:pBdr>
         <w:rPr/>
       </w:pPr>
-      <w:bookmarkStart w:id="4" w:name="__RefHeading___Toc394_2892160277"/>
+      <w:bookmarkStart w:id="4" w:name="__RefHeading___Toc394_3896279339"/>
       <w:bookmarkEnd w:id="4"/>
       <w:r>
         <w:rPr>
@@ -1594,7 +1594,7 @@
         </w:pBdr>
         <w:rPr/>
       </w:pPr>
-      <w:bookmarkStart w:id="5" w:name="__RefHeading___Toc396_2892160277"/>
+      <w:bookmarkStart w:id="5" w:name="__RefHeading___Toc396_3896279339"/>
       <w:bookmarkEnd w:id="5"/>
       <w:r>
         <w:rPr>
@@ -2476,7 +2476,7 @@
         </w:pBdr>
         <w:rPr/>
       </w:pPr>
-      <w:bookmarkStart w:id="6" w:name="__RefHeading___Toc398_2892160277"/>
+      <w:bookmarkStart w:id="6" w:name="__RefHeading___Toc398_3896279339"/>
       <w:bookmarkEnd w:id="6"/>
       <w:r>
         <w:rPr>
@@ -2776,7 +2776,7 @@
         </w:pBdr>
         <w:rPr/>
       </w:pPr>
-      <w:bookmarkStart w:id="7" w:name="__RefHeading___Toc400_2892160277"/>
+      <w:bookmarkStart w:id="7" w:name="__RefHeading___Toc400_3896279339"/>
       <w:bookmarkEnd w:id="7"/>
       <w:r>
         <w:rPr>
@@ -3078,7 +3078,7 @@
         <w:spacing w:before="0" w:after="160"/>
         <w:rPr/>
       </w:pPr>
-      <w:bookmarkStart w:id="8" w:name="__RefHeading___Toc402_2892160277"/>
+      <w:bookmarkStart w:id="8" w:name="__RefHeading___Toc402_3896279339"/>
       <w:bookmarkEnd w:id="8"/>
       <w:r>
         <w:rPr>
@@ -3235,7 +3235,7 @@
         </w:pBdr>
         <w:rPr/>
       </w:pPr>
-      <w:bookmarkStart w:id="9" w:name="__RefHeading___Toc404_2892160277"/>
+      <w:bookmarkStart w:id="9" w:name="__RefHeading___Toc404_3896279339"/>
       <w:bookmarkEnd w:id="9"/>
       <w:r>
         <w:rPr>

</xml_diff>

<commit_message>
Match card 2 and card 3 title sizes (22.5pt)
Combat Mindset Framework title raised from 17.5pt to match Performance
Under Pressure; the two enabling/organising cards now read as peers
beneath the Combat Mindset hero. Paper embed regenerated.

Co-Authored-By: Claude Fable 5 <noreply@anthropic.com>
Claude-Session: https://claude.ai/code/session_01YLo1WfwUDkbwfJEF3ZNVbB
</commit_message>
<xml_diff>
--- a/output/combat-mindset-way-forward.docx
+++ b/output/combat-mindset-way-forward.docx
@@ -320,7 +320,7 @@
             </w:rPr>
             <w:fldChar w:fldCharType="separate"/>
           </w:r>
-          <w:hyperlink w:anchor="__RefHeading___Toc386_3896279339">
+          <w:hyperlink w:anchor="__RefHeading___Toc386_2504271561">
             <w:r>
               <w:rPr>
                 <w:webHidden/>
@@ -347,7 +347,7 @@
             </w:tabs>
             <w:rPr/>
           </w:pPr>
-          <w:hyperlink w:anchor="__RefHeading___Toc388_3896279339">
+          <w:hyperlink w:anchor="__RefHeading___Toc388_2504271561">
             <w:r>
               <w:rPr>
                 <w:webHidden/>
@@ -374,7 +374,7 @@
             </w:tabs>
             <w:rPr/>
           </w:pPr>
-          <w:hyperlink w:anchor="__RefHeading___Toc390_3896279339">
+          <w:hyperlink w:anchor="__RefHeading___Toc390_2504271561">
             <w:r>
               <w:rPr>
                 <w:webHidden/>
@@ -401,7 +401,7 @@
             </w:tabs>
             <w:rPr/>
           </w:pPr>
-          <w:hyperlink w:anchor="__RefHeading___Toc392_3896279339">
+          <w:hyperlink w:anchor="__RefHeading___Toc392_2504271561">
             <w:r>
               <w:rPr>
                 <w:webHidden/>
@@ -428,7 +428,7 @@
             </w:tabs>
             <w:rPr/>
           </w:pPr>
-          <w:hyperlink w:anchor="__RefHeading___Toc394_3896279339">
+          <w:hyperlink w:anchor="__RefHeading___Toc394_2504271561">
             <w:r>
               <w:rPr>
                 <w:webHidden/>
@@ -455,7 +455,7 @@
             </w:tabs>
             <w:rPr/>
           </w:pPr>
-          <w:hyperlink w:anchor="__RefHeading___Toc396_3896279339">
+          <w:hyperlink w:anchor="__RefHeading___Toc396_2504271561">
             <w:r>
               <w:rPr>
                 <w:webHidden/>
@@ -482,7 +482,7 @@
             </w:tabs>
             <w:rPr/>
           </w:pPr>
-          <w:hyperlink w:anchor="__RefHeading___Toc398_3896279339">
+          <w:hyperlink w:anchor="__RefHeading___Toc398_2504271561">
             <w:r>
               <w:rPr>
                 <w:webHidden/>
@@ -509,7 +509,7 @@
             </w:tabs>
             <w:rPr/>
           </w:pPr>
-          <w:hyperlink w:anchor="__RefHeading___Toc400_3896279339">
+          <w:hyperlink w:anchor="__RefHeading___Toc400_2504271561">
             <w:r>
               <w:rPr>
                 <w:webHidden/>
@@ -536,7 +536,7 @@
             </w:tabs>
             <w:rPr/>
           </w:pPr>
-          <w:hyperlink w:anchor="__RefHeading___Toc402_3896279339">
+          <w:hyperlink w:anchor="__RefHeading___Toc402_2504271561">
             <w:r>
               <w:rPr>
                 <w:webHidden/>
@@ -563,7 +563,7 @@
             </w:tabs>
             <w:rPr/>
           </w:pPr>
-          <w:hyperlink w:anchor="__RefHeading___Toc404_3896279339">
+          <w:hyperlink w:anchor="__RefHeading___Toc404_2504271561">
             <w:r>
               <w:rPr>
                 <w:webHidden/>
@@ -618,7 +618,7 @@
         <w:spacing w:before="0" w:after="160"/>
         <w:rPr/>
       </w:pPr>
-      <w:bookmarkStart w:id="0" w:name="__RefHeading___Toc386_3896279339"/>
+      <w:bookmarkStart w:id="0" w:name="__RefHeading___Toc386_2504271561"/>
       <w:bookmarkEnd w:id="0"/>
       <w:r>
         <w:rPr>
@@ -700,7 +700,7 @@
         </w:pBdr>
         <w:rPr/>
       </w:pPr>
-      <w:bookmarkStart w:id="1" w:name="__RefHeading___Toc388_3896279339"/>
+      <w:bookmarkStart w:id="1" w:name="__RefHeading___Toc388_2504271561"/>
       <w:bookmarkEnd w:id="1"/>
       <w:r>
         <w:rPr>
@@ -762,7 +762,7 @@
         </w:pBdr>
         <w:rPr/>
       </w:pPr>
-      <w:bookmarkStart w:id="2" w:name="__RefHeading___Toc390_3896279339"/>
+      <w:bookmarkStart w:id="2" w:name="__RefHeading___Toc390_2504271561"/>
       <w:bookmarkEnd w:id="2"/>
       <w:r>
         <w:rPr>
@@ -870,7 +870,7 @@
         </w:pBdr>
         <w:rPr/>
       </w:pPr>
-      <w:bookmarkStart w:id="3" w:name="__RefHeading___Toc392_3896279339"/>
+      <w:bookmarkStart w:id="3" w:name="__RefHeading___Toc392_2504271561"/>
       <w:bookmarkEnd w:id="3"/>
       <w:r>
         <w:rPr>
@@ -1428,7 +1428,7 @@
         </w:pBdr>
         <w:rPr/>
       </w:pPr>
-      <w:bookmarkStart w:id="4" w:name="__RefHeading___Toc394_3896279339"/>
+      <w:bookmarkStart w:id="4" w:name="__RefHeading___Toc394_2504271561"/>
       <w:bookmarkEnd w:id="4"/>
       <w:r>
         <w:rPr>
@@ -1594,7 +1594,7 @@
         </w:pBdr>
         <w:rPr/>
       </w:pPr>
-      <w:bookmarkStart w:id="5" w:name="__RefHeading___Toc396_3896279339"/>
+      <w:bookmarkStart w:id="5" w:name="__RefHeading___Toc396_2504271561"/>
       <w:bookmarkEnd w:id="5"/>
       <w:r>
         <w:rPr>
@@ -2476,7 +2476,7 @@
         </w:pBdr>
         <w:rPr/>
       </w:pPr>
-      <w:bookmarkStart w:id="6" w:name="__RefHeading___Toc398_3896279339"/>
+      <w:bookmarkStart w:id="6" w:name="__RefHeading___Toc398_2504271561"/>
       <w:bookmarkEnd w:id="6"/>
       <w:r>
         <w:rPr>
@@ -2776,7 +2776,7 @@
         </w:pBdr>
         <w:rPr/>
       </w:pPr>
-      <w:bookmarkStart w:id="7" w:name="__RefHeading___Toc400_3896279339"/>
+      <w:bookmarkStart w:id="7" w:name="__RefHeading___Toc400_2504271561"/>
       <w:bookmarkEnd w:id="7"/>
       <w:r>
         <w:rPr>
@@ -3078,7 +3078,7 @@
         <w:spacing w:before="0" w:after="160"/>
         <w:rPr/>
       </w:pPr>
-      <w:bookmarkStart w:id="8" w:name="__RefHeading___Toc402_3896279339"/>
+      <w:bookmarkStart w:id="8" w:name="__RefHeading___Toc402_2504271561"/>
       <w:bookmarkEnd w:id="8"/>
       <w:r>
         <w:rPr>
@@ -3235,7 +3235,7 @@
         </w:pBdr>
         <w:rPr/>
       </w:pPr>
-      <w:bookmarkStart w:id="9" w:name="__RefHeading___Toc404_3896279339"/>
+      <w:bookmarkStart w:id="9" w:name="__RefHeading___Toc404_2504271561"/>
       <w:bookmarkEnd w:id="9"/>
       <w:r>
         <w:rPr>

</xml_diff>

<commit_message>
Card 3 sentence: the framework through which Combat Mindset...
Co-Authored-By: Claude Fable 5 <noreply@anthropic.com>
Claude-Session: https://claude.ai/code/session_01YLo1WfwUDkbwfJEF3ZNVbB
</commit_message>
<xml_diff>
--- a/output/combat-mindset-way-forward.docx
+++ b/output/combat-mindset-way-forward.docx
@@ -320,7 +320,7 @@
             </w:rPr>
             <w:fldChar w:fldCharType="separate"/>
           </w:r>
-          <w:hyperlink w:anchor="__RefHeading___Toc386_2504271561">
+          <w:hyperlink w:anchor="__RefHeading___Toc386_3274712211">
             <w:r>
               <w:rPr>
                 <w:webHidden/>
@@ -347,7 +347,7 @@
             </w:tabs>
             <w:rPr/>
           </w:pPr>
-          <w:hyperlink w:anchor="__RefHeading___Toc388_2504271561">
+          <w:hyperlink w:anchor="__RefHeading___Toc388_3274712211">
             <w:r>
               <w:rPr>
                 <w:webHidden/>
@@ -374,7 +374,7 @@
             </w:tabs>
             <w:rPr/>
           </w:pPr>
-          <w:hyperlink w:anchor="__RefHeading___Toc390_2504271561">
+          <w:hyperlink w:anchor="__RefHeading___Toc390_3274712211">
             <w:r>
               <w:rPr>
                 <w:webHidden/>
@@ -401,7 +401,7 @@
             </w:tabs>
             <w:rPr/>
           </w:pPr>
-          <w:hyperlink w:anchor="__RefHeading___Toc392_2504271561">
+          <w:hyperlink w:anchor="__RefHeading___Toc392_3274712211">
             <w:r>
               <w:rPr>
                 <w:webHidden/>
@@ -428,7 +428,7 @@
             </w:tabs>
             <w:rPr/>
           </w:pPr>
-          <w:hyperlink w:anchor="__RefHeading___Toc394_2504271561">
+          <w:hyperlink w:anchor="__RefHeading___Toc394_3274712211">
             <w:r>
               <w:rPr>
                 <w:webHidden/>
@@ -455,7 +455,7 @@
             </w:tabs>
             <w:rPr/>
           </w:pPr>
-          <w:hyperlink w:anchor="__RefHeading___Toc396_2504271561">
+          <w:hyperlink w:anchor="__RefHeading___Toc396_3274712211">
             <w:r>
               <w:rPr>
                 <w:webHidden/>
@@ -482,7 +482,7 @@
             </w:tabs>
             <w:rPr/>
           </w:pPr>
-          <w:hyperlink w:anchor="__RefHeading___Toc398_2504271561">
+          <w:hyperlink w:anchor="__RefHeading___Toc398_3274712211">
             <w:r>
               <w:rPr>
                 <w:webHidden/>
@@ -509,7 +509,7 @@
             </w:tabs>
             <w:rPr/>
           </w:pPr>
-          <w:hyperlink w:anchor="__RefHeading___Toc400_2504271561">
+          <w:hyperlink w:anchor="__RefHeading___Toc400_3274712211">
             <w:r>
               <w:rPr>
                 <w:webHidden/>
@@ -536,7 +536,7 @@
             </w:tabs>
             <w:rPr/>
           </w:pPr>
-          <w:hyperlink w:anchor="__RefHeading___Toc402_2504271561">
+          <w:hyperlink w:anchor="__RefHeading___Toc402_3274712211">
             <w:r>
               <w:rPr>
                 <w:webHidden/>
@@ -563,7 +563,7 @@
             </w:tabs>
             <w:rPr/>
           </w:pPr>
-          <w:hyperlink w:anchor="__RefHeading___Toc404_2504271561">
+          <w:hyperlink w:anchor="__RefHeading___Toc404_3274712211">
             <w:r>
               <w:rPr>
                 <w:webHidden/>
@@ -618,7 +618,7 @@
         <w:spacing w:before="0" w:after="160"/>
         <w:rPr/>
       </w:pPr>
-      <w:bookmarkStart w:id="0" w:name="__RefHeading___Toc386_2504271561"/>
+      <w:bookmarkStart w:id="0" w:name="__RefHeading___Toc386_3274712211"/>
       <w:bookmarkEnd w:id="0"/>
       <w:r>
         <w:rPr>
@@ -700,7 +700,7 @@
         </w:pBdr>
         <w:rPr/>
       </w:pPr>
-      <w:bookmarkStart w:id="1" w:name="__RefHeading___Toc388_2504271561"/>
+      <w:bookmarkStart w:id="1" w:name="__RefHeading___Toc388_3274712211"/>
       <w:bookmarkEnd w:id="1"/>
       <w:r>
         <w:rPr>
@@ -762,7 +762,7 @@
         </w:pBdr>
         <w:rPr/>
       </w:pPr>
-      <w:bookmarkStart w:id="2" w:name="__RefHeading___Toc390_2504271561"/>
+      <w:bookmarkStart w:id="2" w:name="__RefHeading___Toc390_3274712211"/>
       <w:bookmarkEnd w:id="2"/>
       <w:r>
         <w:rPr>
@@ -870,7 +870,7 @@
         </w:pBdr>
         <w:rPr/>
       </w:pPr>
-      <w:bookmarkStart w:id="3" w:name="__RefHeading___Toc392_2504271561"/>
+      <w:bookmarkStart w:id="3" w:name="__RefHeading___Toc392_3274712211"/>
       <w:bookmarkEnd w:id="3"/>
       <w:r>
         <w:rPr>
@@ -1428,7 +1428,7 @@
         </w:pBdr>
         <w:rPr/>
       </w:pPr>
-      <w:bookmarkStart w:id="4" w:name="__RefHeading___Toc394_2504271561"/>
+      <w:bookmarkStart w:id="4" w:name="__RefHeading___Toc394_3274712211"/>
       <w:bookmarkEnd w:id="4"/>
       <w:r>
         <w:rPr>
@@ -1594,7 +1594,7 @@
         </w:pBdr>
         <w:rPr/>
       </w:pPr>
-      <w:bookmarkStart w:id="5" w:name="__RefHeading___Toc396_2504271561"/>
+      <w:bookmarkStart w:id="5" w:name="__RefHeading___Toc396_3274712211"/>
       <w:bookmarkEnd w:id="5"/>
       <w:r>
         <w:rPr>
@@ -2476,7 +2476,7 @@
         </w:pBdr>
         <w:rPr/>
       </w:pPr>
-      <w:bookmarkStart w:id="6" w:name="__RefHeading___Toc398_2504271561"/>
+      <w:bookmarkStart w:id="6" w:name="__RefHeading___Toc398_3274712211"/>
       <w:bookmarkEnd w:id="6"/>
       <w:r>
         <w:rPr>
@@ -2776,7 +2776,7 @@
         </w:pBdr>
         <w:rPr/>
       </w:pPr>
-      <w:bookmarkStart w:id="7" w:name="__RefHeading___Toc400_2504271561"/>
+      <w:bookmarkStart w:id="7" w:name="__RefHeading___Toc400_3274712211"/>
       <w:bookmarkEnd w:id="7"/>
       <w:r>
         <w:rPr>
@@ -3078,7 +3078,7 @@
         <w:spacing w:before="0" w:after="160"/>
         <w:rPr/>
       </w:pPr>
-      <w:bookmarkStart w:id="8" w:name="__RefHeading___Toc402_2504271561"/>
+      <w:bookmarkStart w:id="8" w:name="__RefHeading___Toc402_3274712211"/>
       <w:bookmarkEnd w:id="8"/>
       <w:r>
         <w:rPr>
@@ -3235,7 +3235,7 @@
         </w:pBdr>
         <w:rPr/>
       </w:pPr>
-      <w:bookmarkStart w:id="9" w:name="__RefHeading___Toc404_2504271561"/>
+      <w:bookmarkStart w:id="9" w:name="__RefHeading___Toc404_3274712211"/>
       <w:bookmarkEnd w:id="9"/>
       <w:r>
         <w:rPr>

</xml_diff>

<commit_message>
Card 2 capsule: ENABLING CAPABILITY
Co-Authored-By: Claude Fable 5 <noreply@anthropic.com>
Claude-Session: https://claude.ai/code/session_01YLo1WfwUDkbwfJEF3ZNVbB
</commit_message>
<xml_diff>
--- a/output/combat-mindset-way-forward.docx
+++ b/output/combat-mindset-way-forward.docx
@@ -320,7 +320,7 @@
             </w:rPr>
             <w:fldChar w:fldCharType="separate"/>
           </w:r>
-          <w:hyperlink w:anchor="__RefHeading___Toc386_3274712211">
+          <w:hyperlink w:anchor="__RefHeading___Toc386_2636275479">
             <w:r>
               <w:rPr>
                 <w:webHidden/>
@@ -347,7 +347,7 @@
             </w:tabs>
             <w:rPr/>
           </w:pPr>
-          <w:hyperlink w:anchor="__RefHeading___Toc388_3274712211">
+          <w:hyperlink w:anchor="__RefHeading___Toc388_2636275479">
             <w:r>
               <w:rPr>
                 <w:webHidden/>
@@ -374,7 +374,7 @@
             </w:tabs>
             <w:rPr/>
           </w:pPr>
-          <w:hyperlink w:anchor="__RefHeading___Toc390_3274712211">
+          <w:hyperlink w:anchor="__RefHeading___Toc390_2636275479">
             <w:r>
               <w:rPr>
                 <w:webHidden/>
@@ -401,7 +401,7 @@
             </w:tabs>
             <w:rPr/>
           </w:pPr>
-          <w:hyperlink w:anchor="__RefHeading___Toc392_3274712211">
+          <w:hyperlink w:anchor="__RefHeading___Toc392_2636275479">
             <w:r>
               <w:rPr>
                 <w:webHidden/>
@@ -428,7 +428,7 @@
             </w:tabs>
             <w:rPr/>
           </w:pPr>
-          <w:hyperlink w:anchor="__RefHeading___Toc394_3274712211">
+          <w:hyperlink w:anchor="__RefHeading___Toc394_2636275479">
             <w:r>
               <w:rPr>
                 <w:webHidden/>
@@ -455,7 +455,7 @@
             </w:tabs>
             <w:rPr/>
           </w:pPr>
-          <w:hyperlink w:anchor="__RefHeading___Toc396_3274712211">
+          <w:hyperlink w:anchor="__RefHeading___Toc396_2636275479">
             <w:r>
               <w:rPr>
                 <w:webHidden/>
@@ -482,7 +482,7 @@
             </w:tabs>
             <w:rPr/>
           </w:pPr>
-          <w:hyperlink w:anchor="__RefHeading___Toc398_3274712211">
+          <w:hyperlink w:anchor="__RefHeading___Toc398_2636275479">
             <w:r>
               <w:rPr>
                 <w:webHidden/>
@@ -509,7 +509,7 @@
             </w:tabs>
             <w:rPr/>
           </w:pPr>
-          <w:hyperlink w:anchor="__RefHeading___Toc400_3274712211">
+          <w:hyperlink w:anchor="__RefHeading___Toc400_2636275479">
             <w:r>
               <w:rPr>
                 <w:webHidden/>
@@ -536,7 +536,7 @@
             </w:tabs>
             <w:rPr/>
           </w:pPr>
-          <w:hyperlink w:anchor="__RefHeading___Toc402_3274712211">
+          <w:hyperlink w:anchor="__RefHeading___Toc402_2636275479">
             <w:r>
               <w:rPr>
                 <w:webHidden/>
@@ -563,7 +563,7 @@
             </w:tabs>
             <w:rPr/>
           </w:pPr>
-          <w:hyperlink w:anchor="__RefHeading___Toc404_3274712211">
+          <w:hyperlink w:anchor="__RefHeading___Toc404_2636275479">
             <w:r>
               <w:rPr>
                 <w:webHidden/>
@@ -618,7 +618,7 @@
         <w:spacing w:before="0" w:after="160"/>
         <w:rPr/>
       </w:pPr>
-      <w:bookmarkStart w:id="0" w:name="__RefHeading___Toc386_3274712211"/>
+      <w:bookmarkStart w:id="0" w:name="__RefHeading___Toc386_2636275479"/>
       <w:bookmarkEnd w:id="0"/>
       <w:r>
         <w:rPr>
@@ -700,7 +700,7 @@
         </w:pBdr>
         <w:rPr/>
       </w:pPr>
-      <w:bookmarkStart w:id="1" w:name="__RefHeading___Toc388_3274712211"/>
+      <w:bookmarkStart w:id="1" w:name="__RefHeading___Toc388_2636275479"/>
       <w:bookmarkEnd w:id="1"/>
       <w:r>
         <w:rPr>
@@ -762,7 +762,7 @@
         </w:pBdr>
         <w:rPr/>
       </w:pPr>
-      <w:bookmarkStart w:id="2" w:name="__RefHeading___Toc390_3274712211"/>
+      <w:bookmarkStart w:id="2" w:name="__RefHeading___Toc390_2636275479"/>
       <w:bookmarkEnd w:id="2"/>
       <w:r>
         <w:rPr>
@@ -870,7 +870,7 @@
         </w:pBdr>
         <w:rPr/>
       </w:pPr>
-      <w:bookmarkStart w:id="3" w:name="__RefHeading___Toc392_3274712211"/>
+      <w:bookmarkStart w:id="3" w:name="__RefHeading___Toc392_2636275479"/>
       <w:bookmarkEnd w:id="3"/>
       <w:r>
         <w:rPr>
@@ -1428,7 +1428,7 @@
         </w:pBdr>
         <w:rPr/>
       </w:pPr>
-      <w:bookmarkStart w:id="4" w:name="__RefHeading___Toc394_3274712211"/>
+      <w:bookmarkStart w:id="4" w:name="__RefHeading___Toc394_2636275479"/>
       <w:bookmarkEnd w:id="4"/>
       <w:r>
         <w:rPr>
@@ -1594,7 +1594,7 @@
         </w:pBdr>
         <w:rPr/>
       </w:pPr>
-      <w:bookmarkStart w:id="5" w:name="__RefHeading___Toc396_3274712211"/>
+      <w:bookmarkStart w:id="5" w:name="__RefHeading___Toc396_2636275479"/>
       <w:bookmarkEnd w:id="5"/>
       <w:r>
         <w:rPr>
@@ -2476,7 +2476,7 @@
         </w:pBdr>
         <w:rPr/>
       </w:pPr>
-      <w:bookmarkStart w:id="6" w:name="__RefHeading___Toc398_3274712211"/>
+      <w:bookmarkStart w:id="6" w:name="__RefHeading___Toc398_2636275479"/>
       <w:bookmarkEnd w:id="6"/>
       <w:r>
         <w:rPr>
@@ -2776,7 +2776,7 @@
         </w:pBdr>
         <w:rPr/>
       </w:pPr>
-      <w:bookmarkStart w:id="7" w:name="__RefHeading___Toc400_3274712211"/>
+      <w:bookmarkStart w:id="7" w:name="__RefHeading___Toc400_2636275479"/>
       <w:bookmarkEnd w:id="7"/>
       <w:r>
         <w:rPr>
@@ -3078,7 +3078,7 @@
         <w:spacing w:before="0" w:after="160"/>
         <w:rPr/>
       </w:pPr>
-      <w:bookmarkStart w:id="8" w:name="__RefHeading___Toc402_3274712211"/>
+      <w:bookmarkStart w:id="8" w:name="__RefHeading___Toc402_2636275479"/>
       <w:bookmarkEnd w:id="8"/>
       <w:r>
         <w:rPr>
@@ -3235,7 +3235,7 @@
         </w:pBdr>
         <w:rPr/>
       </w:pPr>
-      <w:bookmarkStart w:id="9" w:name="__RefHeading___Toc404_3274712211"/>
+      <w:bookmarkStart w:id="9" w:name="__RefHeading___Toc404_2636275479"/>
       <w:bookmarkEnd w:id="9"/>
       <w:r>
         <w:rPr>

</xml_diff>

<commit_message>
Card 2 subordinate line sized to match card 3 (9.5pt)
Co-Authored-By: Claude Fable 5 <noreply@anthropic.com>
Claude-Session: https://claude.ai/code/session_01YLo1WfwUDkbwfJEF3ZNVbB
</commit_message>
<xml_diff>
--- a/output/combat-mindset-way-forward.docx
+++ b/output/combat-mindset-way-forward.docx
@@ -320,7 +320,7 @@
             </w:rPr>
             <w:fldChar w:fldCharType="separate"/>
           </w:r>
-          <w:hyperlink w:anchor="__RefHeading___Toc386_2636275479">
+          <w:hyperlink w:anchor="__RefHeading___Toc386_2113728725">
             <w:r>
               <w:rPr>
                 <w:webHidden/>
@@ -347,7 +347,7 @@
             </w:tabs>
             <w:rPr/>
           </w:pPr>
-          <w:hyperlink w:anchor="__RefHeading___Toc388_2636275479">
+          <w:hyperlink w:anchor="__RefHeading___Toc388_2113728725">
             <w:r>
               <w:rPr>
                 <w:webHidden/>
@@ -374,7 +374,7 @@
             </w:tabs>
             <w:rPr/>
           </w:pPr>
-          <w:hyperlink w:anchor="__RefHeading___Toc390_2636275479">
+          <w:hyperlink w:anchor="__RefHeading___Toc390_2113728725">
             <w:r>
               <w:rPr>
                 <w:webHidden/>
@@ -401,7 +401,7 @@
             </w:tabs>
             <w:rPr/>
           </w:pPr>
-          <w:hyperlink w:anchor="__RefHeading___Toc392_2636275479">
+          <w:hyperlink w:anchor="__RefHeading___Toc392_2113728725">
             <w:r>
               <w:rPr>
                 <w:webHidden/>
@@ -428,7 +428,7 @@
             </w:tabs>
             <w:rPr/>
           </w:pPr>
-          <w:hyperlink w:anchor="__RefHeading___Toc394_2636275479">
+          <w:hyperlink w:anchor="__RefHeading___Toc394_2113728725">
             <w:r>
               <w:rPr>
                 <w:webHidden/>
@@ -455,7 +455,7 @@
             </w:tabs>
             <w:rPr/>
           </w:pPr>
-          <w:hyperlink w:anchor="__RefHeading___Toc396_2636275479">
+          <w:hyperlink w:anchor="__RefHeading___Toc396_2113728725">
             <w:r>
               <w:rPr>
                 <w:webHidden/>
@@ -482,7 +482,7 @@
             </w:tabs>
             <w:rPr/>
           </w:pPr>
-          <w:hyperlink w:anchor="__RefHeading___Toc398_2636275479">
+          <w:hyperlink w:anchor="__RefHeading___Toc398_2113728725">
             <w:r>
               <w:rPr>
                 <w:webHidden/>
@@ -509,7 +509,7 @@
             </w:tabs>
             <w:rPr/>
           </w:pPr>
-          <w:hyperlink w:anchor="__RefHeading___Toc400_2636275479">
+          <w:hyperlink w:anchor="__RefHeading___Toc400_2113728725">
             <w:r>
               <w:rPr>
                 <w:webHidden/>
@@ -536,7 +536,7 @@
             </w:tabs>
             <w:rPr/>
           </w:pPr>
-          <w:hyperlink w:anchor="__RefHeading___Toc402_2636275479">
+          <w:hyperlink w:anchor="__RefHeading___Toc402_2113728725">
             <w:r>
               <w:rPr>
                 <w:webHidden/>
@@ -563,7 +563,7 @@
             </w:tabs>
             <w:rPr/>
           </w:pPr>
-          <w:hyperlink w:anchor="__RefHeading___Toc404_2636275479">
+          <w:hyperlink w:anchor="__RefHeading___Toc404_2113728725">
             <w:r>
               <w:rPr>
                 <w:webHidden/>
@@ -618,7 +618,7 @@
         <w:spacing w:before="0" w:after="160"/>
         <w:rPr/>
       </w:pPr>
-      <w:bookmarkStart w:id="0" w:name="__RefHeading___Toc386_2636275479"/>
+      <w:bookmarkStart w:id="0" w:name="__RefHeading___Toc386_2113728725"/>
       <w:bookmarkEnd w:id="0"/>
       <w:r>
         <w:rPr>
@@ -700,7 +700,7 @@
         </w:pBdr>
         <w:rPr/>
       </w:pPr>
-      <w:bookmarkStart w:id="1" w:name="__RefHeading___Toc388_2636275479"/>
+      <w:bookmarkStart w:id="1" w:name="__RefHeading___Toc388_2113728725"/>
       <w:bookmarkEnd w:id="1"/>
       <w:r>
         <w:rPr>
@@ -762,7 +762,7 @@
         </w:pBdr>
         <w:rPr/>
       </w:pPr>
-      <w:bookmarkStart w:id="2" w:name="__RefHeading___Toc390_2636275479"/>
+      <w:bookmarkStart w:id="2" w:name="__RefHeading___Toc390_2113728725"/>
       <w:bookmarkEnd w:id="2"/>
       <w:r>
         <w:rPr>
@@ -870,7 +870,7 @@
         </w:pBdr>
         <w:rPr/>
       </w:pPr>
-      <w:bookmarkStart w:id="3" w:name="__RefHeading___Toc392_2636275479"/>
+      <w:bookmarkStart w:id="3" w:name="__RefHeading___Toc392_2113728725"/>
       <w:bookmarkEnd w:id="3"/>
       <w:r>
         <w:rPr>
@@ -1428,7 +1428,7 @@
         </w:pBdr>
         <w:rPr/>
       </w:pPr>
-      <w:bookmarkStart w:id="4" w:name="__RefHeading___Toc394_2636275479"/>
+      <w:bookmarkStart w:id="4" w:name="__RefHeading___Toc394_2113728725"/>
       <w:bookmarkEnd w:id="4"/>
       <w:r>
         <w:rPr>
@@ -1594,7 +1594,7 @@
         </w:pBdr>
         <w:rPr/>
       </w:pPr>
-      <w:bookmarkStart w:id="5" w:name="__RefHeading___Toc396_2636275479"/>
+      <w:bookmarkStart w:id="5" w:name="__RefHeading___Toc396_2113728725"/>
       <w:bookmarkEnd w:id="5"/>
       <w:r>
         <w:rPr>
@@ -2476,7 +2476,7 @@
         </w:pBdr>
         <w:rPr/>
       </w:pPr>
-      <w:bookmarkStart w:id="6" w:name="__RefHeading___Toc398_2636275479"/>
+      <w:bookmarkStart w:id="6" w:name="__RefHeading___Toc398_2113728725"/>
       <w:bookmarkEnd w:id="6"/>
       <w:r>
         <w:rPr>
@@ -2776,7 +2776,7 @@
         </w:pBdr>
         <w:rPr/>
       </w:pPr>
-      <w:bookmarkStart w:id="7" w:name="__RefHeading___Toc400_2636275479"/>
+      <w:bookmarkStart w:id="7" w:name="__RefHeading___Toc400_2113728725"/>
       <w:bookmarkEnd w:id="7"/>
       <w:r>
         <w:rPr>
@@ -3078,7 +3078,7 @@
         <w:spacing w:before="0" w:after="160"/>
         <w:rPr/>
       </w:pPr>
-      <w:bookmarkStart w:id="8" w:name="__RefHeading___Toc402_2636275479"/>
+      <w:bookmarkStart w:id="8" w:name="__RefHeading___Toc402_2113728725"/>
       <w:bookmarkEnd w:id="8"/>
       <w:r>
         <w:rPr>
@@ -3235,7 +3235,7 @@
         </w:pBdr>
         <w:rPr/>
       </w:pPr>
-      <w:bookmarkStart w:id="9" w:name="__RefHeading___Toc404_2636275479"/>
+      <w:bookmarkStart w:id="9" w:name="__RefHeading___Toc404_2113728725"/>
       <w:bookmarkEnd w:id="9"/>
       <w:r>
         <w:rPr>

</xml_diff>

<commit_message>
Card 2 subordinate line: regular weight, matching card 3
Co-Authored-By: Claude Fable 5 <noreply@anthropic.com>
Claude-Session: https://claude.ai/code/session_01YLo1WfwUDkbwfJEF3ZNVbB
</commit_message>
<xml_diff>
--- a/output/combat-mindset-way-forward.docx
+++ b/output/combat-mindset-way-forward.docx
@@ -320,7 +320,7 @@
             </w:rPr>
             <w:fldChar w:fldCharType="separate"/>
           </w:r>
-          <w:hyperlink w:anchor="__RefHeading___Toc386_2113728725">
+          <w:hyperlink w:anchor="__RefHeading___Toc386_3029750867">
             <w:r>
               <w:rPr>
                 <w:webHidden/>
@@ -347,7 +347,7 @@
             </w:tabs>
             <w:rPr/>
           </w:pPr>
-          <w:hyperlink w:anchor="__RefHeading___Toc388_2113728725">
+          <w:hyperlink w:anchor="__RefHeading___Toc388_3029750867">
             <w:r>
               <w:rPr>
                 <w:webHidden/>
@@ -374,7 +374,7 @@
             </w:tabs>
             <w:rPr/>
           </w:pPr>
-          <w:hyperlink w:anchor="__RefHeading___Toc390_2113728725">
+          <w:hyperlink w:anchor="__RefHeading___Toc390_3029750867">
             <w:r>
               <w:rPr>
                 <w:webHidden/>
@@ -401,7 +401,7 @@
             </w:tabs>
             <w:rPr/>
           </w:pPr>
-          <w:hyperlink w:anchor="__RefHeading___Toc392_2113728725">
+          <w:hyperlink w:anchor="__RefHeading___Toc392_3029750867">
             <w:r>
               <w:rPr>
                 <w:webHidden/>
@@ -428,7 +428,7 @@
             </w:tabs>
             <w:rPr/>
           </w:pPr>
-          <w:hyperlink w:anchor="__RefHeading___Toc394_2113728725">
+          <w:hyperlink w:anchor="__RefHeading___Toc394_3029750867">
             <w:r>
               <w:rPr>
                 <w:webHidden/>
@@ -455,7 +455,7 @@
             </w:tabs>
             <w:rPr/>
           </w:pPr>
-          <w:hyperlink w:anchor="__RefHeading___Toc396_2113728725">
+          <w:hyperlink w:anchor="__RefHeading___Toc396_3029750867">
             <w:r>
               <w:rPr>
                 <w:webHidden/>
@@ -482,7 +482,7 @@
             </w:tabs>
             <w:rPr/>
           </w:pPr>
-          <w:hyperlink w:anchor="__RefHeading___Toc398_2113728725">
+          <w:hyperlink w:anchor="__RefHeading___Toc398_3029750867">
             <w:r>
               <w:rPr>
                 <w:webHidden/>
@@ -509,7 +509,7 @@
             </w:tabs>
             <w:rPr/>
           </w:pPr>
-          <w:hyperlink w:anchor="__RefHeading___Toc400_2113728725">
+          <w:hyperlink w:anchor="__RefHeading___Toc400_3029750867">
             <w:r>
               <w:rPr>
                 <w:webHidden/>
@@ -536,7 +536,7 @@
             </w:tabs>
             <w:rPr/>
           </w:pPr>
-          <w:hyperlink w:anchor="__RefHeading___Toc402_2113728725">
+          <w:hyperlink w:anchor="__RefHeading___Toc402_3029750867">
             <w:r>
               <w:rPr>
                 <w:webHidden/>
@@ -563,7 +563,7 @@
             </w:tabs>
             <w:rPr/>
           </w:pPr>
-          <w:hyperlink w:anchor="__RefHeading___Toc404_2113728725">
+          <w:hyperlink w:anchor="__RefHeading___Toc404_3029750867">
             <w:r>
               <w:rPr>
                 <w:webHidden/>
@@ -618,7 +618,7 @@
         <w:spacing w:before="0" w:after="160"/>
         <w:rPr/>
       </w:pPr>
-      <w:bookmarkStart w:id="0" w:name="__RefHeading___Toc386_2113728725"/>
+      <w:bookmarkStart w:id="0" w:name="__RefHeading___Toc386_3029750867"/>
       <w:bookmarkEnd w:id="0"/>
       <w:r>
         <w:rPr>
@@ -700,7 +700,7 @@
         </w:pBdr>
         <w:rPr/>
       </w:pPr>
-      <w:bookmarkStart w:id="1" w:name="__RefHeading___Toc388_2113728725"/>
+      <w:bookmarkStart w:id="1" w:name="__RefHeading___Toc388_3029750867"/>
       <w:bookmarkEnd w:id="1"/>
       <w:r>
         <w:rPr>
@@ -762,7 +762,7 @@
         </w:pBdr>
         <w:rPr/>
       </w:pPr>
-      <w:bookmarkStart w:id="2" w:name="__RefHeading___Toc390_2113728725"/>
+      <w:bookmarkStart w:id="2" w:name="__RefHeading___Toc390_3029750867"/>
       <w:bookmarkEnd w:id="2"/>
       <w:r>
         <w:rPr>
@@ -870,7 +870,7 @@
         </w:pBdr>
         <w:rPr/>
       </w:pPr>
-      <w:bookmarkStart w:id="3" w:name="__RefHeading___Toc392_2113728725"/>
+      <w:bookmarkStart w:id="3" w:name="__RefHeading___Toc392_3029750867"/>
       <w:bookmarkEnd w:id="3"/>
       <w:r>
         <w:rPr>
@@ -1428,7 +1428,7 @@
         </w:pBdr>
         <w:rPr/>
       </w:pPr>
-      <w:bookmarkStart w:id="4" w:name="__RefHeading___Toc394_2113728725"/>
+      <w:bookmarkStart w:id="4" w:name="__RefHeading___Toc394_3029750867"/>
       <w:bookmarkEnd w:id="4"/>
       <w:r>
         <w:rPr>
@@ -1594,7 +1594,7 @@
         </w:pBdr>
         <w:rPr/>
       </w:pPr>
-      <w:bookmarkStart w:id="5" w:name="__RefHeading___Toc396_2113728725"/>
+      <w:bookmarkStart w:id="5" w:name="__RefHeading___Toc396_3029750867"/>
       <w:bookmarkEnd w:id="5"/>
       <w:r>
         <w:rPr>
@@ -2476,7 +2476,7 @@
         </w:pBdr>
         <w:rPr/>
       </w:pPr>
-      <w:bookmarkStart w:id="6" w:name="__RefHeading___Toc398_2113728725"/>
+      <w:bookmarkStart w:id="6" w:name="__RefHeading___Toc398_3029750867"/>
       <w:bookmarkEnd w:id="6"/>
       <w:r>
         <w:rPr>
@@ -2776,7 +2776,7 @@
         </w:pBdr>
         <w:rPr/>
       </w:pPr>
-      <w:bookmarkStart w:id="7" w:name="__RefHeading___Toc400_2113728725"/>
+      <w:bookmarkStart w:id="7" w:name="__RefHeading___Toc400_3029750867"/>
       <w:bookmarkEnd w:id="7"/>
       <w:r>
         <w:rPr>
@@ -3078,7 +3078,7 @@
         <w:spacing w:before="0" w:after="160"/>
         <w:rPr/>
       </w:pPr>
-      <w:bookmarkStart w:id="8" w:name="__RefHeading___Toc402_2113728725"/>
+      <w:bookmarkStart w:id="8" w:name="__RefHeading___Toc402_3029750867"/>
       <w:bookmarkEnd w:id="8"/>
       <w:r>
         <w:rPr>
@@ -3235,7 +3235,7 @@
         </w:pBdr>
         <w:rPr/>
       </w:pPr>
-      <w:bookmarkStart w:id="9" w:name="__RefHeading___Toc404_2113728725"/>
+      <w:bookmarkStart w:id="9" w:name="__RefHeading___Toc404_3029750867"/>
       <w:bookmarkEnd w:id="9"/>
       <w:r>
         <w:rPr>

</xml_diff>

<commit_message>
Align the paper with the final proposal page (Draft v0.9)
Retitled Combat Mindset Framework Proposal (cover hero + subordinate,
footer, properties) with the layered tagline on the cover. Army Combat
Mindset Framework renamed Combat Mindset Framework throughout, with
the page's framework definition adopted. Programme restructured to
phases 1-5 (Define and govern / Understand / Design / Validate /
Implement) keeping dates and proposed leads; stocktake language
replaced by assessment; all cross-references (governance, foundation
documents, annex, recommendations) updated. Em dashes removed
document-wide. Date August 2026.

Co-Authored-By: Claude Fable 5 <noreply@anthropic.com>
Claude-Session: https://claude.ai/code/session_01YLo1WfwUDkbwfJEF3ZNVbB
</commit_message>
<xml_diff>
--- a/output/combat-mindset-way-forward.docx
+++ b/output/combat-mindset-way-forward.docx
@@ -81,7 +81,7 @@
           <w:color w:val="002516"/>
           <w:sz w:val="34"/>
         </w:rPr>
-        <w:t>Proposed Way Forward</w:t>
+        <w:t>Framework Proposal</w:t>
       </w:r>
     </w:p>
     <w:p>
@@ -102,6 +102,21 @@
     <w:p>
       <w:pPr>
         <w:pStyle w:val="Normal"/>
+        <w:spacing w:before="0" w:after="40"/>
+        <w:rPr/>
+      </w:pPr>
+      <w:r>
+        <w:rPr>
+          <w:rFonts w:cs="Arial" w:ascii="Arial" w:hAnsi="Arial"/>
+          <w:color w:val="000000"/>
+          <w:sz w:val="26"/>
+        </w:rPr>
+        <w:t>Remain effective. Act decisively.</w:t>
+      </w:r>
+    </w:p>
+    <w:p>
+      <w:pPr>
+        <w:pStyle w:val="Normal"/>
         <w:spacing w:before="0" w:after="80"/>
         <w:rPr/>
       </w:pPr>
@@ -110,16 +125,15 @@
           <w:rFonts w:cs="Arial" w:ascii="Arial" w:hAnsi="Arial"/>
           <w:b/>
           <w:color w:val="C62026"/>
-          <w:spacing w:val="60"/>
-          <w:sz w:val="30"/>
-        </w:rPr>
-        <w:t>HARDER TO KILL</w:t>
-      </w:r>
-    </w:p>
-    <w:p>
-      <w:pPr>
-        <w:pStyle w:val="Normal"/>
-        <w:spacing w:before="0" w:after="1760"/>
+          <w:sz w:val="26"/>
+        </w:rPr>
+        <w:t>Harder to kill.</w:t>
+      </w:r>
+    </w:p>
+    <w:p>
+      <w:pPr>
+        <w:pStyle w:val="Normal"/>
+        <w:spacing w:before="0" w:after="1680"/>
         <w:rPr/>
       </w:pPr>
       <w:r>
@@ -128,7 +142,7 @@
           <w:color w:val="002516"/>
           <w:sz w:val="18"/>
         </w:rPr>
-        <w:t>Proposed Warfighter Focus tagline — subject to sponsor endorsement</w:t>
+        <w:t>Proposed tagline, subject to sponsor endorsement</w:t>
       </w:r>
     </w:p>
     <w:p>
@@ -189,7 +203,7 @@
           <w:color w:val="000000"/>
           <w:sz w:val="20"/>
         </w:rPr>
-        <w:t>July 2026</w:t>
+        <w:t>August 2026</w:t>
       </w:r>
     </w:p>
     <w:p>
@@ -250,7 +264,7 @@
           <w:color w:val="000000"/>
           <w:sz w:val="20"/>
         </w:rPr>
-        <w:t>Draft v0.8</w:t>
+        <w:t>Draft v0.9</w:t>
       </w:r>
     </w:p>
     <w:p>
@@ -320,7 +334,7 @@
             </w:rPr>
             <w:fldChar w:fldCharType="separate"/>
           </w:r>
-          <w:hyperlink w:anchor="__RefHeading___Toc386_3029750867">
+          <w:hyperlink w:anchor="__RefHeading___Toc387_3124142782">
             <w:r>
               <w:rPr>
                 <w:webHidden/>
@@ -347,7 +361,7 @@
             </w:tabs>
             <w:rPr/>
           </w:pPr>
-          <w:hyperlink w:anchor="__RefHeading___Toc388_3029750867">
+          <w:hyperlink w:anchor="__RefHeading___Toc389_3124142782">
             <w:r>
               <w:rPr>
                 <w:webHidden/>
@@ -374,7 +388,7 @@
             </w:tabs>
             <w:rPr/>
           </w:pPr>
-          <w:hyperlink w:anchor="__RefHeading___Toc390_3029750867">
+          <w:hyperlink w:anchor="__RefHeading___Toc391_3124142782">
             <w:r>
               <w:rPr>
                 <w:webHidden/>
@@ -401,14 +415,14 @@
             </w:tabs>
             <w:rPr/>
           </w:pPr>
-          <w:hyperlink w:anchor="__RefHeading___Toc392_3029750867">
+          <w:hyperlink w:anchor="__RefHeading___Toc393_3124142782">
             <w:r>
               <w:rPr>
                 <w:webHidden/>
                 <w:rStyle w:val="IndexLink"/>
                 <w:i w:val="false"/>
               </w:rPr>
-              <w:t>2. Terminology and definitions — decision sought</w:t>
+              <w:t>2. Terminology and definitions: decision sought</w:t>
             </w:r>
             <w:r>
               <w:rPr>
@@ -428,7 +442,7 @@
             </w:tabs>
             <w:rPr/>
           </w:pPr>
-          <w:hyperlink w:anchor="__RefHeading___Toc394_3029750867">
+          <w:hyperlink w:anchor="__RefHeading___Toc395_3124142782">
             <w:r>
               <w:rPr>
                 <w:webHidden/>
@@ -455,7 +469,7 @@
             </w:tabs>
             <w:rPr/>
           </w:pPr>
-          <w:hyperlink w:anchor="__RefHeading___Toc396_3029750867">
+          <w:hyperlink w:anchor="__RefHeading___Toc397_3124142782">
             <w:r>
               <w:rPr>
                 <w:webHidden/>
@@ -482,7 +496,7 @@
             </w:tabs>
             <w:rPr/>
           </w:pPr>
-          <w:hyperlink w:anchor="__RefHeading___Toc398_3029750867">
+          <w:hyperlink w:anchor="__RefHeading___Toc399_3124142782">
             <w:r>
               <w:rPr>
                 <w:webHidden/>
@@ -509,7 +523,7 @@
             </w:tabs>
             <w:rPr/>
           </w:pPr>
-          <w:hyperlink w:anchor="__RefHeading___Toc400_3029750867">
+          <w:hyperlink w:anchor="__RefHeading___Toc401_3124142782">
             <w:r>
               <w:rPr>
                 <w:webHidden/>
@@ -536,7 +550,7 @@
             </w:tabs>
             <w:rPr/>
           </w:pPr>
-          <w:hyperlink w:anchor="__RefHeading___Toc402_3029750867">
+          <w:hyperlink w:anchor="__RefHeading___Toc403_3124142782">
             <w:r>
               <w:rPr>
                 <w:webHidden/>
@@ -563,14 +577,14 @@
             </w:tabs>
             <w:rPr/>
           </w:pPr>
-          <w:hyperlink w:anchor="__RefHeading___Toc404_3029750867">
+          <w:hyperlink w:anchor="__RefHeading___Toc405_3124142782">
             <w:r>
               <w:rPr>
                 <w:webHidden/>
                 <w:rStyle w:val="IndexLink"/>
                 <w:i w:val="false"/>
               </w:rPr>
-              <w:t>Annex A — Interim governance and division of functions</w:t>
+              <w:t>Annex A: Interim governance and division of functions</w:t>
             </w:r>
             <w:r>
               <w:rPr>
@@ -618,7 +632,7 @@
         <w:spacing w:before="0" w:after="160"/>
         <w:rPr/>
       </w:pPr>
-      <w:bookmarkStart w:id="0" w:name="__RefHeading___Toc386_3029750867"/>
+      <w:bookmarkStart w:id="0" w:name="__RefHeading___Toc387_3124142782"/>
       <w:bookmarkEnd w:id="0"/>
       <w:r>
         <w:rPr>
@@ -700,7 +714,7 @@
         </w:pBdr>
         <w:rPr/>
       </w:pPr>
-      <w:bookmarkStart w:id="1" w:name="__RefHeading___Toc388_3029750867"/>
+      <w:bookmarkStart w:id="1" w:name="__RefHeading___Toc389_3124142782"/>
       <w:bookmarkEnd w:id="1"/>
       <w:r>
         <w:rPr>
@@ -724,21 +738,21 @@
           <w:b w:val="false"/>
           <w:i w:val="false"/>
         </w:rPr>
-        <w:t>This paper responds to COMDT ACS direction of 16 July 2026 for NZ Army Leadership Centre (NZALC) and the Human Performance Cell (HPC) to jointly develop a strategy to close the Combat Mindset doctrine and policy gap. It proposes an agreed problem statement, formal definitions and their relationship for decision, the Army Combat Mindset Framework as the organising model, a programme of work, interim governance and assurance arrangements, and the process by which existing training products will be assessed and nested beneath the framework.</w:t>
-      </w:r>
-    </w:p>
-    <w:p>
-      <w:pPr>
-        <w:pStyle w:val="Normal"/>
-        <w:rPr/>
-      </w:pPr>
-      <w:r>
-        <w:rPr>
-          <w:rFonts w:cs="Book Antiqua"/>
-          <w:b w:val="false"/>
-          <w:i w:val="false"/>
-        </w:rPr>
-        <w:t>This paper is a scoping and decision paper. It does not present final Combat Mindset doctrine. It seeks endorsement of the initial definitions, interim governance and programme of work required to develop, validate and staff the Army Combat Mindset Framework. The definitions are a drafting baseline; the capability pillars are provisional; the Phase 1 stocktake and stakeholder forum will validate the final architecture; and existing products will be assessed rather than automatically adopted. Final recommendations will return to COMDT ACS in November 2026.</w:t>
+        <w:t>This paper responds to COMDT ACS direction of 16 July 2026 for NZ Army Leadership Centre (NZALC) and the Human Performance Cell (HPC) to jointly develop a strategy to close the Combat Mindset doctrine and policy gap. It proposes an agreed problem statement, formal definitions and their relationship for decision, the Combat Mindset Framework as the organising system, a programme of work, interim governance and assurance arrangements, and the process by which existing training products will be assessed and nested beneath the framework.</w:t>
+      </w:r>
+    </w:p>
+    <w:p>
+      <w:pPr>
+        <w:pStyle w:val="Normal"/>
+        <w:rPr/>
+      </w:pPr>
+      <w:r>
+        <w:rPr>
+          <w:rFonts w:cs="Book Antiqua"/>
+          <w:b w:val="false"/>
+          <w:i w:val="false"/>
+        </w:rPr>
+        <w:t>This paper is a scoping and decision paper. It does not present final Combat Mindset doctrine. It seeks endorsement of the initial definitions, interim governance and programme of work required to develop, validate and staff the Combat Mindset Framework. The definitions are a drafting baseline; the capability pillars are provisional; the Phase 2 assessment and Phase 4 validation will confirm the final architecture; and existing products will be assessed rather than automatically adopted. Final recommendations will return to COMDT ACS in November 2026.</w:t>
       </w:r>
     </w:p>
     <w:p>
@@ -762,7 +776,7 @@
         </w:pBdr>
         <w:rPr/>
       </w:pPr>
-      <w:bookmarkStart w:id="2" w:name="__RefHeading___Toc390_3029750867"/>
+      <w:bookmarkStart w:id="2" w:name="__RefHeading___Toc391_3124142782"/>
       <w:bookmarkEnd w:id="2"/>
       <w:r>
         <w:rPr>
@@ -786,7 +800,7 @@
           <w:b w:val="false"/>
           <w:i w:val="false"/>
         </w:rPr>
-        <w:t>Considerable work on Combat Mindset and Performance Under Pressure already exists across Army — notably by NZDF Psychology — and elements of it have been endorsed in various settings. What Army does not yet have is a coherent, Army-wide doctrine, governance and assurance model for Combat Mindset, despite the term's active use and Army's drive toward an increased Warfighter Focus. The COMDT ACS guidance reaches the same diagnosis:</w:t>
+        <w:t>Considerable work on Combat Mindset and Performance Under Pressure already exists across Army (notably by NZDF Psychology) and elements of it have been endorsed in various settings. What Army does not yet have is a coherent, Army-wide doctrine, governance and assurance model for Combat Mindset, despite the term's active use and Army's drive toward an increased Warfighter Focus. The COMDT ACS guidance reaches the same diagnosis:</w:t>
       </w:r>
     </w:p>
     <w:p>
@@ -846,7 +860,7 @@
           <w:b w:val="false"/>
           <w:i w:val="false"/>
         </w:rPr>
-        <w:t>The doctrinal requirement is therefore to define the human-performance capability Army requires, consolidate the substantial body of work that already exists beneath it, and describe its combat-specific expression. Sufficient evidence and existing capability are available to commence governance, the capability stocktake and framework development immediately.</w:t>
+        <w:t>The doctrinal requirement is therefore to define the human-performance capability Army requires, consolidate the substantial body of work that already exists beneath it, and describe its combat-specific expression. Sufficient evidence and existing capability are available to commence governance, the capability assessment and framework development immediately.</w:t>
       </w:r>
     </w:p>
     <w:p>
@@ -870,7 +884,7 @@
         </w:pBdr>
         <w:rPr/>
       </w:pPr>
-      <w:bookmarkStart w:id="3" w:name="__RefHeading___Toc392_3029750867"/>
+      <w:bookmarkStart w:id="3" w:name="__RefHeading___Toc393_3124142782"/>
       <w:bookmarkEnd w:id="3"/>
       <w:r>
         <w:rPr>
@@ -880,7 +894,7 @@
           <w:color w:val="002516"/>
           <w:sz w:val="28"/>
         </w:rPr>
-        <w:t>2. Terminology and definitions — decision sought</w:t>
+        <w:t>2. Terminology and definitions: decision sought</w:t>
       </w:r>
     </w:p>
     <w:p>
@@ -910,7 +924,7 @@
           <w:color w:val="000000"/>
           <w:sz w:val="22"/>
         </w:rPr>
-        <w:t>Option 1 — Combat Mindset as the combat-specific expression of Performance Under Pressure (recommended)</w:t>
+        <w:t>Option 1: Combat Mindset as the combat-specific expression of Performance Under Pressure (recommended)</w:t>
       </w:r>
     </w:p>
     <w:p>
@@ -952,7 +966,7 @@
           <w:b w:val="false"/>
           <w:i w:val="false"/>
         </w:rPr>
-        <w:t>The Army Combat Mindset Framework is the organising model through which Army will define, develop, integrate and assure the provisional capability pillars, developmental outcomes, training products and governance arrangements that enable this effect.</w:t>
+        <w:t>The Combat Mindset Framework is the organising system through which Army will govern, develop, deliver and assure this effect across provisional capability pillars, developmental outcomes, training products and governance arrangements.</w:t>
       </w:r>
     </w:p>
     <w:p>
@@ -1030,7 +1044,7 @@
           <w:b/>
           <w:i/>
         </w:rPr>
-        <w:t>Army Combat Mindset Framework.</w:t>
+        <w:t>Combat Mindset Framework.</w:t>
       </w:r>
       <w:r>
         <w:rPr>
@@ -1038,7 +1052,7 @@
           <w:b w:val="false"/>
           <w:i/>
         </w:rPr>
-        <w:t xml:space="preserve"> The organising model through which Army defines, develops, integrates and assures the individual and collective capabilities that enable Combat Mindset.</w:t>
+        <w:t xml:space="preserve"> The framework through which Combat Mindset is governed, developed, delivered and assured.</w:t>
       </w:r>
     </w:p>
     <w:p>
@@ -1108,7 +1122,7 @@
           <w:b w:val="false"/>
           <w:i w:val="false"/>
         </w:rPr>
-        <w:t>Gives each term one clear purpose: Combat Mindset is the combat-specific expression; Performance Under Pressure is the enabling capability; the Army Combat Mindset Framework is the organising model.</w:t>
+        <w:t>Gives each term one clear purpose: Combat Mindset is the combat-specific expression; Performance Under Pressure is the enabling capability; the Combat Mindset Framework is the organising system.</w:t>
       </w:r>
     </w:p>
     <w:p>
@@ -1196,7 +1210,7 @@
           <w:color w:val="000000"/>
           <w:sz w:val="22"/>
         </w:rPr>
-        <w:t>Option 2 — Combat Mindset as the complete umbrella capability</w:t>
+        <w:t>Option 2: Combat Mindset as the complete umbrella capability</w:t>
       </w:r>
     </w:p>
     <w:p>
@@ -1428,7 +1442,7 @@
         </w:pBdr>
         <w:rPr/>
       </w:pPr>
-      <w:bookmarkStart w:id="4" w:name="__RefHeading___Toc394_3029750867"/>
+      <w:bookmarkStart w:id="4" w:name="__RefHeading___Toc395_3124142782"/>
       <w:bookmarkEnd w:id="4"/>
       <w:r>
         <w:rPr>
@@ -1452,21 +1466,21 @@
           <w:b w:val="false"/>
           <w:i w:val="false"/>
         </w:rPr>
-        <w:t>Allied armies have fielded comparable integrated human-performance programmes, including US Army Holistic Health and Fitness [verify], UK Op SMART [verify] and ADF BattleSMART [verify]. The structure proposed in this paper — a single organising framework beneath which existing products are nested and assured — is consistent with that direction.</w:t>
-      </w:r>
-    </w:p>
-    <w:p>
-      <w:pPr>
-        <w:pStyle w:val="Normal"/>
-        <w:rPr/>
-      </w:pPr>
-      <w:r>
-        <w:rPr>
-          <w:rFonts w:cs="Book Antiqua"/>
-          <w:b w:val="false"/>
-          <w:i w:val="false"/>
-        </w:rPr>
-        <w:t>A full stocktake of existing capability and products will be completed during Phase 1. The products described below contribute to the development of Performance Under Pressure and, where applied in a warfighting context, to Combat Mindset. They do not constitute the doctrinal definitions or the complete framework in isolation. Initial holdings include the following.</w:t>
+        <w:t>Allied armies have fielded comparable integrated human-performance programmes, including US Army Holistic Health and Fitness [verify], UK Op SMART [verify] and ADF BattleSMART [verify]. The structure proposed in this paper (a single organising framework beneath which existing products are nested and assured) is consistent with that direction.</w:t>
+      </w:r>
+    </w:p>
+    <w:p>
+      <w:pPr>
+        <w:pStyle w:val="Normal"/>
+        <w:rPr/>
+      </w:pPr>
+      <w:r>
+        <w:rPr>
+          <w:rFonts w:cs="Book Antiqua"/>
+          <w:b w:val="false"/>
+          <w:i w:val="false"/>
+        </w:rPr>
+        <w:t>A full assessment of existing capability and products will be completed during Phase 2. The products described below contribute to the development of Performance Under Pressure and, where applied in a warfighting context, to Combat Mindset. They do not constitute the doctrinal definitions or the complete framework in isolation. Initial holdings include the following.</w:t>
       </w:r>
     </w:p>
     <w:p>
@@ -1526,7 +1540,7 @@
           <w:b w:val="false"/>
           <w:i w:val="false"/>
         </w:rPr>
-        <w:t>COGCON is a developmental cognitive-conditioning product targeting selected aspects of performance cognition under physical and cognitive load, including arousal regulation, attention, cognitive control and working memory. Feasibility trials in military training have demonstrated acceptability and promising training trends. Its causal effectiveness, operational transfer, readiness validity, scalability and enduring delivery model have not yet been established. Its status and appropriate future role will be confirmed through the Phase 1 stocktake.</w:t>
+        <w:t>COGCON is a developmental cognitive-conditioning product targeting selected aspects of performance cognition under physical and cognitive load, including arousal regulation, attention, cognitive control and working memory. Feasibility trials in military training have demonstrated acceptability and promising training trends. Its causal effectiveness, operational transfer, readiness validity, scalability and enduring delivery model have not yet been established. Its status and appropriate future role will be confirmed through the Phase 2 assessment.</w:t>
       </w:r>
     </w:p>
     <w:p>
@@ -1556,21 +1570,21 @@
           <w:b w:val="false"/>
           <w:i w:val="false"/>
         </w:rPr>
-        <w:t>These organisations hold additional professional expertise, learning products, delivery capability and assurance functions that will be confirmed during the Phase 1 stocktake.</w:t>
-      </w:r>
-    </w:p>
-    <w:p>
-      <w:pPr>
-        <w:pStyle w:val="Normal"/>
-        <w:rPr/>
-      </w:pPr>
-      <w:r>
-        <w:rPr>
-          <w:rFonts w:cs="Book Antiqua"/>
-          <w:b w:val="false"/>
-          <w:i w:val="false"/>
-        </w:rPr>
-        <w:t>Initial review indicates considerable conceptual alignment across existing products. The Army Combat Mindset Framework will establish a common doctrinal language beneath which individual products and methods can be appropriately nested. It will not require all products to use identical internal methodologies, provided they align to the endorsed framework, outcomes and assurance requirements.</w:t>
+        <w:t>These organisations hold additional professional expertise, learning products, delivery capability and assurance functions that will be confirmed during the Phase 2 assessment.</w:t>
+      </w:r>
+    </w:p>
+    <w:p>
+      <w:pPr>
+        <w:pStyle w:val="Normal"/>
+        <w:rPr/>
+      </w:pPr>
+      <w:r>
+        <w:rPr>
+          <w:rFonts w:cs="Book Antiqua"/>
+          <w:b w:val="false"/>
+          <w:i w:val="false"/>
+        </w:rPr>
+        <w:t>Initial review indicates considerable conceptual alignment across existing products. The Combat Mindset Framework will establish a common doctrinal language beneath which individual products and methods can be appropriately nested. It will not require all products to use identical internal methodologies, provided they align to the endorsed framework, outcomes and assurance requirements.</w:t>
       </w:r>
     </w:p>
     <w:p>
@@ -1594,7 +1608,7 @@
         </w:pBdr>
         <w:rPr/>
       </w:pPr>
-      <w:bookmarkStart w:id="5" w:name="__RefHeading___Toc396_3029750867"/>
+      <w:bookmarkStart w:id="5" w:name="__RefHeading___Toc397_3124142782"/>
       <w:bookmarkEnd w:id="5"/>
       <w:r>
         <w:rPr>
@@ -1634,21 +1648,21 @@
           <w:color w:val="000000"/>
           <w:sz w:val="22"/>
         </w:rPr>
-        <w:t>Phase 0: Governance and definition (on endorsement of this paper; target mid-August 2026) (ACS) [proposed – confirm]</w:t>
-      </w:r>
-    </w:p>
-    <w:p>
-      <w:pPr>
-        <w:pStyle w:val="Normal"/>
-        <w:rPr/>
-      </w:pPr>
-      <w:r>
-        <w:rPr>
-          <w:rFonts w:cs="Book Antiqua"/>
-          <w:b w:val="false"/>
-          <w:i w:val="false"/>
-        </w:rPr>
-        <w:t>Confirm interim sponsorship and capability-integration arrangements, endorse the problem statement, select the terminology option at paragraph 2, and draft for staffing the Army-endorsed definitions of Combat Mindset, Performance Under Pressure and the Army Combat Mindset Framework, together with the agreed relationship between the three.</w:t>
+        <w:t>Phase 1: Define and govern (on endorsement of this paper; target mid-August 2026) (ACS) [proposed – confirm]</w:t>
+      </w:r>
+    </w:p>
+    <w:p>
+      <w:pPr>
+        <w:pStyle w:val="Normal"/>
+        <w:rPr/>
+      </w:pPr>
+      <w:r>
+        <w:rPr>
+          <w:rFonts w:cs="Book Antiqua"/>
+          <w:b w:val="false"/>
+          <w:i w:val="false"/>
+        </w:rPr>
+        <w:t>Confirm terminology, governance, roles and responsibilities: endorse the problem statement, select the terminology option at paragraph 2, confirm interim sponsorship and capability-integration arrangements, and draft for staffing the endorsed definitions of Combat Mindset, Performance Under Pressure and the Combat Mindset Framework, together with the agreed relationship between the three.</w:t>
       </w:r>
     </w:p>
     <w:p>
@@ -1664,21 +1678,21 @@
           <w:color w:val="000000"/>
           <w:sz w:val="22"/>
         </w:rPr>
-        <w:t>Phase 1: Capability and product stocktake (August–September 2026) (NZALC lead, HPC support) [proposed – confirm]</w:t>
-      </w:r>
-    </w:p>
-    <w:p>
-      <w:pPr>
-        <w:pStyle w:val="Normal"/>
-        <w:rPr/>
-      </w:pPr>
-      <w:r>
-        <w:rPr>
-          <w:rFonts w:cs="Book Antiqua"/>
-          <w:b w:val="false"/>
-          <w:i w:val="false"/>
-        </w:rPr>
-        <w:t>Conduct a stocktake of existing doctrine, content, products, courses, instructor capability, delivery activity, evidence, ownership and assurance arrangements across ACS, NZALC, HPC, NZDF Psychology, ILD, training establishments and selected units. The stocktake will distinguish:</w:t>
+        <w:t>Phase 2: Understand (August–September 2026) (NZALC lead, HPC support) [proposed – confirm]</w:t>
+      </w:r>
+    </w:p>
+    <w:p>
+      <w:pPr>
+        <w:pStyle w:val="Normal"/>
+        <w:rPr/>
+      </w:pPr>
+      <w:r>
+        <w:rPr>
+          <w:rFonts w:cs="Book Antiqua"/>
+          <w:b w:val="false"/>
+          <w:i w:val="false"/>
+        </w:rPr>
+        <w:t>Assess existing doctrine, content, products, courses, instructor capability, delivery activity, evidence, ownership and assurance arrangements across ACS, NZALC, HPC, NZDF Psychology, ILD, training establishments and selected units. The assessment will distinguish:</w:t>
       </w:r>
     </w:p>
     <w:p>
@@ -1980,7 +1994,7 @@
           <w:b w:val="false"/>
           <w:i w:val="false"/>
         </w:rPr>
-        <w:t>The stocktake will identify which products contribute to the broader Performance Under Pressure capability and which support its combat-specific expression, using the combat-specificity test at paragraph 2. COGCON will be assessed as one developmental product within this stocktake, with particular attention to its product boundary, evidence base — including its completed feasibility trials in live military training — ownership, workforce requirements and scalability.</w:t>
+        <w:t>The assessment will identify which products contribute to the broader Performance Under Pressure capability and which support its combat-specific expression, using the combat-specificity test at paragraph 2. COGCON will be assessed as one developmental product within this assessment, with particular attention to its product boundary, evidence base (including its completed feasibility trials in live military training), ownership, workforce requirements and scalability.</w:t>
       </w:r>
     </w:p>
     <w:p>
@@ -1996,35 +2010,35 @@
           <w:color w:val="000000"/>
           <w:sz w:val="22"/>
         </w:rPr>
-        <w:t>Phase 2: Framework and product architecture (September–October 2026) (NZALC/HPC joint) [proposed – confirm]</w:t>
-      </w:r>
-    </w:p>
-    <w:p>
-      <w:pPr>
-        <w:pStyle w:val="Normal"/>
-        <w:rPr/>
-      </w:pPr>
-      <w:r>
-        <w:rPr>
-          <w:rFonts w:cs="Book Antiqua"/>
-          <w:b w:val="false"/>
-          <w:i w:val="false"/>
-        </w:rPr>
-        <w:t>Draft the Army Combat Mindset Framework as the organising model through which Army will define, develop, integrate and assure Performance Under Pressure and its combat-specific expression. The framework will include the endorsed definitions and desired operational effect; the provisional capability pillars, refined through the stocktake; developmental outcomes from Lead Self through Lead Systems; the relationship between doctrine, framework, products and delivery; common assurance principles; and the criteria by which existing and future products may be recognised as contributing to the framework.</w:t>
-      </w:r>
-    </w:p>
-    <w:p>
-      <w:pPr>
-        <w:pStyle w:val="Normal"/>
-        <w:rPr/>
-      </w:pPr>
-      <w:r>
-        <w:rPr>
-          <w:rFonts w:cs="Book Antiqua"/>
-          <w:b w:val="false"/>
-          <w:i w:val="false"/>
-        </w:rPr>
-        <w:t>The provisional working pillars are: leadership under pressure; self-regulation and mental skills; performance cognition; resilience, adaptation and recovery; physical readiness and performance; professional identity, values and will to act; and team and collective performance. These are provisional working pillars — subject to validation through the Phase 1 stocktake and stakeholder forum. Each describes an enduring capability Army seeks to build. Training products and methods — including progressive exposure to pressure, scenario and experiential training, field and mission-relevant rehearsal, and physical and cognitive conditioning — are how Army builds them.</w:t>
+        <w:t>Phase 3: Design (September–October 2026) (NZALC/HPC joint) [proposed – confirm]</w:t>
+      </w:r>
+    </w:p>
+    <w:p>
+      <w:pPr>
+        <w:pStyle w:val="Normal"/>
+        <w:rPr/>
+      </w:pPr>
+      <w:r>
+        <w:rPr>
+          <w:rFonts w:cs="Book Antiqua"/>
+          <w:b w:val="false"/>
+          <w:i w:val="false"/>
+        </w:rPr>
+        <w:t>Develop the Combat Mindset Framework, delivery system and outcomes: the organising system through which Army will govern, develop, deliver and assure Performance Under Pressure and its combat-specific expression. The framework will include the endorsed definitions and desired operational effect; the provisional capability pillars, refined through the assessment; developmental outcomes from Lead Self through Lead Systems; the relationship between doctrine, framework, products and delivery; common assurance principles; and the criteria by which existing and future products may be recognised as contributing to the framework.</w:t>
+      </w:r>
+    </w:p>
+    <w:p>
+      <w:pPr>
+        <w:pStyle w:val="Normal"/>
+        <w:rPr/>
+      </w:pPr>
+      <w:r>
+        <w:rPr>
+          <w:rFonts w:cs="Book Antiqua"/>
+          <w:b w:val="false"/>
+          <w:i w:val="false"/>
+        </w:rPr>
+        <w:t>The provisional working pillars are: leadership under pressure; self-regulation and mental skills; performance cognition; resilience, adaptation and recovery; physical readiness and performance; professional identity, values and will to act; and team and collective performance. These are provisional working pillars, subject to validation through the Phase 2 assessment and Phase 4 validation. Each describes an enduring capability Army seeks to build. Training products and methods (including progressive exposure to pressure, scenario and experiential training, field and mission-relevant rehearsal, and physical and cognitive conditioning) are how Army builds them.</w:t>
       </w:r>
     </w:p>
     <w:p>
@@ -2054,21 +2068,21 @@
           <w:color w:val="000000"/>
           <w:sz w:val="22"/>
         </w:rPr>
-        <w:t>Phase 3: Stakeholder forum (October 2026) (ACS convenes) [proposed – confirm]</w:t>
-      </w:r>
-    </w:p>
-    <w:p>
-      <w:pPr>
-        <w:pStyle w:val="Normal"/>
-        <w:rPr/>
-      </w:pPr>
-      <w:r>
-        <w:rPr>
-          <w:rFonts w:cs="Book Antiqua"/>
-          <w:b w:val="false"/>
-          <w:i w:val="false"/>
-        </w:rPr>
-        <w:t>Convene ACS, NZALC, HPC, NZDF Psychology, ILD, selected training providers and units to refine the framework, product architecture, governance model, implementation priorities, definition clarity and doctrinal coherence.</w:t>
+        <w:t>Phase 4: Validate (October 2026) (ACS convenes) [proposed – confirm]</w:t>
+      </w:r>
+    </w:p>
+    <w:p>
+      <w:pPr>
+        <w:pStyle w:val="Normal"/>
+        <w:rPr/>
+      </w:pPr>
+      <w:r>
+        <w:rPr>
+          <w:rFonts w:cs="Book Antiqua"/>
+          <w:b w:val="false"/>
+          <w:i w:val="false"/>
+        </w:rPr>
+        <w:t>Refine the framework with key stakeholders and conduct bounded pilots: convene ACS, NZALC, HPC, NZDF Psychology, ILD, selected training providers and units to refine the framework, product architecture, governance model, implementation priorities, definition clarity and doctrinal coherence.</w:t>
       </w:r>
     </w:p>
     <w:p>
@@ -2084,21 +2098,21 @@
           <w:color w:val="000000"/>
           <w:sz w:val="22"/>
         </w:rPr>
-        <w:t>Phase 4: Report back (November 2026) (ACS) [proposed – confirm]</w:t>
-      </w:r>
-    </w:p>
-    <w:p>
-      <w:pPr>
-        <w:pStyle w:val="Normal"/>
-        <w:rPr/>
-      </w:pPr>
-      <w:r>
-        <w:rPr>
-          <w:rFonts w:cs="Book Antiqua"/>
-          <w:b w:val="false"/>
-          <w:i w:val="false"/>
-        </w:rPr>
-        <w:t>Present the endorsed definitions and the confirmed relationship between Combat Mindset and Performance Under Pressure; Framework v1.0 and its agreed architecture; the validated capability and product architecture; the proposed governance and assurance model; an assessment of existing product maturity, evidence and scalability; and a prioritised implementation plan.</w:t>
+        <w:t>Phase 5: Implement (November 2026) (ACS) [proposed – confirm]</w:t>
+      </w:r>
+    </w:p>
+    <w:p>
+      <w:pPr>
+        <w:pStyle w:val="Normal"/>
+        <w:rPr/>
+      </w:pPr>
+      <w:r>
+        <w:rPr>
+          <w:rFonts w:cs="Book Antiqua"/>
+          <w:b w:val="false"/>
+          <w:i w:val="false"/>
+        </w:rPr>
+        <w:t>Deliver the framework for approval and implementation: present the endorsed definitions and the confirmed relationship between Combat Mindset and Performance Under Pressure; Framework v1.0 and its agreed architecture; the validated capability and product architecture; the proposed governance and assurance model; an assessment of existing product maturity, evidence and scalability; and a prioritised implementation plan.</w:t>
       </w:r>
     </w:p>
     <w:p>
@@ -2476,7 +2490,7 @@
         </w:pBdr>
         <w:rPr/>
       </w:pPr>
-      <w:bookmarkStart w:id="6" w:name="__RefHeading___Toc398_3029750867"/>
+      <w:bookmarkStart w:id="6" w:name="__RefHeading___Toc399_3124142782"/>
       <w:bookmarkEnd w:id="6"/>
       <w:r>
         <w:rPr>
@@ -2500,7 +2514,7 @@
           <w:b w:val="false"/>
           <w:i w:val="false"/>
         </w:rPr>
-        <w:t>The following arrangements are proposed for confirmation at Phase 0. Technical and professional authority is distributed by domain; no single organisation owns the evidence base for the entire capability.</w:t>
+        <w:t>The following arrangements are proposed for confirmation at Phase 1. Technical and professional authority is distributed by domain; no single organisation owns the evidence base for the entire capability.</w:t>
       </w:r>
     </w:p>
     <w:p>
@@ -2536,7 +2550,7 @@
           <w:b w:val="false"/>
           <w:i w:val="false"/>
         </w:rPr>
-        <w:t>Army Sponsor — strategic sponsor for Combat Mindset, the enabling Performance Under Pressure capability and the Army Combat Mindset Framework; to be confirmed at Phase 0, with candidate options identified by ACS.</w:t>
+        <w:t>Army Sponsor: strategic sponsor for Combat Mindset, the enabling Performance Under Pressure capability and the Combat Mindset Framework; to be confirmed at Phase 1, with candidate options identified by ACS.</w:t>
       </w:r>
     </w:p>
     <w:p>
@@ -2572,7 +2586,7 @@
           <w:b w:val="false"/>
           <w:i w:val="false"/>
         </w:rPr>
-        <w:t>Interim capability integrator — COMDT ACS, coordinating definition, framework development, stakeholder engagement and recommendations to the Army Sponsor.</w:t>
+        <w:t>Interim capability integrator: COMDT ACS, coordinating definition, framework development, stakeholder engagement and recommendations to the Army Sponsor.</w:t>
       </w:r>
     </w:p>
     <w:p>
@@ -2608,7 +2622,7 @@
           <w:b w:val="false"/>
           <w:i w:val="false"/>
         </w:rPr>
-        <w:t>Framework development and capability-integration lead — ACS, coordinating framework architecture, developmental progression, stakeholder integration, product recognition criteria and implementation planning, leveraging NZALC and wider ACS expertise, intellectual property and programmes.</w:t>
+        <w:t>Framework development and capability-integration lead: ACS, coordinating framework architecture, developmental progression, stakeholder integration, product recognition criteria and implementation planning, leveraging NZALC and wider ACS expertise, intellectual property and programmes.</w:t>
       </w:r>
     </w:p>
     <w:p>
@@ -2644,7 +2658,7 @@
           <w:b w:val="false"/>
           <w:i w:val="false"/>
         </w:rPr>
-        <w:t>COGCON product steward and performance-cognition adviser — Human Performance Cell, responsible for the integrity and further development of the COGCON method and for specialist advice on cognitive conditioning and proportionate measurement, within available capacity.</w:t>
+        <w:t>COGCON product steward and performance-cognition adviser: Human Performance Cell, responsible for the integrity and further development of the COGCON method and for specialist advice on cognitive conditioning and proportionate measurement, within available capacity.</w:t>
       </w:r>
     </w:p>
     <w:p>
@@ -2680,7 +2694,7 @@
           <w:b w:val="false"/>
           <w:i w:val="false"/>
         </w:rPr>
-        <w:t>Domain advisers and authorities — NZDF Psychology, ILD, physical-performance specialists, doctrine staff and other relevant organisations, providing technical or professional advice within their respective domains.</w:t>
+        <w:t>Domain advisers and authorities: NZDF Psychology, ILD, physical-performance specialists, doctrine staff and other relevant organisations, providing technical or professional advice within their respective domains.</w:t>
       </w:r>
     </w:p>
     <w:p>
@@ -2716,7 +2730,7 @@
           <w:b w:val="false"/>
           <w:i w:val="false"/>
         </w:rPr>
-        <w:t>Delivery agencies — training establishments, units and existing instructor workforces approved to deliver recognised products.</w:t>
+        <w:t>Delivery agencies: training establishments, units and existing instructor workforces approved to deliver recognised products.</w:t>
       </w:r>
     </w:p>
     <w:p>
@@ -2752,7 +2766,7 @@
           <w:b w:val="false"/>
           <w:i w:val="false"/>
         </w:rPr>
-        <w:t>Assurance — a layered assurance model covering doctrine, evidence, professional content, learning design, delivery quality and operational relevance, with sufficient independence from individual product owners and delivery organisations.</w:t>
+        <w:t>Assurance: a layered assurance model covering doctrine, evidence, professional content, learning design, delivery quality and operational relevance, with sufficient independence from individual product owners and delivery organisations.</w:t>
       </w:r>
     </w:p>
     <w:p>
@@ -2776,7 +2790,7 @@
         </w:pBdr>
         <w:rPr/>
       </w:pPr>
-      <w:bookmarkStart w:id="7" w:name="__RefHeading___Toc400_3029750867"/>
+      <w:bookmarkStart w:id="7" w:name="__RefHeading___Toc401_3124142782"/>
       <w:bookmarkEnd w:id="7"/>
       <w:r>
         <w:rPr>
@@ -2872,7 +2886,7 @@
           <w:b w:val="false"/>
           <w:i w:val="false"/>
         </w:rPr>
-        <w:t xml:space="preserve"> the proposed definitions of Combat Mindset, Performance Under Pressure and the Army Combat Mindset Framework as the baseline for wider staffing and refinement.</w:t>
+        <w:t xml:space="preserve"> the proposed definitions of Combat Mindset, Performance Under Pressure and the Combat Mindset Framework as the baseline for wider staffing and refinement.</w:t>
       </w:r>
     </w:p>
     <w:p>
@@ -2908,7 +2922,7 @@
           <w:b w:val="false"/>
           <w:i w:val="false"/>
         </w:rPr>
-        <w:t xml:space="preserve"> development of the Army Combat Mindset Framework through the proposed capability and product stocktake, framework-development activity and stakeholder forum, noting that the provisional capability pillars and the contribution, maturity, evidence, ownership and appropriate nesting of existing products — including the NZALC Performance Under Pressure package, COGCON and NZDF Psychology products — will be validated through this process.</w:t>
+        <w:t xml:space="preserve"> development of the Combat Mindset Framework through the proposed capability and product assessment, framework design and validation activity, noting that the provisional capability pillars and the contribution, maturity, evidence, ownership and appropriate nesting of existing products (including the NZALC Performance Under Pressure package, COGCON and NZDF Psychology products) will be validated through this process.</w:t>
       </w:r>
     </w:p>
     <w:p>
@@ -3016,7 +3030,7 @@
           <w:b w:val="false"/>
           <w:i w:val="false"/>
         </w:rPr>
-        <w:t xml:space="preserve"> the status of Harder to Kill within the proposed Combat Mindset tagline — Remain effective. Act decisively. Harder to kill. — endorsing, deferring or rejecting its inclusion.</w:t>
+        <w:t xml:space="preserve"> the status of Harder to Kill within the proposed Combat Mindset tagline (Remain effective. Act decisively. Harder to kill.), endorsing, deferring or rejecting its inclusion.</w:t>
       </w:r>
     </w:p>
     <w:p>
@@ -3078,7 +3092,7 @@
         <w:spacing w:before="0" w:after="160"/>
         <w:rPr/>
       </w:pPr>
-      <w:bookmarkStart w:id="8" w:name="__RefHeading___Toc402_3029750867"/>
+      <w:bookmarkStart w:id="8" w:name="__RefHeading___Toc403_3124142782"/>
       <w:bookmarkEnd w:id="8"/>
       <w:r>
         <w:rPr>
@@ -3174,7 +3188,7 @@
           <w:b w:val="false"/>
           <w:i w:val="false"/>
         </w:rPr>
-        <w:t>Performance Under Pressure and Combat Mindset in the New Zealand Army — Draft Capability Note, NZALC, July 2026.</w:t>
+        <w:t>Performance Under Pressure and Combat Mindset in the New Zealand Army (Draft Capability Note), NZALC, July 2026.</w:t>
       </w:r>
     </w:p>
     <w:p>
@@ -3224,7 +3238,7 @@
           <w:b w:val="false"/>
           <w:i w:val="false"/>
         </w:rPr>
-        <w:t>Relevant NZDF Psychology, ILD and doctrinal holdings will be confirmed and referenced through the Phase 1 stocktake.</w:t>
+        <w:t>Relevant NZDF Psychology, ILD and doctrinal holdings will be confirmed and referenced through the Phase 2 assessment.</w:t>
       </w:r>
     </w:p>
     <w:p>
@@ -3235,7 +3249,7 @@
         </w:pBdr>
         <w:rPr/>
       </w:pPr>
-      <w:bookmarkStart w:id="9" w:name="__RefHeading___Toc404_3029750867"/>
+      <w:bookmarkStart w:id="9" w:name="__RefHeading___Toc405_3124142782"/>
       <w:bookmarkEnd w:id="9"/>
       <w:r>
         <w:rPr>
@@ -3245,21 +3259,21 @@
           <w:color w:val="002516"/>
           <w:sz w:val="28"/>
         </w:rPr>
-        <w:t>Annex A — Interim governance and division of functions</w:t>
-      </w:r>
-    </w:p>
-    <w:p>
-      <w:pPr>
-        <w:pStyle w:val="Normal"/>
-        <w:rPr/>
-      </w:pPr>
-      <w:r>
-        <w:rPr>
-          <w:rFonts w:cs="Book Antiqua"/>
-          <w:b w:val="false"/>
-          <w:i w:val="false"/>
-        </w:rPr>
-        <w:t>The following division of functions is proposed for confirmation at Phase 0 and refinement through the Phase 1 stocktake and stakeholder forum.</w:t>
+        <w:t>Annex A: Interim governance and division of functions</w:t>
+      </w:r>
+    </w:p>
+    <w:p>
+      <w:pPr>
+        <w:pStyle w:val="Normal"/>
+        <w:rPr/>
+      </w:pPr>
+      <w:r>
+        <w:rPr>
+          <w:rFonts w:cs="Book Antiqua"/>
+          <w:b w:val="false"/>
+          <w:i w:val="false"/>
+        </w:rPr>
+        <w:t>The following division of functions is proposed for confirmation at Phase 1 and refinement through the Phase 2 assessment and Phase 4 validation.</w:t>
       </w:r>
     </w:p>
     <w:tbl>
@@ -4202,7 +4216,7 @@
         <w:color w:val="000000"/>
         <w:sz w:val="17"/>
       </w:rPr>
-      <w:t>Combat Mindset — Proposed Way Forward</w:t>
+      <w:t>Combat Mindset Framework Proposal</w:t>
       <w:tab/>
       <w:t>ACS 2026</w:t>
       <w:tab/>
@@ -4334,7 +4348,7 @@
         <w:color w:val="000000"/>
         <w:sz w:val="17"/>
       </w:rPr>
-      <w:t>Combat Mindset — Proposed Way Forward</w:t>
+      <w:t>Combat Mindset Framework Proposal</w:t>
       <w:tab/>
       <w:t>ACS 2026</w:t>
       <w:tab/>
@@ -4496,7 +4510,7 @@
         <w:color w:val="000000"/>
         <w:sz w:val="17"/>
       </w:rPr>
-      <w:t>Combat Mindset — Proposed Way Forward</w:t>
+      <w:t>Combat Mindset Framework Proposal</w:t>
       <w:tab/>
       <w:t>ACS 2026</w:t>
       <w:tab/>
@@ -4642,7 +4656,7 @@
         <w:color w:val="000000"/>
         <w:sz w:val="17"/>
       </w:rPr>
-      <w:t>Combat Mindset — Proposed Way Forward</w:t>
+      <w:t>Combat Mindset Framework Proposal</w:t>
       <w:tab/>
       <w:t>ACS 2026</w:t>
       <w:tab/>

</xml_diff>

<commit_message>
ELDA Lead Leaders across the month boundary; cover page trimmed to v1.0
Calendar: the April ELDA course is renamed to ELDA Lead Leaders and now
runs 26 April to 1 May, with the one-day continuation carried onto May's
ELDA row.

Proposal cover: the descriptive sentence under the red rule and the
tagline qualifier are removed, leaving the two tagline lines. Version
moves to Draft v1.0.

Co-Authored-By: Claude Fable 5 <noreply@anthropic.com>
Claude-Session: https://claude.ai/code/session_01YLo1WfwUDkbwfJEF3ZNVbB
</commit_message>
<xml_diff>
--- a/output/combat-mindset-way-forward.docx
+++ b/output/combat-mindset-way-forward.docx
@@ -87,22 +87,7 @@
     <w:p>
       <w:pPr>
         <w:pStyle w:val="Normal"/>
-        <w:spacing w:before="120" w:after="280"/>
-        <w:rPr/>
-      </w:pPr>
-      <w:r>
-        <w:rPr>
-          <w:rFonts w:cs="Arial" w:ascii="Arial" w:hAnsi="Arial"/>
-          <w:color w:val="002516"/>
-          <w:sz w:val="26"/>
-        </w:rPr>
-        <w:t>Defining, developing and assuring the human-performance capability Army requires to remain effective in combat.</w:t>
-      </w:r>
-    </w:p>
-    <w:p>
-      <w:pPr>
-        <w:pStyle w:val="Normal"/>
-        <w:spacing w:before="0" w:after="40"/>
+        <w:spacing w:before="160" w:after="40"/>
         <w:rPr/>
       </w:pPr>
       <w:r>
@@ -117,7 +102,7 @@
     <w:p>
       <w:pPr>
         <w:pStyle w:val="Normal"/>
-        <w:spacing w:before="0" w:after="80"/>
+        <w:spacing w:before="0" w:after="1680"/>
         <w:rPr/>
       </w:pPr>
       <w:r>
@@ -128,21 +113,6 @@
           <w:sz w:val="26"/>
         </w:rPr>
         <w:t>Harder to kill.</w:t>
-      </w:r>
-    </w:p>
-    <w:p>
-      <w:pPr>
-        <w:pStyle w:val="Normal"/>
-        <w:spacing w:before="0" w:after="1680"/>
-        <w:rPr/>
-      </w:pPr>
-      <w:r>
-        <w:rPr>
-          <w:rFonts w:cs="Arial" w:ascii="Arial" w:hAnsi="Arial"/>
-          <w:color w:val="002516"/>
-          <w:sz w:val="18"/>
-        </w:rPr>
-        <w:t>Proposed tagline, subject to sponsor endorsement</w:t>
       </w:r>
     </w:p>
     <w:p>
@@ -264,7 +234,7 @@
           <w:color w:val="000000"/>
           <w:sz w:val="20"/>
         </w:rPr>
-        <w:t>Draft v0.9</w:t>
+        <w:t>Draft v1.0</w:t>
       </w:r>
     </w:p>
     <w:p>
@@ -334,7 +304,7 @@
             </w:rPr>
             <w:fldChar w:fldCharType="separate"/>
           </w:r>
-          <w:hyperlink w:anchor="__RefHeading___Toc387_3124142782">
+          <w:hyperlink w:anchor="__RefHeading___Toc385_3287448013">
             <w:r>
               <w:rPr>
                 <w:webHidden/>
@@ -361,7 +331,7 @@
             </w:tabs>
             <w:rPr/>
           </w:pPr>
-          <w:hyperlink w:anchor="__RefHeading___Toc389_3124142782">
+          <w:hyperlink w:anchor="__RefHeading___Toc387_3287448013">
             <w:r>
               <w:rPr>
                 <w:webHidden/>
@@ -388,7 +358,7 @@
             </w:tabs>
             <w:rPr/>
           </w:pPr>
-          <w:hyperlink w:anchor="__RefHeading___Toc391_3124142782">
+          <w:hyperlink w:anchor="__RefHeading___Toc389_3287448013">
             <w:r>
               <w:rPr>
                 <w:webHidden/>
@@ -415,7 +385,7 @@
             </w:tabs>
             <w:rPr/>
           </w:pPr>
-          <w:hyperlink w:anchor="__RefHeading___Toc393_3124142782">
+          <w:hyperlink w:anchor="__RefHeading___Toc391_3287448013">
             <w:r>
               <w:rPr>
                 <w:webHidden/>
@@ -442,7 +412,7 @@
             </w:tabs>
             <w:rPr/>
           </w:pPr>
-          <w:hyperlink w:anchor="__RefHeading___Toc395_3124142782">
+          <w:hyperlink w:anchor="__RefHeading___Toc393_3287448013">
             <w:r>
               <w:rPr>
                 <w:webHidden/>
@@ -469,7 +439,7 @@
             </w:tabs>
             <w:rPr/>
           </w:pPr>
-          <w:hyperlink w:anchor="__RefHeading___Toc397_3124142782">
+          <w:hyperlink w:anchor="__RefHeading___Toc395_3287448013">
             <w:r>
               <w:rPr>
                 <w:webHidden/>
@@ -496,7 +466,7 @@
             </w:tabs>
             <w:rPr/>
           </w:pPr>
-          <w:hyperlink w:anchor="__RefHeading___Toc399_3124142782">
+          <w:hyperlink w:anchor="__RefHeading___Toc397_3287448013">
             <w:r>
               <w:rPr>
                 <w:webHidden/>
@@ -523,7 +493,7 @@
             </w:tabs>
             <w:rPr/>
           </w:pPr>
-          <w:hyperlink w:anchor="__RefHeading___Toc401_3124142782">
+          <w:hyperlink w:anchor="__RefHeading___Toc399_3287448013">
             <w:r>
               <w:rPr>
                 <w:webHidden/>
@@ -550,7 +520,7 @@
             </w:tabs>
             <w:rPr/>
           </w:pPr>
-          <w:hyperlink w:anchor="__RefHeading___Toc403_3124142782">
+          <w:hyperlink w:anchor="__RefHeading___Toc401_3287448013">
             <w:r>
               <w:rPr>
                 <w:webHidden/>
@@ -577,7 +547,7 @@
             </w:tabs>
             <w:rPr/>
           </w:pPr>
-          <w:hyperlink w:anchor="__RefHeading___Toc405_3124142782">
+          <w:hyperlink w:anchor="__RefHeading___Toc403_3287448013">
             <w:r>
               <w:rPr>
                 <w:webHidden/>
@@ -632,7 +602,7 @@
         <w:spacing w:before="0" w:after="160"/>
         <w:rPr/>
       </w:pPr>
-      <w:bookmarkStart w:id="0" w:name="__RefHeading___Toc387_3124142782"/>
+      <w:bookmarkStart w:id="0" w:name="__RefHeading___Toc385_3287448013"/>
       <w:bookmarkEnd w:id="0"/>
       <w:r>
         <w:rPr>
@@ -714,7 +684,7 @@
         </w:pBdr>
         <w:rPr/>
       </w:pPr>
-      <w:bookmarkStart w:id="1" w:name="__RefHeading___Toc389_3124142782"/>
+      <w:bookmarkStart w:id="1" w:name="__RefHeading___Toc387_3287448013"/>
       <w:bookmarkEnd w:id="1"/>
       <w:r>
         <w:rPr>
@@ -776,7 +746,7 @@
         </w:pBdr>
         <w:rPr/>
       </w:pPr>
-      <w:bookmarkStart w:id="2" w:name="__RefHeading___Toc391_3124142782"/>
+      <w:bookmarkStart w:id="2" w:name="__RefHeading___Toc389_3287448013"/>
       <w:bookmarkEnd w:id="2"/>
       <w:r>
         <w:rPr>
@@ -884,7 +854,7 @@
         </w:pBdr>
         <w:rPr/>
       </w:pPr>
-      <w:bookmarkStart w:id="3" w:name="__RefHeading___Toc393_3124142782"/>
+      <w:bookmarkStart w:id="3" w:name="__RefHeading___Toc391_3287448013"/>
       <w:bookmarkEnd w:id="3"/>
       <w:r>
         <w:rPr>
@@ -1442,7 +1412,7 @@
         </w:pBdr>
         <w:rPr/>
       </w:pPr>
-      <w:bookmarkStart w:id="4" w:name="__RefHeading___Toc395_3124142782"/>
+      <w:bookmarkStart w:id="4" w:name="__RefHeading___Toc393_3287448013"/>
       <w:bookmarkEnd w:id="4"/>
       <w:r>
         <w:rPr>
@@ -1608,7 +1578,7 @@
         </w:pBdr>
         <w:rPr/>
       </w:pPr>
-      <w:bookmarkStart w:id="5" w:name="__RefHeading___Toc397_3124142782"/>
+      <w:bookmarkStart w:id="5" w:name="__RefHeading___Toc395_3287448013"/>
       <w:bookmarkEnd w:id="5"/>
       <w:r>
         <w:rPr>
@@ -2490,7 +2460,7 @@
         </w:pBdr>
         <w:rPr/>
       </w:pPr>
-      <w:bookmarkStart w:id="6" w:name="__RefHeading___Toc399_3124142782"/>
+      <w:bookmarkStart w:id="6" w:name="__RefHeading___Toc397_3287448013"/>
       <w:bookmarkEnd w:id="6"/>
       <w:r>
         <w:rPr>
@@ -2790,7 +2760,7 @@
         </w:pBdr>
         <w:rPr/>
       </w:pPr>
-      <w:bookmarkStart w:id="7" w:name="__RefHeading___Toc401_3124142782"/>
+      <w:bookmarkStart w:id="7" w:name="__RefHeading___Toc399_3287448013"/>
       <w:bookmarkEnd w:id="7"/>
       <w:r>
         <w:rPr>
@@ -3092,7 +3062,7 @@
         <w:spacing w:before="0" w:after="160"/>
         <w:rPr/>
       </w:pPr>
-      <w:bookmarkStart w:id="8" w:name="__RefHeading___Toc403_3124142782"/>
+      <w:bookmarkStart w:id="8" w:name="__RefHeading___Toc401_3287448013"/>
       <w:bookmarkEnd w:id="8"/>
       <w:r>
         <w:rPr>
@@ -3249,7 +3219,7 @@
         </w:pBdr>
         <w:rPr/>
       </w:pPr>
-      <w:bookmarkStart w:id="9" w:name="__RefHeading___Toc405_3124142782"/>
+      <w:bookmarkStart w:id="9" w:name="__RefHeading___Toc403_3287448013"/>
       <w:bookmarkEnd w:id="9"/>
       <w:r>
         <w:rPr>

</xml_diff>

<commit_message>
Align the model page with the document's margins
The model section used narrow margins, leaving its heading, illustration
and footer on three different left edges, none matching the body pages.
It now carries the same margins as the body, so the section heading and
the footer sit on the document's standard left edge and the illustration
fills the text width.

Co-Authored-By: Claude Fable 5 <noreply@anthropic.com>
Claude-Session: https://claude.ai/code/session_01YLo1WfwUDkbwfJEF3ZNVbB
</commit_message>
<xml_diff>
--- a/output/combat-mindset-way-forward.docx
+++ b/output/combat-mindset-way-forward.docx
@@ -304,7 +304,7 @@
             </w:rPr>
             <w:fldChar w:fldCharType="separate"/>
           </w:r>
-          <w:hyperlink w:anchor="__RefHeading___Toc385_3287448013">
+          <w:hyperlink w:anchor="__RefHeading___Toc385_4017517749">
             <w:r>
               <w:rPr>
                 <w:webHidden/>
@@ -331,7 +331,7 @@
             </w:tabs>
             <w:rPr/>
           </w:pPr>
-          <w:hyperlink w:anchor="__RefHeading___Toc387_3287448013">
+          <w:hyperlink w:anchor="__RefHeading___Toc387_4017517749">
             <w:r>
               <w:rPr>
                 <w:webHidden/>
@@ -358,7 +358,7 @@
             </w:tabs>
             <w:rPr/>
           </w:pPr>
-          <w:hyperlink w:anchor="__RefHeading___Toc389_3287448013">
+          <w:hyperlink w:anchor="__RefHeading___Toc389_4017517749">
             <w:r>
               <w:rPr>
                 <w:webHidden/>
@@ -385,7 +385,7 @@
             </w:tabs>
             <w:rPr/>
           </w:pPr>
-          <w:hyperlink w:anchor="__RefHeading___Toc391_3287448013">
+          <w:hyperlink w:anchor="__RefHeading___Toc391_4017517749">
             <w:r>
               <w:rPr>
                 <w:webHidden/>
@@ -412,7 +412,7 @@
             </w:tabs>
             <w:rPr/>
           </w:pPr>
-          <w:hyperlink w:anchor="__RefHeading___Toc393_3287448013">
+          <w:hyperlink w:anchor="__RefHeading___Toc393_4017517749">
             <w:r>
               <w:rPr>
                 <w:webHidden/>
@@ -439,7 +439,7 @@
             </w:tabs>
             <w:rPr/>
           </w:pPr>
-          <w:hyperlink w:anchor="__RefHeading___Toc395_3287448013">
+          <w:hyperlink w:anchor="__RefHeading___Toc395_4017517749">
             <w:r>
               <w:rPr>
                 <w:webHidden/>
@@ -466,7 +466,7 @@
             </w:tabs>
             <w:rPr/>
           </w:pPr>
-          <w:hyperlink w:anchor="__RefHeading___Toc397_3287448013">
+          <w:hyperlink w:anchor="__RefHeading___Toc397_4017517749">
             <w:r>
               <w:rPr>
                 <w:webHidden/>
@@ -493,7 +493,7 @@
             </w:tabs>
             <w:rPr/>
           </w:pPr>
-          <w:hyperlink w:anchor="__RefHeading___Toc399_3287448013">
+          <w:hyperlink w:anchor="__RefHeading___Toc399_4017517749">
             <w:r>
               <w:rPr>
                 <w:webHidden/>
@@ -520,7 +520,7 @@
             </w:tabs>
             <w:rPr/>
           </w:pPr>
-          <w:hyperlink w:anchor="__RefHeading___Toc401_3287448013">
+          <w:hyperlink w:anchor="__RefHeading___Toc401_4017517749">
             <w:r>
               <w:rPr>
                 <w:webHidden/>
@@ -547,7 +547,7 @@
             </w:tabs>
             <w:rPr/>
           </w:pPr>
-          <w:hyperlink w:anchor="__RefHeading___Toc403_3287448013">
+          <w:hyperlink w:anchor="__RefHeading___Toc403_4017517749">
             <w:r>
               <w:rPr>
                 <w:webHidden/>
@@ -602,7 +602,7 @@
         <w:spacing w:before="0" w:after="160"/>
         <w:rPr/>
       </w:pPr>
-      <w:bookmarkStart w:id="0" w:name="__RefHeading___Toc385_3287448013"/>
+      <w:bookmarkStart w:id="0" w:name="__RefHeading___Toc385_4017517749"/>
       <w:bookmarkEnd w:id="0"/>
       <w:r>
         <w:rPr>
@@ -625,21 +625,21 @@
           <w:footerReference w:type="first" r:id="rId14"/>
           <w:type w:val="nextPage"/>
           <w:pgSz w:w="11906" w:h="16838"/>
-          <w:pgMar w:left="425" w:right="425" w:gutter="0" w:header="624" w:top="681" w:footer="624" w:bottom="794"/>
+          <w:pgMar w:left="1417" w:right="1417" w:gutter="0" w:header="624" w:top="1361" w:footer="624" w:bottom="1361"/>
           <w:pgNumType w:fmt="decimal"/>
           <w:formProt w:val="false"/>
           <w:textDirection w:val="lrTb"/>
           <w:docGrid w:type="default" w:linePitch="360" w:charSpace="0"/>
         </w:sectPr>
         <w:pStyle w:val="Normal"/>
-        <w:jc w:val="center"/>
+        <w:jc w:val="left"/>
         <w:rPr/>
       </w:pPr>
       <w:r>
         <w:rPr/>
         <w:drawing>
           <wp:inline distT="0" distB="0" distL="0" distR="0">
-            <wp:extent cx="6623685" cy="9039225"/>
+            <wp:extent cx="5760085" cy="7860030"/>
             <wp:effectExtent l="0" t="0" r="0" b="0"/>
             <wp:docPr id="2" name="Picture 2" descr=""/>
             <wp:cNvGraphicFramePr>
@@ -663,7 +663,7 @@
                   <pic:spPr bwMode="auto">
                     <a:xfrm>
                       <a:off x="0" y="0"/>
-                      <a:ext cx="6623685" cy="9039225"/>
+                      <a:ext cx="5760085" cy="7860030"/>
                     </a:xfrm>
                     <a:prstGeom prst="rect">
                       <a:avLst/>
@@ -684,7 +684,7 @@
         </w:pBdr>
         <w:rPr/>
       </w:pPr>
-      <w:bookmarkStart w:id="1" w:name="__RefHeading___Toc387_3287448013"/>
+      <w:bookmarkStart w:id="1" w:name="__RefHeading___Toc387_4017517749"/>
       <w:bookmarkEnd w:id="1"/>
       <w:r>
         <w:rPr>
@@ -746,7 +746,7 @@
         </w:pBdr>
         <w:rPr/>
       </w:pPr>
-      <w:bookmarkStart w:id="2" w:name="__RefHeading___Toc389_3287448013"/>
+      <w:bookmarkStart w:id="2" w:name="__RefHeading___Toc389_4017517749"/>
       <w:bookmarkEnd w:id="2"/>
       <w:r>
         <w:rPr>
@@ -854,7 +854,7 @@
         </w:pBdr>
         <w:rPr/>
       </w:pPr>
-      <w:bookmarkStart w:id="3" w:name="__RefHeading___Toc391_3287448013"/>
+      <w:bookmarkStart w:id="3" w:name="__RefHeading___Toc391_4017517749"/>
       <w:bookmarkEnd w:id="3"/>
       <w:r>
         <w:rPr>
@@ -1412,7 +1412,7 @@
         </w:pBdr>
         <w:rPr/>
       </w:pPr>
-      <w:bookmarkStart w:id="4" w:name="__RefHeading___Toc393_3287448013"/>
+      <w:bookmarkStart w:id="4" w:name="__RefHeading___Toc393_4017517749"/>
       <w:bookmarkEnd w:id="4"/>
       <w:r>
         <w:rPr>
@@ -1578,7 +1578,7 @@
         </w:pBdr>
         <w:rPr/>
       </w:pPr>
-      <w:bookmarkStart w:id="5" w:name="__RefHeading___Toc395_3287448013"/>
+      <w:bookmarkStart w:id="5" w:name="__RefHeading___Toc395_4017517749"/>
       <w:bookmarkEnd w:id="5"/>
       <w:r>
         <w:rPr>
@@ -2460,7 +2460,7 @@
         </w:pBdr>
         <w:rPr/>
       </w:pPr>
-      <w:bookmarkStart w:id="6" w:name="__RefHeading___Toc397_3287448013"/>
+      <w:bookmarkStart w:id="6" w:name="__RefHeading___Toc397_4017517749"/>
       <w:bookmarkEnd w:id="6"/>
       <w:r>
         <w:rPr>
@@ -2760,7 +2760,7 @@
         </w:pBdr>
         <w:rPr/>
       </w:pPr>
-      <w:bookmarkStart w:id="7" w:name="__RefHeading___Toc399_3287448013"/>
+      <w:bookmarkStart w:id="7" w:name="__RefHeading___Toc399_4017517749"/>
       <w:bookmarkEnd w:id="7"/>
       <w:r>
         <w:rPr>
@@ -3062,7 +3062,7 @@
         <w:spacing w:before="0" w:after="160"/>
         <w:rPr/>
       </w:pPr>
-      <w:bookmarkStart w:id="8" w:name="__RefHeading___Toc401_3287448013"/>
+      <w:bookmarkStart w:id="8" w:name="__RefHeading___Toc401_4017517749"/>
       <w:bookmarkEnd w:id="8"/>
       <w:r>
         <w:rPr>
@@ -3219,7 +3219,7 @@
         </w:pBdr>
         <w:rPr/>
       </w:pPr>
-      <w:bookmarkStart w:id="9" w:name="__RefHeading___Toc403_3287448013"/>
+      <w:bookmarkStart w:id="9" w:name="__RefHeading___Toc403_4017517749"/>
       <w:bookmarkEnd w:id="9"/>
       <w:r>
         <w:rPr>
@@ -4467,8 +4467,8 @@
       <w:pStyle w:val="Normal"/>
       <w:tabs>
         <w:tab w:val="clear" w:pos="720"/>
-        <w:tab w:val="center" w:pos="5528" w:leader="none"/>
-        <w:tab w:val="right" w:pos="11055" w:leader="none"/>
+        <w:tab w:val="center" w:pos="4535" w:leader="none"/>
+        <w:tab w:val="right" w:pos="9071" w:leader="none"/>
       </w:tabs>
       <w:spacing w:before="40" w:after="0"/>
       <w:rPr/>

</xml_diff>

<commit_message>
Tighten the Purpose to what the paper actually seeks
The opening claimed more than the paper delivers. It now states the
COMDT ACS direction and the four things proposed for decision: a problem
statement, initial working definitions and their relationship, the
Combat Mindset Framework as the organising system, and a programme of
work. The second paragraph summarises the five phases and closes on the
November 2026 recommendations and implementation back brief.

Co-Authored-By: Claude Fable 5 <noreply@anthropic.com>
Claude-Session: https://claude.ai/code/session_01YLo1WfwUDkbwfJEF3ZNVbB
</commit_message>
<xml_diff>
--- a/output/combat-mindset-way-forward.docx
+++ b/output/combat-mindset-way-forward.docx
@@ -304,7 +304,7 @@
             </w:rPr>
             <w:fldChar w:fldCharType="separate"/>
           </w:r>
-          <w:hyperlink w:anchor="__RefHeading___Toc385_4017517749">
+          <w:hyperlink w:anchor="__RefHeading___Toc385_1167437784">
             <w:r>
               <w:rPr>
                 <w:webHidden/>
@@ -331,7 +331,7 @@
             </w:tabs>
             <w:rPr/>
           </w:pPr>
-          <w:hyperlink w:anchor="__RefHeading___Toc387_4017517749">
+          <w:hyperlink w:anchor="__RefHeading___Toc387_1167437784">
             <w:r>
               <w:rPr>
                 <w:webHidden/>
@@ -358,7 +358,7 @@
             </w:tabs>
             <w:rPr/>
           </w:pPr>
-          <w:hyperlink w:anchor="__RefHeading___Toc389_4017517749">
+          <w:hyperlink w:anchor="__RefHeading___Toc389_1167437784">
             <w:r>
               <w:rPr>
                 <w:webHidden/>
@@ -385,7 +385,7 @@
             </w:tabs>
             <w:rPr/>
           </w:pPr>
-          <w:hyperlink w:anchor="__RefHeading___Toc391_4017517749">
+          <w:hyperlink w:anchor="__RefHeading___Toc391_1167437784">
             <w:r>
               <w:rPr>
                 <w:webHidden/>
@@ -399,7 +399,7 @@
                 <w:rStyle w:val="IndexLink"/>
               </w:rPr>
               <w:tab/>
-              <w:t>5</w:t>
+              <w:t>4</w:t>
             </w:r>
           </w:hyperlink>
         </w:p>
@@ -412,7 +412,7 @@
             </w:tabs>
             <w:rPr/>
           </w:pPr>
-          <w:hyperlink w:anchor="__RefHeading___Toc393_4017517749">
+          <w:hyperlink w:anchor="__RefHeading___Toc393_1167437784">
             <w:r>
               <w:rPr>
                 <w:webHidden/>
@@ -439,7 +439,7 @@
             </w:tabs>
             <w:rPr/>
           </w:pPr>
-          <w:hyperlink w:anchor="__RefHeading___Toc395_4017517749">
+          <w:hyperlink w:anchor="__RefHeading___Toc395_1167437784">
             <w:r>
               <w:rPr>
                 <w:webHidden/>
@@ -466,7 +466,7 @@
             </w:tabs>
             <w:rPr/>
           </w:pPr>
-          <w:hyperlink w:anchor="__RefHeading___Toc397_4017517749">
+          <w:hyperlink w:anchor="__RefHeading___Toc397_1167437784">
             <w:r>
               <w:rPr>
                 <w:webHidden/>
@@ -493,7 +493,7 @@
             </w:tabs>
             <w:rPr/>
           </w:pPr>
-          <w:hyperlink w:anchor="__RefHeading___Toc399_4017517749">
+          <w:hyperlink w:anchor="__RefHeading___Toc399_1167437784">
             <w:r>
               <w:rPr>
                 <w:webHidden/>
@@ -520,7 +520,7 @@
             </w:tabs>
             <w:rPr/>
           </w:pPr>
-          <w:hyperlink w:anchor="__RefHeading___Toc401_4017517749">
+          <w:hyperlink w:anchor="__RefHeading___Toc401_1167437784">
             <w:r>
               <w:rPr>
                 <w:webHidden/>
@@ -547,7 +547,7 @@
             </w:tabs>
             <w:rPr/>
           </w:pPr>
-          <w:hyperlink w:anchor="__RefHeading___Toc403_4017517749">
+          <w:hyperlink w:anchor="__RefHeading___Toc403_1167437784">
             <w:r>
               <w:rPr>
                 <w:webHidden/>
@@ -602,7 +602,7 @@
         <w:spacing w:before="0" w:after="160"/>
         <w:rPr/>
       </w:pPr>
-      <w:bookmarkStart w:id="0" w:name="__RefHeading___Toc385_4017517749"/>
+      <w:bookmarkStart w:id="0" w:name="__RefHeading___Toc385_1167437784"/>
       <w:bookmarkEnd w:id="0"/>
       <w:r>
         <w:rPr>
@@ -684,7 +684,7 @@
         </w:pBdr>
         <w:rPr/>
       </w:pPr>
-      <w:bookmarkStart w:id="1" w:name="__RefHeading___Toc387_4017517749"/>
+      <w:bookmarkStart w:id="1" w:name="__RefHeading___Toc387_1167437784"/>
       <w:bookmarkEnd w:id="1"/>
       <w:r>
         <w:rPr>
@@ -708,21 +708,21 @@
           <w:b w:val="false"/>
           <w:i w:val="false"/>
         </w:rPr>
-        <w:t>This paper responds to COMDT ACS direction of 16 July 2026 for NZ Army Leadership Centre (NZALC) and the Human Performance Cell (HPC) to jointly develop a strategy to close the Combat Mindset doctrine and policy gap. It proposes an agreed problem statement, formal definitions and their relationship for decision, the Combat Mindset Framework as the organising system, a programme of work, interim governance and assurance arrangements, and the process by which existing training products will be assessed and nested beneath the framework.</w:t>
-      </w:r>
-    </w:p>
-    <w:p>
-      <w:pPr>
-        <w:pStyle w:val="Normal"/>
-        <w:rPr/>
-      </w:pPr>
-      <w:r>
-        <w:rPr>
-          <w:rFonts w:cs="Book Antiqua"/>
-          <w:b w:val="false"/>
-          <w:i w:val="false"/>
-        </w:rPr>
-        <w:t>This paper is a scoping and decision paper. It does not present final Combat Mindset doctrine. It seeks endorsement of the initial definitions, interim governance and programme of work required to develop, validate and staff the Combat Mindset Framework. The definitions are a drafting baseline; the capability pillars are provisional; the Phase 2 assessment and Phase 4 validation will confirm the final architecture; and existing products will be assessed rather than automatically adopted. Final recommendations will return to COMDT ACS in November 2026.</w:t>
+        <w:t>This paper responds to COMDT ACS direction of 16 July 2026 for NZ Army Leadership Centre (NZALC), in conjunction with the Human Performance Cell (HPC), to develop a strategy to close the Combat Mindset policy and doctrine gap. It proposes a problem statement, initial working definitions and their relationship, the Combat Mindset Framework as the organising system, and a programme of work, for decision.</w:t>
+      </w:r>
+    </w:p>
+    <w:p>
+      <w:pPr>
+        <w:pStyle w:val="Normal"/>
+        <w:rPr/>
+      </w:pPr>
+      <w:r>
+        <w:rPr>
+          <w:rFonts w:cs="Book Antiqua"/>
+          <w:b w:val="false"/>
+          <w:i w:val="false"/>
+        </w:rPr>
+        <w:t>The programme of work is phased: Phase 1 defines terminology, governance, roles and responsibilities; Phase 2 assesses existing doctrine, products, delivery and governance; Phase 3 designs the framework, its delivery system and outcomes; Phase 4 validates the framework with key stakeholders and conducts bounded pilots; and Phase 5 delivers the framework for approval and implementation. Final recommendations and an implementation back brief will return to COMDT ACS in November 2026.</w:t>
       </w:r>
     </w:p>
     <w:p>
@@ -746,7 +746,7 @@
         </w:pBdr>
         <w:rPr/>
       </w:pPr>
-      <w:bookmarkStart w:id="2" w:name="__RefHeading___Toc389_4017517749"/>
+      <w:bookmarkStart w:id="2" w:name="__RefHeading___Toc389_1167437784"/>
       <w:bookmarkEnd w:id="2"/>
       <w:r>
         <w:rPr>
@@ -854,7 +854,7 @@
         </w:pBdr>
         <w:rPr/>
       </w:pPr>
-      <w:bookmarkStart w:id="3" w:name="__RefHeading___Toc391_4017517749"/>
+      <w:bookmarkStart w:id="3" w:name="__RefHeading___Toc391_1167437784"/>
       <w:bookmarkEnd w:id="3"/>
       <w:r>
         <w:rPr>
@@ -1412,7 +1412,7 @@
         </w:pBdr>
         <w:rPr/>
       </w:pPr>
-      <w:bookmarkStart w:id="4" w:name="__RefHeading___Toc393_4017517749"/>
+      <w:bookmarkStart w:id="4" w:name="__RefHeading___Toc393_1167437784"/>
       <w:bookmarkEnd w:id="4"/>
       <w:r>
         <w:rPr>
@@ -1578,7 +1578,7 @@
         </w:pBdr>
         <w:rPr/>
       </w:pPr>
-      <w:bookmarkStart w:id="5" w:name="__RefHeading___Toc395_4017517749"/>
+      <w:bookmarkStart w:id="5" w:name="__RefHeading___Toc395_1167437784"/>
       <w:bookmarkEnd w:id="5"/>
       <w:r>
         <w:rPr>
@@ -2460,7 +2460,7 @@
         </w:pBdr>
         <w:rPr/>
       </w:pPr>
-      <w:bookmarkStart w:id="6" w:name="__RefHeading___Toc397_4017517749"/>
+      <w:bookmarkStart w:id="6" w:name="__RefHeading___Toc397_1167437784"/>
       <w:bookmarkEnd w:id="6"/>
       <w:r>
         <w:rPr>
@@ -2760,7 +2760,7 @@
         </w:pBdr>
         <w:rPr/>
       </w:pPr>
-      <w:bookmarkStart w:id="7" w:name="__RefHeading___Toc399_4017517749"/>
+      <w:bookmarkStart w:id="7" w:name="__RefHeading___Toc399_1167437784"/>
       <w:bookmarkEnd w:id="7"/>
       <w:r>
         <w:rPr>
@@ -3062,7 +3062,7 @@
         <w:spacing w:before="0" w:after="160"/>
         <w:rPr/>
       </w:pPr>
-      <w:bookmarkStart w:id="8" w:name="__RefHeading___Toc401_4017517749"/>
+      <w:bookmarkStart w:id="8" w:name="__RefHeading___Toc401_1167437784"/>
       <w:bookmarkEnd w:id="8"/>
       <w:r>
         <w:rPr>
@@ -3219,7 +3219,7 @@
         </w:pBdr>
         <w:rPr/>
       </w:pPr>
-      <w:bookmarkStart w:id="9" w:name="__RefHeading___Toc403_4017517749"/>
+      <w:bookmarkStart w:id="9" w:name="__RefHeading___Toc403_1167437784"/>
       <w:bookmarkEnd w:id="9"/>
       <w:r>
         <w:rPr>

</xml_diff>

<commit_message>
Set the November return date on its own line in the Purpose
Final recommendations and the implementation back brief now stand as a
separate closing paragraph rather than trailing the phase summary.

Co-Authored-By: Claude Fable 5 <noreply@anthropic.com>
Claude-Session: https://claude.ai/code/session_01YLo1WfwUDkbwfJEF3ZNVbB
</commit_message>
<xml_diff>
--- a/output/combat-mindset-way-forward.docx
+++ b/output/combat-mindset-way-forward.docx
@@ -304,7 +304,7 @@
             </w:rPr>
             <w:fldChar w:fldCharType="separate"/>
           </w:r>
-          <w:hyperlink w:anchor="__RefHeading___Toc385_1167437784">
+          <w:hyperlink w:anchor="__RefHeading___Toc386_1911398084">
             <w:r>
               <w:rPr>
                 <w:webHidden/>
@@ -331,7 +331,7 @@
             </w:tabs>
             <w:rPr/>
           </w:pPr>
-          <w:hyperlink w:anchor="__RefHeading___Toc387_1167437784">
+          <w:hyperlink w:anchor="__RefHeading___Toc388_1911398084">
             <w:r>
               <w:rPr>
                 <w:webHidden/>
@@ -358,7 +358,7 @@
             </w:tabs>
             <w:rPr/>
           </w:pPr>
-          <w:hyperlink w:anchor="__RefHeading___Toc389_1167437784">
+          <w:hyperlink w:anchor="__RefHeading___Toc390_1911398084">
             <w:r>
               <w:rPr>
                 <w:webHidden/>
@@ -385,7 +385,7 @@
             </w:tabs>
             <w:rPr/>
           </w:pPr>
-          <w:hyperlink w:anchor="__RefHeading___Toc391_1167437784">
+          <w:hyperlink w:anchor="__RefHeading___Toc392_1911398084">
             <w:r>
               <w:rPr>
                 <w:webHidden/>
@@ -412,7 +412,7 @@
             </w:tabs>
             <w:rPr/>
           </w:pPr>
-          <w:hyperlink w:anchor="__RefHeading___Toc393_1167437784">
+          <w:hyperlink w:anchor="__RefHeading___Toc394_1911398084">
             <w:r>
               <w:rPr>
                 <w:webHidden/>
@@ -439,7 +439,7 @@
             </w:tabs>
             <w:rPr/>
           </w:pPr>
-          <w:hyperlink w:anchor="__RefHeading___Toc395_1167437784">
+          <w:hyperlink w:anchor="__RefHeading___Toc396_1911398084">
             <w:r>
               <w:rPr>
                 <w:webHidden/>
@@ -466,7 +466,7 @@
             </w:tabs>
             <w:rPr/>
           </w:pPr>
-          <w:hyperlink w:anchor="__RefHeading___Toc397_1167437784">
+          <w:hyperlink w:anchor="__RefHeading___Toc398_1911398084">
             <w:r>
               <w:rPr>
                 <w:webHidden/>
@@ -493,7 +493,7 @@
             </w:tabs>
             <w:rPr/>
           </w:pPr>
-          <w:hyperlink w:anchor="__RefHeading___Toc399_1167437784">
+          <w:hyperlink w:anchor="__RefHeading___Toc400_1911398084">
             <w:r>
               <w:rPr>
                 <w:webHidden/>
@@ -520,7 +520,7 @@
             </w:tabs>
             <w:rPr/>
           </w:pPr>
-          <w:hyperlink w:anchor="__RefHeading___Toc401_1167437784">
+          <w:hyperlink w:anchor="__RefHeading___Toc402_1911398084">
             <w:r>
               <w:rPr>
                 <w:webHidden/>
@@ -547,7 +547,7 @@
             </w:tabs>
             <w:rPr/>
           </w:pPr>
-          <w:hyperlink w:anchor="__RefHeading___Toc403_1167437784">
+          <w:hyperlink w:anchor="__RefHeading___Toc404_1911398084">
             <w:r>
               <w:rPr>
                 <w:webHidden/>
@@ -602,7 +602,7 @@
         <w:spacing w:before="0" w:after="160"/>
         <w:rPr/>
       </w:pPr>
-      <w:bookmarkStart w:id="0" w:name="__RefHeading___Toc385_1167437784"/>
+      <w:bookmarkStart w:id="0" w:name="__RefHeading___Toc386_1911398084"/>
       <w:bookmarkEnd w:id="0"/>
       <w:r>
         <w:rPr>
@@ -684,7 +684,7 @@
         </w:pBdr>
         <w:rPr/>
       </w:pPr>
-      <w:bookmarkStart w:id="1" w:name="__RefHeading___Toc387_1167437784"/>
+      <w:bookmarkStart w:id="1" w:name="__RefHeading___Toc388_1911398084"/>
       <w:bookmarkEnd w:id="1"/>
       <w:r>
         <w:rPr>
@@ -722,7 +722,21 @@
           <w:b w:val="false"/>
           <w:i w:val="false"/>
         </w:rPr>
-        <w:t>The programme of work is phased: Phase 1 defines terminology, governance, roles and responsibilities; Phase 2 assesses existing doctrine, products, delivery and governance; Phase 3 designs the framework, its delivery system and outcomes; Phase 4 validates the framework with key stakeholders and conducts bounded pilots; and Phase 5 delivers the framework for approval and implementation. Final recommendations and an implementation back brief will return to COMDT ACS in November 2026.</w:t>
+        <w:t>The programme of work is phased: Phase 1 defines terminology, governance, roles and responsibilities; Phase 2 assesses existing doctrine, products, delivery and governance; Phase 3 designs the framework, its delivery system and outcomes; Phase 4 validates the framework with key stakeholders and conducts bounded pilots; and Phase 5 delivers the framework for approval and implementation.</w:t>
+      </w:r>
+    </w:p>
+    <w:p>
+      <w:pPr>
+        <w:pStyle w:val="Normal"/>
+        <w:rPr/>
+      </w:pPr>
+      <w:r>
+        <w:rPr>
+          <w:rFonts w:cs="Book Antiqua"/>
+          <w:b w:val="false"/>
+          <w:i w:val="false"/>
+        </w:rPr>
+        <w:t>Final recommendations and an implementation back brief will return to COMDT ACS in November 2026.</w:t>
       </w:r>
     </w:p>
     <w:p>
@@ -746,7 +760,7 @@
         </w:pBdr>
         <w:rPr/>
       </w:pPr>
-      <w:bookmarkStart w:id="2" w:name="__RefHeading___Toc389_1167437784"/>
+      <w:bookmarkStart w:id="2" w:name="__RefHeading___Toc390_1911398084"/>
       <w:bookmarkEnd w:id="2"/>
       <w:r>
         <w:rPr>
@@ -854,7 +868,7 @@
         </w:pBdr>
         <w:rPr/>
       </w:pPr>
-      <w:bookmarkStart w:id="3" w:name="__RefHeading___Toc391_1167437784"/>
+      <w:bookmarkStart w:id="3" w:name="__RefHeading___Toc392_1911398084"/>
       <w:bookmarkEnd w:id="3"/>
       <w:r>
         <w:rPr>
@@ -1412,7 +1426,7 @@
         </w:pBdr>
         <w:rPr/>
       </w:pPr>
-      <w:bookmarkStart w:id="4" w:name="__RefHeading___Toc393_1167437784"/>
+      <w:bookmarkStart w:id="4" w:name="__RefHeading___Toc394_1911398084"/>
       <w:bookmarkEnd w:id="4"/>
       <w:r>
         <w:rPr>
@@ -1578,7 +1592,7 @@
         </w:pBdr>
         <w:rPr/>
       </w:pPr>
-      <w:bookmarkStart w:id="5" w:name="__RefHeading___Toc395_1167437784"/>
+      <w:bookmarkStart w:id="5" w:name="__RefHeading___Toc396_1911398084"/>
       <w:bookmarkEnd w:id="5"/>
       <w:r>
         <w:rPr>
@@ -2460,7 +2474,7 @@
         </w:pBdr>
         <w:rPr/>
       </w:pPr>
-      <w:bookmarkStart w:id="6" w:name="__RefHeading___Toc397_1167437784"/>
+      <w:bookmarkStart w:id="6" w:name="__RefHeading___Toc398_1911398084"/>
       <w:bookmarkEnd w:id="6"/>
       <w:r>
         <w:rPr>
@@ -2760,7 +2774,7 @@
         </w:pBdr>
         <w:rPr/>
       </w:pPr>
-      <w:bookmarkStart w:id="7" w:name="__RefHeading___Toc399_1167437784"/>
+      <w:bookmarkStart w:id="7" w:name="__RefHeading___Toc400_1911398084"/>
       <w:bookmarkEnd w:id="7"/>
       <w:r>
         <w:rPr>
@@ -3062,7 +3076,7 @@
         <w:spacing w:before="0" w:after="160"/>
         <w:rPr/>
       </w:pPr>
-      <w:bookmarkStart w:id="8" w:name="__RefHeading___Toc401_1167437784"/>
+      <w:bookmarkStart w:id="8" w:name="__RefHeading___Toc402_1911398084"/>
       <w:bookmarkEnd w:id="8"/>
       <w:r>
         <w:rPr>
@@ -3219,7 +3233,7 @@
         </w:pBdr>
         <w:rPr/>
       </w:pPr>
-      <w:bookmarkStart w:id="9" w:name="__RefHeading___Toc403_1167437784"/>
+      <w:bookmarkStart w:id="9" w:name="__RefHeading___Toc404_1911398084"/>
       <w:bookmarkEnd w:id="9"/>
       <w:r>
         <w:rPr>

</xml_diff>

<commit_message>
Sharpen the problem statement
Removes the NZDF Psychology attribution and the endorsement clause from
the opening, and the "Army-wide" and Warfighter Focus qualifiers from
the gap statement, leaving two plain assertions. The closing sentence no
longer claims governance can begin immediately: sufficient evidence and
existing capability are available to commence the programme of work in
order to achieve the end state.

Co-Authored-By: Claude Fable 5 <noreply@anthropic.com>
Claude-Session: https://claude.ai/code/session_01YLo1WfwUDkbwfJEF3ZNVbB
</commit_message>
<xml_diff>
--- a/output/combat-mindset-way-forward.docx
+++ b/output/combat-mindset-way-forward.docx
@@ -304,7 +304,7 @@
             </w:rPr>
             <w:fldChar w:fldCharType="separate"/>
           </w:r>
-          <w:hyperlink w:anchor="__RefHeading___Toc386_1911398084">
+          <w:hyperlink w:anchor="__RefHeading___Toc386_3799086776">
             <w:r>
               <w:rPr>
                 <w:webHidden/>
@@ -331,7 +331,7 @@
             </w:tabs>
             <w:rPr/>
           </w:pPr>
-          <w:hyperlink w:anchor="__RefHeading___Toc388_1911398084">
+          <w:hyperlink w:anchor="__RefHeading___Toc388_3799086776">
             <w:r>
               <w:rPr>
                 <w:webHidden/>
@@ -358,7 +358,7 @@
             </w:tabs>
             <w:rPr/>
           </w:pPr>
-          <w:hyperlink w:anchor="__RefHeading___Toc390_1911398084">
+          <w:hyperlink w:anchor="__RefHeading___Toc390_3799086776">
             <w:r>
               <w:rPr>
                 <w:webHidden/>
@@ -385,7 +385,7 @@
             </w:tabs>
             <w:rPr/>
           </w:pPr>
-          <w:hyperlink w:anchor="__RefHeading___Toc392_1911398084">
+          <w:hyperlink w:anchor="__RefHeading___Toc392_3799086776">
             <w:r>
               <w:rPr>
                 <w:webHidden/>
@@ -412,7 +412,7 @@
             </w:tabs>
             <w:rPr/>
           </w:pPr>
-          <w:hyperlink w:anchor="__RefHeading___Toc394_1911398084">
+          <w:hyperlink w:anchor="__RefHeading___Toc394_3799086776">
             <w:r>
               <w:rPr>
                 <w:webHidden/>
@@ -439,7 +439,7 @@
             </w:tabs>
             <w:rPr/>
           </w:pPr>
-          <w:hyperlink w:anchor="__RefHeading___Toc396_1911398084">
+          <w:hyperlink w:anchor="__RefHeading___Toc396_3799086776">
             <w:r>
               <w:rPr>
                 <w:webHidden/>
@@ -466,7 +466,7 @@
             </w:tabs>
             <w:rPr/>
           </w:pPr>
-          <w:hyperlink w:anchor="__RefHeading___Toc398_1911398084">
+          <w:hyperlink w:anchor="__RefHeading___Toc398_3799086776">
             <w:r>
               <w:rPr>
                 <w:webHidden/>
@@ -493,7 +493,7 @@
             </w:tabs>
             <w:rPr/>
           </w:pPr>
-          <w:hyperlink w:anchor="__RefHeading___Toc400_1911398084">
+          <w:hyperlink w:anchor="__RefHeading___Toc400_3799086776">
             <w:r>
               <w:rPr>
                 <w:webHidden/>
@@ -520,7 +520,7 @@
             </w:tabs>
             <w:rPr/>
           </w:pPr>
-          <w:hyperlink w:anchor="__RefHeading___Toc402_1911398084">
+          <w:hyperlink w:anchor="__RefHeading___Toc402_3799086776">
             <w:r>
               <w:rPr>
                 <w:webHidden/>
@@ -547,7 +547,7 @@
             </w:tabs>
             <w:rPr/>
           </w:pPr>
-          <w:hyperlink w:anchor="__RefHeading___Toc404_1911398084">
+          <w:hyperlink w:anchor="__RefHeading___Toc404_3799086776">
             <w:r>
               <w:rPr>
                 <w:webHidden/>
@@ -602,7 +602,7 @@
         <w:spacing w:before="0" w:after="160"/>
         <w:rPr/>
       </w:pPr>
-      <w:bookmarkStart w:id="0" w:name="__RefHeading___Toc386_1911398084"/>
+      <w:bookmarkStart w:id="0" w:name="__RefHeading___Toc386_3799086776"/>
       <w:bookmarkEnd w:id="0"/>
       <w:r>
         <w:rPr>
@@ -684,7 +684,7 @@
         </w:pBdr>
         <w:rPr/>
       </w:pPr>
-      <w:bookmarkStart w:id="1" w:name="__RefHeading___Toc388_1911398084"/>
+      <w:bookmarkStart w:id="1" w:name="__RefHeading___Toc388_3799086776"/>
       <w:bookmarkEnd w:id="1"/>
       <w:r>
         <w:rPr>
@@ -760,7 +760,7 @@
         </w:pBdr>
         <w:rPr/>
       </w:pPr>
-      <w:bookmarkStart w:id="2" w:name="__RefHeading___Toc390_1911398084"/>
+      <w:bookmarkStart w:id="2" w:name="__RefHeading___Toc390_3799086776"/>
       <w:bookmarkEnd w:id="2"/>
       <w:r>
         <w:rPr>
@@ -784,7 +784,7 @@
           <w:b w:val="false"/>
           <w:i w:val="false"/>
         </w:rPr>
-        <w:t>Considerable work on Combat Mindset and Performance Under Pressure already exists across Army (notably by NZDF Psychology) and elements of it have been endorsed in various settings. What Army does not yet have is a coherent, Army-wide doctrine, governance and assurance model for Combat Mindset, despite the term's active use and Army's drive toward an increased Warfighter Focus. The COMDT ACS guidance reaches the same diagnosis:</w:t>
+        <w:t>Considerable work on Combat Mindset and Performance Under Pressure already exists across Army. What Army does not yet have is a coherent doctrine, governance and assurance model for Combat Mindset. The COMDT ACS guidance reaches the same diagnosis:</w:t>
       </w:r>
     </w:p>
     <w:p>
@@ -844,7 +844,7 @@
           <w:b w:val="false"/>
           <w:i w:val="false"/>
         </w:rPr>
-        <w:t>The doctrinal requirement is therefore to define the human-performance capability Army requires, consolidate the substantial body of work that already exists beneath it, and describe its combat-specific expression. Sufficient evidence and existing capability are available to commence governance, the capability assessment and framework development immediately.</w:t>
+        <w:t>The doctrinal requirement is therefore to define the human-performance capability Army requires, consolidate the substantial body of work that already exists beneath it, and describe its combat-specific expression. Sufficient evidence and existing capability are available to commence this programme of work in order to achieve that end state.</w:t>
       </w:r>
     </w:p>
     <w:p>
@@ -868,7 +868,7 @@
         </w:pBdr>
         <w:rPr/>
       </w:pPr>
-      <w:bookmarkStart w:id="3" w:name="__RefHeading___Toc392_1911398084"/>
+      <w:bookmarkStart w:id="3" w:name="__RefHeading___Toc392_3799086776"/>
       <w:bookmarkEnd w:id="3"/>
       <w:r>
         <w:rPr>
@@ -1426,7 +1426,7 @@
         </w:pBdr>
         <w:rPr/>
       </w:pPr>
-      <w:bookmarkStart w:id="4" w:name="__RefHeading___Toc394_1911398084"/>
+      <w:bookmarkStart w:id="4" w:name="__RefHeading___Toc394_3799086776"/>
       <w:bookmarkEnd w:id="4"/>
       <w:r>
         <w:rPr>
@@ -1592,7 +1592,7 @@
         </w:pBdr>
         <w:rPr/>
       </w:pPr>
-      <w:bookmarkStart w:id="5" w:name="__RefHeading___Toc396_1911398084"/>
+      <w:bookmarkStart w:id="5" w:name="__RefHeading___Toc396_3799086776"/>
       <w:bookmarkEnd w:id="5"/>
       <w:r>
         <w:rPr>
@@ -2474,7 +2474,7 @@
         </w:pBdr>
         <w:rPr/>
       </w:pPr>
-      <w:bookmarkStart w:id="6" w:name="__RefHeading___Toc398_1911398084"/>
+      <w:bookmarkStart w:id="6" w:name="__RefHeading___Toc398_3799086776"/>
       <w:bookmarkEnd w:id="6"/>
       <w:r>
         <w:rPr>
@@ -2774,7 +2774,7 @@
         </w:pBdr>
         <w:rPr/>
       </w:pPr>
-      <w:bookmarkStart w:id="7" w:name="__RefHeading___Toc400_1911398084"/>
+      <w:bookmarkStart w:id="7" w:name="__RefHeading___Toc400_3799086776"/>
       <w:bookmarkEnd w:id="7"/>
       <w:r>
         <w:rPr>
@@ -3076,7 +3076,7 @@
         <w:spacing w:before="0" w:after="160"/>
         <w:rPr/>
       </w:pPr>
-      <w:bookmarkStart w:id="8" w:name="__RefHeading___Toc402_1911398084"/>
+      <w:bookmarkStart w:id="8" w:name="__RefHeading___Toc402_3799086776"/>
       <w:bookmarkEnd w:id="8"/>
       <w:r>
         <w:rPr>
@@ -3233,7 +3233,7 @@
         </w:pBdr>
         <w:rPr/>
       </w:pPr>
-      <w:bookmarkStart w:id="9" w:name="__RefHeading___Toc404_1911398084"/>
+      <w:bookmarkStart w:id="9" w:name="__RefHeading___Toc404_3799086776"/>
       <w:bookmarkEnd w:id="9"/>
       <w:r>
         <w:rPr>

</xml_diff>

<commit_message>
Plain heading and display styling for terminology and definitions
Drops "decision sought" from the section 2 heading, since decisions are
consolidated in the recommendations. The coloured callout under Option 1
becomes indented italic display text, matching the formal definitions
above it.

Co-Authored-By: Claude Fable 5 <noreply@anthropic.com>
Claude-Session: https://claude.ai/code/session_01YLo1WfwUDkbwfJEF3ZNVbB
</commit_message>
<xml_diff>
--- a/output/combat-mindset-way-forward.docx
+++ b/output/combat-mindset-way-forward.docx
@@ -304,7 +304,7 @@
             </w:rPr>
             <w:fldChar w:fldCharType="separate"/>
           </w:r>
-          <w:hyperlink w:anchor="__RefHeading___Toc386_3799086776">
+          <w:hyperlink w:anchor="__RefHeading___Toc386_2624487905">
             <w:r>
               <w:rPr>
                 <w:webHidden/>
@@ -331,7 +331,7 @@
             </w:tabs>
             <w:rPr/>
           </w:pPr>
-          <w:hyperlink w:anchor="__RefHeading___Toc388_3799086776">
+          <w:hyperlink w:anchor="__RefHeading___Toc388_2624487905">
             <w:r>
               <w:rPr>
                 <w:webHidden/>
@@ -358,7 +358,7 @@
             </w:tabs>
             <w:rPr/>
           </w:pPr>
-          <w:hyperlink w:anchor="__RefHeading___Toc390_3799086776">
+          <w:hyperlink w:anchor="__RefHeading___Toc390_2624487905">
             <w:r>
               <w:rPr>
                 <w:webHidden/>
@@ -385,14 +385,14 @@
             </w:tabs>
             <w:rPr/>
           </w:pPr>
-          <w:hyperlink w:anchor="__RefHeading___Toc392_3799086776">
+          <w:hyperlink w:anchor="__RefHeading___Toc392_2624487905">
             <w:r>
               <w:rPr>
                 <w:webHidden/>
                 <w:rStyle w:val="IndexLink"/>
                 <w:i w:val="false"/>
               </w:rPr>
-              <w:t>2. Terminology and definitions: decision sought</w:t>
+              <w:t>2. Terminology and definitions</w:t>
             </w:r>
             <w:r>
               <w:rPr>
@@ -412,7 +412,7 @@
             </w:tabs>
             <w:rPr/>
           </w:pPr>
-          <w:hyperlink w:anchor="__RefHeading___Toc394_3799086776">
+          <w:hyperlink w:anchor="__RefHeading___Toc394_2624487905">
             <w:r>
               <w:rPr>
                 <w:webHidden/>
@@ -439,7 +439,7 @@
             </w:tabs>
             <w:rPr/>
           </w:pPr>
-          <w:hyperlink w:anchor="__RefHeading___Toc396_3799086776">
+          <w:hyperlink w:anchor="__RefHeading___Toc396_2624487905">
             <w:r>
               <w:rPr>
                 <w:webHidden/>
@@ -466,7 +466,7 @@
             </w:tabs>
             <w:rPr/>
           </w:pPr>
-          <w:hyperlink w:anchor="__RefHeading___Toc398_3799086776">
+          <w:hyperlink w:anchor="__RefHeading___Toc398_2624487905">
             <w:r>
               <w:rPr>
                 <w:webHidden/>
@@ -493,7 +493,7 @@
             </w:tabs>
             <w:rPr/>
           </w:pPr>
-          <w:hyperlink w:anchor="__RefHeading___Toc400_3799086776">
+          <w:hyperlink w:anchor="__RefHeading___Toc400_2624487905">
             <w:r>
               <w:rPr>
                 <w:webHidden/>
@@ -520,7 +520,7 @@
             </w:tabs>
             <w:rPr/>
           </w:pPr>
-          <w:hyperlink w:anchor="__RefHeading___Toc402_3799086776">
+          <w:hyperlink w:anchor="__RefHeading___Toc402_2624487905">
             <w:r>
               <w:rPr>
                 <w:webHidden/>
@@ -547,7 +547,7 @@
             </w:tabs>
             <w:rPr/>
           </w:pPr>
-          <w:hyperlink w:anchor="__RefHeading___Toc404_3799086776">
+          <w:hyperlink w:anchor="__RefHeading___Toc404_2624487905">
             <w:r>
               <w:rPr>
                 <w:webHidden/>
@@ -602,7 +602,7 @@
         <w:spacing w:before="0" w:after="160"/>
         <w:rPr/>
       </w:pPr>
-      <w:bookmarkStart w:id="0" w:name="__RefHeading___Toc386_3799086776"/>
+      <w:bookmarkStart w:id="0" w:name="__RefHeading___Toc386_2624487905"/>
       <w:bookmarkEnd w:id="0"/>
       <w:r>
         <w:rPr>
@@ -684,7 +684,7 @@
         </w:pBdr>
         <w:rPr/>
       </w:pPr>
-      <w:bookmarkStart w:id="1" w:name="__RefHeading___Toc388_3799086776"/>
+      <w:bookmarkStart w:id="1" w:name="__RefHeading___Toc388_2624487905"/>
       <w:bookmarkEnd w:id="1"/>
       <w:r>
         <w:rPr>
@@ -760,7 +760,7 @@
         </w:pBdr>
         <w:rPr/>
       </w:pPr>
-      <w:bookmarkStart w:id="2" w:name="__RefHeading___Toc390_3799086776"/>
+      <w:bookmarkStart w:id="2" w:name="__RefHeading___Toc390_2624487905"/>
       <w:bookmarkEnd w:id="2"/>
       <w:r>
         <w:rPr>
@@ -868,7 +868,7 @@
         </w:pBdr>
         <w:rPr/>
       </w:pPr>
-      <w:bookmarkStart w:id="3" w:name="__RefHeading___Toc392_3799086776"/>
+      <w:bookmarkStart w:id="3" w:name="__RefHeading___Toc392_2624487905"/>
       <w:bookmarkEnd w:id="3"/>
       <w:r>
         <w:rPr>
@@ -878,7 +878,7 @@
           <w:color w:val="002516"/>
           <w:sz w:val="28"/>
         </w:rPr>
-        <w:t>2. Terminology and definitions: decision sought</w:t>
+        <w:t>2. Terminology and definitions</w:t>
       </w:r>
     </w:p>
     <w:p>
@@ -1056,19 +1056,15 @@
     <w:p>
       <w:pPr>
         <w:pStyle w:val="Normal"/>
-        <w:pBdr>
-          <w:left w:val="single" w:sz="28" w:space="8" w:color="C62026"/>
-        </w:pBdr>
-        <w:shd w:val="clear" w:color="auto" w:fill="CDD2B7"/>
-        <w:spacing w:before="200" w:after="200"/>
-        <w:ind w:left="340" w:right="340"/>
-        <w:rPr/>
-      </w:pPr>
-      <w:r>
-        <w:rPr>
-          <w:rFonts w:cs="Book Antiqua"/>
-          <w:b/>
-          <w:i w:val="false"/>
+        <w:spacing w:before="120" w:after="160"/>
+        <w:ind w:left="567" w:right="567"/>
+        <w:rPr/>
+      </w:pPr>
+      <w:r>
+        <w:rPr>
+          <w:rFonts w:cs="Book Antiqua"/>
+          <w:b w:val="false"/>
+          <w:i/>
         </w:rPr>
         <w:t>Performance Under Pressure describes the trainable human-performance capability. Combat Mindset describes the specifically combat-oriented expression of that capability.</w:t>
       </w:r>
@@ -1426,7 +1422,7 @@
         </w:pBdr>
         <w:rPr/>
       </w:pPr>
-      <w:bookmarkStart w:id="4" w:name="__RefHeading___Toc394_3799086776"/>
+      <w:bookmarkStart w:id="4" w:name="__RefHeading___Toc394_2624487905"/>
       <w:bookmarkEnd w:id="4"/>
       <w:r>
         <w:rPr>
@@ -1592,7 +1588,7 @@
         </w:pBdr>
         <w:rPr/>
       </w:pPr>
-      <w:bookmarkStart w:id="5" w:name="__RefHeading___Toc396_3799086776"/>
+      <w:bookmarkStart w:id="5" w:name="__RefHeading___Toc396_2624487905"/>
       <w:bookmarkEnd w:id="5"/>
       <w:r>
         <w:rPr>
@@ -2474,7 +2470,7 @@
         </w:pBdr>
         <w:rPr/>
       </w:pPr>
-      <w:bookmarkStart w:id="6" w:name="__RefHeading___Toc398_3799086776"/>
+      <w:bookmarkStart w:id="6" w:name="__RefHeading___Toc398_2624487905"/>
       <w:bookmarkEnd w:id="6"/>
       <w:r>
         <w:rPr>
@@ -2774,7 +2770,7 @@
         </w:pBdr>
         <w:rPr/>
       </w:pPr>
-      <w:bookmarkStart w:id="7" w:name="__RefHeading___Toc400_3799086776"/>
+      <w:bookmarkStart w:id="7" w:name="__RefHeading___Toc400_2624487905"/>
       <w:bookmarkEnd w:id="7"/>
       <w:r>
         <w:rPr>
@@ -3076,7 +3072,7 @@
         <w:spacing w:before="0" w:after="160"/>
         <w:rPr/>
       </w:pPr>
-      <w:bookmarkStart w:id="8" w:name="__RefHeading___Toc402_3799086776"/>
+      <w:bookmarkStart w:id="8" w:name="__RefHeading___Toc402_2624487905"/>
       <w:bookmarkEnd w:id="8"/>
       <w:r>
         <w:rPr>
@@ -3233,7 +3229,7 @@
         </w:pBdr>
         <w:rPr/>
       </w:pPr>
-      <w:bookmarkStart w:id="9" w:name="__RefHeading___Toc404_3799086776"/>
+      <w:bookmarkStart w:id="9" w:name="__RefHeading___Toc404_2624487905"/>
       <w:bookmarkEnd w:id="9"/>
       <w:r>
         <w:rPr>

</xml_diff>

<commit_message>
Split what already exists into within and outside ACS
Groups holdings under Within ACS (NZALC Leadership Development System,
HPC Cognitive Conditioning) and Outside ACS (Army Psychology Services,
ILD and other stakeholders). Removes the allied armies paragraph and
moves the Phase 2 assessment caveat from the opening to the close of the
section. Adds a fourth heading level to the builder for the product
names beneath each grouping.

Co-Authored-By: Claude Fable 5 <noreply@anthropic.com>
Claude-Session: https://claude.ai/code/session_01YLo1WfwUDkbwfJEF3ZNVbB
</commit_message>
<xml_diff>
--- a/output/combat-mindset-way-forward.docx
+++ b/output/combat-mindset-way-forward.docx
@@ -304,7 +304,7 @@
             </w:rPr>
             <w:fldChar w:fldCharType="separate"/>
           </w:r>
-          <w:hyperlink w:anchor="__RefHeading___Toc386_2624487905">
+          <w:hyperlink w:anchor="__RefHeading___Toc387_1870298719">
             <w:r>
               <w:rPr>
                 <w:webHidden/>
@@ -331,7 +331,7 @@
             </w:tabs>
             <w:rPr/>
           </w:pPr>
-          <w:hyperlink w:anchor="__RefHeading___Toc388_2624487905">
+          <w:hyperlink w:anchor="__RefHeading___Toc389_1870298719">
             <w:r>
               <w:rPr>
                 <w:webHidden/>
@@ -358,7 +358,7 @@
             </w:tabs>
             <w:rPr/>
           </w:pPr>
-          <w:hyperlink w:anchor="__RefHeading___Toc390_2624487905">
+          <w:hyperlink w:anchor="__RefHeading___Toc391_1870298719">
             <w:r>
               <w:rPr>
                 <w:webHidden/>
@@ -385,7 +385,7 @@
             </w:tabs>
             <w:rPr/>
           </w:pPr>
-          <w:hyperlink w:anchor="__RefHeading___Toc392_2624487905">
+          <w:hyperlink w:anchor="__RefHeading___Toc393_1870298719">
             <w:r>
               <w:rPr>
                 <w:webHidden/>
@@ -412,7 +412,7 @@
             </w:tabs>
             <w:rPr/>
           </w:pPr>
-          <w:hyperlink w:anchor="__RefHeading___Toc394_2624487905">
+          <w:hyperlink w:anchor="__RefHeading___Toc395_1870298719">
             <w:r>
               <w:rPr>
                 <w:webHidden/>
@@ -439,7 +439,7 @@
             </w:tabs>
             <w:rPr/>
           </w:pPr>
-          <w:hyperlink w:anchor="__RefHeading___Toc396_2624487905">
+          <w:hyperlink w:anchor="__RefHeading___Toc397_1870298719">
             <w:r>
               <w:rPr>
                 <w:webHidden/>
@@ -466,7 +466,7 @@
             </w:tabs>
             <w:rPr/>
           </w:pPr>
-          <w:hyperlink w:anchor="__RefHeading___Toc398_2624487905">
+          <w:hyperlink w:anchor="__RefHeading___Toc399_1870298719">
             <w:r>
               <w:rPr>
                 <w:webHidden/>
@@ -493,7 +493,7 @@
             </w:tabs>
             <w:rPr/>
           </w:pPr>
-          <w:hyperlink w:anchor="__RefHeading___Toc400_2624487905">
+          <w:hyperlink w:anchor="__RefHeading___Toc401_1870298719">
             <w:r>
               <w:rPr>
                 <w:webHidden/>
@@ -520,7 +520,7 @@
             </w:tabs>
             <w:rPr/>
           </w:pPr>
-          <w:hyperlink w:anchor="__RefHeading___Toc402_2624487905">
+          <w:hyperlink w:anchor="__RefHeading___Toc403_1870298719">
             <w:r>
               <w:rPr>
                 <w:webHidden/>
@@ -547,7 +547,7 @@
             </w:tabs>
             <w:rPr/>
           </w:pPr>
-          <w:hyperlink w:anchor="__RefHeading___Toc404_2624487905">
+          <w:hyperlink w:anchor="__RefHeading___Toc405_1870298719">
             <w:r>
               <w:rPr>
                 <w:webHidden/>
@@ -602,7 +602,7 @@
         <w:spacing w:before="0" w:after="160"/>
         <w:rPr/>
       </w:pPr>
-      <w:bookmarkStart w:id="0" w:name="__RefHeading___Toc386_2624487905"/>
+      <w:bookmarkStart w:id="0" w:name="__RefHeading___Toc387_1870298719"/>
       <w:bookmarkEnd w:id="0"/>
       <w:r>
         <w:rPr>
@@ -684,7 +684,7 @@
         </w:pBdr>
         <w:rPr/>
       </w:pPr>
-      <w:bookmarkStart w:id="1" w:name="__RefHeading___Toc388_2624487905"/>
+      <w:bookmarkStart w:id="1" w:name="__RefHeading___Toc389_1870298719"/>
       <w:bookmarkEnd w:id="1"/>
       <w:r>
         <w:rPr>
@@ -760,7 +760,7 @@
         </w:pBdr>
         <w:rPr/>
       </w:pPr>
-      <w:bookmarkStart w:id="2" w:name="__RefHeading___Toc390_2624487905"/>
+      <w:bookmarkStart w:id="2" w:name="__RefHeading___Toc391_1870298719"/>
       <w:bookmarkEnd w:id="2"/>
       <w:r>
         <w:rPr>
@@ -868,7 +868,7 @@
         </w:pBdr>
         <w:rPr/>
       </w:pPr>
-      <w:bookmarkStart w:id="3" w:name="__RefHeading___Toc392_2624487905"/>
+      <w:bookmarkStart w:id="3" w:name="__RefHeading___Toc393_1870298719"/>
       <w:bookmarkEnd w:id="3"/>
       <w:r>
         <w:rPr>
@@ -1422,7 +1422,7 @@
         </w:pBdr>
         <w:rPr/>
       </w:pPr>
-      <w:bookmarkStart w:id="4" w:name="__RefHeading___Toc394_2624487905"/>
+      <w:bookmarkStart w:id="4" w:name="__RefHeading___Toc395_1870298719"/>
       <w:bookmarkEnd w:id="4"/>
       <w:r>
         <w:rPr>
@@ -1437,34 +1437,6 @@
     </w:p>
     <w:p>
       <w:pPr>
-        <w:pStyle w:val="Normal"/>
-        <w:rPr/>
-      </w:pPr>
-      <w:r>
-        <w:rPr>
-          <w:rFonts w:cs="Book Antiqua"/>
-          <w:b w:val="false"/>
-          <w:i w:val="false"/>
-        </w:rPr>
-        <w:t>Allied armies have fielded comparable integrated human-performance programmes, including US Army Holistic Health and Fitness [verify], UK Op SMART [verify] and ADF BattleSMART [verify]. The structure proposed in this paper (a single organising framework beneath which existing products are nested and assured) is consistent with that direction.</w:t>
-      </w:r>
-    </w:p>
-    <w:p>
-      <w:pPr>
-        <w:pStyle w:val="Normal"/>
-        <w:rPr/>
-      </w:pPr>
-      <w:r>
-        <w:rPr>
-          <w:rFonts w:cs="Book Antiqua"/>
-          <w:b w:val="false"/>
-          <w:i w:val="false"/>
-        </w:rPr>
-        <w:t>A full assessment of existing capability and products will be completed during Phase 2. The products described below contribute to the development of Performance Under Pressure and, where applied in a warfighting context, to Combat Mindset. They do not constitute the doctrinal definitions or the complete framework in isolation. Initial holdings include the following.</w:t>
-      </w:r>
-    </w:p>
-    <w:p>
-      <w:pPr>
         <w:pStyle w:val="Heading2"/>
         <w:rPr/>
       </w:pPr>
@@ -1476,7 +1448,23 @@
           <w:color w:val="000000"/>
           <w:sz w:val="22"/>
         </w:rPr>
-        <w:t>NZALC Performance Under Pressure package</w:t>
+        <w:t>Within ACS</w:t>
+      </w:r>
+    </w:p>
+    <w:p>
+      <w:pPr>
+        <w:pStyle w:val="Normal"/>
+        <w:rPr/>
+      </w:pPr>
+      <w:r>
+        <w:rPr>
+          <w:rFonts w:cs="Arial" w:ascii="Arial" w:hAnsi="Arial"/>
+          <w:b/>
+          <w:i w:val="false"/>
+          <w:color w:val="002516"/>
+          <w:sz w:val="20"/>
+        </w:rPr>
+        <w:t>NZALC Leadership Development System</w:t>
       </w:r>
     </w:p>
     <w:p>
@@ -1491,6 +1479,36 @@
           <w:i w:val="false"/>
         </w:rPr>
         <w:t>NZALC delivers a leadership-development approach incorporating Performance = Potential – Interference, Red Head–Blue Head, Prepare–Perform–Recover, mental-skills techniques, psychometrics, experiential activity, feedback and Leadership Development Plans. This material is embedded across Lead Self, Lead Teams, Lead Leaders and Lead Systems.</w:t>
+      </w:r>
+    </w:p>
+    <w:p>
+      <w:pPr>
+        <w:pStyle w:val="Normal"/>
+        <w:rPr/>
+      </w:pPr>
+      <w:r>
+        <w:rPr>
+          <w:rFonts w:cs="Arial" w:ascii="Arial" w:hAnsi="Arial"/>
+          <w:b/>
+          <w:i w:val="false"/>
+          <w:color w:val="002516"/>
+          <w:sz w:val="20"/>
+        </w:rPr>
+        <w:t>HPC Cognitive Conditioning (COGCON)</w:t>
+      </w:r>
+    </w:p>
+    <w:p>
+      <w:pPr>
+        <w:pStyle w:val="Normal"/>
+        <w:rPr/>
+      </w:pPr>
+      <w:r>
+        <w:rPr>
+          <w:rFonts w:cs="Book Antiqua"/>
+          <w:b w:val="false"/>
+          <w:i w:val="false"/>
+        </w:rPr>
+        <w:t>COGCON is a developmental cognitive-conditioning product targeting selected aspects of performance cognition under physical and cognitive load, including arousal regulation, attention, cognitive control and working memory. Feasibility trials in military training have demonstrated acceptability and promising training trends. Its causal effectiveness, operational transfer, readiness validity, scalability and enduring delivery model have not yet been established. Its status and appropriate future role will be confirmed through the Phase 2 assessment.</w:t>
       </w:r>
     </w:p>
     <w:p>
@@ -1506,37 +1524,23 @@
           <w:color w:val="000000"/>
           <w:sz w:val="22"/>
         </w:rPr>
-        <w:t>Human Performance Cell Cognitive Conditioning programme (COGCON)</w:t>
-      </w:r>
-    </w:p>
-    <w:p>
-      <w:pPr>
-        <w:pStyle w:val="Normal"/>
-        <w:rPr/>
-      </w:pPr>
-      <w:r>
-        <w:rPr>
-          <w:rFonts w:cs="Book Antiqua"/>
-          <w:b w:val="false"/>
-          <w:i w:val="false"/>
-        </w:rPr>
-        <w:t>COGCON is a developmental cognitive-conditioning product targeting selected aspects of performance cognition under physical and cognitive load, including arousal regulation, attention, cognitive control and working memory. Feasibility trials in military training have demonstrated acceptability and promising training trends. Its causal effectiveness, operational transfer, readiness validity, scalability and enduring delivery model have not yet been established. Its status and appropriate future role will be confirmed through the Phase 2 assessment.</w:t>
-      </w:r>
-    </w:p>
-    <w:p>
-      <w:pPr>
-        <w:pStyle w:val="Heading2"/>
-        <w:rPr/>
-      </w:pPr>
-      <w:r>
-        <w:rPr>
-          <w:rFonts w:cs="Arial" w:ascii="Arial" w:hAnsi="Arial"/>
-          <w:b/>
-          <w:i w:val="false"/>
-          <w:color w:val="000000"/>
-          <w:sz w:val="22"/>
-        </w:rPr>
-        <w:t>NZDF Psychology, ILD and other stakeholders</w:t>
+        <w:t>Outside ACS</w:t>
+      </w:r>
+    </w:p>
+    <w:p>
+      <w:pPr>
+        <w:pStyle w:val="Normal"/>
+        <w:rPr/>
+      </w:pPr>
+      <w:r>
+        <w:rPr>
+          <w:rFonts w:cs="Arial" w:ascii="Arial" w:hAnsi="Arial"/>
+          <w:b/>
+          <w:i w:val="false"/>
+          <w:color w:val="002516"/>
+          <w:sz w:val="20"/>
+        </w:rPr>
+        <w:t>Army Psychology Services, ILD and other stakeholders</w:t>
       </w:r>
     </w:p>
     <w:p>
@@ -1565,6 +1569,20 @@
           <w:i w:val="false"/>
         </w:rPr>
         <w:t>Initial review indicates considerable conceptual alignment across existing products. The Combat Mindset Framework will establish a common doctrinal language beneath which individual products and methods can be appropriately nested. It will not require all products to use identical internal methodologies, provided they align to the endorsed framework, outcomes and assurance requirements.</w:t>
+      </w:r>
+    </w:p>
+    <w:p>
+      <w:pPr>
+        <w:pStyle w:val="Normal"/>
+        <w:rPr/>
+      </w:pPr>
+      <w:r>
+        <w:rPr>
+          <w:rFonts w:cs="Book Antiqua"/>
+          <w:b w:val="false"/>
+          <w:i w:val="false"/>
+        </w:rPr>
+        <w:t>A full assessment of existing capability and products will be completed during Phase 2. The products described above contribute to the development of Performance Under Pressure and, where applied in a warfighting context, to Combat Mindset. They do not constitute the doctrinal definitions or the complete framework in isolation.</w:t>
       </w:r>
     </w:p>
     <w:p>
@@ -1588,7 +1606,7 @@
         </w:pBdr>
         <w:rPr/>
       </w:pPr>
-      <w:bookmarkStart w:id="5" w:name="__RefHeading___Toc396_2624487905"/>
+      <w:bookmarkStart w:id="5" w:name="__RefHeading___Toc397_1870298719"/>
       <w:bookmarkEnd w:id="5"/>
       <w:r>
         <w:rPr>
@@ -2470,7 +2488,7 @@
         </w:pBdr>
         <w:rPr/>
       </w:pPr>
-      <w:bookmarkStart w:id="6" w:name="__RefHeading___Toc398_2624487905"/>
+      <w:bookmarkStart w:id="6" w:name="__RefHeading___Toc399_1870298719"/>
       <w:bookmarkEnd w:id="6"/>
       <w:r>
         <w:rPr>
@@ -2770,7 +2788,7 @@
         </w:pBdr>
         <w:rPr/>
       </w:pPr>
-      <w:bookmarkStart w:id="7" w:name="__RefHeading___Toc400_2624487905"/>
+      <w:bookmarkStart w:id="7" w:name="__RefHeading___Toc401_1870298719"/>
       <w:bookmarkEnd w:id="7"/>
       <w:r>
         <w:rPr>
@@ -3072,7 +3090,7 @@
         <w:spacing w:before="0" w:after="160"/>
         <w:rPr/>
       </w:pPr>
-      <w:bookmarkStart w:id="8" w:name="__RefHeading___Toc402_2624487905"/>
+      <w:bookmarkStart w:id="8" w:name="__RefHeading___Toc403_1870298719"/>
       <w:bookmarkEnd w:id="8"/>
       <w:r>
         <w:rPr>
@@ -3229,7 +3247,7 @@
         </w:pBdr>
         <w:rPr/>
       </w:pPr>
-      <w:bookmarkStart w:id="9" w:name="__RefHeading___Toc404_2624487905"/>
+      <w:bookmarkStart w:id="9" w:name="__RefHeading___Toc405_1870298719"/>
       <w:bookmarkEnd w:id="9"/>
       <w:r>
         <w:rPr>

</xml_diff>

<commit_message>
Adopt Army Psychology Services (APS) and the NZALC Leadership Development System
Aligns terminology across the paper: NZDF Psychology becomes Army
Psychology Services, introduced with its acronym at first use and APS
thereafter, and the NZALC Performance Under Pressure package becomes the
NZALC Leadership Development System. The COMDT ACS guidance quotation
keeps its original wording.

Co-Authored-By: Claude Fable 5 <noreply@anthropic.com>
Claude-Session: https://claude.ai/code/session_01YLo1WfwUDkbwfJEF3ZNVbB
</commit_message>
<xml_diff>
--- a/output/combat-mindset-way-forward.docx
+++ b/output/combat-mindset-way-forward.docx
@@ -304,7 +304,7 @@
             </w:rPr>
             <w:fldChar w:fldCharType="separate"/>
           </w:r>
-          <w:hyperlink w:anchor="__RefHeading___Toc387_1870298719">
+          <w:hyperlink w:anchor="__RefHeading___Toc387_3750230122">
             <w:r>
               <w:rPr>
                 <w:webHidden/>
@@ -331,7 +331,7 @@
             </w:tabs>
             <w:rPr/>
           </w:pPr>
-          <w:hyperlink w:anchor="__RefHeading___Toc389_1870298719">
+          <w:hyperlink w:anchor="__RefHeading___Toc389_3750230122">
             <w:r>
               <w:rPr>
                 <w:webHidden/>
@@ -358,7 +358,7 @@
             </w:tabs>
             <w:rPr/>
           </w:pPr>
-          <w:hyperlink w:anchor="__RefHeading___Toc391_1870298719">
+          <w:hyperlink w:anchor="__RefHeading___Toc391_3750230122">
             <w:r>
               <w:rPr>
                 <w:webHidden/>
@@ -385,7 +385,7 @@
             </w:tabs>
             <w:rPr/>
           </w:pPr>
-          <w:hyperlink w:anchor="__RefHeading___Toc393_1870298719">
+          <w:hyperlink w:anchor="__RefHeading___Toc393_3750230122">
             <w:r>
               <w:rPr>
                 <w:webHidden/>
@@ -412,7 +412,7 @@
             </w:tabs>
             <w:rPr/>
           </w:pPr>
-          <w:hyperlink w:anchor="__RefHeading___Toc395_1870298719">
+          <w:hyperlink w:anchor="__RefHeading___Toc395_3750230122">
             <w:r>
               <w:rPr>
                 <w:webHidden/>
@@ -439,7 +439,7 @@
             </w:tabs>
             <w:rPr/>
           </w:pPr>
-          <w:hyperlink w:anchor="__RefHeading___Toc397_1870298719">
+          <w:hyperlink w:anchor="__RefHeading___Toc397_3750230122">
             <w:r>
               <w:rPr>
                 <w:webHidden/>
@@ -466,7 +466,7 @@
             </w:tabs>
             <w:rPr/>
           </w:pPr>
-          <w:hyperlink w:anchor="__RefHeading___Toc399_1870298719">
+          <w:hyperlink w:anchor="__RefHeading___Toc399_3750230122">
             <w:r>
               <w:rPr>
                 <w:webHidden/>
@@ -493,7 +493,7 @@
             </w:tabs>
             <w:rPr/>
           </w:pPr>
-          <w:hyperlink w:anchor="__RefHeading___Toc401_1870298719">
+          <w:hyperlink w:anchor="__RefHeading___Toc401_3750230122">
             <w:r>
               <w:rPr>
                 <w:webHidden/>
@@ -520,7 +520,7 @@
             </w:tabs>
             <w:rPr/>
           </w:pPr>
-          <w:hyperlink w:anchor="__RefHeading___Toc403_1870298719">
+          <w:hyperlink w:anchor="__RefHeading___Toc403_3750230122">
             <w:r>
               <w:rPr>
                 <w:webHidden/>
@@ -547,7 +547,7 @@
             </w:tabs>
             <w:rPr/>
           </w:pPr>
-          <w:hyperlink w:anchor="__RefHeading___Toc405_1870298719">
+          <w:hyperlink w:anchor="__RefHeading___Toc405_3750230122">
             <w:r>
               <w:rPr>
                 <w:webHidden/>
@@ -602,7 +602,7 @@
         <w:spacing w:before="0" w:after="160"/>
         <w:rPr/>
       </w:pPr>
-      <w:bookmarkStart w:id="0" w:name="__RefHeading___Toc387_1870298719"/>
+      <w:bookmarkStart w:id="0" w:name="__RefHeading___Toc387_3750230122"/>
       <w:bookmarkEnd w:id="0"/>
       <w:r>
         <w:rPr>
@@ -684,7 +684,7 @@
         </w:pBdr>
         <w:rPr/>
       </w:pPr>
-      <w:bookmarkStart w:id="1" w:name="__RefHeading___Toc389_1870298719"/>
+      <w:bookmarkStart w:id="1" w:name="__RefHeading___Toc389_3750230122"/>
       <w:bookmarkEnd w:id="1"/>
       <w:r>
         <w:rPr>
@@ -760,7 +760,7 @@
         </w:pBdr>
         <w:rPr/>
       </w:pPr>
-      <w:bookmarkStart w:id="2" w:name="__RefHeading___Toc391_1870298719"/>
+      <w:bookmarkStart w:id="2" w:name="__RefHeading___Toc391_3750230122"/>
       <w:bookmarkEnd w:id="2"/>
       <w:r>
         <w:rPr>
@@ -868,7 +868,7 @@
         </w:pBdr>
         <w:rPr/>
       </w:pPr>
-      <w:bookmarkStart w:id="3" w:name="__RefHeading___Toc393_1870298719"/>
+      <w:bookmarkStart w:id="3" w:name="__RefHeading___Toc393_3750230122"/>
       <w:bookmarkEnd w:id="3"/>
       <w:r>
         <w:rPr>
@@ -1422,7 +1422,7 @@
         </w:pBdr>
         <w:rPr/>
       </w:pPr>
-      <w:bookmarkStart w:id="4" w:name="__RefHeading___Toc395_1870298719"/>
+      <w:bookmarkStart w:id="4" w:name="__RefHeading___Toc395_3750230122"/>
       <w:bookmarkEnd w:id="4"/>
       <w:r>
         <w:rPr>
@@ -1540,7 +1540,7 @@
           <w:color w:val="002516"/>
           <w:sz w:val="20"/>
         </w:rPr>
-        <w:t>Army Psychology Services, ILD and other stakeholders</w:t>
+        <w:t>Army Psychology Services (APS), ILD and other stakeholders</w:t>
       </w:r>
     </w:p>
     <w:p>
@@ -1606,7 +1606,7 @@
         </w:pBdr>
         <w:rPr/>
       </w:pPr>
-      <w:bookmarkStart w:id="5" w:name="__RefHeading___Toc397_1870298719"/>
+      <w:bookmarkStart w:id="5" w:name="__RefHeading___Toc397_3750230122"/>
       <w:bookmarkEnd w:id="5"/>
       <w:r>
         <w:rPr>
@@ -1690,7 +1690,7 @@
           <w:b w:val="false"/>
           <w:i w:val="false"/>
         </w:rPr>
-        <w:t>Assess existing doctrine, content, products, courses, instructor capability, delivery activity, evidence, ownership and assurance arrangements across ACS, NZALC, HPC, NZDF Psychology, ILD, training establishments and selected units. The assessment will distinguish:</w:t>
+        <w:t>Assess existing doctrine, content, products, courses, instructor capability, delivery activity, evidence, ownership and assurance arrangements across ACS, NZALC, HPC, APS, ILD, training establishments and selected units. The assessment will distinguish:</w:t>
       </w:r>
     </w:p>
     <w:p>
@@ -2050,7 +2050,7 @@
           <w:b w:val="false"/>
           <w:i w:val="false"/>
         </w:rPr>
-        <w:t>Existing products, including the NZALC Performance Under Pressure package and COGCON, will be mapped beneath the relevant provisional capability pillars rather than treated as the framework itself.</w:t>
+        <w:t>Existing products, including the NZALC Leadership Development System and COGCON, will be mapped beneath the relevant provisional capability pillars rather than treated as the framework itself.</w:t>
       </w:r>
     </w:p>
     <w:p>
@@ -2080,7 +2080,7 @@
           <w:b w:val="false"/>
           <w:i w:val="false"/>
         </w:rPr>
-        <w:t>Refine the framework with key stakeholders and conduct bounded pilots: convene ACS, NZALC, HPC, NZDF Psychology, ILD, selected training providers and units to refine the framework, product architecture, governance model, implementation priorities, definition clarity and doctrinal coherence.</w:t>
+        <w:t>Refine the framework with key stakeholders and conduct bounded pilots: convene ACS, NZALC, HPC, APS, ILD, selected training providers and units to refine the framework, product architecture, governance model, implementation priorities, definition clarity and doctrinal coherence.</w:t>
       </w:r>
     </w:p>
     <w:p>
@@ -2488,7 +2488,7 @@
         </w:pBdr>
         <w:rPr/>
       </w:pPr>
-      <w:bookmarkStart w:id="6" w:name="__RefHeading___Toc399_1870298719"/>
+      <w:bookmarkStart w:id="6" w:name="__RefHeading___Toc399_3750230122"/>
       <w:bookmarkEnd w:id="6"/>
       <w:r>
         <w:rPr>
@@ -2692,7 +2692,7 @@
           <w:b w:val="false"/>
           <w:i w:val="false"/>
         </w:rPr>
-        <w:t>Domain advisers and authorities: NZDF Psychology, ILD, physical-performance specialists, doctrine staff and other relevant organisations, providing technical or professional advice within their respective domains.</w:t>
+        <w:t>Domain advisers and authorities: APS, ILD, physical-performance specialists, doctrine staff and other relevant organisations, providing technical or professional advice within their respective domains.</w:t>
       </w:r>
     </w:p>
     <w:p>
@@ -2788,7 +2788,7 @@
         </w:pBdr>
         <w:rPr/>
       </w:pPr>
-      <w:bookmarkStart w:id="7" w:name="__RefHeading___Toc401_1870298719"/>
+      <w:bookmarkStart w:id="7" w:name="__RefHeading___Toc401_3750230122"/>
       <w:bookmarkEnd w:id="7"/>
       <w:r>
         <w:rPr>
@@ -2920,7 +2920,7 @@
           <w:b w:val="false"/>
           <w:i w:val="false"/>
         </w:rPr>
-        <w:t xml:space="preserve"> development of the Combat Mindset Framework through the proposed capability and product assessment, framework design and validation activity, noting that the provisional capability pillars and the contribution, maturity, evidence, ownership and appropriate nesting of existing products (including the NZALC Performance Under Pressure package, COGCON and NZDF Psychology products) will be validated through this process.</w:t>
+        <w:t xml:space="preserve"> development of the Combat Mindset Framework through the proposed capability and product assessment, framework design and validation activity, noting that the provisional capability pillars and the contribution, maturity, evidence, ownership and appropriate nesting of existing products (including the NZALC Leadership Development System, COGCON and APS products) will be validated through this process.</w:t>
       </w:r>
     </w:p>
     <w:p>
@@ -3090,7 +3090,7 @@
         <w:spacing w:before="0" w:after="160"/>
         <w:rPr/>
       </w:pPr>
-      <w:bookmarkStart w:id="8" w:name="__RefHeading___Toc403_1870298719"/>
+      <w:bookmarkStart w:id="8" w:name="__RefHeading___Toc403_3750230122"/>
       <w:bookmarkEnd w:id="8"/>
       <w:r>
         <w:rPr>
@@ -3236,7 +3236,7 @@
           <w:b w:val="false"/>
           <w:i w:val="false"/>
         </w:rPr>
-        <w:t>Relevant NZDF Psychology, ILD and doctrinal holdings will be confirmed and referenced through the Phase 2 assessment.</w:t>
+        <w:t>Relevant APS, ILD and doctrinal holdings will be confirmed and referenced through the Phase 2 assessment.</w:t>
       </w:r>
     </w:p>
     <w:p>
@@ -3247,7 +3247,7 @@
         </w:pBdr>
         <w:rPr/>
       </w:pPr>
-      <w:bookmarkStart w:id="9" w:name="__RefHeading___Toc405_1870298719"/>
+      <w:bookmarkStart w:id="9" w:name="__RefHeading___Toc405_3750230122"/>
       <w:bookmarkEnd w:id="9"/>
       <w:r>
         <w:rPr>

</xml_diff>

<commit_message>
Reschedule the programme of work and qualify the timeframes
Drops "proposed" from the section title. August 2026 is set aside for
socialising the paper, so the programme now commences in September:
Phases 1 and 2 in September, Phase 3 in October, Phase 4 in November and
Phase 5 in late November. Adds a statement that the timeframes are
aspirational, depend on stakeholder and unit availability, and may extend
into early 2027. Bounded pilots become conditional on time and unit
availability and may run earlier than Phase 4. The Army Sponsor
confirmation date moves to 30 September to match Phase 1.

Co-Authored-By: Claude Fable 5 <noreply@anthropic.com>
Claude-Session: https://claude.ai/code/session_01YLo1WfwUDkbwfJEF3ZNVbB
</commit_message>
<xml_diff>
--- a/output/combat-mindset-way-forward.docx
+++ b/output/combat-mindset-way-forward.docx
@@ -304,7 +304,7 @@
             </w:rPr>
             <w:fldChar w:fldCharType="separate"/>
           </w:r>
-          <w:hyperlink w:anchor="__RefHeading___Toc387_3750230122">
+          <w:hyperlink w:anchor="__RefHeading___Toc388_1179594044">
             <w:r>
               <w:rPr>
                 <w:webHidden/>
@@ -331,7 +331,7 @@
             </w:tabs>
             <w:rPr/>
           </w:pPr>
-          <w:hyperlink w:anchor="__RefHeading___Toc389_3750230122">
+          <w:hyperlink w:anchor="__RefHeading___Toc390_1179594044">
             <w:r>
               <w:rPr>
                 <w:webHidden/>
@@ -358,7 +358,7 @@
             </w:tabs>
             <w:rPr/>
           </w:pPr>
-          <w:hyperlink w:anchor="__RefHeading___Toc391_3750230122">
+          <w:hyperlink w:anchor="__RefHeading___Toc392_1179594044">
             <w:r>
               <w:rPr>
                 <w:webHidden/>
@@ -385,7 +385,7 @@
             </w:tabs>
             <w:rPr/>
           </w:pPr>
-          <w:hyperlink w:anchor="__RefHeading___Toc393_3750230122">
+          <w:hyperlink w:anchor="__RefHeading___Toc394_1179594044">
             <w:r>
               <w:rPr>
                 <w:webHidden/>
@@ -412,7 +412,7 @@
             </w:tabs>
             <w:rPr/>
           </w:pPr>
-          <w:hyperlink w:anchor="__RefHeading___Toc395_3750230122">
+          <w:hyperlink w:anchor="__RefHeading___Toc396_1179594044">
             <w:r>
               <w:rPr>
                 <w:webHidden/>
@@ -439,14 +439,14 @@
             </w:tabs>
             <w:rPr/>
           </w:pPr>
-          <w:hyperlink w:anchor="__RefHeading___Toc397_3750230122">
+          <w:hyperlink w:anchor="__RefHeading___Toc398_1179594044">
             <w:r>
               <w:rPr>
                 <w:webHidden/>
                 <w:rStyle w:val="IndexLink"/>
                 <w:i w:val="false"/>
               </w:rPr>
-              <w:t>4. Proposed programme of work</w:t>
+              <w:t>4. Programme of work</w:t>
             </w:r>
             <w:r>
               <w:rPr>
@@ -466,7 +466,7 @@
             </w:tabs>
             <w:rPr/>
           </w:pPr>
-          <w:hyperlink w:anchor="__RefHeading___Toc399_3750230122">
+          <w:hyperlink w:anchor="__RefHeading___Toc400_1179594044">
             <w:r>
               <w:rPr>
                 <w:webHidden/>
@@ -493,7 +493,7 @@
             </w:tabs>
             <w:rPr/>
           </w:pPr>
-          <w:hyperlink w:anchor="__RefHeading___Toc401_3750230122">
+          <w:hyperlink w:anchor="__RefHeading___Toc402_1179594044">
             <w:r>
               <w:rPr>
                 <w:webHidden/>
@@ -520,7 +520,7 @@
             </w:tabs>
             <w:rPr/>
           </w:pPr>
-          <w:hyperlink w:anchor="__RefHeading___Toc403_3750230122">
+          <w:hyperlink w:anchor="__RefHeading___Toc404_1179594044">
             <w:r>
               <w:rPr>
                 <w:webHidden/>
@@ -547,7 +547,7 @@
             </w:tabs>
             <w:rPr/>
           </w:pPr>
-          <w:hyperlink w:anchor="__RefHeading___Toc405_3750230122">
+          <w:hyperlink w:anchor="__RefHeading___Toc406_1179594044">
             <w:r>
               <w:rPr>
                 <w:webHidden/>
@@ -602,7 +602,7 @@
         <w:spacing w:before="0" w:after="160"/>
         <w:rPr/>
       </w:pPr>
-      <w:bookmarkStart w:id="0" w:name="__RefHeading___Toc387_3750230122"/>
+      <w:bookmarkStart w:id="0" w:name="__RefHeading___Toc388_1179594044"/>
       <w:bookmarkEnd w:id="0"/>
       <w:r>
         <w:rPr>
@@ -684,7 +684,7 @@
         </w:pBdr>
         <w:rPr/>
       </w:pPr>
-      <w:bookmarkStart w:id="1" w:name="__RefHeading___Toc389_3750230122"/>
+      <w:bookmarkStart w:id="1" w:name="__RefHeading___Toc390_1179594044"/>
       <w:bookmarkEnd w:id="1"/>
       <w:r>
         <w:rPr>
@@ -722,7 +722,7 @@
           <w:b w:val="false"/>
           <w:i w:val="false"/>
         </w:rPr>
-        <w:t>The programme of work is phased: Phase 1 defines terminology, governance, roles and responsibilities; Phase 2 assesses existing doctrine, products, delivery and governance; Phase 3 designs the framework, its delivery system and outcomes; Phase 4 validates the framework with key stakeholders and conducts bounded pilots; and Phase 5 delivers the framework for approval and implementation.</w:t>
+        <w:t>The programme of work is phased: Phase 1 defines terminology, governance, roles and responsibilities; Phase 2 assesses existing doctrine, products, delivery and governance; Phase 3 designs the framework, its delivery system and outcomes; Phase 4 validates the framework with key stakeholders; and Phase 5 delivers the framework for approval and implementation.</w:t>
       </w:r>
     </w:p>
     <w:p>
@@ -760,7 +760,7 @@
         </w:pBdr>
         <w:rPr/>
       </w:pPr>
-      <w:bookmarkStart w:id="2" w:name="__RefHeading___Toc391_3750230122"/>
+      <w:bookmarkStart w:id="2" w:name="__RefHeading___Toc392_1179594044"/>
       <w:bookmarkEnd w:id="2"/>
       <w:r>
         <w:rPr>
@@ -868,7 +868,7 @@
         </w:pBdr>
         <w:rPr/>
       </w:pPr>
-      <w:bookmarkStart w:id="3" w:name="__RefHeading___Toc393_3750230122"/>
+      <w:bookmarkStart w:id="3" w:name="__RefHeading___Toc394_1179594044"/>
       <w:bookmarkEnd w:id="3"/>
       <w:r>
         <w:rPr>
@@ -1422,7 +1422,7 @@
         </w:pBdr>
         <w:rPr/>
       </w:pPr>
-      <w:bookmarkStart w:id="4" w:name="__RefHeading___Toc395_3750230122"/>
+      <w:bookmarkStart w:id="4" w:name="__RefHeading___Toc396_1179594044"/>
       <w:bookmarkEnd w:id="4"/>
       <w:r>
         <w:rPr>
@@ -1606,7 +1606,7 @@
         </w:pBdr>
         <w:rPr/>
       </w:pPr>
-      <w:bookmarkStart w:id="5" w:name="__RefHeading___Toc397_3750230122"/>
+      <w:bookmarkStart w:id="5" w:name="__RefHeading___Toc398_1179594044"/>
       <w:bookmarkEnd w:id="5"/>
       <w:r>
         <w:rPr>
@@ -1616,7 +1616,7 @@
           <w:color w:val="002516"/>
           <w:sz w:val="28"/>
         </w:rPr>
-        <w:t>4. Proposed programme of work</w:t>
+        <w:t>4. Programme of work</w:t>
       </w:r>
     </w:p>
     <w:p>
@@ -1631,6 +1631,20 @@
           <w:i w:val="false"/>
         </w:rPr>
         <w:t>The programme will be conducted within existing ACS, NZALC and HPC baselines; no new resource is sought before the November 2026 report. Proposed phase leads are shown against each phase and are subject to confirmation.</w:t>
+      </w:r>
+    </w:p>
+    <w:p>
+      <w:pPr>
+        <w:pStyle w:val="Normal"/>
+        <w:rPr/>
+      </w:pPr>
+      <w:r>
+        <w:rPr>
+          <w:rFonts w:cs="Book Antiqua"/>
+          <w:b w:val="false"/>
+          <w:i w:val="false"/>
+        </w:rPr>
+        <w:t>August 2026 is set aside for this paper to be socialised through the chain of command, and the programme is therefore proposed to commence in September 2026. The timeframes below are aspirational. They depend on stakeholder availability and on unit and training establishment programmes, and activity extending into early 2027 is anticipated rather than unforeseen.</w:t>
       </w:r>
     </w:p>
     <w:p>
@@ -1646,7 +1660,7 @@
           <w:color w:val="000000"/>
           <w:sz w:val="22"/>
         </w:rPr>
-        <w:t>Phase 1: Define and govern (on endorsement of this paper; target mid-August 2026) (ACS) [proposed – confirm]</w:t>
+        <w:t>Phase 1: Define and govern (on endorsement of this paper; September 2026) (ACS) [proposed – confirm]</w:t>
       </w:r>
     </w:p>
     <w:p>
@@ -1676,7 +1690,7 @@
           <w:color w:val="000000"/>
           <w:sz w:val="22"/>
         </w:rPr>
-        <w:t>Phase 2: Understand (August–September 2026) (NZALC lead, HPC support) [proposed – confirm]</w:t>
+        <w:t>Phase 2: Understand (September 2026) (NZALC lead, HPC support) [proposed – confirm]</w:t>
       </w:r>
     </w:p>
     <w:p>
@@ -2008,7 +2022,7 @@
           <w:color w:val="000000"/>
           <w:sz w:val="22"/>
         </w:rPr>
-        <w:t>Phase 3: Design (September–October 2026) (NZALC/HPC joint) [proposed – confirm]</w:t>
+        <w:t>Phase 3: Design (October 2026) (NZALC/HPC joint) [proposed – confirm]</w:t>
       </w:r>
     </w:p>
     <w:p>
@@ -2066,21 +2080,21 @@
           <w:color w:val="000000"/>
           <w:sz w:val="22"/>
         </w:rPr>
-        <w:t>Phase 4: Validate (October 2026) (ACS convenes) [proposed – confirm]</w:t>
-      </w:r>
-    </w:p>
-    <w:p>
-      <w:pPr>
-        <w:pStyle w:val="Normal"/>
-        <w:rPr/>
-      </w:pPr>
-      <w:r>
-        <w:rPr>
-          <w:rFonts w:cs="Book Antiqua"/>
-          <w:b w:val="false"/>
-          <w:i w:val="false"/>
-        </w:rPr>
-        <w:t>Refine the framework with key stakeholders and conduct bounded pilots: convene ACS, NZALC, HPC, APS, ILD, selected training providers and units to refine the framework, product architecture, governance model, implementation priorities, definition clarity and doctrinal coherence.</w:t>
+        <w:t>Phase 4: Validate (November 2026) (ACS convenes) [proposed – confirm]</w:t>
+      </w:r>
+    </w:p>
+    <w:p>
+      <w:pPr>
+        <w:pStyle w:val="Normal"/>
+        <w:rPr/>
+      </w:pPr>
+      <w:r>
+        <w:rPr>
+          <w:rFonts w:cs="Book Antiqua"/>
+          <w:b w:val="false"/>
+          <w:i w:val="false"/>
+        </w:rPr>
+        <w:t>Refine the framework with key stakeholders: convene ACS, NZALC, HPC, APS, ILD, selected training providers and units to refine the framework, product architecture, governance model, implementation priorities, definition clarity and doctrinal coherence. Where time and unit availability permit, bounded pilots will be conducted within this phase or earlier alongside Phase 2 or Phase 3.</w:t>
       </w:r>
     </w:p>
     <w:p>
@@ -2096,7 +2110,7 @@
           <w:color w:val="000000"/>
           <w:sz w:val="22"/>
         </w:rPr>
-        <w:t>Phase 5: Implement (November 2026) (ACS) [proposed – confirm]</w:t>
+        <w:t>Phase 5: Implement (late November 2026) (ACS) [proposed – confirm]</w:t>
       </w:r>
     </w:p>
     <w:p>
@@ -2488,7 +2502,7 @@
         </w:pBdr>
         <w:rPr/>
       </w:pPr>
-      <w:bookmarkStart w:id="6" w:name="__RefHeading___Toc399_3750230122"/>
+      <w:bookmarkStart w:id="6" w:name="__RefHeading___Toc400_1179594044"/>
       <w:bookmarkEnd w:id="6"/>
       <w:r>
         <w:rPr>
@@ -2788,7 +2802,7 @@
         </w:pBdr>
         <w:rPr/>
       </w:pPr>
-      <w:bookmarkStart w:id="7" w:name="__RefHeading___Toc401_3750230122"/>
+      <w:bookmarkStart w:id="7" w:name="__RefHeading___Toc402_1179594044"/>
       <w:bookmarkEnd w:id="7"/>
       <w:r>
         <w:rPr>
@@ -2992,7 +3006,7 @@
           <w:b w:val="false"/>
           <w:i w:val="false"/>
         </w:rPr>
-        <w:t xml:space="preserve"> confirmation of the Army Sponsor by 31 August 2026, with candidate options identified by ACS.</w:t>
+        <w:t xml:space="preserve"> confirmation of the Army Sponsor by 30 September 2026, with candidate options identified by ACS.</w:t>
       </w:r>
     </w:p>
     <w:p>
@@ -3090,7 +3104,7 @@
         <w:spacing w:before="0" w:after="160"/>
         <w:rPr/>
       </w:pPr>
-      <w:bookmarkStart w:id="8" w:name="__RefHeading___Toc403_3750230122"/>
+      <w:bookmarkStart w:id="8" w:name="__RefHeading___Toc404_1179594044"/>
       <w:bookmarkEnd w:id="8"/>
       <w:r>
         <w:rPr>
@@ -3247,7 +3261,7 @@
         </w:pBdr>
         <w:rPr/>
       </w:pPr>
-      <w:bookmarkStart w:id="9" w:name="__RefHeading___Toc405_3750230122"/>
+      <w:bookmarkStart w:id="9" w:name="__RefHeading___Toc406_1179594044"/>
       <w:bookmarkEnd w:id="9"/>
       <w:r>
         <w:rPr>

</xml_diff>

<commit_message>
Restructure the phases around Define, Understand, Design, Validate, Implement
Each phase now opens with the outcome line used on the model page, then
states what takes place, then names its key output, so the section reads
as a fuller articulation of the framework development programme. Phase 1
is renamed Define, its governance content moving into the description,
and wording across all five phases is tightened to imperatives.

Co-Authored-By: Claude Fable 5 <noreply@anthropic.com>
Claude-Session: https://claude.ai/code/session_01YLo1WfwUDkbwfJEF3ZNVbB
</commit_message>
<xml_diff>
--- a/output/combat-mindset-way-forward.docx
+++ b/output/combat-mindset-way-forward.docx
@@ -304,7 +304,7 @@
             </w:rPr>
             <w:fldChar w:fldCharType="separate"/>
           </w:r>
-          <w:hyperlink w:anchor="__RefHeading___Toc388_1179594044">
+          <w:hyperlink w:anchor="__RefHeading___Toc403_3067098715">
             <w:r>
               <w:rPr>
                 <w:webHidden/>
@@ -331,7 +331,7 @@
             </w:tabs>
             <w:rPr/>
           </w:pPr>
-          <w:hyperlink w:anchor="__RefHeading___Toc390_1179594044">
+          <w:hyperlink w:anchor="__RefHeading___Toc405_3067098715">
             <w:r>
               <w:rPr>
                 <w:webHidden/>
@@ -358,7 +358,7 @@
             </w:tabs>
             <w:rPr/>
           </w:pPr>
-          <w:hyperlink w:anchor="__RefHeading___Toc392_1179594044">
+          <w:hyperlink w:anchor="__RefHeading___Toc407_3067098715">
             <w:r>
               <w:rPr>
                 <w:webHidden/>
@@ -385,7 +385,7 @@
             </w:tabs>
             <w:rPr/>
           </w:pPr>
-          <w:hyperlink w:anchor="__RefHeading___Toc394_1179594044">
+          <w:hyperlink w:anchor="__RefHeading___Toc409_3067098715">
             <w:r>
               <w:rPr>
                 <w:webHidden/>
@@ -412,7 +412,7 @@
             </w:tabs>
             <w:rPr/>
           </w:pPr>
-          <w:hyperlink w:anchor="__RefHeading___Toc396_1179594044">
+          <w:hyperlink w:anchor="__RefHeading___Toc411_3067098715">
             <w:r>
               <w:rPr>
                 <w:webHidden/>
@@ -439,7 +439,7 @@
             </w:tabs>
             <w:rPr/>
           </w:pPr>
-          <w:hyperlink w:anchor="__RefHeading___Toc398_1179594044">
+          <w:hyperlink w:anchor="__RefHeading___Toc413_3067098715">
             <w:r>
               <w:rPr>
                 <w:webHidden/>
@@ -466,7 +466,7 @@
             </w:tabs>
             <w:rPr/>
           </w:pPr>
-          <w:hyperlink w:anchor="__RefHeading___Toc400_1179594044">
+          <w:hyperlink w:anchor="__RefHeading___Toc415_3067098715">
             <w:r>
               <w:rPr>
                 <w:webHidden/>
@@ -493,7 +493,7 @@
             </w:tabs>
             <w:rPr/>
           </w:pPr>
-          <w:hyperlink w:anchor="__RefHeading___Toc402_1179594044">
+          <w:hyperlink w:anchor="__RefHeading___Toc417_3067098715">
             <w:r>
               <w:rPr>
                 <w:webHidden/>
@@ -507,7 +507,7 @@
                 <w:rStyle w:val="IndexLink"/>
               </w:rPr>
               <w:tab/>
-              <w:t>9</w:t>
+              <w:t>10</w:t>
             </w:r>
           </w:hyperlink>
         </w:p>
@@ -520,7 +520,7 @@
             </w:tabs>
             <w:rPr/>
           </w:pPr>
-          <w:hyperlink w:anchor="__RefHeading___Toc404_1179594044">
+          <w:hyperlink w:anchor="__RefHeading___Toc419_3067098715">
             <w:r>
               <w:rPr>
                 <w:webHidden/>
@@ -547,7 +547,7 @@
             </w:tabs>
             <w:rPr/>
           </w:pPr>
-          <w:hyperlink w:anchor="__RefHeading___Toc406_1179594044">
+          <w:hyperlink w:anchor="__RefHeading___Toc421_3067098715">
             <w:r>
               <w:rPr>
                 <w:webHidden/>
@@ -602,7 +602,7 @@
         <w:spacing w:before="0" w:after="160"/>
         <w:rPr/>
       </w:pPr>
-      <w:bookmarkStart w:id="0" w:name="__RefHeading___Toc388_1179594044"/>
+      <w:bookmarkStart w:id="0" w:name="__RefHeading___Toc403_3067098715"/>
       <w:bookmarkEnd w:id="0"/>
       <w:r>
         <w:rPr>
@@ -684,7 +684,7 @@
         </w:pBdr>
         <w:rPr/>
       </w:pPr>
-      <w:bookmarkStart w:id="1" w:name="__RefHeading___Toc390_1179594044"/>
+      <w:bookmarkStart w:id="1" w:name="__RefHeading___Toc405_3067098715"/>
       <w:bookmarkEnd w:id="1"/>
       <w:r>
         <w:rPr>
@@ -760,7 +760,7 @@
         </w:pBdr>
         <w:rPr/>
       </w:pPr>
-      <w:bookmarkStart w:id="2" w:name="__RefHeading___Toc392_1179594044"/>
+      <w:bookmarkStart w:id="2" w:name="__RefHeading___Toc407_3067098715"/>
       <w:bookmarkEnd w:id="2"/>
       <w:r>
         <w:rPr>
@@ -868,7 +868,7 @@
         </w:pBdr>
         <w:rPr/>
       </w:pPr>
-      <w:bookmarkStart w:id="3" w:name="__RefHeading___Toc394_1179594044"/>
+      <w:bookmarkStart w:id="3" w:name="__RefHeading___Toc409_3067098715"/>
       <w:bookmarkEnd w:id="3"/>
       <w:r>
         <w:rPr>
@@ -1422,7 +1422,7 @@
         </w:pBdr>
         <w:rPr/>
       </w:pPr>
-      <w:bookmarkStart w:id="4" w:name="__RefHeading___Toc396_1179594044"/>
+      <w:bookmarkStart w:id="4" w:name="__RefHeading___Toc411_3067098715"/>
       <w:bookmarkEnd w:id="4"/>
       <w:r>
         <w:rPr>
@@ -1606,7 +1606,7 @@
         </w:pBdr>
         <w:rPr/>
       </w:pPr>
-      <w:bookmarkStart w:id="5" w:name="__RefHeading___Toc398_1179594044"/>
+      <w:bookmarkStart w:id="5" w:name="__RefHeading___Toc413_3067098715"/>
       <w:bookmarkEnd w:id="5"/>
       <w:r>
         <w:rPr>
@@ -1660,21 +1660,57 @@
           <w:color w:val="000000"/>
           <w:sz w:val="22"/>
         </w:rPr>
-        <w:t>Phase 1: Define and govern (on endorsement of this paper; September 2026) (ACS) [proposed – confirm]</w:t>
-      </w:r>
-    </w:p>
-    <w:p>
-      <w:pPr>
-        <w:pStyle w:val="Normal"/>
-        <w:rPr/>
-      </w:pPr>
-      <w:r>
-        <w:rPr>
-          <w:rFonts w:cs="Book Antiqua"/>
-          <w:b w:val="false"/>
-          <w:i w:val="false"/>
-        </w:rPr>
-        <w:t>Confirm terminology, governance, roles and responsibilities: endorse the problem statement, select the terminology option at paragraph 2, confirm interim sponsorship and capability-integration arrangements, and draft for staffing the endorsed definitions of Combat Mindset, Performance Under Pressure and the Combat Mindset Framework, together with the agreed relationship between the three.</w:t>
+        <w:t>Phase 1: Define (September 2026) (ACS) [proposed – confirm]</w:t>
+      </w:r>
+    </w:p>
+    <w:p>
+      <w:pPr>
+        <w:pStyle w:val="Normal"/>
+        <w:rPr/>
+      </w:pPr>
+      <w:r>
+        <w:rPr>
+          <w:rFonts w:cs="Book Antiqua"/>
+          <w:b w:val="false"/>
+          <w:i w:val="false"/>
+        </w:rPr>
+        <w:t>Confirm terminology, governance, roles and responsibilities.</w:t>
+      </w:r>
+    </w:p>
+    <w:p>
+      <w:pPr>
+        <w:pStyle w:val="Normal"/>
+        <w:rPr/>
+      </w:pPr>
+      <w:r>
+        <w:rPr>
+          <w:rFonts w:cs="Book Antiqua"/>
+          <w:b w:val="false"/>
+          <w:i w:val="false"/>
+        </w:rPr>
+        <w:t>Endorse the problem statement, select the terminology option at paragraph 2, and confirm interim sponsorship, capability-integration arrangements and phase leads. Draft for staffing the endorsed definitions of Combat Mindset, Performance Under Pressure and the Combat Mindset Framework, together with the relationship between the three.</w:t>
+      </w:r>
+    </w:p>
+    <w:p>
+      <w:pPr>
+        <w:pStyle w:val="Normal"/>
+        <w:rPr/>
+      </w:pPr>
+      <w:r>
+        <w:rPr>
+          <w:rFonts w:cs="Book Antiqua"/>
+          <w:b/>
+          <w:i w:val="false"/>
+        </w:rPr>
+        <w:t>Key output.</w:t>
+      </w:r>
+      <w:r>
+        <w:rPr>
+          <w:rFonts w:cs="Book Antiqua"/>
+          <w:b w:val="false"/>
+          <w:i w:val="false"/>
+        </w:rPr>
+        <w:t xml:space="preserve"> Endorsed problem statement and definitions, and confirmed interim governance.</w:t>
       </w:r>
     </w:p>
     <w:p>
@@ -1704,7 +1740,21 @@
           <w:b w:val="false"/>
           <w:i w:val="false"/>
         </w:rPr>
-        <w:t>Assess existing doctrine, content, products, courses, instructor capability, delivery activity, evidence, ownership and assurance arrangements across ACS, NZALC, HPC, APS, ILD, training establishments and selected units. The assessment will distinguish:</w:t>
+        <w:t>Assess existing doctrine, products, delivery and governance.</w:t>
+      </w:r>
+    </w:p>
+    <w:p>
+      <w:pPr>
+        <w:pStyle w:val="Normal"/>
+        <w:rPr/>
+      </w:pPr>
+      <w:r>
+        <w:rPr>
+          <w:rFonts w:cs="Book Antiqua"/>
+          <w:b w:val="false"/>
+          <w:i w:val="false"/>
+        </w:rPr>
+        <w:t>Assess holdings across ACS, NZALC, HPC, APS, ILD, training establishments and selected units against:</w:t>
       </w:r>
     </w:p>
     <w:p>
@@ -2006,7 +2056,29 @@
           <w:b w:val="false"/>
           <w:i w:val="false"/>
         </w:rPr>
-        <w:t>The assessment will identify which products contribute to the broader Performance Under Pressure capability and which support its combat-specific expression, using the combat-specificity test at paragraph 2. COGCON will be assessed as one developmental product within this assessment, with particular attention to its product boundary, evidence base (including its completed feasibility trials in live military training), ownership, workforce requirements and scalability.</w:t>
+        <w:t>Apply the combat-specificity test at paragraph 2 to distinguish products that contribute to the broader Performance Under Pressure capability from those that support its combat-specific expression. Assess COGCON as one developmental product within this assessment, with particular attention to its product boundary, evidence base (including its completed feasibility trials in live military training), ownership, workforce requirements and scalability.</w:t>
+      </w:r>
+    </w:p>
+    <w:p>
+      <w:pPr>
+        <w:pStyle w:val="Normal"/>
+        <w:rPr/>
+      </w:pPr>
+      <w:r>
+        <w:rPr>
+          <w:rFonts w:cs="Book Antiqua"/>
+          <w:b/>
+          <w:i w:val="false"/>
+        </w:rPr>
+        <w:t>Key output.</w:t>
+      </w:r>
+      <w:r>
+        <w:rPr>
+          <w:rFonts w:cs="Book Antiqua"/>
+          <w:b w:val="false"/>
+          <w:i w:val="false"/>
+        </w:rPr>
+        <w:t xml:space="preserve"> A capability and product baseline identifying holdings, gaps, duplication and integration opportunities.</w:t>
       </w:r>
     </w:p>
     <w:p>
@@ -2036,35 +2108,71 @@
           <w:b w:val="false"/>
           <w:i w:val="false"/>
         </w:rPr>
-        <w:t>Develop the Combat Mindset Framework, delivery system and outcomes: the organising system through which Army will govern, develop, deliver and assure Performance Under Pressure and its combat-specific expression. The framework will include the endorsed definitions and desired operational effect; the provisional capability pillars, refined through the assessment; developmental outcomes from Lead Self through Lead Systems; the relationship between doctrine, framework, products and delivery; common assurance principles; and the criteria by which existing and future products may be recognised as contributing to the framework.</w:t>
-      </w:r>
-    </w:p>
-    <w:p>
-      <w:pPr>
-        <w:pStyle w:val="Normal"/>
-        <w:rPr/>
-      </w:pPr>
-      <w:r>
-        <w:rPr>
-          <w:rFonts w:cs="Book Antiqua"/>
-          <w:b w:val="false"/>
-          <w:i w:val="false"/>
-        </w:rPr>
-        <w:t>The provisional working pillars are: leadership under pressure; self-regulation and mental skills; performance cognition; resilience, adaptation and recovery; physical readiness and performance; professional identity, values and will to act; and team and collective performance. These are provisional working pillars, subject to validation through the Phase 2 assessment and Phase 4 validation. Each describes an enduring capability Army seeks to build. Training products and methods (including progressive exposure to pressure, scenario and experiential training, field and mission-relevant rehearsal, and physical and cognitive conditioning) are how Army builds them.</w:t>
-      </w:r>
-    </w:p>
-    <w:p>
-      <w:pPr>
-        <w:pStyle w:val="Normal"/>
-        <w:rPr/>
-      </w:pPr>
-      <w:r>
-        <w:rPr>
-          <w:rFonts w:cs="Book Antiqua"/>
-          <w:b w:val="false"/>
-          <w:i w:val="false"/>
-        </w:rPr>
-        <w:t>Existing products, including the NZALC Leadership Development System and COGCON, will be mapped beneath the relevant provisional capability pillars rather than treated as the framework itself.</w:t>
+        <w:t>Develop the Combat Mindset Framework, delivery system and outcomes.</w:t>
+      </w:r>
+    </w:p>
+    <w:p>
+      <w:pPr>
+        <w:pStyle w:val="Normal"/>
+        <w:rPr/>
+      </w:pPr>
+      <w:r>
+        <w:rPr>
+          <w:rFonts w:cs="Book Antiqua"/>
+          <w:b w:val="false"/>
+          <w:i w:val="false"/>
+        </w:rPr>
+        <w:t>Draft the organising system through which Army will govern, develop, deliver and assure Performance Under Pressure and its combat-specific expression. The framework will set out the endorsed definitions and desired operational effect; the capability pillars, refined through the Phase 2 assessment; developmental outcomes from Lead Self through Lead Systems; the relationship between doctrine, framework, products and delivery; common assurance principles; and the criteria by which existing and future products may be recognised as contributing to the framework.</w:t>
+      </w:r>
+    </w:p>
+    <w:p>
+      <w:pPr>
+        <w:pStyle w:val="Normal"/>
+        <w:rPr/>
+      </w:pPr>
+      <w:r>
+        <w:rPr>
+          <w:rFonts w:cs="Book Antiqua"/>
+          <w:b w:val="false"/>
+          <w:i w:val="false"/>
+        </w:rPr>
+        <w:t>The provisional working pillars are: leadership under pressure; self-regulation and mental skills; performance cognition; resilience, adaptation and recovery; physical readiness and performance; professional identity, values and will to act; and team and collective performance. Each describes an enduring capability Army seeks to build, and each is subject to validation through the Phase 2 assessment and Phase 4 validation. Training products and methods, including progressive exposure to pressure, scenario and experiential training, field and mission-relevant rehearsal, and physical and cognitive conditioning, are how Army builds them.</w:t>
+      </w:r>
+    </w:p>
+    <w:p>
+      <w:pPr>
+        <w:pStyle w:val="Normal"/>
+        <w:rPr/>
+      </w:pPr>
+      <w:r>
+        <w:rPr>
+          <w:rFonts w:cs="Book Antiqua"/>
+          <w:b w:val="false"/>
+          <w:i w:val="false"/>
+        </w:rPr>
+        <w:t>Existing products, including the NZALC Leadership Development System and COGCON, will be mapped beneath the relevant pillars rather than treated as the framework itself.</w:t>
+      </w:r>
+    </w:p>
+    <w:p>
+      <w:pPr>
+        <w:pStyle w:val="Normal"/>
+        <w:rPr/>
+      </w:pPr>
+      <w:r>
+        <w:rPr>
+          <w:rFonts w:cs="Book Antiqua"/>
+          <w:b/>
+          <w:i w:val="false"/>
+        </w:rPr>
+        <w:t>Key output.</w:t>
+      </w:r>
+      <w:r>
+        <w:rPr>
+          <w:rFonts w:cs="Book Antiqua"/>
+          <w:b w:val="false"/>
+          <w:i w:val="false"/>
+        </w:rPr>
+        <w:t xml:space="preserve"> Draft Framework v1.0, comprising the capability pillars, developmental outcomes, product architecture and assurance criteria.</w:t>
       </w:r>
     </w:p>
     <w:p>
@@ -2094,7 +2202,43 @@
           <w:b w:val="false"/>
           <w:i w:val="false"/>
         </w:rPr>
-        <w:t>Refine the framework with key stakeholders: convene ACS, NZALC, HPC, APS, ILD, selected training providers and units to refine the framework, product architecture, governance model, implementation priorities, definition clarity and doctrinal coherence. Where time and unit availability permit, bounded pilots will be conducted within this phase or earlier alongside Phase 2 or Phase 3.</w:t>
+        <w:t>Refine the framework with key stakeholders.</w:t>
+      </w:r>
+    </w:p>
+    <w:p>
+      <w:pPr>
+        <w:pStyle w:val="Normal"/>
+        <w:rPr/>
+      </w:pPr>
+      <w:r>
+        <w:rPr>
+          <w:rFonts w:cs="Book Antiqua"/>
+          <w:b w:val="false"/>
+          <w:i w:val="false"/>
+        </w:rPr>
+        <w:t>Convene ACS, NZALC, HPC, APS, ILD, selected training providers and units to test the framework, product architecture, governance model, implementation priorities, definition clarity and doctrinal coherence. Where time and unit availability permit, bounded pilots will be conducted within this phase or earlier alongside Phase 2 or Phase 3.</w:t>
+      </w:r>
+    </w:p>
+    <w:p>
+      <w:pPr>
+        <w:pStyle w:val="Normal"/>
+        <w:rPr/>
+      </w:pPr>
+      <w:r>
+        <w:rPr>
+          <w:rFonts w:cs="Book Antiqua"/>
+          <w:b/>
+          <w:i w:val="false"/>
+        </w:rPr>
+        <w:t>Key output.</w:t>
+      </w:r>
+      <w:r>
+        <w:rPr>
+          <w:rFonts w:cs="Book Antiqua"/>
+          <w:b w:val="false"/>
+          <w:i w:val="false"/>
+        </w:rPr>
+        <w:t xml:space="preserve"> A validated framework and product architecture, with stakeholder positions recorded.</w:t>
       </w:r>
     </w:p>
     <w:p>
@@ -2124,7 +2268,43 @@
           <w:b w:val="false"/>
           <w:i w:val="false"/>
         </w:rPr>
-        <w:t>Deliver the framework for approval and implementation: present the endorsed definitions and the confirmed relationship between Combat Mindset and Performance Under Pressure; Framework v1.0 and its agreed architecture; the validated capability and product architecture; the proposed governance and assurance model; an assessment of existing product maturity, evidence and scalability; and a prioritised implementation plan.</w:t>
+        <w:t>Deliver the framework for approval and implementation.</w:t>
+      </w:r>
+    </w:p>
+    <w:p>
+      <w:pPr>
+        <w:pStyle w:val="Normal"/>
+        <w:rPr/>
+      </w:pPr>
+      <w:r>
+        <w:rPr>
+          <w:rFonts w:cs="Book Antiqua"/>
+          <w:b w:val="false"/>
+          <w:i w:val="false"/>
+        </w:rPr>
+        <w:t>Present to COMDT ACS the endorsed definitions and the confirmed relationship between Combat Mindset and Performance Under Pressure; Framework v1.0 and its agreed architecture; the validated capability and product architecture; the proposed governance and assurance model; an assessment of existing product maturity, evidence and scalability; and a prioritised implementation plan.</w:t>
+      </w:r>
+    </w:p>
+    <w:p>
+      <w:pPr>
+        <w:pStyle w:val="Normal"/>
+        <w:rPr/>
+      </w:pPr>
+      <w:r>
+        <w:rPr>
+          <w:rFonts w:cs="Book Antiqua"/>
+          <w:b/>
+          <w:i w:val="false"/>
+        </w:rPr>
+        <w:t>Key output.</w:t>
+      </w:r>
+      <w:r>
+        <w:rPr>
+          <w:rFonts w:cs="Book Antiqua"/>
+          <w:b w:val="false"/>
+          <w:i w:val="false"/>
+        </w:rPr>
+        <w:t xml:space="preserve"> Framework v1.0 submitted for approval, with an implementation plan and back brief to COMDT ACS.</w:t>
       </w:r>
     </w:p>
     <w:p>
@@ -2502,7 +2682,7 @@
         </w:pBdr>
         <w:rPr/>
       </w:pPr>
-      <w:bookmarkStart w:id="6" w:name="__RefHeading___Toc400_1179594044"/>
+      <w:bookmarkStart w:id="6" w:name="__RefHeading___Toc415_3067098715"/>
       <w:bookmarkEnd w:id="6"/>
       <w:r>
         <w:rPr>
@@ -2802,7 +2982,7 @@
         </w:pBdr>
         <w:rPr/>
       </w:pPr>
-      <w:bookmarkStart w:id="7" w:name="__RefHeading___Toc402_1179594044"/>
+      <w:bookmarkStart w:id="7" w:name="__RefHeading___Toc417_3067098715"/>
       <w:bookmarkEnd w:id="7"/>
       <w:r>
         <w:rPr>
@@ -3104,7 +3284,7 @@
         <w:spacing w:before="0" w:after="160"/>
         <w:rPr/>
       </w:pPr>
-      <w:bookmarkStart w:id="8" w:name="__RefHeading___Toc404_1179594044"/>
+      <w:bookmarkStart w:id="8" w:name="__RefHeading___Toc419_3067098715"/>
       <w:bookmarkEnd w:id="8"/>
       <w:r>
         <w:rPr>
@@ -3261,7 +3441,7 @@
         </w:pBdr>
         <w:rPr/>
       </w:pPr>
-      <w:bookmarkStart w:id="9" w:name="__RefHeading___Toc406_1179594044"/>
+      <w:bookmarkStart w:id="9" w:name="__RefHeading___Toc421_3067098715"/>
       <w:bookmarkEnd w:id="9"/>
       <w:r>
         <w:rPr>

</xml_diff>

<commit_message>
Trim the programme of work to its essentials
Removes the baselines and phase-leads lead-in, so the section opens on
the schedule. Timeframes now depend on external stakeholder availability
and input, with the unit and training establishment clause dropped. Phase
headings carry name and timing only. Phase 1's key output covers the
definitions and interim governance, since the problem statement is
endorsed by this paper. Phase 2's assessment dimensions consolidate from
eight bullets to five, Phase 3 is halved, and the framework development
principles subsection is removed.

Co-Authored-By: Claude Fable 5 <noreply@anthropic.com>
Claude-Session: https://claude.ai/code/session_01YLo1WfwUDkbwfJEF3ZNVbB
</commit_message>
<xml_diff>
--- a/output/combat-mindset-way-forward.docx
+++ b/output/combat-mindset-way-forward.docx
@@ -304,7 +304,7 @@
             </w:rPr>
             <w:fldChar w:fldCharType="separate"/>
           </w:r>
-          <w:hyperlink w:anchor="__RefHeading___Toc403_3067098715">
+          <w:hyperlink w:anchor="__RefHeading___Toc363_3535704424">
             <w:r>
               <w:rPr>
                 <w:webHidden/>
@@ -331,7 +331,7 @@
             </w:tabs>
             <w:rPr/>
           </w:pPr>
-          <w:hyperlink w:anchor="__RefHeading___Toc405_3067098715">
+          <w:hyperlink w:anchor="__RefHeading___Toc365_3535704424">
             <w:r>
               <w:rPr>
                 <w:webHidden/>
@@ -358,7 +358,7 @@
             </w:tabs>
             <w:rPr/>
           </w:pPr>
-          <w:hyperlink w:anchor="__RefHeading___Toc407_3067098715">
+          <w:hyperlink w:anchor="__RefHeading___Toc367_3535704424">
             <w:r>
               <w:rPr>
                 <w:webHidden/>
@@ -385,7 +385,7 @@
             </w:tabs>
             <w:rPr/>
           </w:pPr>
-          <w:hyperlink w:anchor="__RefHeading___Toc409_3067098715">
+          <w:hyperlink w:anchor="__RefHeading___Toc369_3535704424">
             <w:r>
               <w:rPr>
                 <w:webHidden/>
@@ -412,7 +412,7 @@
             </w:tabs>
             <w:rPr/>
           </w:pPr>
-          <w:hyperlink w:anchor="__RefHeading___Toc411_3067098715">
+          <w:hyperlink w:anchor="__RefHeading___Toc371_3535704424">
             <w:r>
               <w:rPr>
                 <w:webHidden/>
@@ -439,7 +439,7 @@
             </w:tabs>
             <w:rPr/>
           </w:pPr>
-          <w:hyperlink w:anchor="__RefHeading___Toc413_3067098715">
+          <w:hyperlink w:anchor="__RefHeading___Toc373_3535704424">
             <w:r>
               <w:rPr>
                 <w:webHidden/>
@@ -466,7 +466,7 @@
             </w:tabs>
             <w:rPr/>
           </w:pPr>
-          <w:hyperlink w:anchor="__RefHeading___Toc415_3067098715">
+          <w:hyperlink w:anchor="__RefHeading___Toc375_3535704424">
             <w:r>
               <w:rPr>
                 <w:webHidden/>
@@ -474,6 +474,33 @@
                 <w:i w:val="false"/>
               </w:rPr>
               <w:t>5. Governance</w:t>
+            </w:r>
+            <w:r>
+              <w:rPr>
+                <w:rStyle w:val="IndexLink"/>
+              </w:rPr>
+              <w:tab/>
+              <w:t>8</w:t>
+            </w:r>
+          </w:hyperlink>
+        </w:p>
+        <w:p>
+          <w:pPr>
+            <w:pStyle w:val="TOC1"/>
+            <w:tabs>
+              <w:tab w:val="clear" w:pos="9072"/>
+              <w:tab w:val="right" w:pos="9071" w:leader="dot"/>
+            </w:tabs>
+            <w:rPr/>
+          </w:pPr>
+          <w:hyperlink w:anchor="__RefHeading___Toc377_3535704424">
+            <w:r>
+              <w:rPr>
+                <w:webHidden/>
+                <w:rStyle w:val="IndexLink"/>
+                <w:i w:val="false"/>
+              </w:rPr>
+              <w:t>6. Recommendations</w:t>
             </w:r>
             <w:r>
               <w:rPr>
@@ -493,34 +520,7 @@
             </w:tabs>
             <w:rPr/>
           </w:pPr>
-          <w:hyperlink w:anchor="__RefHeading___Toc417_3067098715">
-            <w:r>
-              <w:rPr>
-                <w:webHidden/>
-                <w:rStyle w:val="IndexLink"/>
-                <w:i w:val="false"/>
-              </w:rPr>
-              <w:t>6. Recommendations</w:t>
-            </w:r>
-            <w:r>
-              <w:rPr>
-                <w:rStyle w:val="IndexLink"/>
-              </w:rPr>
-              <w:tab/>
-              <w:t>10</w:t>
-            </w:r>
-          </w:hyperlink>
-        </w:p>
-        <w:p>
-          <w:pPr>
-            <w:pStyle w:val="TOC1"/>
-            <w:tabs>
-              <w:tab w:val="clear" w:pos="9072"/>
-              <w:tab w:val="right" w:pos="9071" w:leader="dot"/>
-            </w:tabs>
-            <w:rPr/>
-          </w:pPr>
-          <w:hyperlink w:anchor="__RefHeading___Toc419_3067098715">
+          <w:hyperlink w:anchor="__RefHeading___Toc379_3535704424">
             <w:r>
               <w:rPr>
                 <w:webHidden/>
@@ -547,7 +547,7 @@
             </w:tabs>
             <w:rPr/>
           </w:pPr>
-          <w:hyperlink w:anchor="__RefHeading___Toc421_3067098715">
+          <w:hyperlink w:anchor="__RefHeading___Toc381_3535704424">
             <w:r>
               <w:rPr>
                 <w:webHidden/>
@@ -602,7 +602,7 @@
         <w:spacing w:before="0" w:after="160"/>
         <w:rPr/>
       </w:pPr>
-      <w:bookmarkStart w:id="0" w:name="__RefHeading___Toc403_3067098715"/>
+      <w:bookmarkStart w:id="0" w:name="__RefHeading___Toc363_3535704424"/>
       <w:bookmarkEnd w:id="0"/>
       <w:r>
         <w:rPr>
@@ -684,7 +684,7 @@
         </w:pBdr>
         <w:rPr/>
       </w:pPr>
-      <w:bookmarkStart w:id="1" w:name="__RefHeading___Toc405_3067098715"/>
+      <w:bookmarkStart w:id="1" w:name="__RefHeading___Toc365_3535704424"/>
       <w:bookmarkEnd w:id="1"/>
       <w:r>
         <w:rPr>
@@ -760,7 +760,7 @@
         </w:pBdr>
         <w:rPr/>
       </w:pPr>
-      <w:bookmarkStart w:id="2" w:name="__RefHeading___Toc407_3067098715"/>
+      <w:bookmarkStart w:id="2" w:name="__RefHeading___Toc367_3535704424"/>
       <w:bookmarkEnd w:id="2"/>
       <w:r>
         <w:rPr>
@@ -868,7 +868,7 @@
         </w:pBdr>
         <w:rPr/>
       </w:pPr>
-      <w:bookmarkStart w:id="3" w:name="__RefHeading___Toc409_3067098715"/>
+      <w:bookmarkStart w:id="3" w:name="__RefHeading___Toc369_3535704424"/>
       <w:bookmarkEnd w:id="3"/>
       <w:r>
         <w:rPr>
@@ -1422,7 +1422,7 @@
         </w:pBdr>
         <w:rPr/>
       </w:pPr>
-      <w:bookmarkStart w:id="4" w:name="__RefHeading___Toc411_3067098715"/>
+      <w:bookmarkStart w:id="4" w:name="__RefHeading___Toc371_3535704424"/>
       <w:bookmarkEnd w:id="4"/>
       <w:r>
         <w:rPr>
@@ -1606,7 +1606,7 @@
         </w:pBdr>
         <w:rPr/>
       </w:pPr>
-      <w:bookmarkStart w:id="5" w:name="__RefHeading___Toc413_3067098715"/>
+      <w:bookmarkStart w:id="5" w:name="__RefHeading___Toc373_3535704424"/>
       <w:bookmarkEnd w:id="5"/>
       <w:r>
         <w:rPr>
@@ -1630,21 +1630,7 @@
           <w:b w:val="false"/>
           <w:i w:val="false"/>
         </w:rPr>
-        <w:t>The programme will be conducted within existing ACS, NZALC and HPC baselines; no new resource is sought before the November 2026 report. Proposed phase leads are shown against each phase and are subject to confirmation.</w:t>
-      </w:r>
-    </w:p>
-    <w:p>
-      <w:pPr>
-        <w:pStyle w:val="Normal"/>
-        <w:rPr/>
-      </w:pPr>
-      <w:r>
-        <w:rPr>
-          <w:rFonts w:cs="Book Antiqua"/>
-          <w:b w:val="false"/>
-          <w:i w:val="false"/>
-        </w:rPr>
-        <w:t>August 2026 is set aside for this paper to be socialised through the chain of command, and the programme is therefore proposed to commence in September 2026. The timeframes below are aspirational. They depend on stakeholder availability and on unit and training establishment programmes, and activity extending into early 2027 is anticipated rather than unforeseen.</w:t>
+        <w:t>August 2026 is set aside for this paper to be socialised through the chain of command, and the programme is therefore proposed to commence in September 2026. The timeframes below are aspirational and depend to varying extents on external stakeholder availability and input. As such, activity extending into early 2027 is anticipated rather than unforeseen.</w:t>
       </w:r>
     </w:p>
     <w:p>
@@ -1660,7 +1646,7 @@
           <w:color w:val="000000"/>
           <w:sz w:val="22"/>
         </w:rPr>
-        <w:t>Phase 1: Define (September 2026) (ACS) [proposed – confirm]</w:t>
+        <w:t>Phase 1: Define (September 2026)</w:t>
       </w:r>
     </w:p>
     <w:p>
@@ -1710,7 +1696,7 @@
           <w:b w:val="false"/>
           <w:i w:val="false"/>
         </w:rPr>
-        <w:t xml:space="preserve"> Endorsed problem statement and definitions, and confirmed interim governance.</w:t>
+        <w:t xml:space="preserve"> Endorsed definitions and confirmed interim governance.</w:t>
       </w:r>
     </w:p>
     <w:p>
@@ -1726,7 +1712,7 @@
           <w:color w:val="000000"/>
           <w:sz w:val="22"/>
         </w:rPr>
-        <w:t>Phase 2: Understand (September 2026) (NZALC lead, HPC support) [proposed – confirm]</w:t>
+        <w:t>Phase 2: Understand (September 2026)</w:t>
       </w:r>
     </w:p>
     <w:p>
@@ -1826,7 +1812,7 @@
           <w:b w:val="false"/>
           <w:i w:val="false"/>
         </w:rPr>
-        <w:t>capability outcomes;</w:t>
+        <w:t>capability outcomes, training products and methods;</w:t>
       </w:r>
     </w:p>
     <w:p>
@@ -1862,7 +1848,7 @@
           <w:b w:val="false"/>
           <w:i w:val="false"/>
         </w:rPr>
-        <w:t>training products and methods;</w:t>
+        <w:t>delivery organisations and their technical and professional authorities;</w:t>
       </w:r>
     </w:p>
     <w:p>
@@ -1898,7 +1884,7 @@
           <w:b w:val="false"/>
           <w:i w:val="false"/>
         </w:rPr>
-        <w:t>delivery organisations;</w:t>
+        <w:t>evidence maturity, scalability and resource requirements; and</w:t>
       </w:r>
     </w:p>
     <w:p>
@@ -1934,7 +1920,303 @@
           <w:b w:val="false"/>
           <w:i w:val="false"/>
         </w:rPr>
-        <w:t>technical and professional authorities;</w:t>
+        <w:t>gaps, duplication and integration opportunities.</w:t>
+      </w:r>
+    </w:p>
+    <w:p>
+      <w:pPr>
+        <w:pStyle w:val="Normal"/>
+        <w:rPr/>
+      </w:pPr>
+      <w:r>
+        <w:rPr>
+          <w:rFonts w:cs="Book Antiqua"/>
+          <w:b w:val="false"/>
+          <w:i w:val="false"/>
+        </w:rPr>
+        <w:t>Apply the combat-specificity test at paragraph 2 to distinguish products that contribute to the broader Performance Under Pressure capability from those that support its combat-specific expression. Assess COGCON as one developmental product within this assessment, with particular attention to its product boundary, evidence base (including its completed feasibility trials in live military training), ownership, workforce requirements and scalability.</w:t>
+      </w:r>
+    </w:p>
+    <w:p>
+      <w:pPr>
+        <w:pStyle w:val="Normal"/>
+        <w:rPr/>
+      </w:pPr>
+      <w:r>
+        <w:rPr>
+          <w:rFonts w:cs="Book Antiqua"/>
+          <w:b/>
+          <w:i w:val="false"/>
+        </w:rPr>
+        <w:t>Key output.</w:t>
+      </w:r>
+      <w:r>
+        <w:rPr>
+          <w:rFonts w:cs="Book Antiqua"/>
+          <w:b w:val="false"/>
+          <w:i w:val="false"/>
+        </w:rPr>
+        <w:t xml:space="preserve"> A capability and product baseline identifying holdings, gaps, duplication and integration opportunities.</w:t>
+      </w:r>
+    </w:p>
+    <w:p>
+      <w:pPr>
+        <w:pStyle w:val="Heading2"/>
+        <w:rPr/>
+      </w:pPr>
+      <w:r>
+        <w:rPr>
+          <w:rFonts w:cs="Arial" w:ascii="Arial" w:hAnsi="Arial"/>
+          <w:b/>
+          <w:i w:val="false"/>
+          <w:color w:val="000000"/>
+          <w:sz w:val="22"/>
+        </w:rPr>
+        <w:t>Phase 3: Design (October 2026)</w:t>
+      </w:r>
+    </w:p>
+    <w:p>
+      <w:pPr>
+        <w:pStyle w:val="Normal"/>
+        <w:rPr/>
+      </w:pPr>
+      <w:r>
+        <w:rPr>
+          <w:rFonts w:cs="Book Antiqua"/>
+          <w:b w:val="false"/>
+          <w:i w:val="false"/>
+        </w:rPr>
+        <w:t>Develop the Combat Mindset Framework, delivery system and outcomes.</w:t>
+      </w:r>
+    </w:p>
+    <w:p>
+      <w:pPr>
+        <w:pStyle w:val="Normal"/>
+        <w:rPr/>
+      </w:pPr>
+      <w:r>
+        <w:rPr>
+          <w:rFonts w:cs="Book Antiqua"/>
+          <w:b w:val="false"/>
+          <w:i w:val="false"/>
+        </w:rPr>
+        <w:t>Draft the organising system through which Army will govern, develop, deliver and assure Performance Under Pressure and its combat-specific expression, covering the capability pillars, developmental outcomes from Lead Self through Lead Systems, common assurance principles, and the criteria by which products are recognised as contributing to the framework.</w:t>
+      </w:r>
+    </w:p>
+    <w:p>
+      <w:pPr>
+        <w:pStyle w:val="Normal"/>
+        <w:rPr/>
+      </w:pPr>
+      <w:r>
+        <w:rPr>
+          <w:rFonts w:cs="Book Antiqua"/>
+          <w:b w:val="false"/>
+          <w:i w:val="false"/>
+        </w:rPr>
+        <w:t>The provisional working pillars are: leadership under pressure; self-regulation and mental skills; performance cognition; resilience, adaptation and recovery; physical readiness and performance; professional identity, values and will to act; and team and collective performance. Existing products, including the NZALC Leadership Development System and COGCON, will be mapped beneath the relevant pillars rather than treated as the framework itself.</w:t>
+      </w:r>
+    </w:p>
+    <w:p>
+      <w:pPr>
+        <w:pStyle w:val="Normal"/>
+        <w:rPr/>
+      </w:pPr>
+      <w:r>
+        <w:rPr>
+          <w:rFonts w:cs="Book Antiqua"/>
+          <w:b/>
+          <w:i w:val="false"/>
+        </w:rPr>
+        <w:t>Key output.</w:t>
+      </w:r>
+      <w:r>
+        <w:rPr>
+          <w:rFonts w:cs="Book Antiqua"/>
+          <w:b w:val="false"/>
+          <w:i w:val="false"/>
+        </w:rPr>
+        <w:t xml:space="preserve"> Draft Framework v1.0, comprising the capability pillars, developmental outcomes, product architecture and assurance criteria.</w:t>
+      </w:r>
+    </w:p>
+    <w:p>
+      <w:pPr>
+        <w:pStyle w:val="Heading2"/>
+        <w:rPr/>
+      </w:pPr>
+      <w:r>
+        <w:rPr>
+          <w:rFonts w:cs="Arial" w:ascii="Arial" w:hAnsi="Arial"/>
+          <w:b/>
+          <w:i w:val="false"/>
+          <w:color w:val="000000"/>
+          <w:sz w:val="22"/>
+        </w:rPr>
+        <w:t>Phase 4: Validate (November 2026)</w:t>
+      </w:r>
+    </w:p>
+    <w:p>
+      <w:pPr>
+        <w:pStyle w:val="Normal"/>
+        <w:rPr/>
+      </w:pPr>
+      <w:r>
+        <w:rPr>
+          <w:rFonts w:cs="Book Antiqua"/>
+          <w:b w:val="false"/>
+          <w:i w:val="false"/>
+        </w:rPr>
+        <w:t>Refine the framework with key stakeholders.</w:t>
+      </w:r>
+    </w:p>
+    <w:p>
+      <w:pPr>
+        <w:pStyle w:val="Normal"/>
+        <w:rPr/>
+      </w:pPr>
+      <w:r>
+        <w:rPr>
+          <w:rFonts w:cs="Book Antiqua"/>
+          <w:b w:val="false"/>
+          <w:i w:val="false"/>
+        </w:rPr>
+        <w:t>Convene ACS, NZALC, HPC, APS, ILD, selected training providers and units to test the framework, product architecture, governance model, implementation priorities, definition clarity and doctrinal coherence. Where time and unit availability permit, bounded pilots will be conducted within this phase or earlier alongside Phase 2 or Phase 3.</w:t>
+      </w:r>
+    </w:p>
+    <w:p>
+      <w:pPr>
+        <w:pStyle w:val="Normal"/>
+        <w:rPr/>
+      </w:pPr>
+      <w:r>
+        <w:rPr>
+          <w:rFonts w:cs="Book Antiqua"/>
+          <w:b/>
+          <w:i w:val="false"/>
+        </w:rPr>
+        <w:t>Key output.</w:t>
+      </w:r>
+      <w:r>
+        <w:rPr>
+          <w:rFonts w:cs="Book Antiqua"/>
+          <w:b w:val="false"/>
+          <w:i w:val="false"/>
+        </w:rPr>
+        <w:t xml:space="preserve"> A validated framework and product architecture, with stakeholder positions recorded.</w:t>
+      </w:r>
+    </w:p>
+    <w:p>
+      <w:pPr>
+        <w:pStyle w:val="Heading2"/>
+        <w:rPr/>
+      </w:pPr>
+      <w:r>
+        <w:rPr>
+          <w:rFonts w:cs="Arial" w:ascii="Arial" w:hAnsi="Arial"/>
+          <w:b/>
+          <w:i w:val="false"/>
+          <w:color w:val="000000"/>
+          <w:sz w:val="22"/>
+        </w:rPr>
+        <w:t>Phase 5: Implement (late November 2026)</w:t>
+      </w:r>
+    </w:p>
+    <w:p>
+      <w:pPr>
+        <w:pStyle w:val="Normal"/>
+        <w:rPr/>
+      </w:pPr>
+      <w:r>
+        <w:rPr>
+          <w:rFonts w:cs="Book Antiqua"/>
+          <w:b w:val="false"/>
+          <w:i w:val="false"/>
+        </w:rPr>
+        <w:t>Deliver the framework for approval and implementation.</w:t>
+      </w:r>
+    </w:p>
+    <w:p>
+      <w:pPr>
+        <w:pStyle w:val="Normal"/>
+        <w:rPr/>
+      </w:pPr>
+      <w:r>
+        <w:rPr>
+          <w:rFonts w:cs="Book Antiqua"/>
+          <w:b w:val="false"/>
+          <w:i w:val="false"/>
+        </w:rPr>
+        <w:t>Present to COMDT ACS the endorsed definitions and the confirmed relationship between Combat Mindset and Performance Under Pressure; Framework v1.0 and its agreed architecture; the validated capability and product architecture; the proposed governance and assurance model; an assessment of existing product maturity, evidence and scalability; and a prioritised implementation plan.</w:t>
+      </w:r>
+    </w:p>
+    <w:p>
+      <w:pPr>
+        <w:pStyle w:val="Normal"/>
+        <w:rPr/>
+      </w:pPr>
+      <w:r>
+        <w:rPr>
+          <w:rFonts w:cs="Book Antiqua"/>
+          <w:b/>
+          <w:i w:val="false"/>
+        </w:rPr>
+        <w:t>Key output.</w:t>
+      </w:r>
+      <w:r>
+        <w:rPr>
+          <w:rFonts w:cs="Book Antiqua"/>
+          <w:b w:val="false"/>
+          <w:i w:val="false"/>
+        </w:rPr>
+        <w:t xml:space="preserve"> Framework v1.0 submitted for approval, with an implementation plan and back brief to COMDT ACS.</w:t>
+      </w:r>
+    </w:p>
+    <w:p>
+      <w:pPr>
+        <w:pStyle w:val="Normal"/>
+        <w:pBdr>
+          <w:bottom w:val="single" w:sz="6" w:space="1" w:color="A89662"/>
+        </w:pBdr>
+        <w:spacing w:before="200" w:after="200"/>
+        <w:rPr/>
+      </w:pPr>
+      <w:r>
+        <w:rPr/>
+      </w:r>
+    </w:p>
+    <w:p>
+      <w:pPr>
+        <w:pStyle w:val="Heading1"/>
+        <w:pBdr>
+          <w:left w:val="single" w:sz="24" w:space="8" w:color="C62026"/>
+        </w:pBdr>
+        <w:rPr/>
+      </w:pPr>
+      <w:bookmarkStart w:id="6" w:name="__RefHeading___Toc375_3535704424"/>
+      <w:bookmarkEnd w:id="6"/>
+      <w:r>
+        <w:rPr>
+          <w:rFonts w:cs="Arial" w:ascii="Arial" w:hAnsi="Arial"/>
+          <w:b/>
+          <w:i w:val="false"/>
+          <w:color w:val="002516"/>
+          <w:sz w:val="28"/>
+        </w:rPr>
+        <w:t>5. Governance</w:t>
+      </w:r>
+    </w:p>
+    <w:p>
+      <w:pPr>
+        <w:pStyle w:val="Normal"/>
+        <w:rPr/>
+      </w:pPr>
+      <w:r>
+        <w:rPr>
+          <w:rFonts w:cs="Book Antiqua"/>
+          <w:b w:val="false"/>
+          <w:i w:val="false"/>
+        </w:rPr>
+        <w:t>The following arrangements are proposed for confirmation at Phase 1. Technical and professional authority is distributed by domain; no single organisation owns the evidence base for the entire capability.</w:t>
       </w:r>
     </w:p>
     <w:p>
@@ -1970,7 +2252,7 @@
           <w:b w:val="false"/>
           <w:i w:val="false"/>
         </w:rPr>
-        <w:t>evidence maturity;</w:t>
+        <w:t>Army Sponsor: strategic sponsor for Combat Mindset, the enabling Performance Under Pressure capability and the Combat Mindset Framework; to be confirmed at Phase 1, with candidate options identified by ACS.</w:t>
       </w:r>
     </w:p>
     <w:p>
@@ -2006,7 +2288,7 @@
           <w:b w:val="false"/>
           <w:i w:val="false"/>
         </w:rPr>
-        <w:t>scalability and resource requirements; and</w:t>
+        <w:t>Interim capability integrator: COMDT ACS, coordinating definition, framework development, stakeholder engagement and recommendations to the Army Sponsor.</w:t>
       </w:r>
     </w:p>
     <w:p>
@@ -2042,299 +2324,7 @@
           <w:b w:val="false"/>
           <w:i w:val="false"/>
         </w:rPr>
-        <w:t>gaps, duplication and integration opportunities.</w:t>
-      </w:r>
-    </w:p>
-    <w:p>
-      <w:pPr>
-        <w:pStyle w:val="Normal"/>
-        <w:rPr/>
-      </w:pPr>
-      <w:r>
-        <w:rPr>
-          <w:rFonts w:cs="Book Antiqua"/>
-          <w:b w:val="false"/>
-          <w:i w:val="false"/>
-        </w:rPr>
-        <w:t>Apply the combat-specificity test at paragraph 2 to distinguish products that contribute to the broader Performance Under Pressure capability from those that support its combat-specific expression. Assess COGCON as one developmental product within this assessment, with particular attention to its product boundary, evidence base (including its completed feasibility trials in live military training), ownership, workforce requirements and scalability.</w:t>
-      </w:r>
-    </w:p>
-    <w:p>
-      <w:pPr>
-        <w:pStyle w:val="Normal"/>
-        <w:rPr/>
-      </w:pPr>
-      <w:r>
-        <w:rPr>
-          <w:rFonts w:cs="Book Antiqua"/>
-          <w:b/>
-          <w:i w:val="false"/>
-        </w:rPr>
-        <w:t>Key output.</w:t>
-      </w:r>
-      <w:r>
-        <w:rPr>
-          <w:rFonts w:cs="Book Antiqua"/>
-          <w:b w:val="false"/>
-          <w:i w:val="false"/>
-        </w:rPr>
-        <w:t xml:space="preserve"> A capability and product baseline identifying holdings, gaps, duplication and integration opportunities.</w:t>
-      </w:r>
-    </w:p>
-    <w:p>
-      <w:pPr>
-        <w:pStyle w:val="Heading2"/>
-        <w:rPr/>
-      </w:pPr>
-      <w:r>
-        <w:rPr>
-          <w:rFonts w:cs="Arial" w:ascii="Arial" w:hAnsi="Arial"/>
-          <w:b/>
-          <w:i w:val="false"/>
-          <w:color w:val="000000"/>
-          <w:sz w:val="22"/>
-        </w:rPr>
-        <w:t>Phase 3: Design (October 2026) (NZALC/HPC joint) [proposed – confirm]</w:t>
-      </w:r>
-    </w:p>
-    <w:p>
-      <w:pPr>
-        <w:pStyle w:val="Normal"/>
-        <w:rPr/>
-      </w:pPr>
-      <w:r>
-        <w:rPr>
-          <w:rFonts w:cs="Book Antiqua"/>
-          <w:b w:val="false"/>
-          <w:i w:val="false"/>
-        </w:rPr>
-        <w:t>Develop the Combat Mindset Framework, delivery system and outcomes.</w:t>
-      </w:r>
-    </w:p>
-    <w:p>
-      <w:pPr>
-        <w:pStyle w:val="Normal"/>
-        <w:rPr/>
-      </w:pPr>
-      <w:r>
-        <w:rPr>
-          <w:rFonts w:cs="Book Antiqua"/>
-          <w:b w:val="false"/>
-          <w:i w:val="false"/>
-        </w:rPr>
-        <w:t>Draft the organising system through which Army will govern, develop, deliver and assure Performance Under Pressure and its combat-specific expression. The framework will set out the endorsed definitions and desired operational effect; the capability pillars, refined through the Phase 2 assessment; developmental outcomes from Lead Self through Lead Systems; the relationship between doctrine, framework, products and delivery; common assurance principles; and the criteria by which existing and future products may be recognised as contributing to the framework.</w:t>
-      </w:r>
-    </w:p>
-    <w:p>
-      <w:pPr>
-        <w:pStyle w:val="Normal"/>
-        <w:rPr/>
-      </w:pPr>
-      <w:r>
-        <w:rPr>
-          <w:rFonts w:cs="Book Antiqua"/>
-          <w:b w:val="false"/>
-          <w:i w:val="false"/>
-        </w:rPr>
-        <w:t>The provisional working pillars are: leadership under pressure; self-regulation and mental skills; performance cognition; resilience, adaptation and recovery; physical readiness and performance; professional identity, values and will to act; and team and collective performance. Each describes an enduring capability Army seeks to build, and each is subject to validation through the Phase 2 assessment and Phase 4 validation. Training products and methods, including progressive exposure to pressure, scenario and experiential training, field and mission-relevant rehearsal, and physical and cognitive conditioning, are how Army builds them.</w:t>
-      </w:r>
-    </w:p>
-    <w:p>
-      <w:pPr>
-        <w:pStyle w:val="Normal"/>
-        <w:rPr/>
-      </w:pPr>
-      <w:r>
-        <w:rPr>
-          <w:rFonts w:cs="Book Antiqua"/>
-          <w:b w:val="false"/>
-          <w:i w:val="false"/>
-        </w:rPr>
-        <w:t>Existing products, including the NZALC Leadership Development System and COGCON, will be mapped beneath the relevant pillars rather than treated as the framework itself.</w:t>
-      </w:r>
-    </w:p>
-    <w:p>
-      <w:pPr>
-        <w:pStyle w:val="Normal"/>
-        <w:rPr/>
-      </w:pPr>
-      <w:r>
-        <w:rPr>
-          <w:rFonts w:cs="Book Antiqua"/>
-          <w:b/>
-          <w:i w:val="false"/>
-        </w:rPr>
-        <w:t>Key output.</w:t>
-      </w:r>
-      <w:r>
-        <w:rPr>
-          <w:rFonts w:cs="Book Antiqua"/>
-          <w:b w:val="false"/>
-          <w:i w:val="false"/>
-        </w:rPr>
-        <w:t xml:space="preserve"> Draft Framework v1.0, comprising the capability pillars, developmental outcomes, product architecture and assurance criteria.</w:t>
-      </w:r>
-    </w:p>
-    <w:p>
-      <w:pPr>
-        <w:pStyle w:val="Heading2"/>
-        <w:rPr/>
-      </w:pPr>
-      <w:r>
-        <w:rPr>
-          <w:rFonts w:cs="Arial" w:ascii="Arial" w:hAnsi="Arial"/>
-          <w:b/>
-          <w:i w:val="false"/>
-          <w:color w:val="000000"/>
-          <w:sz w:val="22"/>
-        </w:rPr>
-        <w:t>Phase 4: Validate (November 2026) (ACS convenes) [proposed – confirm]</w:t>
-      </w:r>
-    </w:p>
-    <w:p>
-      <w:pPr>
-        <w:pStyle w:val="Normal"/>
-        <w:rPr/>
-      </w:pPr>
-      <w:r>
-        <w:rPr>
-          <w:rFonts w:cs="Book Antiqua"/>
-          <w:b w:val="false"/>
-          <w:i w:val="false"/>
-        </w:rPr>
-        <w:t>Refine the framework with key stakeholders.</w:t>
-      </w:r>
-    </w:p>
-    <w:p>
-      <w:pPr>
-        <w:pStyle w:val="Normal"/>
-        <w:rPr/>
-      </w:pPr>
-      <w:r>
-        <w:rPr>
-          <w:rFonts w:cs="Book Antiqua"/>
-          <w:b w:val="false"/>
-          <w:i w:val="false"/>
-        </w:rPr>
-        <w:t>Convene ACS, NZALC, HPC, APS, ILD, selected training providers and units to test the framework, product architecture, governance model, implementation priorities, definition clarity and doctrinal coherence. Where time and unit availability permit, bounded pilots will be conducted within this phase or earlier alongside Phase 2 or Phase 3.</w:t>
-      </w:r>
-    </w:p>
-    <w:p>
-      <w:pPr>
-        <w:pStyle w:val="Normal"/>
-        <w:rPr/>
-      </w:pPr>
-      <w:r>
-        <w:rPr>
-          <w:rFonts w:cs="Book Antiqua"/>
-          <w:b/>
-          <w:i w:val="false"/>
-        </w:rPr>
-        <w:t>Key output.</w:t>
-      </w:r>
-      <w:r>
-        <w:rPr>
-          <w:rFonts w:cs="Book Antiqua"/>
-          <w:b w:val="false"/>
-          <w:i w:val="false"/>
-        </w:rPr>
-        <w:t xml:space="preserve"> A validated framework and product architecture, with stakeholder positions recorded.</w:t>
-      </w:r>
-    </w:p>
-    <w:p>
-      <w:pPr>
-        <w:pStyle w:val="Heading2"/>
-        <w:rPr/>
-      </w:pPr>
-      <w:r>
-        <w:rPr>
-          <w:rFonts w:cs="Arial" w:ascii="Arial" w:hAnsi="Arial"/>
-          <w:b/>
-          <w:i w:val="false"/>
-          <w:color w:val="000000"/>
-          <w:sz w:val="22"/>
-        </w:rPr>
-        <w:t>Phase 5: Implement (late November 2026) (ACS) [proposed – confirm]</w:t>
-      </w:r>
-    </w:p>
-    <w:p>
-      <w:pPr>
-        <w:pStyle w:val="Normal"/>
-        <w:rPr/>
-      </w:pPr>
-      <w:r>
-        <w:rPr>
-          <w:rFonts w:cs="Book Antiqua"/>
-          <w:b w:val="false"/>
-          <w:i w:val="false"/>
-        </w:rPr>
-        <w:t>Deliver the framework for approval and implementation.</w:t>
-      </w:r>
-    </w:p>
-    <w:p>
-      <w:pPr>
-        <w:pStyle w:val="Normal"/>
-        <w:rPr/>
-      </w:pPr>
-      <w:r>
-        <w:rPr>
-          <w:rFonts w:cs="Book Antiqua"/>
-          <w:b w:val="false"/>
-          <w:i w:val="false"/>
-        </w:rPr>
-        <w:t>Present to COMDT ACS the endorsed definitions and the confirmed relationship between Combat Mindset and Performance Under Pressure; Framework v1.0 and its agreed architecture; the validated capability and product architecture; the proposed governance and assurance model; an assessment of existing product maturity, evidence and scalability; and a prioritised implementation plan.</w:t>
-      </w:r>
-    </w:p>
-    <w:p>
-      <w:pPr>
-        <w:pStyle w:val="Normal"/>
-        <w:rPr/>
-      </w:pPr>
-      <w:r>
-        <w:rPr>
-          <w:rFonts w:cs="Book Antiqua"/>
-          <w:b/>
-          <w:i w:val="false"/>
-        </w:rPr>
-        <w:t>Key output.</w:t>
-      </w:r>
-      <w:r>
-        <w:rPr>
-          <w:rFonts w:cs="Book Antiqua"/>
-          <w:b w:val="false"/>
-          <w:i w:val="false"/>
-        </w:rPr>
-        <w:t xml:space="preserve"> Framework v1.0 submitted for approval, with an implementation plan and back brief to COMDT ACS.</w:t>
-      </w:r>
-    </w:p>
-    <w:p>
-      <w:pPr>
-        <w:pStyle w:val="Heading2"/>
-        <w:rPr/>
-      </w:pPr>
-      <w:r>
-        <w:rPr>
-          <w:rFonts w:cs="Arial" w:ascii="Arial" w:hAnsi="Arial"/>
-          <w:b/>
-          <w:i w:val="false"/>
-          <w:color w:val="000000"/>
-          <w:sz w:val="22"/>
-        </w:rPr>
-        <w:t>Framework development principles</w:t>
-      </w:r>
-    </w:p>
-    <w:p>
-      <w:pPr>
-        <w:pStyle w:val="Normal"/>
-        <w:rPr/>
-      </w:pPr>
-      <w:r>
-        <w:rPr>
-          <w:rFonts w:cs="Book Antiqua"/>
-          <w:b w:val="false"/>
-          <w:i w:val="false"/>
-        </w:rPr>
-        <w:t>Framework development will be guided by the following principles:</w:t>
+        <w:t>Framework development and capability-integration lead: ACS, coordinating framework architecture, developmental progression, stakeholder integration, product recognition criteria and implementation planning, leveraging NZALC and wider ACS expertise, intellectual property and programmes.</w:t>
       </w:r>
     </w:p>
     <w:p>
@@ -2370,7 +2360,7 @@
           <w:b w:val="false"/>
           <w:i w:val="false"/>
         </w:rPr>
-        <w:t>Consolidate and align existing capability before creating new content.</w:t>
+        <w:t>COGCON product steward and performance-cognition adviser: Human Performance Cell, responsible for the integrity and further development of the COGCON method and for specialist advice on cognitive conditioning and proportionate measurement, within available capacity.</w:t>
       </w:r>
     </w:p>
     <w:p>
@@ -2406,7 +2396,7 @@
           <w:b w:val="false"/>
           <w:i w:val="false"/>
         </w:rPr>
-        <w:t>Use clear, common and Army-relevant language.</w:t>
+        <w:t>Domain advisers and authorities: APS, ILD, physical-performance specialists, doctrine staff and other relevant organisations, providing technical or professional advice within their respective domains.</w:t>
       </w:r>
     </w:p>
     <w:p>
@@ -2442,7 +2432,7 @@
           <w:b w:val="false"/>
           <w:i w:val="false"/>
         </w:rPr>
-        <w:t>Distinguish capability outcomes from training products and methods.</w:t>
+        <w:t>Delivery agencies: training establishments, units and existing instructor workforces approved to deliver recognised products.</w:t>
       </w:r>
     </w:p>
     <w:p>
@@ -2478,187 +2468,7 @@
           <w:b w:val="false"/>
           <w:i w:val="false"/>
         </w:rPr>
-        <w:t>Remain evidence-informed and proportionate to the maturity of each product.</w:t>
-      </w:r>
-    </w:p>
-    <w:p>
-      <w:pPr>
-        <w:pStyle w:val="Normal"/>
-        <w:tabs>
-          <w:tab w:val="clear" w:pos="720"/>
-          <w:tab w:val="left" w:pos="425" w:leader="none"/>
-        </w:tabs>
-        <w:spacing w:before="0" w:after="60"/>
-        <w:ind w:hanging="255" w:left="425"/>
-        <w:rPr/>
-      </w:pPr>
-      <w:r>
-        <w:rPr>
-          <w:rFonts w:cs="Arial" w:ascii="Arial" w:hAnsi="Arial"/>
-          <w:b/>
-          <w:color w:val="C62026"/>
-        </w:rPr>
-        <w:t>•</w:t>
-      </w:r>
-      <w:r>
-        <w:rPr>
-          <w:rFonts w:cs="Arial" w:ascii="Arial" w:hAnsi="Arial"/>
-          <w:b/>
-          <w:color w:val="C62026"/>
-        </w:rPr>
-        <w:tab/>
-      </w:r>
-      <w:r>
-        <w:rPr>
-          <w:rFonts w:cs="Book Antiqua"/>
-          <w:b w:val="false"/>
-          <w:i w:val="false"/>
-        </w:rPr>
-        <w:t>Avoid capture by any single organisation, discipline or product.</w:t>
-      </w:r>
-    </w:p>
-    <w:p>
-      <w:pPr>
-        <w:pStyle w:val="Normal"/>
-        <w:tabs>
-          <w:tab w:val="clear" w:pos="720"/>
-          <w:tab w:val="left" w:pos="425" w:leader="none"/>
-        </w:tabs>
-        <w:spacing w:before="0" w:after="60"/>
-        <w:ind w:hanging="255" w:left="425"/>
-        <w:rPr/>
-      </w:pPr>
-      <w:r>
-        <w:rPr>
-          <w:rFonts w:cs="Arial" w:ascii="Arial" w:hAnsi="Arial"/>
-          <w:b/>
-          <w:color w:val="C62026"/>
-        </w:rPr>
-        <w:t>•</w:t>
-      </w:r>
-      <w:r>
-        <w:rPr>
-          <w:rFonts w:cs="Arial" w:ascii="Arial" w:hAnsi="Arial"/>
-          <w:b/>
-          <w:color w:val="C62026"/>
-        </w:rPr>
-        <w:tab/>
-      </w:r>
-      <w:r>
-        <w:rPr>
-          <w:rFonts w:cs="Book Antiqua"/>
-          <w:b w:val="false"/>
-          <w:i w:val="false"/>
-        </w:rPr>
-        <w:t>Use existing training and leadership systems wherever practicable.</w:t>
-      </w:r>
-    </w:p>
-    <w:p>
-      <w:pPr>
-        <w:pStyle w:val="Normal"/>
-        <w:tabs>
-          <w:tab w:val="clear" w:pos="720"/>
-          <w:tab w:val="left" w:pos="425" w:leader="none"/>
-        </w:tabs>
-        <w:spacing w:before="0" w:after="60"/>
-        <w:ind w:hanging="255" w:left="425"/>
-        <w:rPr/>
-      </w:pPr>
-      <w:r>
-        <w:rPr>
-          <w:rFonts w:cs="Arial" w:ascii="Arial" w:hAnsi="Arial"/>
-          <w:b/>
-          <w:color w:val="C62026"/>
-        </w:rPr>
-        <w:t>•</w:t>
-      </w:r>
-      <w:r>
-        <w:rPr>
-          <w:rFonts w:cs="Arial" w:ascii="Arial" w:hAnsi="Arial"/>
-          <w:b/>
-          <w:color w:val="C62026"/>
-        </w:rPr>
-        <w:tab/>
-      </w:r>
-      <w:r>
-        <w:rPr>
-          <w:rFonts w:cs="Book Antiqua"/>
-          <w:b w:val="false"/>
-          <w:i w:val="false"/>
-        </w:rPr>
-        <w:t>Develop from Lead Self through Lead Systems.</w:t>
-      </w:r>
-    </w:p>
-    <w:p>
-      <w:pPr>
-        <w:pStyle w:val="Normal"/>
-        <w:tabs>
-          <w:tab w:val="clear" w:pos="720"/>
-          <w:tab w:val="left" w:pos="425" w:leader="none"/>
-        </w:tabs>
-        <w:spacing w:before="0" w:after="60"/>
-        <w:ind w:hanging="255" w:left="425"/>
-        <w:rPr/>
-      </w:pPr>
-      <w:r>
-        <w:rPr>
-          <w:rFonts w:cs="Arial" w:ascii="Arial" w:hAnsi="Arial"/>
-          <w:b/>
-          <w:color w:val="C62026"/>
-        </w:rPr>
-        <w:t>•</w:t>
-      </w:r>
-      <w:r>
-        <w:rPr>
-          <w:rFonts w:cs="Arial" w:ascii="Arial" w:hAnsi="Arial"/>
-          <w:b/>
-          <w:color w:val="C62026"/>
-        </w:rPr>
-        <w:tab/>
-      </w:r>
-      <w:r>
-        <w:rPr>
-          <w:rFonts w:cs="Book Antiqua"/>
-          <w:b w:val="false"/>
-          <w:i w:val="false"/>
-        </w:rPr>
-        <w:t>Validate operational relevance with training establishments and units.</w:t>
-      </w:r>
-    </w:p>
-    <w:p>
-      <w:pPr>
-        <w:pStyle w:val="Normal"/>
-        <w:tabs>
-          <w:tab w:val="clear" w:pos="720"/>
-          <w:tab w:val="left" w:pos="425" w:leader="none"/>
-        </w:tabs>
-        <w:spacing w:before="0" w:after="60"/>
-        <w:ind w:hanging="255" w:left="425"/>
-        <w:rPr/>
-      </w:pPr>
-      <w:r>
-        <w:rPr>
-          <w:rFonts w:cs="Arial" w:ascii="Arial" w:hAnsi="Arial"/>
-          <w:b/>
-          <w:color w:val="C62026"/>
-        </w:rPr>
-        <w:t>•</w:t>
-      </w:r>
-      <w:r>
-        <w:rPr>
-          <w:rFonts w:cs="Arial" w:ascii="Arial" w:hAnsi="Arial"/>
-          <w:b/>
-          <w:color w:val="C62026"/>
-        </w:rPr>
-        <w:tab/>
-      </w:r>
-      <w:r>
-        <w:rPr>
-          <w:rFonts w:cs="Book Antiqua"/>
-          <w:b w:val="false"/>
-          <w:i w:val="false"/>
-        </w:rPr>
-        <w:t>Design governance and assurance into the framework from the outset.</w:t>
+        <w:t>Assurance: a layered assurance model covering doctrine, evidence, professional content, learning design, delivery quality and operational relevance, with sufficient independence from individual product owners and delivery organisations.</w:t>
       </w:r>
     </w:p>
     <w:p>
@@ -2682,307 +2492,7 @@
         </w:pBdr>
         <w:rPr/>
       </w:pPr>
-      <w:bookmarkStart w:id="6" w:name="__RefHeading___Toc415_3067098715"/>
-      <w:bookmarkEnd w:id="6"/>
-      <w:r>
-        <w:rPr>
-          <w:rFonts w:cs="Arial" w:ascii="Arial" w:hAnsi="Arial"/>
-          <w:b/>
-          <w:i w:val="false"/>
-          <w:color w:val="002516"/>
-          <w:sz w:val="28"/>
-        </w:rPr>
-        <w:t>5. Governance</w:t>
-      </w:r>
-    </w:p>
-    <w:p>
-      <w:pPr>
-        <w:pStyle w:val="Normal"/>
-        <w:rPr/>
-      </w:pPr>
-      <w:r>
-        <w:rPr>
-          <w:rFonts w:cs="Book Antiqua"/>
-          <w:b w:val="false"/>
-          <w:i w:val="false"/>
-        </w:rPr>
-        <w:t>The following arrangements are proposed for confirmation at Phase 1. Technical and professional authority is distributed by domain; no single organisation owns the evidence base for the entire capability.</w:t>
-      </w:r>
-    </w:p>
-    <w:p>
-      <w:pPr>
-        <w:pStyle w:val="Normal"/>
-        <w:tabs>
-          <w:tab w:val="clear" w:pos="720"/>
-          <w:tab w:val="left" w:pos="425" w:leader="none"/>
-        </w:tabs>
-        <w:spacing w:before="0" w:after="60"/>
-        <w:ind w:hanging="255" w:left="425"/>
-        <w:rPr/>
-      </w:pPr>
-      <w:r>
-        <w:rPr>
-          <w:rFonts w:cs="Arial" w:ascii="Arial" w:hAnsi="Arial"/>
-          <w:b/>
-          <w:color w:val="C62026"/>
-        </w:rPr>
-        <w:t>•</w:t>
-      </w:r>
-      <w:r>
-        <w:rPr>
-          <w:rFonts w:cs="Arial" w:ascii="Arial" w:hAnsi="Arial"/>
-          <w:b/>
-          <w:color w:val="C62026"/>
-        </w:rPr>
-        <w:tab/>
-      </w:r>
-      <w:r>
-        <w:rPr>
-          <w:rFonts w:cs="Book Antiqua"/>
-          <w:b w:val="false"/>
-          <w:i w:val="false"/>
-        </w:rPr>
-        <w:t>Army Sponsor: strategic sponsor for Combat Mindset, the enabling Performance Under Pressure capability and the Combat Mindset Framework; to be confirmed at Phase 1, with candidate options identified by ACS.</w:t>
-      </w:r>
-    </w:p>
-    <w:p>
-      <w:pPr>
-        <w:pStyle w:val="Normal"/>
-        <w:tabs>
-          <w:tab w:val="clear" w:pos="720"/>
-          <w:tab w:val="left" w:pos="425" w:leader="none"/>
-        </w:tabs>
-        <w:spacing w:before="0" w:after="60"/>
-        <w:ind w:hanging="255" w:left="425"/>
-        <w:rPr/>
-      </w:pPr>
-      <w:r>
-        <w:rPr>
-          <w:rFonts w:cs="Arial" w:ascii="Arial" w:hAnsi="Arial"/>
-          <w:b/>
-          <w:color w:val="C62026"/>
-        </w:rPr>
-        <w:t>•</w:t>
-      </w:r>
-      <w:r>
-        <w:rPr>
-          <w:rFonts w:cs="Arial" w:ascii="Arial" w:hAnsi="Arial"/>
-          <w:b/>
-          <w:color w:val="C62026"/>
-        </w:rPr>
-        <w:tab/>
-      </w:r>
-      <w:r>
-        <w:rPr>
-          <w:rFonts w:cs="Book Antiqua"/>
-          <w:b w:val="false"/>
-          <w:i w:val="false"/>
-        </w:rPr>
-        <w:t>Interim capability integrator: COMDT ACS, coordinating definition, framework development, stakeholder engagement and recommendations to the Army Sponsor.</w:t>
-      </w:r>
-    </w:p>
-    <w:p>
-      <w:pPr>
-        <w:pStyle w:val="Normal"/>
-        <w:tabs>
-          <w:tab w:val="clear" w:pos="720"/>
-          <w:tab w:val="left" w:pos="425" w:leader="none"/>
-        </w:tabs>
-        <w:spacing w:before="0" w:after="60"/>
-        <w:ind w:hanging="255" w:left="425"/>
-        <w:rPr/>
-      </w:pPr>
-      <w:r>
-        <w:rPr>
-          <w:rFonts w:cs="Arial" w:ascii="Arial" w:hAnsi="Arial"/>
-          <w:b/>
-          <w:color w:val="C62026"/>
-        </w:rPr>
-        <w:t>•</w:t>
-      </w:r>
-      <w:r>
-        <w:rPr>
-          <w:rFonts w:cs="Arial" w:ascii="Arial" w:hAnsi="Arial"/>
-          <w:b/>
-          <w:color w:val="C62026"/>
-        </w:rPr>
-        <w:tab/>
-      </w:r>
-      <w:r>
-        <w:rPr>
-          <w:rFonts w:cs="Book Antiqua"/>
-          <w:b w:val="false"/>
-          <w:i w:val="false"/>
-        </w:rPr>
-        <w:t>Framework development and capability-integration lead: ACS, coordinating framework architecture, developmental progression, stakeholder integration, product recognition criteria and implementation planning, leveraging NZALC and wider ACS expertise, intellectual property and programmes.</w:t>
-      </w:r>
-    </w:p>
-    <w:p>
-      <w:pPr>
-        <w:pStyle w:val="Normal"/>
-        <w:tabs>
-          <w:tab w:val="clear" w:pos="720"/>
-          <w:tab w:val="left" w:pos="425" w:leader="none"/>
-        </w:tabs>
-        <w:spacing w:before="0" w:after="60"/>
-        <w:ind w:hanging="255" w:left="425"/>
-        <w:rPr/>
-      </w:pPr>
-      <w:r>
-        <w:rPr>
-          <w:rFonts w:cs="Arial" w:ascii="Arial" w:hAnsi="Arial"/>
-          <w:b/>
-          <w:color w:val="C62026"/>
-        </w:rPr>
-        <w:t>•</w:t>
-      </w:r>
-      <w:r>
-        <w:rPr>
-          <w:rFonts w:cs="Arial" w:ascii="Arial" w:hAnsi="Arial"/>
-          <w:b/>
-          <w:color w:val="C62026"/>
-        </w:rPr>
-        <w:tab/>
-      </w:r>
-      <w:r>
-        <w:rPr>
-          <w:rFonts w:cs="Book Antiqua"/>
-          <w:b w:val="false"/>
-          <w:i w:val="false"/>
-        </w:rPr>
-        <w:t>COGCON product steward and performance-cognition adviser: Human Performance Cell, responsible for the integrity and further development of the COGCON method and for specialist advice on cognitive conditioning and proportionate measurement, within available capacity.</w:t>
-      </w:r>
-    </w:p>
-    <w:p>
-      <w:pPr>
-        <w:pStyle w:val="Normal"/>
-        <w:tabs>
-          <w:tab w:val="clear" w:pos="720"/>
-          <w:tab w:val="left" w:pos="425" w:leader="none"/>
-        </w:tabs>
-        <w:spacing w:before="0" w:after="60"/>
-        <w:ind w:hanging="255" w:left="425"/>
-        <w:rPr/>
-      </w:pPr>
-      <w:r>
-        <w:rPr>
-          <w:rFonts w:cs="Arial" w:ascii="Arial" w:hAnsi="Arial"/>
-          <w:b/>
-          <w:color w:val="C62026"/>
-        </w:rPr>
-        <w:t>•</w:t>
-      </w:r>
-      <w:r>
-        <w:rPr>
-          <w:rFonts w:cs="Arial" w:ascii="Arial" w:hAnsi="Arial"/>
-          <w:b/>
-          <w:color w:val="C62026"/>
-        </w:rPr>
-        <w:tab/>
-      </w:r>
-      <w:r>
-        <w:rPr>
-          <w:rFonts w:cs="Book Antiqua"/>
-          <w:b w:val="false"/>
-          <w:i w:val="false"/>
-        </w:rPr>
-        <w:t>Domain advisers and authorities: APS, ILD, physical-performance specialists, doctrine staff and other relevant organisations, providing technical or professional advice within their respective domains.</w:t>
-      </w:r>
-    </w:p>
-    <w:p>
-      <w:pPr>
-        <w:pStyle w:val="Normal"/>
-        <w:tabs>
-          <w:tab w:val="clear" w:pos="720"/>
-          <w:tab w:val="left" w:pos="425" w:leader="none"/>
-        </w:tabs>
-        <w:spacing w:before="0" w:after="60"/>
-        <w:ind w:hanging="255" w:left="425"/>
-        <w:rPr/>
-      </w:pPr>
-      <w:r>
-        <w:rPr>
-          <w:rFonts w:cs="Arial" w:ascii="Arial" w:hAnsi="Arial"/>
-          <w:b/>
-          <w:color w:val="C62026"/>
-        </w:rPr>
-        <w:t>•</w:t>
-      </w:r>
-      <w:r>
-        <w:rPr>
-          <w:rFonts w:cs="Arial" w:ascii="Arial" w:hAnsi="Arial"/>
-          <w:b/>
-          <w:color w:val="C62026"/>
-        </w:rPr>
-        <w:tab/>
-      </w:r>
-      <w:r>
-        <w:rPr>
-          <w:rFonts w:cs="Book Antiqua"/>
-          <w:b w:val="false"/>
-          <w:i w:val="false"/>
-        </w:rPr>
-        <w:t>Delivery agencies: training establishments, units and existing instructor workforces approved to deliver recognised products.</w:t>
-      </w:r>
-    </w:p>
-    <w:p>
-      <w:pPr>
-        <w:pStyle w:val="Normal"/>
-        <w:tabs>
-          <w:tab w:val="clear" w:pos="720"/>
-          <w:tab w:val="left" w:pos="425" w:leader="none"/>
-        </w:tabs>
-        <w:spacing w:before="0" w:after="60"/>
-        <w:ind w:hanging="255" w:left="425"/>
-        <w:rPr/>
-      </w:pPr>
-      <w:r>
-        <w:rPr>
-          <w:rFonts w:cs="Arial" w:ascii="Arial" w:hAnsi="Arial"/>
-          <w:b/>
-          <w:color w:val="C62026"/>
-        </w:rPr>
-        <w:t>•</w:t>
-      </w:r>
-      <w:r>
-        <w:rPr>
-          <w:rFonts w:cs="Arial" w:ascii="Arial" w:hAnsi="Arial"/>
-          <w:b/>
-          <w:color w:val="C62026"/>
-        </w:rPr>
-        <w:tab/>
-      </w:r>
-      <w:r>
-        <w:rPr>
-          <w:rFonts w:cs="Book Antiqua"/>
-          <w:b w:val="false"/>
-          <w:i w:val="false"/>
-        </w:rPr>
-        <w:t>Assurance: a layered assurance model covering doctrine, evidence, professional content, learning design, delivery quality and operational relevance, with sufficient independence from individual product owners and delivery organisations.</w:t>
-      </w:r>
-    </w:p>
-    <w:p>
-      <w:pPr>
-        <w:pStyle w:val="Normal"/>
-        <w:pBdr>
-          <w:bottom w:val="single" w:sz="6" w:space="1" w:color="A89662"/>
-        </w:pBdr>
-        <w:spacing w:before="200" w:after="200"/>
-        <w:rPr/>
-      </w:pPr>
-      <w:r>
-        <w:rPr/>
-      </w:r>
-    </w:p>
-    <w:p>
-      <w:pPr>
-        <w:pStyle w:val="Heading1"/>
-        <w:pBdr>
-          <w:left w:val="single" w:sz="24" w:space="8" w:color="C62026"/>
-        </w:pBdr>
-        <w:rPr/>
-      </w:pPr>
-      <w:bookmarkStart w:id="7" w:name="__RefHeading___Toc417_3067098715"/>
+      <w:bookmarkStart w:id="7" w:name="__RefHeading___Toc377_3535704424"/>
       <w:bookmarkEnd w:id="7"/>
       <w:r>
         <w:rPr>
@@ -3284,7 +2794,7 @@
         <w:spacing w:before="0" w:after="160"/>
         <w:rPr/>
       </w:pPr>
-      <w:bookmarkStart w:id="8" w:name="__RefHeading___Toc419_3067098715"/>
+      <w:bookmarkStart w:id="8" w:name="__RefHeading___Toc379_3535704424"/>
       <w:bookmarkEnd w:id="8"/>
       <w:r>
         <w:rPr>
@@ -3441,7 +2951,7 @@
         </w:pBdr>
         <w:rPr/>
       </w:pPr>
-      <w:bookmarkStart w:id="9" w:name="__RefHeading___Toc421_3067098715"/>
+      <w:bookmarkStart w:id="9" w:name="__RefHeading___Toc381_3535704424"/>
       <w:bookmarkEnd w:id="9"/>
       <w:r>
         <w:rPr>

</xml_diff>

<commit_message>
Remove the governance section and restate the first four recommendations
Governance is defined by Phase 1, so the standalone section is removed
and Recommendations becomes section 5. The first four recommendations are
now single, unambiguous asks: endorse the problem statement; approve the
recommended relationship; endorse the initial working definitions; and
approve commencement of the programme of work. The previous interim
governance recommendation goes with the section it referenced.

Co-Authored-By: Claude Fable 5 <noreply@anthropic.com>
Claude-Session: https://claude.ai/code/session_01YLo1WfwUDkbwfJEF3ZNVbB
</commit_message>
<xml_diff>
--- a/output/combat-mindset-way-forward.docx
+++ b/output/combat-mindset-way-forward.docx
@@ -304,7 +304,7 @@
             </w:rPr>
             <w:fldChar w:fldCharType="separate"/>
           </w:r>
-          <w:hyperlink w:anchor="__RefHeading___Toc363_3535704424">
+          <w:hyperlink w:anchor="__RefHeading___Toc340_2828093440">
             <w:r>
               <w:rPr>
                 <w:webHidden/>
@@ -331,7 +331,7 @@
             </w:tabs>
             <w:rPr/>
           </w:pPr>
-          <w:hyperlink w:anchor="__RefHeading___Toc365_3535704424">
+          <w:hyperlink w:anchor="__RefHeading___Toc342_2828093440">
             <w:r>
               <w:rPr>
                 <w:webHidden/>
@@ -358,7 +358,7 @@
             </w:tabs>
             <w:rPr/>
           </w:pPr>
-          <w:hyperlink w:anchor="__RefHeading___Toc367_3535704424">
+          <w:hyperlink w:anchor="__RefHeading___Toc344_2828093440">
             <w:r>
               <w:rPr>
                 <w:webHidden/>
@@ -385,7 +385,7 @@
             </w:tabs>
             <w:rPr/>
           </w:pPr>
-          <w:hyperlink w:anchor="__RefHeading___Toc369_3535704424">
+          <w:hyperlink w:anchor="__RefHeading___Toc346_2828093440">
             <w:r>
               <w:rPr>
                 <w:webHidden/>
@@ -412,7 +412,7 @@
             </w:tabs>
             <w:rPr/>
           </w:pPr>
-          <w:hyperlink w:anchor="__RefHeading___Toc371_3535704424">
+          <w:hyperlink w:anchor="__RefHeading___Toc348_2828093440">
             <w:r>
               <w:rPr>
                 <w:webHidden/>
@@ -439,7 +439,7 @@
             </w:tabs>
             <w:rPr/>
           </w:pPr>
-          <w:hyperlink w:anchor="__RefHeading___Toc373_3535704424">
+          <w:hyperlink w:anchor="__RefHeading___Toc350_2828093440">
             <w:r>
               <w:rPr>
                 <w:webHidden/>
@@ -466,14 +466,14 @@
             </w:tabs>
             <w:rPr/>
           </w:pPr>
-          <w:hyperlink w:anchor="__RefHeading___Toc375_3535704424">
+          <w:hyperlink w:anchor="__RefHeading___Toc352_2828093440">
             <w:r>
               <w:rPr>
                 <w:webHidden/>
                 <w:rStyle w:val="IndexLink"/>
                 <w:i w:val="false"/>
               </w:rPr>
-              <w:t>5. Governance</w:t>
+              <w:t>5. Recommendations</w:t>
             </w:r>
             <w:r>
               <w:rPr>
@@ -493,34 +493,7 @@
             </w:tabs>
             <w:rPr/>
           </w:pPr>
-          <w:hyperlink w:anchor="__RefHeading___Toc377_3535704424">
-            <w:r>
-              <w:rPr>
-                <w:webHidden/>
-                <w:rStyle w:val="IndexLink"/>
-                <w:i w:val="false"/>
-              </w:rPr>
-              <w:t>6. Recommendations</w:t>
-            </w:r>
-            <w:r>
-              <w:rPr>
-                <w:rStyle w:val="IndexLink"/>
-              </w:rPr>
-              <w:tab/>
-              <w:t>9</w:t>
-            </w:r>
-          </w:hyperlink>
-        </w:p>
-        <w:p>
-          <w:pPr>
-            <w:pStyle w:val="TOC1"/>
-            <w:tabs>
-              <w:tab w:val="clear" w:pos="9072"/>
-              <w:tab w:val="right" w:pos="9071" w:leader="dot"/>
-            </w:tabs>
-            <w:rPr/>
-          </w:pPr>
-          <w:hyperlink w:anchor="__RefHeading___Toc379_3535704424">
+          <w:hyperlink w:anchor="__RefHeading___Toc354_2828093440">
             <w:r>
               <w:rPr>
                 <w:webHidden/>
@@ -534,7 +507,7 @@
                 <w:rStyle w:val="IndexLink"/>
               </w:rPr>
               <w:tab/>
-              <w:t>11</w:t>
+              <w:t>10</w:t>
             </w:r>
           </w:hyperlink>
         </w:p>
@@ -547,7 +520,7 @@
             </w:tabs>
             <w:rPr/>
           </w:pPr>
-          <w:hyperlink w:anchor="__RefHeading___Toc381_3535704424">
+          <w:hyperlink w:anchor="__RefHeading___Toc356_2828093440">
             <w:r>
               <w:rPr>
                 <w:webHidden/>
@@ -561,7 +534,7 @@
                 <w:rStyle w:val="IndexLink"/>
               </w:rPr>
               <w:tab/>
-              <w:t>11</w:t>
+              <w:t>10</w:t>
             </w:r>
           </w:hyperlink>
           <w:r>
@@ -602,7 +575,7 @@
         <w:spacing w:before="0" w:after="160"/>
         <w:rPr/>
       </w:pPr>
-      <w:bookmarkStart w:id="0" w:name="__RefHeading___Toc363_3535704424"/>
+      <w:bookmarkStart w:id="0" w:name="__RefHeading___Toc340_2828093440"/>
       <w:bookmarkEnd w:id="0"/>
       <w:r>
         <w:rPr>
@@ -684,7 +657,7 @@
         </w:pBdr>
         <w:rPr/>
       </w:pPr>
-      <w:bookmarkStart w:id="1" w:name="__RefHeading___Toc365_3535704424"/>
+      <w:bookmarkStart w:id="1" w:name="__RefHeading___Toc342_2828093440"/>
       <w:bookmarkEnd w:id="1"/>
       <w:r>
         <w:rPr>
@@ -760,7 +733,7 @@
         </w:pBdr>
         <w:rPr/>
       </w:pPr>
-      <w:bookmarkStart w:id="2" w:name="__RefHeading___Toc367_3535704424"/>
+      <w:bookmarkStart w:id="2" w:name="__RefHeading___Toc344_2828093440"/>
       <w:bookmarkEnd w:id="2"/>
       <w:r>
         <w:rPr>
@@ -868,7 +841,7 @@
         </w:pBdr>
         <w:rPr/>
       </w:pPr>
-      <w:bookmarkStart w:id="3" w:name="__RefHeading___Toc369_3535704424"/>
+      <w:bookmarkStart w:id="3" w:name="__RefHeading___Toc346_2828093440"/>
       <w:bookmarkEnd w:id="3"/>
       <w:r>
         <w:rPr>
@@ -1422,7 +1395,7 @@
         </w:pBdr>
         <w:rPr/>
       </w:pPr>
-      <w:bookmarkStart w:id="4" w:name="__RefHeading___Toc371_3535704424"/>
+      <w:bookmarkStart w:id="4" w:name="__RefHeading___Toc348_2828093440"/>
       <w:bookmarkEnd w:id="4"/>
       <w:r>
         <w:rPr>
@@ -1606,7 +1579,7 @@
         </w:pBdr>
         <w:rPr/>
       </w:pPr>
-      <w:bookmarkStart w:id="5" w:name="__RefHeading___Toc373_3535704424"/>
+      <w:bookmarkStart w:id="5" w:name="__RefHeading___Toc350_2828093440"/>
       <w:bookmarkEnd w:id="5"/>
       <w:r>
         <w:rPr>
@@ -2192,7 +2165,7 @@
         </w:pBdr>
         <w:rPr/>
       </w:pPr>
-      <w:bookmarkStart w:id="6" w:name="__RefHeading___Toc375_3535704424"/>
+      <w:bookmarkStart w:id="6" w:name="__RefHeading___Toc352_2828093440"/>
       <w:bookmarkEnd w:id="6"/>
       <w:r>
         <w:rPr>
@@ -2202,307 +2175,7 @@
           <w:color w:val="002516"/>
           <w:sz w:val="28"/>
         </w:rPr>
-        <w:t>5. Governance</w:t>
-      </w:r>
-    </w:p>
-    <w:p>
-      <w:pPr>
-        <w:pStyle w:val="Normal"/>
-        <w:rPr/>
-      </w:pPr>
-      <w:r>
-        <w:rPr>
-          <w:rFonts w:cs="Book Antiqua"/>
-          <w:b w:val="false"/>
-          <w:i w:val="false"/>
-        </w:rPr>
-        <w:t>The following arrangements are proposed for confirmation at Phase 1. Technical and professional authority is distributed by domain; no single organisation owns the evidence base for the entire capability.</w:t>
-      </w:r>
-    </w:p>
-    <w:p>
-      <w:pPr>
-        <w:pStyle w:val="Normal"/>
-        <w:tabs>
-          <w:tab w:val="clear" w:pos="720"/>
-          <w:tab w:val="left" w:pos="425" w:leader="none"/>
-        </w:tabs>
-        <w:spacing w:before="0" w:after="60"/>
-        <w:ind w:hanging="255" w:left="425"/>
-        <w:rPr/>
-      </w:pPr>
-      <w:r>
-        <w:rPr>
-          <w:rFonts w:cs="Arial" w:ascii="Arial" w:hAnsi="Arial"/>
-          <w:b/>
-          <w:color w:val="C62026"/>
-        </w:rPr>
-        <w:t>•</w:t>
-      </w:r>
-      <w:r>
-        <w:rPr>
-          <w:rFonts w:cs="Arial" w:ascii="Arial" w:hAnsi="Arial"/>
-          <w:b/>
-          <w:color w:val="C62026"/>
-        </w:rPr>
-        <w:tab/>
-      </w:r>
-      <w:r>
-        <w:rPr>
-          <w:rFonts w:cs="Book Antiqua"/>
-          <w:b w:val="false"/>
-          <w:i w:val="false"/>
-        </w:rPr>
-        <w:t>Army Sponsor: strategic sponsor for Combat Mindset, the enabling Performance Under Pressure capability and the Combat Mindset Framework; to be confirmed at Phase 1, with candidate options identified by ACS.</w:t>
-      </w:r>
-    </w:p>
-    <w:p>
-      <w:pPr>
-        <w:pStyle w:val="Normal"/>
-        <w:tabs>
-          <w:tab w:val="clear" w:pos="720"/>
-          <w:tab w:val="left" w:pos="425" w:leader="none"/>
-        </w:tabs>
-        <w:spacing w:before="0" w:after="60"/>
-        <w:ind w:hanging="255" w:left="425"/>
-        <w:rPr/>
-      </w:pPr>
-      <w:r>
-        <w:rPr>
-          <w:rFonts w:cs="Arial" w:ascii="Arial" w:hAnsi="Arial"/>
-          <w:b/>
-          <w:color w:val="C62026"/>
-        </w:rPr>
-        <w:t>•</w:t>
-      </w:r>
-      <w:r>
-        <w:rPr>
-          <w:rFonts w:cs="Arial" w:ascii="Arial" w:hAnsi="Arial"/>
-          <w:b/>
-          <w:color w:val="C62026"/>
-        </w:rPr>
-        <w:tab/>
-      </w:r>
-      <w:r>
-        <w:rPr>
-          <w:rFonts w:cs="Book Antiqua"/>
-          <w:b w:val="false"/>
-          <w:i w:val="false"/>
-        </w:rPr>
-        <w:t>Interim capability integrator: COMDT ACS, coordinating definition, framework development, stakeholder engagement and recommendations to the Army Sponsor.</w:t>
-      </w:r>
-    </w:p>
-    <w:p>
-      <w:pPr>
-        <w:pStyle w:val="Normal"/>
-        <w:tabs>
-          <w:tab w:val="clear" w:pos="720"/>
-          <w:tab w:val="left" w:pos="425" w:leader="none"/>
-        </w:tabs>
-        <w:spacing w:before="0" w:after="60"/>
-        <w:ind w:hanging="255" w:left="425"/>
-        <w:rPr/>
-      </w:pPr>
-      <w:r>
-        <w:rPr>
-          <w:rFonts w:cs="Arial" w:ascii="Arial" w:hAnsi="Arial"/>
-          <w:b/>
-          <w:color w:val="C62026"/>
-        </w:rPr>
-        <w:t>•</w:t>
-      </w:r>
-      <w:r>
-        <w:rPr>
-          <w:rFonts w:cs="Arial" w:ascii="Arial" w:hAnsi="Arial"/>
-          <w:b/>
-          <w:color w:val="C62026"/>
-        </w:rPr>
-        <w:tab/>
-      </w:r>
-      <w:r>
-        <w:rPr>
-          <w:rFonts w:cs="Book Antiqua"/>
-          <w:b w:val="false"/>
-          <w:i w:val="false"/>
-        </w:rPr>
-        <w:t>Framework development and capability-integration lead: ACS, coordinating framework architecture, developmental progression, stakeholder integration, product recognition criteria and implementation planning, leveraging NZALC and wider ACS expertise, intellectual property and programmes.</w:t>
-      </w:r>
-    </w:p>
-    <w:p>
-      <w:pPr>
-        <w:pStyle w:val="Normal"/>
-        <w:tabs>
-          <w:tab w:val="clear" w:pos="720"/>
-          <w:tab w:val="left" w:pos="425" w:leader="none"/>
-        </w:tabs>
-        <w:spacing w:before="0" w:after="60"/>
-        <w:ind w:hanging="255" w:left="425"/>
-        <w:rPr/>
-      </w:pPr>
-      <w:r>
-        <w:rPr>
-          <w:rFonts w:cs="Arial" w:ascii="Arial" w:hAnsi="Arial"/>
-          <w:b/>
-          <w:color w:val="C62026"/>
-        </w:rPr>
-        <w:t>•</w:t>
-      </w:r>
-      <w:r>
-        <w:rPr>
-          <w:rFonts w:cs="Arial" w:ascii="Arial" w:hAnsi="Arial"/>
-          <w:b/>
-          <w:color w:val="C62026"/>
-        </w:rPr>
-        <w:tab/>
-      </w:r>
-      <w:r>
-        <w:rPr>
-          <w:rFonts w:cs="Book Antiqua"/>
-          <w:b w:val="false"/>
-          <w:i w:val="false"/>
-        </w:rPr>
-        <w:t>COGCON product steward and performance-cognition adviser: Human Performance Cell, responsible for the integrity and further development of the COGCON method and for specialist advice on cognitive conditioning and proportionate measurement, within available capacity.</w:t>
-      </w:r>
-    </w:p>
-    <w:p>
-      <w:pPr>
-        <w:pStyle w:val="Normal"/>
-        <w:tabs>
-          <w:tab w:val="clear" w:pos="720"/>
-          <w:tab w:val="left" w:pos="425" w:leader="none"/>
-        </w:tabs>
-        <w:spacing w:before="0" w:after="60"/>
-        <w:ind w:hanging="255" w:left="425"/>
-        <w:rPr/>
-      </w:pPr>
-      <w:r>
-        <w:rPr>
-          <w:rFonts w:cs="Arial" w:ascii="Arial" w:hAnsi="Arial"/>
-          <w:b/>
-          <w:color w:val="C62026"/>
-        </w:rPr>
-        <w:t>•</w:t>
-      </w:r>
-      <w:r>
-        <w:rPr>
-          <w:rFonts w:cs="Arial" w:ascii="Arial" w:hAnsi="Arial"/>
-          <w:b/>
-          <w:color w:val="C62026"/>
-        </w:rPr>
-        <w:tab/>
-      </w:r>
-      <w:r>
-        <w:rPr>
-          <w:rFonts w:cs="Book Antiqua"/>
-          <w:b w:val="false"/>
-          <w:i w:val="false"/>
-        </w:rPr>
-        <w:t>Domain advisers and authorities: APS, ILD, physical-performance specialists, doctrine staff and other relevant organisations, providing technical or professional advice within their respective domains.</w:t>
-      </w:r>
-    </w:p>
-    <w:p>
-      <w:pPr>
-        <w:pStyle w:val="Normal"/>
-        <w:tabs>
-          <w:tab w:val="clear" w:pos="720"/>
-          <w:tab w:val="left" w:pos="425" w:leader="none"/>
-        </w:tabs>
-        <w:spacing w:before="0" w:after="60"/>
-        <w:ind w:hanging="255" w:left="425"/>
-        <w:rPr/>
-      </w:pPr>
-      <w:r>
-        <w:rPr>
-          <w:rFonts w:cs="Arial" w:ascii="Arial" w:hAnsi="Arial"/>
-          <w:b/>
-          <w:color w:val="C62026"/>
-        </w:rPr>
-        <w:t>•</w:t>
-      </w:r>
-      <w:r>
-        <w:rPr>
-          <w:rFonts w:cs="Arial" w:ascii="Arial" w:hAnsi="Arial"/>
-          <w:b/>
-          <w:color w:val="C62026"/>
-        </w:rPr>
-        <w:tab/>
-      </w:r>
-      <w:r>
-        <w:rPr>
-          <w:rFonts w:cs="Book Antiqua"/>
-          <w:b w:val="false"/>
-          <w:i w:val="false"/>
-        </w:rPr>
-        <w:t>Delivery agencies: training establishments, units and existing instructor workforces approved to deliver recognised products.</w:t>
-      </w:r>
-    </w:p>
-    <w:p>
-      <w:pPr>
-        <w:pStyle w:val="Normal"/>
-        <w:tabs>
-          <w:tab w:val="clear" w:pos="720"/>
-          <w:tab w:val="left" w:pos="425" w:leader="none"/>
-        </w:tabs>
-        <w:spacing w:before="0" w:after="60"/>
-        <w:ind w:hanging="255" w:left="425"/>
-        <w:rPr/>
-      </w:pPr>
-      <w:r>
-        <w:rPr>
-          <w:rFonts w:cs="Arial" w:ascii="Arial" w:hAnsi="Arial"/>
-          <w:b/>
-          <w:color w:val="C62026"/>
-        </w:rPr>
-        <w:t>•</w:t>
-      </w:r>
-      <w:r>
-        <w:rPr>
-          <w:rFonts w:cs="Arial" w:ascii="Arial" w:hAnsi="Arial"/>
-          <w:b/>
-          <w:color w:val="C62026"/>
-        </w:rPr>
-        <w:tab/>
-      </w:r>
-      <w:r>
-        <w:rPr>
-          <w:rFonts w:cs="Book Antiqua"/>
-          <w:b w:val="false"/>
-          <w:i w:val="false"/>
-        </w:rPr>
-        <w:t>Assurance: a layered assurance model covering doctrine, evidence, professional content, learning design, delivery quality and operational relevance, with sufficient independence from individual product owners and delivery organisations.</w:t>
-      </w:r>
-    </w:p>
-    <w:p>
-      <w:pPr>
-        <w:pStyle w:val="Normal"/>
-        <w:pBdr>
-          <w:bottom w:val="single" w:sz="6" w:space="1" w:color="A89662"/>
-        </w:pBdr>
-        <w:spacing w:before="200" w:after="200"/>
-        <w:rPr/>
-      </w:pPr>
-      <w:r>
-        <w:rPr/>
-      </w:r>
-    </w:p>
-    <w:p>
-      <w:pPr>
-        <w:pStyle w:val="Heading1"/>
-        <w:pBdr>
-          <w:left w:val="single" w:sz="24" w:space="8" w:color="C62026"/>
-        </w:pBdr>
-        <w:rPr/>
-      </w:pPr>
-      <w:bookmarkStart w:id="7" w:name="__RefHeading___Toc377_3535704424"/>
-      <w:bookmarkEnd w:id="7"/>
-      <w:r>
-        <w:rPr>
-          <w:rFonts w:cs="Arial" w:ascii="Arial" w:hAnsi="Arial"/>
-          <w:b/>
-          <w:i w:val="false"/>
-          <w:color w:val="002516"/>
-          <w:sz w:val="28"/>
-        </w:rPr>
-        <w:t>6. Recommendations</w:t>
+        <w:t>5. Recommendations</w:t>
       </w:r>
     </w:p>
     <w:p>
@@ -2552,7 +2225,7 @@
           <w:b w:val="false"/>
           <w:i w:val="false"/>
         </w:rPr>
-        <w:t xml:space="preserve"> the problem statement at paragraph 1 and the recommended relationship between Combat Mindset and Performance Under Pressure at paragraph 2.</w:t>
+        <w:t xml:space="preserve"> the problem statement.</w:t>
       </w:r>
     </w:p>
     <w:p>
@@ -2580,15 +2253,15 @@
           <w:b/>
           <w:i w:val="false"/>
         </w:rPr>
-        <w:t>Endorse</w:t>
-      </w:r>
-      <w:r>
-        <w:rPr>
-          <w:rFonts w:cs="Book Antiqua"/>
-          <w:b w:val="false"/>
-          <w:i w:val="false"/>
-        </w:rPr>
-        <w:t xml:space="preserve"> the proposed definitions of Combat Mindset, Performance Under Pressure and the Combat Mindset Framework as the baseline for wider staffing and refinement.</w:t>
+        <w:t>Approve</w:t>
+      </w:r>
+      <w:r>
+        <w:rPr>
+          <w:rFonts w:cs="Book Antiqua"/>
+          <w:b w:val="false"/>
+          <w:i w:val="false"/>
+        </w:rPr>
+        <w:t xml:space="preserve"> the recommended relationship between Combat Mindset and Performance Under Pressure.</w:t>
       </w:r>
     </w:p>
     <w:p>
@@ -2616,15 +2289,15 @@
           <w:b/>
           <w:i w:val="false"/>
         </w:rPr>
-        <w:t>Approve</w:t>
-      </w:r>
-      <w:r>
-        <w:rPr>
-          <w:rFonts w:cs="Book Antiqua"/>
-          <w:b w:val="false"/>
-          <w:i w:val="false"/>
-        </w:rPr>
-        <w:t xml:space="preserve"> development of the Combat Mindset Framework through the proposed capability and product assessment, framework design and validation activity, noting that the provisional capability pillars and the contribution, maturity, evidence, ownership and appropriate nesting of existing products (including the NZALC Leadership Development System, COGCON and APS products) will be validated through this process.</w:t>
+        <w:t>Endorse</w:t>
+      </w:r>
+      <w:r>
+        <w:rPr>
+          <w:rFonts w:cs="Book Antiqua"/>
+          <w:b w:val="false"/>
+          <w:i w:val="false"/>
+        </w:rPr>
+        <w:t xml:space="preserve"> the initial working definitions of Combat Mindset, Performance Under Pressure and the Combat Mindset Framework.</w:t>
       </w:r>
     </w:p>
     <w:p>
@@ -2652,15 +2325,15 @@
           <w:b/>
           <w:i w:val="false"/>
         </w:rPr>
-        <w:t>Confirm</w:t>
-      </w:r>
-      <w:r>
-        <w:rPr>
-          <w:rFonts w:cs="Book Antiqua"/>
-          <w:b w:val="false"/>
-          <w:i w:val="false"/>
-        </w:rPr>
-        <w:t xml:space="preserve"> the interim governance arrangements at paragraph 5, including COMDT ACS as interim capability integrator pending confirmation of the Army Sponsor, ACS as framework development and capability-integration lead, and technical and professional authority distributed by domain.</w:t>
+        <w:t>Approve</w:t>
+      </w:r>
+      <w:r>
+        <w:rPr>
+          <w:rFonts w:cs="Book Antiqua"/>
+          <w:b w:val="false"/>
+          <w:i w:val="false"/>
+        </w:rPr>
+        <w:t xml:space="preserve"> commencement of the proposed programme of work.</w:t>
       </w:r>
     </w:p>
     <w:p>
@@ -2794,8 +2467,8 @@
         <w:spacing w:before="0" w:after="160"/>
         <w:rPr/>
       </w:pPr>
-      <w:bookmarkStart w:id="8" w:name="__RefHeading___Toc379_3535704424"/>
-      <w:bookmarkEnd w:id="8"/>
+      <w:bookmarkStart w:id="7" w:name="__RefHeading___Toc354_2828093440"/>
+      <w:bookmarkEnd w:id="7"/>
       <w:r>
         <w:rPr>
           <w:rFonts w:cs="Arial" w:ascii="Arial" w:hAnsi="Arial"/>
@@ -2951,8 +2624,8 @@
         </w:pBdr>
         <w:rPr/>
       </w:pPr>
-      <w:bookmarkStart w:id="9" w:name="__RefHeading___Toc381_3535704424"/>
-      <w:bookmarkEnd w:id="9"/>
+      <w:bookmarkStart w:id="8" w:name="__RefHeading___Toc356_2828093440"/>
+      <w:bookmarkEnd w:id="8"/>
       <w:r>
         <w:rPr>
           <w:rFonts w:cs="Arial" w:ascii="Arial" w:hAnsi="Arial"/>
@@ -3950,7 +3623,7 @@
         <w:sz w:val="17"/>
         <w:rFonts w:cs="Arial" w:ascii="Arial" w:hAnsi="Arial"/>
       </w:rPr>
-      <w:t>11</w:t>
+      <w:t>10</w:t>
     </w:r>
     <w:r>
       <w:rPr>
@@ -3994,7 +3667,7 @@
         <w:sz w:val="17"/>
         <w:rFonts w:cs="Arial" w:ascii="Arial" w:hAnsi="Arial"/>
       </w:rPr>
-      <w:t>11</w:t>
+      <w:t>10</w:t>
     </w:r>
     <w:r>
       <w:rPr>
@@ -4126,7 +3799,7 @@
         <w:sz w:val="17"/>
         <w:rFonts w:cs="Arial" w:ascii="Arial" w:hAnsi="Arial"/>
       </w:rPr>
-      <w:t>11</w:t>
+      <w:t>10</w:t>
     </w:r>
     <w:r>
       <w:rPr>
@@ -4288,7 +3961,7 @@
         <w:sz w:val="17"/>
         <w:rFonts w:cs="Arial" w:ascii="Arial" w:hAnsi="Arial"/>
       </w:rPr>
-      <w:t>11</w:t>
+      <w:t>10</w:t>
     </w:r>
     <w:r>
       <w:rPr>
@@ -4390,7 +4063,7 @@
         <w:sz w:val="17"/>
         <w:rFonts w:cs="Arial" w:ascii="Arial" w:hAnsi="Arial"/>
       </w:rPr>
-      <w:t>10</w:t>
+      <w:t>9</w:t>
     </w:r>
     <w:r>
       <w:rPr>
@@ -4434,7 +4107,7 @@
         <w:sz w:val="17"/>
         <w:rFonts w:cs="Arial" w:ascii="Arial" w:hAnsi="Arial"/>
       </w:rPr>
-      <w:t>11</w:t>
+      <w:t>10</w:t>
     </w:r>
     <w:r>
       <w:rPr>

</xml_diff>

<commit_message>
Close the recommendations with a note on the programme timeframes
Removes the Army Sponsor confirmation, tagline decision and November
report-back recommendations. Recommendation 5 now asks COMDT ACS to note
that the timeframes are aspirational and that activity may extend into
early 2027.

Co-Authored-By: Claude Fable 5 <noreply@anthropic.com>
Claude-Session: https://claude.ai/code/session_01YLo1WfwUDkbwfJEF3ZNVbB
</commit_message>
<xml_diff>
--- a/output/combat-mindset-way-forward.docx
+++ b/output/combat-mindset-way-forward.docx
@@ -304,7 +304,7 @@
             </w:rPr>
             <w:fldChar w:fldCharType="separate"/>
           </w:r>
-          <w:hyperlink w:anchor="__RefHeading___Toc340_2828093440">
+          <w:hyperlink w:anchor="__RefHeading___Toc332_2077115726">
             <w:r>
               <w:rPr>
                 <w:webHidden/>
@@ -331,7 +331,7 @@
             </w:tabs>
             <w:rPr/>
           </w:pPr>
-          <w:hyperlink w:anchor="__RefHeading___Toc342_2828093440">
+          <w:hyperlink w:anchor="__RefHeading___Toc334_2077115726">
             <w:r>
               <w:rPr>
                 <w:webHidden/>
@@ -358,7 +358,7 @@
             </w:tabs>
             <w:rPr/>
           </w:pPr>
-          <w:hyperlink w:anchor="__RefHeading___Toc344_2828093440">
+          <w:hyperlink w:anchor="__RefHeading___Toc336_2077115726">
             <w:r>
               <w:rPr>
                 <w:webHidden/>
@@ -385,7 +385,7 @@
             </w:tabs>
             <w:rPr/>
           </w:pPr>
-          <w:hyperlink w:anchor="__RefHeading___Toc346_2828093440">
+          <w:hyperlink w:anchor="__RefHeading___Toc338_2077115726">
             <w:r>
               <w:rPr>
                 <w:webHidden/>
@@ -412,7 +412,7 @@
             </w:tabs>
             <w:rPr/>
           </w:pPr>
-          <w:hyperlink w:anchor="__RefHeading___Toc348_2828093440">
+          <w:hyperlink w:anchor="__RefHeading___Toc340_2077115726">
             <w:r>
               <w:rPr>
                 <w:webHidden/>
@@ -439,7 +439,7 @@
             </w:tabs>
             <w:rPr/>
           </w:pPr>
-          <w:hyperlink w:anchor="__RefHeading___Toc350_2828093440">
+          <w:hyperlink w:anchor="__RefHeading___Toc342_2077115726">
             <w:r>
               <w:rPr>
                 <w:webHidden/>
@@ -466,7 +466,7 @@
             </w:tabs>
             <w:rPr/>
           </w:pPr>
-          <w:hyperlink w:anchor="__RefHeading___Toc352_2828093440">
+          <w:hyperlink w:anchor="__RefHeading___Toc344_2077115726">
             <w:r>
               <w:rPr>
                 <w:webHidden/>
@@ -493,7 +493,7 @@
             </w:tabs>
             <w:rPr/>
           </w:pPr>
-          <w:hyperlink w:anchor="__RefHeading___Toc354_2828093440">
+          <w:hyperlink w:anchor="__RefHeading___Toc346_2077115726">
             <w:r>
               <w:rPr>
                 <w:webHidden/>
@@ -520,7 +520,7 @@
             </w:tabs>
             <w:rPr/>
           </w:pPr>
-          <w:hyperlink w:anchor="__RefHeading___Toc356_2828093440">
+          <w:hyperlink w:anchor="__RefHeading___Toc348_2077115726">
             <w:r>
               <w:rPr>
                 <w:webHidden/>
@@ -575,7 +575,7 @@
         <w:spacing w:before="0" w:after="160"/>
         <w:rPr/>
       </w:pPr>
-      <w:bookmarkStart w:id="0" w:name="__RefHeading___Toc340_2828093440"/>
+      <w:bookmarkStart w:id="0" w:name="__RefHeading___Toc332_2077115726"/>
       <w:bookmarkEnd w:id="0"/>
       <w:r>
         <w:rPr>
@@ -657,7 +657,7 @@
         </w:pBdr>
         <w:rPr/>
       </w:pPr>
-      <w:bookmarkStart w:id="1" w:name="__RefHeading___Toc342_2828093440"/>
+      <w:bookmarkStart w:id="1" w:name="__RefHeading___Toc334_2077115726"/>
       <w:bookmarkEnd w:id="1"/>
       <w:r>
         <w:rPr>
@@ -733,7 +733,7 @@
         </w:pBdr>
         <w:rPr/>
       </w:pPr>
-      <w:bookmarkStart w:id="2" w:name="__RefHeading___Toc344_2828093440"/>
+      <w:bookmarkStart w:id="2" w:name="__RefHeading___Toc336_2077115726"/>
       <w:bookmarkEnd w:id="2"/>
       <w:r>
         <w:rPr>
@@ -841,7 +841,7 @@
         </w:pBdr>
         <w:rPr/>
       </w:pPr>
-      <w:bookmarkStart w:id="3" w:name="__RefHeading___Toc346_2828093440"/>
+      <w:bookmarkStart w:id="3" w:name="__RefHeading___Toc338_2077115726"/>
       <w:bookmarkEnd w:id="3"/>
       <w:r>
         <w:rPr>
@@ -1395,7 +1395,7 @@
         </w:pBdr>
         <w:rPr/>
       </w:pPr>
-      <w:bookmarkStart w:id="4" w:name="__RefHeading___Toc348_2828093440"/>
+      <w:bookmarkStart w:id="4" w:name="__RefHeading___Toc340_2077115726"/>
       <w:bookmarkEnd w:id="4"/>
       <w:r>
         <w:rPr>
@@ -1579,7 +1579,7 @@
         </w:pBdr>
         <w:rPr/>
       </w:pPr>
-      <w:bookmarkStart w:id="5" w:name="__RefHeading___Toc350_2828093440"/>
+      <w:bookmarkStart w:id="5" w:name="__RefHeading___Toc342_2077115726"/>
       <w:bookmarkEnd w:id="5"/>
       <w:r>
         <w:rPr>
@@ -2165,7 +2165,7 @@
         </w:pBdr>
         <w:rPr/>
       </w:pPr>
-      <w:bookmarkStart w:id="6" w:name="__RefHeading___Toc352_2828093440"/>
+      <w:bookmarkStart w:id="6" w:name="__RefHeading___Toc344_2077115726"/>
       <w:bookmarkEnd w:id="6"/>
       <w:r>
         <w:rPr>
@@ -2334,78 +2334,6 @@
           <w:i w:val="false"/>
         </w:rPr>
         <w:t xml:space="preserve"> commencement of the proposed programme of work.</w:t>
-      </w:r>
-    </w:p>
-    <w:p>
-      <w:pPr>
-        <w:pStyle w:val="Normal"/>
-        <w:tabs>
-          <w:tab w:val="clear" w:pos="720"/>
-          <w:tab w:val="left" w:pos="425" w:leader="none"/>
-        </w:tabs>
-        <w:spacing w:before="80" w:after="40"/>
-        <w:ind w:hanging="425" w:left="425"/>
-        <w:rPr/>
-      </w:pPr>
-      <w:r>
-        <w:rPr>
-          <w:rFonts w:cs="Arial" w:ascii="Arial" w:hAnsi="Arial"/>
-          <w:b w:val="false"/>
-        </w:rPr>
-        <w:t>5.</w:t>
-        <w:tab/>
-      </w:r>
-      <w:r>
-        <w:rPr>
-          <w:rFonts w:cs="Book Antiqua"/>
-          <w:b/>
-          <w:i w:val="false"/>
-        </w:rPr>
-        <w:t>Seek</w:t>
-      </w:r>
-      <w:r>
-        <w:rPr>
-          <w:rFonts w:cs="Book Antiqua"/>
-          <w:b w:val="false"/>
-          <w:i w:val="false"/>
-        </w:rPr>
-        <w:t xml:space="preserve"> confirmation of the Army Sponsor by 30 September 2026, with candidate options identified by ACS.</w:t>
-      </w:r>
-    </w:p>
-    <w:p>
-      <w:pPr>
-        <w:pStyle w:val="Normal"/>
-        <w:tabs>
-          <w:tab w:val="clear" w:pos="720"/>
-          <w:tab w:val="left" w:pos="425" w:leader="none"/>
-        </w:tabs>
-        <w:spacing w:before="80" w:after="40"/>
-        <w:ind w:hanging="425" w:left="425"/>
-        <w:rPr/>
-      </w:pPr>
-      <w:r>
-        <w:rPr>
-          <w:rFonts w:cs="Arial" w:ascii="Arial" w:hAnsi="Arial"/>
-          <w:b w:val="false"/>
-        </w:rPr>
-        <w:t>6.</w:t>
-        <w:tab/>
-      </w:r>
-      <w:r>
-        <w:rPr>
-          <w:rFonts w:cs="Book Antiqua"/>
-          <w:b/>
-          <w:i w:val="false"/>
-        </w:rPr>
-        <w:t>Decide</w:t>
-      </w:r>
-      <w:r>
-        <w:rPr>
-          <w:rFonts w:cs="Book Antiqua"/>
-          <w:b w:val="false"/>
-          <w:i w:val="false"/>
-        </w:rPr>
-        <w:t xml:space="preserve"> the status of Harder to Kill within the proposed Combat Mindset tagline (Remain effective. Act decisively. Harder to kill.), endorsing, deferring or rejecting its inclusion.</w:t>
       </w:r>
     </w:p>
     <w:p>
@@ -2438,7 +2366,7 @@
           <w:rFonts w:cs="Arial" w:ascii="Arial" w:hAnsi="Arial"/>
           <w:b w:val="false"/>
         </w:rPr>
-        <w:t>7.</w:t>
+        <w:t>5.</w:t>
         <w:tab/>
       </w:r>
       <w:r>
@@ -2447,15 +2375,15 @@
           <w:b/>
           <w:i w:val="false"/>
         </w:rPr>
-        <w:t>Direct</w:t>
-      </w:r>
-      <w:r>
-        <w:rPr>
-          <w:rFonts w:cs="Book Antiqua"/>
-          <w:b w:val="false"/>
-          <w:i w:val="false"/>
-        </w:rPr>
-        <w:t xml:space="preserve"> a report back in November 2026 containing the endorsed definitions; Framework v1.0; the validated capability and product architecture; proposed governance and assurance arrangements; an assessment of existing product maturity, evidence and scalability; and a prioritised implementation plan.</w:t>
+        <w:t>Note</w:t>
+      </w:r>
+      <w:r>
+        <w:rPr>
+          <w:rFonts w:cs="Book Antiqua"/>
+          <w:b w:val="false"/>
+          <w:i w:val="false"/>
+        </w:rPr>
+        <w:t xml:space="preserve"> that the programme timeframes are aspirational and that activity may extend into early 2027.</w:t>
       </w:r>
     </w:p>
     <w:p>
@@ -2467,7 +2395,7 @@
         <w:spacing w:before="0" w:after="160"/>
         <w:rPr/>
       </w:pPr>
-      <w:bookmarkStart w:id="7" w:name="__RefHeading___Toc354_2828093440"/>
+      <w:bookmarkStart w:id="7" w:name="__RefHeading___Toc346_2077115726"/>
       <w:bookmarkEnd w:id="7"/>
       <w:r>
         <w:rPr>
@@ -2624,7 +2552,7 @@
         </w:pBdr>
         <w:rPr/>
       </w:pPr>
-      <w:bookmarkStart w:id="8" w:name="__RefHeading___Toc356_2828093440"/>
+      <w:bookmarkStart w:id="8" w:name="__RefHeading___Toc348_2077115726"/>
       <w:bookmarkEnd w:id="8"/>
       <w:r>
         <w:rPr>

</xml_diff>

<commit_message>
End the paper at the recommendations
Removes the foundation documents list and Annex A. Two sentences in the
programme of work are tightened, dropping a feasibility-trial detail
already given at section 3 and a duplicated reference to the framework
architecture, which brings all five recommendations onto a single closing
page. The paper is now eight pages.

Co-Authored-By: Claude Fable 5 <noreply@anthropic.com>
Claude-Session: https://claude.ai/code/session_01YLo1WfwUDkbwfJEF3ZNVbB
</commit_message>
<xml_diff>
--- a/output/combat-mindset-way-forward.docx
+++ b/output/combat-mindset-way-forward.docx
@@ -304,7 +304,7 @@
             </w:rPr>
             <w:fldChar w:fldCharType="separate"/>
           </w:r>
-          <w:hyperlink w:anchor="__RefHeading___Toc332_2077115726">
+          <w:hyperlink w:anchor="__RefHeading___Toc209_383309730">
             <w:r>
               <w:rPr>
                 <w:webHidden/>
@@ -331,7 +331,7 @@
             </w:tabs>
             <w:rPr/>
           </w:pPr>
-          <w:hyperlink w:anchor="__RefHeading___Toc334_2077115726">
+          <w:hyperlink w:anchor="__RefHeading___Toc211_383309730">
             <w:r>
               <w:rPr>
                 <w:webHidden/>
@@ -358,7 +358,7 @@
             </w:tabs>
             <w:rPr/>
           </w:pPr>
-          <w:hyperlink w:anchor="__RefHeading___Toc336_2077115726">
+          <w:hyperlink w:anchor="__RefHeading___Toc213_383309730">
             <w:r>
               <w:rPr>
                 <w:webHidden/>
@@ -385,7 +385,7 @@
             </w:tabs>
             <w:rPr/>
           </w:pPr>
-          <w:hyperlink w:anchor="__RefHeading___Toc338_2077115726">
+          <w:hyperlink w:anchor="__RefHeading___Toc215_383309730">
             <w:r>
               <w:rPr>
                 <w:webHidden/>
@@ -412,7 +412,7 @@
             </w:tabs>
             <w:rPr/>
           </w:pPr>
-          <w:hyperlink w:anchor="__RefHeading___Toc340_2077115726">
+          <w:hyperlink w:anchor="__RefHeading___Toc217_383309730">
             <w:r>
               <w:rPr>
                 <w:webHidden/>
@@ -439,7 +439,7 @@
             </w:tabs>
             <w:rPr/>
           </w:pPr>
-          <w:hyperlink w:anchor="__RefHeading___Toc342_2077115726">
+          <w:hyperlink w:anchor="__RefHeading___Toc219_383309730">
             <w:r>
               <w:rPr>
                 <w:webHidden/>
@@ -466,7 +466,7 @@
             </w:tabs>
             <w:rPr/>
           </w:pPr>
-          <w:hyperlink w:anchor="__RefHeading___Toc344_2077115726">
+          <w:hyperlink w:anchor="__RefHeading___Toc221_383309730">
             <w:r>
               <w:rPr>
                 <w:webHidden/>
@@ -481,60 +481,6 @@
               </w:rPr>
               <w:tab/>
               <w:t>8</w:t>
-            </w:r>
-          </w:hyperlink>
-        </w:p>
-        <w:p>
-          <w:pPr>
-            <w:pStyle w:val="TOC1"/>
-            <w:tabs>
-              <w:tab w:val="clear" w:pos="9072"/>
-              <w:tab w:val="right" w:pos="9071" w:leader="dot"/>
-            </w:tabs>
-            <w:rPr/>
-          </w:pPr>
-          <w:hyperlink w:anchor="__RefHeading___Toc346_2077115726">
-            <w:r>
-              <w:rPr>
-                <w:webHidden/>
-                <w:rStyle w:val="IndexLink"/>
-                <w:i w:val="false"/>
-              </w:rPr>
-              <w:t>Foundation documents</w:t>
-            </w:r>
-            <w:r>
-              <w:rPr>
-                <w:rStyle w:val="IndexLink"/>
-              </w:rPr>
-              <w:tab/>
-              <w:t>10</w:t>
-            </w:r>
-          </w:hyperlink>
-        </w:p>
-        <w:p>
-          <w:pPr>
-            <w:pStyle w:val="TOC1"/>
-            <w:tabs>
-              <w:tab w:val="clear" w:pos="9072"/>
-              <w:tab w:val="right" w:pos="9071" w:leader="dot"/>
-            </w:tabs>
-            <w:rPr/>
-          </w:pPr>
-          <w:hyperlink w:anchor="__RefHeading___Toc348_2077115726">
-            <w:r>
-              <w:rPr>
-                <w:webHidden/>
-                <w:rStyle w:val="IndexLink"/>
-                <w:i w:val="false"/>
-              </w:rPr>
-              <w:t>Annex A: Interim governance and division of functions</w:t>
-            </w:r>
-            <w:r>
-              <w:rPr>
-                <w:rStyle w:val="IndexLink"/>
-              </w:rPr>
-              <w:tab/>
-              <w:t>10</w:t>
             </w:r>
           </w:hyperlink>
           <w:r>
@@ -575,7 +521,7 @@
         <w:spacing w:before="0" w:after="160"/>
         <w:rPr/>
       </w:pPr>
-      <w:bookmarkStart w:id="0" w:name="__RefHeading___Toc332_2077115726"/>
+      <w:bookmarkStart w:id="0" w:name="__RefHeading___Toc209_383309730"/>
       <w:bookmarkEnd w:id="0"/>
       <w:r>
         <w:rPr>
@@ -657,7 +603,7 @@
         </w:pBdr>
         <w:rPr/>
       </w:pPr>
-      <w:bookmarkStart w:id="1" w:name="__RefHeading___Toc334_2077115726"/>
+      <w:bookmarkStart w:id="1" w:name="__RefHeading___Toc211_383309730"/>
       <w:bookmarkEnd w:id="1"/>
       <w:r>
         <w:rPr>
@@ -733,7 +679,7 @@
         </w:pBdr>
         <w:rPr/>
       </w:pPr>
-      <w:bookmarkStart w:id="2" w:name="__RefHeading___Toc336_2077115726"/>
+      <w:bookmarkStart w:id="2" w:name="__RefHeading___Toc213_383309730"/>
       <w:bookmarkEnd w:id="2"/>
       <w:r>
         <w:rPr>
@@ -841,7 +787,7 @@
         </w:pBdr>
         <w:rPr/>
       </w:pPr>
-      <w:bookmarkStart w:id="3" w:name="__RefHeading___Toc338_2077115726"/>
+      <w:bookmarkStart w:id="3" w:name="__RefHeading___Toc215_383309730"/>
       <w:bookmarkEnd w:id="3"/>
       <w:r>
         <w:rPr>
@@ -1395,7 +1341,7 @@
         </w:pBdr>
         <w:rPr/>
       </w:pPr>
-      <w:bookmarkStart w:id="4" w:name="__RefHeading___Toc340_2077115726"/>
+      <w:bookmarkStart w:id="4" w:name="__RefHeading___Toc217_383309730"/>
       <w:bookmarkEnd w:id="4"/>
       <w:r>
         <w:rPr>
@@ -1579,7 +1525,7 @@
         </w:pBdr>
         <w:rPr/>
       </w:pPr>
-      <w:bookmarkStart w:id="5" w:name="__RefHeading___Toc342_2077115726"/>
+      <w:bookmarkStart w:id="5" w:name="__RefHeading___Toc219_383309730"/>
       <w:bookmarkEnd w:id="5"/>
       <w:r>
         <w:rPr>
@@ -1907,7 +1853,7 @@
           <w:b w:val="false"/>
           <w:i w:val="false"/>
         </w:rPr>
-        <w:t>Apply the combat-specificity test at paragraph 2 to distinguish products that contribute to the broader Performance Under Pressure capability from those that support its combat-specific expression. Assess COGCON as one developmental product within this assessment, with particular attention to its product boundary, evidence base (including its completed feasibility trials in live military training), ownership, workforce requirements and scalability.</w:t>
+        <w:t>Apply the combat-specificity test at paragraph 2 to distinguish products that contribute to the broader Performance Under Pressure capability from those that support its combat-specific expression. Assess COGCON as one developmental product, with particular attention to its product boundary, evidence base, ownership, workforce requirements and scalability.</w:t>
       </w:r>
     </w:p>
     <w:p>
@@ -2119,7 +2065,7 @@
           <w:b w:val="false"/>
           <w:i w:val="false"/>
         </w:rPr>
-        <w:t>Present to COMDT ACS the endorsed definitions and the confirmed relationship between Combat Mindset and Performance Under Pressure; Framework v1.0 and its agreed architecture; the validated capability and product architecture; the proposed governance and assurance model; an assessment of existing product maturity, evidence and scalability; and a prioritised implementation plan.</w:t>
+        <w:t>Present to COMDT ACS the endorsed definitions and confirmed relationship; Framework v1.0 and its validated capability and product architecture; the proposed governance and assurance model; and a prioritised implementation plan.</w:t>
       </w:r>
     </w:p>
     <w:p>
@@ -2165,7 +2111,7 @@
         </w:pBdr>
         <w:rPr/>
       </w:pPr>
-      <w:bookmarkStart w:id="6" w:name="__RefHeading___Toc344_2077115726"/>
+      <w:bookmarkStart w:id="6" w:name="__RefHeading___Toc221_383309730"/>
       <w:bookmarkEnd w:id="6"/>
       <w:r>
         <w:rPr>
@@ -2338,20 +2284,6 @@
     </w:p>
     <w:p>
       <w:pPr>
-        <w:sectPr>
-          <w:headerReference w:type="default" r:id="rId15"/>
-          <w:headerReference w:type="first" r:id="rId16"/>
-          <w:footerReference w:type="even" r:id="rId17"/>
-          <w:footerReference w:type="default" r:id="rId18"/>
-          <w:footerReference w:type="first" r:id="rId19"/>
-          <w:type w:val="nextPage"/>
-          <w:pgSz w:w="11906" w:h="16838"/>
-          <w:pgMar w:left="1417" w:right="1417" w:gutter="0" w:header="624" w:top="1361" w:footer="624" w:bottom="1361"/>
-          <w:pgNumType w:fmt="decimal"/>
-          <w:formProt w:val="false"/>
-          <w:textDirection w:val="lrTb"/>
-          <w:docGrid w:type="default" w:linePitch="360" w:charSpace="0"/>
-        </w:sectPr>
         <w:pStyle w:val="Normal"/>
         <w:tabs>
           <w:tab w:val="clear" w:pos="720"/>
@@ -2386,1065 +2318,15 @@
         <w:t xml:space="preserve"> that the programme timeframes are aspirational and that activity may extend into early 2027.</w:t>
       </w:r>
     </w:p>
-    <w:p>
-      <w:pPr>
-        <w:pStyle w:val="Heading1"/>
-        <w:pBdr>
-          <w:left w:val="single" w:sz="24" w:space="8" w:color="C62026"/>
-        </w:pBdr>
-        <w:spacing w:before="0" w:after="160"/>
-        <w:rPr/>
-      </w:pPr>
-      <w:bookmarkStart w:id="7" w:name="__RefHeading___Toc346_2077115726"/>
-      <w:bookmarkEnd w:id="7"/>
-      <w:r>
-        <w:rPr>
-          <w:rFonts w:cs="Arial" w:ascii="Arial" w:hAnsi="Arial"/>
-          <w:b/>
-          <w:i w:val="false"/>
-          <w:color w:val="002516"/>
-          <w:sz w:val="28"/>
-        </w:rPr>
-        <w:t>Foundation documents</w:t>
-      </w:r>
-    </w:p>
-    <w:p>
-      <w:pPr>
-        <w:pStyle w:val="Normal"/>
-        <w:rPr/>
-      </w:pPr>
-      <w:r>
-        <w:rPr>
-          <w:rFonts w:cs="Book Antiqua"/>
-          <w:b w:val="false"/>
-          <w:i w:val="false"/>
-        </w:rPr>
-        <w:t>This paper draws on the following documents:</w:t>
-      </w:r>
-    </w:p>
-    <w:p>
-      <w:pPr>
-        <w:pStyle w:val="Normal"/>
-        <w:tabs>
-          <w:tab w:val="clear" w:pos="720"/>
-          <w:tab w:val="left" w:pos="425" w:leader="none"/>
-        </w:tabs>
-        <w:spacing w:before="0" w:after="60"/>
-        <w:ind w:hanging="255" w:left="425"/>
-        <w:rPr/>
-      </w:pPr>
-      <w:r>
-        <w:rPr>
-          <w:rFonts w:cs="Arial" w:ascii="Arial" w:hAnsi="Arial"/>
-          <w:b/>
-          <w:color w:val="C62026"/>
-        </w:rPr>
-        <w:t>•</w:t>
-      </w:r>
-      <w:r>
-        <w:rPr>
-          <w:rFonts w:cs="Arial" w:ascii="Arial" w:hAnsi="Arial"/>
-          <w:b/>
-          <w:color w:val="C62026"/>
-        </w:rPr>
-        <w:tab/>
-      </w:r>
-      <w:r>
-        <w:rPr>
-          <w:rFonts w:cs="Book Antiqua"/>
-          <w:b w:val="false"/>
-          <w:i w:val="false"/>
-        </w:rPr>
-        <w:t>COMDT ACS Combat Mindset guidance, 16 July 2026.</w:t>
-      </w:r>
-    </w:p>
-    <w:p>
-      <w:pPr>
-        <w:pStyle w:val="Normal"/>
-        <w:tabs>
-          <w:tab w:val="clear" w:pos="720"/>
-          <w:tab w:val="left" w:pos="425" w:leader="none"/>
-        </w:tabs>
-        <w:spacing w:before="0" w:after="60"/>
-        <w:ind w:hanging="255" w:left="425"/>
-        <w:rPr/>
-      </w:pPr>
-      <w:r>
-        <w:rPr>
-          <w:rFonts w:cs="Arial" w:ascii="Arial" w:hAnsi="Arial"/>
-          <w:b/>
-          <w:color w:val="C62026"/>
-        </w:rPr>
-        <w:t>•</w:t>
-      </w:r>
-      <w:r>
-        <w:rPr>
-          <w:rFonts w:cs="Arial" w:ascii="Arial" w:hAnsi="Arial"/>
-          <w:b/>
-          <w:color w:val="C62026"/>
-        </w:rPr>
-        <w:tab/>
-      </w:r>
-      <w:r>
-        <w:rPr>
-          <w:rFonts w:cs="Book Antiqua"/>
-          <w:b w:val="false"/>
-          <w:i w:val="false"/>
-        </w:rPr>
-        <w:t>Performance Under Pressure and Combat Mindset in the New Zealand Army (Draft Capability Note), NZALC, July 2026.</w:t>
-      </w:r>
-    </w:p>
-    <w:p>
-      <w:pPr>
-        <w:pStyle w:val="Normal"/>
-        <w:tabs>
-          <w:tab w:val="clear" w:pos="720"/>
-          <w:tab w:val="left" w:pos="425" w:leader="none"/>
-        </w:tabs>
-        <w:spacing w:before="0" w:after="60"/>
-        <w:ind w:hanging="255" w:left="425"/>
-        <w:rPr/>
-      </w:pPr>
-      <w:r>
-        <w:rPr>
-          <w:rFonts w:cs="Arial" w:ascii="Arial" w:hAnsi="Arial"/>
-          <w:b/>
-          <w:color w:val="C62026"/>
-        </w:rPr>
-        <w:t>•</w:t>
-      </w:r>
-      <w:r>
-        <w:rPr>
-          <w:rFonts w:cs="Arial" w:ascii="Arial" w:hAnsi="Arial"/>
-          <w:b/>
-          <w:color w:val="C62026"/>
-        </w:rPr>
-        <w:tab/>
-      </w:r>
-      <w:r>
-        <w:rPr>
-          <w:rFonts w:cs="Book Antiqua"/>
-          <w:b w:val="false"/>
-          <w:i w:val="false"/>
-        </w:rPr>
-        <w:t>Human Performance Cell Performance Cognition paper (COGCON).</w:t>
-      </w:r>
-    </w:p>
-    <w:p>
-      <w:pPr>
-        <w:pStyle w:val="Normal"/>
-        <w:rPr/>
-      </w:pPr>
-      <w:r>
-        <w:rPr>
-          <w:rFonts w:cs="Book Antiqua"/>
-          <w:b w:val="false"/>
-          <w:i w:val="false"/>
-        </w:rPr>
-        <w:t>Relevant APS, ILD and doctrinal holdings will be confirmed and referenced through the Phase 2 assessment.</w:t>
-      </w:r>
-    </w:p>
-    <w:p>
-      <w:pPr>
-        <w:pStyle w:val="Heading1"/>
-        <w:pBdr>
-          <w:left w:val="single" w:sz="24" w:space="8" w:color="C62026"/>
-        </w:pBdr>
-        <w:rPr/>
-      </w:pPr>
-      <w:bookmarkStart w:id="8" w:name="__RefHeading___Toc348_2077115726"/>
-      <w:bookmarkEnd w:id="8"/>
-      <w:r>
-        <w:rPr>
-          <w:rFonts w:cs="Arial" w:ascii="Arial" w:hAnsi="Arial"/>
-          <w:b/>
-          <w:i w:val="false"/>
-          <w:color w:val="002516"/>
-          <w:sz w:val="28"/>
-        </w:rPr>
-        <w:t>Annex A: Interim governance and division of functions</w:t>
-      </w:r>
-    </w:p>
-    <w:p>
-      <w:pPr>
-        <w:pStyle w:val="Normal"/>
-        <w:rPr/>
-      </w:pPr>
-      <w:r>
-        <w:rPr>
-          <w:rFonts w:cs="Book Antiqua"/>
-          <w:b w:val="false"/>
-          <w:i w:val="false"/>
-        </w:rPr>
-        <w:t>The following division of functions is proposed for confirmation at Phase 1 and refinement through the Phase 2 assessment and Phase 4 validation.</w:t>
-      </w:r>
-    </w:p>
-    <w:tbl>
-      <w:tblPr>
-        <w:tblW w:w="14571" w:type="dxa"/>
-        <w:jc w:val="left"/>
-        <w:tblInd w:w="0" w:type="dxa"/>
-        <w:tblLayout w:type="fixed"/>
-        <w:tblCellMar>
-          <w:top w:w="0" w:type="dxa"/>
-          <w:left w:w="108" w:type="dxa"/>
-          <w:bottom w:w="0" w:type="dxa"/>
-          <w:right w:w="108" w:type="dxa"/>
-        </w:tblCellMar>
-        <w:tblLook w:val="04a0" w:noHBand="0" w:noVBand="1" w:firstColumn="1" w:lastRow="0" w:lastColumn="0" w:firstRow="1"/>
-      </w:tblPr>
-      <w:tblGrid>
-        <w:gridCol w:w="4857"/>
-        <w:gridCol w:w="4857"/>
-        <w:gridCol w:w="4857"/>
-      </w:tblGrid>
-      <w:tr>
-        <w:trPr>
-          <w:tblHeader w:val="true"/>
-          <w:cantSplit w:val="true"/>
-        </w:trPr>
-        <w:tc>
-          <w:tcPr>
-            <w:tcW w:w="4857" w:type="dxa"/>
-            <w:tcBorders>
-              <w:top w:val="single" w:sz="4" w:space="0" w:color="A89662"/>
-              <w:left w:val="single" w:sz="4" w:space="0" w:color="A89662"/>
-              <w:bottom w:val="single" w:sz="4" w:space="0" w:color="A89662"/>
-              <w:right w:val="single" w:sz="4" w:space="0" w:color="A89662"/>
-            </w:tcBorders>
-            <w:shd w:fill="002516" w:val="clear"/>
-          </w:tcPr>
-          <w:p>
-            <w:pPr>
-              <w:pStyle w:val="Normal"/>
-              <w:spacing w:before="20" w:after="20"/>
-              <w:rPr/>
-            </w:pPr>
-            <w:r>
-              <w:rPr>
-                <w:rFonts w:cs="Arial" w:ascii="Arial" w:hAnsi="Arial"/>
-                <w:b/>
-                <w:color w:val="FFFFFF"/>
-                <w:sz w:val="19"/>
-              </w:rPr>
-              <w:t>Function</w:t>
-            </w:r>
-          </w:p>
-        </w:tc>
-        <w:tc>
-          <w:tcPr>
-            <w:tcW w:w="4857" w:type="dxa"/>
-            <w:tcBorders>
-              <w:top w:val="single" w:sz="4" w:space="0" w:color="A89662"/>
-              <w:left w:val="single" w:sz="4" w:space="0" w:color="A89662"/>
-              <w:bottom w:val="single" w:sz="4" w:space="0" w:color="A89662"/>
-              <w:right w:val="single" w:sz="4" w:space="0" w:color="A89662"/>
-            </w:tcBorders>
-            <w:shd w:fill="002516" w:val="clear"/>
-          </w:tcPr>
-          <w:p>
-            <w:pPr>
-              <w:pStyle w:val="Normal"/>
-              <w:spacing w:before="20" w:after="20"/>
-              <w:rPr/>
-            </w:pPr>
-            <w:r>
-              <w:rPr>
-                <w:rFonts w:cs="Arial" w:ascii="Arial" w:hAnsi="Arial"/>
-                <w:b/>
-                <w:color w:val="FFFFFF"/>
-                <w:sz w:val="19"/>
-              </w:rPr>
-              <w:t>Lead</w:t>
-            </w:r>
-          </w:p>
-        </w:tc>
-        <w:tc>
-          <w:tcPr>
-            <w:tcW w:w="4857" w:type="dxa"/>
-            <w:tcBorders>
-              <w:top w:val="single" w:sz="4" w:space="0" w:color="A89662"/>
-              <w:left w:val="single" w:sz="4" w:space="0" w:color="A89662"/>
-              <w:bottom w:val="single" w:sz="4" w:space="0" w:color="A89662"/>
-              <w:right w:val="single" w:sz="4" w:space="0" w:color="A89662"/>
-            </w:tcBorders>
-            <w:shd w:fill="002516" w:val="clear"/>
-          </w:tcPr>
-          <w:p>
-            <w:pPr>
-              <w:pStyle w:val="Normal"/>
-              <w:spacing w:before="20" w:after="20"/>
-              <w:rPr/>
-            </w:pPr>
-            <w:r>
-              <w:rPr>
-                <w:rFonts w:cs="Arial" w:ascii="Arial" w:hAnsi="Arial"/>
-                <w:b/>
-                <w:color w:val="FFFFFF"/>
-                <w:sz w:val="19"/>
-              </w:rPr>
-              <w:t>Output</w:t>
-            </w:r>
-          </w:p>
-        </w:tc>
-      </w:tr>
-      <w:tr>
-        <w:trPr>
-          <w:cantSplit w:val="true"/>
-        </w:trPr>
-        <w:tc>
-          <w:tcPr>
-            <w:tcW w:w="4857" w:type="dxa"/>
-            <w:tcBorders>
-              <w:top w:val="single" w:sz="4" w:space="0" w:color="A89662"/>
-              <w:left w:val="single" w:sz="4" w:space="0" w:color="A89662"/>
-              <w:bottom w:val="single" w:sz="4" w:space="0" w:color="A89662"/>
-              <w:right w:val="single" w:sz="4" w:space="0" w:color="A89662"/>
-            </w:tcBorders>
-          </w:tcPr>
-          <w:p>
-            <w:pPr>
-              <w:pStyle w:val="Normal"/>
-              <w:spacing w:before="20" w:after="20"/>
-              <w:rPr/>
-            </w:pPr>
-            <w:r>
-              <w:rPr>
-                <w:rFonts w:cs="Book Antiqua"/>
-                <w:color w:val="000000"/>
-                <w:sz w:val="19"/>
-              </w:rPr>
-              <w:t>Define and govern</w:t>
-            </w:r>
-          </w:p>
-        </w:tc>
-        <w:tc>
-          <w:tcPr>
-            <w:tcW w:w="4857" w:type="dxa"/>
-            <w:tcBorders>
-              <w:top w:val="single" w:sz="4" w:space="0" w:color="A89662"/>
-              <w:left w:val="single" w:sz="4" w:space="0" w:color="A89662"/>
-              <w:bottom w:val="single" w:sz="4" w:space="0" w:color="A89662"/>
-              <w:right w:val="single" w:sz="4" w:space="0" w:color="A89662"/>
-            </w:tcBorders>
-          </w:tcPr>
-          <w:p>
-            <w:pPr>
-              <w:pStyle w:val="Normal"/>
-              <w:spacing w:before="20" w:after="20"/>
-              <w:rPr/>
-            </w:pPr>
-            <w:r>
-              <w:rPr>
-                <w:rFonts w:cs="Book Antiqua"/>
-                <w:color w:val="000000"/>
-                <w:sz w:val="19"/>
-              </w:rPr>
-              <w:t>Army Sponsor / ACS</w:t>
-            </w:r>
-          </w:p>
-        </w:tc>
-        <w:tc>
-          <w:tcPr>
-            <w:tcW w:w="4857" w:type="dxa"/>
-            <w:tcBorders>
-              <w:top w:val="single" w:sz="4" w:space="0" w:color="A89662"/>
-              <w:left w:val="single" w:sz="4" w:space="0" w:color="A89662"/>
-              <w:bottom w:val="single" w:sz="4" w:space="0" w:color="A89662"/>
-              <w:right w:val="single" w:sz="4" w:space="0" w:color="A89662"/>
-            </w:tcBorders>
-          </w:tcPr>
-          <w:p>
-            <w:pPr>
-              <w:pStyle w:val="Normal"/>
-              <w:spacing w:before="20" w:after="20"/>
-              <w:rPr/>
-            </w:pPr>
-            <w:r>
-              <w:rPr>
-                <w:rFonts w:cs="Book Antiqua"/>
-                <w:color w:val="000000"/>
-                <w:sz w:val="19"/>
-              </w:rPr>
-              <w:t>Endorsed doctrine, definitions, policy direction and capability outcomes</w:t>
-            </w:r>
-          </w:p>
-        </w:tc>
-      </w:tr>
-      <w:tr>
-        <w:trPr>
-          <w:cantSplit w:val="true"/>
-        </w:trPr>
-        <w:tc>
-          <w:tcPr>
-            <w:tcW w:w="4857" w:type="dxa"/>
-            <w:tcBorders>
-              <w:top w:val="single" w:sz="4" w:space="0" w:color="A89662"/>
-              <w:left w:val="single" w:sz="4" w:space="0" w:color="A89662"/>
-              <w:bottom w:val="single" w:sz="4" w:space="0" w:color="A89662"/>
-              <w:right w:val="single" w:sz="4" w:space="0" w:color="A89662"/>
-            </w:tcBorders>
-          </w:tcPr>
-          <w:p>
-            <w:pPr>
-              <w:pStyle w:val="Normal"/>
-              <w:spacing w:before="20" w:after="20"/>
-              <w:rPr/>
-            </w:pPr>
-            <w:r>
-              <w:rPr>
-                <w:rFonts w:cs="Book Antiqua"/>
-                <w:color w:val="000000"/>
-                <w:sz w:val="19"/>
-              </w:rPr>
-              <w:t>Integrate capability and develop the framework</w:t>
-            </w:r>
-          </w:p>
-        </w:tc>
-        <w:tc>
-          <w:tcPr>
-            <w:tcW w:w="4857" w:type="dxa"/>
-            <w:tcBorders>
-              <w:top w:val="single" w:sz="4" w:space="0" w:color="A89662"/>
-              <w:left w:val="single" w:sz="4" w:space="0" w:color="A89662"/>
-              <w:bottom w:val="single" w:sz="4" w:space="0" w:color="A89662"/>
-              <w:right w:val="single" w:sz="4" w:space="0" w:color="A89662"/>
-            </w:tcBorders>
-          </w:tcPr>
-          <w:p>
-            <w:pPr>
-              <w:pStyle w:val="Normal"/>
-              <w:spacing w:before="20" w:after="20"/>
-              <w:rPr/>
-            </w:pPr>
-            <w:r>
-              <w:rPr>
-                <w:rFonts w:cs="Book Antiqua"/>
-                <w:color w:val="000000"/>
-                <w:sz w:val="19"/>
-              </w:rPr>
-              <w:t>ACS</w:t>
-            </w:r>
-          </w:p>
-        </w:tc>
-        <w:tc>
-          <w:tcPr>
-            <w:tcW w:w="4857" w:type="dxa"/>
-            <w:tcBorders>
-              <w:top w:val="single" w:sz="4" w:space="0" w:color="A89662"/>
-              <w:left w:val="single" w:sz="4" w:space="0" w:color="A89662"/>
-              <w:bottom w:val="single" w:sz="4" w:space="0" w:color="A89662"/>
-              <w:right w:val="single" w:sz="4" w:space="0" w:color="A89662"/>
-            </w:tcBorders>
-          </w:tcPr>
-          <w:p>
-            <w:pPr>
-              <w:pStyle w:val="Normal"/>
-              <w:spacing w:before="20" w:after="20"/>
-              <w:rPr/>
-            </w:pPr>
-            <w:r>
-              <w:rPr>
-                <w:rFonts w:cs="Book Antiqua"/>
-                <w:color w:val="000000"/>
-                <w:sz w:val="19"/>
-              </w:rPr>
-              <w:t>Framework architecture, product recognition criteria, stakeholder coordination and implementation priorities</w:t>
-            </w:r>
-          </w:p>
-        </w:tc>
-      </w:tr>
-      <w:tr>
-        <w:trPr>
-          <w:cantSplit w:val="true"/>
-        </w:trPr>
-        <w:tc>
-          <w:tcPr>
-            <w:tcW w:w="4857" w:type="dxa"/>
-            <w:tcBorders>
-              <w:top w:val="single" w:sz="4" w:space="0" w:color="A89662"/>
-              <w:left w:val="single" w:sz="4" w:space="0" w:color="A89662"/>
-              <w:bottom w:val="single" w:sz="4" w:space="0" w:color="A89662"/>
-              <w:right w:val="single" w:sz="4" w:space="0" w:color="A89662"/>
-            </w:tcBorders>
-          </w:tcPr>
-          <w:p>
-            <w:pPr>
-              <w:pStyle w:val="Normal"/>
-              <w:spacing w:before="20" w:after="20"/>
-              <w:rPr/>
-            </w:pPr>
-            <w:r>
-              <w:rPr>
-                <w:rFonts w:cs="Book Antiqua"/>
-                <w:color w:val="000000"/>
-                <w:sz w:val="19"/>
-              </w:rPr>
-              <w:t>Develop products</w:t>
-            </w:r>
-          </w:p>
-        </w:tc>
-        <w:tc>
-          <w:tcPr>
-            <w:tcW w:w="4857" w:type="dxa"/>
-            <w:tcBorders>
-              <w:top w:val="single" w:sz="4" w:space="0" w:color="A89662"/>
-              <w:left w:val="single" w:sz="4" w:space="0" w:color="A89662"/>
-              <w:bottom w:val="single" w:sz="4" w:space="0" w:color="A89662"/>
-              <w:right w:val="single" w:sz="4" w:space="0" w:color="A89662"/>
-            </w:tcBorders>
-          </w:tcPr>
-          <w:p>
-            <w:pPr>
-              <w:pStyle w:val="Normal"/>
-              <w:spacing w:before="20" w:after="20"/>
-              <w:rPr/>
-            </w:pPr>
-            <w:r>
-              <w:rPr>
-                <w:rFonts w:cs="Book Antiqua"/>
-                <w:color w:val="000000"/>
-                <w:sz w:val="19"/>
-              </w:rPr>
-              <w:t>Relevant product owner</w:t>
-            </w:r>
-          </w:p>
-        </w:tc>
-        <w:tc>
-          <w:tcPr>
-            <w:tcW w:w="4857" w:type="dxa"/>
-            <w:tcBorders>
-              <w:top w:val="single" w:sz="4" w:space="0" w:color="A89662"/>
-              <w:left w:val="single" w:sz="4" w:space="0" w:color="A89662"/>
-              <w:bottom w:val="single" w:sz="4" w:space="0" w:color="A89662"/>
-              <w:right w:val="single" w:sz="4" w:space="0" w:color="A89662"/>
-            </w:tcBorders>
-          </w:tcPr>
-          <w:p>
-            <w:pPr>
-              <w:pStyle w:val="Normal"/>
-              <w:spacing w:before="20" w:after="20"/>
-              <w:rPr/>
-            </w:pPr>
-            <w:r>
-              <w:rPr>
-                <w:rFonts w:cs="Book Antiqua"/>
-                <w:color w:val="000000"/>
-                <w:sz w:val="19"/>
-              </w:rPr>
-              <w:t>Product design, protocols, instructor materials and updates</w:t>
-            </w:r>
-          </w:p>
-        </w:tc>
-      </w:tr>
-      <w:tr>
-        <w:trPr>
-          <w:cantSplit w:val="true"/>
-        </w:trPr>
-        <w:tc>
-          <w:tcPr>
-            <w:tcW w:w="4857" w:type="dxa"/>
-            <w:tcBorders>
-              <w:top w:val="single" w:sz="4" w:space="0" w:color="A89662"/>
-              <w:left w:val="single" w:sz="4" w:space="0" w:color="A89662"/>
-              <w:bottom w:val="single" w:sz="4" w:space="0" w:color="A89662"/>
-              <w:right w:val="single" w:sz="4" w:space="0" w:color="A89662"/>
-            </w:tcBorders>
-          </w:tcPr>
-          <w:p>
-            <w:pPr>
-              <w:pStyle w:val="Normal"/>
-              <w:spacing w:before="20" w:after="20"/>
-              <w:rPr/>
-            </w:pPr>
-            <w:r>
-              <w:rPr>
-                <w:rFonts w:cs="Book Antiqua"/>
-                <w:color w:val="000000"/>
-                <w:sz w:val="19"/>
-              </w:rPr>
-              <w:t>Provide domain advice</w:t>
-            </w:r>
-          </w:p>
-        </w:tc>
-        <w:tc>
-          <w:tcPr>
-            <w:tcW w:w="4857" w:type="dxa"/>
-            <w:tcBorders>
-              <w:top w:val="single" w:sz="4" w:space="0" w:color="A89662"/>
-              <w:left w:val="single" w:sz="4" w:space="0" w:color="A89662"/>
-              <w:bottom w:val="single" w:sz="4" w:space="0" w:color="A89662"/>
-              <w:right w:val="single" w:sz="4" w:space="0" w:color="A89662"/>
-            </w:tcBorders>
-          </w:tcPr>
-          <w:p>
-            <w:pPr>
-              <w:pStyle w:val="Normal"/>
-              <w:spacing w:before="20" w:after="20"/>
-              <w:rPr/>
-            </w:pPr>
-            <w:r>
-              <w:rPr>
-                <w:rFonts w:cs="Book Antiqua"/>
-                <w:color w:val="000000"/>
-                <w:sz w:val="19"/>
-              </w:rPr>
-              <w:t>Relevant technical or professional adviser</w:t>
-            </w:r>
-          </w:p>
-        </w:tc>
-        <w:tc>
-          <w:tcPr>
-            <w:tcW w:w="4857" w:type="dxa"/>
-            <w:tcBorders>
-              <w:top w:val="single" w:sz="4" w:space="0" w:color="A89662"/>
-              <w:left w:val="single" w:sz="4" w:space="0" w:color="A89662"/>
-              <w:bottom w:val="single" w:sz="4" w:space="0" w:color="A89662"/>
-              <w:right w:val="single" w:sz="4" w:space="0" w:color="A89662"/>
-            </w:tcBorders>
-          </w:tcPr>
-          <w:p>
-            <w:pPr>
-              <w:pStyle w:val="Normal"/>
-              <w:spacing w:before="20" w:after="20"/>
-              <w:rPr/>
-            </w:pPr>
-            <w:r>
-              <w:rPr>
-                <w:rFonts w:cs="Book Antiqua"/>
-                <w:color w:val="000000"/>
-                <w:sz w:val="19"/>
-              </w:rPr>
-              <w:t>Specialist advice within leadership, psychology, cognition, learning design, physical performance and other domains</w:t>
-            </w:r>
-          </w:p>
-        </w:tc>
-      </w:tr>
-      <w:tr>
-        <w:trPr>
-          <w:cantSplit w:val="true"/>
-        </w:trPr>
-        <w:tc>
-          <w:tcPr>
-            <w:tcW w:w="4857" w:type="dxa"/>
-            <w:tcBorders>
-              <w:top w:val="single" w:sz="4" w:space="0" w:color="A89662"/>
-              <w:left w:val="single" w:sz="4" w:space="0" w:color="A89662"/>
-              <w:bottom w:val="single" w:sz="4" w:space="0" w:color="A89662"/>
-              <w:right w:val="single" w:sz="4" w:space="0" w:color="A89662"/>
-            </w:tcBorders>
-          </w:tcPr>
-          <w:p>
-            <w:pPr>
-              <w:pStyle w:val="Normal"/>
-              <w:spacing w:before="20" w:after="20"/>
-              <w:rPr/>
-            </w:pPr>
-            <w:r>
-              <w:rPr>
-                <w:rFonts w:cs="Book Antiqua"/>
-                <w:color w:val="000000"/>
-                <w:sz w:val="19"/>
-              </w:rPr>
-              <w:t>Deliver</w:t>
-            </w:r>
-          </w:p>
-        </w:tc>
-        <w:tc>
-          <w:tcPr>
-            <w:tcW w:w="4857" w:type="dxa"/>
-            <w:tcBorders>
-              <w:top w:val="single" w:sz="4" w:space="0" w:color="A89662"/>
-              <w:left w:val="single" w:sz="4" w:space="0" w:color="A89662"/>
-              <w:bottom w:val="single" w:sz="4" w:space="0" w:color="A89662"/>
-              <w:right w:val="single" w:sz="4" w:space="0" w:color="A89662"/>
-            </w:tcBorders>
-          </w:tcPr>
-          <w:p>
-            <w:pPr>
-              <w:pStyle w:val="Normal"/>
-              <w:spacing w:before="20" w:after="20"/>
-              <w:rPr/>
-            </w:pPr>
-            <w:r>
-              <w:rPr>
-                <w:rFonts w:cs="Book Antiqua"/>
-                <w:color w:val="000000"/>
-                <w:sz w:val="19"/>
-              </w:rPr>
-              <w:t>Approved training establishments, units and existing instructor workforces</w:t>
-            </w:r>
-          </w:p>
-        </w:tc>
-        <w:tc>
-          <w:tcPr>
-            <w:tcW w:w="4857" w:type="dxa"/>
-            <w:tcBorders>
-              <w:top w:val="single" w:sz="4" w:space="0" w:color="A89662"/>
-              <w:left w:val="single" w:sz="4" w:space="0" w:color="A89662"/>
-              <w:bottom w:val="single" w:sz="4" w:space="0" w:color="A89662"/>
-              <w:right w:val="single" w:sz="4" w:space="0" w:color="A89662"/>
-            </w:tcBorders>
-          </w:tcPr>
-          <w:p>
-            <w:pPr>
-              <w:pStyle w:val="Normal"/>
-              <w:spacing w:before="20" w:after="20"/>
-              <w:rPr/>
-            </w:pPr>
-            <w:r>
-              <w:rPr>
-                <w:rFonts w:cs="Book Antiqua"/>
-                <w:color w:val="000000"/>
-                <w:sz w:val="19"/>
-              </w:rPr>
-              <w:t>Routine delivery of recognised products</w:t>
-            </w:r>
-          </w:p>
-        </w:tc>
-      </w:tr>
-      <w:tr>
-        <w:trPr>
-          <w:cantSplit w:val="true"/>
-        </w:trPr>
-        <w:tc>
-          <w:tcPr>
-            <w:tcW w:w="4857" w:type="dxa"/>
-            <w:tcBorders>
-              <w:top w:val="single" w:sz="4" w:space="0" w:color="A89662"/>
-              <w:left w:val="single" w:sz="4" w:space="0" w:color="A89662"/>
-              <w:bottom w:val="single" w:sz="4" w:space="0" w:color="A89662"/>
-              <w:right w:val="single" w:sz="4" w:space="0" w:color="A89662"/>
-            </w:tcBorders>
-          </w:tcPr>
-          <w:p>
-            <w:pPr>
-              <w:pStyle w:val="Normal"/>
-              <w:spacing w:before="20" w:after="20"/>
-              <w:rPr/>
-            </w:pPr>
-            <w:r>
-              <w:rPr>
-                <w:rFonts w:cs="Book Antiqua"/>
-                <w:color w:val="000000"/>
-                <w:sz w:val="19"/>
-              </w:rPr>
-              <w:t>Measure training performance</w:t>
-            </w:r>
-          </w:p>
-        </w:tc>
-        <w:tc>
-          <w:tcPr>
-            <w:tcW w:w="4857" w:type="dxa"/>
-            <w:tcBorders>
-              <w:top w:val="single" w:sz="4" w:space="0" w:color="A89662"/>
-              <w:left w:val="single" w:sz="4" w:space="0" w:color="A89662"/>
-              <w:bottom w:val="single" w:sz="4" w:space="0" w:color="A89662"/>
-              <w:right w:val="single" w:sz="4" w:space="0" w:color="A89662"/>
-            </w:tcBorders>
-          </w:tcPr>
-          <w:p>
-            <w:pPr>
-              <w:pStyle w:val="Normal"/>
-              <w:spacing w:before="20" w:after="20"/>
-              <w:rPr/>
-            </w:pPr>
-            <w:r>
-              <w:rPr>
-                <w:rFonts w:cs="Book Antiqua"/>
-                <w:color w:val="000000"/>
-                <w:sz w:val="19"/>
-              </w:rPr>
-              <w:t>Delivery organisation, using approved methods</w:t>
-            </w:r>
-          </w:p>
-        </w:tc>
-        <w:tc>
-          <w:tcPr>
-            <w:tcW w:w="4857" w:type="dxa"/>
-            <w:tcBorders>
-              <w:top w:val="single" w:sz="4" w:space="0" w:color="A89662"/>
-              <w:left w:val="single" w:sz="4" w:space="0" w:color="A89662"/>
-              <w:bottom w:val="single" w:sz="4" w:space="0" w:color="A89662"/>
-              <w:right w:val="single" w:sz="4" w:space="0" w:color="A89662"/>
-            </w:tcBorders>
-          </w:tcPr>
-          <w:p>
-            <w:pPr>
-              <w:pStyle w:val="Normal"/>
-              <w:spacing w:before="20" w:after="20"/>
-              <w:rPr/>
-            </w:pPr>
-            <w:r>
-              <w:rPr>
-                <w:rFonts w:cs="Book Antiqua"/>
-                <w:color w:val="000000"/>
-                <w:sz w:val="19"/>
-              </w:rPr>
-              <w:t>Proportionate training feedback and product-level performance data</w:t>
-            </w:r>
-          </w:p>
-        </w:tc>
-      </w:tr>
-      <w:tr>
-        <w:trPr>
-          <w:cantSplit w:val="true"/>
-        </w:trPr>
-        <w:tc>
-          <w:tcPr>
-            <w:tcW w:w="4857" w:type="dxa"/>
-            <w:tcBorders>
-              <w:top w:val="single" w:sz="4" w:space="0" w:color="A89662"/>
-              <w:left w:val="single" w:sz="4" w:space="0" w:color="A89662"/>
-              <w:bottom w:val="single" w:sz="4" w:space="0" w:color="A89662"/>
-              <w:right w:val="single" w:sz="4" w:space="0" w:color="A89662"/>
-            </w:tcBorders>
-          </w:tcPr>
-          <w:p>
-            <w:pPr>
-              <w:pStyle w:val="Normal"/>
-              <w:spacing w:before="20" w:after="20"/>
-              <w:rPr/>
-            </w:pPr>
-            <w:r>
-              <w:rPr>
-                <w:rFonts w:cs="Book Antiqua"/>
-                <w:color w:val="000000"/>
-                <w:sz w:val="19"/>
-              </w:rPr>
-              <w:t>Evaluate product effectiveness</w:t>
-            </w:r>
-          </w:p>
-        </w:tc>
-        <w:tc>
-          <w:tcPr>
-            <w:tcW w:w="4857" w:type="dxa"/>
-            <w:tcBorders>
-              <w:top w:val="single" w:sz="4" w:space="0" w:color="A89662"/>
-              <w:left w:val="single" w:sz="4" w:space="0" w:color="A89662"/>
-              <w:bottom w:val="single" w:sz="4" w:space="0" w:color="A89662"/>
-              <w:right w:val="single" w:sz="4" w:space="0" w:color="A89662"/>
-            </w:tcBorders>
-          </w:tcPr>
-          <w:p>
-            <w:pPr>
-              <w:pStyle w:val="Normal"/>
-              <w:spacing w:before="20" w:after="20"/>
-              <w:rPr/>
-            </w:pPr>
-            <w:r>
-              <w:rPr>
-                <w:rFonts w:cs="Book Antiqua"/>
-                <w:color w:val="000000"/>
-                <w:sz w:val="19"/>
-              </w:rPr>
-              <w:t>Product owner, with independent evaluation or research support</w:t>
-            </w:r>
-          </w:p>
-        </w:tc>
-        <w:tc>
-          <w:tcPr>
-            <w:tcW w:w="4857" w:type="dxa"/>
-            <w:tcBorders>
-              <w:top w:val="single" w:sz="4" w:space="0" w:color="A89662"/>
-              <w:left w:val="single" w:sz="4" w:space="0" w:color="A89662"/>
-              <w:bottom w:val="single" w:sz="4" w:space="0" w:color="A89662"/>
-              <w:right w:val="single" w:sz="4" w:space="0" w:color="A89662"/>
-            </w:tcBorders>
-          </w:tcPr>
-          <w:p>
-            <w:pPr>
-              <w:pStyle w:val="Normal"/>
-              <w:spacing w:before="20" w:after="20"/>
-              <w:rPr/>
-            </w:pPr>
-            <w:r>
-              <w:rPr>
-                <w:rFonts w:cs="Book Antiqua"/>
-                <w:color w:val="000000"/>
-                <w:sz w:val="19"/>
-              </w:rPr>
-              <w:t>Evidence of feasibility, effectiveness, transfer and scalability</w:t>
-            </w:r>
-          </w:p>
-        </w:tc>
-      </w:tr>
-      <w:tr>
-        <w:trPr>
-          <w:cantSplit w:val="true"/>
-        </w:trPr>
-        <w:tc>
-          <w:tcPr>
-            <w:tcW w:w="4857" w:type="dxa"/>
-            <w:tcBorders>
-              <w:top w:val="single" w:sz="4" w:space="0" w:color="A89662"/>
-              <w:left w:val="single" w:sz="4" w:space="0" w:color="A89662"/>
-              <w:bottom w:val="single" w:sz="4" w:space="0" w:color="A89662"/>
-              <w:right w:val="single" w:sz="4" w:space="0" w:color="A89662"/>
-            </w:tcBorders>
-          </w:tcPr>
-          <w:p>
-            <w:pPr>
-              <w:pStyle w:val="Normal"/>
-              <w:spacing w:before="20" w:after="20"/>
-              <w:rPr/>
-            </w:pPr>
-            <w:r>
-              <w:rPr>
-                <w:rFonts w:cs="Book Antiqua"/>
-                <w:color w:val="000000"/>
-                <w:sz w:val="19"/>
-              </w:rPr>
-              <w:t>Assure</w:t>
-            </w:r>
-          </w:p>
-        </w:tc>
-        <w:tc>
-          <w:tcPr>
-            <w:tcW w:w="4857" w:type="dxa"/>
-            <w:tcBorders>
-              <w:top w:val="single" w:sz="4" w:space="0" w:color="A89662"/>
-              <w:left w:val="single" w:sz="4" w:space="0" w:color="A89662"/>
-              <w:bottom w:val="single" w:sz="4" w:space="0" w:color="A89662"/>
-              <w:right w:val="single" w:sz="4" w:space="0" w:color="A89662"/>
-            </w:tcBorders>
-          </w:tcPr>
-          <w:p>
-            <w:pPr>
-              <w:pStyle w:val="Normal"/>
-              <w:spacing w:before="20" w:after="20"/>
-              <w:rPr/>
-            </w:pPr>
-            <w:r>
-              <w:rPr>
-                <w:rFonts w:cs="Book Antiqua"/>
-                <w:color w:val="000000"/>
-                <w:sz w:val="19"/>
-              </w:rPr>
-              <w:t>Layered governance and domain authorities</w:t>
-            </w:r>
-          </w:p>
-        </w:tc>
-        <w:tc>
-          <w:tcPr>
-            <w:tcW w:w="4857" w:type="dxa"/>
-            <w:tcBorders>
-              <w:top w:val="single" w:sz="4" w:space="0" w:color="A89662"/>
-              <w:left w:val="single" w:sz="4" w:space="0" w:color="A89662"/>
-              <w:bottom w:val="single" w:sz="4" w:space="0" w:color="A89662"/>
-              <w:right w:val="single" w:sz="4" w:space="0" w:color="A89662"/>
-            </w:tcBorders>
-          </w:tcPr>
-          <w:p>
-            <w:pPr>
-              <w:pStyle w:val="Normal"/>
-              <w:spacing w:before="20" w:after="20"/>
-              <w:rPr/>
-            </w:pPr>
-            <w:r>
-              <w:rPr>
-                <w:rFonts w:cs="Book Antiqua"/>
-                <w:color w:val="000000"/>
-                <w:sz w:val="19"/>
-              </w:rPr>
-              <w:t>Doctrine, evidence, professional, learning, delivery and operational assurance</w:t>
-            </w:r>
-          </w:p>
-        </w:tc>
-      </w:tr>
-      <w:tr>
-        <w:trPr>
-          <w:cantSplit w:val="true"/>
-        </w:trPr>
-        <w:tc>
-          <w:tcPr>
-            <w:tcW w:w="4857" w:type="dxa"/>
-            <w:tcBorders>
-              <w:top w:val="single" w:sz="4" w:space="0" w:color="A89662"/>
-              <w:left w:val="single" w:sz="4" w:space="0" w:color="A89662"/>
-              <w:bottom w:val="single" w:sz="4" w:space="0" w:color="A89662"/>
-              <w:right w:val="single" w:sz="4" w:space="0" w:color="A89662"/>
-            </w:tcBorders>
-          </w:tcPr>
-          <w:p>
-            <w:pPr>
-              <w:pStyle w:val="Normal"/>
-              <w:spacing w:before="20" w:after="20"/>
-              <w:rPr/>
-            </w:pPr>
-            <w:r>
-              <w:rPr>
-                <w:rFonts w:cs="Book Antiqua"/>
-                <w:color w:val="000000"/>
-                <w:sz w:val="19"/>
-              </w:rPr>
-              <w:t>Review and recover</w:t>
-            </w:r>
-          </w:p>
-        </w:tc>
-        <w:tc>
-          <w:tcPr>
-            <w:tcW w:w="4857" w:type="dxa"/>
-            <w:tcBorders>
-              <w:top w:val="single" w:sz="4" w:space="0" w:color="A89662"/>
-              <w:left w:val="single" w:sz="4" w:space="0" w:color="A89662"/>
-              <w:bottom w:val="single" w:sz="4" w:space="0" w:color="A89662"/>
-              <w:right w:val="single" w:sz="4" w:space="0" w:color="A89662"/>
-            </w:tcBorders>
-          </w:tcPr>
-          <w:p>
-            <w:pPr>
-              <w:pStyle w:val="Normal"/>
-              <w:spacing w:before="20" w:after="20"/>
-              <w:rPr/>
-            </w:pPr>
-            <w:r>
-              <w:rPr>
-                <w:rFonts w:cs="Book Antiqua"/>
-                <w:color w:val="000000"/>
-                <w:sz w:val="19"/>
-              </w:rPr>
-              <w:t>Relevant leadership and training systems</w:t>
-            </w:r>
-          </w:p>
-        </w:tc>
-        <w:tc>
-          <w:tcPr>
-            <w:tcW w:w="4857" w:type="dxa"/>
-            <w:tcBorders>
-              <w:top w:val="single" w:sz="4" w:space="0" w:color="A89662"/>
-              <w:left w:val="single" w:sz="4" w:space="0" w:color="A89662"/>
-              <w:bottom w:val="single" w:sz="4" w:space="0" w:color="A89662"/>
-              <w:right w:val="single" w:sz="4" w:space="0" w:color="A89662"/>
-            </w:tcBorders>
-          </w:tcPr>
-          <w:p>
-            <w:pPr>
-              <w:pStyle w:val="Normal"/>
-              <w:spacing w:before="20" w:after="20"/>
-              <w:rPr/>
-            </w:pPr>
-            <w:r>
-              <w:rPr>
-                <w:rFonts w:cs="Book Antiqua"/>
-                <w:color w:val="000000"/>
-                <w:sz w:val="19"/>
-              </w:rPr>
-              <w:t>Reflection, feedback, recovery and developmental planning</w:t>
-            </w:r>
-          </w:p>
-        </w:tc>
-      </w:tr>
-    </w:tbl>
     <w:sectPr>
-      <w:headerReference w:type="default" r:id="rId20"/>
-      <w:headerReference w:type="first" r:id="rId21"/>
-      <w:footerReference w:type="even" r:id="rId22"/>
-      <w:footerReference w:type="default" r:id="rId23"/>
-      <w:footerReference w:type="first" r:id="rId24"/>
+      <w:headerReference w:type="default" r:id="rId15"/>
+      <w:headerReference w:type="first" r:id="rId16"/>
+      <w:footerReference w:type="even" r:id="rId17"/>
+      <w:footerReference w:type="default" r:id="rId18"/>
+      <w:footerReference w:type="first" r:id="rId19"/>
       <w:type w:val="nextPage"/>
-      <w:pgSz w:orient="landscape" w:w="16838" w:h="11906"/>
-      <w:pgMar w:left="1134" w:right="1134" w:gutter="0" w:header="624" w:top="850" w:footer="624" w:bottom="850"/>
+      <w:pgSz w:w="11906" w:h="16838"/>
+      <w:pgMar w:left="1417" w:right="1417" w:gutter="0" w:header="624" w:top="1361" w:footer="624" w:bottom="1361"/>
       <w:pgNumType w:fmt="decimal"/>
       <w:formProt w:val="false"/>
       <w:textDirection w:val="lrTb"/>
@@ -3468,152 +2350,6 @@
 </w:ftr>
 </file>
 
-<file path=word/footer10.xml><?xml version="1.0" encoding="utf-8"?>
-<w:ftr xmlns:o="urn:schemas-microsoft-com:office:office" xmlns:r="http://schemas.openxmlformats.org/officeDocument/2006/relationships" xmlns:v="urn:schemas-microsoft-com:vml" xmlns:w="http://schemas.openxmlformats.org/wordprocessingml/2006/main" xmlns:w10="urn:schemas-microsoft-com:office:word" xmlns:wp="http://schemas.openxmlformats.org/drawingml/2006/wordprocessingDrawing" xmlns:wps="http://schemas.microsoft.com/office/word/2010/wordprocessingShape" xmlns:wpg="http://schemas.microsoft.com/office/word/2010/wordprocessingGroup" xmlns:mc="http://schemas.openxmlformats.org/markup-compatibility/2006" xmlns:wp14="http://schemas.microsoft.com/office/word/2010/wordprocessingDrawing" xmlns:w14="http://schemas.microsoft.com/office/word/2010/wordml" xmlns:w15="http://schemas.microsoft.com/office/word/2012/wordml" mc:Ignorable="w14 wp14 w15">
-  <w:p>
-    <w:pPr>
-      <w:pStyle w:val="Footer"/>
-      <w:rPr/>
-    </w:pPr>
-    <w:r>
-      <w:rPr/>
-    </w:r>
-  </w:p>
-</w:ftr>
-</file>
-
-<file path=word/footer11.xml><?xml version="1.0" encoding="utf-8"?>
-<w:ftr xmlns:o="urn:schemas-microsoft-com:office:office" xmlns:r="http://schemas.openxmlformats.org/officeDocument/2006/relationships" xmlns:v="urn:schemas-microsoft-com:vml" xmlns:w="http://schemas.openxmlformats.org/wordprocessingml/2006/main" xmlns:w10="urn:schemas-microsoft-com:office:word" xmlns:wp="http://schemas.openxmlformats.org/drawingml/2006/wordprocessingDrawing" xmlns:wps="http://schemas.microsoft.com/office/word/2010/wordprocessingShape" xmlns:wpg="http://schemas.microsoft.com/office/word/2010/wordprocessingGroup" xmlns:mc="http://schemas.openxmlformats.org/markup-compatibility/2006" xmlns:wp14="http://schemas.microsoft.com/office/word/2010/wordprocessingDrawing" xmlns:w14="http://schemas.microsoft.com/office/word/2010/wordml" xmlns:w15="http://schemas.microsoft.com/office/word/2012/wordml" mc:Ignorable="w14 wp14 w15">
-  <w:p>
-    <w:pPr>
-      <w:pStyle w:val="Footer"/>
-      <w:spacing w:before="0" w:after="0"/>
-      <w:jc w:val="center"/>
-      <w:rPr/>
-    </w:pPr>
-    <w:r>
-      <w:rPr>
-        <w:rFonts w:cs="Arial" w:ascii="Arial" w:hAnsi="Arial"/>
-        <w:b/>
-        <w:color w:val="000000"/>
-        <w:sz w:val="20"/>
-      </w:rPr>
-      <w:t>UNCLASSIFIED</w:t>
-    </w:r>
-  </w:p>
-  <w:p>
-    <w:pPr>
-      <w:pStyle w:val="Normal"/>
-      <w:tabs>
-        <w:tab w:val="clear" w:pos="720"/>
-        <w:tab w:val="center" w:pos="7285" w:leader="none"/>
-        <w:tab w:val="right" w:pos="14570" w:leader="none"/>
-      </w:tabs>
-      <w:spacing w:before="40" w:after="0"/>
-      <w:rPr/>
-    </w:pPr>
-    <w:r>
-      <w:rPr>
-        <w:rFonts w:cs="Arial" w:ascii="Arial" w:hAnsi="Arial"/>
-        <w:b w:val="false"/>
-        <w:color w:val="000000"/>
-        <w:sz w:val="17"/>
-      </w:rPr>
-      <w:t>Combat Mindset Framework Proposal</w:t>
-      <w:tab/>
-      <w:t>ACS 2026</w:t>
-      <w:tab/>
-      <w:t xml:space="preserve">Page </w:t>
-    </w:r>
-    <w:r>
-      <w:rPr>
-        <w:rFonts w:cs="Arial" w:ascii="Arial" w:hAnsi="Arial"/>
-        <w:sz w:val="17"/>
-      </w:rPr>
-      <w:fldChar w:fldCharType="begin"/>
-    </w:r>
-    <w:r>
-      <w:rPr>
-        <w:sz w:val="17"/>
-        <w:rFonts w:cs="Arial" w:ascii="Arial" w:hAnsi="Arial"/>
-      </w:rPr>
-      <w:instrText xml:space="preserve"> PAGE </w:instrText>
-    </w:r>
-    <w:r>
-      <w:rPr>
-        <w:sz w:val="17"/>
-        <w:rFonts w:cs="Arial" w:ascii="Arial" w:hAnsi="Arial"/>
-      </w:rPr>
-      <w:fldChar w:fldCharType="separate"/>
-    </w:r>
-    <w:r>
-      <w:rPr>
-        <w:sz w:val="17"/>
-        <w:rFonts w:cs="Arial" w:ascii="Arial" w:hAnsi="Arial"/>
-      </w:rPr>
-      <w:t>10</w:t>
-    </w:r>
-    <w:r>
-      <w:rPr>
-        <w:sz w:val="17"/>
-        <w:rFonts w:cs="Arial" w:ascii="Arial" w:hAnsi="Arial"/>
-      </w:rPr>
-      <w:fldChar w:fldCharType="end"/>
-    </w:r>
-    <w:r>
-      <w:rPr>
-        <w:rFonts w:cs="Arial" w:ascii="Arial" w:hAnsi="Arial"/>
-        <w:b w:val="false"/>
-        <w:color w:val="000000"/>
-        <w:sz w:val="17"/>
-      </w:rPr>
-      <w:t xml:space="preserve"> of </w:t>
-    </w:r>
-    <w:r>
-      <w:rPr>
-        <w:rFonts w:cs="Arial" w:ascii="Arial" w:hAnsi="Arial"/>
-        <w:sz w:val="17"/>
-      </w:rPr>
-      <w:fldChar w:fldCharType="begin"/>
-    </w:r>
-    <w:r>
-      <w:rPr>
-        <w:sz w:val="17"/>
-        <w:rFonts w:cs="Arial" w:ascii="Arial" w:hAnsi="Arial"/>
-      </w:rPr>
-      <w:instrText xml:space="preserve"> NUMPAGES </w:instrText>
-    </w:r>
-    <w:r>
-      <w:rPr>
-        <w:sz w:val="17"/>
-        <w:rFonts w:cs="Arial" w:ascii="Arial" w:hAnsi="Arial"/>
-      </w:rPr>
-      <w:fldChar w:fldCharType="separate"/>
-    </w:r>
-    <w:r>
-      <w:rPr>
-        <w:sz w:val="17"/>
-        <w:rFonts w:cs="Arial" w:ascii="Arial" w:hAnsi="Arial"/>
-      </w:rPr>
-      <w:t>10</w:t>
-    </w:r>
-    <w:r>
-      <w:rPr>
-        <w:sz w:val="17"/>
-        <w:rFonts w:cs="Arial" w:ascii="Arial" w:hAnsi="Arial"/>
-      </w:rPr>
-      <w:fldChar w:fldCharType="end"/>
-    </w:r>
-  </w:p>
-</w:ftr>
-</file>
-
-<file path=word/footer12.xml><?xml version="1.0" encoding="utf-8"?>
-<w:ftr xmlns:o="urn:schemas-microsoft-com:office:office" xmlns:r="http://schemas.openxmlformats.org/officeDocument/2006/relationships" xmlns:v="urn:schemas-microsoft-com:vml" xmlns:w="http://schemas.openxmlformats.org/wordprocessingml/2006/main" xmlns:w10="urn:schemas-microsoft-com:office:word" xmlns:wp="http://schemas.openxmlformats.org/drawingml/2006/wordprocessingDrawing" xmlns:wps="http://schemas.microsoft.com/office/word/2010/wordprocessingShape" xmlns:wpg="http://schemas.microsoft.com/office/word/2010/wordprocessingGroup" xmlns:mc="http://schemas.openxmlformats.org/markup-compatibility/2006" xmlns:wp14="http://schemas.microsoft.com/office/word/2010/wordprocessingDrawing" xmlns:w14="http://schemas.microsoft.com/office/word/2010/wordml" xmlns:w15="http://schemas.microsoft.com/office/word/2012/wordml" mc:Ignorable="w14 wp14 w15">
-  <w:p/>
-</w:ftr>
-</file>
-
 <file path=word/footer2.xml><?xml version="1.0" encoding="utf-8"?>
 <w:ftr xmlns:o="urn:schemas-microsoft-com:office:office" xmlns:r="http://schemas.openxmlformats.org/officeDocument/2006/relationships" xmlns:v="urn:schemas-microsoft-com:vml" xmlns:w="http://schemas.openxmlformats.org/wordprocessingml/2006/main" xmlns:w10="urn:schemas-microsoft-com:office:word" xmlns:wp="http://schemas.openxmlformats.org/drawingml/2006/wordprocessingDrawing" xmlns:wps="http://schemas.microsoft.com/office/word/2010/wordprocessingShape" xmlns:wpg="http://schemas.microsoft.com/office/word/2010/wordprocessingGroup" xmlns:mc="http://schemas.openxmlformats.org/markup-compatibility/2006" xmlns:wp14="http://schemas.microsoft.com/office/word/2010/wordprocessingDrawing" xmlns:w14="http://schemas.microsoft.com/office/word/2010/wordml" xmlns:w15="http://schemas.microsoft.com/office/word/2012/wordml" mc:Ignorable="w14 wp14 w15">
   <w:p>
@@ -3727,7 +2463,7 @@
         <w:sz w:val="17"/>
         <w:rFonts w:cs="Arial" w:ascii="Arial" w:hAnsi="Arial"/>
       </w:rPr>
-      <w:t>10</w:t>
+      <w:t>8</w:t>
     </w:r>
     <w:r>
       <w:rPr>
@@ -3889,7 +2625,7 @@
         <w:sz w:val="17"/>
         <w:rFonts w:cs="Arial" w:ascii="Arial" w:hAnsi="Arial"/>
       </w:rPr>
-      <w:t>10</w:t>
+      <w:t>8</w:t>
     </w:r>
     <w:r>
       <w:rPr>
@@ -3991,7 +2727,7 @@
         <w:sz w:val="17"/>
         <w:rFonts w:cs="Arial" w:ascii="Arial" w:hAnsi="Arial"/>
       </w:rPr>
-      <w:t>9</w:t>
+      <w:t>8</w:t>
     </w:r>
     <w:r>
       <w:rPr>
@@ -4035,7 +2771,7 @@
         <w:sz w:val="17"/>
         <w:rFonts w:cs="Arial" w:ascii="Arial" w:hAnsi="Arial"/>
       </w:rPr>
-      <w:t>10</w:t>
+      <w:t>8</w:t>
     </w:r>
     <w:r>
       <w:rPr>
@@ -4163,34 +2899,6 @@
 </file>
 
 <file path=word/header7.xml><?xml version="1.0" encoding="utf-8"?>
-<w:hdr xmlns:o="urn:schemas-microsoft-com:office:office" xmlns:r="http://schemas.openxmlformats.org/officeDocument/2006/relationships" xmlns:v="urn:schemas-microsoft-com:vml" xmlns:w="http://schemas.openxmlformats.org/wordprocessingml/2006/main" xmlns:w10="urn:schemas-microsoft-com:office:word" xmlns:wp="http://schemas.openxmlformats.org/drawingml/2006/wordprocessingDrawing" xmlns:wps="http://schemas.microsoft.com/office/word/2010/wordprocessingShape" xmlns:wpg="http://schemas.microsoft.com/office/word/2010/wordprocessingGroup" xmlns:mc="http://schemas.openxmlformats.org/markup-compatibility/2006" xmlns:wp14="http://schemas.microsoft.com/office/word/2010/wordprocessingDrawing" xmlns:w14="http://schemas.microsoft.com/office/word/2010/wordml" xmlns:w15="http://schemas.microsoft.com/office/word/2012/wordml" mc:Ignorable="w14 wp14 w15">
-  <w:p/>
-</w:hdr>
-</file>
-
-<file path=word/header8.xml><?xml version="1.0" encoding="utf-8"?>
-<w:hdr xmlns:o="urn:schemas-microsoft-com:office:office" xmlns:r="http://schemas.openxmlformats.org/officeDocument/2006/relationships" xmlns:v="urn:schemas-microsoft-com:vml" xmlns:w="http://schemas.openxmlformats.org/wordprocessingml/2006/main" xmlns:w10="urn:schemas-microsoft-com:office:word" xmlns:wp="http://schemas.openxmlformats.org/drawingml/2006/wordprocessingDrawing" xmlns:wps="http://schemas.microsoft.com/office/word/2010/wordprocessingShape" xmlns:wpg="http://schemas.microsoft.com/office/word/2010/wordprocessingGroup" xmlns:mc="http://schemas.openxmlformats.org/markup-compatibility/2006" xmlns:wp14="http://schemas.microsoft.com/office/word/2010/wordprocessingDrawing" xmlns:w14="http://schemas.microsoft.com/office/word/2010/wordml" xmlns:w15="http://schemas.microsoft.com/office/word/2012/wordml" mc:Ignorable="w14 wp14 w15">
-  <w:p>
-    <w:pPr>
-      <w:pStyle w:val="Header"/>
-      <w:spacing w:before="0" w:after="0"/>
-      <w:jc w:val="center"/>
-      <w:rPr/>
-    </w:pPr>
-    <w:r>
-      <w:rPr>
-        <w:rFonts w:cs="Arial" w:ascii="Arial" w:hAnsi="Arial"/>
-        <w:b/>
-        <w:color w:val="000000"/>
-        <w:sz w:val="20"/>
-      </w:rPr>
-      <w:t>UNCLASSIFIED</w:t>
-    </w:r>
-  </w:p>
-</w:hdr>
-</file>
-
-<file path=word/header9.xml><?xml version="1.0" encoding="utf-8"?>
 <w:hdr xmlns:o="urn:schemas-microsoft-com:office:office" xmlns:r="http://schemas.openxmlformats.org/officeDocument/2006/relationships" xmlns:v="urn:schemas-microsoft-com:vml" xmlns:w="http://schemas.openxmlformats.org/wordprocessingml/2006/main" xmlns:w10="urn:schemas-microsoft-com:office:word" xmlns:wp="http://schemas.openxmlformats.org/drawingml/2006/wordprocessingDrawing" xmlns:wps="http://schemas.microsoft.com/office/word/2010/wordprocessingShape" xmlns:wpg="http://schemas.microsoft.com/office/word/2010/wordprocessingGroup" xmlns:mc="http://schemas.openxmlformats.org/markup-compatibility/2006" xmlns:wp14="http://schemas.microsoft.com/office/word/2010/wordprocessingDrawing" xmlns:w14="http://schemas.microsoft.com/office/word/2010/wordml" xmlns:w15="http://schemas.microsoft.com/office/word/2012/wordml" mc:Ignorable="w14 wp14 w15">
   <w:p/>
 </w:hdr>

</xml_diff>

<commit_message>
Final editorial refinements before socialisation
The combat-specificity test reads significant mission or human
consequence. The problem opens on relevant capability, expertise and
activity, matching the diagnosis that follows. Phase 3 splits into two
sentences for readability, Phase 4 refers to bounded validation
activities or pilots rather than implying a complete product is field
tested, and Recommendation 3 endorses the definitions explicitly as the
drafting baseline for the programme.

Co-Authored-By: Claude Fable 5 <noreply@anthropic.com>
Claude-Session: https://claude.ai/code/session_01YLo1WfwUDkbwfJEF3ZNVbB
</commit_message>
<xml_diff>
--- a/output/combat-mindset-way-forward.docx
+++ b/output/combat-mindset-way-forward.docx
@@ -304,7 +304,7 @@
             </w:rPr>
             <w:fldChar w:fldCharType="separate"/>
           </w:r>
-          <w:hyperlink w:anchor="__RefHeading___Toc207_3139211550">
+          <w:hyperlink w:anchor="__RefHeading___Toc207_1934721245">
             <w:r>
               <w:rPr>
                 <w:webHidden/>
@@ -331,7 +331,7 @@
             </w:tabs>
             <w:rPr/>
           </w:pPr>
-          <w:hyperlink w:anchor="__RefHeading___Toc209_3139211550">
+          <w:hyperlink w:anchor="__RefHeading___Toc209_1934721245">
             <w:r>
               <w:rPr>
                 <w:webHidden/>
@@ -358,7 +358,7 @@
             </w:tabs>
             <w:rPr/>
           </w:pPr>
-          <w:hyperlink w:anchor="__RefHeading___Toc211_3139211550">
+          <w:hyperlink w:anchor="__RefHeading___Toc211_1934721245">
             <w:r>
               <w:rPr>
                 <w:webHidden/>
@@ -385,7 +385,7 @@
             </w:tabs>
             <w:rPr/>
           </w:pPr>
-          <w:hyperlink w:anchor="__RefHeading___Toc213_3139211550">
+          <w:hyperlink w:anchor="__RefHeading___Toc213_1934721245">
             <w:r>
               <w:rPr>
                 <w:webHidden/>
@@ -399,7 +399,7 @@
                 <w:rStyle w:val="IndexLink"/>
               </w:rPr>
               <w:tab/>
-              <w:t>5</w:t>
+              <w:t>4</w:t>
             </w:r>
           </w:hyperlink>
         </w:p>
@@ -412,7 +412,7 @@
             </w:tabs>
             <w:rPr/>
           </w:pPr>
-          <w:hyperlink w:anchor="__RefHeading___Toc215_3139211550">
+          <w:hyperlink w:anchor="__RefHeading___Toc215_1934721245">
             <w:r>
               <w:rPr>
                 <w:webHidden/>
@@ -439,7 +439,7 @@
             </w:tabs>
             <w:rPr/>
           </w:pPr>
-          <w:hyperlink w:anchor="__RefHeading___Toc217_3139211550">
+          <w:hyperlink w:anchor="__RefHeading___Toc217_1934721245">
             <w:r>
               <w:rPr>
                 <w:webHidden/>
@@ -466,7 +466,7 @@
             </w:tabs>
             <w:rPr/>
           </w:pPr>
-          <w:hyperlink w:anchor="__RefHeading___Toc219_3139211550">
+          <w:hyperlink w:anchor="__RefHeading___Toc219_1934721245">
             <w:r>
               <w:rPr>
                 <w:webHidden/>
@@ -521,7 +521,7 @@
         <w:spacing w:before="0" w:after="160"/>
         <w:rPr/>
       </w:pPr>
-      <w:bookmarkStart w:id="0" w:name="__RefHeading___Toc207_3139211550"/>
+      <w:bookmarkStart w:id="0" w:name="__RefHeading___Toc207_1934721245"/>
       <w:bookmarkEnd w:id="0"/>
       <w:r>
         <w:rPr>
@@ -603,7 +603,7 @@
         </w:pBdr>
         <w:rPr/>
       </w:pPr>
-      <w:bookmarkStart w:id="1" w:name="__RefHeading___Toc209_3139211550"/>
+      <w:bookmarkStart w:id="1" w:name="__RefHeading___Toc209_1934721245"/>
       <w:bookmarkEnd w:id="1"/>
       <w:r>
         <w:rPr>
@@ -693,7 +693,7 @@
         </w:pBdr>
         <w:rPr/>
       </w:pPr>
-      <w:bookmarkStart w:id="2" w:name="__RefHeading___Toc211_3139211550"/>
+      <w:bookmarkStart w:id="2" w:name="__RefHeading___Toc211_1934721245"/>
       <w:bookmarkEnd w:id="2"/>
       <w:r>
         <w:rPr>
@@ -717,7 +717,7 @@
           <w:b w:val="false"/>
           <w:i w:val="false"/>
         </w:rPr>
-        <w:t>Considerable work on Combat Mindset and Performance Under Pressure already exists across Army. What Army does not yet have is a coherent doctrine, governance and assurance model for Combat Mindset. The COMDT ACS guidance reaches the same diagnosis:</w:t>
+        <w:t>Considerable relevant capability, expertise and activity already exist across Army. What Army does not yet have is a coherent doctrine, governance and assurance model for Combat Mindset. The COMDT ACS guidance reaches the same diagnosis:</w:t>
       </w:r>
     </w:p>
     <w:p>
@@ -801,7 +801,7 @@
         </w:pBdr>
         <w:rPr/>
       </w:pPr>
-      <w:bookmarkStart w:id="3" w:name="__RefHeading___Toc213_3139211550"/>
+      <w:bookmarkStart w:id="3" w:name="__RefHeading___Toc213_1934721245"/>
       <w:bookmarkEnd w:id="3"/>
       <w:r>
         <w:rPr>
@@ -955,7 +955,7 @@
           <w:b w:val="false"/>
           <w:i w:val="false"/>
         </w:rPr>
-        <w:t>A product, method or activity is combat-specific where it develops or applies Performance Under Pressure in a context that represents or deliberately simulates the defining demands of combat: opposition or threat, significant consequence for mission or life, and ethical load. Products that do not represent these demands contribute to the enabling capability rather than its combat-specific expression.</w:t>
+        <w:t>A product, method or activity is combat-specific where it develops or applies Performance Under Pressure in a context that represents or deliberately simulates the defining demands of combat: opposition or threat, significant mission or human consequence, and ethical load. Products that do not represent these demands contribute to the enabling capability rather than its combat-specific expression.</w:t>
       </w:r>
     </w:p>
     <w:p>
@@ -1355,7 +1355,7 @@
         </w:pBdr>
         <w:rPr/>
       </w:pPr>
-      <w:bookmarkStart w:id="4" w:name="__RefHeading___Toc215_3139211550"/>
+      <w:bookmarkStart w:id="4" w:name="__RefHeading___Toc215_1934721245"/>
       <w:bookmarkEnd w:id="4"/>
       <w:r>
         <w:rPr>
@@ -1539,7 +1539,7 @@
         </w:pBdr>
         <w:rPr/>
       </w:pPr>
-      <w:bookmarkStart w:id="5" w:name="__RefHeading___Toc217_3139211550"/>
+      <w:bookmarkStart w:id="5" w:name="__RefHeading___Toc217_1934721245"/>
       <w:bookmarkEnd w:id="5"/>
       <w:r>
         <w:rPr>
@@ -1905,7 +1905,7 @@
           <w:b w:val="false"/>
           <w:i w:val="false"/>
         </w:rPr>
-        <w:t>Develop the Combat Mindset Framework, delivery system and outcomes: the organising system through which Army will govern, develop, deliver and assure Performance Under Pressure and its combat-specific expression. The design will establish developmental outcomes from Lead Self through Lead Systems, the architecture through which existing and future products contribute, common assurance principles, and the criteria by which products are recognised as part of the framework.</w:t>
+        <w:t>Develop the Combat Mindset Framework, delivery system and outcomes. The framework will establish how Army governs, develops, delivers and assures Performance Under Pressure and its combat-specific expression. The design will set developmental outcomes from Lead Self through Lead Systems, the architecture through which existing and future products contribute, common assurance principles, and the criteria by which products are recognised as part of the framework.</w:t>
       </w:r>
     </w:p>
     <w:p>
@@ -1971,7 +1971,7 @@
           <w:b w:val="false"/>
           <w:i w:val="false"/>
         </w:rPr>
-        <w:t>Refine the framework with key stakeholders: convene ACS, NZALC, HPC, APS, ILD, selected training providers and units to test the framework, product architecture, governance model, implementation priorities, definition clarity and doctrinal coherence. Where time and unit availability permit, bounded pilots will be conducted within this phase or earlier alongside Phase 2 or Phase 3.</w:t>
+        <w:t>Refine the framework with key stakeholders: convene ACS, NZALC, HPC, APS, ILD, selected training providers and units to test the framework, product architecture, governance model, implementation priorities, definition clarity and doctrinal coherence. Where time and unit availability permit, bounded validation activities or pilots will be conducted within this phase or earlier alongside Phase 2 or Phase 3.</w:t>
       </w:r>
     </w:p>
     <w:p>
@@ -2083,7 +2083,7 @@
         </w:pBdr>
         <w:rPr/>
       </w:pPr>
-      <w:bookmarkStart w:id="6" w:name="__RefHeading___Toc219_3139211550"/>
+      <w:bookmarkStart w:id="6" w:name="__RefHeading___Toc219_1934721245"/>
       <w:bookmarkEnd w:id="6"/>
       <w:r>
         <w:rPr>
@@ -2215,7 +2215,7 @@
           <w:b w:val="false"/>
           <w:i w:val="false"/>
         </w:rPr>
-        <w:t xml:space="preserve"> the initial working definitions of Combat Mindset, Performance Under Pressure and the Combat Mindset Framework.</w:t>
+        <w:t xml:space="preserve"> the initial working definitions of Combat Mindset, Performance Under Pressure and the Combat Mindset Framework as the drafting baseline for the programme.</w:t>
       </w:r>
     </w:p>
     <w:p>

</xml_diff>

<commit_message>
Remove governance from Phase 2, which Phase 1 already addresses
Phase 2 now assesses existing doctrine, products and delivery. Updated in
the Purpose summary, the Phase 2 body and the model page, so governance
appears once, in Phase 1.

Co-Authored-By: Claude Fable 5 <noreply@anthropic.com>
Claude-Session: https://claude.ai/code/session_01YLo1WfwUDkbwfJEF3ZNVbB
</commit_message>
<xml_diff>
--- a/output/combat-mindset-way-forward.docx
+++ b/output/combat-mindset-way-forward.docx
@@ -304,7 +304,7 @@
             </w:rPr>
             <w:fldChar w:fldCharType="separate"/>
           </w:r>
-          <w:hyperlink w:anchor="__RefHeading___Toc207_1934721245">
+          <w:hyperlink w:anchor="__RefHeading___Toc207_1907301578">
             <w:r>
               <w:rPr>
                 <w:webHidden/>
@@ -331,7 +331,7 @@
             </w:tabs>
             <w:rPr/>
           </w:pPr>
-          <w:hyperlink w:anchor="__RefHeading___Toc209_1934721245">
+          <w:hyperlink w:anchor="__RefHeading___Toc209_1907301578">
             <w:r>
               <w:rPr>
                 <w:webHidden/>
@@ -358,7 +358,7 @@
             </w:tabs>
             <w:rPr/>
           </w:pPr>
-          <w:hyperlink w:anchor="__RefHeading___Toc211_1934721245">
+          <w:hyperlink w:anchor="__RefHeading___Toc211_1907301578">
             <w:r>
               <w:rPr>
                 <w:webHidden/>
@@ -385,7 +385,7 @@
             </w:tabs>
             <w:rPr/>
           </w:pPr>
-          <w:hyperlink w:anchor="__RefHeading___Toc213_1934721245">
+          <w:hyperlink w:anchor="__RefHeading___Toc213_1907301578">
             <w:r>
               <w:rPr>
                 <w:webHidden/>
@@ -412,7 +412,7 @@
             </w:tabs>
             <w:rPr/>
           </w:pPr>
-          <w:hyperlink w:anchor="__RefHeading___Toc215_1934721245">
+          <w:hyperlink w:anchor="__RefHeading___Toc215_1907301578">
             <w:r>
               <w:rPr>
                 <w:webHidden/>
@@ -439,7 +439,7 @@
             </w:tabs>
             <w:rPr/>
           </w:pPr>
-          <w:hyperlink w:anchor="__RefHeading___Toc217_1934721245">
+          <w:hyperlink w:anchor="__RefHeading___Toc217_1907301578">
             <w:r>
               <w:rPr>
                 <w:webHidden/>
@@ -466,7 +466,7 @@
             </w:tabs>
             <w:rPr/>
           </w:pPr>
-          <w:hyperlink w:anchor="__RefHeading___Toc219_1934721245">
+          <w:hyperlink w:anchor="__RefHeading___Toc219_1907301578">
             <w:r>
               <w:rPr>
                 <w:webHidden/>
@@ -521,7 +521,7 @@
         <w:spacing w:before="0" w:after="160"/>
         <w:rPr/>
       </w:pPr>
-      <w:bookmarkStart w:id="0" w:name="__RefHeading___Toc207_1934721245"/>
+      <w:bookmarkStart w:id="0" w:name="__RefHeading___Toc207_1907301578"/>
       <w:bookmarkEnd w:id="0"/>
       <w:r>
         <w:rPr>
@@ -603,7 +603,7 @@
         </w:pBdr>
         <w:rPr/>
       </w:pPr>
-      <w:bookmarkStart w:id="1" w:name="__RefHeading___Toc209_1934721245"/>
+      <w:bookmarkStart w:id="1" w:name="__RefHeading___Toc209_1907301578"/>
       <w:bookmarkEnd w:id="1"/>
       <w:r>
         <w:rPr>
@@ -641,7 +641,7 @@
           <w:b w:val="false"/>
           <w:i w:val="false"/>
         </w:rPr>
-        <w:t>The programme of work is phased: Phase 1 defines terminology, governance, roles and responsibilities; Phase 2 assesses existing doctrine, products, delivery and governance; Phase 3 designs the framework, its delivery system and outcomes; Phase 4 validates the framework with key stakeholders; and Phase 5 delivers the framework for approval and implementation.</w:t>
+        <w:t>The programme of work is phased: Phase 1 defines terminology, governance, roles and responsibilities; Phase 2 assesses existing doctrine, products and delivery; Phase 3 designs the framework, its delivery system and outcomes; Phase 4 validates the framework with key stakeholders; and Phase 5 delivers the framework for approval and implementation.</w:t>
       </w:r>
     </w:p>
     <w:p>
@@ -693,7 +693,7 @@
         </w:pBdr>
         <w:rPr/>
       </w:pPr>
-      <w:bookmarkStart w:id="2" w:name="__RefHeading___Toc211_1934721245"/>
+      <w:bookmarkStart w:id="2" w:name="__RefHeading___Toc211_1907301578"/>
       <w:bookmarkEnd w:id="2"/>
       <w:r>
         <w:rPr>
@@ -801,7 +801,7 @@
         </w:pBdr>
         <w:rPr/>
       </w:pPr>
-      <w:bookmarkStart w:id="3" w:name="__RefHeading___Toc213_1934721245"/>
+      <w:bookmarkStart w:id="3" w:name="__RefHeading___Toc213_1907301578"/>
       <w:bookmarkEnd w:id="3"/>
       <w:r>
         <w:rPr>
@@ -1355,7 +1355,7 @@
         </w:pBdr>
         <w:rPr/>
       </w:pPr>
-      <w:bookmarkStart w:id="4" w:name="__RefHeading___Toc215_1934721245"/>
+      <w:bookmarkStart w:id="4" w:name="__RefHeading___Toc215_1907301578"/>
       <w:bookmarkEnd w:id="4"/>
       <w:r>
         <w:rPr>
@@ -1539,7 +1539,7 @@
         </w:pBdr>
         <w:rPr/>
       </w:pPr>
-      <w:bookmarkStart w:id="5" w:name="__RefHeading___Toc217_1934721245"/>
+      <w:bookmarkStart w:id="5" w:name="__RefHeading___Toc217_1907301578"/>
       <w:bookmarkEnd w:id="5"/>
       <w:r>
         <w:rPr>
@@ -1659,7 +1659,7 @@
           <w:b w:val="false"/>
           <w:i w:val="false"/>
         </w:rPr>
-        <w:t>Assess existing doctrine, products, delivery and governance across ACS, NZALC, HPC, APS, ILD, training establishments and selected units against:</w:t>
+        <w:t>Assess existing doctrine, products and delivery across ACS, NZALC, HPC, APS, ILD, training establishments and selected units against:</w:t>
       </w:r>
     </w:p>
     <w:p>
@@ -2083,7 +2083,7 @@
         </w:pBdr>
         <w:rPr/>
       </w:pPr>
-      <w:bookmarkStart w:id="6" w:name="__RefHeading___Toc219_1934721245"/>
+      <w:bookmarkStart w:id="6" w:name="__RefHeading___Toc219_1907301578"/>
       <w:bookmarkEnd w:id="6"/>
       <w:r>
         <w:rPr>

</xml_diff>

<commit_message>
Shorten the Phase 2 delivery bullet to delivery organisations
Removes the reference to technical and professional authorities, keeping
Phase 2 clear of authority questions that Phase 1 resolves.

Co-Authored-By: Claude Fable 5 <noreply@anthropic.com>
Claude-Session: https://claude.ai/code/session_01YLo1WfwUDkbwfJEF3ZNVbB
</commit_message>
<xml_diff>
--- a/output/combat-mindset-way-forward.docx
+++ b/output/combat-mindset-way-forward.docx
@@ -304,7 +304,7 @@
             </w:rPr>
             <w:fldChar w:fldCharType="separate"/>
           </w:r>
-          <w:hyperlink w:anchor="__RefHeading___Toc207_1907301578">
+          <w:hyperlink w:anchor="__RefHeading___Toc207_2185207780">
             <w:r>
               <w:rPr>
                 <w:webHidden/>
@@ -331,7 +331,7 @@
             </w:tabs>
             <w:rPr/>
           </w:pPr>
-          <w:hyperlink w:anchor="__RefHeading___Toc209_1907301578">
+          <w:hyperlink w:anchor="__RefHeading___Toc209_2185207780">
             <w:r>
               <w:rPr>
                 <w:webHidden/>
@@ -358,7 +358,7 @@
             </w:tabs>
             <w:rPr/>
           </w:pPr>
-          <w:hyperlink w:anchor="__RefHeading___Toc211_1907301578">
+          <w:hyperlink w:anchor="__RefHeading___Toc211_2185207780">
             <w:r>
               <w:rPr>
                 <w:webHidden/>
@@ -385,7 +385,7 @@
             </w:tabs>
             <w:rPr/>
           </w:pPr>
-          <w:hyperlink w:anchor="__RefHeading___Toc213_1907301578">
+          <w:hyperlink w:anchor="__RefHeading___Toc213_2185207780">
             <w:r>
               <w:rPr>
                 <w:webHidden/>
@@ -412,7 +412,7 @@
             </w:tabs>
             <w:rPr/>
           </w:pPr>
-          <w:hyperlink w:anchor="__RefHeading___Toc215_1907301578">
+          <w:hyperlink w:anchor="__RefHeading___Toc215_2185207780">
             <w:r>
               <w:rPr>
                 <w:webHidden/>
@@ -439,7 +439,7 @@
             </w:tabs>
             <w:rPr/>
           </w:pPr>
-          <w:hyperlink w:anchor="__RefHeading___Toc217_1907301578">
+          <w:hyperlink w:anchor="__RefHeading___Toc217_2185207780">
             <w:r>
               <w:rPr>
                 <w:webHidden/>
@@ -466,7 +466,7 @@
             </w:tabs>
             <w:rPr/>
           </w:pPr>
-          <w:hyperlink w:anchor="__RefHeading___Toc219_1907301578">
+          <w:hyperlink w:anchor="__RefHeading___Toc219_2185207780">
             <w:r>
               <w:rPr>
                 <w:webHidden/>
@@ -521,7 +521,7 @@
         <w:spacing w:before="0" w:after="160"/>
         <w:rPr/>
       </w:pPr>
-      <w:bookmarkStart w:id="0" w:name="__RefHeading___Toc207_1907301578"/>
+      <w:bookmarkStart w:id="0" w:name="__RefHeading___Toc207_2185207780"/>
       <w:bookmarkEnd w:id="0"/>
       <w:r>
         <w:rPr>
@@ -603,7 +603,7 @@
         </w:pBdr>
         <w:rPr/>
       </w:pPr>
-      <w:bookmarkStart w:id="1" w:name="__RefHeading___Toc209_1907301578"/>
+      <w:bookmarkStart w:id="1" w:name="__RefHeading___Toc209_2185207780"/>
       <w:bookmarkEnd w:id="1"/>
       <w:r>
         <w:rPr>
@@ -693,7 +693,7 @@
         </w:pBdr>
         <w:rPr/>
       </w:pPr>
-      <w:bookmarkStart w:id="2" w:name="__RefHeading___Toc211_1907301578"/>
+      <w:bookmarkStart w:id="2" w:name="__RefHeading___Toc211_2185207780"/>
       <w:bookmarkEnd w:id="2"/>
       <w:r>
         <w:rPr>
@@ -801,7 +801,7 @@
         </w:pBdr>
         <w:rPr/>
       </w:pPr>
-      <w:bookmarkStart w:id="3" w:name="__RefHeading___Toc213_1907301578"/>
+      <w:bookmarkStart w:id="3" w:name="__RefHeading___Toc213_2185207780"/>
       <w:bookmarkEnd w:id="3"/>
       <w:r>
         <w:rPr>
@@ -1355,7 +1355,7 @@
         </w:pBdr>
         <w:rPr/>
       </w:pPr>
-      <w:bookmarkStart w:id="4" w:name="__RefHeading___Toc215_1907301578"/>
+      <w:bookmarkStart w:id="4" w:name="__RefHeading___Toc215_2185207780"/>
       <w:bookmarkEnd w:id="4"/>
       <w:r>
         <w:rPr>
@@ -1539,7 +1539,7 @@
         </w:pBdr>
         <w:rPr/>
       </w:pPr>
-      <w:bookmarkStart w:id="5" w:name="__RefHeading___Toc217_1907301578"/>
+      <w:bookmarkStart w:id="5" w:name="__RefHeading___Toc217_2185207780"/>
       <w:bookmarkEnd w:id="5"/>
       <w:r>
         <w:rPr>
@@ -1767,7 +1767,7 @@
           <w:b w:val="false"/>
           <w:i w:val="false"/>
         </w:rPr>
-        <w:t>delivery organisations and their technical and professional authorities;</w:t>
+        <w:t>delivery organisations;</w:t>
       </w:r>
     </w:p>
     <w:p>
@@ -2083,7 +2083,7 @@
         </w:pBdr>
         <w:rPr/>
       </w:pPr>
-      <w:bookmarkStart w:id="6" w:name="__RefHeading___Toc219_1907301578"/>
+      <w:bookmarkStart w:id="6" w:name="__RefHeading___Toc219_2185207780"/>
       <w:bookmarkEnd w:id="6"/>
       <w:r>
         <w:rPr>

</xml_diff>

<commit_message>
Set the body font to Arial to match the rest of the document
The body was Book Antiqua, which is absent on the build host and was
substituting to a Times clone in the rendered PDF. Body text now uses
Arial, the same face as the headings, the model page and the one-pager
suite. Size drops to 10.5pt with 1.2 line spacing to account for Arial's
larger x-height. The paper stays at eight pages.

Co-Authored-By: Claude Fable 5 <noreply@anthropic.com>
Claude-Session: https://claude.ai/code/session_01YLo1WfwUDkbwfJEF3ZNVbB
</commit_message>
<xml_diff>
--- a/output/combat-mindset-way-forward.docx
+++ b/output/combat-mindset-way-forward.docx
@@ -57,7 +57,7 @@
       </w:pPr>
       <w:r>
         <w:rPr>
-          <w:rFonts w:cs="Arial" w:ascii="Arial" w:hAnsi="Arial"/>
+          <w:rFonts w:cs="Arial"/>
           <w:b/>
           <w:color w:val="000000"/>
           <w:sz w:val="72"/>
@@ -76,7 +76,7 @@
       </w:pPr>
       <w:r>
         <w:rPr>
-          <w:rFonts w:cs="Arial" w:ascii="Arial" w:hAnsi="Arial"/>
+          <w:rFonts w:cs="Arial"/>
           <w:b/>
           <w:color w:val="002516"/>
           <w:sz w:val="34"/>
@@ -92,7 +92,7 @@
       </w:pPr>
       <w:r>
         <w:rPr>
-          <w:rFonts w:cs="Arial" w:ascii="Arial" w:hAnsi="Arial"/>
+          <w:rFonts w:cs="Arial"/>
           <w:color w:val="000000"/>
           <w:sz w:val="26"/>
         </w:rPr>
@@ -107,7 +107,7 @@
       </w:pPr>
       <w:r>
         <w:rPr>
-          <w:rFonts w:cs="Arial" w:ascii="Arial" w:hAnsi="Arial"/>
+          <w:rFonts w:cs="Arial"/>
           <w:b/>
           <w:color w:val="C62026"/>
           <w:sz w:val="26"/>
@@ -130,7 +130,7 @@
       </w:pPr>
       <w:r>
         <w:rPr>
-          <w:rFonts w:cs="Arial" w:ascii="Arial" w:hAnsi="Arial"/>
+          <w:rFonts w:cs="Arial"/>
           <w:b/>
           <w:color w:val="002516"/>
           <w:sz w:val="20"/>
@@ -140,7 +140,7 @@
       </w:r>
       <w:r>
         <w:rPr>
-          <w:rFonts w:cs="Arial" w:ascii="Arial" w:hAnsi="Arial"/>
+          <w:rFonts w:cs="Arial"/>
           <w:color w:val="000000"/>
           <w:sz w:val="20"/>
         </w:rPr>
@@ -159,7 +159,7 @@
       </w:pPr>
       <w:r>
         <w:rPr>
-          <w:rFonts w:cs="Arial" w:ascii="Arial" w:hAnsi="Arial"/>
+          <w:rFonts w:cs="Arial"/>
           <w:b/>
           <w:color w:val="002516"/>
           <w:sz w:val="20"/>
@@ -169,7 +169,7 @@
       </w:r>
       <w:r>
         <w:rPr>
-          <w:rFonts w:cs="Arial" w:ascii="Arial" w:hAnsi="Arial"/>
+          <w:rFonts w:cs="Arial"/>
           <w:color w:val="000000"/>
           <w:sz w:val="20"/>
         </w:rPr>
@@ -188,7 +188,7 @@
       </w:pPr>
       <w:r>
         <w:rPr>
-          <w:rFonts w:cs="Arial" w:ascii="Arial" w:hAnsi="Arial"/>
+          <w:rFonts w:cs="Arial"/>
           <w:b/>
           <w:color w:val="002516"/>
           <w:sz w:val="20"/>
@@ -198,7 +198,7 @@
       </w:r>
       <w:r>
         <w:rPr>
-          <w:rFonts w:cs="Arial" w:ascii="Arial" w:hAnsi="Arial"/>
+          <w:rFonts w:cs="Arial"/>
           <w:color w:val="000000"/>
           <w:sz w:val="20"/>
         </w:rPr>
@@ -220,7 +220,7 @@
       </w:pPr>
       <w:r>
         <w:rPr>
-          <w:rFonts w:cs="Arial" w:ascii="Arial" w:hAnsi="Arial"/>
+          <w:rFonts w:cs="Arial"/>
           <w:b/>
           <w:color w:val="002516"/>
           <w:sz w:val="20"/>
@@ -230,7 +230,7 @@
       </w:r>
       <w:r>
         <w:rPr>
-          <w:rFonts w:cs="Arial" w:ascii="Arial" w:hAnsi="Arial"/>
+          <w:rFonts w:cs="Arial"/>
           <w:color w:val="000000"/>
           <w:sz w:val="20"/>
         </w:rPr>
@@ -260,7 +260,7 @@
       </w:pPr>
       <w:r>
         <w:rPr>
-          <w:rFonts w:cs="Arial" w:ascii="Arial" w:hAnsi="Arial"/>
+          <w:rFonts w:cs="Arial"/>
           <w:b/>
           <w:color w:val="002516"/>
           <w:sz w:val="28"/>
@@ -304,7 +304,7 @@
             </w:rPr>
             <w:fldChar w:fldCharType="separate"/>
           </w:r>
-          <w:hyperlink w:anchor="__RefHeading___Toc207_2185207780">
+          <w:hyperlink w:anchor="__RefHeading___Toc207_871499688">
             <w:r>
               <w:rPr>
                 <w:webHidden/>
@@ -331,7 +331,7 @@
             </w:tabs>
             <w:rPr/>
           </w:pPr>
-          <w:hyperlink w:anchor="__RefHeading___Toc209_2185207780">
+          <w:hyperlink w:anchor="__RefHeading___Toc209_871499688">
             <w:r>
               <w:rPr>
                 <w:webHidden/>
@@ -358,7 +358,7 @@
             </w:tabs>
             <w:rPr/>
           </w:pPr>
-          <w:hyperlink w:anchor="__RefHeading___Toc211_2185207780">
+          <w:hyperlink w:anchor="__RefHeading___Toc211_871499688">
             <w:r>
               <w:rPr>
                 <w:webHidden/>
@@ -385,7 +385,7 @@
             </w:tabs>
             <w:rPr/>
           </w:pPr>
-          <w:hyperlink w:anchor="__RefHeading___Toc213_2185207780">
+          <w:hyperlink w:anchor="__RefHeading___Toc213_871499688">
             <w:r>
               <w:rPr>
                 <w:webHidden/>
@@ -412,7 +412,7 @@
             </w:tabs>
             <w:rPr/>
           </w:pPr>
-          <w:hyperlink w:anchor="__RefHeading___Toc215_2185207780">
+          <w:hyperlink w:anchor="__RefHeading___Toc215_871499688">
             <w:r>
               <w:rPr>
                 <w:webHidden/>
@@ -439,7 +439,7 @@
             </w:tabs>
             <w:rPr/>
           </w:pPr>
-          <w:hyperlink w:anchor="__RefHeading___Toc217_2185207780">
+          <w:hyperlink w:anchor="__RefHeading___Toc217_871499688">
             <w:r>
               <w:rPr>
                 <w:webHidden/>
@@ -453,7 +453,7 @@
                 <w:rStyle w:val="IndexLink"/>
               </w:rPr>
               <w:tab/>
-              <w:t>7</w:t>
+              <w:t>6</w:t>
             </w:r>
           </w:hyperlink>
         </w:p>
@@ -466,7 +466,7 @@
             </w:tabs>
             <w:rPr/>
           </w:pPr>
-          <w:hyperlink w:anchor="__RefHeading___Toc219_2185207780">
+          <w:hyperlink w:anchor="__RefHeading___Toc219_871499688">
             <w:r>
               <w:rPr>
                 <w:webHidden/>
@@ -521,11 +521,11 @@
         <w:spacing w:before="0" w:after="160"/>
         <w:rPr/>
       </w:pPr>
-      <w:bookmarkStart w:id="0" w:name="__RefHeading___Toc207_2185207780"/>
+      <w:bookmarkStart w:id="0" w:name="__RefHeading___Toc207_871499688"/>
       <w:bookmarkEnd w:id="0"/>
       <w:r>
         <w:rPr>
-          <w:rFonts w:cs="Arial" w:ascii="Arial" w:hAnsi="Arial"/>
+          <w:rFonts w:cs="Arial"/>
           <w:b/>
           <w:i w:val="false"/>
           <w:color w:val="002516"/>
@@ -603,11 +603,11 @@
         </w:pBdr>
         <w:rPr/>
       </w:pPr>
-      <w:bookmarkStart w:id="1" w:name="__RefHeading___Toc209_2185207780"/>
+      <w:bookmarkStart w:id="1" w:name="__RefHeading___Toc209_871499688"/>
       <w:bookmarkEnd w:id="1"/>
       <w:r>
         <w:rPr>
-          <w:rFonts w:cs="Arial" w:ascii="Arial" w:hAnsi="Arial"/>
+          <w:rFonts w:cs="Arial"/>
           <w:b/>
           <w:i w:val="false"/>
           <w:color w:val="002516"/>
@@ -623,7 +623,7 @@
       </w:pPr>
       <w:r>
         <w:rPr>
-          <w:rFonts w:cs="Book Antiqua"/>
+          <w:rFonts w:cs="Arial"/>
           <w:b w:val="false"/>
           <w:i w:val="false"/>
         </w:rPr>
@@ -637,7 +637,7 @@
       </w:pPr>
       <w:r>
         <w:rPr>
-          <w:rFonts w:cs="Book Antiqua"/>
+          <w:rFonts w:cs="Arial"/>
           <w:b w:val="false"/>
           <w:i w:val="false"/>
         </w:rPr>
@@ -651,7 +651,7 @@
       </w:pPr>
       <w:r>
         <w:rPr>
-          <w:rFonts w:cs="Book Antiqua"/>
+          <w:rFonts w:cs="Arial"/>
           <w:b w:val="false"/>
           <w:i w:val="false"/>
         </w:rPr>
@@ -665,7 +665,7 @@
       </w:pPr>
       <w:r>
         <w:rPr>
-          <w:rFonts w:cs="Book Antiqua"/>
+          <w:rFonts w:cs="Arial"/>
           <w:b w:val="false"/>
           <w:i w:val="false"/>
         </w:rPr>
@@ -693,11 +693,11 @@
         </w:pBdr>
         <w:rPr/>
       </w:pPr>
-      <w:bookmarkStart w:id="2" w:name="__RefHeading___Toc211_2185207780"/>
+      <w:bookmarkStart w:id="2" w:name="__RefHeading___Toc211_871499688"/>
       <w:bookmarkEnd w:id="2"/>
       <w:r>
         <w:rPr>
-          <w:rFonts w:cs="Arial" w:ascii="Arial" w:hAnsi="Arial"/>
+          <w:rFonts w:cs="Arial"/>
           <w:b/>
           <w:i w:val="false"/>
           <w:color w:val="002516"/>
@@ -713,7 +713,7 @@
       </w:pPr>
       <w:r>
         <w:rPr>
-          <w:rFonts w:cs="Book Antiqua"/>
+          <w:rFonts w:cs="Arial"/>
           <w:b w:val="false"/>
           <w:i w:val="false"/>
         </w:rPr>
@@ -729,7 +729,7 @@
       </w:pPr>
       <w:r>
         <w:rPr>
-          <w:rFonts w:cs="Book Antiqua"/>
+          <w:rFonts w:cs="Arial"/>
           <w:b w:val="false"/>
           <w:i/>
         </w:rPr>
@@ -743,7 +743,7 @@
       </w:pPr>
       <w:r>
         <w:rPr>
-          <w:rFonts w:cs="Book Antiqua"/>
+          <w:rFonts w:cs="Arial"/>
           <w:b w:val="false"/>
           <w:i w:val="false"/>
         </w:rPr>
@@ -759,7 +759,7 @@
       </w:pPr>
       <w:r>
         <w:rPr>
-          <w:rFonts w:cs="Book Antiqua"/>
+          <w:rFonts w:cs="Arial"/>
           <w:b w:val="false"/>
           <w:i/>
         </w:rPr>
@@ -773,7 +773,7 @@
       </w:pPr>
       <w:r>
         <w:rPr>
-          <w:rFonts w:cs="Book Antiqua"/>
+          <w:rFonts w:cs="Arial"/>
           <w:b w:val="false"/>
           <w:i w:val="false"/>
         </w:rPr>
@@ -801,11 +801,11 @@
         </w:pBdr>
         <w:rPr/>
       </w:pPr>
-      <w:bookmarkStart w:id="3" w:name="__RefHeading___Toc213_2185207780"/>
+      <w:bookmarkStart w:id="3" w:name="__RefHeading___Toc213_871499688"/>
       <w:bookmarkEnd w:id="3"/>
       <w:r>
         <w:rPr>
-          <w:rFonts w:cs="Arial" w:ascii="Arial" w:hAnsi="Arial"/>
+          <w:rFonts w:cs="Arial"/>
           <w:b/>
           <w:i w:val="false"/>
           <w:color w:val="002516"/>
@@ -821,7 +821,7 @@
       </w:pPr>
       <w:r>
         <w:rPr>
-          <w:rFonts w:cs="Book Antiqua"/>
+          <w:rFonts w:cs="Arial"/>
           <w:b w:val="false"/>
           <w:i w:val="false"/>
         </w:rPr>
@@ -835,7 +835,7 @@
       </w:pPr>
       <w:r>
         <w:rPr>
-          <w:rFonts w:cs="Arial" w:ascii="Arial" w:hAnsi="Arial"/>
+          <w:rFonts w:cs="Arial"/>
           <w:b/>
           <w:i w:val="false"/>
           <w:color w:val="000000"/>
@@ -851,7 +851,7 @@
       </w:pPr>
       <w:r>
         <w:rPr>
-          <w:rFonts w:cs="Book Antiqua"/>
+          <w:rFonts w:cs="Arial"/>
           <w:b w:val="false"/>
           <w:i w:val="false"/>
         </w:rPr>
@@ -865,7 +865,7 @@
       </w:pPr>
       <w:r>
         <w:rPr>
-          <w:rFonts w:cs="Book Antiqua"/>
+          <w:rFonts w:cs="Arial"/>
           <w:b w:val="false"/>
           <w:i w:val="false"/>
         </w:rPr>
@@ -881,7 +881,7 @@
       </w:pPr>
       <w:r>
         <w:rPr>
-          <w:rFonts w:cs="Book Antiqua"/>
+          <w:rFonts w:cs="Arial"/>
           <w:b/>
           <w:i/>
         </w:rPr>
@@ -889,7 +889,7 @@
       </w:r>
       <w:r>
         <w:rPr>
-          <w:rFonts w:cs="Book Antiqua"/>
+          <w:rFonts w:cs="Arial"/>
           <w:b w:val="false"/>
           <w:i/>
         </w:rPr>
@@ -905,7 +905,7 @@
       </w:pPr>
       <w:r>
         <w:rPr>
-          <w:rFonts w:cs="Book Antiqua"/>
+          <w:rFonts w:cs="Arial"/>
           <w:b/>
           <w:i/>
         </w:rPr>
@@ -913,7 +913,7 @@
       </w:r>
       <w:r>
         <w:rPr>
-          <w:rFonts w:cs="Book Antiqua"/>
+          <w:rFonts w:cs="Arial"/>
           <w:b w:val="false"/>
           <w:i/>
         </w:rPr>
@@ -929,7 +929,7 @@
       </w:pPr>
       <w:r>
         <w:rPr>
-          <w:rFonts w:cs="Book Antiqua"/>
+          <w:rFonts w:cs="Arial"/>
           <w:b/>
           <w:i/>
         </w:rPr>
@@ -937,7 +937,7 @@
       </w:r>
       <w:r>
         <w:rPr>
-          <w:rFonts w:cs="Book Antiqua"/>
+          <w:rFonts w:cs="Arial"/>
           <w:b w:val="false"/>
           <w:i/>
         </w:rPr>
@@ -951,7 +951,7 @@
       </w:pPr>
       <w:r>
         <w:rPr>
-          <w:rFonts w:cs="Book Antiqua"/>
+          <w:rFonts w:cs="Arial"/>
           <w:b w:val="false"/>
           <w:i w:val="false"/>
         </w:rPr>
@@ -967,7 +967,7 @@
       </w:pPr>
       <w:r>
         <w:rPr>
-          <w:rFonts w:cs="Book Antiqua"/>
+          <w:rFonts w:cs="Arial"/>
           <w:b w:val="false"/>
           <w:i/>
         </w:rPr>
@@ -987,7 +987,7 @@
       </w:pPr>
       <w:r>
         <w:rPr>
-          <w:rFonts w:cs="Arial" w:ascii="Arial" w:hAnsi="Arial"/>
+          <w:rFonts w:cs="Arial"/>
           <w:b/>
           <w:color w:val="C62026"/>
         </w:rPr>
@@ -995,7 +995,7 @@
       </w:r>
       <w:r>
         <w:rPr>
-          <w:rFonts w:cs="Arial" w:ascii="Arial" w:hAnsi="Arial"/>
+          <w:rFonts w:cs="Arial"/>
           <w:b/>
           <w:color w:val="C62026"/>
         </w:rPr>
@@ -1003,7 +1003,7 @@
       </w:r>
       <w:r>
         <w:rPr>
-          <w:rFonts w:cs="Book Antiqua"/>
+          <w:rFonts w:cs="Arial"/>
           <w:b w:val="false"/>
           <w:i w:val="false"/>
         </w:rPr>
@@ -1023,7 +1023,7 @@
       </w:pPr>
       <w:r>
         <w:rPr>
-          <w:rFonts w:cs="Arial" w:ascii="Arial" w:hAnsi="Arial"/>
+          <w:rFonts w:cs="Arial"/>
           <w:b/>
           <w:color w:val="C62026"/>
         </w:rPr>
@@ -1031,7 +1031,7 @@
       </w:r>
       <w:r>
         <w:rPr>
-          <w:rFonts w:cs="Arial" w:ascii="Arial" w:hAnsi="Arial"/>
+          <w:rFonts w:cs="Arial"/>
           <w:b/>
           <w:color w:val="C62026"/>
         </w:rPr>
@@ -1039,7 +1039,7 @@
       </w:r>
       <w:r>
         <w:rPr>
-          <w:rFonts w:cs="Book Antiqua"/>
+          <w:rFonts w:cs="Arial"/>
           <w:b w:val="false"/>
           <w:i w:val="false"/>
         </w:rPr>
@@ -1059,7 +1059,7 @@
       </w:pPr>
       <w:r>
         <w:rPr>
-          <w:rFonts w:cs="Arial" w:ascii="Arial" w:hAnsi="Arial"/>
+          <w:rFonts w:cs="Arial"/>
           <w:b/>
           <w:color w:val="C62026"/>
         </w:rPr>
@@ -1067,7 +1067,7 @@
       </w:r>
       <w:r>
         <w:rPr>
-          <w:rFonts w:cs="Arial" w:ascii="Arial" w:hAnsi="Arial"/>
+          <w:rFonts w:cs="Arial"/>
           <w:b/>
           <w:color w:val="C62026"/>
         </w:rPr>
@@ -1075,7 +1075,7 @@
       </w:r>
       <w:r>
         <w:rPr>
-          <w:rFonts w:cs="Book Antiqua"/>
+          <w:rFonts w:cs="Arial"/>
           <w:b w:val="false"/>
           <w:i w:val="false"/>
         </w:rPr>
@@ -1089,7 +1089,7 @@
       </w:pPr>
       <w:r>
         <w:rPr>
-          <w:rFonts w:cs="Arial" w:ascii="Arial" w:hAnsi="Arial"/>
+          <w:rFonts w:cs="Arial"/>
           <w:b/>
           <w:i w:val="false"/>
           <w:color w:val="000000"/>
@@ -1105,7 +1105,7 @@
       </w:pPr>
       <w:r>
         <w:rPr>
-          <w:rFonts w:cs="Book Antiqua"/>
+          <w:rFonts w:cs="Arial"/>
           <w:b w:val="false"/>
           <w:i w:val="false"/>
         </w:rPr>
@@ -1119,7 +1119,7 @@
       </w:pPr>
       <w:r>
         <w:rPr>
-          <w:rFonts w:cs="Book Antiqua"/>
+          <w:rFonts w:cs="Arial"/>
           <w:b/>
           <w:i w:val="false"/>
         </w:rPr>
@@ -1139,7 +1139,7 @@
       </w:pPr>
       <w:r>
         <w:rPr>
-          <w:rFonts w:cs="Arial" w:ascii="Arial" w:hAnsi="Arial"/>
+          <w:rFonts w:cs="Arial"/>
           <w:b/>
           <w:color w:val="C62026"/>
         </w:rPr>
@@ -1147,7 +1147,7 @@
       </w:r>
       <w:r>
         <w:rPr>
-          <w:rFonts w:cs="Arial" w:ascii="Arial" w:hAnsi="Arial"/>
+          <w:rFonts w:cs="Arial"/>
           <w:b/>
           <w:color w:val="C62026"/>
         </w:rPr>
@@ -1155,7 +1155,7 @@
       </w:r>
       <w:r>
         <w:rPr>
-          <w:rFonts w:cs="Book Antiqua"/>
+          <w:rFonts w:cs="Arial"/>
           <w:b w:val="false"/>
           <w:i w:val="false"/>
         </w:rPr>
@@ -1175,7 +1175,7 @@
       </w:pPr>
       <w:r>
         <w:rPr>
-          <w:rFonts w:cs="Arial" w:ascii="Arial" w:hAnsi="Arial"/>
+          <w:rFonts w:cs="Arial"/>
           <w:b/>
           <w:color w:val="C62026"/>
         </w:rPr>
@@ -1183,7 +1183,7 @@
       </w:r>
       <w:r>
         <w:rPr>
-          <w:rFonts w:cs="Arial" w:ascii="Arial" w:hAnsi="Arial"/>
+          <w:rFonts w:cs="Arial"/>
           <w:b/>
           <w:color w:val="C62026"/>
         </w:rPr>
@@ -1191,7 +1191,7 @@
       </w:r>
       <w:r>
         <w:rPr>
-          <w:rFonts w:cs="Book Antiqua"/>
+          <w:rFonts w:cs="Arial"/>
           <w:b w:val="false"/>
           <w:i w:val="false"/>
         </w:rPr>
@@ -1205,7 +1205,7 @@
       </w:pPr>
       <w:r>
         <w:rPr>
-          <w:rFonts w:cs="Book Antiqua"/>
+          <w:rFonts w:cs="Arial"/>
           <w:b/>
           <w:i w:val="false"/>
         </w:rPr>
@@ -1225,7 +1225,7 @@
       </w:pPr>
       <w:r>
         <w:rPr>
-          <w:rFonts w:cs="Arial" w:ascii="Arial" w:hAnsi="Arial"/>
+          <w:rFonts w:cs="Arial"/>
           <w:b/>
           <w:color w:val="C62026"/>
         </w:rPr>
@@ -1233,7 +1233,7 @@
       </w:r>
       <w:r>
         <w:rPr>
-          <w:rFonts w:cs="Arial" w:ascii="Arial" w:hAnsi="Arial"/>
+          <w:rFonts w:cs="Arial"/>
           <w:b/>
           <w:color w:val="C62026"/>
         </w:rPr>
@@ -1241,7 +1241,7 @@
       </w:r>
       <w:r>
         <w:rPr>
-          <w:rFonts w:cs="Book Antiqua"/>
+          <w:rFonts w:cs="Arial"/>
           <w:b w:val="false"/>
           <w:i w:val="false"/>
         </w:rPr>
@@ -1261,7 +1261,7 @@
       </w:pPr>
       <w:r>
         <w:rPr>
-          <w:rFonts w:cs="Arial" w:ascii="Arial" w:hAnsi="Arial"/>
+          <w:rFonts w:cs="Arial"/>
           <w:b/>
           <w:color w:val="C62026"/>
         </w:rPr>
@@ -1269,7 +1269,7 @@
       </w:r>
       <w:r>
         <w:rPr>
-          <w:rFonts w:cs="Arial" w:ascii="Arial" w:hAnsi="Arial"/>
+          <w:rFonts w:cs="Arial"/>
           <w:b/>
           <w:color w:val="C62026"/>
         </w:rPr>
@@ -1277,7 +1277,7 @@
       </w:r>
       <w:r>
         <w:rPr>
-          <w:rFonts w:cs="Book Antiqua"/>
+          <w:rFonts w:cs="Arial"/>
           <w:b w:val="false"/>
           <w:i w:val="false"/>
         </w:rPr>
@@ -1297,7 +1297,7 @@
       </w:pPr>
       <w:r>
         <w:rPr>
-          <w:rFonts w:cs="Arial" w:ascii="Arial" w:hAnsi="Arial"/>
+          <w:rFonts w:cs="Arial"/>
           <w:b/>
           <w:color w:val="C62026"/>
         </w:rPr>
@@ -1305,7 +1305,7 @@
       </w:r>
       <w:r>
         <w:rPr>
-          <w:rFonts w:cs="Arial" w:ascii="Arial" w:hAnsi="Arial"/>
+          <w:rFonts w:cs="Arial"/>
           <w:b/>
           <w:color w:val="C62026"/>
         </w:rPr>
@@ -1313,7 +1313,7 @@
       </w:r>
       <w:r>
         <w:rPr>
-          <w:rFonts w:cs="Book Antiqua"/>
+          <w:rFonts w:cs="Arial"/>
           <w:b w:val="false"/>
           <w:i w:val="false"/>
         </w:rPr>
@@ -1327,7 +1327,7 @@
       </w:pPr>
       <w:r>
         <w:rPr>
-          <w:rFonts w:cs="Book Antiqua"/>
+          <w:rFonts w:cs="Arial"/>
           <w:b w:val="false"/>
           <w:i w:val="false"/>
         </w:rPr>
@@ -1355,11 +1355,11 @@
         </w:pBdr>
         <w:rPr/>
       </w:pPr>
-      <w:bookmarkStart w:id="4" w:name="__RefHeading___Toc215_2185207780"/>
+      <w:bookmarkStart w:id="4" w:name="__RefHeading___Toc215_871499688"/>
       <w:bookmarkEnd w:id="4"/>
       <w:r>
         <w:rPr>
-          <w:rFonts w:cs="Arial" w:ascii="Arial" w:hAnsi="Arial"/>
+          <w:rFonts w:cs="Arial"/>
           <w:b/>
           <w:i w:val="false"/>
           <w:color w:val="002516"/>
@@ -1375,7 +1375,7 @@
       </w:pPr>
       <w:r>
         <w:rPr>
-          <w:rFonts w:cs="Arial" w:ascii="Arial" w:hAnsi="Arial"/>
+          <w:rFonts w:cs="Arial"/>
           <w:b/>
           <w:i w:val="false"/>
           <w:color w:val="000000"/>
@@ -1391,7 +1391,7 @@
       </w:pPr>
       <w:r>
         <w:rPr>
-          <w:rFonts w:cs="Arial" w:ascii="Arial" w:hAnsi="Arial"/>
+          <w:rFonts w:cs="Arial"/>
           <w:b/>
           <w:i w:val="false"/>
           <w:color w:val="002516"/>
@@ -1407,7 +1407,7 @@
       </w:pPr>
       <w:r>
         <w:rPr>
-          <w:rFonts w:cs="Book Antiqua"/>
+          <w:rFonts w:cs="Arial"/>
           <w:b w:val="false"/>
           <w:i w:val="false"/>
         </w:rPr>
@@ -1421,7 +1421,7 @@
       </w:pPr>
       <w:r>
         <w:rPr>
-          <w:rFonts w:cs="Arial" w:ascii="Arial" w:hAnsi="Arial"/>
+          <w:rFonts w:cs="Arial"/>
           <w:b/>
           <w:i w:val="false"/>
           <w:color w:val="002516"/>
@@ -1437,7 +1437,7 @@
       </w:pPr>
       <w:r>
         <w:rPr>
-          <w:rFonts w:cs="Book Antiqua"/>
+          <w:rFonts w:cs="Arial"/>
           <w:b w:val="false"/>
           <w:i w:val="false"/>
         </w:rPr>
@@ -1451,7 +1451,7 @@
       </w:pPr>
       <w:r>
         <w:rPr>
-          <w:rFonts w:cs="Arial" w:ascii="Arial" w:hAnsi="Arial"/>
+          <w:rFonts w:cs="Arial"/>
           <w:b/>
           <w:i w:val="false"/>
           <w:color w:val="000000"/>
@@ -1467,7 +1467,7 @@
       </w:pPr>
       <w:r>
         <w:rPr>
-          <w:rFonts w:cs="Arial" w:ascii="Arial" w:hAnsi="Arial"/>
+          <w:rFonts w:cs="Arial"/>
           <w:b/>
           <w:i w:val="false"/>
           <w:color w:val="002516"/>
@@ -1483,7 +1483,7 @@
       </w:pPr>
       <w:r>
         <w:rPr>
-          <w:rFonts w:cs="Book Antiqua"/>
+          <w:rFonts w:cs="Arial"/>
           <w:b w:val="false"/>
           <w:i w:val="false"/>
         </w:rPr>
@@ -1497,7 +1497,7 @@
       </w:pPr>
       <w:r>
         <w:rPr>
-          <w:rFonts w:cs="Book Antiqua"/>
+          <w:rFonts w:cs="Arial"/>
           <w:b w:val="false"/>
           <w:i w:val="false"/>
         </w:rPr>
@@ -1511,7 +1511,7 @@
       </w:pPr>
       <w:r>
         <w:rPr>
-          <w:rFonts w:cs="Book Antiqua"/>
+          <w:rFonts w:cs="Arial"/>
           <w:b w:val="false"/>
           <w:i w:val="false"/>
         </w:rPr>
@@ -1539,11 +1539,11 @@
         </w:pBdr>
         <w:rPr/>
       </w:pPr>
-      <w:bookmarkStart w:id="5" w:name="__RefHeading___Toc217_2185207780"/>
+      <w:bookmarkStart w:id="5" w:name="__RefHeading___Toc217_871499688"/>
       <w:bookmarkEnd w:id="5"/>
       <w:r>
         <w:rPr>
-          <w:rFonts w:cs="Arial" w:ascii="Arial" w:hAnsi="Arial"/>
+          <w:rFonts w:cs="Arial"/>
           <w:b/>
           <w:i w:val="false"/>
           <w:color w:val="002516"/>
@@ -1559,7 +1559,7 @@
       </w:pPr>
       <w:r>
         <w:rPr>
-          <w:rFonts w:cs="Book Antiqua"/>
+          <w:rFonts w:cs="Arial"/>
           <w:b w:val="false"/>
           <w:i w:val="false"/>
         </w:rPr>
@@ -1573,7 +1573,7 @@
       </w:pPr>
       <w:r>
         <w:rPr>
-          <w:rFonts w:cs="Book Antiqua"/>
+          <w:rFonts w:cs="Arial"/>
           <w:b w:val="false"/>
           <w:i w:val="false"/>
         </w:rPr>
@@ -1587,7 +1587,7 @@
       </w:pPr>
       <w:r>
         <w:rPr>
-          <w:rFonts w:cs="Arial" w:ascii="Arial" w:hAnsi="Arial"/>
+          <w:rFonts w:cs="Arial"/>
           <w:b/>
           <w:i w:val="false"/>
           <w:color w:val="000000"/>
@@ -1603,7 +1603,7 @@
       </w:pPr>
       <w:r>
         <w:rPr>
-          <w:rFonts w:cs="Book Antiqua"/>
+          <w:rFonts w:cs="Arial"/>
           <w:b w:val="false"/>
           <w:i w:val="false"/>
         </w:rPr>
@@ -1617,7 +1617,7 @@
       </w:pPr>
       <w:r>
         <w:rPr>
-          <w:rFonts w:cs="Book Antiqua"/>
+          <w:rFonts w:cs="Arial"/>
           <w:b/>
           <w:i w:val="false"/>
         </w:rPr>
@@ -1625,7 +1625,7 @@
       </w:r>
       <w:r>
         <w:rPr>
-          <w:rFonts w:cs="Book Antiqua"/>
+          <w:rFonts w:cs="Arial"/>
           <w:b w:val="false"/>
           <w:i w:val="false"/>
         </w:rPr>
@@ -1639,7 +1639,7 @@
       </w:pPr>
       <w:r>
         <w:rPr>
-          <w:rFonts w:cs="Arial" w:ascii="Arial" w:hAnsi="Arial"/>
+          <w:rFonts w:cs="Arial"/>
           <w:b/>
           <w:i w:val="false"/>
           <w:color w:val="000000"/>
@@ -1655,7 +1655,7 @@
       </w:pPr>
       <w:r>
         <w:rPr>
-          <w:rFonts w:cs="Book Antiqua"/>
+          <w:rFonts w:cs="Arial"/>
           <w:b w:val="false"/>
           <w:i w:val="false"/>
         </w:rPr>
@@ -1675,7 +1675,7 @@
       </w:pPr>
       <w:r>
         <w:rPr>
-          <w:rFonts w:cs="Arial" w:ascii="Arial" w:hAnsi="Arial"/>
+          <w:rFonts w:cs="Arial"/>
           <w:b/>
           <w:color w:val="C62026"/>
         </w:rPr>
@@ -1683,7 +1683,7 @@
       </w:r>
       <w:r>
         <w:rPr>
-          <w:rFonts w:cs="Arial" w:ascii="Arial" w:hAnsi="Arial"/>
+          <w:rFonts w:cs="Arial"/>
           <w:b/>
           <w:color w:val="C62026"/>
         </w:rPr>
@@ -1691,7 +1691,7 @@
       </w:r>
       <w:r>
         <w:rPr>
-          <w:rFonts w:cs="Book Antiqua"/>
+          <w:rFonts w:cs="Arial"/>
           <w:b w:val="false"/>
           <w:i w:val="false"/>
         </w:rPr>
@@ -1711,7 +1711,7 @@
       </w:pPr>
       <w:r>
         <w:rPr>
-          <w:rFonts w:cs="Arial" w:ascii="Arial" w:hAnsi="Arial"/>
+          <w:rFonts w:cs="Arial"/>
           <w:b/>
           <w:color w:val="C62026"/>
         </w:rPr>
@@ -1719,7 +1719,7 @@
       </w:r>
       <w:r>
         <w:rPr>
-          <w:rFonts w:cs="Arial" w:ascii="Arial" w:hAnsi="Arial"/>
+          <w:rFonts w:cs="Arial"/>
           <w:b/>
           <w:color w:val="C62026"/>
         </w:rPr>
@@ -1727,7 +1727,7 @@
       </w:r>
       <w:r>
         <w:rPr>
-          <w:rFonts w:cs="Book Antiqua"/>
+          <w:rFonts w:cs="Arial"/>
           <w:b w:val="false"/>
           <w:i w:val="false"/>
         </w:rPr>
@@ -1747,7 +1747,7 @@
       </w:pPr>
       <w:r>
         <w:rPr>
-          <w:rFonts w:cs="Arial" w:ascii="Arial" w:hAnsi="Arial"/>
+          <w:rFonts w:cs="Arial"/>
           <w:b/>
           <w:color w:val="C62026"/>
         </w:rPr>
@@ -1755,7 +1755,7 @@
       </w:r>
       <w:r>
         <w:rPr>
-          <w:rFonts w:cs="Arial" w:ascii="Arial" w:hAnsi="Arial"/>
+          <w:rFonts w:cs="Arial"/>
           <w:b/>
           <w:color w:val="C62026"/>
         </w:rPr>
@@ -1763,7 +1763,7 @@
       </w:r>
       <w:r>
         <w:rPr>
-          <w:rFonts w:cs="Book Antiqua"/>
+          <w:rFonts w:cs="Arial"/>
           <w:b w:val="false"/>
           <w:i w:val="false"/>
         </w:rPr>
@@ -1783,7 +1783,7 @@
       </w:pPr>
       <w:r>
         <w:rPr>
-          <w:rFonts w:cs="Arial" w:ascii="Arial" w:hAnsi="Arial"/>
+          <w:rFonts w:cs="Arial"/>
           <w:b/>
           <w:color w:val="C62026"/>
         </w:rPr>
@@ -1791,7 +1791,7 @@
       </w:r>
       <w:r>
         <w:rPr>
-          <w:rFonts w:cs="Arial" w:ascii="Arial" w:hAnsi="Arial"/>
+          <w:rFonts w:cs="Arial"/>
           <w:b/>
           <w:color w:val="C62026"/>
         </w:rPr>
@@ -1799,7 +1799,7 @@
       </w:r>
       <w:r>
         <w:rPr>
-          <w:rFonts w:cs="Book Antiqua"/>
+          <w:rFonts w:cs="Arial"/>
           <w:b w:val="false"/>
           <w:i w:val="false"/>
         </w:rPr>
@@ -1819,7 +1819,7 @@
       </w:pPr>
       <w:r>
         <w:rPr>
-          <w:rFonts w:cs="Arial" w:ascii="Arial" w:hAnsi="Arial"/>
+          <w:rFonts w:cs="Arial"/>
           <w:b/>
           <w:color w:val="C62026"/>
         </w:rPr>
@@ -1827,7 +1827,7 @@
       </w:r>
       <w:r>
         <w:rPr>
-          <w:rFonts w:cs="Arial" w:ascii="Arial" w:hAnsi="Arial"/>
+          <w:rFonts w:cs="Arial"/>
           <w:b/>
           <w:color w:val="C62026"/>
         </w:rPr>
@@ -1835,7 +1835,7 @@
       </w:r>
       <w:r>
         <w:rPr>
-          <w:rFonts w:cs="Book Antiqua"/>
+          <w:rFonts w:cs="Arial"/>
           <w:b w:val="false"/>
           <w:i w:val="false"/>
         </w:rPr>
@@ -1849,7 +1849,7 @@
       </w:pPr>
       <w:r>
         <w:rPr>
-          <w:rFonts w:cs="Book Antiqua"/>
+          <w:rFonts w:cs="Arial"/>
           <w:b w:val="false"/>
           <w:i w:val="false"/>
         </w:rPr>
@@ -1863,7 +1863,7 @@
       </w:pPr>
       <w:r>
         <w:rPr>
-          <w:rFonts w:cs="Book Antiqua"/>
+          <w:rFonts w:cs="Arial"/>
           <w:b/>
           <w:i w:val="false"/>
         </w:rPr>
@@ -1871,7 +1871,7 @@
       </w:r>
       <w:r>
         <w:rPr>
-          <w:rFonts w:cs="Book Antiqua"/>
+          <w:rFonts w:cs="Arial"/>
           <w:b w:val="false"/>
           <w:i w:val="false"/>
         </w:rPr>
@@ -1885,7 +1885,7 @@
       </w:pPr>
       <w:r>
         <w:rPr>
-          <w:rFonts w:cs="Arial" w:ascii="Arial" w:hAnsi="Arial"/>
+          <w:rFonts w:cs="Arial"/>
           <w:b/>
           <w:i w:val="false"/>
           <w:color w:val="000000"/>
@@ -1901,7 +1901,7 @@
       </w:pPr>
       <w:r>
         <w:rPr>
-          <w:rFonts w:cs="Book Antiqua"/>
+          <w:rFonts w:cs="Arial"/>
           <w:b w:val="false"/>
           <w:i w:val="false"/>
         </w:rPr>
@@ -1915,7 +1915,7 @@
       </w:pPr>
       <w:r>
         <w:rPr>
-          <w:rFonts w:cs="Book Antiqua"/>
+          <w:rFonts w:cs="Arial"/>
           <w:b w:val="false"/>
           <w:i w:val="false"/>
         </w:rPr>
@@ -1929,7 +1929,7 @@
       </w:pPr>
       <w:r>
         <w:rPr>
-          <w:rFonts w:cs="Book Antiqua"/>
+          <w:rFonts w:cs="Arial"/>
           <w:b/>
           <w:i w:val="false"/>
         </w:rPr>
@@ -1937,7 +1937,7 @@
       </w:r>
       <w:r>
         <w:rPr>
-          <w:rFonts w:cs="Book Antiqua"/>
+          <w:rFonts w:cs="Arial"/>
           <w:b w:val="false"/>
           <w:i w:val="false"/>
         </w:rPr>
@@ -1951,7 +1951,7 @@
       </w:pPr>
       <w:r>
         <w:rPr>
-          <w:rFonts w:cs="Arial" w:ascii="Arial" w:hAnsi="Arial"/>
+          <w:rFonts w:cs="Arial"/>
           <w:b/>
           <w:i w:val="false"/>
           <w:color w:val="000000"/>
@@ -1967,7 +1967,7 @@
       </w:pPr>
       <w:r>
         <w:rPr>
-          <w:rFonts w:cs="Book Antiqua"/>
+          <w:rFonts w:cs="Arial"/>
           <w:b w:val="false"/>
           <w:i w:val="false"/>
         </w:rPr>
@@ -1981,7 +1981,7 @@
       </w:pPr>
       <w:r>
         <w:rPr>
-          <w:rFonts w:cs="Book Antiqua"/>
+          <w:rFonts w:cs="Arial"/>
           <w:b/>
           <w:i w:val="false"/>
         </w:rPr>
@@ -1989,7 +1989,7 @@
       </w:r>
       <w:r>
         <w:rPr>
-          <w:rFonts w:cs="Book Antiqua"/>
+          <w:rFonts w:cs="Arial"/>
           <w:b w:val="false"/>
           <w:i w:val="false"/>
         </w:rPr>
@@ -2003,7 +2003,7 @@
       </w:pPr>
       <w:r>
         <w:rPr>
-          <w:rFonts w:cs="Arial" w:ascii="Arial" w:hAnsi="Arial"/>
+          <w:rFonts w:cs="Arial"/>
           <w:b/>
           <w:i w:val="false"/>
           <w:color w:val="000000"/>
@@ -2019,7 +2019,7 @@
       </w:pPr>
       <w:r>
         <w:rPr>
-          <w:rFonts w:cs="Book Antiqua"/>
+          <w:rFonts w:cs="Arial"/>
           <w:b w:val="false"/>
           <w:i w:val="false"/>
         </w:rPr>
@@ -2033,7 +2033,7 @@
       </w:pPr>
       <w:r>
         <w:rPr>
-          <w:rFonts w:cs="Book Antiqua"/>
+          <w:rFonts w:cs="Arial"/>
           <w:b w:val="false"/>
           <w:i w:val="false"/>
         </w:rPr>
@@ -2047,7 +2047,7 @@
       </w:pPr>
       <w:r>
         <w:rPr>
-          <w:rFonts w:cs="Book Antiqua"/>
+          <w:rFonts w:cs="Arial"/>
           <w:b/>
           <w:i w:val="false"/>
         </w:rPr>
@@ -2055,7 +2055,7 @@
       </w:r>
       <w:r>
         <w:rPr>
-          <w:rFonts w:cs="Book Antiqua"/>
+          <w:rFonts w:cs="Arial"/>
           <w:b w:val="false"/>
           <w:i w:val="false"/>
         </w:rPr>
@@ -2083,11 +2083,11 @@
         </w:pBdr>
         <w:rPr/>
       </w:pPr>
-      <w:bookmarkStart w:id="6" w:name="__RefHeading___Toc219_2185207780"/>
+      <w:bookmarkStart w:id="6" w:name="__RefHeading___Toc219_871499688"/>
       <w:bookmarkEnd w:id="6"/>
       <w:r>
         <w:rPr>
-          <w:rFonts w:cs="Arial" w:ascii="Arial" w:hAnsi="Arial"/>
+          <w:rFonts w:cs="Arial"/>
           <w:b/>
           <w:i w:val="false"/>
           <w:color w:val="002516"/>
@@ -2103,7 +2103,7 @@
       </w:pPr>
       <w:r>
         <w:rPr>
-          <w:rFonts w:cs="Book Antiqua"/>
+          <w:rFonts w:cs="Arial"/>
           <w:b w:val="false"/>
           <w:i w:val="false"/>
         </w:rPr>
@@ -2123,7 +2123,7 @@
       </w:pPr>
       <w:r>
         <w:rPr>
-          <w:rFonts w:cs="Arial" w:ascii="Arial" w:hAnsi="Arial"/>
+          <w:rFonts w:cs="Arial"/>
           <w:b w:val="false"/>
         </w:rPr>
         <w:t>1.</w:t>
@@ -2131,7 +2131,7 @@
       </w:r>
       <w:r>
         <w:rPr>
-          <w:rFonts w:cs="Book Antiqua"/>
+          <w:rFonts w:cs="Arial"/>
           <w:b/>
           <w:i w:val="false"/>
         </w:rPr>
@@ -2139,7 +2139,7 @@
       </w:r>
       <w:r>
         <w:rPr>
-          <w:rFonts w:cs="Book Antiqua"/>
+          <w:rFonts w:cs="Arial"/>
           <w:b w:val="false"/>
           <w:i w:val="false"/>
         </w:rPr>
@@ -2159,7 +2159,7 @@
       </w:pPr>
       <w:r>
         <w:rPr>
-          <w:rFonts w:cs="Arial" w:ascii="Arial" w:hAnsi="Arial"/>
+          <w:rFonts w:cs="Arial"/>
           <w:b w:val="false"/>
         </w:rPr>
         <w:t>2.</w:t>
@@ -2167,7 +2167,7 @@
       </w:r>
       <w:r>
         <w:rPr>
-          <w:rFonts w:cs="Book Antiqua"/>
+          <w:rFonts w:cs="Arial"/>
           <w:b/>
           <w:i w:val="false"/>
         </w:rPr>
@@ -2175,7 +2175,7 @@
       </w:r>
       <w:r>
         <w:rPr>
-          <w:rFonts w:cs="Book Antiqua"/>
+          <w:rFonts w:cs="Arial"/>
           <w:b w:val="false"/>
           <w:i w:val="false"/>
         </w:rPr>
@@ -2195,7 +2195,7 @@
       </w:pPr>
       <w:r>
         <w:rPr>
-          <w:rFonts w:cs="Arial" w:ascii="Arial" w:hAnsi="Arial"/>
+          <w:rFonts w:cs="Arial"/>
           <w:b w:val="false"/>
         </w:rPr>
         <w:t>3.</w:t>
@@ -2203,7 +2203,7 @@
       </w:r>
       <w:r>
         <w:rPr>
-          <w:rFonts w:cs="Book Antiqua"/>
+          <w:rFonts w:cs="Arial"/>
           <w:b/>
           <w:i w:val="false"/>
         </w:rPr>
@@ -2211,7 +2211,7 @@
       </w:r>
       <w:r>
         <w:rPr>
-          <w:rFonts w:cs="Book Antiqua"/>
+          <w:rFonts w:cs="Arial"/>
           <w:b w:val="false"/>
           <w:i w:val="false"/>
         </w:rPr>
@@ -2231,7 +2231,7 @@
       </w:pPr>
       <w:r>
         <w:rPr>
-          <w:rFonts w:cs="Arial" w:ascii="Arial" w:hAnsi="Arial"/>
+          <w:rFonts w:cs="Arial"/>
           <w:b w:val="false"/>
         </w:rPr>
         <w:t>4.</w:t>
@@ -2239,7 +2239,7 @@
       </w:r>
       <w:r>
         <w:rPr>
-          <w:rFonts w:cs="Book Antiqua"/>
+          <w:rFonts w:cs="Arial"/>
           <w:b/>
           <w:i w:val="false"/>
         </w:rPr>
@@ -2247,7 +2247,7 @@
       </w:r>
       <w:r>
         <w:rPr>
-          <w:rFonts w:cs="Book Antiqua"/>
+          <w:rFonts w:cs="Arial"/>
           <w:b w:val="false"/>
           <w:i w:val="false"/>
         </w:rPr>
@@ -2267,7 +2267,7 @@
       </w:pPr>
       <w:r>
         <w:rPr>
-          <w:rFonts w:cs="Arial" w:ascii="Arial" w:hAnsi="Arial"/>
+          <w:rFonts w:cs="Arial"/>
           <w:b w:val="false"/>
         </w:rPr>
         <w:t>5.</w:t>
@@ -2275,7 +2275,7 @@
       </w:r>
       <w:r>
         <w:rPr>
-          <w:rFonts w:cs="Book Antiqua"/>
+          <w:rFonts w:cs="Arial"/>
           <w:b/>
           <w:i w:val="false"/>
         </w:rPr>
@@ -2283,7 +2283,7 @@
       </w:r>
       <w:r>
         <w:rPr>
-          <w:rFonts w:cs="Book Antiqua"/>
+          <w:rFonts w:cs="Arial"/>
           <w:b w:val="false"/>
           <w:i w:val="false"/>
         </w:rPr>
@@ -2333,7 +2333,7 @@
     </w:pPr>
     <w:r>
       <w:rPr>
-        <w:rFonts w:cs="Arial" w:ascii="Arial" w:hAnsi="Arial"/>
+        <w:rFonts w:cs="Arial"/>
         <w:b/>
         <w:color w:val="000000"/>
         <w:sz w:val="20"/>
@@ -2354,7 +2354,7 @@
     </w:pPr>
     <w:r>
       <w:rPr>
-        <w:rFonts w:cs="Arial" w:ascii="Arial" w:hAnsi="Arial"/>
+        <w:rFonts w:cs="Arial"/>
         <w:b w:val="false"/>
         <w:color w:val="000000"/>
         <w:sz w:val="17"/>
@@ -2367,7 +2367,7 @@
     </w:r>
     <w:r>
       <w:rPr>
-        <w:rFonts w:cs="Arial" w:ascii="Arial" w:hAnsi="Arial"/>
+        <w:rFonts w:cs="Arial"/>
         <w:sz w:val="17"/>
       </w:rPr>
       <w:fldChar w:fldCharType="begin"/>
@@ -2375,34 +2375,34 @@
     <w:r>
       <w:rPr>
         <w:sz w:val="17"/>
-        <w:rFonts w:cs="Arial" w:ascii="Arial" w:hAnsi="Arial"/>
+        <w:rFonts w:cs="Arial"/>
       </w:rPr>
       <w:instrText xml:space="preserve"> PAGE </w:instrText>
     </w:r>
     <w:r>
       <w:rPr>
         <w:sz w:val="17"/>
-        <w:rFonts w:cs="Arial" w:ascii="Arial" w:hAnsi="Arial"/>
+        <w:rFonts w:cs="Arial"/>
       </w:rPr>
       <w:fldChar w:fldCharType="separate"/>
     </w:r>
     <w:r>
       <w:rPr>
         <w:sz w:val="17"/>
-        <w:rFonts w:cs="Arial" w:ascii="Arial" w:hAnsi="Arial"/>
+        <w:rFonts w:cs="Arial"/>
       </w:rPr>
       <w:t>2</w:t>
     </w:r>
     <w:r>
       <w:rPr>
         <w:sz w:val="17"/>
-        <w:rFonts w:cs="Arial" w:ascii="Arial" w:hAnsi="Arial"/>
+        <w:rFonts w:cs="Arial"/>
       </w:rPr>
       <w:fldChar w:fldCharType="end"/>
     </w:r>
     <w:r>
       <w:rPr>
-        <w:rFonts w:cs="Arial" w:ascii="Arial" w:hAnsi="Arial"/>
+        <w:rFonts w:cs="Arial"/>
         <w:b w:val="false"/>
         <w:color w:val="000000"/>
         <w:sz w:val="17"/>
@@ -2411,7 +2411,7 @@
     </w:r>
     <w:r>
       <w:rPr>
-        <w:rFonts w:cs="Arial" w:ascii="Arial" w:hAnsi="Arial"/>
+        <w:rFonts w:cs="Arial"/>
         <w:sz w:val="17"/>
       </w:rPr>
       <w:fldChar w:fldCharType="begin"/>
@@ -2419,28 +2419,28 @@
     <w:r>
       <w:rPr>
         <w:sz w:val="17"/>
-        <w:rFonts w:cs="Arial" w:ascii="Arial" w:hAnsi="Arial"/>
+        <w:rFonts w:cs="Arial"/>
       </w:rPr>
       <w:instrText xml:space="preserve"> NUMPAGES </w:instrText>
     </w:r>
     <w:r>
       <w:rPr>
         <w:sz w:val="17"/>
-        <w:rFonts w:cs="Arial" w:ascii="Arial" w:hAnsi="Arial"/>
+        <w:rFonts w:cs="Arial"/>
       </w:rPr>
       <w:fldChar w:fldCharType="separate"/>
     </w:r>
     <w:r>
       <w:rPr>
         <w:sz w:val="17"/>
-        <w:rFonts w:cs="Arial" w:ascii="Arial" w:hAnsi="Arial"/>
+        <w:rFonts w:cs="Arial"/>
       </w:rPr>
       <w:t>8</w:t>
     </w:r>
     <w:r>
       <w:rPr>
         <w:sz w:val="17"/>
-        <w:rFonts w:cs="Arial" w:ascii="Arial" w:hAnsi="Arial"/>
+        <w:rFonts w:cs="Arial"/>
       </w:rPr>
       <w:fldChar w:fldCharType="end"/>
     </w:r>
@@ -2459,7 +2459,7 @@
     </w:pPr>
     <w:r>
       <w:rPr>
-        <w:rFonts w:cs="Arial" w:ascii="Arial" w:hAnsi="Arial"/>
+        <w:rFonts w:cs="Arial"/>
         <w:b/>
         <w:color w:val="000000"/>
         <w:sz w:val="20"/>
@@ -2495,7 +2495,7 @@
     </w:pPr>
     <w:r>
       <w:rPr>
-        <w:rFonts w:cs="Arial" w:ascii="Arial" w:hAnsi="Arial"/>
+        <w:rFonts w:cs="Arial"/>
         <w:b/>
         <w:color w:val="000000"/>
         <w:sz w:val="20"/>
@@ -2516,7 +2516,7 @@
     </w:pPr>
     <w:r>
       <w:rPr>
-        <w:rFonts w:cs="Arial" w:ascii="Arial" w:hAnsi="Arial"/>
+        <w:rFonts w:cs="Arial"/>
         <w:b w:val="false"/>
         <w:color w:val="000000"/>
         <w:sz w:val="17"/>
@@ -2529,7 +2529,7 @@
     </w:r>
     <w:r>
       <w:rPr>
-        <w:rFonts w:cs="Arial" w:ascii="Arial" w:hAnsi="Arial"/>
+        <w:rFonts w:cs="Arial"/>
         <w:sz w:val="17"/>
       </w:rPr>
       <w:fldChar w:fldCharType="begin"/>
@@ -2537,34 +2537,34 @@
     <w:r>
       <w:rPr>
         <w:sz w:val="17"/>
-        <w:rFonts w:cs="Arial" w:ascii="Arial" w:hAnsi="Arial"/>
+        <w:rFonts w:cs="Arial"/>
       </w:rPr>
       <w:instrText xml:space="preserve"> PAGE </w:instrText>
     </w:r>
     <w:r>
       <w:rPr>
         <w:sz w:val="17"/>
-        <w:rFonts w:cs="Arial" w:ascii="Arial" w:hAnsi="Arial"/>
+        <w:rFonts w:cs="Arial"/>
       </w:rPr>
       <w:fldChar w:fldCharType="separate"/>
     </w:r>
     <w:r>
       <w:rPr>
         <w:sz w:val="17"/>
-        <w:rFonts w:cs="Arial" w:ascii="Arial" w:hAnsi="Arial"/>
+        <w:rFonts w:cs="Arial"/>
       </w:rPr>
       <w:t>3</w:t>
     </w:r>
     <w:r>
       <w:rPr>
         <w:sz w:val="17"/>
-        <w:rFonts w:cs="Arial" w:ascii="Arial" w:hAnsi="Arial"/>
+        <w:rFonts w:cs="Arial"/>
       </w:rPr>
       <w:fldChar w:fldCharType="end"/>
     </w:r>
     <w:r>
       <w:rPr>
-        <w:rFonts w:cs="Arial" w:ascii="Arial" w:hAnsi="Arial"/>
+        <w:rFonts w:cs="Arial"/>
         <w:b w:val="false"/>
         <w:color w:val="000000"/>
         <w:sz w:val="17"/>
@@ -2573,7 +2573,7 @@
     </w:r>
     <w:r>
       <w:rPr>
-        <w:rFonts w:cs="Arial" w:ascii="Arial" w:hAnsi="Arial"/>
+        <w:rFonts w:cs="Arial"/>
         <w:sz w:val="17"/>
       </w:rPr>
       <w:fldChar w:fldCharType="begin"/>
@@ -2581,28 +2581,28 @@
     <w:r>
       <w:rPr>
         <w:sz w:val="17"/>
-        <w:rFonts w:cs="Arial" w:ascii="Arial" w:hAnsi="Arial"/>
+        <w:rFonts w:cs="Arial"/>
       </w:rPr>
       <w:instrText xml:space="preserve"> NUMPAGES </w:instrText>
     </w:r>
     <w:r>
       <w:rPr>
         <w:sz w:val="17"/>
-        <w:rFonts w:cs="Arial" w:ascii="Arial" w:hAnsi="Arial"/>
+        <w:rFonts w:cs="Arial"/>
       </w:rPr>
       <w:fldChar w:fldCharType="separate"/>
     </w:r>
     <w:r>
       <w:rPr>
         <w:sz w:val="17"/>
-        <w:rFonts w:cs="Arial" w:ascii="Arial" w:hAnsi="Arial"/>
+        <w:rFonts w:cs="Arial"/>
       </w:rPr>
       <w:t>8</w:t>
     </w:r>
     <w:r>
       <w:rPr>
         <w:sz w:val="17"/>
-        <w:rFonts w:cs="Arial" w:ascii="Arial" w:hAnsi="Arial"/>
+        <w:rFonts w:cs="Arial"/>
       </w:rPr>
       <w:fldChar w:fldCharType="end"/>
     </w:r>
@@ -2641,7 +2641,7 @@
     </w:pPr>
     <w:r>
       <w:rPr>
-        <w:rFonts w:cs="Arial" w:ascii="Arial" w:hAnsi="Arial"/>
+        <w:rFonts w:cs="Arial"/>
         <w:b/>
         <w:color w:val="000000"/>
         <w:sz w:val="20"/>
@@ -2662,7 +2662,7 @@
     </w:pPr>
     <w:r>
       <w:rPr>
-        <w:rFonts w:cs="Arial" w:ascii="Arial" w:hAnsi="Arial"/>
+        <w:rFonts w:cs="Arial"/>
         <w:b w:val="false"/>
         <w:color w:val="000000"/>
         <w:sz w:val="17"/>
@@ -2675,7 +2675,7 @@
     </w:r>
     <w:r>
       <w:rPr>
-        <w:rFonts w:cs="Arial" w:ascii="Arial" w:hAnsi="Arial"/>
+        <w:rFonts w:cs="Arial"/>
         <w:sz w:val="17"/>
       </w:rPr>
       <w:fldChar w:fldCharType="begin"/>
@@ -2683,34 +2683,34 @@
     <w:r>
       <w:rPr>
         <w:sz w:val="17"/>
-        <w:rFonts w:cs="Arial" w:ascii="Arial" w:hAnsi="Arial"/>
+        <w:rFonts w:cs="Arial"/>
       </w:rPr>
       <w:instrText xml:space="preserve"> PAGE </w:instrText>
     </w:r>
     <w:r>
       <w:rPr>
         <w:sz w:val="17"/>
-        <w:rFonts w:cs="Arial" w:ascii="Arial" w:hAnsi="Arial"/>
+        <w:rFonts w:cs="Arial"/>
       </w:rPr>
       <w:fldChar w:fldCharType="separate"/>
     </w:r>
     <w:r>
       <w:rPr>
         <w:sz w:val="17"/>
-        <w:rFonts w:cs="Arial" w:ascii="Arial" w:hAnsi="Arial"/>
+        <w:rFonts w:cs="Arial"/>
       </w:rPr>
       <w:t>8</w:t>
     </w:r>
     <w:r>
       <w:rPr>
         <w:sz w:val="17"/>
-        <w:rFonts w:cs="Arial" w:ascii="Arial" w:hAnsi="Arial"/>
+        <w:rFonts w:cs="Arial"/>
       </w:rPr>
       <w:fldChar w:fldCharType="end"/>
     </w:r>
     <w:r>
       <w:rPr>
-        <w:rFonts w:cs="Arial" w:ascii="Arial" w:hAnsi="Arial"/>
+        <w:rFonts w:cs="Arial"/>
         <w:b w:val="false"/>
         <w:color w:val="000000"/>
         <w:sz w:val="17"/>
@@ -2719,7 +2719,7 @@
     </w:r>
     <w:r>
       <w:rPr>
-        <w:rFonts w:cs="Arial" w:ascii="Arial" w:hAnsi="Arial"/>
+        <w:rFonts w:cs="Arial"/>
         <w:sz w:val="17"/>
       </w:rPr>
       <w:fldChar w:fldCharType="begin"/>
@@ -2727,28 +2727,28 @@
     <w:r>
       <w:rPr>
         <w:sz w:val="17"/>
-        <w:rFonts w:cs="Arial" w:ascii="Arial" w:hAnsi="Arial"/>
+        <w:rFonts w:cs="Arial"/>
       </w:rPr>
       <w:instrText xml:space="preserve"> NUMPAGES </w:instrText>
     </w:r>
     <w:r>
       <w:rPr>
         <w:sz w:val="17"/>
-        <w:rFonts w:cs="Arial" w:ascii="Arial" w:hAnsi="Arial"/>
+        <w:rFonts w:cs="Arial"/>
       </w:rPr>
       <w:fldChar w:fldCharType="separate"/>
     </w:r>
     <w:r>
       <w:rPr>
         <w:sz w:val="17"/>
-        <w:rFonts w:cs="Arial" w:ascii="Arial" w:hAnsi="Arial"/>
+        <w:rFonts w:cs="Arial"/>
       </w:rPr>
       <w:t>8</w:t>
     </w:r>
     <w:r>
       <w:rPr>
         <w:sz w:val="17"/>
-        <w:rFonts w:cs="Arial" w:ascii="Arial" w:hAnsi="Arial"/>
+        <w:rFonts w:cs="Arial"/>
       </w:rPr>
       <w:fldChar w:fldCharType="end"/>
     </w:r>
@@ -2787,7 +2787,7 @@
     </w:pPr>
     <w:r>
       <w:rPr>
-        <w:rFonts w:cs="Arial" w:ascii="Arial" w:hAnsi="Arial"/>
+        <w:rFonts w:cs="Arial"/>
         <w:b/>
         <w:color w:val="000000"/>
         <w:sz w:val="20"/>
@@ -2809,7 +2809,7 @@
     </w:pPr>
     <w:r>
       <w:rPr>
-        <w:rFonts w:cs="Arial" w:ascii="Arial" w:hAnsi="Arial"/>
+        <w:rFonts w:cs="Arial"/>
         <w:b/>
         <w:color w:val="000000"/>
         <w:sz w:val="20"/>
@@ -2831,7 +2831,7 @@
     </w:pPr>
     <w:r>
       <w:rPr>
-        <w:rFonts w:cs="Arial" w:ascii="Arial" w:hAnsi="Arial"/>
+        <w:rFonts w:cs="Arial"/>
         <w:b/>
         <w:color w:val="000000"/>
         <w:sz w:val="20"/>
@@ -2859,7 +2859,7 @@
     </w:pPr>
     <w:r>
       <w:rPr>
-        <w:rFonts w:cs="Arial" w:ascii="Arial" w:hAnsi="Arial"/>
+        <w:rFonts w:cs="Arial"/>
         <w:b/>
         <w:color w:val="000000"/>
         <w:sz w:val="20"/>
@@ -2881,7 +2881,7 @@
   <w:docDefaults>
     <w:rPrDefault>
       <w:rPr>
-        <w:rFonts w:ascii="Book Antiqua" w:hAnsi="Book Antiqua" w:eastAsia="WenQuanYi Zen Hei" w:cs="Book Antiqua"/>
+        <w:rFonts w:ascii="Arial" w:hAnsi="Arial" w:eastAsia="WenQuanYi Zen Hei" w:cs="Arial"/>
         <w:sz w:val="22"/>
         <w:szCs w:val="22"/>
         <w:lang w:val="en-US" w:eastAsia="en-US" w:bidi="ar-SA"/>
@@ -3039,14 +3039,14 @@
     <w:pPr>
       <w:widowControl/>
       <w:bidi w:val="0"/>
-      <w:spacing w:lineRule="auto" w:line="276" w:before="0" w:after="120"/>
+      <w:spacing w:lineRule="auto" w:line="288" w:before="0" w:after="120"/>
       <w:jc w:val="left"/>
     </w:pPr>
     <w:rPr>
-      <w:rFonts w:ascii="Book Antiqua" w:hAnsi="Book Antiqua" w:cs="Book Antiqua" w:eastAsia="WenQuanYi Zen Hei"/>
+      <w:rFonts w:ascii="Arial" w:hAnsi="Arial" w:cs="Arial" w:eastAsia="WenQuanYi Zen Hei"/>
       <w:color w:val="000000"/>
       <w:kern w:val="0"/>
-      <w:sz w:val="22"/>
+      <w:sz w:val="21"/>
       <w:szCs w:val="22"/>
       <w:lang w:val="en-US" w:eastAsia="en-US" w:bidi="ar-SA"/>
     </w:rPr>
@@ -3065,7 +3065,7 @@
       <w:outlineLvl w:val="0"/>
     </w:pPr>
     <w:rPr>
-      <w:rFonts w:ascii="Book Antiqua" w:hAnsi="Book Antiqua" w:cs="Book Antiqua"/>
+      <w:rFonts w:ascii="Arial" w:hAnsi="Arial" w:cs="Arial"/>
       <w:b/>
       <w:color w:val="002516"/>
       <w:sz w:val="28"/>
@@ -3086,7 +3086,7 @@
       <w:outlineLvl w:val="1"/>
     </w:pPr>
     <w:rPr>
-      <w:rFonts w:ascii="Book Antiqua" w:hAnsi="Book Antiqua" w:cs="Book Antiqua"/>
+      <w:rFonts w:ascii="Arial" w:hAnsi="Arial" w:cs="Arial"/>
       <w:b/>
       <w:color w:val="000000"/>
       <w:sz w:val="22"/>

</xml_diff>

<commit_message>
Final cover pass on Combat Mindset framework proposal
Remove the rules above Reference and below Version so the meta block
sits clean, and set the version to V1.0.

Co-Authored-By: Claude Fable 5 <noreply@anthropic.com>
Claude-Session: https://claude.ai/code/session_01YLo1WfwUDkbwfJEF3ZNVbB
</commit_message>
<xml_diff>
--- a/output/combat-mindset-way-forward.docx
+++ b/output/combat-mindset-way-forward.docx
@@ -118,9 +118,6 @@
     <w:p>
       <w:pPr>
         <w:pStyle w:val="Normal"/>
-        <w:pBdr>
-          <w:top w:val="single" w:sz="6" w:space="6" w:color="A89662"/>
-        </w:pBdr>
         <w:tabs>
           <w:tab w:val="clear" w:pos="720"/>
           <w:tab w:val="left" w:pos="1814" w:leader="none"/>
@@ -208,9 +205,6 @@
     <w:p>
       <w:pPr>
         <w:pStyle w:val="Normal"/>
-        <w:pBdr>
-          <w:bottom w:val="single" w:sz="6" w:space="6" w:color="A89662"/>
-        </w:pBdr>
         <w:tabs>
           <w:tab w:val="clear" w:pos="720"/>
           <w:tab w:val="left" w:pos="1814" w:leader="none"/>
@@ -234,7 +228,7 @@
           <w:color w:val="000000"/>
           <w:sz w:val="20"/>
         </w:rPr>
-        <w:t>Draft v1.0</w:t>
+        <w:t>V1.0</w:t>
       </w:r>
     </w:p>
     <w:p>
@@ -304,7 +298,7 @@
             </w:rPr>
             <w:fldChar w:fldCharType="separate"/>
           </w:r>
-          <w:hyperlink w:anchor="__RefHeading___Toc207_871499688">
+          <w:hyperlink w:anchor="__RefHeading___Toc207_4102002274">
             <w:r>
               <w:rPr>
                 <w:webHidden/>
@@ -331,7 +325,7 @@
             </w:tabs>
             <w:rPr/>
           </w:pPr>
-          <w:hyperlink w:anchor="__RefHeading___Toc209_871499688">
+          <w:hyperlink w:anchor="__RefHeading___Toc209_4102002274">
             <w:r>
               <w:rPr>
                 <w:webHidden/>
@@ -358,7 +352,7 @@
             </w:tabs>
             <w:rPr/>
           </w:pPr>
-          <w:hyperlink w:anchor="__RefHeading___Toc211_871499688">
+          <w:hyperlink w:anchor="__RefHeading___Toc211_4102002274">
             <w:r>
               <w:rPr>
                 <w:webHidden/>
@@ -385,7 +379,7 @@
             </w:tabs>
             <w:rPr/>
           </w:pPr>
-          <w:hyperlink w:anchor="__RefHeading___Toc213_871499688">
+          <w:hyperlink w:anchor="__RefHeading___Toc213_4102002274">
             <w:r>
               <w:rPr>
                 <w:webHidden/>
@@ -412,7 +406,7 @@
             </w:tabs>
             <w:rPr/>
           </w:pPr>
-          <w:hyperlink w:anchor="__RefHeading___Toc215_871499688">
+          <w:hyperlink w:anchor="__RefHeading___Toc215_4102002274">
             <w:r>
               <w:rPr>
                 <w:webHidden/>
@@ -439,7 +433,7 @@
             </w:tabs>
             <w:rPr/>
           </w:pPr>
-          <w:hyperlink w:anchor="__RefHeading___Toc217_871499688">
+          <w:hyperlink w:anchor="__RefHeading___Toc217_4102002274">
             <w:r>
               <w:rPr>
                 <w:webHidden/>
@@ -466,7 +460,7 @@
             </w:tabs>
             <w:rPr/>
           </w:pPr>
-          <w:hyperlink w:anchor="__RefHeading___Toc219_871499688">
+          <w:hyperlink w:anchor="__RefHeading___Toc219_4102002274">
             <w:r>
               <w:rPr>
                 <w:webHidden/>
@@ -521,7 +515,7 @@
         <w:spacing w:before="0" w:after="160"/>
         <w:rPr/>
       </w:pPr>
-      <w:bookmarkStart w:id="0" w:name="__RefHeading___Toc207_871499688"/>
+      <w:bookmarkStart w:id="0" w:name="__RefHeading___Toc207_4102002274"/>
       <w:bookmarkEnd w:id="0"/>
       <w:r>
         <w:rPr>
@@ -603,7 +597,7 @@
         </w:pBdr>
         <w:rPr/>
       </w:pPr>
-      <w:bookmarkStart w:id="1" w:name="__RefHeading___Toc209_871499688"/>
+      <w:bookmarkStart w:id="1" w:name="__RefHeading___Toc209_4102002274"/>
       <w:bookmarkEnd w:id="1"/>
       <w:r>
         <w:rPr>
@@ -693,7 +687,7 @@
         </w:pBdr>
         <w:rPr/>
       </w:pPr>
-      <w:bookmarkStart w:id="2" w:name="__RefHeading___Toc211_871499688"/>
+      <w:bookmarkStart w:id="2" w:name="__RefHeading___Toc211_4102002274"/>
       <w:bookmarkEnd w:id="2"/>
       <w:r>
         <w:rPr>
@@ -801,7 +795,7 @@
         </w:pBdr>
         <w:rPr/>
       </w:pPr>
-      <w:bookmarkStart w:id="3" w:name="__RefHeading___Toc213_871499688"/>
+      <w:bookmarkStart w:id="3" w:name="__RefHeading___Toc213_4102002274"/>
       <w:bookmarkEnd w:id="3"/>
       <w:r>
         <w:rPr>
@@ -1355,7 +1349,7 @@
         </w:pBdr>
         <w:rPr/>
       </w:pPr>
-      <w:bookmarkStart w:id="4" w:name="__RefHeading___Toc215_871499688"/>
+      <w:bookmarkStart w:id="4" w:name="__RefHeading___Toc215_4102002274"/>
       <w:bookmarkEnd w:id="4"/>
       <w:r>
         <w:rPr>
@@ -1539,7 +1533,7 @@
         </w:pBdr>
         <w:rPr/>
       </w:pPr>
-      <w:bookmarkStart w:id="5" w:name="__RefHeading___Toc217_871499688"/>
+      <w:bookmarkStart w:id="5" w:name="__RefHeading___Toc217_4102002274"/>
       <w:bookmarkEnd w:id="5"/>
       <w:r>
         <w:rPr>
@@ -2083,7 +2077,7 @@
         </w:pBdr>
         <w:rPr/>
       </w:pPr>
-      <w:bookmarkStart w:id="6" w:name="__RefHeading___Toc219_871499688"/>
+      <w:bookmarkStart w:id="6" w:name="__RefHeading___Toc219_4102002274"/>
       <w:bookmarkEnd w:id="6"/>
       <w:r>
         <w:rPr>

</xml_diff>

<commit_message>
Trim purpose and align psychology naming
Delete the closing back brief sentence from Purpose, and change NZDF
Psychology to Army Psychology Services (APS) in the problem statement so
the naming matches the rest of the paper.

Co-Authored-By: Claude Fable 5 <noreply@anthropic.com>
Claude-Session: https://claude.ai/code/session_01YLo1WfwUDkbwfJEF3ZNVbB
</commit_message>
<xml_diff>
--- a/output/combat-mindset-way-forward.docx
+++ b/output/combat-mindset-way-forward.docx
@@ -298,7 +298,7 @@
             </w:rPr>
             <w:fldChar w:fldCharType="separate"/>
           </w:r>
-          <w:hyperlink w:anchor="__RefHeading___Toc207_4102002274">
+          <w:hyperlink w:anchor="__RefHeading___Toc206_970847438">
             <w:r>
               <w:rPr>
                 <w:webHidden/>
@@ -325,7 +325,7 @@
             </w:tabs>
             <w:rPr/>
           </w:pPr>
-          <w:hyperlink w:anchor="__RefHeading___Toc209_4102002274">
+          <w:hyperlink w:anchor="__RefHeading___Toc208_970847438">
             <w:r>
               <w:rPr>
                 <w:webHidden/>
@@ -352,7 +352,7 @@
             </w:tabs>
             <w:rPr/>
           </w:pPr>
-          <w:hyperlink w:anchor="__RefHeading___Toc211_4102002274">
+          <w:hyperlink w:anchor="__RefHeading___Toc210_970847438">
             <w:r>
               <w:rPr>
                 <w:webHidden/>
@@ -379,7 +379,7 @@
             </w:tabs>
             <w:rPr/>
           </w:pPr>
-          <w:hyperlink w:anchor="__RefHeading___Toc213_4102002274">
+          <w:hyperlink w:anchor="__RefHeading___Toc212_970847438">
             <w:r>
               <w:rPr>
                 <w:webHidden/>
@@ -406,7 +406,7 @@
             </w:tabs>
             <w:rPr/>
           </w:pPr>
-          <w:hyperlink w:anchor="__RefHeading___Toc215_4102002274">
+          <w:hyperlink w:anchor="__RefHeading___Toc214_970847438">
             <w:r>
               <w:rPr>
                 <w:webHidden/>
@@ -433,7 +433,7 @@
             </w:tabs>
             <w:rPr/>
           </w:pPr>
-          <w:hyperlink w:anchor="__RefHeading___Toc217_4102002274">
+          <w:hyperlink w:anchor="__RefHeading___Toc216_970847438">
             <w:r>
               <w:rPr>
                 <w:webHidden/>
@@ -460,7 +460,7 @@
             </w:tabs>
             <w:rPr/>
           </w:pPr>
-          <w:hyperlink w:anchor="__RefHeading___Toc219_4102002274">
+          <w:hyperlink w:anchor="__RefHeading___Toc218_970847438">
             <w:r>
               <w:rPr>
                 <w:webHidden/>
@@ -515,7 +515,7 @@
         <w:spacing w:before="0" w:after="160"/>
         <w:rPr/>
       </w:pPr>
-      <w:bookmarkStart w:id="0" w:name="__RefHeading___Toc207_4102002274"/>
+      <w:bookmarkStart w:id="0" w:name="__RefHeading___Toc206_970847438"/>
       <w:bookmarkEnd w:id="0"/>
       <w:r>
         <w:rPr>
@@ -597,7 +597,7 @@
         </w:pBdr>
         <w:rPr/>
       </w:pPr>
-      <w:bookmarkStart w:id="1" w:name="__RefHeading___Toc209_4102002274"/>
+      <w:bookmarkStart w:id="1" w:name="__RefHeading___Toc208_970847438"/>
       <w:bookmarkEnd w:id="1"/>
       <w:r>
         <w:rPr>
@@ -650,20 +650,6 @@
           <w:i w:val="false"/>
         </w:rPr>
         <w:t>The decisions sought establish the drafting baseline and the authority to commence the programme. Final doctrine, governance and implementation arrangements remain subject to the appropriate Army approval processes.</w:t>
-      </w:r>
-    </w:p>
-    <w:p>
-      <w:pPr>
-        <w:pStyle w:val="Normal"/>
-        <w:rPr/>
-      </w:pPr>
-      <w:r>
-        <w:rPr>
-          <w:rFonts w:cs="Arial"/>
-          <w:b w:val="false"/>
-          <w:i w:val="false"/>
-        </w:rPr>
-        <w:t>Final recommendations and an implementation back brief will return to COMDT ACS in November 2026.</w:t>
       </w:r>
     </w:p>
     <w:p>
@@ -687,7 +673,7 @@
         </w:pBdr>
         <w:rPr/>
       </w:pPr>
-      <w:bookmarkStart w:id="2" w:name="__RefHeading___Toc211_4102002274"/>
+      <w:bookmarkStart w:id="2" w:name="__RefHeading___Toc210_970847438"/>
       <w:bookmarkEnd w:id="2"/>
       <w:r>
         <w:rPr>
@@ -727,7 +713,7 @@
           <w:b w:val="false"/>
           <w:i/>
         </w:rPr>
-        <w:t>Substantial relevant capability already exists across ACS, NZALC, the Human Performance Cell, NZDF Psychology, ILD, training establishments and units. The challenge is not primarily a lack of content. It is a lack of visibility, integration, common terminology, strategic ownership and assurance across that existing capability.</w:t>
+        <w:t>Substantial relevant capability already exists across ACS, NZALC, the Human Performance Cell, Army Psychology Services (APS), ILD, training establishments and units. The challenge is not primarily a lack of content. It is a lack of visibility, integration, common terminology, strategic ownership and assurance across that existing capability.</w:t>
       </w:r>
     </w:p>
     <w:p>
@@ -795,7 +781,7 @@
         </w:pBdr>
         <w:rPr/>
       </w:pPr>
-      <w:bookmarkStart w:id="3" w:name="__RefHeading___Toc213_4102002274"/>
+      <w:bookmarkStart w:id="3" w:name="__RefHeading___Toc212_970847438"/>
       <w:bookmarkEnd w:id="3"/>
       <w:r>
         <w:rPr>
@@ -1349,7 +1335,7 @@
         </w:pBdr>
         <w:rPr/>
       </w:pPr>
-      <w:bookmarkStart w:id="4" w:name="__RefHeading___Toc215_4102002274"/>
+      <w:bookmarkStart w:id="4" w:name="__RefHeading___Toc214_970847438"/>
       <w:bookmarkEnd w:id="4"/>
       <w:r>
         <w:rPr>
@@ -1533,7 +1519,7 @@
         </w:pBdr>
         <w:rPr/>
       </w:pPr>
-      <w:bookmarkStart w:id="5" w:name="__RefHeading___Toc217_4102002274"/>
+      <w:bookmarkStart w:id="5" w:name="__RefHeading___Toc216_970847438"/>
       <w:bookmarkEnd w:id="5"/>
       <w:r>
         <w:rPr>
@@ -2077,7 +2063,7 @@
         </w:pBdr>
         <w:rPr/>
       </w:pPr>
-      <w:bookmarkStart w:id="6" w:name="__RefHeading___Toc219_4102002274"/>
+      <w:bookmarkStart w:id="6" w:name="__RefHeading___Toc218_970847438"/>
       <w:bookmarkEnd w:id="6"/>
       <w:r>
         <w:rPr>

</xml_diff>

<commit_message>
Name the service on the model page and drop the card connectors
Title now reads NZ Army Combat Mindset Framework Proposal so the paper is
clearly a single-service body of work. Remove the enabled by, organised
through and achieved through connectors and their arrows, close the gaps
they left, and give the programme card the reclaimed height.

Co-Authored-By: Claude Fable 5 <noreply@anthropic.com>
Claude-Session: https://claude.ai/code/session_01YLo1WfwUDkbwfJEF3ZNVbB
</commit_message>
<xml_diff>
--- a/output/combat-mindset-way-forward.docx
+++ b/output/combat-mindset-way-forward.docx
@@ -298,7 +298,7 @@
             </w:rPr>
             <w:fldChar w:fldCharType="separate"/>
           </w:r>
-          <w:hyperlink w:anchor="__RefHeading___Toc206_970847438">
+          <w:hyperlink w:anchor="__RefHeading___Toc206_3930625172">
             <w:r>
               <w:rPr>
                 <w:webHidden/>
@@ -325,7 +325,7 @@
             </w:tabs>
             <w:rPr/>
           </w:pPr>
-          <w:hyperlink w:anchor="__RefHeading___Toc208_970847438">
+          <w:hyperlink w:anchor="__RefHeading___Toc208_3930625172">
             <w:r>
               <w:rPr>
                 <w:webHidden/>
@@ -352,7 +352,7 @@
             </w:tabs>
             <w:rPr/>
           </w:pPr>
-          <w:hyperlink w:anchor="__RefHeading___Toc210_970847438">
+          <w:hyperlink w:anchor="__RefHeading___Toc210_3930625172">
             <w:r>
               <w:rPr>
                 <w:webHidden/>
@@ -379,7 +379,7 @@
             </w:tabs>
             <w:rPr/>
           </w:pPr>
-          <w:hyperlink w:anchor="__RefHeading___Toc212_970847438">
+          <w:hyperlink w:anchor="__RefHeading___Toc212_3930625172">
             <w:r>
               <w:rPr>
                 <w:webHidden/>
@@ -406,7 +406,7 @@
             </w:tabs>
             <w:rPr/>
           </w:pPr>
-          <w:hyperlink w:anchor="__RefHeading___Toc214_970847438">
+          <w:hyperlink w:anchor="__RefHeading___Toc214_3930625172">
             <w:r>
               <w:rPr>
                 <w:webHidden/>
@@ -433,7 +433,7 @@
             </w:tabs>
             <w:rPr/>
           </w:pPr>
-          <w:hyperlink w:anchor="__RefHeading___Toc216_970847438">
+          <w:hyperlink w:anchor="__RefHeading___Toc216_3930625172">
             <w:r>
               <w:rPr>
                 <w:webHidden/>
@@ -460,7 +460,7 @@
             </w:tabs>
             <w:rPr/>
           </w:pPr>
-          <w:hyperlink w:anchor="__RefHeading___Toc218_970847438">
+          <w:hyperlink w:anchor="__RefHeading___Toc218_3930625172">
             <w:r>
               <w:rPr>
                 <w:webHidden/>
@@ -515,7 +515,7 @@
         <w:spacing w:before="0" w:after="160"/>
         <w:rPr/>
       </w:pPr>
-      <w:bookmarkStart w:id="0" w:name="__RefHeading___Toc206_970847438"/>
+      <w:bookmarkStart w:id="0" w:name="__RefHeading___Toc206_3930625172"/>
       <w:bookmarkEnd w:id="0"/>
       <w:r>
         <w:rPr>
@@ -597,7 +597,7 @@
         </w:pBdr>
         <w:rPr/>
       </w:pPr>
-      <w:bookmarkStart w:id="1" w:name="__RefHeading___Toc208_970847438"/>
+      <w:bookmarkStart w:id="1" w:name="__RefHeading___Toc208_3930625172"/>
       <w:bookmarkEnd w:id="1"/>
       <w:r>
         <w:rPr>
@@ -673,7 +673,7 @@
         </w:pBdr>
         <w:rPr/>
       </w:pPr>
-      <w:bookmarkStart w:id="2" w:name="__RefHeading___Toc210_970847438"/>
+      <w:bookmarkStart w:id="2" w:name="__RefHeading___Toc210_3930625172"/>
       <w:bookmarkEnd w:id="2"/>
       <w:r>
         <w:rPr>
@@ -781,7 +781,7 @@
         </w:pBdr>
         <w:rPr/>
       </w:pPr>
-      <w:bookmarkStart w:id="3" w:name="__RefHeading___Toc212_970847438"/>
+      <w:bookmarkStart w:id="3" w:name="__RefHeading___Toc212_3930625172"/>
       <w:bookmarkEnd w:id="3"/>
       <w:r>
         <w:rPr>
@@ -1335,7 +1335,7 @@
         </w:pBdr>
         <w:rPr/>
       </w:pPr>
-      <w:bookmarkStart w:id="4" w:name="__RefHeading___Toc214_970847438"/>
+      <w:bookmarkStart w:id="4" w:name="__RefHeading___Toc214_3930625172"/>
       <w:bookmarkEnd w:id="4"/>
       <w:r>
         <w:rPr>
@@ -1519,7 +1519,7 @@
         </w:pBdr>
         <w:rPr/>
       </w:pPr>
-      <w:bookmarkStart w:id="5" w:name="__RefHeading___Toc216_970847438"/>
+      <w:bookmarkStart w:id="5" w:name="__RefHeading___Toc216_3930625172"/>
       <w:bookmarkEnd w:id="5"/>
       <w:r>
         <w:rPr>
@@ -2063,7 +2063,7 @@
         </w:pBdr>
         <w:rPr/>
       </w:pPr>
-      <w:bookmarkStart w:id="6" w:name="__RefHeading___Toc218_970847438"/>
+      <w:bookmarkStart w:id="6" w:name="__RefHeading___Toc218_3930625172"/>
       <w:bookmarkEnd w:id="6"/>
       <w:r>
         <w:rPr>

</xml_diff>

<commit_message>
Set the cover on three vertical registers
The cover previously sat entirely in the top 60 percent of the page with
97mm of dead space beneath the reference block. Register the logo on the
top margin, place the title block on the optical centre, and anchor the
reference block above the bottom margin, giving even 81mm fields of white
between the three elements.

Co-Authored-By: Claude Fable 5 <noreply@anthropic.com>
Claude-Session: https://claude.ai/code/session_01YLo1WfwUDkbwfJEF3ZNVbB
</commit_message>
<xml_diff>
--- a/output/combat-mindset-way-forward.docx
+++ b/output/combat-mindset-way-forward.docx
@@ -5,7 +5,7 @@
     <w:p>
       <w:pPr>
         <w:pStyle w:val="Normal"/>
-        <w:spacing w:before="880" w:after="1280"/>
+        <w:spacing w:before="0" w:after="4400"/>
         <w:rPr/>
       </w:pPr>
       <w:r>
@@ -102,7 +102,7 @@
     <w:p>
       <w:pPr>
         <w:pStyle w:val="Normal"/>
-        <w:spacing w:before="0" w:after="1680"/>
+        <w:spacing w:before="0" w:after="4500"/>
         <w:rPr/>
       </w:pPr>
       <w:r>
@@ -298,7 +298,7 @@
             </w:rPr>
             <w:fldChar w:fldCharType="separate"/>
           </w:r>
-          <w:hyperlink w:anchor="__RefHeading___Toc206_3930625172">
+          <w:hyperlink w:anchor="__RefHeading___Toc206_2407265486">
             <w:r>
               <w:rPr>
                 <w:webHidden/>
@@ -325,7 +325,7 @@
             </w:tabs>
             <w:rPr/>
           </w:pPr>
-          <w:hyperlink w:anchor="__RefHeading___Toc208_3930625172">
+          <w:hyperlink w:anchor="__RefHeading___Toc208_2407265486">
             <w:r>
               <w:rPr>
                 <w:webHidden/>
@@ -352,7 +352,7 @@
             </w:tabs>
             <w:rPr/>
           </w:pPr>
-          <w:hyperlink w:anchor="__RefHeading___Toc210_3930625172">
+          <w:hyperlink w:anchor="__RefHeading___Toc210_2407265486">
             <w:r>
               <w:rPr>
                 <w:webHidden/>
@@ -379,7 +379,7 @@
             </w:tabs>
             <w:rPr/>
           </w:pPr>
-          <w:hyperlink w:anchor="__RefHeading___Toc212_3930625172">
+          <w:hyperlink w:anchor="__RefHeading___Toc212_2407265486">
             <w:r>
               <w:rPr>
                 <w:webHidden/>
@@ -406,7 +406,7 @@
             </w:tabs>
             <w:rPr/>
           </w:pPr>
-          <w:hyperlink w:anchor="__RefHeading___Toc214_3930625172">
+          <w:hyperlink w:anchor="__RefHeading___Toc214_2407265486">
             <w:r>
               <w:rPr>
                 <w:webHidden/>
@@ -433,7 +433,7 @@
             </w:tabs>
             <w:rPr/>
           </w:pPr>
-          <w:hyperlink w:anchor="__RefHeading___Toc216_3930625172">
+          <w:hyperlink w:anchor="__RefHeading___Toc216_2407265486">
             <w:r>
               <w:rPr>
                 <w:webHidden/>
@@ -460,7 +460,7 @@
             </w:tabs>
             <w:rPr/>
           </w:pPr>
-          <w:hyperlink w:anchor="__RefHeading___Toc218_3930625172">
+          <w:hyperlink w:anchor="__RefHeading___Toc218_2407265486">
             <w:r>
               <w:rPr>
                 <w:webHidden/>
@@ -515,7 +515,7 @@
         <w:spacing w:before="0" w:after="160"/>
         <w:rPr/>
       </w:pPr>
-      <w:bookmarkStart w:id="0" w:name="__RefHeading___Toc206_3930625172"/>
+      <w:bookmarkStart w:id="0" w:name="__RefHeading___Toc206_2407265486"/>
       <w:bookmarkEnd w:id="0"/>
       <w:r>
         <w:rPr>
@@ -597,7 +597,7 @@
         </w:pBdr>
         <w:rPr/>
       </w:pPr>
-      <w:bookmarkStart w:id="1" w:name="__RefHeading___Toc208_3930625172"/>
+      <w:bookmarkStart w:id="1" w:name="__RefHeading___Toc208_2407265486"/>
       <w:bookmarkEnd w:id="1"/>
       <w:r>
         <w:rPr>
@@ -673,7 +673,7 @@
         </w:pBdr>
         <w:rPr/>
       </w:pPr>
-      <w:bookmarkStart w:id="2" w:name="__RefHeading___Toc210_3930625172"/>
+      <w:bookmarkStart w:id="2" w:name="__RefHeading___Toc210_2407265486"/>
       <w:bookmarkEnd w:id="2"/>
       <w:r>
         <w:rPr>
@@ -781,7 +781,7 @@
         </w:pBdr>
         <w:rPr/>
       </w:pPr>
-      <w:bookmarkStart w:id="3" w:name="__RefHeading___Toc212_3930625172"/>
+      <w:bookmarkStart w:id="3" w:name="__RefHeading___Toc212_2407265486"/>
       <w:bookmarkEnd w:id="3"/>
       <w:r>
         <w:rPr>
@@ -1335,7 +1335,7 @@
         </w:pBdr>
         <w:rPr/>
       </w:pPr>
-      <w:bookmarkStart w:id="4" w:name="__RefHeading___Toc214_3930625172"/>
+      <w:bookmarkStart w:id="4" w:name="__RefHeading___Toc214_2407265486"/>
       <w:bookmarkEnd w:id="4"/>
       <w:r>
         <w:rPr>
@@ -1519,7 +1519,7 @@
         </w:pBdr>
         <w:rPr/>
       </w:pPr>
-      <w:bookmarkStart w:id="5" w:name="__RefHeading___Toc216_3930625172"/>
+      <w:bookmarkStart w:id="5" w:name="__RefHeading___Toc216_2407265486"/>
       <w:bookmarkEnd w:id="5"/>
       <w:r>
         <w:rPr>
@@ -2063,7 +2063,7 @@
         </w:pBdr>
         <w:rPr/>
       </w:pPr>
-      <w:bookmarkStart w:id="6" w:name="__RefHeading___Toc218_3930625172"/>
+      <w:bookmarkStart w:id="6" w:name="__RefHeading___Toc218_2407265486"/>
       <w:bookmarkEnd w:id="6"/>
       <w:r>
         <w:rPr>

</xml_diff>

<commit_message>
Give Option 1 the same advantages and limitations structure as Option 2
Option 1 previously listed only its advantages, which read as an
unbalanced comparison. Add the Advantages heading and a Limitations
heading carrying the two-term burden: Army must hold and sustain two
related definitions rather than one, and that hierarchy runs against
common soldier usage.

Co-Authored-By: Claude Fable 5 <noreply@anthropic.com>
Claude-Session: https://claude.ai/code/session_01YLo1WfwUDkbwfJEF3ZNVbB
</commit_message>
<xml_diff>
--- a/output/combat-mindset-way-forward.docx
+++ b/output/combat-mindset-way-forward.docx
@@ -298,7 +298,7 @@
             </w:rPr>
             <w:fldChar w:fldCharType="separate"/>
           </w:r>
-          <w:hyperlink w:anchor="__RefHeading___Toc206_2407265486">
+          <w:hyperlink w:anchor="__RefHeading___Toc214_35239450">
             <w:r>
               <w:rPr>
                 <w:webHidden/>
@@ -325,7 +325,7 @@
             </w:tabs>
             <w:rPr/>
           </w:pPr>
-          <w:hyperlink w:anchor="__RefHeading___Toc208_2407265486">
+          <w:hyperlink w:anchor="__RefHeading___Toc216_35239450">
             <w:r>
               <w:rPr>
                 <w:webHidden/>
@@ -352,7 +352,7 @@
             </w:tabs>
             <w:rPr/>
           </w:pPr>
-          <w:hyperlink w:anchor="__RefHeading___Toc210_2407265486">
+          <w:hyperlink w:anchor="__RefHeading___Toc218_35239450">
             <w:r>
               <w:rPr>
                 <w:webHidden/>
@@ -379,7 +379,7 @@
             </w:tabs>
             <w:rPr/>
           </w:pPr>
-          <w:hyperlink w:anchor="__RefHeading___Toc212_2407265486">
+          <w:hyperlink w:anchor="__RefHeading___Toc220_35239450">
             <w:r>
               <w:rPr>
                 <w:webHidden/>
@@ -406,7 +406,7 @@
             </w:tabs>
             <w:rPr/>
           </w:pPr>
-          <w:hyperlink w:anchor="__RefHeading___Toc214_2407265486">
+          <w:hyperlink w:anchor="__RefHeading___Toc222_35239450">
             <w:r>
               <w:rPr>
                 <w:webHidden/>
@@ -433,7 +433,7 @@
             </w:tabs>
             <w:rPr/>
           </w:pPr>
-          <w:hyperlink w:anchor="__RefHeading___Toc216_2407265486">
+          <w:hyperlink w:anchor="__RefHeading___Toc224_35239450">
             <w:r>
               <w:rPr>
                 <w:webHidden/>
@@ -447,7 +447,7 @@
                 <w:rStyle w:val="IndexLink"/>
               </w:rPr>
               <w:tab/>
-              <w:t>6</w:t>
+              <w:t>7</w:t>
             </w:r>
           </w:hyperlink>
         </w:p>
@@ -460,7 +460,7 @@
             </w:tabs>
             <w:rPr/>
           </w:pPr>
-          <w:hyperlink w:anchor="__RefHeading___Toc218_2407265486">
+          <w:hyperlink w:anchor="__RefHeading___Toc226_35239450">
             <w:r>
               <w:rPr>
                 <w:webHidden/>
@@ -515,7 +515,7 @@
         <w:spacing w:before="0" w:after="160"/>
         <w:rPr/>
       </w:pPr>
-      <w:bookmarkStart w:id="0" w:name="__RefHeading___Toc206_2407265486"/>
+      <w:bookmarkStart w:id="0" w:name="__RefHeading___Toc214_35239450"/>
       <w:bookmarkEnd w:id="0"/>
       <w:r>
         <w:rPr>
@@ -597,7 +597,7 @@
         </w:pBdr>
         <w:rPr/>
       </w:pPr>
-      <w:bookmarkStart w:id="1" w:name="__RefHeading___Toc208_2407265486"/>
+      <w:bookmarkStart w:id="1" w:name="__RefHeading___Toc216_35239450"/>
       <w:bookmarkEnd w:id="1"/>
       <w:r>
         <w:rPr>
@@ -673,7 +673,7 @@
         </w:pBdr>
         <w:rPr/>
       </w:pPr>
-      <w:bookmarkStart w:id="2" w:name="__RefHeading___Toc210_2407265486"/>
+      <w:bookmarkStart w:id="2" w:name="__RefHeading___Toc218_35239450"/>
       <w:bookmarkEnd w:id="2"/>
       <w:r>
         <w:rPr>
@@ -781,7 +781,7 @@
         </w:pBdr>
         <w:rPr/>
       </w:pPr>
-      <w:bookmarkStart w:id="3" w:name="__RefHeading___Toc212_2407265486"/>
+      <w:bookmarkStart w:id="3" w:name="__RefHeading___Toc220_35239450"/>
       <w:bookmarkEnd w:id="3"/>
       <w:r>
         <w:rPr>
@@ -952,6 +952,20 @@
           <w:i/>
         </w:rPr>
         <w:t>In summary, Performance Under Pressure is the trainable capability; Combat Mindset is its combat-specific expression.</w:t>
+      </w:r>
+    </w:p>
+    <w:p>
+      <w:pPr>
+        <w:pStyle w:val="Normal"/>
+        <w:rPr/>
+      </w:pPr>
+      <w:r>
+        <w:rPr>
+          <w:rFonts w:cs="Arial"/>
+          <w:b/>
+          <w:i w:val="false"/>
+        </w:rPr>
+        <w:t>Advantages</w:t>
       </w:r>
     </w:p>
     <w:p>
@@ -1064,46 +1078,16 @@
     </w:p>
     <w:p>
       <w:pPr>
-        <w:pStyle w:val="Heading2"/>
-        <w:rPr/>
-      </w:pPr>
-      <w:r>
-        <w:rPr>
-          <w:rFonts w:cs="Arial"/>
-          <w:b/>
-          <w:i w:val="false"/>
-          <w:color w:val="000000"/>
-          <w:sz w:val="22"/>
-        </w:rPr>
-        <w:t>Option 2: Combat Mindset as the complete umbrella capability</w:t>
-      </w:r>
-    </w:p>
-    <w:p>
-      <w:pPr>
-        <w:pStyle w:val="Normal"/>
-        <w:rPr/>
-      </w:pPr>
-      <w:r>
-        <w:rPr>
-          <w:rFonts w:cs="Arial"/>
-          <w:b w:val="false"/>
-          <w:i w:val="false"/>
-        </w:rPr>
-        <w:t>Combat Mindset is treated as the complete capability itself, integrating leadership, human performance, resilience, mental skills and performance cognition, with performance under pressure expressed within it.</w:t>
-      </w:r>
-    </w:p>
-    <w:p>
-      <w:pPr>
-        <w:pStyle w:val="Normal"/>
-        <w:rPr/>
-      </w:pPr>
-      <w:r>
-        <w:rPr>
-          <w:rFonts w:cs="Arial"/>
-          <w:b/>
-          <w:i w:val="false"/>
-        </w:rPr>
-        <w:t>Advantages</w:t>
+        <w:pStyle w:val="Normal"/>
+        <w:rPr/>
+      </w:pPr>
+      <w:r>
+        <w:rPr>
+          <w:rFonts w:cs="Arial"/>
+          <w:b/>
+          <w:i w:val="false"/>
+        </w:rPr>
+        <w:t>Limitations</w:t>
       </w:r>
     </w:p>
     <w:p>
@@ -1139,7 +1123,7 @@
           <w:b w:val="false"/>
           <w:i w:val="false"/>
         </w:rPr>
-        <w:t>Maximises simplicity: one term serves as outcome, capability and framework alike.</w:t>
+        <w:t>Requires Army to hold two related terms rather than one, so the distinction must be explained and sustained in doctrine, instruction and everyday use.</w:t>
       </w:r>
     </w:p>
     <w:p>
@@ -1175,21 +1159,51 @@
           <w:b w:val="false"/>
           <w:i w:val="false"/>
         </w:rPr>
-        <w:t>Matches common soldier usage, in which Combat Mindset already serves as the umbrella term, and avoids a two-term hierarchy that requires sustained explanation.</w:t>
-      </w:r>
-    </w:p>
-    <w:p>
-      <w:pPr>
-        <w:pStyle w:val="Normal"/>
-        <w:rPr/>
-      </w:pPr>
-      <w:r>
-        <w:rPr>
-          <w:rFonts w:cs="Arial"/>
-          <w:b/>
-          <w:i w:val="false"/>
-        </w:rPr>
-        <w:t>Limitations</w:t>
+        <w:t>Runs against common soldier usage, in which Combat Mindset already serves as the umbrella term, so the hierarchy will need reinforcement to hold.</w:t>
+      </w:r>
+    </w:p>
+    <w:p>
+      <w:pPr>
+        <w:pStyle w:val="Heading2"/>
+        <w:rPr/>
+      </w:pPr>
+      <w:r>
+        <w:rPr>
+          <w:rFonts w:cs="Arial"/>
+          <w:b/>
+          <w:i w:val="false"/>
+          <w:color w:val="000000"/>
+          <w:sz w:val="22"/>
+        </w:rPr>
+        <w:t>Option 2: Combat Mindset as the complete umbrella capability</w:t>
+      </w:r>
+    </w:p>
+    <w:p>
+      <w:pPr>
+        <w:pStyle w:val="Normal"/>
+        <w:rPr/>
+      </w:pPr>
+      <w:r>
+        <w:rPr>
+          <w:rFonts w:cs="Arial"/>
+          <w:b w:val="false"/>
+          <w:i w:val="false"/>
+        </w:rPr>
+        <w:t>Combat Mindset is treated as the complete capability itself, integrating leadership, human performance, resilience, mental skills and performance cognition, with performance under pressure expressed within it.</w:t>
+      </w:r>
+    </w:p>
+    <w:p>
+      <w:pPr>
+        <w:pStyle w:val="Normal"/>
+        <w:rPr/>
+      </w:pPr>
+      <w:r>
+        <w:rPr>
+          <w:rFonts w:cs="Arial"/>
+          <w:b/>
+          <w:i w:val="false"/>
+        </w:rPr>
+        <w:t>Advantages</w:t>
       </w:r>
     </w:p>
     <w:p>
@@ -1225,7 +1239,7 @@
           <w:b w:val="false"/>
           <w:i w:val="false"/>
         </w:rPr>
-        <w:t>Conflates the combat-specific outcome with the broader human-performance capability, reducing applicability outside combat.</w:t>
+        <w:t>Maximises simplicity: one term serves as outcome, capability and framework alike.</w:t>
       </w:r>
     </w:p>
     <w:p>
@@ -1261,7 +1275,21 @@
           <w:b w:val="false"/>
           <w:i w:val="false"/>
         </w:rPr>
-        <w:t>Makes it difficult to distinguish doctrine, capability, framework and product.</w:t>
+        <w:t>Matches common soldier usage, in which Combat Mindset already serves as the umbrella term, and avoids a two-term hierarchy that requires sustained explanation.</w:t>
+      </w:r>
+    </w:p>
+    <w:p>
+      <w:pPr>
+        <w:pStyle w:val="Normal"/>
+        <w:rPr/>
+      </w:pPr>
+      <w:r>
+        <w:rPr>
+          <w:rFonts w:cs="Arial"/>
+          <w:b/>
+          <w:i w:val="false"/>
+        </w:rPr>
+        <w:t>Limitations</w:t>
       </w:r>
     </w:p>
     <w:p>
@@ -1297,349 +1325,7 @@
           <w:b w:val="false"/>
           <w:i w:val="false"/>
         </w:rPr>
-        <w:t>Increases the risk that Combat Mindset is interpreted as motivation or aggression alone.</w:t>
-      </w:r>
-    </w:p>
-    <w:p>
-      <w:pPr>
-        <w:pStyle w:val="Normal"/>
-        <w:rPr/>
-      </w:pPr>
-      <w:r>
-        <w:rPr>
-          <w:rFonts w:cs="Arial"/>
-          <w:b w:val="false"/>
-          <w:i w:val="false"/>
-        </w:rPr>
-        <w:t>Both options deliver the end state described in the COMDT ACS guidance. NZALC and HPC jointly recommend Option 1, and will implement whichever option COMDT ACS selects.</w:t>
-      </w:r>
-    </w:p>
-    <w:p>
-      <w:pPr>
-        <w:pStyle w:val="Normal"/>
-        <w:pBdr>
-          <w:bottom w:val="single" w:sz="6" w:space="1" w:color="A89662"/>
-        </w:pBdr>
-        <w:spacing w:before="200" w:after="200"/>
-        <w:rPr/>
-      </w:pPr>
-      <w:r>
-        <w:rPr/>
-      </w:r>
-    </w:p>
-    <w:p>
-      <w:pPr>
-        <w:pStyle w:val="Heading1"/>
-        <w:pBdr>
-          <w:left w:val="single" w:sz="24" w:space="8" w:color="C62026"/>
-        </w:pBdr>
-        <w:rPr/>
-      </w:pPr>
-      <w:bookmarkStart w:id="4" w:name="__RefHeading___Toc214_2407265486"/>
-      <w:bookmarkEnd w:id="4"/>
-      <w:r>
-        <w:rPr>
-          <w:rFonts w:cs="Arial"/>
-          <w:b/>
-          <w:i w:val="false"/>
-          <w:color w:val="002516"/>
-          <w:sz w:val="28"/>
-        </w:rPr>
-        <w:t>3. What already exists</w:t>
-      </w:r>
-    </w:p>
-    <w:p>
-      <w:pPr>
-        <w:pStyle w:val="Heading2"/>
-        <w:rPr/>
-      </w:pPr>
-      <w:r>
-        <w:rPr>
-          <w:rFonts w:cs="Arial"/>
-          <w:b/>
-          <w:i w:val="false"/>
-          <w:color w:val="000000"/>
-          <w:sz w:val="22"/>
-        </w:rPr>
-        <w:t>Within ACS</w:t>
-      </w:r>
-    </w:p>
-    <w:p>
-      <w:pPr>
-        <w:pStyle w:val="Normal"/>
-        <w:rPr/>
-      </w:pPr>
-      <w:r>
-        <w:rPr>
-          <w:rFonts w:cs="Arial"/>
-          <w:b/>
-          <w:i w:val="false"/>
-          <w:color w:val="002516"/>
-          <w:sz w:val="20"/>
-        </w:rPr>
-        <w:t>NZALC Leadership Development System</w:t>
-      </w:r>
-    </w:p>
-    <w:p>
-      <w:pPr>
-        <w:pStyle w:val="Normal"/>
-        <w:rPr/>
-      </w:pPr>
-      <w:r>
-        <w:rPr>
-          <w:rFonts w:cs="Arial"/>
-          <w:b w:val="false"/>
-          <w:i w:val="false"/>
-        </w:rPr>
-        <w:t>NZALC delivers a leadership-development approach incorporating Performance = Potential – Interference, Red Head–Blue Head, Prepare–Perform–Recover, mental-skills techniques, psychometrics, experiential activity, feedback and Leadership Development Plans. This material is embedded across Lead Self, Lead Teams, Lead Leaders and Lead Systems.</w:t>
-      </w:r>
-    </w:p>
-    <w:p>
-      <w:pPr>
-        <w:pStyle w:val="Normal"/>
-        <w:rPr/>
-      </w:pPr>
-      <w:r>
-        <w:rPr>
-          <w:rFonts w:cs="Arial"/>
-          <w:b/>
-          <w:i w:val="false"/>
-          <w:color w:val="002516"/>
-          <w:sz w:val="20"/>
-        </w:rPr>
-        <w:t>HPC Cognitive Conditioning (COGCON)</w:t>
-      </w:r>
-    </w:p>
-    <w:p>
-      <w:pPr>
-        <w:pStyle w:val="Normal"/>
-        <w:rPr/>
-      </w:pPr>
-      <w:r>
-        <w:rPr>
-          <w:rFonts w:cs="Arial"/>
-          <w:b w:val="false"/>
-          <w:i w:val="false"/>
-        </w:rPr>
-        <w:t>COGCON is a developmental cognitive-conditioning product targeting selected aspects of performance cognition under physical and cognitive load, including arousal regulation, attention, cognitive control and working memory. Feasibility trials in military training have demonstrated acceptability and promising training trends. Its causal effectiveness, operational transfer, readiness validity, scalability and enduring delivery model have not yet been established. Its status and appropriate future role will be confirmed through the Phase 2 assessment.</w:t>
-      </w:r>
-    </w:p>
-    <w:p>
-      <w:pPr>
-        <w:pStyle w:val="Heading2"/>
-        <w:rPr/>
-      </w:pPr>
-      <w:r>
-        <w:rPr>
-          <w:rFonts w:cs="Arial"/>
-          <w:b/>
-          <w:i w:val="false"/>
-          <w:color w:val="000000"/>
-          <w:sz w:val="22"/>
-        </w:rPr>
-        <w:t>Outside ACS</w:t>
-      </w:r>
-    </w:p>
-    <w:p>
-      <w:pPr>
-        <w:pStyle w:val="Normal"/>
-        <w:rPr/>
-      </w:pPr>
-      <w:r>
-        <w:rPr>
-          <w:rFonts w:cs="Arial"/>
-          <w:b/>
-          <w:i w:val="false"/>
-          <w:color w:val="002516"/>
-          <w:sz w:val="20"/>
-        </w:rPr>
-        <w:t>Army Psychology Services (APS), ILD and other stakeholders</w:t>
-      </w:r>
-    </w:p>
-    <w:p>
-      <w:pPr>
-        <w:pStyle w:val="Normal"/>
-        <w:rPr/>
-      </w:pPr>
-      <w:r>
-        <w:rPr>
-          <w:rFonts w:cs="Arial"/>
-          <w:b w:val="false"/>
-          <w:i w:val="false"/>
-        </w:rPr>
-        <w:t>These organisations hold additional professional expertise, learning products, delivery capability and assurance functions that will be confirmed during the Phase 2 assessment.</w:t>
-      </w:r>
-    </w:p>
-    <w:p>
-      <w:pPr>
-        <w:pStyle w:val="Normal"/>
-        <w:rPr/>
-      </w:pPr>
-      <w:r>
-        <w:rPr>
-          <w:rFonts w:cs="Arial"/>
-          <w:b w:val="false"/>
-          <w:i w:val="false"/>
-        </w:rPr>
-        <w:t>Initial review indicates considerable conceptual alignment across existing products. The Combat Mindset Framework will establish a common doctrinal language beneath which individual products and methods can be nested. It will not require identical internal methodologies, provided products align to the endorsed framework, outcomes and assurance requirements.</w:t>
-      </w:r>
-    </w:p>
-    <w:p>
-      <w:pPr>
-        <w:pStyle w:val="Normal"/>
-        <w:rPr/>
-      </w:pPr>
-      <w:r>
-        <w:rPr>
-          <w:rFonts w:cs="Arial"/>
-          <w:b w:val="false"/>
-          <w:i w:val="false"/>
-        </w:rPr>
-        <w:t>A full assessment of existing capability and products will be completed during Phase 2. The products described above contribute to Performance Under Pressure and, where applied in a warfighting context, to Combat Mindset; none constitutes the framework in isolation.</w:t>
-      </w:r>
-    </w:p>
-    <w:p>
-      <w:pPr>
-        <w:pStyle w:val="Normal"/>
-        <w:pBdr>
-          <w:bottom w:val="single" w:sz="6" w:space="1" w:color="A89662"/>
-        </w:pBdr>
-        <w:spacing w:before="200" w:after="200"/>
-        <w:rPr/>
-      </w:pPr>
-      <w:r>
-        <w:rPr/>
-      </w:r>
-    </w:p>
-    <w:p>
-      <w:pPr>
-        <w:pStyle w:val="Heading1"/>
-        <w:pBdr>
-          <w:left w:val="single" w:sz="24" w:space="8" w:color="C62026"/>
-        </w:pBdr>
-        <w:rPr/>
-      </w:pPr>
-      <w:bookmarkStart w:id="5" w:name="__RefHeading___Toc216_2407265486"/>
-      <w:bookmarkEnd w:id="5"/>
-      <w:r>
-        <w:rPr>
-          <w:rFonts w:cs="Arial"/>
-          <w:b/>
-          <w:i w:val="false"/>
-          <w:color w:val="002516"/>
-          <w:sz w:val="28"/>
-        </w:rPr>
-        <w:t>4. Programme of work</w:t>
-      </w:r>
-    </w:p>
-    <w:p>
-      <w:pPr>
-        <w:pStyle w:val="Normal"/>
-        <w:rPr/>
-      </w:pPr>
-      <w:r>
-        <w:rPr>
-          <w:rFonts w:cs="Arial"/>
-          <w:b w:val="false"/>
-          <w:i w:val="false"/>
-        </w:rPr>
-        <w:t>August 2026 is set aside for this paper to be socialised through the chain of command, and the programme is therefore proposed to commence in September 2026. The timeframes below are aspirational and depend to varying extents on external stakeholder availability and input. As such, activity extending into early 2027 is anticipated rather than unforeseen.</w:t>
-      </w:r>
-    </w:p>
-    <w:p>
-      <w:pPr>
-        <w:pStyle w:val="Normal"/>
-        <w:rPr/>
-      </w:pPr>
-      <w:r>
-        <w:rPr>
-          <w:rFonts w:cs="Arial"/>
-          <w:b w:val="false"/>
-          <w:i w:val="false"/>
-        </w:rPr>
-        <w:t>Phases may overlap where practical, however subsequent design decisions remain dependent upon the endorsed outputs of preceding phases.</w:t>
-      </w:r>
-    </w:p>
-    <w:p>
-      <w:pPr>
-        <w:pStyle w:val="Heading2"/>
-        <w:rPr/>
-      </w:pPr>
-      <w:r>
-        <w:rPr>
-          <w:rFonts w:cs="Arial"/>
-          <w:b/>
-          <w:i w:val="false"/>
-          <w:color w:val="000000"/>
-          <w:sz w:val="22"/>
-        </w:rPr>
-        <w:t>Phase 1: Define (September 2026)</w:t>
-      </w:r>
-    </w:p>
-    <w:p>
-      <w:pPr>
-        <w:pStyle w:val="Normal"/>
-        <w:rPr/>
-      </w:pPr>
-      <w:r>
-        <w:rPr>
-          <w:rFonts w:cs="Arial"/>
-          <w:b w:val="false"/>
-          <w:i w:val="false"/>
-        </w:rPr>
-        <w:t>Confirm terminology, governance, roles and responsibilities. Select the terminology option at paragraph 2 and draft the endorsed definitions and their relationship for staffing. Confirm interim sponsorship, programme leadership, phase leads, stakeholder representation and decision authorities, while identifying the enduring capability ownership, technical-authority and assurance arrangements to be resolved through the programme.</w:t>
-      </w:r>
-    </w:p>
-    <w:p>
-      <w:pPr>
-        <w:pStyle w:val="Normal"/>
-        <w:rPr/>
-      </w:pPr>
-      <w:r>
-        <w:rPr>
-          <w:rFonts w:cs="Arial"/>
-          <w:b/>
-          <w:i w:val="false"/>
-        </w:rPr>
-        <w:t>Key output.</w:t>
-      </w:r>
-      <w:r>
-        <w:rPr>
-          <w:rFonts w:cs="Arial"/>
-          <w:b w:val="false"/>
-          <w:i w:val="false"/>
-        </w:rPr>
-        <w:t xml:space="preserve"> Endorsed drafting baseline and confirmed interim governance.</w:t>
-      </w:r>
-    </w:p>
-    <w:p>
-      <w:pPr>
-        <w:pStyle w:val="Heading2"/>
-        <w:rPr/>
-      </w:pPr>
-      <w:r>
-        <w:rPr>
-          <w:rFonts w:cs="Arial"/>
-          <w:b/>
-          <w:i w:val="false"/>
-          <w:color w:val="000000"/>
-          <w:sz w:val="22"/>
-        </w:rPr>
-        <w:t>Phase 2: Understand (September 2026)</w:t>
-      </w:r>
-    </w:p>
-    <w:p>
-      <w:pPr>
-        <w:pStyle w:val="Normal"/>
-        <w:rPr/>
-      </w:pPr>
-      <w:r>
-        <w:rPr>
-          <w:rFonts w:cs="Arial"/>
-          <w:b w:val="false"/>
-          <w:i w:val="false"/>
-        </w:rPr>
-        <w:t>Assess existing doctrine, products and delivery across ACS, NZALC, HPC, APS, ILD, training establishments and selected units against:</w:t>
+        <w:t>Conflates the combat-specific outcome with the broader human-performance capability, reducing applicability outside combat.</w:t>
       </w:r>
     </w:p>
     <w:p>
@@ -1675,7 +1361,7 @@
           <w:b w:val="false"/>
           <w:i w:val="false"/>
         </w:rPr>
-        <w:t>doctrinal and policy holdings;</w:t>
+        <w:t>Makes it difficult to distinguish doctrine, capability, framework and product.</w:t>
       </w:r>
     </w:p>
     <w:p>
@@ -1711,7 +1397,349 @@
           <w:b w:val="false"/>
           <w:i w:val="false"/>
         </w:rPr>
-        <w:t>capability outcomes, training products and methods;</w:t>
+        <w:t>Increases the risk that Combat Mindset is interpreted as motivation or aggression alone.</w:t>
+      </w:r>
+    </w:p>
+    <w:p>
+      <w:pPr>
+        <w:pStyle w:val="Normal"/>
+        <w:rPr/>
+      </w:pPr>
+      <w:r>
+        <w:rPr>
+          <w:rFonts w:cs="Arial"/>
+          <w:b w:val="false"/>
+          <w:i w:val="false"/>
+        </w:rPr>
+        <w:t>Both options deliver the end state described in the COMDT ACS guidance. NZALC and HPC jointly recommend Option 1, and will implement whichever option COMDT ACS selects.</w:t>
+      </w:r>
+    </w:p>
+    <w:p>
+      <w:pPr>
+        <w:pStyle w:val="Normal"/>
+        <w:pBdr>
+          <w:bottom w:val="single" w:sz="6" w:space="1" w:color="A89662"/>
+        </w:pBdr>
+        <w:spacing w:before="200" w:after="200"/>
+        <w:rPr/>
+      </w:pPr>
+      <w:r>
+        <w:rPr/>
+      </w:r>
+    </w:p>
+    <w:p>
+      <w:pPr>
+        <w:pStyle w:val="Heading1"/>
+        <w:pBdr>
+          <w:left w:val="single" w:sz="24" w:space="8" w:color="C62026"/>
+        </w:pBdr>
+        <w:rPr/>
+      </w:pPr>
+      <w:bookmarkStart w:id="4" w:name="__RefHeading___Toc222_35239450"/>
+      <w:bookmarkEnd w:id="4"/>
+      <w:r>
+        <w:rPr>
+          <w:rFonts w:cs="Arial"/>
+          <w:b/>
+          <w:i w:val="false"/>
+          <w:color w:val="002516"/>
+          <w:sz w:val="28"/>
+        </w:rPr>
+        <w:t>3. What already exists</w:t>
+      </w:r>
+    </w:p>
+    <w:p>
+      <w:pPr>
+        <w:pStyle w:val="Heading2"/>
+        <w:rPr/>
+      </w:pPr>
+      <w:r>
+        <w:rPr>
+          <w:rFonts w:cs="Arial"/>
+          <w:b/>
+          <w:i w:val="false"/>
+          <w:color w:val="000000"/>
+          <w:sz w:val="22"/>
+        </w:rPr>
+        <w:t>Within ACS</w:t>
+      </w:r>
+    </w:p>
+    <w:p>
+      <w:pPr>
+        <w:pStyle w:val="Normal"/>
+        <w:rPr/>
+      </w:pPr>
+      <w:r>
+        <w:rPr>
+          <w:rFonts w:cs="Arial"/>
+          <w:b/>
+          <w:i w:val="false"/>
+          <w:color w:val="002516"/>
+          <w:sz w:val="20"/>
+        </w:rPr>
+        <w:t>NZALC Leadership Development System</w:t>
+      </w:r>
+    </w:p>
+    <w:p>
+      <w:pPr>
+        <w:pStyle w:val="Normal"/>
+        <w:rPr/>
+      </w:pPr>
+      <w:r>
+        <w:rPr>
+          <w:rFonts w:cs="Arial"/>
+          <w:b w:val="false"/>
+          <w:i w:val="false"/>
+        </w:rPr>
+        <w:t>NZALC delivers a leadership-development approach incorporating Performance = Potential – Interference, Red Head–Blue Head, Prepare–Perform–Recover, mental-skills techniques, psychometrics, experiential activity, feedback and Leadership Development Plans. This material is embedded across Lead Self, Lead Teams, Lead Leaders and Lead Systems.</w:t>
+      </w:r>
+    </w:p>
+    <w:p>
+      <w:pPr>
+        <w:pStyle w:val="Normal"/>
+        <w:rPr/>
+      </w:pPr>
+      <w:r>
+        <w:rPr>
+          <w:rFonts w:cs="Arial"/>
+          <w:b/>
+          <w:i w:val="false"/>
+          <w:color w:val="002516"/>
+          <w:sz w:val="20"/>
+        </w:rPr>
+        <w:t>HPC Cognitive Conditioning (COGCON)</w:t>
+      </w:r>
+    </w:p>
+    <w:p>
+      <w:pPr>
+        <w:pStyle w:val="Normal"/>
+        <w:rPr/>
+      </w:pPr>
+      <w:r>
+        <w:rPr>
+          <w:rFonts w:cs="Arial"/>
+          <w:b w:val="false"/>
+          <w:i w:val="false"/>
+        </w:rPr>
+        <w:t>COGCON is a developmental cognitive-conditioning product targeting selected aspects of performance cognition under physical and cognitive load, including arousal regulation, attention, cognitive control and working memory. Feasibility trials in military training have demonstrated acceptability and promising training trends. Its causal effectiveness, operational transfer, readiness validity, scalability and enduring delivery model have not yet been established. Its status and appropriate future role will be confirmed through the Phase 2 assessment.</w:t>
+      </w:r>
+    </w:p>
+    <w:p>
+      <w:pPr>
+        <w:pStyle w:val="Heading2"/>
+        <w:rPr/>
+      </w:pPr>
+      <w:r>
+        <w:rPr>
+          <w:rFonts w:cs="Arial"/>
+          <w:b/>
+          <w:i w:val="false"/>
+          <w:color w:val="000000"/>
+          <w:sz w:val="22"/>
+        </w:rPr>
+        <w:t>Outside ACS</w:t>
+      </w:r>
+    </w:p>
+    <w:p>
+      <w:pPr>
+        <w:pStyle w:val="Normal"/>
+        <w:rPr/>
+      </w:pPr>
+      <w:r>
+        <w:rPr>
+          <w:rFonts w:cs="Arial"/>
+          <w:b/>
+          <w:i w:val="false"/>
+          <w:color w:val="002516"/>
+          <w:sz w:val="20"/>
+        </w:rPr>
+        <w:t>Army Psychology Services (APS), ILD and other stakeholders</w:t>
+      </w:r>
+    </w:p>
+    <w:p>
+      <w:pPr>
+        <w:pStyle w:val="Normal"/>
+        <w:rPr/>
+      </w:pPr>
+      <w:r>
+        <w:rPr>
+          <w:rFonts w:cs="Arial"/>
+          <w:b w:val="false"/>
+          <w:i w:val="false"/>
+        </w:rPr>
+        <w:t>These organisations hold additional professional expertise, learning products, delivery capability and assurance functions that will be confirmed during the Phase 2 assessment.</w:t>
+      </w:r>
+    </w:p>
+    <w:p>
+      <w:pPr>
+        <w:pStyle w:val="Normal"/>
+        <w:rPr/>
+      </w:pPr>
+      <w:r>
+        <w:rPr>
+          <w:rFonts w:cs="Arial"/>
+          <w:b w:val="false"/>
+          <w:i w:val="false"/>
+        </w:rPr>
+        <w:t>Initial review indicates considerable conceptual alignment across existing products. The Combat Mindset Framework will establish a common doctrinal language beneath which individual products and methods can be nested. It will not require identical internal methodologies, provided products align to the endorsed framework, outcomes and assurance requirements.</w:t>
+      </w:r>
+    </w:p>
+    <w:p>
+      <w:pPr>
+        <w:pStyle w:val="Normal"/>
+        <w:rPr/>
+      </w:pPr>
+      <w:r>
+        <w:rPr>
+          <w:rFonts w:cs="Arial"/>
+          <w:b w:val="false"/>
+          <w:i w:val="false"/>
+        </w:rPr>
+        <w:t>A full assessment of existing capability and products will be completed during Phase 2. The products described above contribute to Performance Under Pressure and, where applied in a warfighting context, to Combat Mindset; none constitutes the framework in isolation.</w:t>
+      </w:r>
+    </w:p>
+    <w:p>
+      <w:pPr>
+        <w:pStyle w:val="Normal"/>
+        <w:pBdr>
+          <w:bottom w:val="single" w:sz="6" w:space="1" w:color="A89662"/>
+        </w:pBdr>
+        <w:spacing w:before="200" w:after="200"/>
+        <w:rPr/>
+      </w:pPr>
+      <w:r>
+        <w:rPr/>
+      </w:r>
+    </w:p>
+    <w:p>
+      <w:pPr>
+        <w:pStyle w:val="Heading1"/>
+        <w:pBdr>
+          <w:left w:val="single" w:sz="24" w:space="8" w:color="C62026"/>
+        </w:pBdr>
+        <w:rPr/>
+      </w:pPr>
+      <w:bookmarkStart w:id="5" w:name="__RefHeading___Toc224_35239450"/>
+      <w:bookmarkEnd w:id="5"/>
+      <w:r>
+        <w:rPr>
+          <w:rFonts w:cs="Arial"/>
+          <w:b/>
+          <w:i w:val="false"/>
+          <w:color w:val="002516"/>
+          <w:sz w:val="28"/>
+        </w:rPr>
+        <w:t>4. Programme of work</w:t>
+      </w:r>
+    </w:p>
+    <w:p>
+      <w:pPr>
+        <w:pStyle w:val="Normal"/>
+        <w:rPr/>
+      </w:pPr>
+      <w:r>
+        <w:rPr>
+          <w:rFonts w:cs="Arial"/>
+          <w:b w:val="false"/>
+          <w:i w:val="false"/>
+        </w:rPr>
+        <w:t>August 2026 is set aside for this paper to be socialised through the chain of command, and the programme is therefore proposed to commence in September 2026. The timeframes below are aspirational and depend to varying extents on external stakeholder availability and input. As such, activity extending into early 2027 is anticipated rather than unforeseen.</w:t>
+      </w:r>
+    </w:p>
+    <w:p>
+      <w:pPr>
+        <w:pStyle w:val="Normal"/>
+        <w:rPr/>
+      </w:pPr>
+      <w:r>
+        <w:rPr>
+          <w:rFonts w:cs="Arial"/>
+          <w:b w:val="false"/>
+          <w:i w:val="false"/>
+        </w:rPr>
+        <w:t>Phases may overlap where practical, however subsequent design decisions remain dependent upon the endorsed outputs of preceding phases.</w:t>
+      </w:r>
+    </w:p>
+    <w:p>
+      <w:pPr>
+        <w:pStyle w:val="Heading2"/>
+        <w:rPr/>
+      </w:pPr>
+      <w:r>
+        <w:rPr>
+          <w:rFonts w:cs="Arial"/>
+          <w:b/>
+          <w:i w:val="false"/>
+          <w:color w:val="000000"/>
+          <w:sz w:val="22"/>
+        </w:rPr>
+        <w:t>Phase 1: Define (September 2026)</w:t>
+      </w:r>
+    </w:p>
+    <w:p>
+      <w:pPr>
+        <w:pStyle w:val="Normal"/>
+        <w:rPr/>
+      </w:pPr>
+      <w:r>
+        <w:rPr>
+          <w:rFonts w:cs="Arial"/>
+          <w:b w:val="false"/>
+          <w:i w:val="false"/>
+        </w:rPr>
+        <w:t>Confirm terminology, governance, roles and responsibilities. Select the terminology option at paragraph 2 and draft the endorsed definitions and their relationship for staffing. Confirm interim sponsorship, programme leadership, phase leads, stakeholder representation and decision authorities, while identifying the enduring capability ownership, technical-authority and assurance arrangements to be resolved through the programme.</w:t>
+      </w:r>
+    </w:p>
+    <w:p>
+      <w:pPr>
+        <w:pStyle w:val="Normal"/>
+        <w:rPr/>
+      </w:pPr>
+      <w:r>
+        <w:rPr>
+          <w:rFonts w:cs="Arial"/>
+          <w:b/>
+          <w:i w:val="false"/>
+        </w:rPr>
+        <w:t>Key output.</w:t>
+      </w:r>
+      <w:r>
+        <w:rPr>
+          <w:rFonts w:cs="Arial"/>
+          <w:b w:val="false"/>
+          <w:i w:val="false"/>
+        </w:rPr>
+        <w:t xml:space="preserve"> Endorsed drafting baseline and confirmed interim governance.</w:t>
+      </w:r>
+    </w:p>
+    <w:p>
+      <w:pPr>
+        <w:pStyle w:val="Heading2"/>
+        <w:rPr/>
+      </w:pPr>
+      <w:r>
+        <w:rPr>
+          <w:rFonts w:cs="Arial"/>
+          <w:b/>
+          <w:i w:val="false"/>
+          <w:color w:val="000000"/>
+          <w:sz w:val="22"/>
+        </w:rPr>
+        <w:t>Phase 2: Understand (September 2026)</w:t>
+      </w:r>
+    </w:p>
+    <w:p>
+      <w:pPr>
+        <w:pStyle w:val="Normal"/>
+        <w:rPr/>
+      </w:pPr>
+      <w:r>
+        <w:rPr>
+          <w:rFonts w:cs="Arial"/>
+          <w:b w:val="false"/>
+          <w:i w:val="false"/>
+        </w:rPr>
+        <w:t>Assess existing doctrine, products and delivery across ACS, NZALC, HPC, APS, ILD, training establishments and selected units against:</w:t>
       </w:r>
     </w:p>
     <w:p>
@@ -1747,7 +1775,7 @@
           <w:b w:val="false"/>
           <w:i w:val="false"/>
         </w:rPr>
-        <w:t>delivery organisations;</w:t>
+        <w:t>doctrinal and policy holdings;</w:t>
       </w:r>
     </w:p>
     <w:p>
@@ -1783,7 +1811,7 @@
           <w:b w:val="false"/>
           <w:i w:val="false"/>
         </w:rPr>
-        <w:t>evidence maturity, scalability and resource requirements; and</w:t>
+        <w:t>capability outcomes, training products and methods;</w:t>
       </w:r>
     </w:p>
     <w:p>
@@ -1819,6 +1847,78 @@
           <w:b w:val="false"/>
           <w:i w:val="false"/>
         </w:rPr>
+        <w:t>delivery organisations;</w:t>
+      </w:r>
+    </w:p>
+    <w:p>
+      <w:pPr>
+        <w:pStyle w:val="Normal"/>
+        <w:tabs>
+          <w:tab w:val="clear" w:pos="720"/>
+          <w:tab w:val="left" w:pos="425" w:leader="none"/>
+        </w:tabs>
+        <w:spacing w:before="0" w:after="60"/>
+        <w:ind w:hanging="255" w:left="425"/>
+        <w:rPr/>
+      </w:pPr>
+      <w:r>
+        <w:rPr>
+          <w:rFonts w:cs="Arial"/>
+          <w:b/>
+          <w:color w:val="C62026"/>
+        </w:rPr>
+        <w:t>•</w:t>
+      </w:r>
+      <w:r>
+        <w:rPr>
+          <w:rFonts w:cs="Arial"/>
+          <w:b/>
+          <w:color w:val="C62026"/>
+        </w:rPr>
+        <w:tab/>
+      </w:r>
+      <w:r>
+        <w:rPr>
+          <w:rFonts w:cs="Arial"/>
+          <w:b w:val="false"/>
+          <w:i w:val="false"/>
+        </w:rPr>
+        <w:t>evidence maturity, scalability and resource requirements; and</w:t>
+      </w:r>
+    </w:p>
+    <w:p>
+      <w:pPr>
+        <w:pStyle w:val="Normal"/>
+        <w:tabs>
+          <w:tab w:val="clear" w:pos="720"/>
+          <w:tab w:val="left" w:pos="425" w:leader="none"/>
+        </w:tabs>
+        <w:spacing w:before="0" w:after="60"/>
+        <w:ind w:hanging="255" w:left="425"/>
+        <w:rPr/>
+      </w:pPr>
+      <w:r>
+        <w:rPr>
+          <w:rFonts w:cs="Arial"/>
+          <w:b/>
+          <w:color w:val="C62026"/>
+        </w:rPr>
+        <w:t>•</w:t>
+      </w:r>
+      <w:r>
+        <w:rPr>
+          <w:rFonts w:cs="Arial"/>
+          <w:b/>
+          <w:color w:val="C62026"/>
+        </w:rPr>
+        <w:tab/>
+      </w:r>
+      <w:r>
+        <w:rPr>
+          <w:rFonts w:cs="Arial"/>
+          <w:b w:val="false"/>
+          <w:i w:val="false"/>
+        </w:rPr>
         <w:t>gaps, duplication and integration opportunities.</w:t>
       </w:r>
     </w:p>
@@ -2063,7 +2163,7 @@
         </w:pBdr>
         <w:rPr/>
       </w:pPr>
-      <w:bookmarkStart w:id="6" w:name="__RefHeading___Toc218_2407265486"/>
+      <w:bookmarkStart w:id="6" w:name="__RefHeading___Toc226_35239450"/>
       <w:bookmarkEnd w:id="6"/>
       <w:r>
         <w:rPr>

</xml_diff>

<commit_message>
Trim section 3 close and simplify the phase overlap sentence
Remove the identical internal methodologies caveat from section 3, and
reduce the phase dependency sentence to a single plain statement.

Co-Authored-By: Claude Fable 5 <noreply@anthropic.com>
Claude-Session: https://claude.ai/code/session_01YLo1WfwUDkbwfJEF3ZNVbB
</commit_message>
<xml_diff>
--- a/output/combat-mindset-way-forward.docx
+++ b/output/combat-mindset-way-forward.docx
@@ -298,7 +298,7 @@
             </w:rPr>
             <w:fldChar w:fldCharType="separate"/>
           </w:r>
-          <w:hyperlink w:anchor="__RefHeading___Toc214_35239450">
+          <w:hyperlink w:anchor="__RefHeading___Toc214_1027417978">
             <w:r>
               <w:rPr>
                 <w:webHidden/>
@@ -325,7 +325,7 @@
             </w:tabs>
             <w:rPr/>
           </w:pPr>
-          <w:hyperlink w:anchor="__RefHeading___Toc216_35239450">
+          <w:hyperlink w:anchor="__RefHeading___Toc216_1027417978">
             <w:r>
               <w:rPr>
                 <w:webHidden/>
@@ -352,7 +352,7 @@
             </w:tabs>
             <w:rPr/>
           </w:pPr>
-          <w:hyperlink w:anchor="__RefHeading___Toc218_35239450">
+          <w:hyperlink w:anchor="__RefHeading___Toc218_1027417978">
             <w:r>
               <w:rPr>
                 <w:webHidden/>
@@ -379,7 +379,7 @@
             </w:tabs>
             <w:rPr/>
           </w:pPr>
-          <w:hyperlink w:anchor="__RefHeading___Toc220_35239450">
+          <w:hyperlink w:anchor="__RefHeading___Toc220_1027417978">
             <w:r>
               <w:rPr>
                 <w:webHidden/>
@@ -406,7 +406,7 @@
             </w:tabs>
             <w:rPr/>
           </w:pPr>
-          <w:hyperlink w:anchor="__RefHeading___Toc222_35239450">
+          <w:hyperlink w:anchor="__RefHeading___Toc222_1027417978">
             <w:r>
               <w:rPr>
                 <w:webHidden/>
@@ -433,7 +433,7 @@
             </w:tabs>
             <w:rPr/>
           </w:pPr>
-          <w:hyperlink w:anchor="__RefHeading___Toc224_35239450">
+          <w:hyperlink w:anchor="__RefHeading___Toc224_1027417978">
             <w:r>
               <w:rPr>
                 <w:webHidden/>
@@ -460,7 +460,7 @@
             </w:tabs>
             <w:rPr/>
           </w:pPr>
-          <w:hyperlink w:anchor="__RefHeading___Toc226_35239450">
+          <w:hyperlink w:anchor="__RefHeading___Toc226_1027417978">
             <w:r>
               <w:rPr>
                 <w:webHidden/>
@@ -515,7 +515,7 @@
         <w:spacing w:before="0" w:after="160"/>
         <w:rPr/>
       </w:pPr>
-      <w:bookmarkStart w:id="0" w:name="__RefHeading___Toc214_35239450"/>
+      <w:bookmarkStart w:id="0" w:name="__RefHeading___Toc214_1027417978"/>
       <w:bookmarkEnd w:id="0"/>
       <w:r>
         <w:rPr>
@@ -597,7 +597,7 @@
         </w:pBdr>
         <w:rPr/>
       </w:pPr>
-      <w:bookmarkStart w:id="1" w:name="__RefHeading___Toc216_35239450"/>
+      <w:bookmarkStart w:id="1" w:name="__RefHeading___Toc216_1027417978"/>
       <w:bookmarkEnd w:id="1"/>
       <w:r>
         <w:rPr>
@@ -673,7 +673,7 @@
         </w:pBdr>
         <w:rPr/>
       </w:pPr>
-      <w:bookmarkStart w:id="2" w:name="__RefHeading___Toc218_35239450"/>
+      <w:bookmarkStart w:id="2" w:name="__RefHeading___Toc218_1027417978"/>
       <w:bookmarkEnd w:id="2"/>
       <w:r>
         <w:rPr>
@@ -781,7 +781,7 @@
         </w:pBdr>
         <w:rPr/>
       </w:pPr>
-      <w:bookmarkStart w:id="3" w:name="__RefHeading___Toc220_35239450"/>
+      <w:bookmarkStart w:id="3" w:name="__RefHeading___Toc220_1027417978"/>
       <w:bookmarkEnd w:id="3"/>
       <w:r>
         <w:rPr>
@@ -1435,7 +1435,7 @@
         </w:pBdr>
         <w:rPr/>
       </w:pPr>
-      <w:bookmarkStart w:id="4" w:name="__RefHeading___Toc222_35239450"/>
+      <w:bookmarkStart w:id="4" w:name="__RefHeading___Toc222_1027417978"/>
       <w:bookmarkEnd w:id="4"/>
       <w:r>
         <w:rPr>
@@ -1581,7 +1581,7 @@
           <w:b w:val="false"/>
           <w:i w:val="false"/>
         </w:rPr>
-        <w:t>Initial review indicates considerable conceptual alignment across existing products. The Combat Mindset Framework will establish a common doctrinal language beneath which individual products and methods can be nested. It will not require identical internal methodologies, provided products align to the endorsed framework, outcomes and assurance requirements.</w:t>
+        <w:t>Initial review indicates considerable conceptual alignment across existing products. The Combat Mindset Framework will establish a common doctrinal language beneath which individual products and methods can be nested.</w:t>
       </w:r>
     </w:p>
     <w:p>
@@ -1619,7 +1619,7 @@
         </w:pBdr>
         <w:rPr/>
       </w:pPr>
-      <w:bookmarkStart w:id="5" w:name="__RefHeading___Toc224_35239450"/>
+      <w:bookmarkStart w:id="5" w:name="__RefHeading___Toc224_1027417978"/>
       <w:bookmarkEnd w:id="5"/>
       <w:r>
         <w:rPr>
@@ -1657,7 +1657,7 @@
           <w:b w:val="false"/>
           <w:i w:val="false"/>
         </w:rPr>
-        <w:t>Phases may overlap where practical, however subsequent design decisions remain dependent upon the endorsed outputs of preceding phases.</w:t>
+        <w:t>Phases may overlap, but each phase depends on the endorsed outputs of the one before it.</w:t>
       </w:r>
     </w:p>
     <w:p>
@@ -2163,7 +2163,7 @@
         </w:pBdr>
         <w:rPr/>
       </w:pPr>
-      <w:bookmarkStart w:id="6" w:name="__RefHeading___Toc226_35239450"/>
+      <w:bookmarkStart w:id="6" w:name="__RefHeading___Toc226_1027417978"/>
       <w:bookmarkEnd w:id="6"/>
       <w:r>
         <w:rPr>

</xml_diff>

<commit_message>
Tighten phases 1 and 2
Remove the terminology staffing sentence from Phase 1, correct the
combat-specificity test cross reference to section 2, reduce the COGCON
sentence from five considerations to three, and replace holdings with
plain wording in the Phase 2 key output.

Co-Authored-By: Claude Fable 5 <noreply@anthropic.com>
Claude-Session: https://claude.ai/code/session_01YLo1WfwUDkbwfJEF3ZNVbB
</commit_message>
<xml_diff>
--- a/output/combat-mindset-way-forward.docx
+++ b/output/combat-mindset-way-forward.docx
@@ -298,7 +298,7 @@
             </w:rPr>
             <w:fldChar w:fldCharType="separate"/>
           </w:r>
-          <w:hyperlink w:anchor="__RefHeading___Toc214_1027417978">
+          <w:hyperlink w:anchor="__RefHeading___Toc214_2939245216">
             <w:r>
               <w:rPr>
                 <w:webHidden/>
@@ -325,7 +325,7 @@
             </w:tabs>
             <w:rPr/>
           </w:pPr>
-          <w:hyperlink w:anchor="__RefHeading___Toc216_1027417978">
+          <w:hyperlink w:anchor="__RefHeading___Toc216_2939245216">
             <w:r>
               <w:rPr>
                 <w:webHidden/>
@@ -352,7 +352,7 @@
             </w:tabs>
             <w:rPr/>
           </w:pPr>
-          <w:hyperlink w:anchor="__RefHeading___Toc218_1027417978">
+          <w:hyperlink w:anchor="__RefHeading___Toc218_2939245216">
             <w:r>
               <w:rPr>
                 <w:webHidden/>
@@ -379,7 +379,7 @@
             </w:tabs>
             <w:rPr/>
           </w:pPr>
-          <w:hyperlink w:anchor="__RefHeading___Toc220_1027417978">
+          <w:hyperlink w:anchor="__RefHeading___Toc220_2939245216">
             <w:r>
               <w:rPr>
                 <w:webHidden/>
@@ -406,7 +406,7 @@
             </w:tabs>
             <w:rPr/>
           </w:pPr>
-          <w:hyperlink w:anchor="__RefHeading___Toc222_1027417978">
+          <w:hyperlink w:anchor="__RefHeading___Toc222_2939245216">
             <w:r>
               <w:rPr>
                 <w:webHidden/>
@@ -433,7 +433,7 @@
             </w:tabs>
             <w:rPr/>
           </w:pPr>
-          <w:hyperlink w:anchor="__RefHeading___Toc224_1027417978">
+          <w:hyperlink w:anchor="__RefHeading___Toc224_2939245216">
             <w:r>
               <w:rPr>
                 <w:webHidden/>
@@ -460,7 +460,7 @@
             </w:tabs>
             <w:rPr/>
           </w:pPr>
-          <w:hyperlink w:anchor="__RefHeading___Toc226_1027417978">
+          <w:hyperlink w:anchor="__RefHeading___Toc226_2939245216">
             <w:r>
               <w:rPr>
                 <w:webHidden/>
@@ -515,7 +515,7 @@
         <w:spacing w:before="0" w:after="160"/>
         <w:rPr/>
       </w:pPr>
-      <w:bookmarkStart w:id="0" w:name="__RefHeading___Toc214_1027417978"/>
+      <w:bookmarkStart w:id="0" w:name="__RefHeading___Toc214_2939245216"/>
       <w:bookmarkEnd w:id="0"/>
       <w:r>
         <w:rPr>
@@ -597,7 +597,7 @@
         </w:pBdr>
         <w:rPr/>
       </w:pPr>
-      <w:bookmarkStart w:id="1" w:name="__RefHeading___Toc216_1027417978"/>
+      <w:bookmarkStart w:id="1" w:name="__RefHeading___Toc216_2939245216"/>
       <w:bookmarkEnd w:id="1"/>
       <w:r>
         <w:rPr>
@@ -673,7 +673,7 @@
         </w:pBdr>
         <w:rPr/>
       </w:pPr>
-      <w:bookmarkStart w:id="2" w:name="__RefHeading___Toc218_1027417978"/>
+      <w:bookmarkStart w:id="2" w:name="__RefHeading___Toc218_2939245216"/>
       <w:bookmarkEnd w:id="2"/>
       <w:r>
         <w:rPr>
@@ -781,7 +781,7 @@
         </w:pBdr>
         <w:rPr/>
       </w:pPr>
-      <w:bookmarkStart w:id="3" w:name="__RefHeading___Toc220_1027417978"/>
+      <w:bookmarkStart w:id="3" w:name="__RefHeading___Toc220_2939245216"/>
       <w:bookmarkEnd w:id="3"/>
       <w:r>
         <w:rPr>
@@ -1435,7 +1435,7 @@
         </w:pBdr>
         <w:rPr/>
       </w:pPr>
-      <w:bookmarkStart w:id="4" w:name="__RefHeading___Toc222_1027417978"/>
+      <w:bookmarkStart w:id="4" w:name="__RefHeading___Toc222_2939245216"/>
       <w:bookmarkEnd w:id="4"/>
       <w:r>
         <w:rPr>
@@ -1619,7 +1619,7 @@
         </w:pBdr>
         <w:rPr/>
       </w:pPr>
-      <w:bookmarkStart w:id="5" w:name="__RefHeading___Toc224_1027417978"/>
+      <w:bookmarkStart w:id="5" w:name="__RefHeading___Toc224_2939245216"/>
       <w:bookmarkEnd w:id="5"/>
       <w:r>
         <w:rPr>
@@ -1687,7 +1687,7 @@
           <w:b w:val="false"/>
           <w:i w:val="false"/>
         </w:rPr>
-        <w:t>Confirm terminology, governance, roles and responsibilities. Select the terminology option at paragraph 2 and draft the endorsed definitions and their relationship for staffing. Confirm interim sponsorship, programme leadership, phase leads, stakeholder representation and decision authorities, while identifying the enduring capability ownership, technical-authority and assurance arrangements to be resolved through the programme.</w:t>
+        <w:t>Confirm terminology, governance, roles and responsibilities. Establish interim sponsorship, programme leadership, phase leads, stakeholder representation and decision authorities, while identifying the enduring capability ownership, technical-authority and assurance arrangements to be resolved through the programme.</w:t>
       </w:r>
     </w:p>
     <w:p>
@@ -1933,7 +1933,7 @@
           <w:b w:val="false"/>
           <w:i w:val="false"/>
         </w:rPr>
-        <w:t>Apply the combat-specificity test at paragraph 2 to distinguish products that contribute to the broader Performance Under Pressure capability from those that support its combat-specific expression. Assess COGCON as one developmental product, with particular attention to its product boundary, evidence base, ownership, workforce requirements and scalability.</w:t>
+        <w:t>Apply the combat-specificity test in section 2 to distinguish products that contribute to the broader Performance Under Pressure capability from those that support its combat-specific expression. Assess COGCON as one developmental product, establishing what it delivers, who owns it and whether it can be scaled.</w:t>
       </w:r>
     </w:p>
     <w:p>
@@ -1955,7 +1955,7 @@
           <w:b w:val="false"/>
           <w:i w:val="false"/>
         </w:rPr>
-        <w:t xml:space="preserve"> A capability and product baseline identifying holdings, gaps, duplication and integration opportunities.</w:t>
+        <w:t xml:space="preserve"> A capability and product baseline identifying what already exists, gaps, duplication and integration opportunities.</w:t>
       </w:r>
     </w:p>
     <w:p>
@@ -2163,7 +2163,7 @@
         </w:pBdr>
         <w:rPr/>
       </w:pPr>
-      <w:bookmarkStart w:id="6" w:name="__RefHeading___Toc226_1027417978"/>
+      <w:bookmarkStart w:id="6" w:name="__RefHeading___Toc226_2939245216"/>
       <w:bookmarkEnd w:id="6"/>
       <w:r>
         <w:rPr>

</xml_diff>

<commit_message>
Simplify phases 3 and 4
Phase 3 now reads transfer to performance and organisational adoption.
Phase 4 replaces the six item test list with a single plain statement of
what validation is for.

Co-Authored-By: Claude Fable 5 <noreply@anthropic.com>
Claude-Session: https://claude.ai/code/session_01YLo1WfwUDkbwfJEF3ZNVbB
</commit_message>
<xml_diff>
--- a/output/combat-mindset-way-forward.docx
+++ b/output/combat-mindset-way-forward.docx
@@ -298,7 +298,7 @@
             </w:rPr>
             <w:fldChar w:fldCharType="separate"/>
           </w:r>
-          <w:hyperlink w:anchor="__RefHeading___Toc214_2939245216">
+          <w:hyperlink w:anchor="__RefHeading___Toc214_2591497081">
             <w:r>
               <w:rPr>
                 <w:webHidden/>
@@ -325,7 +325,7 @@
             </w:tabs>
             <w:rPr/>
           </w:pPr>
-          <w:hyperlink w:anchor="__RefHeading___Toc216_2939245216">
+          <w:hyperlink w:anchor="__RefHeading___Toc216_2591497081">
             <w:r>
               <w:rPr>
                 <w:webHidden/>
@@ -352,7 +352,7 @@
             </w:tabs>
             <w:rPr/>
           </w:pPr>
-          <w:hyperlink w:anchor="__RefHeading___Toc218_2939245216">
+          <w:hyperlink w:anchor="__RefHeading___Toc218_2591497081">
             <w:r>
               <w:rPr>
                 <w:webHidden/>
@@ -379,7 +379,7 @@
             </w:tabs>
             <w:rPr/>
           </w:pPr>
-          <w:hyperlink w:anchor="__RefHeading___Toc220_2939245216">
+          <w:hyperlink w:anchor="__RefHeading___Toc220_2591497081">
             <w:r>
               <w:rPr>
                 <w:webHidden/>
@@ -406,7 +406,7 @@
             </w:tabs>
             <w:rPr/>
           </w:pPr>
-          <w:hyperlink w:anchor="__RefHeading___Toc222_2939245216">
+          <w:hyperlink w:anchor="__RefHeading___Toc222_2591497081">
             <w:r>
               <w:rPr>
                 <w:webHidden/>
@@ -433,7 +433,7 @@
             </w:tabs>
             <w:rPr/>
           </w:pPr>
-          <w:hyperlink w:anchor="__RefHeading___Toc224_2939245216">
+          <w:hyperlink w:anchor="__RefHeading___Toc224_2591497081">
             <w:r>
               <w:rPr>
                 <w:webHidden/>
@@ -460,7 +460,7 @@
             </w:tabs>
             <w:rPr/>
           </w:pPr>
-          <w:hyperlink w:anchor="__RefHeading___Toc226_2939245216">
+          <w:hyperlink w:anchor="__RefHeading___Toc226_2591497081">
             <w:r>
               <w:rPr>
                 <w:webHidden/>
@@ -515,7 +515,7 @@
         <w:spacing w:before="0" w:after="160"/>
         <w:rPr/>
       </w:pPr>
-      <w:bookmarkStart w:id="0" w:name="__RefHeading___Toc214_2939245216"/>
+      <w:bookmarkStart w:id="0" w:name="__RefHeading___Toc214_2591497081"/>
       <w:bookmarkEnd w:id="0"/>
       <w:r>
         <w:rPr>
@@ -597,7 +597,7 @@
         </w:pBdr>
         <w:rPr/>
       </w:pPr>
-      <w:bookmarkStart w:id="1" w:name="__RefHeading___Toc216_2939245216"/>
+      <w:bookmarkStart w:id="1" w:name="__RefHeading___Toc216_2591497081"/>
       <w:bookmarkEnd w:id="1"/>
       <w:r>
         <w:rPr>
@@ -673,7 +673,7 @@
         </w:pBdr>
         <w:rPr/>
       </w:pPr>
-      <w:bookmarkStart w:id="2" w:name="__RefHeading___Toc218_2939245216"/>
+      <w:bookmarkStart w:id="2" w:name="__RefHeading___Toc218_2591497081"/>
       <w:bookmarkEnd w:id="2"/>
       <w:r>
         <w:rPr>
@@ -781,7 +781,7 @@
         </w:pBdr>
         <w:rPr/>
       </w:pPr>
-      <w:bookmarkStart w:id="3" w:name="__RefHeading___Toc220_2939245216"/>
+      <w:bookmarkStart w:id="3" w:name="__RefHeading___Toc220_2591497081"/>
       <w:bookmarkEnd w:id="3"/>
       <w:r>
         <w:rPr>
@@ -1435,7 +1435,7 @@
         </w:pBdr>
         <w:rPr/>
       </w:pPr>
-      <w:bookmarkStart w:id="4" w:name="__RefHeading___Toc222_2939245216"/>
+      <w:bookmarkStart w:id="4" w:name="__RefHeading___Toc222_2591497081"/>
       <w:bookmarkEnd w:id="4"/>
       <w:r>
         <w:rPr>
@@ -1619,7 +1619,7 @@
         </w:pBdr>
         <w:rPr/>
       </w:pPr>
-      <w:bookmarkStart w:id="5" w:name="__RefHeading___Toc224_2939245216"/>
+      <w:bookmarkStart w:id="5" w:name="__RefHeading___Toc224_2591497081"/>
       <w:bookmarkEnd w:id="5"/>
       <w:r>
         <w:rPr>
@@ -1999,7 +1999,7 @@
           <w:b w:val="false"/>
           <w:i w:val="false"/>
         </w:rPr>
-        <w:t>Existing products, including the NZALC Leadership Development System and COGCON, will be mapped against the endorsed outcomes and framework requirements rather than treated as the framework itself. The design will also identify how progression, transfer to operationally relevant performance, product quality and institutional adoption will be assessed.</w:t>
+        <w:t>Existing products, including the NZALC Leadership Development System and COGCON, will be mapped against the endorsed outcomes and framework requirements rather than treated as the framework itself. The design will also identify how progression, transfer to performance, product quality and organisational adoption will be assessed.</w:t>
       </w:r>
     </w:p>
     <w:p>
@@ -2051,7 +2051,7 @@
           <w:b w:val="false"/>
           <w:i w:val="false"/>
         </w:rPr>
-        <w:t>Refine the framework with key stakeholders: convene ACS, NZALC, HPC, APS, ILD, selected training providers and units to test the framework, product architecture, governance model, implementation priorities, definition clarity and doctrinal coherence. Where time and unit availability permit, bounded validation activities or pilots will be conducted within this phase or earlier alongside Phase 2 or Phase 3.</w:t>
+        <w:t>Refine the framework with key stakeholders: convene ACS, NZALC, HPC, APS, ILD, selected training providers and units to test whether the framework is clear, coherent and workable. Where time and unit availability permit, bounded validation activities or pilots will be conducted within this phase or earlier alongside Phase 2 or Phase 3.</w:t>
       </w:r>
     </w:p>
     <w:p>
@@ -2163,7 +2163,7 @@
         </w:pBdr>
         <w:rPr/>
       </w:pPr>
-      <w:bookmarkStart w:id="6" w:name="__RefHeading___Toc226_2939245216"/>
+      <w:bookmarkStart w:id="6" w:name="__RefHeading___Toc226_2591497081"/>
       <w:bookmarkEnd w:id="6"/>
       <w:r>
         <w:rPr>

</xml_diff>

<commit_message>
Remove the soldier usage limitation from Option 1
The claim that the two-term hierarchy runs against common soldier usage
is not accurate, leaving the definitional burden as the single
limitation.

Co-Authored-By: Claude Fable 5 <noreply@anthropic.com>
Claude-Session: https://claude.ai/code/session_01YLo1WfwUDkbwfJEF3ZNVbB
</commit_message>
<xml_diff>
--- a/output/combat-mindset-way-forward.docx
+++ b/output/combat-mindset-way-forward.docx
@@ -298,7 +298,7 @@
             </w:rPr>
             <w:fldChar w:fldCharType="separate"/>
           </w:r>
-          <w:hyperlink w:anchor="__RefHeading___Toc214_712034351">
+          <w:hyperlink w:anchor="__RefHeading___Toc211_2605921147">
             <w:r>
               <w:rPr>
                 <w:webHidden/>
@@ -325,7 +325,7 @@
             </w:tabs>
             <w:rPr/>
           </w:pPr>
-          <w:hyperlink w:anchor="__RefHeading___Toc216_712034351">
+          <w:hyperlink w:anchor="__RefHeading___Toc213_2605921147">
             <w:r>
               <w:rPr>
                 <w:webHidden/>
@@ -352,7 +352,7 @@
             </w:tabs>
             <w:rPr/>
           </w:pPr>
-          <w:hyperlink w:anchor="__RefHeading___Toc218_712034351">
+          <w:hyperlink w:anchor="__RefHeading___Toc215_2605921147">
             <w:r>
               <w:rPr>
                 <w:webHidden/>
@@ -379,7 +379,7 @@
             </w:tabs>
             <w:rPr/>
           </w:pPr>
-          <w:hyperlink w:anchor="__RefHeading___Toc220_712034351">
+          <w:hyperlink w:anchor="__RefHeading___Toc217_2605921147">
             <w:r>
               <w:rPr>
                 <w:webHidden/>
@@ -406,7 +406,7 @@
             </w:tabs>
             <w:rPr/>
           </w:pPr>
-          <w:hyperlink w:anchor="__RefHeading___Toc222_712034351">
+          <w:hyperlink w:anchor="__RefHeading___Toc219_2605921147">
             <w:r>
               <w:rPr>
                 <w:webHidden/>
@@ -433,7 +433,7 @@
             </w:tabs>
             <w:rPr/>
           </w:pPr>
-          <w:hyperlink w:anchor="__RefHeading___Toc224_712034351">
+          <w:hyperlink w:anchor="__RefHeading___Toc221_2605921147">
             <w:r>
               <w:rPr>
                 <w:webHidden/>
@@ -460,7 +460,7 @@
             </w:tabs>
             <w:rPr/>
           </w:pPr>
-          <w:hyperlink w:anchor="__RefHeading___Toc226_712034351">
+          <w:hyperlink w:anchor="__RefHeading___Toc223_2605921147">
             <w:r>
               <w:rPr>
                 <w:webHidden/>
@@ -515,7 +515,7 @@
         <w:spacing w:before="0" w:after="160"/>
         <w:rPr/>
       </w:pPr>
-      <w:bookmarkStart w:id="0" w:name="__RefHeading___Toc214_712034351"/>
+      <w:bookmarkStart w:id="0" w:name="__RefHeading___Toc211_2605921147"/>
       <w:bookmarkEnd w:id="0"/>
       <w:r>
         <w:rPr>
@@ -597,7 +597,7 @@
         </w:pBdr>
         <w:rPr/>
       </w:pPr>
-      <w:bookmarkStart w:id="1" w:name="__RefHeading___Toc216_712034351"/>
+      <w:bookmarkStart w:id="1" w:name="__RefHeading___Toc213_2605921147"/>
       <w:bookmarkEnd w:id="1"/>
       <w:r>
         <w:rPr>
@@ -673,7 +673,7 @@
         </w:pBdr>
         <w:rPr/>
       </w:pPr>
-      <w:bookmarkStart w:id="2" w:name="__RefHeading___Toc218_712034351"/>
+      <w:bookmarkStart w:id="2" w:name="__RefHeading___Toc215_2605921147"/>
       <w:bookmarkEnd w:id="2"/>
       <w:r>
         <w:rPr>
@@ -781,7 +781,7 @@
         </w:pBdr>
         <w:rPr/>
       </w:pPr>
-      <w:bookmarkStart w:id="3" w:name="__RefHeading___Toc220_712034351"/>
+      <w:bookmarkStart w:id="3" w:name="__RefHeading___Toc217_2605921147"/>
       <w:bookmarkEnd w:id="3"/>
       <w:r>
         <w:rPr>
@@ -1128,6 +1128,50 @@
     </w:p>
     <w:p>
       <w:pPr>
+        <w:pStyle w:val="Heading2"/>
+        <w:rPr/>
+      </w:pPr>
+      <w:r>
+        <w:rPr>
+          <w:rFonts w:cs="Arial"/>
+          <w:b/>
+          <w:i w:val="false"/>
+          <w:color w:val="000000"/>
+          <w:sz w:val="22"/>
+        </w:rPr>
+        <w:t>Option 2: Combat Mindset as the complete umbrella capability</w:t>
+      </w:r>
+    </w:p>
+    <w:p>
+      <w:pPr>
+        <w:pStyle w:val="Normal"/>
+        <w:rPr/>
+      </w:pPr>
+      <w:r>
+        <w:rPr>
+          <w:rFonts w:cs="Arial"/>
+          <w:b w:val="false"/>
+          <w:i w:val="false"/>
+        </w:rPr>
+        <w:t>Combat Mindset is treated as the complete capability itself, integrating leadership, human performance, resilience, mental skills and performance cognition, with performance under pressure expressed within it.</w:t>
+      </w:r>
+    </w:p>
+    <w:p>
+      <w:pPr>
+        <w:pStyle w:val="Normal"/>
+        <w:rPr/>
+      </w:pPr>
+      <w:r>
+        <w:rPr>
+          <w:rFonts w:cs="Arial"/>
+          <w:b/>
+          <w:i w:val="false"/>
+        </w:rPr>
+        <w:t>Advantages</w:t>
+      </w:r>
+    </w:p>
+    <w:p>
+      <w:pPr>
         <w:pStyle w:val="Normal"/>
         <w:tabs>
           <w:tab w:val="clear" w:pos="720"/>
@@ -1159,51 +1203,7 @@
           <w:b w:val="false"/>
           <w:i w:val="false"/>
         </w:rPr>
-        <w:t>Runs against common soldier usage, in which Combat Mindset already serves as the umbrella term, so the hierarchy will need reinforcement to hold.</w:t>
-      </w:r>
-    </w:p>
-    <w:p>
-      <w:pPr>
-        <w:pStyle w:val="Heading2"/>
-        <w:rPr/>
-      </w:pPr>
-      <w:r>
-        <w:rPr>
-          <w:rFonts w:cs="Arial"/>
-          <w:b/>
-          <w:i w:val="false"/>
-          <w:color w:val="000000"/>
-          <w:sz w:val="22"/>
-        </w:rPr>
-        <w:t>Option 2: Combat Mindset as the complete umbrella capability</w:t>
-      </w:r>
-    </w:p>
-    <w:p>
-      <w:pPr>
-        <w:pStyle w:val="Normal"/>
-        <w:rPr/>
-      </w:pPr>
-      <w:r>
-        <w:rPr>
-          <w:rFonts w:cs="Arial"/>
-          <w:b w:val="false"/>
-          <w:i w:val="false"/>
-        </w:rPr>
-        <w:t>Combat Mindset is treated as the complete capability itself, integrating leadership, human performance, resilience, mental skills and performance cognition, with performance under pressure expressed within it.</w:t>
-      </w:r>
-    </w:p>
-    <w:p>
-      <w:pPr>
-        <w:pStyle w:val="Normal"/>
-        <w:rPr/>
-      </w:pPr>
-      <w:r>
-        <w:rPr>
-          <w:rFonts w:cs="Arial"/>
-          <w:b/>
-          <w:i w:val="false"/>
-        </w:rPr>
-        <w:t>Advantages</w:t>
+        <w:t>Maximises simplicity: one term serves as outcome, capability and framework alike.</w:t>
       </w:r>
     </w:p>
     <w:p>
@@ -1239,7 +1239,21 @@
           <w:b w:val="false"/>
           <w:i w:val="false"/>
         </w:rPr>
-        <w:t>Maximises simplicity: one term serves as outcome, capability and framework alike.</w:t>
+        <w:t>Matches common soldier usage, in which Combat Mindset already serves as the umbrella term, and avoids a two-term hierarchy that requires sustained explanation.</w:t>
+      </w:r>
+    </w:p>
+    <w:p>
+      <w:pPr>
+        <w:pStyle w:val="Normal"/>
+        <w:rPr/>
+      </w:pPr>
+      <w:r>
+        <w:rPr>
+          <w:rFonts w:cs="Arial"/>
+          <w:b/>
+          <w:i w:val="false"/>
+        </w:rPr>
+        <w:t>Limitations</w:t>
       </w:r>
     </w:p>
     <w:p>
@@ -1275,21 +1289,7 @@
           <w:b w:val="false"/>
           <w:i w:val="false"/>
         </w:rPr>
-        <w:t>Matches common soldier usage, in which Combat Mindset already serves as the umbrella term, and avoids a two-term hierarchy that requires sustained explanation.</w:t>
-      </w:r>
-    </w:p>
-    <w:p>
-      <w:pPr>
-        <w:pStyle w:val="Normal"/>
-        <w:rPr/>
-      </w:pPr>
-      <w:r>
-        <w:rPr>
-          <w:rFonts w:cs="Arial"/>
-          <w:b/>
-          <w:i w:val="false"/>
-        </w:rPr>
-        <w:t>Limitations</w:t>
+        <w:t>Conflates the combat-specific outcome with the broader human-performance capability, reducing applicability outside combat.</w:t>
       </w:r>
     </w:p>
     <w:p>
@@ -1325,7 +1325,7 @@
           <w:b w:val="false"/>
           <w:i w:val="false"/>
         </w:rPr>
-        <w:t>Conflates the combat-specific outcome with the broader human-performance capability, reducing applicability outside combat.</w:t>
+        <w:t>Makes it difficult to distinguish doctrine, capability, framework and product.</w:t>
       </w:r>
     </w:p>
     <w:p>
@@ -1361,7 +1361,349 @@
           <w:b w:val="false"/>
           <w:i w:val="false"/>
         </w:rPr>
-        <w:t>Makes it difficult to distinguish doctrine, capability, framework and product.</w:t>
+        <w:t>Increases the risk that Combat Mindset is interpreted as motivation or aggression alone.</w:t>
+      </w:r>
+    </w:p>
+    <w:p>
+      <w:pPr>
+        <w:pStyle w:val="Normal"/>
+        <w:rPr/>
+      </w:pPr>
+      <w:r>
+        <w:rPr>
+          <w:rFonts w:cs="Arial"/>
+          <w:b w:val="false"/>
+          <w:i w:val="false"/>
+        </w:rPr>
+        <w:t>Both options deliver the end state described in the COMDT ACS guidance. NZALC and HPC jointly recommend Option 1, and will implement whichever option COMDT ACS selects.</w:t>
+      </w:r>
+    </w:p>
+    <w:p>
+      <w:pPr>
+        <w:pStyle w:val="Normal"/>
+        <w:pBdr>
+          <w:bottom w:val="single" w:sz="6" w:space="1" w:color="A89662"/>
+        </w:pBdr>
+        <w:spacing w:before="200" w:after="200"/>
+        <w:rPr/>
+      </w:pPr>
+      <w:r>
+        <w:rPr/>
+      </w:r>
+    </w:p>
+    <w:p>
+      <w:pPr>
+        <w:pStyle w:val="Heading1"/>
+        <w:pBdr>
+          <w:left w:val="single" w:sz="24" w:space="8" w:color="C62026"/>
+        </w:pBdr>
+        <w:rPr/>
+      </w:pPr>
+      <w:bookmarkStart w:id="4" w:name="__RefHeading___Toc219_2605921147"/>
+      <w:bookmarkEnd w:id="4"/>
+      <w:r>
+        <w:rPr>
+          <w:rFonts w:cs="Arial"/>
+          <w:b/>
+          <w:i w:val="false"/>
+          <w:color w:val="002516"/>
+          <w:sz w:val="28"/>
+        </w:rPr>
+        <w:t>3. What already exists</w:t>
+      </w:r>
+    </w:p>
+    <w:p>
+      <w:pPr>
+        <w:pStyle w:val="Heading2"/>
+        <w:rPr/>
+      </w:pPr>
+      <w:r>
+        <w:rPr>
+          <w:rFonts w:cs="Arial"/>
+          <w:b/>
+          <w:i w:val="false"/>
+          <w:color w:val="000000"/>
+          <w:sz w:val="22"/>
+        </w:rPr>
+        <w:t>Within ACS</w:t>
+      </w:r>
+    </w:p>
+    <w:p>
+      <w:pPr>
+        <w:pStyle w:val="Normal"/>
+        <w:rPr/>
+      </w:pPr>
+      <w:r>
+        <w:rPr>
+          <w:rFonts w:cs="Arial"/>
+          <w:b/>
+          <w:i w:val="false"/>
+          <w:color w:val="002516"/>
+          <w:sz w:val="20"/>
+        </w:rPr>
+        <w:t>NZALC Leadership Development System</w:t>
+      </w:r>
+    </w:p>
+    <w:p>
+      <w:pPr>
+        <w:pStyle w:val="Normal"/>
+        <w:rPr/>
+      </w:pPr>
+      <w:r>
+        <w:rPr>
+          <w:rFonts w:cs="Arial"/>
+          <w:b w:val="false"/>
+          <w:i w:val="false"/>
+        </w:rPr>
+        <w:t>NZALC delivers a leadership-development approach incorporating Performance = Potential – Interference, Red Head–Blue Head, Prepare–Perform–Recover, mental-skills techniques, psychometrics, experiential activity, feedback and Leadership Development Plans. This material is embedded across Lead Self, Lead Teams, Lead Leaders and Lead Systems.</w:t>
+      </w:r>
+    </w:p>
+    <w:p>
+      <w:pPr>
+        <w:pStyle w:val="Normal"/>
+        <w:rPr/>
+      </w:pPr>
+      <w:r>
+        <w:rPr>
+          <w:rFonts w:cs="Arial"/>
+          <w:b/>
+          <w:i w:val="false"/>
+          <w:color w:val="002516"/>
+          <w:sz w:val="20"/>
+        </w:rPr>
+        <w:t>HPC Cognitive Conditioning (COGCON)</w:t>
+      </w:r>
+    </w:p>
+    <w:p>
+      <w:pPr>
+        <w:pStyle w:val="Normal"/>
+        <w:rPr/>
+      </w:pPr>
+      <w:r>
+        <w:rPr>
+          <w:rFonts w:cs="Arial"/>
+          <w:b w:val="false"/>
+          <w:i w:val="false"/>
+        </w:rPr>
+        <w:t>COGCON is a developmental cognitive-conditioning product targeting selected aspects of performance cognition under physical and cognitive load, including arousal regulation, attention, cognitive control and working memory. Feasibility trials in military training have demonstrated acceptability and promising training trends. Its causal effectiveness, operational transfer, readiness validity, scalability and enduring delivery model have not yet been established. Its status and appropriate future role will be confirmed through the Phase 2 assessment.</w:t>
+      </w:r>
+    </w:p>
+    <w:p>
+      <w:pPr>
+        <w:pStyle w:val="Heading2"/>
+        <w:rPr/>
+      </w:pPr>
+      <w:r>
+        <w:rPr>
+          <w:rFonts w:cs="Arial"/>
+          <w:b/>
+          <w:i w:val="false"/>
+          <w:color w:val="000000"/>
+          <w:sz w:val="22"/>
+        </w:rPr>
+        <w:t>Outside ACS</w:t>
+      </w:r>
+    </w:p>
+    <w:p>
+      <w:pPr>
+        <w:pStyle w:val="Normal"/>
+        <w:rPr/>
+      </w:pPr>
+      <w:r>
+        <w:rPr>
+          <w:rFonts w:cs="Arial"/>
+          <w:b/>
+          <w:i w:val="false"/>
+          <w:color w:val="002516"/>
+          <w:sz w:val="20"/>
+        </w:rPr>
+        <w:t>Army Psychology Services (APS), ILD and other stakeholders</w:t>
+      </w:r>
+    </w:p>
+    <w:p>
+      <w:pPr>
+        <w:pStyle w:val="Normal"/>
+        <w:rPr/>
+      </w:pPr>
+      <w:r>
+        <w:rPr>
+          <w:rFonts w:cs="Arial"/>
+          <w:b w:val="false"/>
+          <w:i w:val="false"/>
+        </w:rPr>
+        <w:t>These organisations hold additional professional expertise, learning products, delivery capability and assurance functions that will be confirmed during the Phase 2 assessment.</w:t>
+      </w:r>
+    </w:p>
+    <w:p>
+      <w:pPr>
+        <w:pStyle w:val="Normal"/>
+        <w:rPr/>
+      </w:pPr>
+      <w:r>
+        <w:rPr>
+          <w:rFonts w:cs="Arial"/>
+          <w:b w:val="false"/>
+          <w:i w:val="false"/>
+        </w:rPr>
+        <w:t>Initial review indicates considerable conceptual alignment across existing products. The Combat Mindset Framework will establish a common doctrinal language beneath which individual products and methods can be nested.</w:t>
+      </w:r>
+    </w:p>
+    <w:p>
+      <w:pPr>
+        <w:pStyle w:val="Normal"/>
+        <w:rPr/>
+      </w:pPr>
+      <w:r>
+        <w:rPr>
+          <w:rFonts w:cs="Arial"/>
+          <w:b w:val="false"/>
+          <w:i w:val="false"/>
+        </w:rPr>
+        <w:t>A full assessment of existing capability and products will be completed during Phase 2. The products described above contribute to Performance Under Pressure and, where applied in a warfighting context, to Combat Mindset; none constitutes the framework in isolation.</w:t>
+      </w:r>
+    </w:p>
+    <w:p>
+      <w:pPr>
+        <w:pStyle w:val="Normal"/>
+        <w:pBdr>
+          <w:bottom w:val="single" w:sz="6" w:space="1" w:color="A89662"/>
+        </w:pBdr>
+        <w:spacing w:before="200" w:after="200"/>
+        <w:rPr/>
+      </w:pPr>
+      <w:r>
+        <w:rPr/>
+      </w:r>
+    </w:p>
+    <w:p>
+      <w:pPr>
+        <w:pStyle w:val="Heading1"/>
+        <w:pBdr>
+          <w:left w:val="single" w:sz="24" w:space="8" w:color="C62026"/>
+        </w:pBdr>
+        <w:rPr/>
+      </w:pPr>
+      <w:bookmarkStart w:id="5" w:name="__RefHeading___Toc221_2605921147"/>
+      <w:bookmarkEnd w:id="5"/>
+      <w:r>
+        <w:rPr>
+          <w:rFonts w:cs="Arial"/>
+          <w:b/>
+          <w:i w:val="false"/>
+          <w:color w:val="002516"/>
+          <w:sz w:val="28"/>
+        </w:rPr>
+        <w:t>4. Programme of work</w:t>
+      </w:r>
+    </w:p>
+    <w:p>
+      <w:pPr>
+        <w:pStyle w:val="Normal"/>
+        <w:rPr/>
+      </w:pPr>
+      <w:r>
+        <w:rPr>
+          <w:rFonts w:cs="Arial"/>
+          <w:b w:val="false"/>
+          <w:i w:val="false"/>
+        </w:rPr>
+        <w:t>August 2026 is set aside for this paper to be socialised through the chain of command, and the programme is therefore proposed to commence in September 2026. The timeframes below are aspirational and depend to varying extents on external stakeholder availability and input. As such, activity extending into early 2027 is anticipated rather than unforeseen.</w:t>
+      </w:r>
+    </w:p>
+    <w:p>
+      <w:pPr>
+        <w:pStyle w:val="Normal"/>
+        <w:rPr/>
+      </w:pPr>
+      <w:r>
+        <w:rPr>
+          <w:rFonts w:cs="Arial"/>
+          <w:b w:val="false"/>
+          <w:i w:val="false"/>
+        </w:rPr>
+        <w:t>Phases may overlap, but each phase depends on the endorsed outputs of the one before it.</w:t>
+      </w:r>
+    </w:p>
+    <w:p>
+      <w:pPr>
+        <w:pStyle w:val="Heading2"/>
+        <w:rPr/>
+      </w:pPr>
+      <w:r>
+        <w:rPr>
+          <w:rFonts w:cs="Arial"/>
+          <w:b/>
+          <w:i w:val="false"/>
+          <w:color w:val="000000"/>
+          <w:sz w:val="22"/>
+        </w:rPr>
+        <w:t>Phase 1: Define (September 2026)</w:t>
+      </w:r>
+    </w:p>
+    <w:p>
+      <w:pPr>
+        <w:pStyle w:val="Normal"/>
+        <w:rPr/>
+      </w:pPr>
+      <w:r>
+        <w:rPr>
+          <w:rFonts w:cs="Arial"/>
+          <w:b w:val="false"/>
+          <w:i w:val="false"/>
+        </w:rPr>
+        <w:t>Confirm terminology, governance, roles and responsibilities. Establish interim sponsorship, programme leadership, phase leads, stakeholder representation and decision authorities, while identifying the enduring capability ownership, technical-authority and assurance arrangements to be resolved through the programme.</w:t>
+      </w:r>
+    </w:p>
+    <w:p>
+      <w:pPr>
+        <w:pStyle w:val="Normal"/>
+        <w:rPr/>
+      </w:pPr>
+      <w:r>
+        <w:rPr>
+          <w:rFonts w:cs="Arial"/>
+          <w:b/>
+          <w:i w:val="false"/>
+        </w:rPr>
+        <w:t>Key output.</w:t>
+      </w:r>
+      <w:r>
+        <w:rPr>
+          <w:rFonts w:cs="Arial"/>
+          <w:b w:val="false"/>
+          <w:i w:val="false"/>
+        </w:rPr>
+        <w:t xml:space="preserve"> Endorsed drafting baseline and confirmed interim governance.</w:t>
+      </w:r>
+    </w:p>
+    <w:p>
+      <w:pPr>
+        <w:pStyle w:val="Heading2"/>
+        <w:rPr/>
+      </w:pPr>
+      <w:r>
+        <w:rPr>
+          <w:rFonts w:cs="Arial"/>
+          <w:b/>
+          <w:i w:val="false"/>
+          <w:color w:val="000000"/>
+          <w:sz w:val="22"/>
+        </w:rPr>
+        <w:t>Phase 2: Understand (September 2026)</w:t>
+      </w:r>
+    </w:p>
+    <w:p>
+      <w:pPr>
+        <w:pStyle w:val="Normal"/>
+        <w:rPr/>
+      </w:pPr>
+      <w:r>
+        <w:rPr>
+          <w:rFonts w:cs="Arial"/>
+          <w:b w:val="false"/>
+          <w:i w:val="false"/>
+        </w:rPr>
+        <w:t>Assess existing doctrine, products and delivery across ACS, NZALC, HPC, APS, ILD, training establishments and selected units against:</w:t>
       </w:r>
     </w:p>
     <w:p>
@@ -1397,349 +1739,7 @@
           <w:b w:val="false"/>
           <w:i w:val="false"/>
         </w:rPr>
-        <w:t>Increases the risk that Combat Mindset is interpreted as motivation or aggression alone.</w:t>
-      </w:r>
-    </w:p>
-    <w:p>
-      <w:pPr>
-        <w:pStyle w:val="Normal"/>
-        <w:rPr/>
-      </w:pPr>
-      <w:r>
-        <w:rPr>
-          <w:rFonts w:cs="Arial"/>
-          <w:b w:val="false"/>
-          <w:i w:val="false"/>
-        </w:rPr>
-        <w:t>Both options deliver the end state described in the COMDT ACS guidance. NZALC and HPC jointly recommend Option 1, and will implement whichever option COMDT ACS selects.</w:t>
-      </w:r>
-    </w:p>
-    <w:p>
-      <w:pPr>
-        <w:pStyle w:val="Normal"/>
-        <w:pBdr>
-          <w:bottom w:val="single" w:sz="6" w:space="1" w:color="A89662"/>
-        </w:pBdr>
-        <w:spacing w:before="200" w:after="200"/>
-        <w:rPr/>
-      </w:pPr>
-      <w:r>
-        <w:rPr/>
-      </w:r>
-    </w:p>
-    <w:p>
-      <w:pPr>
-        <w:pStyle w:val="Heading1"/>
-        <w:pBdr>
-          <w:left w:val="single" w:sz="24" w:space="8" w:color="C62026"/>
-        </w:pBdr>
-        <w:rPr/>
-      </w:pPr>
-      <w:bookmarkStart w:id="4" w:name="__RefHeading___Toc222_712034351"/>
-      <w:bookmarkEnd w:id="4"/>
-      <w:r>
-        <w:rPr>
-          <w:rFonts w:cs="Arial"/>
-          <w:b/>
-          <w:i w:val="false"/>
-          <w:color w:val="002516"/>
-          <w:sz w:val="28"/>
-        </w:rPr>
-        <w:t>3. What already exists</w:t>
-      </w:r>
-    </w:p>
-    <w:p>
-      <w:pPr>
-        <w:pStyle w:val="Heading2"/>
-        <w:rPr/>
-      </w:pPr>
-      <w:r>
-        <w:rPr>
-          <w:rFonts w:cs="Arial"/>
-          <w:b/>
-          <w:i w:val="false"/>
-          <w:color w:val="000000"/>
-          <w:sz w:val="22"/>
-        </w:rPr>
-        <w:t>Within ACS</w:t>
-      </w:r>
-    </w:p>
-    <w:p>
-      <w:pPr>
-        <w:pStyle w:val="Normal"/>
-        <w:rPr/>
-      </w:pPr>
-      <w:r>
-        <w:rPr>
-          <w:rFonts w:cs="Arial"/>
-          <w:b/>
-          <w:i w:val="false"/>
-          <w:color w:val="002516"/>
-          <w:sz w:val="20"/>
-        </w:rPr>
-        <w:t>NZALC Leadership Development System</w:t>
-      </w:r>
-    </w:p>
-    <w:p>
-      <w:pPr>
-        <w:pStyle w:val="Normal"/>
-        <w:rPr/>
-      </w:pPr>
-      <w:r>
-        <w:rPr>
-          <w:rFonts w:cs="Arial"/>
-          <w:b w:val="false"/>
-          <w:i w:val="false"/>
-        </w:rPr>
-        <w:t>NZALC delivers a leadership-development approach incorporating Performance = Potential – Interference, Red Head–Blue Head, Prepare–Perform–Recover, mental-skills techniques, psychometrics, experiential activity, feedback and Leadership Development Plans. This material is embedded across Lead Self, Lead Teams, Lead Leaders and Lead Systems.</w:t>
-      </w:r>
-    </w:p>
-    <w:p>
-      <w:pPr>
-        <w:pStyle w:val="Normal"/>
-        <w:rPr/>
-      </w:pPr>
-      <w:r>
-        <w:rPr>
-          <w:rFonts w:cs="Arial"/>
-          <w:b/>
-          <w:i w:val="false"/>
-          <w:color w:val="002516"/>
-          <w:sz w:val="20"/>
-        </w:rPr>
-        <w:t>HPC Cognitive Conditioning (COGCON)</w:t>
-      </w:r>
-    </w:p>
-    <w:p>
-      <w:pPr>
-        <w:pStyle w:val="Normal"/>
-        <w:rPr/>
-      </w:pPr>
-      <w:r>
-        <w:rPr>
-          <w:rFonts w:cs="Arial"/>
-          <w:b w:val="false"/>
-          <w:i w:val="false"/>
-        </w:rPr>
-        <w:t>COGCON is a developmental cognitive-conditioning product targeting selected aspects of performance cognition under physical and cognitive load, including arousal regulation, attention, cognitive control and working memory. Feasibility trials in military training have demonstrated acceptability and promising training trends. Its causal effectiveness, operational transfer, readiness validity, scalability and enduring delivery model have not yet been established. Its status and appropriate future role will be confirmed through the Phase 2 assessment.</w:t>
-      </w:r>
-    </w:p>
-    <w:p>
-      <w:pPr>
-        <w:pStyle w:val="Heading2"/>
-        <w:rPr/>
-      </w:pPr>
-      <w:r>
-        <w:rPr>
-          <w:rFonts w:cs="Arial"/>
-          <w:b/>
-          <w:i w:val="false"/>
-          <w:color w:val="000000"/>
-          <w:sz w:val="22"/>
-        </w:rPr>
-        <w:t>Outside ACS</w:t>
-      </w:r>
-    </w:p>
-    <w:p>
-      <w:pPr>
-        <w:pStyle w:val="Normal"/>
-        <w:rPr/>
-      </w:pPr>
-      <w:r>
-        <w:rPr>
-          <w:rFonts w:cs="Arial"/>
-          <w:b/>
-          <w:i w:val="false"/>
-          <w:color w:val="002516"/>
-          <w:sz w:val="20"/>
-        </w:rPr>
-        <w:t>Army Psychology Services (APS), ILD and other stakeholders</w:t>
-      </w:r>
-    </w:p>
-    <w:p>
-      <w:pPr>
-        <w:pStyle w:val="Normal"/>
-        <w:rPr/>
-      </w:pPr>
-      <w:r>
-        <w:rPr>
-          <w:rFonts w:cs="Arial"/>
-          <w:b w:val="false"/>
-          <w:i w:val="false"/>
-        </w:rPr>
-        <w:t>These organisations hold additional professional expertise, learning products, delivery capability and assurance functions that will be confirmed during the Phase 2 assessment.</w:t>
-      </w:r>
-    </w:p>
-    <w:p>
-      <w:pPr>
-        <w:pStyle w:val="Normal"/>
-        <w:rPr/>
-      </w:pPr>
-      <w:r>
-        <w:rPr>
-          <w:rFonts w:cs="Arial"/>
-          <w:b w:val="false"/>
-          <w:i w:val="false"/>
-        </w:rPr>
-        <w:t>Initial review indicates considerable conceptual alignment across existing products. The Combat Mindset Framework will establish a common doctrinal language beneath which individual products and methods can be nested.</w:t>
-      </w:r>
-    </w:p>
-    <w:p>
-      <w:pPr>
-        <w:pStyle w:val="Normal"/>
-        <w:rPr/>
-      </w:pPr>
-      <w:r>
-        <w:rPr>
-          <w:rFonts w:cs="Arial"/>
-          <w:b w:val="false"/>
-          <w:i w:val="false"/>
-        </w:rPr>
-        <w:t>A full assessment of existing capability and products will be completed during Phase 2. The products described above contribute to Performance Under Pressure and, where applied in a warfighting context, to Combat Mindset; none constitutes the framework in isolation.</w:t>
-      </w:r>
-    </w:p>
-    <w:p>
-      <w:pPr>
-        <w:pStyle w:val="Normal"/>
-        <w:pBdr>
-          <w:bottom w:val="single" w:sz="6" w:space="1" w:color="A89662"/>
-        </w:pBdr>
-        <w:spacing w:before="200" w:after="200"/>
-        <w:rPr/>
-      </w:pPr>
-      <w:r>
-        <w:rPr/>
-      </w:r>
-    </w:p>
-    <w:p>
-      <w:pPr>
-        <w:pStyle w:val="Heading1"/>
-        <w:pBdr>
-          <w:left w:val="single" w:sz="24" w:space="8" w:color="C62026"/>
-        </w:pBdr>
-        <w:rPr/>
-      </w:pPr>
-      <w:bookmarkStart w:id="5" w:name="__RefHeading___Toc224_712034351"/>
-      <w:bookmarkEnd w:id="5"/>
-      <w:r>
-        <w:rPr>
-          <w:rFonts w:cs="Arial"/>
-          <w:b/>
-          <w:i w:val="false"/>
-          <w:color w:val="002516"/>
-          <w:sz w:val="28"/>
-        </w:rPr>
-        <w:t>4. Programme of work</w:t>
-      </w:r>
-    </w:p>
-    <w:p>
-      <w:pPr>
-        <w:pStyle w:val="Normal"/>
-        <w:rPr/>
-      </w:pPr>
-      <w:r>
-        <w:rPr>
-          <w:rFonts w:cs="Arial"/>
-          <w:b w:val="false"/>
-          <w:i w:val="false"/>
-        </w:rPr>
-        <w:t>August 2026 is set aside for this paper to be socialised through the chain of command, and the programme is therefore proposed to commence in September 2026. The timeframes below are aspirational and depend to varying extents on external stakeholder availability and input. As such, activity extending into early 2027 is anticipated rather than unforeseen.</w:t>
-      </w:r>
-    </w:p>
-    <w:p>
-      <w:pPr>
-        <w:pStyle w:val="Normal"/>
-        <w:rPr/>
-      </w:pPr>
-      <w:r>
-        <w:rPr>
-          <w:rFonts w:cs="Arial"/>
-          <w:b w:val="false"/>
-          <w:i w:val="false"/>
-        </w:rPr>
-        <w:t>Phases may overlap, but each phase depends on the endorsed outputs of the one before it.</w:t>
-      </w:r>
-    </w:p>
-    <w:p>
-      <w:pPr>
-        <w:pStyle w:val="Heading2"/>
-        <w:rPr/>
-      </w:pPr>
-      <w:r>
-        <w:rPr>
-          <w:rFonts w:cs="Arial"/>
-          <w:b/>
-          <w:i w:val="false"/>
-          <w:color w:val="000000"/>
-          <w:sz w:val="22"/>
-        </w:rPr>
-        <w:t>Phase 1: Define (September 2026)</w:t>
-      </w:r>
-    </w:p>
-    <w:p>
-      <w:pPr>
-        <w:pStyle w:val="Normal"/>
-        <w:rPr/>
-      </w:pPr>
-      <w:r>
-        <w:rPr>
-          <w:rFonts w:cs="Arial"/>
-          <w:b w:val="false"/>
-          <w:i w:val="false"/>
-        </w:rPr>
-        <w:t>Confirm terminology, governance, roles and responsibilities. Establish interim sponsorship, programme leadership, phase leads, stakeholder representation and decision authorities, while identifying the enduring capability ownership, technical-authority and assurance arrangements to be resolved through the programme.</w:t>
-      </w:r>
-    </w:p>
-    <w:p>
-      <w:pPr>
-        <w:pStyle w:val="Normal"/>
-        <w:rPr/>
-      </w:pPr>
-      <w:r>
-        <w:rPr>
-          <w:rFonts w:cs="Arial"/>
-          <w:b/>
-          <w:i w:val="false"/>
-        </w:rPr>
-        <w:t>Key output.</w:t>
-      </w:r>
-      <w:r>
-        <w:rPr>
-          <w:rFonts w:cs="Arial"/>
-          <w:b w:val="false"/>
-          <w:i w:val="false"/>
-        </w:rPr>
-        <w:t xml:space="preserve"> Endorsed drafting baseline and confirmed interim governance.</w:t>
-      </w:r>
-    </w:p>
-    <w:p>
-      <w:pPr>
-        <w:pStyle w:val="Heading2"/>
-        <w:rPr/>
-      </w:pPr>
-      <w:r>
-        <w:rPr>
-          <w:rFonts w:cs="Arial"/>
-          <w:b/>
-          <w:i w:val="false"/>
-          <w:color w:val="000000"/>
-          <w:sz w:val="22"/>
-        </w:rPr>
-        <w:t>Phase 2: Understand (September 2026)</w:t>
-      </w:r>
-    </w:p>
-    <w:p>
-      <w:pPr>
-        <w:pStyle w:val="Normal"/>
-        <w:rPr/>
-      </w:pPr>
-      <w:r>
-        <w:rPr>
-          <w:rFonts w:cs="Arial"/>
-          <w:b w:val="false"/>
-          <w:i w:val="false"/>
-        </w:rPr>
-        <w:t>Assess existing doctrine, products and delivery across ACS, NZALC, HPC, APS, ILD, training establishments and selected units against:</w:t>
+        <w:t>doctrinal and policy holdings;</w:t>
       </w:r>
     </w:p>
     <w:p>
@@ -1775,7 +1775,7 @@
           <w:b w:val="false"/>
           <w:i w:val="false"/>
         </w:rPr>
-        <w:t>doctrinal and policy holdings;</w:t>
+        <w:t>capability outcomes, training products and methods;</w:t>
       </w:r>
     </w:p>
     <w:p>
@@ -1811,7 +1811,7 @@
           <w:b w:val="false"/>
           <w:i w:val="false"/>
         </w:rPr>
-        <w:t>capability outcomes, training products and methods;</w:t>
+        <w:t>delivery organisations;</w:t>
       </w:r>
     </w:p>
     <w:p>
@@ -1847,7 +1847,7 @@
           <w:b w:val="false"/>
           <w:i w:val="false"/>
         </w:rPr>
-        <w:t>delivery organisations;</w:t>
+        <w:t>evidence maturity, scalability and resource requirements; and</w:t>
       </w:r>
     </w:p>
     <w:p>
@@ -1883,42 +1883,6 @@
           <w:b w:val="false"/>
           <w:i w:val="false"/>
         </w:rPr>
-        <w:t>evidence maturity, scalability and resource requirements; and</w:t>
-      </w:r>
-    </w:p>
-    <w:p>
-      <w:pPr>
-        <w:pStyle w:val="Normal"/>
-        <w:tabs>
-          <w:tab w:val="clear" w:pos="720"/>
-          <w:tab w:val="left" w:pos="425" w:leader="none"/>
-        </w:tabs>
-        <w:spacing w:before="0" w:after="60"/>
-        <w:ind w:hanging="255" w:left="425"/>
-        <w:rPr/>
-      </w:pPr>
-      <w:r>
-        <w:rPr>
-          <w:rFonts w:cs="Arial"/>
-          <w:b/>
-          <w:color w:val="C62026"/>
-        </w:rPr>
-        <w:t>•</w:t>
-      </w:r>
-      <w:r>
-        <w:rPr>
-          <w:rFonts w:cs="Arial"/>
-          <w:b/>
-          <w:color w:val="C62026"/>
-        </w:rPr>
-        <w:tab/>
-      </w:r>
-      <w:r>
-        <w:rPr>
-          <w:rFonts w:cs="Arial"/>
-          <w:b w:val="false"/>
-          <w:i w:val="false"/>
-        </w:rPr>
         <w:t>gaps, duplication and integration opportunities.</w:t>
       </w:r>
     </w:p>
@@ -2163,7 +2127,7 @@
         </w:pBdr>
         <w:rPr/>
       </w:pPr>
-      <w:bookmarkStart w:id="6" w:name="__RefHeading___Toc226_712034351"/>
+      <w:bookmarkStart w:id="6" w:name="__RefHeading___Toc223_2605921147"/>
       <w:bookmarkEnd w:id="6"/>
       <w:r>
         <w:rPr>

</xml_diff>

<commit_message>
Name the service in the cover hero title
Cover title now reads NZ Army Combat Mindset, matching the model page and
making the single service scope clear from the front.

Co-Authored-By: Claude Fable 5 <noreply@anthropic.com>
Claude-Session: https://claude.ai/code/session_01YLo1WfwUDkbwfJEF3ZNVbB
</commit_message>
<xml_diff>
--- a/output/combat-mindset-way-forward.docx
+++ b/output/combat-mindset-way-forward.docx
@@ -62,7 +62,7 @@
           <w:color w:val="000000"/>
           <w:sz w:val="72"/>
         </w:rPr>
-        <w:t>Combat Mindset</w:t>
+        <w:t>NZ Army Combat Mindset</w:t>
       </w:r>
     </w:p>
     <w:p>
@@ -298,7 +298,7 @@
             </w:rPr>
             <w:fldChar w:fldCharType="separate"/>
           </w:r>
-          <w:hyperlink w:anchor="__RefHeading___Toc211_2605921147">
+          <w:hyperlink w:anchor="__RefHeading___Toc211_2288453424">
             <w:r>
               <w:rPr>
                 <w:webHidden/>
@@ -325,7 +325,7 @@
             </w:tabs>
             <w:rPr/>
           </w:pPr>
-          <w:hyperlink w:anchor="__RefHeading___Toc213_2605921147">
+          <w:hyperlink w:anchor="__RefHeading___Toc213_2288453424">
             <w:r>
               <w:rPr>
                 <w:webHidden/>
@@ -352,7 +352,7 @@
             </w:tabs>
             <w:rPr/>
           </w:pPr>
-          <w:hyperlink w:anchor="__RefHeading___Toc215_2605921147">
+          <w:hyperlink w:anchor="__RefHeading___Toc215_2288453424">
             <w:r>
               <w:rPr>
                 <w:webHidden/>
@@ -379,7 +379,7 @@
             </w:tabs>
             <w:rPr/>
           </w:pPr>
-          <w:hyperlink w:anchor="__RefHeading___Toc217_2605921147">
+          <w:hyperlink w:anchor="__RefHeading___Toc217_2288453424">
             <w:r>
               <w:rPr>
                 <w:webHidden/>
@@ -406,7 +406,7 @@
             </w:tabs>
             <w:rPr/>
           </w:pPr>
-          <w:hyperlink w:anchor="__RefHeading___Toc219_2605921147">
+          <w:hyperlink w:anchor="__RefHeading___Toc219_2288453424">
             <w:r>
               <w:rPr>
                 <w:webHidden/>
@@ -433,7 +433,7 @@
             </w:tabs>
             <w:rPr/>
           </w:pPr>
-          <w:hyperlink w:anchor="__RefHeading___Toc221_2605921147">
+          <w:hyperlink w:anchor="__RefHeading___Toc221_2288453424">
             <w:r>
               <w:rPr>
                 <w:webHidden/>
@@ -460,7 +460,7 @@
             </w:tabs>
             <w:rPr/>
           </w:pPr>
-          <w:hyperlink w:anchor="__RefHeading___Toc223_2605921147">
+          <w:hyperlink w:anchor="__RefHeading___Toc223_2288453424">
             <w:r>
               <w:rPr>
                 <w:webHidden/>
@@ -515,7 +515,7 @@
         <w:spacing w:before="0" w:after="160"/>
         <w:rPr/>
       </w:pPr>
-      <w:bookmarkStart w:id="0" w:name="__RefHeading___Toc211_2605921147"/>
+      <w:bookmarkStart w:id="0" w:name="__RefHeading___Toc211_2288453424"/>
       <w:bookmarkEnd w:id="0"/>
       <w:r>
         <w:rPr>
@@ -597,7 +597,7 @@
         </w:pBdr>
         <w:rPr/>
       </w:pPr>
-      <w:bookmarkStart w:id="1" w:name="__RefHeading___Toc213_2605921147"/>
+      <w:bookmarkStart w:id="1" w:name="__RefHeading___Toc213_2288453424"/>
       <w:bookmarkEnd w:id="1"/>
       <w:r>
         <w:rPr>
@@ -673,7 +673,7 @@
         </w:pBdr>
         <w:rPr/>
       </w:pPr>
-      <w:bookmarkStart w:id="2" w:name="__RefHeading___Toc215_2605921147"/>
+      <w:bookmarkStart w:id="2" w:name="__RefHeading___Toc215_2288453424"/>
       <w:bookmarkEnd w:id="2"/>
       <w:r>
         <w:rPr>
@@ -781,7 +781,7 @@
         </w:pBdr>
         <w:rPr/>
       </w:pPr>
-      <w:bookmarkStart w:id="3" w:name="__RefHeading___Toc217_2605921147"/>
+      <w:bookmarkStart w:id="3" w:name="__RefHeading___Toc217_2288453424"/>
       <w:bookmarkEnd w:id="3"/>
       <w:r>
         <w:rPr>
@@ -1399,7 +1399,7 @@
         </w:pBdr>
         <w:rPr/>
       </w:pPr>
-      <w:bookmarkStart w:id="4" w:name="__RefHeading___Toc219_2605921147"/>
+      <w:bookmarkStart w:id="4" w:name="__RefHeading___Toc219_2288453424"/>
       <w:bookmarkEnd w:id="4"/>
       <w:r>
         <w:rPr>
@@ -1583,7 +1583,7 @@
         </w:pBdr>
         <w:rPr/>
       </w:pPr>
-      <w:bookmarkStart w:id="5" w:name="__RefHeading___Toc221_2605921147"/>
+      <w:bookmarkStart w:id="5" w:name="__RefHeading___Toc221_2288453424"/>
       <w:bookmarkEnd w:id="5"/>
       <w:r>
         <w:rPr>
@@ -2127,7 +2127,7 @@
         </w:pBdr>
         <w:rPr/>
       </w:pPr>
-      <w:bookmarkStart w:id="6" w:name="__RefHeading___Toc223_2605921147"/>
+      <w:bookmarkStart w:id="6" w:name="__RefHeading___Toc223_2288453424"/>
       <w:bookmarkEnd w:id="6"/>
       <w:r>
         <w:rPr>

</xml_diff>

<commit_message>
Apply the NZ Army brand guidelines to the framework proposal
Colour: replace the approximated palette with the published Army values,
Pantone 200 C red and the four secondary greens, across the paper and the
model page.

Type: body copy to Calibri and display headings to Arial Black, the
published PC substitutes for Neue Haas Grotesk. Sub-headings stay in
Calibri Bold. Leading tightened to hold the paper at eight pages.

Colour use: headings move from secondary green to black with red as the
single accent, matching every Army application example in the guidelines.
Fourth level headings take red, the way the guidelines label sub-sections.

Co-Authored-By: Claude Fable 5 <noreply@anthropic.com>
Claude-Session: https://claude.ai/code/session_01YLo1WfwUDkbwfJEF3ZNVbB
</commit_message>
<xml_diff>
--- a/output/combat-mindset-way-forward.docx
+++ b/output/combat-mindset-way-forward.docx
@@ -57,10 +57,10 @@
       </w:pPr>
       <w:r>
         <w:rPr>
-          <w:rFonts w:cs="Arial"/>
-          <w:b/>
+          <w:rFonts w:cs="Arial Black" w:ascii="Arial Black" w:hAnsi="Arial Black"/>
+          <w:b w:val="false"/>
           <w:color w:val="000000"/>
-          <w:sz w:val="72"/>
+          <w:sz w:val="60"/>
         </w:rPr>
         <w:t>NZ Army Combat Mindset</w:t>
       </w:r>
@@ -69,16 +69,16 @@
       <w:pPr>
         <w:pStyle w:val="Normal"/>
         <w:pBdr>
-          <w:bottom w:val="single" w:sz="20" w:space="10" w:color="C62026"/>
+          <w:bottom w:val="single" w:sz="20" w:space="10" w:color="D31145"/>
         </w:pBdr>
         <w:spacing w:before="0" w:after="200"/>
         <w:rPr/>
       </w:pPr>
       <w:r>
         <w:rPr>
-          <w:rFonts w:cs="Arial"/>
-          <w:b/>
-          <w:color w:val="002516"/>
+          <w:rFonts w:cs="Calibri"/>
+          <w:b/>
+          <w:color w:val="000000"/>
           <w:sz w:val="34"/>
         </w:rPr>
         <w:t>Framework Proposal</w:t>
@@ -92,7 +92,7 @@
       </w:pPr>
       <w:r>
         <w:rPr>
-          <w:rFonts w:cs="Arial"/>
+          <w:rFonts w:cs="Calibri"/>
           <w:color w:val="000000"/>
           <w:sz w:val="26"/>
         </w:rPr>
@@ -107,9 +107,9 @@
       </w:pPr>
       <w:r>
         <w:rPr>
-          <w:rFonts w:cs="Arial"/>
-          <w:b/>
-          <w:color w:val="C62026"/>
+          <w:rFonts w:cs="Calibri"/>
+          <w:b/>
+          <w:color w:val="D31145"/>
           <w:sz w:val="26"/>
         </w:rPr>
         <w:t>Harder to kill.</w:t>
@@ -127,9 +127,9 @@
       </w:pPr>
       <w:r>
         <w:rPr>
-          <w:rFonts w:cs="Arial"/>
-          <w:b/>
-          <w:color w:val="002516"/>
+          <w:rFonts w:cs="Calibri"/>
+          <w:b/>
+          <w:color w:val="000000"/>
           <w:sz w:val="20"/>
         </w:rPr>
         <w:t>Reference</w:t>
@@ -137,7 +137,7 @@
       </w:r>
       <w:r>
         <w:rPr>
-          <w:rFonts w:cs="Arial"/>
+          <w:rFonts w:cs="Calibri"/>
           <w:color w:val="000000"/>
           <w:sz w:val="20"/>
         </w:rPr>
@@ -156,9 +156,9 @@
       </w:pPr>
       <w:r>
         <w:rPr>
-          <w:rFonts w:cs="Arial"/>
-          <w:b/>
-          <w:color w:val="002516"/>
+          <w:rFonts w:cs="Calibri"/>
+          <w:b/>
+          <w:color w:val="000000"/>
           <w:sz w:val="20"/>
         </w:rPr>
         <w:t>Date</w:t>
@@ -166,7 +166,7 @@
       </w:r>
       <w:r>
         <w:rPr>
-          <w:rFonts w:cs="Arial"/>
+          <w:rFonts w:cs="Calibri"/>
           <w:color w:val="000000"/>
           <w:sz w:val="20"/>
         </w:rPr>
@@ -185,9 +185,9 @@
       </w:pPr>
       <w:r>
         <w:rPr>
-          <w:rFonts w:cs="Arial"/>
-          <w:b/>
-          <w:color w:val="002516"/>
+          <w:rFonts w:cs="Calibri"/>
+          <w:b/>
+          <w:color w:val="000000"/>
           <w:sz w:val="20"/>
         </w:rPr>
         <w:t>Originator</w:t>
@@ -195,7 +195,7 @@
       </w:r>
       <w:r>
         <w:rPr>
-          <w:rFonts w:cs="Arial"/>
+          <w:rFonts w:cs="Calibri"/>
           <w:color w:val="000000"/>
           <w:sz w:val="20"/>
         </w:rPr>
@@ -214,9 +214,9 @@
       </w:pPr>
       <w:r>
         <w:rPr>
-          <w:rFonts w:cs="Arial"/>
-          <w:b/>
-          <w:color w:val="002516"/>
+          <w:rFonts w:cs="Calibri"/>
+          <w:b/>
+          <w:color w:val="000000"/>
           <w:sz w:val="20"/>
         </w:rPr>
         <w:t>Version</w:t>
@@ -224,7 +224,7 @@
       </w:r>
       <w:r>
         <w:rPr>
-          <w:rFonts w:cs="Arial"/>
+          <w:rFonts w:cs="Calibri"/>
           <w:color w:val="000000"/>
           <w:sz w:val="20"/>
         </w:rPr>
@@ -247,16 +247,16 @@
       <w:pPr>
         <w:pStyle w:val="Normal"/>
         <w:pBdr>
-          <w:left w:val="single" w:sz="24" w:space="8" w:color="C62026"/>
+          <w:left w:val="single" w:sz="24" w:space="8" w:color="D31145"/>
         </w:pBdr>
         <w:spacing w:before="0" w:after="240"/>
         <w:rPr/>
       </w:pPr>
       <w:r>
         <w:rPr>
-          <w:rFonts w:cs="Arial"/>
-          <w:b/>
-          <w:color w:val="002516"/>
+          <w:rFonts w:cs="Arial Black" w:ascii="Arial Black" w:hAnsi="Arial Black"/>
+          <w:b w:val="false"/>
+          <w:color w:val="000000"/>
           <w:sz w:val="28"/>
         </w:rPr>
         <w:t>Contents</w:t>
@@ -298,7 +298,7 @@
             </w:rPr>
             <w:fldChar w:fldCharType="separate"/>
           </w:r>
-          <w:hyperlink w:anchor="__RefHeading___Toc211_2288453424">
+          <w:hyperlink w:anchor="__RefHeading___Toc211_2535076536">
             <w:r>
               <w:rPr>
                 <w:webHidden/>
@@ -325,7 +325,7 @@
             </w:tabs>
             <w:rPr/>
           </w:pPr>
-          <w:hyperlink w:anchor="__RefHeading___Toc213_2288453424">
+          <w:hyperlink w:anchor="__RefHeading___Toc213_2535076536">
             <w:r>
               <w:rPr>
                 <w:webHidden/>
@@ -352,7 +352,7 @@
             </w:tabs>
             <w:rPr/>
           </w:pPr>
-          <w:hyperlink w:anchor="__RefHeading___Toc215_2288453424">
+          <w:hyperlink w:anchor="__RefHeading___Toc215_2535076536">
             <w:r>
               <w:rPr>
                 <w:webHidden/>
@@ -379,7 +379,7 @@
             </w:tabs>
             <w:rPr/>
           </w:pPr>
-          <w:hyperlink w:anchor="__RefHeading___Toc217_2288453424">
+          <w:hyperlink w:anchor="__RefHeading___Toc217_2535076536">
             <w:r>
               <w:rPr>
                 <w:webHidden/>
@@ -406,7 +406,7 @@
             </w:tabs>
             <w:rPr/>
           </w:pPr>
-          <w:hyperlink w:anchor="__RefHeading___Toc219_2288453424">
+          <w:hyperlink w:anchor="__RefHeading___Toc219_2535076536">
             <w:r>
               <w:rPr>
                 <w:webHidden/>
@@ -433,7 +433,7 @@
             </w:tabs>
             <w:rPr/>
           </w:pPr>
-          <w:hyperlink w:anchor="__RefHeading___Toc221_2288453424">
+          <w:hyperlink w:anchor="__RefHeading___Toc221_2535076536">
             <w:r>
               <w:rPr>
                 <w:webHidden/>
@@ -460,7 +460,7 @@
             </w:tabs>
             <w:rPr/>
           </w:pPr>
-          <w:hyperlink w:anchor="__RefHeading___Toc223_2288453424">
+          <w:hyperlink w:anchor="__RefHeading___Toc223_2535076536">
             <w:r>
               <w:rPr>
                 <w:webHidden/>
@@ -510,19 +510,19 @@
       <w:pPr>
         <w:pStyle w:val="Heading1"/>
         <w:pBdr>
-          <w:left w:val="single" w:sz="24" w:space="8" w:color="C62026"/>
+          <w:left w:val="single" w:sz="24" w:space="8" w:color="D31145"/>
         </w:pBdr>
         <w:spacing w:before="0" w:after="160"/>
         <w:rPr/>
       </w:pPr>
-      <w:bookmarkStart w:id="0" w:name="__RefHeading___Toc211_2288453424"/>
+      <w:bookmarkStart w:id="0" w:name="__RefHeading___Toc211_2535076536"/>
       <w:bookmarkEnd w:id="0"/>
       <w:r>
         <w:rPr>
-          <w:rFonts w:cs="Arial"/>
-          <w:b/>
-          <w:i w:val="false"/>
-          <w:color w:val="002516"/>
+          <w:rFonts w:cs="Arial Black" w:ascii="Arial Black" w:hAnsi="Arial Black"/>
+          <w:b w:val="false"/>
+          <w:i w:val="false"/>
+          <w:color w:val="000000"/>
           <w:sz w:val="28"/>
         </w:rPr>
         <w:t>The Model on a Page</w:t>
@@ -593,18 +593,18 @@
       <w:pPr>
         <w:pStyle w:val="Heading1"/>
         <w:pBdr>
-          <w:left w:val="single" w:sz="24" w:space="8" w:color="C62026"/>
+          <w:left w:val="single" w:sz="24" w:space="8" w:color="D31145"/>
         </w:pBdr>
         <w:rPr/>
       </w:pPr>
-      <w:bookmarkStart w:id="1" w:name="__RefHeading___Toc213_2288453424"/>
+      <w:bookmarkStart w:id="1" w:name="__RefHeading___Toc213_2535076536"/>
       <w:bookmarkEnd w:id="1"/>
       <w:r>
         <w:rPr>
-          <w:rFonts w:cs="Arial"/>
-          <w:b/>
-          <w:i w:val="false"/>
-          <w:color w:val="002516"/>
+          <w:rFonts w:cs="Arial Black" w:ascii="Arial Black" w:hAnsi="Arial Black"/>
+          <w:b w:val="false"/>
+          <w:i w:val="false"/>
+          <w:color w:val="000000"/>
           <w:sz w:val="28"/>
         </w:rPr>
         <w:t>Purpose</w:t>
@@ -617,7 +617,7 @@
       </w:pPr>
       <w:r>
         <w:rPr>
-          <w:rFonts w:cs="Arial"/>
+          <w:rFonts w:cs="Calibri"/>
           <w:b w:val="false"/>
           <w:i w:val="false"/>
         </w:rPr>
@@ -631,7 +631,7 @@
       </w:pPr>
       <w:r>
         <w:rPr>
-          <w:rFonts w:cs="Arial"/>
+          <w:rFonts w:cs="Calibri"/>
           <w:b w:val="false"/>
           <w:i w:val="false"/>
         </w:rPr>
@@ -645,7 +645,7 @@
       </w:pPr>
       <w:r>
         <w:rPr>
-          <w:rFonts w:cs="Arial"/>
+          <w:rFonts w:cs="Calibri"/>
           <w:b w:val="false"/>
           <w:i w:val="false"/>
         </w:rPr>
@@ -656,7 +656,7 @@
       <w:pPr>
         <w:pStyle w:val="Normal"/>
         <w:pBdr>
-          <w:bottom w:val="single" w:sz="6" w:space="1" w:color="A89662"/>
+          <w:bottom w:val="single" w:sz="6" w:space="1" w:color="B3A650"/>
         </w:pBdr>
         <w:spacing w:before="200" w:after="200"/>
         <w:rPr/>
@@ -669,18 +669,18 @@
       <w:pPr>
         <w:pStyle w:val="Heading1"/>
         <w:pBdr>
-          <w:left w:val="single" w:sz="24" w:space="8" w:color="C62026"/>
+          <w:left w:val="single" w:sz="24" w:space="8" w:color="D31145"/>
         </w:pBdr>
         <w:rPr/>
       </w:pPr>
-      <w:bookmarkStart w:id="2" w:name="__RefHeading___Toc215_2288453424"/>
+      <w:bookmarkStart w:id="2" w:name="__RefHeading___Toc215_2535076536"/>
       <w:bookmarkEnd w:id="2"/>
       <w:r>
         <w:rPr>
-          <w:rFonts w:cs="Arial"/>
-          <w:b/>
-          <w:i w:val="false"/>
-          <w:color w:val="002516"/>
+          <w:rFonts w:cs="Arial Black" w:ascii="Arial Black" w:hAnsi="Arial Black"/>
+          <w:b w:val="false"/>
+          <w:i w:val="false"/>
+          <w:color w:val="000000"/>
           <w:sz w:val="28"/>
         </w:rPr>
         <w:t>1. The problem</w:t>
@@ -693,7 +693,7 @@
       </w:pPr>
       <w:r>
         <w:rPr>
-          <w:rFonts w:cs="Arial"/>
+          <w:rFonts w:cs="Calibri"/>
           <w:b w:val="false"/>
           <w:i w:val="false"/>
         </w:rPr>
@@ -709,7 +709,7 @@
       </w:pPr>
       <w:r>
         <w:rPr>
-          <w:rFonts w:cs="Arial"/>
+          <w:rFonts w:cs="Calibri"/>
           <w:b w:val="false"/>
           <w:i/>
         </w:rPr>
@@ -723,7 +723,7 @@
       </w:pPr>
       <w:r>
         <w:rPr>
-          <w:rFonts w:cs="Arial"/>
+          <w:rFonts w:cs="Calibri"/>
           <w:b w:val="false"/>
           <w:i w:val="false"/>
         </w:rPr>
@@ -739,7 +739,7 @@
       </w:pPr>
       <w:r>
         <w:rPr>
-          <w:rFonts w:cs="Arial"/>
+          <w:rFonts w:cs="Calibri"/>
           <w:b w:val="false"/>
           <w:i/>
         </w:rPr>
@@ -753,7 +753,7 @@
       </w:pPr>
       <w:r>
         <w:rPr>
-          <w:rFonts w:cs="Arial"/>
+          <w:rFonts w:cs="Calibri"/>
           <w:b w:val="false"/>
           <w:i w:val="false"/>
         </w:rPr>
@@ -764,7 +764,7 @@
       <w:pPr>
         <w:pStyle w:val="Normal"/>
         <w:pBdr>
-          <w:bottom w:val="single" w:sz="6" w:space="1" w:color="A89662"/>
+          <w:bottom w:val="single" w:sz="6" w:space="1" w:color="B3A650"/>
         </w:pBdr>
         <w:spacing w:before="200" w:after="200"/>
         <w:rPr/>
@@ -777,18 +777,18 @@
       <w:pPr>
         <w:pStyle w:val="Heading1"/>
         <w:pBdr>
-          <w:left w:val="single" w:sz="24" w:space="8" w:color="C62026"/>
+          <w:left w:val="single" w:sz="24" w:space="8" w:color="D31145"/>
         </w:pBdr>
         <w:rPr/>
       </w:pPr>
-      <w:bookmarkStart w:id="3" w:name="__RefHeading___Toc217_2288453424"/>
+      <w:bookmarkStart w:id="3" w:name="__RefHeading___Toc217_2535076536"/>
       <w:bookmarkEnd w:id="3"/>
       <w:r>
         <w:rPr>
-          <w:rFonts w:cs="Arial"/>
-          <w:b/>
-          <w:i w:val="false"/>
-          <w:color w:val="002516"/>
+          <w:rFonts w:cs="Arial Black" w:ascii="Arial Black" w:hAnsi="Arial Black"/>
+          <w:b w:val="false"/>
+          <w:i w:val="false"/>
+          <w:color w:val="000000"/>
           <w:sz w:val="28"/>
         </w:rPr>
         <w:t>2. Terminology and definitions</w:t>
@@ -801,7 +801,7 @@
       </w:pPr>
       <w:r>
         <w:rPr>
-          <w:rFonts w:cs="Arial"/>
+          <w:rFonts w:cs="Calibri"/>
           <w:b w:val="false"/>
           <w:i w:val="false"/>
         </w:rPr>
@@ -815,7 +815,7 @@
       </w:pPr>
       <w:r>
         <w:rPr>
-          <w:rFonts w:cs="Arial"/>
+          <w:rFonts w:cs="Calibri"/>
           <w:b/>
           <w:i w:val="false"/>
           <w:color w:val="000000"/>
@@ -831,7 +831,7 @@
       </w:pPr>
       <w:r>
         <w:rPr>
-          <w:rFonts w:cs="Arial"/>
+          <w:rFonts w:cs="Calibri"/>
           <w:b w:val="false"/>
           <w:i w:val="false"/>
         </w:rPr>
@@ -845,7 +845,7 @@
       </w:pPr>
       <w:r>
         <w:rPr>
-          <w:rFonts w:cs="Arial"/>
+          <w:rFonts w:cs="Calibri"/>
           <w:b w:val="false"/>
           <w:i w:val="false"/>
         </w:rPr>
@@ -861,7 +861,7 @@
       </w:pPr>
       <w:r>
         <w:rPr>
-          <w:rFonts w:cs="Arial"/>
+          <w:rFonts w:cs="Calibri"/>
           <w:b/>
           <w:i/>
         </w:rPr>
@@ -869,7 +869,7 @@
       </w:r>
       <w:r>
         <w:rPr>
-          <w:rFonts w:cs="Arial"/>
+          <w:rFonts w:cs="Calibri"/>
           <w:b w:val="false"/>
           <w:i/>
         </w:rPr>
@@ -885,7 +885,7 @@
       </w:pPr>
       <w:r>
         <w:rPr>
-          <w:rFonts w:cs="Arial"/>
+          <w:rFonts w:cs="Calibri"/>
           <w:b/>
           <w:i/>
         </w:rPr>
@@ -893,7 +893,7 @@
       </w:r>
       <w:r>
         <w:rPr>
-          <w:rFonts w:cs="Arial"/>
+          <w:rFonts w:cs="Calibri"/>
           <w:b w:val="false"/>
           <w:i/>
         </w:rPr>
@@ -909,7 +909,7 @@
       </w:pPr>
       <w:r>
         <w:rPr>
-          <w:rFonts w:cs="Arial"/>
+          <w:rFonts w:cs="Calibri"/>
           <w:b/>
           <w:i/>
         </w:rPr>
@@ -917,7 +917,7 @@
       </w:r>
       <w:r>
         <w:rPr>
-          <w:rFonts w:cs="Arial"/>
+          <w:rFonts w:cs="Calibri"/>
           <w:b w:val="false"/>
           <w:i/>
         </w:rPr>
@@ -931,7 +931,7 @@
       </w:pPr>
       <w:r>
         <w:rPr>
-          <w:rFonts w:cs="Arial"/>
+          <w:rFonts w:cs="Calibri"/>
           <w:b w:val="false"/>
           <w:i w:val="false"/>
         </w:rPr>
@@ -947,7 +947,7 @@
       </w:pPr>
       <w:r>
         <w:rPr>
-          <w:rFonts w:cs="Arial"/>
+          <w:rFonts w:cs="Calibri"/>
           <w:b w:val="false"/>
           <w:i/>
         </w:rPr>
@@ -961,7 +961,7 @@
       </w:pPr>
       <w:r>
         <w:rPr>
-          <w:rFonts w:cs="Arial"/>
+          <w:rFonts w:cs="Calibri"/>
           <w:b/>
           <w:i w:val="false"/>
         </w:rPr>
@@ -981,23 +981,23 @@
       </w:pPr>
       <w:r>
         <w:rPr>
-          <w:rFonts w:cs="Arial"/>
-          <w:b/>
-          <w:color w:val="C62026"/>
+          <w:rFonts w:cs="Calibri"/>
+          <w:b/>
+          <w:color w:val="D31145"/>
         </w:rPr>
         <w:t>•</w:t>
       </w:r>
       <w:r>
         <w:rPr>
-          <w:rFonts w:cs="Arial"/>
-          <w:b/>
-          <w:color w:val="C62026"/>
+          <w:rFonts w:cs="Calibri"/>
+          <w:b/>
+          <w:color w:val="D31145"/>
         </w:rPr>
         <w:tab/>
       </w:r>
       <w:r>
         <w:rPr>
-          <w:rFonts w:cs="Arial"/>
+          <w:rFonts w:cs="Calibri"/>
           <w:b w:val="false"/>
           <w:i w:val="false"/>
         </w:rPr>
@@ -1017,23 +1017,23 @@
       </w:pPr>
       <w:r>
         <w:rPr>
-          <w:rFonts w:cs="Arial"/>
-          <w:b/>
-          <w:color w:val="C62026"/>
+          <w:rFonts w:cs="Calibri"/>
+          <w:b/>
+          <w:color w:val="D31145"/>
         </w:rPr>
         <w:t>•</w:t>
       </w:r>
       <w:r>
         <w:rPr>
-          <w:rFonts w:cs="Arial"/>
-          <w:b/>
-          <w:color w:val="C62026"/>
+          <w:rFonts w:cs="Calibri"/>
+          <w:b/>
+          <w:color w:val="D31145"/>
         </w:rPr>
         <w:tab/>
       </w:r>
       <w:r>
         <w:rPr>
-          <w:rFonts w:cs="Arial"/>
+          <w:rFonts w:cs="Calibri"/>
           <w:b w:val="false"/>
           <w:i w:val="false"/>
         </w:rPr>
@@ -1053,23 +1053,23 @@
       </w:pPr>
       <w:r>
         <w:rPr>
-          <w:rFonts w:cs="Arial"/>
-          <w:b/>
-          <w:color w:val="C62026"/>
+          <w:rFonts w:cs="Calibri"/>
+          <w:b/>
+          <w:color w:val="D31145"/>
         </w:rPr>
         <w:t>•</w:t>
       </w:r>
       <w:r>
         <w:rPr>
-          <w:rFonts w:cs="Arial"/>
-          <w:b/>
-          <w:color w:val="C62026"/>
+          <w:rFonts w:cs="Calibri"/>
+          <w:b/>
+          <w:color w:val="D31145"/>
         </w:rPr>
         <w:tab/>
       </w:r>
       <w:r>
         <w:rPr>
-          <w:rFonts w:cs="Arial"/>
+          <w:rFonts w:cs="Calibri"/>
           <w:b w:val="false"/>
           <w:i w:val="false"/>
         </w:rPr>
@@ -1083,7 +1083,7 @@
       </w:pPr>
       <w:r>
         <w:rPr>
-          <w:rFonts w:cs="Arial"/>
+          <w:rFonts w:cs="Calibri"/>
           <w:b/>
           <w:i w:val="false"/>
         </w:rPr>
@@ -1103,23 +1103,23 @@
       </w:pPr>
       <w:r>
         <w:rPr>
-          <w:rFonts w:cs="Arial"/>
-          <w:b/>
-          <w:color w:val="C62026"/>
+          <w:rFonts w:cs="Calibri"/>
+          <w:b/>
+          <w:color w:val="D31145"/>
         </w:rPr>
         <w:t>•</w:t>
       </w:r>
       <w:r>
         <w:rPr>
-          <w:rFonts w:cs="Arial"/>
-          <w:b/>
-          <w:color w:val="C62026"/>
+          <w:rFonts w:cs="Calibri"/>
+          <w:b/>
+          <w:color w:val="D31145"/>
         </w:rPr>
         <w:tab/>
       </w:r>
       <w:r>
         <w:rPr>
-          <w:rFonts w:cs="Arial"/>
+          <w:rFonts w:cs="Calibri"/>
           <w:b w:val="false"/>
           <w:i w:val="false"/>
         </w:rPr>
@@ -1133,7 +1133,7 @@
       </w:pPr>
       <w:r>
         <w:rPr>
-          <w:rFonts w:cs="Arial"/>
+          <w:rFonts w:cs="Calibri"/>
           <w:b/>
           <w:i w:val="false"/>
           <w:color w:val="000000"/>
@@ -1149,7 +1149,7 @@
       </w:pPr>
       <w:r>
         <w:rPr>
-          <w:rFonts w:cs="Arial"/>
+          <w:rFonts w:cs="Calibri"/>
           <w:b w:val="false"/>
           <w:i w:val="false"/>
         </w:rPr>
@@ -1163,7 +1163,7 @@
       </w:pPr>
       <w:r>
         <w:rPr>
-          <w:rFonts w:cs="Arial"/>
+          <w:rFonts w:cs="Calibri"/>
           <w:b/>
           <w:i w:val="false"/>
         </w:rPr>
@@ -1183,23 +1183,23 @@
       </w:pPr>
       <w:r>
         <w:rPr>
-          <w:rFonts w:cs="Arial"/>
-          <w:b/>
-          <w:color w:val="C62026"/>
+          <w:rFonts w:cs="Calibri"/>
+          <w:b/>
+          <w:color w:val="D31145"/>
         </w:rPr>
         <w:t>•</w:t>
       </w:r>
       <w:r>
         <w:rPr>
-          <w:rFonts w:cs="Arial"/>
-          <w:b/>
-          <w:color w:val="C62026"/>
+          <w:rFonts w:cs="Calibri"/>
+          <w:b/>
+          <w:color w:val="D31145"/>
         </w:rPr>
         <w:tab/>
       </w:r>
       <w:r>
         <w:rPr>
-          <w:rFonts w:cs="Arial"/>
+          <w:rFonts w:cs="Calibri"/>
           <w:b w:val="false"/>
           <w:i w:val="false"/>
         </w:rPr>
@@ -1219,23 +1219,23 @@
       </w:pPr>
       <w:r>
         <w:rPr>
-          <w:rFonts w:cs="Arial"/>
-          <w:b/>
-          <w:color w:val="C62026"/>
+          <w:rFonts w:cs="Calibri"/>
+          <w:b/>
+          <w:color w:val="D31145"/>
         </w:rPr>
         <w:t>•</w:t>
       </w:r>
       <w:r>
         <w:rPr>
-          <w:rFonts w:cs="Arial"/>
-          <w:b/>
-          <w:color w:val="C62026"/>
+          <w:rFonts w:cs="Calibri"/>
+          <w:b/>
+          <w:color w:val="D31145"/>
         </w:rPr>
         <w:tab/>
       </w:r>
       <w:r>
         <w:rPr>
-          <w:rFonts w:cs="Arial"/>
+          <w:rFonts w:cs="Calibri"/>
           <w:b w:val="false"/>
           <w:i w:val="false"/>
         </w:rPr>
@@ -1249,7 +1249,7 @@
       </w:pPr>
       <w:r>
         <w:rPr>
-          <w:rFonts w:cs="Arial"/>
+          <w:rFonts w:cs="Calibri"/>
           <w:b/>
           <w:i w:val="false"/>
         </w:rPr>
@@ -1269,23 +1269,23 @@
       </w:pPr>
       <w:r>
         <w:rPr>
-          <w:rFonts w:cs="Arial"/>
-          <w:b/>
-          <w:color w:val="C62026"/>
+          <w:rFonts w:cs="Calibri"/>
+          <w:b/>
+          <w:color w:val="D31145"/>
         </w:rPr>
         <w:t>•</w:t>
       </w:r>
       <w:r>
         <w:rPr>
-          <w:rFonts w:cs="Arial"/>
-          <w:b/>
-          <w:color w:val="C62026"/>
+          <w:rFonts w:cs="Calibri"/>
+          <w:b/>
+          <w:color w:val="D31145"/>
         </w:rPr>
         <w:tab/>
       </w:r>
       <w:r>
         <w:rPr>
-          <w:rFonts w:cs="Arial"/>
+          <w:rFonts w:cs="Calibri"/>
           <w:b w:val="false"/>
           <w:i w:val="false"/>
         </w:rPr>
@@ -1305,23 +1305,23 @@
       </w:pPr>
       <w:r>
         <w:rPr>
-          <w:rFonts w:cs="Arial"/>
-          <w:b/>
-          <w:color w:val="C62026"/>
+          <w:rFonts w:cs="Calibri"/>
+          <w:b/>
+          <w:color w:val="D31145"/>
         </w:rPr>
         <w:t>•</w:t>
       </w:r>
       <w:r>
         <w:rPr>
-          <w:rFonts w:cs="Arial"/>
-          <w:b/>
-          <w:color w:val="C62026"/>
+          <w:rFonts w:cs="Calibri"/>
+          <w:b/>
+          <w:color w:val="D31145"/>
         </w:rPr>
         <w:tab/>
       </w:r>
       <w:r>
         <w:rPr>
-          <w:rFonts w:cs="Arial"/>
+          <w:rFonts w:cs="Calibri"/>
           <w:b w:val="false"/>
           <w:i w:val="false"/>
         </w:rPr>
@@ -1341,23 +1341,23 @@
       </w:pPr>
       <w:r>
         <w:rPr>
-          <w:rFonts w:cs="Arial"/>
-          <w:b/>
-          <w:color w:val="C62026"/>
+          <w:rFonts w:cs="Calibri"/>
+          <w:b/>
+          <w:color w:val="D31145"/>
         </w:rPr>
         <w:t>•</w:t>
       </w:r>
       <w:r>
         <w:rPr>
-          <w:rFonts w:cs="Arial"/>
-          <w:b/>
-          <w:color w:val="C62026"/>
+          <w:rFonts w:cs="Calibri"/>
+          <w:b/>
+          <w:color w:val="D31145"/>
         </w:rPr>
         <w:tab/>
       </w:r>
       <w:r>
         <w:rPr>
-          <w:rFonts w:cs="Arial"/>
+          <w:rFonts w:cs="Calibri"/>
           <w:b w:val="false"/>
           <w:i w:val="false"/>
         </w:rPr>
@@ -1371,7 +1371,7 @@
       </w:pPr>
       <w:r>
         <w:rPr>
-          <w:rFonts w:cs="Arial"/>
+          <w:rFonts w:cs="Calibri"/>
           <w:b w:val="false"/>
           <w:i w:val="false"/>
         </w:rPr>
@@ -1382,7 +1382,7 @@
       <w:pPr>
         <w:pStyle w:val="Normal"/>
         <w:pBdr>
-          <w:bottom w:val="single" w:sz="6" w:space="1" w:color="A89662"/>
+          <w:bottom w:val="single" w:sz="6" w:space="1" w:color="B3A650"/>
         </w:pBdr>
         <w:spacing w:before="200" w:after="200"/>
         <w:rPr/>
@@ -1395,18 +1395,18 @@
       <w:pPr>
         <w:pStyle w:val="Heading1"/>
         <w:pBdr>
-          <w:left w:val="single" w:sz="24" w:space="8" w:color="C62026"/>
+          <w:left w:val="single" w:sz="24" w:space="8" w:color="D31145"/>
         </w:pBdr>
         <w:rPr/>
       </w:pPr>
-      <w:bookmarkStart w:id="4" w:name="__RefHeading___Toc219_2288453424"/>
+      <w:bookmarkStart w:id="4" w:name="__RefHeading___Toc219_2535076536"/>
       <w:bookmarkEnd w:id="4"/>
       <w:r>
         <w:rPr>
-          <w:rFonts w:cs="Arial"/>
-          <w:b/>
-          <w:i w:val="false"/>
-          <w:color w:val="002516"/>
+          <w:rFonts w:cs="Arial Black" w:ascii="Arial Black" w:hAnsi="Arial Black"/>
+          <w:b w:val="false"/>
+          <w:i w:val="false"/>
+          <w:color w:val="000000"/>
           <w:sz w:val="28"/>
         </w:rPr>
         <w:t>3. What already exists</w:t>
@@ -1419,7 +1419,7 @@
       </w:pPr>
       <w:r>
         <w:rPr>
-          <w:rFonts w:cs="Arial"/>
+          <w:rFonts w:cs="Calibri"/>
           <w:b/>
           <w:i w:val="false"/>
           <w:color w:val="000000"/>
@@ -1435,10 +1435,10 @@
       </w:pPr>
       <w:r>
         <w:rPr>
-          <w:rFonts w:cs="Arial"/>
-          <w:b/>
-          <w:i w:val="false"/>
-          <w:color w:val="002516"/>
+          <w:rFonts w:cs="Calibri"/>
+          <w:b/>
+          <w:i w:val="false"/>
+          <w:color w:val="D31145"/>
           <w:sz w:val="20"/>
         </w:rPr>
         <w:t>NZALC Leadership Development System</w:t>
@@ -1451,7 +1451,7 @@
       </w:pPr>
       <w:r>
         <w:rPr>
-          <w:rFonts w:cs="Arial"/>
+          <w:rFonts w:cs="Calibri"/>
           <w:b w:val="false"/>
           <w:i w:val="false"/>
         </w:rPr>
@@ -1465,10 +1465,10 @@
       </w:pPr>
       <w:r>
         <w:rPr>
-          <w:rFonts w:cs="Arial"/>
-          <w:b/>
-          <w:i w:val="false"/>
-          <w:color w:val="002516"/>
+          <w:rFonts w:cs="Calibri"/>
+          <w:b/>
+          <w:i w:val="false"/>
+          <w:color w:val="D31145"/>
           <w:sz w:val="20"/>
         </w:rPr>
         <w:t>HPC Cognitive Conditioning (COGCON)</w:t>
@@ -1481,7 +1481,7 @@
       </w:pPr>
       <w:r>
         <w:rPr>
-          <w:rFonts w:cs="Arial"/>
+          <w:rFonts w:cs="Calibri"/>
           <w:b w:val="false"/>
           <w:i w:val="false"/>
         </w:rPr>
@@ -1495,7 +1495,7 @@
       </w:pPr>
       <w:r>
         <w:rPr>
-          <w:rFonts w:cs="Arial"/>
+          <w:rFonts w:cs="Calibri"/>
           <w:b/>
           <w:i w:val="false"/>
           <w:color w:val="000000"/>
@@ -1511,10 +1511,10 @@
       </w:pPr>
       <w:r>
         <w:rPr>
-          <w:rFonts w:cs="Arial"/>
-          <w:b/>
-          <w:i w:val="false"/>
-          <w:color w:val="002516"/>
+          <w:rFonts w:cs="Calibri"/>
+          <w:b/>
+          <w:i w:val="false"/>
+          <w:color w:val="D31145"/>
           <w:sz w:val="20"/>
         </w:rPr>
         <w:t>Army Psychology Services (APS), ILD and other stakeholders</w:t>
@@ -1527,7 +1527,7 @@
       </w:pPr>
       <w:r>
         <w:rPr>
-          <w:rFonts w:cs="Arial"/>
+          <w:rFonts w:cs="Calibri"/>
           <w:b w:val="false"/>
           <w:i w:val="false"/>
         </w:rPr>
@@ -1541,7 +1541,7 @@
       </w:pPr>
       <w:r>
         <w:rPr>
-          <w:rFonts w:cs="Arial"/>
+          <w:rFonts w:cs="Calibri"/>
           <w:b w:val="false"/>
           <w:i w:val="false"/>
         </w:rPr>
@@ -1555,7 +1555,7 @@
       </w:pPr>
       <w:r>
         <w:rPr>
-          <w:rFonts w:cs="Arial"/>
+          <w:rFonts w:cs="Calibri"/>
           <w:b w:val="false"/>
           <w:i w:val="false"/>
         </w:rPr>
@@ -1566,7 +1566,7 @@
       <w:pPr>
         <w:pStyle w:val="Normal"/>
         <w:pBdr>
-          <w:bottom w:val="single" w:sz="6" w:space="1" w:color="A89662"/>
+          <w:bottom w:val="single" w:sz="6" w:space="1" w:color="B3A650"/>
         </w:pBdr>
         <w:spacing w:before="200" w:after="200"/>
         <w:rPr/>
@@ -1579,18 +1579,18 @@
       <w:pPr>
         <w:pStyle w:val="Heading1"/>
         <w:pBdr>
-          <w:left w:val="single" w:sz="24" w:space="8" w:color="C62026"/>
+          <w:left w:val="single" w:sz="24" w:space="8" w:color="D31145"/>
         </w:pBdr>
         <w:rPr/>
       </w:pPr>
-      <w:bookmarkStart w:id="5" w:name="__RefHeading___Toc221_2288453424"/>
+      <w:bookmarkStart w:id="5" w:name="__RefHeading___Toc221_2535076536"/>
       <w:bookmarkEnd w:id="5"/>
       <w:r>
         <w:rPr>
-          <w:rFonts w:cs="Arial"/>
-          <w:b/>
-          <w:i w:val="false"/>
-          <w:color w:val="002516"/>
+          <w:rFonts w:cs="Arial Black" w:ascii="Arial Black" w:hAnsi="Arial Black"/>
+          <w:b w:val="false"/>
+          <w:i w:val="false"/>
+          <w:color w:val="000000"/>
           <w:sz w:val="28"/>
         </w:rPr>
         <w:t>4. Programme of work</w:t>
@@ -1603,7 +1603,7 @@
       </w:pPr>
       <w:r>
         <w:rPr>
-          <w:rFonts w:cs="Arial"/>
+          <w:rFonts w:cs="Calibri"/>
           <w:b w:val="false"/>
           <w:i w:val="false"/>
         </w:rPr>
@@ -1617,7 +1617,7 @@
       </w:pPr>
       <w:r>
         <w:rPr>
-          <w:rFonts w:cs="Arial"/>
+          <w:rFonts w:cs="Calibri"/>
           <w:b w:val="false"/>
           <w:i w:val="false"/>
         </w:rPr>
@@ -1631,7 +1631,7 @@
       </w:pPr>
       <w:r>
         <w:rPr>
-          <w:rFonts w:cs="Arial"/>
+          <w:rFonts w:cs="Calibri"/>
           <w:b/>
           <w:i w:val="false"/>
           <w:color w:val="000000"/>
@@ -1647,7 +1647,7 @@
       </w:pPr>
       <w:r>
         <w:rPr>
-          <w:rFonts w:cs="Arial"/>
+          <w:rFonts w:cs="Calibri"/>
           <w:b w:val="false"/>
           <w:i w:val="false"/>
         </w:rPr>
@@ -1661,7 +1661,7 @@
       </w:pPr>
       <w:r>
         <w:rPr>
-          <w:rFonts w:cs="Arial"/>
+          <w:rFonts w:cs="Calibri"/>
           <w:b/>
           <w:i w:val="false"/>
         </w:rPr>
@@ -1669,7 +1669,7 @@
       </w:r>
       <w:r>
         <w:rPr>
-          <w:rFonts w:cs="Arial"/>
+          <w:rFonts w:cs="Calibri"/>
           <w:b w:val="false"/>
           <w:i w:val="false"/>
         </w:rPr>
@@ -1683,7 +1683,7 @@
       </w:pPr>
       <w:r>
         <w:rPr>
-          <w:rFonts w:cs="Arial"/>
+          <w:rFonts w:cs="Calibri"/>
           <w:b/>
           <w:i w:val="false"/>
           <w:color w:val="000000"/>
@@ -1699,7 +1699,7 @@
       </w:pPr>
       <w:r>
         <w:rPr>
-          <w:rFonts w:cs="Arial"/>
+          <w:rFonts w:cs="Calibri"/>
           <w:b w:val="false"/>
           <w:i w:val="false"/>
         </w:rPr>
@@ -1719,23 +1719,23 @@
       </w:pPr>
       <w:r>
         <w:rPr>
-          <w:rFonts w:cs="Arial"/>
-          <w:b/>
-          <w:color w:val="C62026"/>
+          <w:rFonts w:cs="Calibri"/>
+          <w:b/>
+          <w:color w:val="D31145"/>
         </w:rPr>
         <w:t>•</w:t>
       </w:r>
       <w:r>
         <w:rPr>
-          <w:rFonts w:cs="Arial"/>
-          <w:b/>
-          <w:color w:val="C62026"/>
+          <w:rFonts w:cs="Calibri"/>
+          <w:b/>
+          <w:color w:val="D31145"/>
         </w:rPr>
         <w:tab/>
       </w:r>
       <w:r>
         <w:rPr>
-          <w:rFonts w:cs="Arial"/>
+          <w:rFonts w:cs="Calibri"/>
           <w:b w:val="false"/>
           <w:i w:val="false"/>
         </w:rPr>
@@ -1755,23 +1755,23 @@
       </w:pPr>
       <w:r>
         <w:rPr>
-          <w:rFonts w:cs="Arial"/>
-          <w:b/>
-          <w:color w:val="C62026"/>
+          <w:rFonts w:cs="Calibri"/>
+          <w:b/>
+          <w:color w:val="D31145"/>
         </w:rPr>
         <w:t>•</w:t>
       </w:r>
       <w:r>
         <w:rPr>
-          <w:rFonts w:cs="Arial"/>
-          <w:b/>
-          <w:color w:val="C62026"/>
+          <w:rFonts w:cs="Calibri"/>
+          <w:b/>
+          <w:color w:val="D31145"/>
         </w:rPr>
         <w:tab/>
       </w:r>
       <w:r>
         <w:rPr>
-          <w:rFonts w:cs="Arial"/>
+          <w:rFonts w:cs="Calibri"/>
           <w:b w:val="false"/>
           <w:i w:val="false"/>
         </w:rPr>
@@ -1791,23 +1791,23 @@
       </w:pPr>
       <w:r>
         <w:rPr>
-          <w:rFonts w:cs="Arial"/>
-          <w:b/>
-          <w:color w:val="C62026"/>
+          <w:rFonts w:cs="Calibri"/>
+          <w:b/>
+          <w:color w:val="D31145"/>
         </w:rPr>
         <w:t>•</w:t>
       </w:r>
       <w:r>
         <w:rPr>
-          <w:rFonts w:cs="Arial"/>
-          <w:b/>
-          <w:color w:val="C62026"/>
+          <w:rFonts w:cs="Calibri"/>
+          <w:b/>
+          <w:color w:val="D31145"/>
         </w:rPr>
         <w:tab/>
       </w:r>
       <w:r>
         <w:rPr>
-          <w:rFonts w:cs="Arial"/>
+          <w:rFonts w:cs="Calibri"/>
           <w:b w:val="false"/>
           <w:i w:val="false"/>
         </w:rPr>
@@ -1827,23 +1827,23 @@
       </w:pPr>
       <w:r>
         <w:rPr>
-          <w:rFonts w:cs="Arial"/>
-          <w:b/>
-          <w:color w:val="C62026"/>
+          <w:rFonts w:cs="Calibri"/>
+          <w:b/>
+          <w:color w:val="D31145"/>
         </w:rPr>
         <w:t>•</w:t>
       </w:r>
       <w:r>
         <w:rPr>
-          <w:rFonts w:cs="Arial"/>
-          <w:b/>
-          <w:color w:val="C62026"/>
+          <w:rFonts w:cs="Calibri"/>
+          <w:b/>
+          <w:color w:val="D31145"/>
         </w:rPr>
         <w:tab/>
       </w:r>
       <w:r>
         <w:rPr>
-          <w:rFonts w:cs="Arial"/>
+          <w:rFonts w:cs="Calibri"/>
           <w:b w:val="false"/>
           <w:i w:val="false"/>
         </w:rPr>
@@ -1863,23 +1863,23 @@
       </w:pPr>
       <w:r>
         <w:rPr>
-          <w:rFonts w:cs="Arial"/>
-          <w:b/>
-          <w:color w:val="C62026"/>
+          <w:rFonts w:cs="Calibri"/>
+          <w:b/>
+          <w:color w:val="D31145"/>
         </w:rPr>
         <w:t>•</w:t>
       </w:r>
       <w:r>
         <w:rPr>
-          <w:rFonts w:cs="Arial"/>
-          <w:b/>
-          <w:color w:val="C62026"/>
+          <w:rFonts w:cs="Calibri"/>
+          <w:b/>
+          <w:color w:val="D31145"/>
         </w:rPr>
         <w:tab/>
       </w:r>
       <w:r>
         <w:rPr>
-          <w:rFonts w:cs="Arial"/>
+          <w:rFonts w:cs="Calibri"/>
           <w:b w:val="false"/>
           <w:i w:val="false"/>
         </w:rPr>
@@ -1893,7 +1893,7 @@
       </w:pPr>
       <w:r>
         <w:rPr>
-          <w:rFonts w:cs="Arial"/>
+          <w:rFonts w:cs="Calibri"/>
           <w:b w:val="false"/>
           <w:i w:val="false"/>
         </w:rPr>
@@ -1907,7 +1907,7 @@
       </w:pPr>
       <w:r>
         <w:rPr>
-          <w:rFonts w:cs="Arial"/>
+          <w:rFonts w:cs="Calibri"/>
           <w:b/>
           <w:i w:val="false"/>
         </w:rPr>
@@ -1915,7 +1915,7 @@
       </w:r>
       <w:r>
         <w:rPr>
-          <w:rFonts w:cs="Arial"/>
+          <w:rFonts w:cs="Calibri"/>
           <w:b w:val="false"/>
           <w:i w:val="false"/>
         </w:rPr>
@@ -1929,7 +1929,7 @@
       </w:pPr>
       <w:r>
         <w:rPr>
-          <w:rFonts w:cs="Arial"/>
+          <w:rFonts w:cs="Calibri"/>
           <w:b/>
           <w:i w:val="false"/>
           <w:color w:val="000000"/>
@@ -1945,7 +1945,7 @@
       </w:pPr>
       <w:r>
         <w:rPr>
-          <w:rFonts w:cs="Arial"/>
+          <w:rFonts w:cs="Calibri"/>
           <w:b w:val="false"/>
           <w:i w:val="false"/>
         </w:rPr>
@@ -1959,7 +1959,7 @@
       </w:pPr>
       <w:r>
         <w:rPr>
-          <w:rFonts w:cs="Arial"/>
+          <w:rFonts w:cs="Calibri"/>
           <w:b w:val="false"/>
           <w:i w:val="false"/>
         </w:rPr>
@@ -1973,7 +1973,7 @@
       </w:pPr>
       <w:r>
         <w:rPr>
-          <w:rFonts w:cs="Arial"/>
+          <w:rFonts w:cs="Calibri"/>
           <w:b/>
           <w:i w:val="false"/>
         </w:rPr>
@@ -1981,7 +1981,7 @@
       </w:r>
       <w:r>
         <w:rPr>
-          <w:rFonts w:cs="Arial"/>
+          <w:rFonts w:cs="Calibri"/>
           <w:b w:val="false"/>
           <w:i w:val="false"/>
         </w:rPr>
@@ -1995,7 +1995,7 @@
       </w:pPr>
       <w:r>
         <w:rPr>
-          <w:rFonts w:cs="Arial"/>
+          <w:rFonts w:cs="Calibri"/>
           <w:b/>
           <w:i w:val="false"/>
           <w:color w:val="000000"/>
@@ -2011,7 +2011,7 @@
       </w:pPr>
       <w:r>
         <w:rPr>
-          <w:rFonts w:cs="Arial"/>
+          <w:rFonts w:cs="Calibri"/>
           <w:b w:val="false"/>
           <w:i w:val="false"/>
         </w:rPr>
@@ -2025,7 +2025,7 @@
       </w:pPr>
       <w:r>
         <w:rPr>
-          <w:rFonts w:cs="Arial"/>
+          <w:rFonts w:cs="Calibri"/>
           <w:b/>
           <w:i w:val="false"/>
         </w:rPr>
@@ -2033,7 +2033,7 @@
       </w:r>
       <w:r>
         <w:rPr>
-          <w:rFonts w:cs="Arial"/>
+          <w:rFonts w:cs="Calibri"/>
           <w:b w:val="false"/>
           <w:i w:val="false"/>
         </w:rPr>
@@ -2047,7 +2047,7 @@
       </w:pPr>
       <w:r>
         <w:rPr>
-          <w:rFonts w:cs="Arial"/>
+          <w:rFonts w:cs="Calibri"/>
           <w:b/>
           <w:i w:val="false"/>
           <w:color w:val="000000"/>
@@ -2063,7 +2063,7 @@
       </w:pPr>
       <w:r>
         <w:rPr>
-          <w:rFonts w:cs="Arial"/>
+          <w:rFonts w:cs="Calibri"/>
           <w:b w:val="false"/>
           <w:i w:val="false"/>
         </w:rPr>
@@ -2077,7 +2077,7 @@
       </w:pPr>
       <w:r>
         <w:rPr>
-          <w:rFonts w:cs="Arial"/>
+          <w:rFonts w:cs="Calibri"/>
           <w:b w:val="false"/>
           <w:i w:val="false"/>
         </w:rPr>
@@ -2091,7 +2091,7 @@
       </w:pPr>
       <w:r>
         <w:rPr>
-          <w:rFonts w:cs="Arial"/>
+          <w:rFonts w:cs="Calibri"/>
           <w:b/>
           <w:i w:val="false"/>
         </w:rPr>
@@ -2099,7 +2099,7 @@
       </w:r>
       <w:r>
         <w:rPr>
-          <w:rFonts w:cs="Arial"/>
+          <w:rFonts w:cs="Calibri"/>
           <w:b w:val="false"/>
           <w:i w:val="false"/>
         </w:rPr>
@@ -2110,7 +2110,7 @@
       <w:pPr>
         <w:pStyle w:val="Normal"/>
         <w:pBdr>
-          <w:bottom w:val="single" w:sz="6" w:space="1" w:color="A89662"/>
+          <w:bottom w:val="single" w:sz="6" w:space="1" w:color="B3A650"/>
         </w:pBdr>
         <w:spacing w:before="200" w:after="200"/>
         <w:rPr/>
@@ -2123,18 +2123,18 @@
       <w:pPr>
         <w:pStyle w:val="Heading1"/>
         <w:pBdr>
-          <w:left w:val="single" w:sz="24" w:space="8" w:color="C62026"/>
+          <w:left w:val="single" w:sz="24" w:space="8" w:color="D31145"/>
         </w:pBdr>
         <w:rPr/>
       </w:pPr>
-      <w:bookmarkStart w:id="6" w:name="__RefHeading___Toc223_2288453424"/>
+      <w:bookmarkStart w:id="6" w:name="__RefHeading___Toc223_2535076536"/>
       <w:bookmarkEnd w:id="6"/>
       <w:r>
         <w:rPr>
-          <w:rFonts w:cs="Arial"/>
-          <w:b/>
-          <w:i w:val="false"/>
-          <w:color w:val="002516"/>
+          <w:rFonts w:cs="Arial Black" w:ascii="Arial Black" w:hAnsi="Arial Black"/>
+          <w:b w:val="false"/>
+          <w:i w:val="false"/>
+          <w:color w:val="000000"/>
           <w:sz w:val="28"/>
         </w:rPr>
         <w:t>5. Recommendations</w:t>
@@ -2147,7 +2147,7 @@
       </w:pPr>
       <w:r>
         <w:rPr>
-          <w:rFonts w:cs="Arial"/>
+          <w:rFonts w:cs="Calibri"/>
           <w:b w:val="false"/>
           <w:i w:val="false"/>
         </w:rPr>
@@ -2167,7 +2167,7 @@
       </w:pPr>
       <w:r>
         <w:rPr>
-          <w:rFonts w:cs="Arial"/>
+          <w:rFonts w:cs="Calibri"/>
           <w:b w:val="false"/>
         </w:rPr>
         <w:t>1.</w:t>
@@ -2175,7 +2175,7 @@
       </w:r>
       <w:r>
         <w:rPr>
-          <w:rFonts w:cs="Arial"/>
+          <w:rFonts w:cs="Calibri"/>
           <w:b/>
           <w:i w:val="false"/>
         </w:rPr>
@@ -2183,7 +2183,7 @@
       </w:r>
       <w:r>
         <w:rPr>
-          <w:rFonts w:cs="Arial"/>
+          <w:rFonts w:cs="Calibri"/>
           <w:b w:val="false"/>
           <w:i w:val="false"/>
         </w:rPr>
@@ -2203,7 +2203,7 @@
       </w:pPr>
       <w:r>
         <w:rPr>
-          <w:rFonts w:cs="Arial"/>
+          <w:rFonts w:cs="Calibri"/>
           <w:b w:val="false"/>
         </w:rPr>
         <w:t>2.</w:t>
@@ -2211,7 +2211,7 @@
       </w:r>
       <w:r>
         <w:rPr>
-          <w:rFonts w:cs="Arial"/>
+          <w:rFonts w:cs="Calibri"/>
           <w:b/>
           <w:i w:val="false"/>
         </w:rPr>
@@ -2219,7 +2219,7 @@
       </w:r>
       <w:r>
         <w:rPr>
-          <w:rFonts w:cs="Arial"/>
+          <w:rFonts w:cs="Calibri"/>
           <w:b w:val="false"/>
           <w:i w:val="false"/>
         </w:rPr>
@@ -2239,7 +2239,7 @@
       </w:pPr>
       <w:r>
         <w:rPr>
-          <w:rFonts w:cs="Arial"/>
+          <w:rFonts w:cs="Calibri"/>
           <w:b w:val="false"/>
         </w:rPr>
         <w:t>3.</w:t>
@@ -2247,7 +2247,7 @@
       </w:r>
       <w:r>
         <w:rPr>
-          <w:rFonts w:cs="Arial"/>
+          <w:rFonts w:cs="Calibri"/>
           <w:b/>
           <w:i w:val="false"/>
         </w:rPr>
@@ -2255,7 +2255,7 @@
       </w:r>
       <w:r>
         <w:rPr>
-          <w:rFonts w:cs="Arial"/>
+          <w:rFonts w:cs="Calibri"/>
           <w:b w:val="false"/>
           <w:i w:val="false"/>
         </w:rPr>
@@ -2275,7 +2275,7 @@
       </w:pPr>
       <w:r>
         <w:rPr>
-          <w:rFonts w:cs="Arial"/>
+          <w:rFonts w:cs="Calibri"/>
           <w:b w:val="false"/>
         </w:rPr>
         <w:t>4.</w:t>
@@ -2283,7 +2283,7 @@
       </w:r>
       <w:r>
         <w:rPr>
-          <w:rFonts w:cs="Arial"/>
+          <w:rFonts w:cs="Calibri"/>
           <w:b/>
           <w:i w:val="false"/>
         </w:rPr>
@@ -2291,7 +2291,7 @@
       </w:r>
       <w:r>
         <w:rPr>
-          <w:rFonts w:cs="Arial"/>
+          <w:rFonts w:cs="Calibri"/>
           <w:b w:val="false"/>
           <w:i w:val="false"/>
         </w:rPr>
@@ -2311,7 +2311,7 @@
       </w:pPr>
       <w:r>
         <w:rPr>
-          <w:rFonts w:cs="Arial"/>
+          <w:rFonts w:cs="Calibri"/>
           <w:b w:val="false"/>
         </w:rPr>
         <w:t>5.</w:t>
@@ -2319,7 +2319,7 @@
       </w:r>
       <w:r>
         <w:rPr>
-          <w:rFonts w:cs="Arial"/>
+          <w:rFonts w:cs="Calibri"/>
           <w:b/>
           <w:i w:val="false"/>
         </w:rPr>
@@ -2327,7 +2327,7 @@
       </w:r>
       <w:r>
         <w:rPr>
-          <w:rFonts w:cs="Arial"/>
+          <w:rFonts w:cs="Calibri"/>
           <w:b w:val="false"/>
           <w:i w:val="false"/>
         </w:rPr>
@@ -2377,7 +2377,7 @@
     </w:pPr>
     <w:r>
       <w:rPr>
-        <w:rFonts w:cs="Arial"/>
+        <w:rFonts w:cs="Calibri"/>
         <w:b/>
         <w:color w:val="000000"/>
         <w:sz w:val="20"/>
@@ -2398,7 +2398,7 @@
     </w:pPr>
     <w:r>
       <w:rPr>
-        <w:rFonts w:cs="Arial"/>
+        <w:rFonts w:cs="Calibri"/>
         <w:b w:val="false"/>
         <w:color w:val="000000"/>
         <w:sz w:val="17"/>
@@ -2411,7 +2411,7 @@
     </w:r>
     <w:r>
       <w:rPr>
-        <w:rFonts w:cs="Arial"/>
+        <w:rFonts w:cs="Calibri"/>
         <w:sz w:val="17"/>
       </w:rPr>
       <w:fldChar w:fldCharType="begin"/>
@@ -2419,34 +2419,34 @@
     <w:r>
       <w:rPr>
         <w:sz w:val="17"/>
-        <w:rFonts w:cs="Arial"/>
+        <w:rFonts w:cs="Calibri"/>
       </w:rPr>
       <w:instrText xml:space="preserve"> PAGE </w:instrText>
     </w:r>
     <w:r>
       <w:rPr>
         <w:sz w:val="17"/>
-        <w:rFonts w:cs="Arial"/>
+        <w:rFonts w:cs="Calibri"/>
       </w:rPr>
       <w:fldChar w:fldCharType="separate"/>
     </w:r>
     <w:r>
       <w:rPr>
         <w:sz w:val="17"/>
-        <w:rFonts w:cs="Arial"/>
+        <w:rFonts w:cs="Calibri"/>
       </w:rPr>
       <w:t>2</w:t>
     </w:r>
     <w:r>
       <w:rPr>
         <w:sz w:val="17"/>
-        <w:rFonts w:cs="Arial"/>
+        <w:rFonts w:cs="Calibri"/>
       </w:rPr>
       <w:fldChar w:fldCharType="end"/>
     </w:r>
     <w:r>
       <w:rPr>
-        <w:rFonts w:cs="Arial"/>
+        <w:rFonts w:cs="Calibri"/>
         <w:b w:val="false"/>
         <w:color w:val="000000"/>
         <w:sz w:val="17"/>
@@ -2455,7 +2455,7 @@
     </w:r>
     <w:r>
       <w:rPr>
-        <w:rFonts w:cs="Arial"/>
+        <w:rFonts w:cs="Calibri"/>
         <w:sz w:val="17"/>
       </w:rPr>
       <w:fldChar w:fldCharType="begin"/>
@@ -2463,28 +2463,28 @@
     <w:r>
       <w:rPr>
         <w:sz w:val="17"/>
-        <w:rFonts w:cs="Arial"/>
+        <w:rFonts w:cs="Calibri"/>
       </w:rPr>
       <w:instrText xml:space="preserve"> NUMPAGES </w:instrText>
     </w:r>
     <w:r>
       <w:rPr>
         <w:sz w:val="17"/>
-        <w:rFonts w:cs="Arial"/>
+        <w:rFonts w:cs="Calibri"/>
       </w:rPr>
       <w:fldChar w:fldCharType="separate"/>
     </w:r>
     <w:r>
       <w:rPr>
         <w:sz w:val="17"/>
-        <w:rFonts w:cs="Arial"/>
+        <w:rFonts w:cs="Calibri"/>
       </w:rPr>
       <w:t>8</w:t>
     </w:r>
     <w:r>
       <w:rPr>
         <w:sz w:val="17"/>
-        <w:rFonts w:cs="Arial"/>
+        <w:rFonts w:cs="Calibri"/>
       </w:rPr>
       <w:fldChar w:fldCharType="end"/>
     </w:r>
@@ -2503,7 +2503,7 @@
     </w:pPr>
     <w:r>
       <w:rPr>
-        <w:rFonts w:cs="Arial"/>
+        <w:rFonts w:cs="Calibri"/>
         <w:b/>
         <w:color w:val="000000"/>
         <w:sz w:val="20"/>
@@ -2539,7 +2539,7 @@
     </w:pPr>
     <w:r>
       <w:rPr>
-        <w:rFonts w:cs="Arial"/>
+        <w:rFonts w:cs="Calibri"/>
         <w:b/>
         <w:color w:val="000000"/>
         <w:sz w:val="20"/>
@@ -2560,7 +2560,7 @@
     </w:pPr>
     <w:r>
       <w:rPr>
-        <w:rFonts w:cs="Arial"/>
+        <w:rFonts w:cs="Calibri"/>
         <w:b w:val="false"/>
         <w:color w:val="000000"/>
         <w:sz w:val="17"/>
@@ -2573,7 +2573,7 @@
     </w:r>
     <w:r>
       <w:rPr>
-        <w:rFonts w:cs="Arial"/>
+        <w:rFonts w:cs="Calibri"/>
         <w:sz w:val="17"/>
       </w:rPr>
       <w:fldChar w:fldCharType="begin"/>
@@ -2581,34 +2581,34 @@
     <w:r>
       <w:rPr>
         <w:sz w:val="17"/>
-        <w:rFonts w:cs="Arial"/>
+        <w:rFonts w:cs="Calibri"/>
       </w:rPr>
       <w:instrText xml:space="preserve"> PAGE </w:instrText>
     </w:r>
     <w:r>
       <w:rPr>
         <w:sz w:val="17"/>
-        <w:rFonts w:cs="Arial"/>
+        <w:rFonts w:cs="Calibri"/>
       </w:rPr>
       <w:fldChar w:fldCharType="separate"/>
     </w:r>
     <w:r>
       <w:rPr>
         <w:sz w:val="17"/>
-        <w:rFonts w:cs="Arial"/>
+        <w:rFonts w:cs="Calibri"/>
       </w:rPr>
       <w:t>3</w:t>
     </w:r>
     <w:r>
       <w:rPr>
         <w:sz w:val="17"/>
-        <w:rFonts w:cs="Arial"/>
+        <w:rFonts w:cs="Calibri"/>
       </w:rPr>
       <w:fldChar w:fldCharType="end"/>
     </w:r>
     <w:r>
       <w:rPr>
-        <w:rFonts w:cs="Arial"/>
+        <w:rFonts w:cs="Calibri"/>
         <w:b w:val="false"/>
         <w:color w:val="000000"/>
         <w:sz w:val="17"/>
@@ -2617,7 +2617,7 @@
     </w:r>
     <w:r>
       <w:rPr>
-        <w:rFonts w:cs="Arial"/>
+        <w:rFonts w:cs="Calibri"/>
         <w:sz w:val="17"/>
       </w:rPr>
       <w:fldChar w:fldCharType="begin"/>
@@ -2625,28 +2625,28 @@
     <w:r>
       <w:rPr>
         <w:sz w:val="17"/>
-        <w:rFonts w:cs="Arial"/>
+        <w:rFonts w:cs="Calibri"/>
       </w:rPr>
       <w:instrText xml:space="preserve"> NUMPAGES </w:instrText>
     </w:r>
     <w:r>
       <w:rPr>
         <w:sz w:val="17"/>
-        <w:rFonts w:cs="Arial"/>
+        <w:rFonts w:cs="Calibri"/>
       </w:rPr>
       <w:fldChar w:fldCharType="separate"/>
     </w:r>
     <w:r>
       <w:rPr>
         <w:sz w:val="17"/>
-        <w:rFonts w:cs="Arial"/>
+        <w:rFonts w:cs="Calibri"/>
       </w:rPr>
       <w:t>8</w:t>
     </w:r>
     <w:r>
       <w:rPr>
         <w:sz w:val="17"/>
-        <w:rFonts w:cs="Arial"/>
+        <w:rFonts w:cs="Calibri"/>
       </w:rPr>
       <w:fldChar w:fldCharType="end"/>
     </w:r>
@@ -2685,7 +2685,7 @@
     </w:pPr>
     <w:r>
       <w:rPr>
-        <w:rFonts w:cs="Arial"/>
+        <w:rFonts w:cs="Calibri"/>
         <w:b/>
         <w:color w:val="000000"/>
         <w:sz w:val="20"/>
@@ -2706,7 +2706,7 @@
     </w:pPr>
     <w:r>
       <w:rPr>
-        <w:rFonts w:cs="Arial"/>
+        <w:rFonts w:cs="Calibri"/>
         <w:b w:val="false"/>
         <w:color w:val="000000"/>
         <w:sz w:val="17"/>
@@ -2719,7 +2719,7 @@
     </w:r>
     <w:r>
       <w:rPr>
-        <w:rFonts w:cs="Arial"/>
+        <w:rFonts w:cs="Calibri"/>
         <w:sz w:val="17"/>
       </w:rPr>
       <w:fldChar w:fldCharType="begin"/>
@@ -2727,34 +2727,34 @@
     <w:r>
       <w:rPr>
         <w:sz w:val="17"/>
-        <w:rFonts w:cs="Arial"/>
+        <w:rFonts w:cs="Calibri"/>
       </w:rPr>
       <w:instrText xml:space="preserve"> PAGE </w:instrText>
     </w:r>
     <w:r>
       <w:rPr>
         <w:sz w:val="17"/>
-        <w:rFonts w:cs="Arial"/>
+        <w:rFonts w:cs="Calibri"/>
       </w:rPr>
       <w:fldChar w:fldCharType="separate"/>
     </w:r>
     <w:r>
       <w:rPr>
         <w:sz w:val="17"/>
-        <w:rFonts w:cs="Arial"/>
+        <w:rFonts w:cs="Calibri"/>
       </w:rPr>
       <w:t>8</w:t>
     </w:r>
     <w:r>
       <w:rPr>
         <w:sz w:val="17"/>
-        <w:rFonts w:cs="Arial"/>
+        <w:rFonts w:cs="Calibri"/>
       </w:rPr>
       <w:fldChar w:fldCharType="end"/>
     </w:r>
     <w:r>
       <w:rPr>
-        <w:rFonts w:cs="Arial"/>
+        <w:rFonts w:cs="Calibri"/>
         <w:b w:val="false"/>
         <w:color w:val="000000"/>
         <w:sz w:val="17"/>
@@ -2763,7 +2763,7 @@
     </w:r>
     <w:r>
       <w:rPr>
-        <w:rFonts w:cs="Arial"/>
+        <w:rFonts w:cs="Calibri"/>
         <w:sz w:val="17"/>
       </w:rPr>
       <w:fldChar w:fldCharType="begin"/>
@@ -2771,28 +2771,28 @@
     <w:r>
       <w:rPr>
         <w:sz w:val="17"/>
-        <w:rFonts w:cs="Arial"/>
+        <w:rFonts w:cs="Calibri"/>
       </w:rPr>
       <w:instrText xml:space="preserve"> NUMPAGES </w:instrText>
     </w:r>
     <w:r>
       <w:rPr>
         <w:sz w:val="17"/>
-        <w:rFonts w:cs="Arial"/>
+        <w:rFonts w:cs="Calibri"/>
       </w:rPr>
       <w:fldChar w:fldCharType="separate"/>
     </w:r>
     <w:r>
       <w:rPr>
         <w:sz w:val="17"/>
-        <w:rFonts w:cs="Arial"/>
+        <w:rFonts w:cs="Calibri"/>
       </w:rPr>
       <w:t>8</w:t>
     </w:r>
     <w:r>
       <w:rPr>
         <w:sz w:val="17"/>
-        <w:rFonts w:cs="Arial"/>
+        <w:rFonts w:cs="Calibri"/>
       </w:rPr>
       <w:fldChar w:fldCharType="end"/>
     </w:r>
@@ -2831,7 +2831,7 @@
     </w:pPr>
     <w:r>
       <w:rPr>
-        <w:rFonts w:cs="Arial"/>
+        <w:rFonts w:cs="Calibri"/>
         <w:b/>
         <w:color w:val="000000"/>
         <w:sz w:val="20"/>
@@ -2853,7 +2853,7 @@
     </w:pPr>
     <w:r>
       <w:rPr>
-        <w:rFonts w:cs="Arial"/>
+        <w:rFonts w:cs="Calibri"/>
         <w:b/>
         <w:color w:val="000000"/>
         <w:sz w:val="20"/>
@@ -2875,7 +2875,7 @@
     </w:pPr>
     <w:r>
       <w:rPr>
-        <w:rFonts w:cs="Arial"/>
+        <w:rFonts w:cs="Calibri"/>
         <w:b/>
         <w:color w:val="000000"/>
         <w:sz w:val="20"/>
@@ -2903,7 +2903,7 @@
     </w:pPr>
     <w:r>
       <w:rPr>
-        <w:rFonts w:cs="Arial"/>
+        <w:rFonts w:cs="Calibri"/>
         <w:b/>
         <w:color w:val="000000"/>
         <w:sz w:val="20"/>
@@ -2925,7 +2925,7 @@
   <w:docDefaults>
     <w:rPrDefault>
       <w:rPr>
-        <w:rFonts w:ascii="Arial" w:hAnsi="Arial" w:eastAsia="WenQuanYi Zen Hei" w:cs="Arial"/>
+        <w:rFonts w:ascii="Calibri" w:hAnsi="Calibri" w:eastAsia="WenQuanYi Zen Hei" w:cs="Calibri"/>
         <w:sz w:val="22"/>
         <w:szCs w:val="22"/>
         <w:lang w:val="en-US" w:eastAsia="en-US" w:bidi="ar-SA"/>
@@ -3083,14 +3083,14 @@
     <w:pPr>
       <w:widowControl/>
       <w:bidi w:val="0"/>
-      <w:spacing w:lineRule="auto" w:line="288" w:before="0" w:after="120"/>
+      <w:spacing w:lineRule="auto" w:line="268" w:before="0" w:after="120"/>
       <w:jc w:val="left"/>
     </w:pPr>
     <w:rPr>
-      <w:rFonts w:ascii="Arial" w:hAnsi="Arial" w:cs="Arial" w:eastAsia="WenQuanYi Zen Hei"/>
+      <w:rFonts w:ascii="Calibri" w:hAnsi="Calibri" w:cs="Calibri" w:eastAsia="WenQuanYi Zen Hei"/>
       <w:color w:val="000000"/>
       <w:kern w:val="0"/>
-      <w:sz w:val="21"/>
+      <w:sz w:val="22"/>
       <w:szCs w:val="22"/>
       <w:lang w:val="en-US" w:eastAsia="en-US" w:bidi="ar-SA"/>
     </w:rPr>
@@ -3109,9 +3109,9 @@
       <w:outlineLvl w:val="0"/>
     </w:pPr>
     <w:rPr>
-      <w:rFonts w:ascii="Arial" w:hAnsi="Arial" w:cs="Arial"/>
-      <w:b/>
-      <w:color w:val="002516"/>
+      <w:rFonts w:ascii="Calibri" w:hAnsi="Calibri" w:cs="Calibri"/>
+      <w:b w:val="false"/>
+      <w:color w:val="000000"/>
       <w:sz w:val="28"/>
     </w:rPr>
   </w:style>
@@ -3130,7 +3130,7 @@
       <w:outlineLvl w:val="1"/>
     </w:pPr>
     <w:rPr>
-      <w:rFonts w:ascii="Arial" w:hAnsi="Arial" w:cs="Arial"/>
+      <w:rFonts w:ascii="Calibri" w:hAnsi="Calibri" w:cs="Calibri"/>
       <w:b/>
       <w:color w:val="000000"/>
       <w:sz w:val="22"/>

</xml_diff>

<commit_message>
Replace the Army logo with the approved primary artwork
The file in use had the descriptor above the wordmark, carried macrons,
and used a brick red of A53332 rather than Army Red D31145, which the
guidelines list as incorrect use. Extract the primary logo from the
guidelines at 600dpi with an alpha channel, rather than recreating it,
and correct the placement aspect from 4.14 to 4.38 across the paper, the
model page and the identity board. Cover registers rebalanced for the
shorter logo. Previous file kept as nz-army-logo-superseded.png.

Co-Authored-By: Claude Fable 5 <noreply@anthropic.com>
Claude-Session: https://claude.ai/code/session_01YLo1WfwUDkbwfJEF3ZNVbB
</commit_message>
<xml_diff>
--- a/output/combat-mindset-way-forward.docx
+++ b/output/combat-mindset-way-forward.docx
@@ -5,14 +5,14 @@
     <w:p>
       <w:pPr>
         <w:pStyle w:val="Normal"/>
-        <w:spacing w:before="0" w:after="4400"/>
+        <w:spacing w:before="0" w:after="4620"/>
         <w:rPr/>
       </w:pPr>
       <w:r>
         <w:rPr/>
         <w:drawing>
           <wp:inline distT="0" distB="0" distL="0" distR="0">
-            <wp:extent cx="2160270" cy="521335"/>
+            <wp:extent cx="2160270" cy="493395"/>
             <wp:effectExtent l="0" t="0" r="0" b="0"/>
             <wp:docPr id="1" name="Picture 1" descr=""/>
             <wp:cNvGraphicFramePr>
@@ -36,7 +36,7 @@
                   <pic:spPr bwMode="auto">
                     <a:xfrm>
                       <a:off x="0" y="0"/>
-                      <a:ext cx="2160270" cy="521335"/>
+                      <a:ext cx="2160270" cy="493395"/>
                     </a:xfrm>
                     <a:prstGeom prst="rect">
                       <a:avLst/>
@@ -102,7 +102,7 @@
     <w:p>
       <w:pPr>
         <w:pStyle w:val="Normal"/>
-        <w:spacing w:before="0" w:after="4500"/>
+        <w:spacing w:before="0" w:after="4580"/>
         <w:rPr/>
       </w:pPr>
       <w:r>
@@ -298,7 +298,7 @@
             </w:rPr>
             <w:fldChar w:fldCharType="separate"/>
           </w:r>
-          <w:hyperlink w:anchor="__RefHeading___Toc211_2535076536">
+          <w:hyperlink w:anchor="__RefHeading___Toc211_1130615341">
             <w:r>
               <w:rPr>
                 <w:webHidden/>
@@ -325,7 +325,7 @@
             </w:tabs>
             <w:rPr/>
           </w:pPr>
-          <w:hyperlink w:anchor="__RefHeading___Toc213_2535076536">
+          <w:hyperlink w:anchor="__RefHeading___Toc213_1130615341">
             <w:r>
               <w:rPr>
                 <w:webHidden/>
@@ -352,7 +352,7 @@
             </w:tabs>
             <w:rPr/>
           </w:pPr>
-          <w:hyperlink w:anchor="__RefHeading___Toc215_2535076536">
+          <w:hyperlink w:anchor="__RefHeading___Toc215_1130615341">
             <w:r>
               <w:rPr>
                 <w:webHidden/>
@@ -379,7 +379,7 @@
             </w:tabs>
             <w:rPr/>
           </w:pPr>
-          <w:hyperlink w:anchor="__RefHeading___Toc217_2535076536">
+          <w:hyperlink w:anchor="__RefHeading___Toc217_1130615341">
             <w:r>
               <w:rPr>
                 <w:webHidden/>
@@ -406,7 +406,7 @@
             </w:tabs>
             <w:rPr/>
           </w:pPr>
-          <w:hyperlink w:anchor="__RefHeading___Toc219_2535076536">
+          <w:hyperlink w:anchor="__RefHeading___Toc219_1130615341">
             <w:r>
               <w:rPr>
                 <w:webHidden/>
@@ -433,7 +433,7 @@
             </w:tabs>
             <w:rPr/>
           </w:pPr>
-          <w:hyperlink w:anchor="__RefHeading___Toc221_2535076536">
+          <w:hyperlink w:anchor="__RefHeading___Toc221_1130615341">
             <w:r>
               <w:rPr>
                 <w:webHidden/>
@@ -460,7 +460,7 @@
             </w:tabs>
             <w:rPr/>
           </w:pPr>
-          <w:hyperlink w:anchor="__RefHeading___Toc223_2535076536">
+          <w:hyperlink w:anchor="__RefHeading___Toc223_1130615341">
             <w:r>
               <w:rPr>
                 <w:webHidden/>
@@ -515,7 +515,7 @@
         <w:spacing w:before="0" w:after="160"/>
         <w:rPr/>
       </w:pPr>
-      <w:bookmarkStart w:id="0" w:name="__RefHeading___Toc211_2535076536"/>
+      <w:bookmarkStart w:id="0" w:name="__RefHeading___Toc211_1130615341"/>
       <w:bookmarkEnd w:id="0"/>
       <w:r>
         <w:rPr>
@@ -597,7 +597,7 @@
         </w:pBdr>
         <w:rPr/>
       </w:pPr>
-      <w:bookmarkStart w:id="1" w:name="__RefHeading___Toc213_2535076536"/>
+      <w:bookmarkStart w:id="1" w:name="__RefHeading___Toc213_1130615341"/>
       <w:bookmarkEnd w:id="1"/>
       <w:r>
         <w:rPr>
@@ -673,7 +673,7 @@
         </w:pBdr>
         <w:rPr/>
       </w:pPr>
-      <w:bookmarkStart w:id="2" w:name="__RefHeading___Toc215_2535076536"/>
+      <w:bookmarkStart w:id="2" w:name="__RefHeading___Toc215_1130615341"/>
       <w:bookmarkEnd w:id="2"/>
       <w:r>
         <w:rPr>
@@ -781,7 +781,7 @@
         </w:pBdr>
         <w:rPr/>
       </w:pPr>
-      <w:bookmarkStart w:id="3" w:name="__RefHeading___Toc217_2535076536"/>
+      <w:bookmarkStart w:id="3" w:name="__RefHeading___Toc217_1130615341"/>
       <w:bookmarkEnd w:id="3"/>
       <w:r>
         <w:rPr>
@@ -1399,7 +1399,7 @@
         </w:pBdr>
         <w:rPr/>
       </w:pPr>
-      <w:bookmarkStart w:id="4" w:name="__RefHeading___Toc219_2535076536"/>
+      <w:bookmarkStart w:id="4" w:name="__RefHeading___Toc219_1130615341"/>
       <w:bookmarkEnd w:id="4"/>
       <w:r>
         <w:rPr>
@@ -1583,7 +1583,7 @@
         </w:pBdr>
         <w:rPr/>
       </w:pPr>
-      <w:bookmarkStart w:id="5" w:name="__RefHeading___Toc221_2535076536"/>
+      <w:bookmarkStart w:id="5" w:name="__RefHeading___Toc221_1130615341"/>
       <w:bookmarkEnd w:id="5"/>
       <w:r>
         <w:rPr>
@@ -2127,7 +2127,7 @@
         </w:pBdr>
         <w:rPr/>
       </w:pPr>
-      <w:bookmarkStart w:id="6" w:name="__RefHeading___Toc223_2535076536"/>
+      <w:bookmarkStart w:id="6" w:name="__RefHeading___Toc223_1130615341"/>
       <w:bookmarkEnd w:id="6"/>
       <w:r>
         <w:rPr>

</xml_diff>

<commit_message>
Remove the emblem family from the model page
The identity system permits no freestanding brand mark, badge or symbol.
The three shield emblems inside the cards were the last of them, so they
go, along with the SVG generator and the now unused imports that served
only them. The cards carry their meaning through typography, hierarchy
and the published palette alone.

Co-Authored-By: Claude Fable 5 <noreply@anthropic.com>
Claude-Session: https://claude.ai/code/session_01YLo1WfwUDkbwfJEF3ZNVbB
</commit_message>
<xml_diff>
--- a/output/combat-mindset-way-forward.docx
+++ b/output/combat-mindset-way-forward.docx
@@ -363,7 +363,7 @@
             </w:rPr>
             <w:fldChar w:fldCharType="separate"/>
           </w:r>
-          <w:hyperlink w:anchor="__RefHeading___Toc220_801138078">
+          <w:hyperlink w:anchor="__RefHeading___Toc220_1018303087">
             <w:r>
               <w:rPr>
                 <w:webHidden/>
@@ -390,7 +390,7 @@
             </w:tabs>
             <w:rPr/>
           </w:pPr>
-          <w:hyperlink w:anchor="__RefHeading___Toc222_801138078">
+          <w:hyperlink w:anchor="__RefHeading___Toc222_1018303087">
             <w:r>
               <w:rPr>
                 <w:webHidden/>
@@ -417,7 +417,7 @@
             </w:tabs>
             <w:rPr/>
           </w:pPr>
-          <w:hyperlink w:anchor="__RefHeading___Toc224_801138078">
+          <w:hyperlink w:anchor="__RefHeading___Toc224_1018303087">
             <w:r>
               <w:rPr>
                 <w:webHidden/>
@@ -444,7 +444,7 @@
             </w:tabs>
             <w:rPr/>
           </w:pPr>
-          <w:hyperlink w:anchor="__RefHeading___Toc226_801138078">
+          <w:hyperlink w:anchor="__RefHeading___Toc226_1018303087">
             <w:r>
               <w:rPr>
                 <w:webHidden/>
@@ -471,7 +471,7 @@
             </w:tabs>
             <w:rPr/>
           </w:pPr>
-          <w:hyperlink w:anchor="__RefHeading___Toc228_801138078">
+          <w:hyperlink w:anchor="__RefHeading___Toc228_1018303087">
             <w:r>
               <w:rPr>
                 <w:webHidden/>
@@ -498,7 +498,7 @@
             </w:tabs>
             <w:rPr/>
           </w:pPr>
-          <w:hyperlink w:anchor="__RefHeading___Toc230_801138078">
+          <w:hyperlink w:anchor="__RefHeading___Toc230_1018303087">
             <w:r>
               <w:rPr>
                 <w:webHidden/>
@@ -525,7 +525,7 @@
             </w:tabs>
             <w:rPr/>
           </w:pPr>
-          <w:hyperlink w:anchor="__RefHeading___Toc232_801138078">
+          <w:hyperlink w:anchor="__RefHeading___Toc232_1018303087">
             <w:r>
               <w:rPr>
                 <w:webHidden/>
@@ -580,7 +580,7 @@
         <w:spacing w:before="0" w:after="160"/>
         <w:rPr/>
       </w:pPr>
-      <w:bookmarkStart w:id="0" w:name="__RefHeading___Toc220_801138078"/>
+      <w:bookmarkStart w:id="0" w:name="__RefHeading___Toc220_1018303087"/>
       <w:bookmarkEnd w:id="0"/>
       <w:r>
         <w:rPr>
@@ -662,7 +662,7 @@
         </w:pBdr>
         <w:rPr/>
       </w:pPr>
-      <w:bookmarkStart w:id="1" w:name="__RefHeading___Toc222_801138078"/>
+      <w:bookmarkStart w:id="1" w:name="__RefHeading___Toc222_1018303087"/>
       <w:bookmarkEnd w:id="1"/>
       <w:r>
         <w:rPr>
@@ -735,7 +735,7 @@
         </w:pBdr>
         <w:rPr/>
       </w:pPr>
-      <w:bookmarkStart w:id="2" w:name="__RefHeading___Toc224_801138078"/>
+      <w:bookmarkStart w:id="2" w:name="__RefHeading___Toc224_1018303087"/>
       <w:bookmarkEnd w:id="2"/>
       <w:r>
         <w:rPr>
@@ -840,7 +840,7 @@
         </w:pBdr>
         <w:rPr/>
       </w:pPr>
-      <w:bookmarkStart w:id="3" w:name="__RefHeading___Toc226_801138078"/>
+      <w:bookmarkStart w:id="3" w:name="__RefHeading___Toc226_1018303087"/>
       <w:bookmarkEnd w:id="3"/>
       <w:r>
         <w:rPr>
@@ -1455,7 +1455,7 @@
         </w:pBdr>
         <w:rPr/>
       </w:pPr>
-      <w:bookmarkStart w:id="4" w:name="__RefHeading___Toc228_801138078"/>
+      <w:bookmarkStart w:id="4" w:name="__RefHeading___Toc228_1018303087"/>
       <w:bookmarkEnd w:id="4"/>
       <w:r>
         <w:rPr>
@@ -1636,7 +1636,7 @@
         </w:pBdr>
         <w:rPr/>
       </w:pPr>
-      <w:bookmarkStart w:id="5" w:name="__RefHeading___Toc230_801138078"/>
+      <w:bookmarkStart w:id="5" w:name="__RefHeading___Toc230_1018303087"/>
       <w:bookmarkEnd w:id="5"/>
       <w:r>
         <w:rPr>
@@ -2177,7 +2177,7 @@
         </w:pBdr>
         <w:rPr/>
       </w:pPr>
-      <w:bookmarkStart w:id="6" w:name="__RefHeading___Toc232_801138078"/>
+      <w:bookmarkStart w:id="6" w:name="__RefHeading___Toc232_1018303087"/>
       <w:bookmarkEnd w:id="6"/>
       <w:r>
         <w:rPr>

</xml_diff>